<commit_message>
05/10/2025 - 19:10 h
</commit_message>
<xml_diff>
--- a/O mandamento maior/O Mandamento Maior.docx
+++ b/O mandamento maior/O Mandamento Maior.docx
@@ -89,7 +89,79 @@
           <w:shd w:fill="auto" w:val="clear"/>
           <w:lang w:val="en-US" w:eastAsia="zh-CN" w:bidi="hi-IN"/>
         </w:rPr>
-        <w:t>O tema das nossas reflexões de hoje é "O mandamento maior". Nada melhor então do que iniciarmos nosso estudo relembrando a passagem evangélica onde esse mandamento nos foi dado por Jesus. Ele encontra-se em Mateus 22:34-40:</w:t>
+        <w:t xml:space="preserve">O tema das nossas reflexões de hoje é "O mandamento maior". </w:t>
+      </w:r>
+      <w:r>
+        <w:rPr>
+          <w:rFonts w:eastAsia="Times New Roman" w:cs="Times New Roman" w:ascii="Garamond" w:hAnsi="Garamond"/>
+          <w:color w:val="000000"/>
+          <w:kern w:val="0"/>
+          <w:sz w:val="36"/>
+          <w:szCs w:val="36"/>
+          <w:shd w:fill="auto" w:val="clear"/>
+          <w:lang w:val="en-US" w:eastAsia="zh-CN" w:bidi="hi-IN"/>
+        </w:rPr>
+        <w:t xml:space="preserve">Vamos iniciar então lendo </w:t>
+      </w:r>
+      <w:r>
+        <w:rPr>
+          <w:rFonts w:eastAsia="Times New Roman" w:cs="Times New Roman" w:ascii="Garamond" w:hAnsi="Garamond"/>
+          <w:color w:val="000000"/>
+          <w:kern w:val="0"/>
+          <w:sz w:val="36"/>
+          <w:szCs w:val="36"/>
+          <w:shd w:fill="auto" w:val="clear"/>
+          <w:lang w:val="en-US" w:eastAsia="zh-CN" w:bidi="hi-IN"/>
+        </w:rPr>
+        <w:t xml:space="preserve">a passagem evangélica onde esse mandamento nos foi </w:t>
+      </w:r>
+      <w:r>
+        <w:rPr>
+          <w:rFonts w:eastAsia="Times New Roman" w:cs="Times New Roman" w:ascii="Garamond" w:hAnsi="Garamond"/>
+          <w:color w:val="000000"/>
+          <w:kern w:val="0"/>
+          <w:sz w:val="36"/>
+          <w:szCs w:val="36"/>
+          <w:shd w:fill="auto" w:val="clear"/>
+          <w:lang w:val="en-US" w:eastAsia="zh-CN" w:bidi="hi-IN"/>
+        </w:rPr>
+        <w:t>apresentado</w:t>
+      </w:r>
+      <w:r>
+        <w:rPr>
+          <w:rFonts w:eastAsia="Times New Roman" w:cs="Times New Roman" w:ascii="Garamond" w:hAnsi="Garamond"/>
+          <w:color w:val="000000"/>
+          <w:kern w:val="0"/>
+          <w:sz w:val="36"/>
+          <w:szCs w:val="36"/>
+          <w:shd w:fill="auto" w:val="clear"/>
+          <w:lang w:val="en-US" w:eastAsia="zh-CN" w:bidi="hi-IN"/>
+        </w:rPr>
+        <w:t xml:space="preserve"> por Jesus. El</w:t>
+      </w:r>
+      <w:r>
+        <w:rPr>
+          <w:rFonts w:eastAsia="Times New Roman" w:cs="Times New Roman" w:ascii="Garamond" w:hAnsi="Garamond"/>
+          <w:color w:val="000000"/>
+          <w:kern w:val="0"/>
+          <w:sz w:val="36"/>
+          <w:szCs w:val="36"/>
+          <w:shd w:fill="auto" w:val="clear"/>
+          <w:lang w:val="en-US" w:eastAsia="zh-CN" w:bidi="hi-IN"/>
+        </w:rPr>
+        <w:t>a</w:t>
+      </w:r>
+      <w:r>
+        <w:rPr>
+          <w:rFonts w:eastAsia="Times New Roman" w:cs="Times New Roman" w:ascii="Garamond" w:hAnsi="Garamond"/>
+          <w:color w:val="000000"/>
+          <w:kern w:val="0"/>
+          <w:sz w:val="36"/>
+          <w:szCs w:val="36"/>
+          <w:shd w:fill="auto" w:val="clear"/>
+          <w:lang w:val="en-US" w:eastAsia="zh-CN" w:bidi="hi-IN"/>
+        </w:rPr>
+        <w:t xml:space="preserve"> encontra-se em Mateus 22:34-40:</w:t>
       </w:r>
     </w:p>
     <w:p>
@@ -322,7 +394,1485 @@
           <w:shd w:fill="auto" w:val="clear"/>
           <w:lang w:val="en-US" w:eastAsia="zh-CN" w:bidi="hi-IN"/>
         </w:rPr>
-        <w:t>É importante nós observarmos que o capítulo 22 do Evangelho de Mateus, no qual está inserido o mandamento maior, apresenta de uma sequência de confrontos entre Jesus e os grupos religiosos e políticos da época (fariseus, saduceus, doutores da lei), que tentavam testá-lo e colocá-lo em contradição.</w:t>
+        <w:t>Embora seja no capítulo 22 que está o tema do nosso estudo de hoje, vamos traçar alguns comentários sobre os ensinamentos de Jesus apresentados nos capítulos 21, 22 e 23 do evangelho de Mateus. Isso vai nos ajudar a compreender melhor o porquê Jesus ter nos dado o ensinamento maior.</w:t>
+      </w:r>
+    </w:p>
+    <w:p>
+      <w:pPr>
+        <w:pStyle w:val="Normal"/>
+        <w:jc w:val="both"/>
+        <w:rPr>
+          <w:sz w:val="36"/>
+          <w:szCs w:val="36"/>
+        </w:rPr>
+      </w:pPr>
+      <w:r>
+        <w:rPr/>
+      </w:r>
+    </w:p>
+    <w:p>
+      <w:pPr>
+        <w:pStyle w:val="Normal"/>
+        <w:jc w:val="both"/>
+        <w:rPr>
+          <w:sz w:val="36"/>
+          <w:szCs w:val="36"/>
+        </w:rPr>
+      </w:pPr>
+      <w:r>
+        <w:rPr>
+          <w:rFonts w:eastAsia="Times New Roman" w:cs="Times New Roman" w:ascii="Garamond" w:hAnsi="Garamond"/>
+          <w:color w:val="000000"/>
+          <w:kern w:val="0"/>
+          <w:sz w:val="36"/>
+          <w:szCs w:val="36"/>
+          <w:shd w:fill="auto" w:val="clear"/>
+          <w:lang w:val="en-US" w:eastAsia="zh-CN" w:bidi="hi-IN"/>
+        </w:rPr>
+        <w:t>Esses três capítulos - 21, 22 e 23 - formam  aquilo que podemos chamar “trilogia moral de transição”, onde Jesus nos convida a abandonar a  religiosidade meramente formal e abraçarmos a religiosidade verdadeira vivida no amor.</w:t>
+      </w:r>
+    </w:p>
+    <w:p>
+      <w:pPr>
+        <w:pStyle w:val="Normal"/>
+        <w:jc w:val="both"/>
+        <w:rPr>
+          <w:sz w:val="36"/>
+          <w:szCs w:val="36"/>
+        </w:rPr>
+      </w:pPr>
+      <w:r>
+        <w:rPr/>
+      </w:r>
+    </w:p>
+    <w:p>
+      <w:pPr>
+        <w:pStyle w:val="Normal"/>
+        <w:jc w:val="both"/>
+        <w:rPr>
+          <w:sz w:val="36"/>
+          <w:szCs w:val="36"/>
+        </w:rPr>
+      </w:pPr>
+      <w:r>
+        <w:rPr>
+          <w:rFonts w:eastAsia="Times New Roman" w:cs="Times New Roman" w:ascii="Garamond" w:hAnsi="Garamond"/>
+          <w:color w:val="000000"/>
+          <w:kern w:val="0"/>
+          <w:sz w:val="36"/>
+          <w:szCs w:val="36"/>
+          <w:shd w:fill="auto" w:val="clear"/>
+          <w:lang w:val="en-US" w:eastAsia="zh-CN" w:bidi="hi-IN"/>
+        </w:rPr>
+        <w:t>Na cronologia do evangelho de Mateus, é exatamente no capítulo 21 que começam a ser narrados os últimos dias da vida de Jesus na Terra. Esse capítulo inicia-se com a entrada triunfante de Jesus em Jerusalém.</w:t>
+      </w:r>
+    </w:p>
+    <w:p>
+      <w:pPr>
+        <w:pStyle w:val="Normal"/>
+        <w:jc w:val="both"/>
+        <w:rPr>
+          <w:sz w:val="36"/>
+          <w:szCs w:val="36"/>
+        </w:rPr>
+      </w:pPr>
+      <w:r>
+        <w:rPr/>
+      </w:r>
+    </w:p>
+    <w:p>
+      <w:pPr>
+        <w:pStyle w:val="Normal"/>
+        <w:jc w:val="both"/>
+        <w:rPr>
+          <w:sz w:val="36"/>
+          <w:szCs w:val="36"/>
+        </w:rPr>
+      </w:pPr>
+      <w:r>
+        <w:rPr>
+          <w:rFonts w:eastAsia="Times New Roman" w:cs="Times New Roman" w:ascii="Garamond" w:hAnsi="Garamond"/>
+          <w:color w:val="000000"/>
+          <w:kern w:val="0"/>
+          <w:sz w:val="36"/>
+          <w:szCs w:val="36"/>
+          <w:shd w:fill="auto" w:val="clear"/>
+          <w:lang w:val="en-US" w:eastAsia="zh-CN" w:bidi="hi-IN"/>
+        </w:rPr>
+        <w:t>Jesus tinha pleno conhecimento do que estava prestes a acontecer com Ele. Por isso, em seus últimos dias entre os homens, Ele nos falou com tanta ênfase sobre nossa necessidade de vivermos a  religião e a religiosidade de forma pura, simples e verdadeira, construindo tesouros para o Reino dos Céus e não para a Terra.</w:t>
+      </w:r>
+    </w:p>
+    <w:p>
+      <w:pPr>
+        <w:pStyle w:val="Normal"/>
+        <w:jc w:val="both"/>
+        <w:rPr>
+          <w:sz w:val="36"/>
+          <w:szCs w:val="36"/>
+        </w:rPr>
+      </w:pPr>
+      <w:r>
+        <w:rPr/>
+      </w:r>
+    </w:p>
+    <w:p>
+      <w:pPr>
+        <w:pStyle w:val="Normal"/>
+        <w:jc w:val="both"/>
+        <w:rPr>
+          <w:u w:val="single"/>
+        </w:rPr>
+      </w:pPr>
+      <w:r>
+        <w:rPr>
+          <w:rFonts w:eastAsia="Times New Roman" w:cs="Times New Roman" w:ascii="Garamond" w:hAnsi="Garamond"/>
+          <w:color w:val="000000"/>
+          <w:kern w:val="0"/>
+          <w:sz w:val="36"/>
+          <w:szCs w:val="36"/>
+          <w:u w:val="single"/>
+          <w:shd w:fill="auto" w:val="clear"/>
+          <w:lang w:val="en-US" w:eastAsia="zh-CN" w:bidi="hi-IN"/>
+        </w:rPr>
+        <w:t>Capítulo 21</w:t>
+      </w:r>
+    </w:p>
+    <w:p>
+      <w:pPr>
+        <w:pStyle w:val="Normal"/>
+        <w:jc w:val="both"/>
+        <w:rPr>
+          <w:sz w:val="36"/>
+          <w:szCs w:val="36"/>
+        </w:rPr>
+      </w:pPr>
+      <w:r>
+        <w:rPr>
+          <w:rFonts w:eastAsia="Times New Roman" w:cs="Times New Roman" w:ascii="Garamond" w:hAnsi="Garamond"/>
+          <w:color w:val="000000"/>
+          <w:kern w:val="0"/>
+          <w:sz w:val="36"/>
+          <w:szCs w:val="36"/>
+          <w:shd w:fill="auto" w:val="clear"/>
+          <w:lang w:val="en-US" w:eastAsia="zh-CN" w:bidi="hi-IN"/>
+        </w:rPr>
+        <w:t xml:space="preserve">Jesus denuncia a esterilidade da fé exterior. A figueira estéril à qual Jesus manda secar e a expulsão dos vendedores do Templo são símbolos da alma que aparenta religiosidade, mas não produz obras de amor. </w:t>
+      </w:r>
+    </w:p>
+    <w:p>
+      <w:pPr>
+        <w:pStyle w:val="Normal"/>
+        <w:jc w:val="both"/>
+        <w:rPr>
+          <w:sz w:val="36"/>
+          <w:szCs w:val="36"/>
+        </w:rPr>
+      </w:pPr>
+      <w:r>
+        <w:rPr/>
+      </w:r>
+    </w:p>
+    <w:p>
+      <w:pPr>
+        <w:pStyle w:val="Normal"/>
+        <w:jc w:val="both"/>
+        <w:rPr>
+          <w:u w:val="single"/>
+        </w:rPr>
+      </w:pPr>
+      <w:r>
+        <w:rPr>
+          <w:rFonts w:eastAsia="Times New Roman" w:cs="Times New Roman" w:ascii="Garamond" w:hAnsi="Garamond"/>
+          <w:color w:val="000000"/>
+          <w:kern w:val="0"/>
+          <w:sz w:val="36"/>
+          <w:szCs w:val="36"/>
+          <w:u w:val="single"/>
+          <w:shd w:fill="auto" w:val="clear"/>
+          <w:lang w:val="en-US" w:eastAsia="zh-CN" w:bidi="hi-IN"/>
+        </w:rPr>
+        <w:t>Capítulo 22</w:t>
+      </w:r>
+    </w:p>
+    <w:p>
+      <w:pPr>
+        <w:pStyle w:val="Normal"/>
+        <w:jc w:val="both"/>
+        <w:rPr>
+          <w:sz w:val="36"/>
+          <w:szCs w:val="36"/>
+        </w:rPr>
+      </w:pPr>
+      <w:r>
+        <w:rPr>
+          <w:rFonts w:eastAsia="Times New Roman" w:cs="Times New Roman" w:ascii="Garamond" w:hAnsi="Garamond"/>
+          <w:color w:val="000000"/>
+          <w:kern w:val="0"/>
+          <w:sz w:val="36"/>
+          <w:szCs w:val="36"/>
+          <w:shd w:fill="auto" w:val="clear"/>
+          <w:lang w:val="en-US" w:eastAsia="zh-CN" w:bidi="hi-IN"/>
+        </w:rPr>
+        <w:t xml:space="preserve">Jesus revela a essência da Lei: o amor. Como veremos ao longo do nosso estudo toda a Lei e os Profetas se resumem em amar a Deus sobre todas as coisas e ao próximo como a si mesmo. </w:t>
+      </w:r>
+    </w:p>
+    <w:p>
+      <w:pPr>
+        <w:pStyle w:val="Normal"/>
+        <w:jc w:val="both"/>
+        <w:rPr>
+          <w:sz w:val="36"/>
+          <w:szCs w:val="36"/>
+        </w:rPr>
+      </w:pPr>
+      <w:r>
+        <w:rPr/>
+      </w:r>
+    </w:p>
+    <w:p>
+      <w:pPr>
+        <w:pStyle w:val="Normal"/>
+        <w:jc w:val="both"/>
+        <w:rPr>
+          <w:sz w:val="36"/>
+          <w:szCs w:val="36"/>
+        </w:rPr>
+      </w:pPr>
+      <w:r>
+        <w:rPr>
+          <w:rFonts w:eastAsia="Times New Roman" w:cs="Times New Roman" w:ascii="Garamond" w:hAnsi="Garamond"/>
+          <w:color w:val="000000"/>
+          <w:kern w:val="0"/>
+          <w:sz w:val="36"/>
+          <w:szCs w:val="36"/>
+          <w:shd w:fill="auto" w:val="clear"/>
+          <w:lang w:val="en-US" w:eastAsia="zh-CN" w:bidi="hi-IN"/>
+        </w:rPr>
+        <w:t>O amor se torna o eixo da vida moral e espiritual, inspirando todas as virtudes e guiando a alma ao verdadeiro entendimento de Deus.</w:t>
+      </w:r>
+    </w:p>
+    <w:p>
+      <w:pPr>
+        <w:pStyle w:val="Normal"/>
+        <w:jc w:val="both"/>
+        <w:rPr>
+          <w:sz w:val="36"/>
+          <w:szCs w:val="36"/>
+        </w:rPr>
+      </w:pPr>
+      <w:r>
+        <w:rPr/>
+      </w:r>
+    </w:p>
+    <w:p>
+      <w:pPr>
+        <w:pStyle w:val="Normal"/>
+        <w:jc w:val="both"/>
+        <w:rPr>
+          <w:u w:val="single"/>
+        </w:rPr>
+      </w:pPr>
+      <w:r>
+        <w:rPr>
+          <w:rFonts w:eastAsia="Times New Roman" w:cs="Times New Roman" w:ascii="Garamond" w:hAnsi="Garamond"/>
+          <w:color w:val="000000"/>
+          <w:kern w:val="0"/>
+          <w:sz w:val="36"/>
+          <w:szCs w:val="36"/>
+          <w:u w:val="single"/>
+          <w:shd w:fill="auto" w:val="clear"/>
+          <w:lang w:val="en-US" w:eastAsia="zh-CN" w:bidi="hi-IN"/>
+        </w:rPr>
+        <w:t>Capítulo 23</w:t>
+      </w:r>
+    </w:p>
+    <w:p>
+      <w:pPr>
+        <w:pStyle w:val="Normal"/>
+        <w:jc w:val="both"/>
+        <w:rPr>
+          <w:sz w:val="36"/>
+          <w:szCs w:val="36"/>
+        </w:rPr>
+      </w:pPr>
+      <w:r>
+        <w:rPr>
+          <w:rFonts w:eastAsia="Times New Roman" w:cs="Times New Roman" w:ascii="Garamond" w:hAnsi="Garamond"/>
+          <w:color w:val="000000"/>
+          <w:kern w:val="0"/>
+          <w:sz w:val="36"/>
+          <w:szCs w:val="36"/>
+          <w:shd w:fill="auto" w:val="clear"/>
+          <w:lang w:val="en-US" w:eastAsia="zh-CN" w:bidi="hi-IN"/>
+        </w:rPr>
+        <w:t xml:space="preserve">Jesus faz o juízo moral e convoca à sinceridade do coração. Aos escribas e fariseus, denuncia a hipocrisia e alerta sobre o perigo de servir às aparências. Seu lamento sobre Jerusalém é também um convite à humanidade inteira: abrir o coração para o amor e para a verdade. </w:t>
+      </w:r>
+    </w:p>
+    <w:p>
+      <w:pPr>
+        <w:pStyle w:val="Normal"/>
+        <w:jc w:val="both"/>
+        <w:rPr>
+          <w:sz w:val="36"/>
+          <w:szCs w:val="36"/>
+        </w:rPr>
+      </w:pPr>
+      <w:r>
+        <w:rPr/>
+      </w:r>
+    </w:p>
+    <w:p>
+      <w:pPr>
+        <w:pStyle w:val="Normal"/>
+        <w:jc w:val="both"/>
+        <w:rPr>
+          <w:b/>
+          <w:b/>
+          <w:bCs/>
+          <w:color w:val="C9211E"/>
+        </w:rPr>
+      </w:pPr>
+      <w:r>
+        <w:rPr>
+          <w:rFonts w:eastAsia="Times New Roman" w:cs="Times New Roman" w:ascii="Garamond" w:hAnsi="Garamond"/>
+          <w:b/>
+          <w:bCs/>
+          <w:color w:val="C9211E"/>
+          <w:kern w:val="0"/>
+          <w:sz w:val="36"/>
+          <w:szCs w:val="36"/>
+          <w:shd w:fill="auto" w:val="clear"/>
+          <w:lang w:val="en-US" w:eastAsia="zh-CN" w:bidi="hi-IN"/>
+        </w:rPr>
+        <w:t>D</w:t>
+      </w:r>
+      <w:r>
+        <w:rPr>
+          <w:rFonts w:eastAsia="Times New Roman" w:cs="Times New Roman" w:ascii="Garamond" w:hAnsi="Garamond"/>
+          <w:b/>
+          <w:bCs/>
+          <w:color w:val="C9211E"/>
+          <w:kern w:val="0"/>
+          <w:sz w:val="36"/>
+          <w:szCs w:val="36"/>
+          <w:shd w:fill="auto" w:val="clear"/>
+          <w:lang w:val="en-US" w:eastAsia="zh-CN" w:bidi="hi-IN"/>
+        </w:rPr>
+        <w:t>esenvolver e apresentar os seguintes tópicos:</w:t>
+      </w:r>
+    </w:p>
+    <w:p>
+      <w:pPr>
+        <w:pStyle w:val="Normal"/>
+        <w:jc w:val="both"/>
+        <w:rPr>
+          <w:b/>
+          <w:b/>
+          <w:bCs/>
+          <w:color w:val="C9211E"/>
+        </w:rPr>
+      </w:pPr>
+      <w:r>
+        <w:rPr>
+          <w:rFonts w:eastAsia="Times New Roman" w:cs="Times New Roman" w:ascii="Garamond" w:hAnsi="Garamond"/>
+          <w:b/>
+          <w:bCs/>
+          <w:color w:val="C9211E"/>
+          <w:kern w:val="0"/>
+          <w:sz w:val="36"/>
+          <w:szCs w:val="36"/>
+          <w:shd w:fill="auto" w:val="clear"/>
+          <w:lang w:val="en-US" w:eastAsia="zh-CN" w:bidi="hi-IN"/>
+        </w:rPr>
+        <w:t>1 - Diferenciar saduceus dos fariseus</w:t>
+      </w:r>
+    </w:p>
+    <w:p>
+      <w:pPr>
+        <w:pStyle w:val="Normal"/>
+        <w:jc w:val="both"/>
+        <w:rPr>
+          <w:b/>
+          <w:b/>
+          <w:bCs/>
+          <w:color w:val="C9211E"/>
+        </w:rPr>
+      </w:pPr>
+      <w:r>
+        <w:rPr>
+          <w:rFonts w:eastAsia="Times New Roman" w:cs="Times New Roman" w:ascii="Garamond" w:hAnsi="Garamond"/>
+          <w:b/>
+          <w:bCs/>
+          <w:color w:val="C9211E"/>
+          <w:kern w:val="0"/>
+          <w:sz w:val="36"/>
+          <w:szCs w:val="36"/>
+          <w:shd w:fill="auto" w:val="clear"/>
+          <w:lang w:val="en-US" w:eastAsia="zh-CN" w:bidi="hi-IN"/>
+        </w:rPr>
+        <w:t>2 - Explicar porque Jesus teve mais embates com os fariseus</w:t>
+      </w:r>
+    </w:p>
+    <w:p>
+      <w:pPr>
+        <w:pStyle w:val="Normal"/>
+        <w:jc w:val="both"/>
+        <w:rPr>
+          <w:sz w:val="36"/>
+          <w:szCs w:val="36"/>
+        </w:rPr>
+      </w:pPr>
+      <w:r>
+        <w:rPr/>
+      </w:r>
+    </w:p>
+    <w:p>
+      <w:pPr>
+        <w:pStyle w:val="Normal"/>
+        <w:jc w:val="both"/>
+        <w:rPr>
+          <w:sz w:val="36"/>
+          <w:szCs w:val="36"/>
+        </w:rPr>
+      </w:pPr>
+      <w:r>
+        <w:rPr>
+          <w:rFonts w:eastAsia="Times New Roman" w:cs="Times New Roman" w:ascii="Garamond" w:hAnsi="Garamond"/>
+          <w:color w:val="000000"/>
+          <w:kern w:val="0"/>
+          <w:sz w:val="36"/>
+          <w:szCs w:val="36"/>
+          <w:shd w:fill="auto" w:val="clear"/>
+          <w:lang w:val="en-US" w:eastAsia="zh-CN" w:bidi="hi-IN"/>
+        </w:rPr>
+        <w:t>[</w:t>
+      </w:r>
+      <w:r>
+        <w:rPr>
+          <w:rFonts w:eastAsia="Times New Roman" w:cs="Times New Roman" w:ascii="Garamond" w:hAnsi="Garamond"/>
+          <w:color w:val="000000"/>
+          <w:kern w:val="0"/>
+          <w:sz w:val="36"/>
+          <w:szCs w:val="36"/>
+          <w:shd w:fill="auto" w:val="clear"/>
+          <w:lang w:val="en-US" w:eastAsia="zh-CN" w:bidi="hi-IN"/>
+        </w:rPr>
+        <w:t xml:space="preserve"> Os saduceus eram principalmente sacerdotes e aristocratas ligados ao Templo de Jerusalém, ocupando posições de poder tanto religioso quanto político. Sua fé se baseava unicamente na Torá, os cinco primeiros livros da Bíblia, e negavam a ressurreição dos mortos, a existência de anjos ou espíritos. A prática religiosa dos saduceus concentrava-se nos rituais do Templo, nos sacrifícios e nas funções sacerdotais, sendo voltada mais para a aparência externa e o cumprimento formal das leis do que para a vivência espiritual interior.</w:t>
+      </w:r>
+    </w:p>
+    <w:p>
+      <w:pPr>
+        <w:pStyle w:val="Normal"/>
+        <w:jc w:val="both"/>
+        <w:rPr>
+          <w:sz w:val="36"/>
+          <w:szCs w:val="36"/>
+        </w:rPr>
+      </w:pPr>
+      <w:r>
+        <w:rPr/>
+      </w:r>
+    </w:p>
+    <w:p>
+      <w:pPr>
+        <w:pStyle w:val="Normal"/>
+        <w:jc w:val="both"/>
+        <w:rPr>
+          <w:sz w:val="36"/>
+          <w:szCs w:val="36"/>
+        </w:rPr>
+      </w:pPr>
+      <w:r>
+        <w:rPr>
+          <w:rFonts w:eastAsia="Times New Roman" w:cs="Times New Roman" w:ascii="Garamond" w:hAnsi="Garamond"/>
+          <w:color w:val="000000"/>
+          <w:kern w:val="0"/>
+          <w:sz w:val="36"/>
+          <w:szCs w:val="36"/>
+          <w:shd w:fill="auto" w:val="clear"/>
+          <w:lang w:val="en-US" w:eastAsia="zh-CN" w:bidi="hi-IN"/>
+        </w:rPr>
+        <w:t>Em contraste, os fariseus eram mestres da Lei e líderes religiosos mais próximos do povo, atuando nas sinagogas e na vida cotidiana. Acreditavam na ressurreição, nos espíritos e na vida após a morte, e valorizavam uma interpretação detalhada da Lei, incluindo tradições orais que complementavam a Torá. A prática dos fariseus envolvia cumprir rigorosamente as leis de pureza, o sábado, os dízimos e outros rituais, mas muitas vezes caíam em hipocrisia, privilegiando o formalismo e a aparência de santidade sobre a essência do amor e da fé.</w:t>
+      </w:r>
+    </w:p>
+    <w:p>
+      <w:pPr>
+        <w:pStyle w:val="Normal"/>
+        <w:jc w:val="both"/>
+        <w:rPr>
+          <w:sz w:val="36"/>
+          <w:szCs w:val="36"/>
+        </w:rPr>
+      </w:pPr>
+      <w:r>
+        <w:rPr/>
+      </w:r>
+    </w:p>
+    <w:p>
+      <w:pPr>
+        <w:pStyle w:val="Normal"/>
+        <w:jc w:val="both"/>
+        <w:rPr>
+          <w:sz w:val="36"/>
+          <w:szCs w:val="36"/>
+        </w:rPr>
+      </w:pPr>
+      <w:r>
+        <w:rPr>
+          <w:rFonts w:eastAsia="Times New Roman" w:cs="Times New Roman" w:ascii="Garamond" w:hAnsi="Garamond"/>
+          <w:color w:val="000000"/>
+          <w:kern w:val="0"/>
+          <w:sz w:val="36"/>
+          <w:szCs w:val="36"/>
+          <w:shd w:fill="auto" w:val="clear"/>
+          <w:lang w:val="en-US" w:eastAsia="zh-CN" w:bidi="hi-IN"/>
+        </w:rPr>
+        <w:t>Enquanto os saduceus representavam a religiosidade do poder e da aparência externa, os fariseus simbolizavam a religiosidade sem vida interior, preocupada com moral, doutrina e cumprimento rigoroso da Lei, mas marcada por orgulho e vaidade espiritual. Jesus confrontava ambos: os saduceus por sua cegueira e apego ao poder, e os fariseus por sua hipocrisia e formalismo, revelando a necessidade de coerência entre fé, amor e prática.Adicionar aqui a parte que diferencia Saduceus de Fariseus ]</w:t>
+      </w:r>
+    </w:p>
+    <w:p>
+      <w:pPr>
+        <w:pStyle w:val="Normal"/>
+        <w:jc w:val="both"/>
+        <w:rPr>
+          <w:sz w:val="36"/>
+          <w:szCs w:val="36"/>
+        </w:rPr>
+      </w:pPr>
+      <w:r>
+        <w:rPr/>
+      </w:r>
+    </w:p>
+    <w:p>
+      <w:pPr>
+        <w:pStyle w:val="Normal"/>
+        <w:jc w:val="both"/>
+        <w:rPr>
+          <w:sz w:val="36"/>
+          <w:szCs w:val="36"/>
+        </w:rPr>
+      </w:pPr>
+      <w:r>
+        <w:rPr>
+          <w:rFonts w:eastAsia="Times New Roman" w:cs="Times New Roman" w:ascii="Garamond" w:hAnsi="Garamond"/>
+          <w:color w:val="000000"/>
+          <w:kern w:val="0"/>
+          <w:sz w:val="36"/>
+          <w:szCs w:val="36"/>
+          <w:shd w:fill="auto" w:val="clear"/>
+          <w:lang w:val="en-US" w:eastAsia="zh-CN" w:bidi="hi-IN"/>
+        </w:rPr>
+        <w:t>[ Desenvolver essa ideia: Durante suas últimas semanas na Terra, Jesus foi constantemente interpelado pelos saduceus e fariseus. Cada grupo apresentava suas próprias leis e tradições, buscando colocá-lo à prova e descobrir qual seria, afinal, a regra mais importante a ser seguida pelo homem.</w:t>
+      </w:r>
+    </w:p>
+    <w:p>
+      <w:pPr>
+        <w:pStyle w:val="Normal"/>
+        <w:jc w:val="both"/>
+        <w:rPr>
+          <w:sz w:val="36"/>
+          <w:szCs w:val="36"/>
+        </w:rPr>
+      </w:pPr>
+      <w:r>
+        <w:rPr/>
+      </w:r>
+    </w:p>
+    <w:p>
+      <w:pPr>
+        <w:pStyle w:val="Normal"/>
+        <w:jc w:val="both"/>
+        <w:rPr>
+          <w:sz w:val="36"/>
+          <w:szCs w:val="36"/>
+        </w:rPr>
+      </w:pPr>
+      <w:r>
+        <w:rPr>
+          <w:rFonts w:eastAsia="Times New Roman" w:cs="Times New Roman" w:ascii="Garamond" w:hAnsi="Garamond"/>
+          <w:color w:val="000000"/>
+          <w:kern w:val="0"/>
+          <w:sz w:val="36"/>
+          <w:szCs w:val="36"/>
+          <w:shd w:fill="auto" w:val="clear"/>
+          <w:lang w:val="en-US" w:eastAsia="zh-CN" w:bidi="hi-IN"/>
+        </w:rPr>
+        <w:t>Em meio a tantas disputas e interpretações humanas, Jesus oferece uma resposta simples e profunda, capaz de iluminar todas as leis e orientar todos os corações: amar a Deus de todo o coração, de toda a alma e de todo o entendimento; e amar o próximo como a si mesmo.</w:t>
+      </w:r>
+    </w:p>
+    <w:p>
+      <w:pPr>
+        <w:pStyle w:val="Normal"/>
+        <w:jc w:val="both"/>
+        <w:rPr>
+          <w:sz w:val="36"/>
+          <w:szCs w:val="36"/>
+        </w:rPr>
+      </w:pPr>
+      <w:r>
+        <w:rPr/>
+      </w:r>
+    </w:p>
+    <w:p>
+      <w:pPr>
+        <w:pStyle w:val="Normal"/>
+        <w:jc w:val="both"/>
+        <w:rPr>
+          <w:sz w:val="36"/>
+          <w:szCs w:val="36"/>
+        </w:rPr>
+      </w:pPr>
+      <w:r>
+        <w:rPr>
+          <w:rFonts w:eastAsia="Times New Roman" w:cs="Times New Roman" w:ascii="Garamond" w:hAnsi="Garamond"/>
+          <w:color w:val="000000"/>
+          <w:kern w:val="0"/>
+          <w:sz w:val="36"/>
+          <w:szCs w:val="36"/>
+          <w:shd w:fill="auto" w:val="clear"/>
+          <w:lang w:val="en-US" w:eastAsia="zh-CN" w:bidi="hi-IN"/>
+        </w:rPr>
+        <w:t>Com isso, o Mestre ensina que o verdadeiro cumprimento da Lei não está na letra, mas no sentimento. Toda norma, todo princípio ou prática religiosa deve ter como base o amor — amor que se volta primeiro para Deus, que se estende ao próximo e que também se reconhece em nós mesmos. É nesse equilíbrio que a fé deixa de ser mera obediência e se torna vivência, conduzindo-nos ao verdadeiro entendimento da vontade divina.]</w:t>
+      </w:r>
+    </w:p>
+    <w:p>
+      <w:pPr>
+        <w:pStyle w:val="Normal"/>
+        <w:jc w:val="both"/>
+        <w:rPr>
+          <w:sz w:val="36"/>
+          <w:szCs w:val="36"/>
+        </w:rPr>
+      </w:pPr>
+      <w:r>
+        <w:rPr>
+          <w:rFonts w:eastAsia="Times New Roman" w:cs="Times New Roman" w:ascii="Garamond" w:hAnsi="Garamond"/>
+          <w:color w:val="000000"/>
+          <w:kern w:val="0"/>
+          <w:sz w:val="36"/>
+          <w:szCs w:val="36"/>
+          <w:shd w:fill="auto" w:val="clear"/>
+          <w:lang w:val="en-US" w:eastAsia="zh-CN" w:bidi="hi-IN"/>
+        </w:rPr>
+        <w:t xml:space="preserve"> </w:t>
+      </w:r>
+    </w:p>
+    <w:p>
+      <w:pPr>
+        <w:pStyle w:val="Normal"/>
+        <w:jc w:val="both"/>
+        <w:rPr>
+          <w:sz w:val="36"/>
+          <w:szCs w:val="36"/>
+        </w:rPr>
+      </w:pPr>
+      <w:r>
+        <w:rPr/>
+      </w:r>
+    </w:p>
+    <w:p>
+      <w:pPr>
+        <w:pStyle w:val="Normal"/>
+        <w:jc w:val="both"/>
+        <w:rPr>
+          <w:sz w:val="36"/>
+          <w:szCs w:val="36"/>
+        </w:rPr>
+      </w:pPr>
+      <w:r>
+        <w:rPr/>
+      </w:r>
+    </w:p>
+    <w:p>
+      <w:pPr>
+        <w:pStyle w:val="Normal"/>
+        <w:jc w:val="both"/>
+        <w:rPr>
+          <w:sz w:val="36"/>
+          <w:szCs w:val="36"/>
+        </w:rPr>
+      </w:pPr>
+      <w:r>
+        <w:rPr/>
+      </w:r>
+    </w:p>
+    <w:p>
+      <w:pPr>
+        <w:pStyle w:val="Normal"/>
+        <w:jc w:val="both"/>
+        <w:rPr>
+          <w:sz w:val="36"/>
+          <w:szCs w:val="36"/>
+        </w:rPr>
+      </w:pPr>
+      <w:r>
+        <w:rPr>
+          <w:rFonts w:eastAsia="Times New Roman" w:cs="Times New Roman" w:ascii="Garamond" w:hAnsi="Garamond"/>
+          <w:color w:val="000000"/>
+          <w:kern w:val="0"/>
+          <w:sz w:val="36"/>
+          <w:szCs w:val="36"/>
+          <w:shd w:fill="auto" w:val="clear"/>
+          <w:lang w:val="en-US" w:eastAsia="zh-CN" w:bidi="hi-IN"/>
+        </w:rPr>
+        <w:t xml:space="preserve">[ </w:t>
+      </w:r>
+      <w:r>
+        <w:rPr>
+          <w:rFonts w:eastAsia="Times New Roman" w:cs="Times New Roman" w:ascii="Garamond" w:hAnsi="Garamond"/>
+          <w:b/>
+          <w:bCs/>
+          <w:color w:val="C9211E"/>
+          <w:kern w:val="0"/>
+          <w:sz w:val="36"/>
+          <w:szCs w:val="36"/>
+          <w:shd w:fill="auto" w:val="clear"/>
+          <w:lang w:val="en-US" w:eastAsia="zh-CN" w:bidi="hi-IN"/>
+        </w:rPr>
+        <w:t>Início de bloco a ser avaliado se permanece</w:t>
+      </w:r>
+      <w:r>
+        <w:rPr>
+          <w:rFonts w:eastAsia="Times New Roman" w:cs="Times New Roman" w:ascii="Garamond" w:hAnsi="Garamond"/>
+          <w:color w:val="000000"/>
+          <w:kern w:val="0"/>
+          <w:sz w:val="36"/>
+          <w:szCs w:val="36"/>
+          <w:shd w:fill="auto" w:val="clear"/>
+          <w:lang w:val="en-US" w:eastAsia="zh-CN" w:bidi="hi-IN"/>
+        </w:rPr>
+        <w:t xml:space="preserve"> ]</w:t>
+      </w:r>
+    </w:p>
+    <w:p>
+      <w:pPr>
+        <w:pStyle w:val="Normal"/>
+        <w:jc w:val="both"/>
+        <w:rPr>
+          <w:sz w:val="36"/>
+          <w:szCs w:val="36"/>
+        </w:rPr>
+      </w:pPr>
+      <w:r>
+        <w:rPr/>
+      </w:r>
+    </w:p>
+    <w:p>
+      <w:pPr>
+        <w:pStyle w:val="Normal"/>
+        <w:jc w:val="both"/>
+        <w:rPr>
+          <w:sz w:val="36"/>
+          <w:szCs w:val="36"/>
+        </w:rPr>
+      </w:pPr>
+      <w:r>
+        <w:rPr>
+          <w:rFonts w:eastAsia="Times New Roman" w:cs="Times New Roman" w:ascii="Garamond" w:hAnsi="Garamond"/>
+          <w:color w:val="000000"/>
+          <w:kern w:val="0"/>
+          <w:sz w:val="36"/>
+          <w:szCs w:val="36"/>
+          <w:shd w:fill="auto" w:val="clear"/>
+          <w:lang w:val="en-US" w:eastAsia="zh-CN" w:bidi="hi-IN"/>
+        </w:rPr>
+        <w:t>À luz do Espiritismo, esses capítulos mostram estágios da nossa evolução moral:</w:t>
+      </w:r>
+    </w:p>
+    <w:p>
+      <w:pPr>
+        <w:pStyle w:val="Normal"/>
+        <w:jc w:val="both"/>
+        <w:rPr>
+          <w:sz w:val="36"/>
+          <w:szCs w:val="36"/>
+        </w:rPr>
+      </w:pPr>
+      <w:r>
+        <w:rPr/>
+      </w:r>
+    </w:p>
+    <w:p>
+      <w:pPr>
+        <w:pStyle w:val="Normal"/>
+        <w:jc w:val="both"/>
+        <w:rPr>
+          <w:sz w:val="36"/>
+          <w:szCs w:val="36"/>
+        </w:rPr>
+      </w:pPr>
+      <w:r>
+        <w:rPr>
+          <w:rFonts w:eastAsia="Times New Roman" w:cs="Times New Roman" w:ascii="Garamond" w:hAnsi="Garamond"/>
+          <w:color w:val="000000"/>
+          <w:kern w:val="0"/>
+          <w:sz w:val="36"/>
+          <w:szCs w:val="36"/>
+          <w:shd w:fill="auto" w:val="clear"/>
+          <w:lang w:val="en-US" w:eastAsia="zh-CN" w:bidi="hi-IN"/>
+        </w:rPr>
+        <w:t>Capítulo 21 traz o despertar da consciência, ou seja,  reconhecer nossa própria esterilidade.</w:t>
+      </w:r>
+    </w:p>
+    <w:p>
+      <w:pPr>
+        <w:pStyle w:val="Normal"/>
+        <w:jc w:val="both"/>
+        <w:rPr>
+          <w:sz w:val="36"/>
+          <w:szCs w:val="36"/>
+        </w:rPr>
+      </w:pPr>
+      <w:r>
+        <w:rPr/>
+      </w:r>
+    </w:p>
+    <w:p>
+      <w:pPr>
+        <w:pStyle w:val="Normal"/>
+        <w:jc w:val="both"/>
+        <w:rPr>
+          <w:sz w:val="36"/>
+          <w:szCs w:val="36"/>
+        </w:rPr>
+      </w:pPr>
+      <w:r>
+        <w:rPr>
+          <w:rFonts w:eastAsia="Times New Roman" w:cs="Times New Roman" w:ascii="Garamond" w:hAnsi="Garamond"/>
+          <w:color w:val="000000"/>
+          <w:kern w:val="0"/>
+          <w:sz w:val="36"/>
+          <w:szCs w:val="36"/>
+          <w:shd w:fill="auto" w:val="clear"/>
+          <w:lang w:val="en-US" w:eastAsia="zh-CN" w:bidi="hi-IN"/>
+        </w:rPr>
+        <w:t>Já o capítulo 22 representa a iluminação interior — compreender o amor como essência da Lei (cap. 22).</w:t>
+      </w:r>
+    </w:p>
+    <w:p>
+      <w:pPr>
+        <w:pStyle w:val="Normal"/>
+        <w:jc w:val="both"/>
+        <w:rPr>
+          <w:sz w:val="36"/>
+          <w:szCs w:val="36"/>
+        </w:rPr>
+      </w:pPr>
+      <w:r>
+        <w:rPr/>
+      </w:r>
+    </w:p>
+    <w:p>
+      <w:pPr>
+        <w:pStyle w:val="Normal"/>
+        <w:jc w:val="both"/>
+        <w:rPr>
+          <w:sz w:val="36"/>
+          <w:szCs w:val="36"/>
+        </w:rPr>
+      </w:pPr>
+      <w:r>
+        <w:rPr>
+          <w:rFonts w:eastAsia="Times New Roman" w:cs="Times New Roman" w:ascii="Garamond" w:hAnsi="Garamond"/>
+          <w:color w:val="000000"/>
+          <w:kern w:val="0"/>
+          <w:sz w:val="36"/>
+          <w:szCs w:val="36"/>
+          <w:shd w:fill="auto" w:val="clear"/>
+          <w:lang w:val="en-US" w:eastAsia="zh-CN" w:bidi="hi-IN"/>
+        </w:rPr>
+        <w:t xml:space="preserve">Reforma íntima — vencer o orgulho e a hipocrisia (cap. 23). </w:t>
+      </w:r>
+    </w:p>
+    <w:p>
+      <w:pPr>
+        <w:pStyle w:val="Normal"/>
+        <w:jc w:val="both"/>
+        <w:rPr>
+          <w:sz w:val="36"/>
+          <w:szCs w:val="36"/>
+        </w:rPr>
+      </w:pPr>
+      <w:r>
+        <w:rPr/>
+      </w:r>
+    </w:p>
+    <w:p>
+      <w:pPr>
+        <w:pStyle w:val="Normal"/>
+        <w:jc w:val="both"/>
+        <w:rPr>
+          <w:sz w:val="36"/>
+          <w:szCs w:val="36"/>
+        </w:rPr>
+      </w:pPr>
+      <w:r>
+        <w:rPr>
+          <w:rFonts w:eastAsia="Times New Roman" w:cs="Times New Roman" w:ascii="Garamond" w:hAnsi="Garamond"/>
+          <w:color w:val="000000"/>
+          <w:kern w:val="0"/>
+          <w:sz w:val="36"/>
+          <w:szCs w:val="36"/>
+          <w:shd w:fill="auto" w:val="clear"/>
+          <w:lang w:val="en-US" w:eastAsia="zh-CN" w:bidi="hi-IN"/>
+        </w:rPr>
+        <w:t>Somente depois de passar por esse processo o espírito está preparado para o sacrifício consciente, isto é, para renunciar ao ego e viver o amor em plenitude — o que Jesus realiza na cruz e confirma na ressurreição</w:t>
+      </w:r>
+    </w:p>
+    <w:p>
+      <w:pPr>
+        <w:pStyle w:val="Normal"/>
+        <w:jc w:val="both"/>
+        <w:rPr>
+          <w:sz w:val="36"/>
+          <w:szCs w:val="36"/>
+        </w:rPr>
+      </w:pPr>
+      <w:r>
+        <w:rPr>
+          <w:rFonts w:eastAsia="Times New Roman" w:cs="Times New Roman" w:ascii="Garamond" w:hAnsi="Garamond"/>
+          <w:color w:val="000000"/>
+          <w:kern w:val="0"/>
+          <w:sz w:val="36"/>
+          <w:szCs w:val="36"/>
+          <w:shd w:fill="auto" w:val="clear"/>
+          <w:lang w:val="en-US" w:eastAsia="zh-CN" w:bidi="hi-IN"/>
+        </w:rPr>
+        <w:t xml:space="preserve">[ </w:t>
+      </w:r>
+      <w:r>
+        <w:rPr>
+          <w:rFonts w:eastAsia="Times New Roman" w:cs="Times New Roman" w:ascii="Garamond" w:hAnsi="Garamond"/>
+          <w:b/>
+          <w:bCs/>
+          <w:color w:val="C9211E"/>
+          <w:kern w:val="0"/>
+          <w:sz w:val="36"/>
+          <w:szCs w:val="36"/>
+          <w:shd w:fill="auto" w:val="clear"/>
+          <w:lang w:val="en-US" w:eastAsia="zh-CN" w:bidi="hi-IN"/>
+        </w:rPr>
+        <w:t>Término de bloco a ser avaliado se permanece</w:t>
+      </w:r>
+      <w:r>
+        <w:rPr>
+          <w:rFonts w:eastAsia="Times New Roman" w:cs="Times New Roman" w:ascii="Garamond" w:hAnsi="Garamond"/>
+          <w:color w:val="000000"/>
+          <w:kern w:val="0"/>
+          <w:sz w:val="36"/>
+          <w:szCs w:val="36"/>
+          <w:shd w:fill="auto" w:val="clear"/>
+          <w:lang w:val="en-US" w:eastAsia="zh-CN" w:bidi="hi-IN"/>
+        </w:rPr>
+        <w:t xml:space="preserve"> ]</w:t>
+      </w:r>
+    </w:p>
+    <w:p>
+      <w:pPr>
+        <w:pStyle w:val="Normal"/>
+        <w:jc w:val="both"/>
+        <w:rPr>
+          <w:sz w:val="36"/>
+          <w:szCs w:val="36"/>
+        </w:rPr>
+      </w:pPr>
+      <w:r>
+        <w:rPr/>
+      </w:r>
+    </w:p>
+    <w:p>
+      <w:pPr>
+        <w:pStyle w:val="Normal"/>
+        <w:jc w:val="both"/>
+        <w:rPr/>
+      </w:pPr>
+      <w:r>
+        <w:rPr>
+          <w:rFonts w:eastAsia="Times New Roman" w:cs="Times New Roman" w:ascii="Garamond" w:hAnsi="Garamond"/>
+          <w:color w:val="000000"/>
+          <w:kern w:val="0"/>
+          <w:sz w:val="36"/>
+          <w:szCs w:val="36"/>
+          <w:shd w:fill="auto" w:val="clear"/>
+          <w:lang w:val="en-US" w:eastAsia="zh-CN" w:bidi="hi-IN"/>
+        </w:rPr>
+        <w:t xml:space="preserve">[ </w:t>
+      </w:r>
+      <w:r>
+        <w:rPr>
+          <w:rFonts w:eastAsia="Times New Roman" w:cs="Times New Roman" w:ascii="Garamond" w:hAnsi="Garamond"/>
+          <w:b/>
+          <w:bCs/>
+          <w:color w:val="C9211E"/>
+          <w:kern w:val="0"/>
+          <w:sz w:val="36"/>
+          <w:szCs w:val="36"/>
+          <w:shd w:fill="auto" w:val="clear"/>
+          <w:lang w:val="en-US" w:eastAsia="zh-CN" w:bidi="hi-IN"/>
+        </w:rPr>
+        <w:t>Precisa ser desenvolvido e encaixado no texto</w:t>
+      </w:r>
+      <w:r>
+        <w:rPr>
+          <w:rFonts w:eastAsia="Times New Roman" w:cs="Times New Roman" w:ascii="Garamond" w:hAnsi="Garamond"/>
+          <w:color w:val="000000"/>
+          <w:kern w:val="0"/>
+          <w:sz w:val="36"/>
+          <w:szCs w:val="36"/>
+          <w:shd w:fill="auto" w:val="clear"/>
+          <w:lang w:val="en-US" w:eastAsia="zh-CN" w:bidi="hi-IN"/>
+        </w:rPr>
+        <w:t>] O que você formulou toca num ponto que muitos estudiosos também percebem: Jesus entra em confronto mais direto com quem está mais perto da verdade, mas a vive de forma distorcida. Os saduceus, por negarem a ressurreição, os anjos e a vida futura, estavam tão distantes da dimensão espiritual que o diálogo com eles tinha pouco espaço — Jesus os corrige, mas não trava com eles o mesmo tipo de debate moral e espiritual que tem com os fariseus.</w:t>
+      </w:r>
+    </w:p>
+    <w:p>
+      <w:pPr>
+        <w:pStyle w:val="Normal"/>
+        <w:jc w:val="both"/>
+        <w:rPr>
+          <w:rFonts w:ascii="Garamond" w:hAnsi="Garamond" w:eastAsia="Times New Roman" w:cs="Times New Roman"/>
+          <w:color w:val="000000"/>
+          <w:kern w:val="0"/>
+          <w:sz w:val="36"/>
+          <w:szCs w:val="36"/>
+          <w:shd w:fill="auto" w:val="clear"/>
+          <w:lang w:val="en-US" w:eastAsia="zh-CN" w:bidi="hi-IN"/>
+        </w:rPr>
+      </w:pPr>
+      <w:r>
+        <w:rPr/>
+      </w:r>
+    </w:p>
+    <w:p>
+      <w:pPr>
+        <w:pStyle w:val="Normal"/>
+        <w:jc w:val="both"/>
+        <w:rPr/>
+      </w:pPr>
+      <w:r>
+        <w:rPr>
+          <w:rFonts w:eastAsia="Times New Roman" w:cs="Times New Roman" w:ascii="Garamond" w:hAnsi="Garamond"/>
+          <w:color w:val="000000"/>
+          <w:kern w:val="0"/>
+          <w:sz w:val="36"/>
+          <w:szCs w:val="36"/>
+          <w:shd w:fill="auto" w:val="clear"/>
+          <w:lang w:val="en-US" w:eastAsia="zh-CN" w:bidi="hi-IN"/>
+        </w:rPr>
+        <w:t>Já os fariseus, por outro lado, acreditavam nas Escrituras, na vida após a morte, e na vinda do Messias — ou seja, estavam dentro do mesmo universo de fé que Jesus. O problema era que transformaram a fé em formalismo e hipocrisia, perdendo o coração do ensinamento que professavam. Por isso, Jesus os confronta com mais veemência: eles sabiam mais, mas viviam menos.</w:t>
+      </w:r>
+    </w:p>
+    <w:p>
+      <w:pPr>
+        <w:pStyle w:val="Normal"/>
+        <w:jc w:val="both"/>
+        <w:rPr>
+          <w:rFonts w:ascii="Garamond" w:hAnsi="Garamond" w:eastAsia="Times New Roman" w:cs="Times New Roman"/>
+          <w:color w:val="000000"/>
+          <w:kern w:val="0"/>
+          <w:sz w:val="36"/>
+          <w:szCs w:val="36"/>
+          <w:shd w:fill="auto" w:val="clear"/>
+          <w:lang w:val="en-US" w:eastAsia="zh-CN" w:bidi="hi-IN"/>
+        </w:rPr>
+      </w:pPr>
+      <w:r>
+        <w:rPr/>
+      </w:r>
+    </w:p>
+    <w:p>
+      <w:pPr>
+        <w:pStyle w:val="Normal"/>
+        <w:jc w:val="both"/>
+        <w:rPr/>
+      </w:pPr>
+      <w:r>
+        <w:rPr>
+          <w:rFonts w:eastAsia="Times New Roman" w:cs="Times New Roman" w:ascii="Garamond" w:hAnsi="Garamond"/>
+          <w:color w:val="000000"/>
+          <w:kern w:val="0"/>
+          <w:sz w:val="36"/>
+          <w:szCs w:val="36"/>
+          <w:shd w:fill="auto" w:val="clear"/>
+          <w:lang w:val="en-US" w:eastAsia="zh-CN" w:bidi="hi-IN"/>
+        </w:rPr>
+        <w:t>Em termos simbólicos, podemos dizer que:</w:t>
+      </w:r>
+    </w:p>
+    <w:p>
+      <w:pPr>
+        <w:pStyle w:val="Normal"/>
+        <w:jc w:val="both"/>
+        <w:rPr>
+          <w:rFonts w:ascii="Garamond" w:hAnsi="Garamond" w:eastAsia="Times New Roman" w:cs="Times New Roman"/>
+          <w:color w:val="000000"/>
+          <w:kern w:val="0"/>
+          <w:sz w:val="36"/>
+          <w:szCs w:val="36"/>
+          <w:shd w:fill="auto" w:val="clear"/>
+          <w:lang w:val="en-US" w:eastAsia="zh-CN" w:bidi="hi-IN"/>
+        </w:rPr>
+      </w:pPr>
+      <w:r>
+        <w:rPr/>
+      </w:r>
+    </w:p>
+    <w:p>
+      <w:pPr>
+        <w:pStyle w:val="Normal"/>
+        <w:jc w:val="both"/>
+        <w:rPr/>
+      </w:pPr>
+      <w:r>
+        <w:rPr>
+          <w:rFonts w:eastAsia="Times New Roman" w:cs="Times New Roman" w:ascii="Garamond" w:hAnsi="Garamond"/>
+          <w:color w:val="000000"/>
+          <w:kern w:val="0"/>
+          <w:sz w:val="36"/>
+          <w:szCs w:val="36"/>
+          <w:shd w:fill="auto" w:val="clear"/>
+          <w:lang w:val="en-US" w:eastAsia="zh-CN" w:bidi="hi-IN"/>
+        </w:rPr>
+        <w:t>Os saduceus representam o ceticismo religioso, que perde a dimensão do sagrado;</w:t>
+      </w:r>
+    </w:p>
+    <w:p>
+      <w:pPr>
+        <w:pStyle w:val="Normal"/>
+        <w:jc w:val="both"/>
+        <w:rPr>
+          <w:rFonts w:ascii="Garamond" w:hAnsi="Garamond" w:eastAsia="Times New Roman" w:cs="Times New Roman"/>
+          <w:color w:val="000000"/>
+          <w:kern w:val="0"/>
+          <w:sz w:val="36"/>
+          <w:szCs w:val="36"/>
+          <w:shd w:fill="auto" w:val="clear"/>
+          <w:lang w:val="en-US" w:eastAsia="zh-CN" w:bidi="hi-IN"/>
+        </w:rPr>
+      </w:pPr>
+      <w:r>
+        <w:rPr/>
+      </w:r>
+    </w:p>
+    <w:p>
+      <w:pPr>
+        <w:pStyle w:val="Normal"/>
+        <w:jc w:val="both"/>
+        <w:rPr/>
+      </w:pPr>
+      <w:r>
+        <w:rPr>
+          <w:rFonts w:eastAsia="Times New Roman" w:cs="Times New Roman" w:ascii="Garamond" w:hAnsi="Garamond"/>
+          <w:color w:val="000000"/>
+          <w:kern w:val="0"/>
+          <w:sz w:val="36"/>
+          <w:szCs w:val="36"/>
+          <w:shd w:fill="auto" w:val="clear"/>
+          <w:lang w:val="en-US" w:eastAsia="zh-CN" w:bidi="hi-IN"/>
+        </w:rPr>
+        <w:t>Os fariseus representam a religiosidade sem vida interior, que conserva a forma mas esquece o espírito.</w:t>
+      </w:r>
+    </w:p>
+    <w:p>
+      <w:pPr>
+        <w:pStyle w:val="Normal"/>
+        <w:jc w:val="both"/>
+        <w:rPr>
+          <w:rFonts w:ascii="Garamond" w:hAnsi="Garamond" w:eastAsia="Times New Roman" w:cs="Times New Roman"/>
+          <w:color w:val="000000"/>
+          <w:kern w:val="0"/>
+          <w:sz w:val="36"/>
+          <w:szCs w:val="36"/>
+          <w:shd w:fill="auto" w:val="clear"/>
+          <w:lang w:val="en-US" w:eastAsia="zh-CN" w:bidi="hi-IN"/>
+        </w:rPr>
+      </w:pPr>
+      <w:r>
+        <w:rPr/>
+      </w:r>
+    </w:p>
+    <w:p>
+      <w:pPr>
+        <w:pStyle w:val="Normal"/>
+        <w:jc w:val="both"/>
+        <w:rPr/>
+      </w:pPr>
+      <w:r>
+        <w:rPr>
+          <w:rFonts w:eastAsia="Times New Roman" w:cs="Times New Roman" w:ascii="Garamond" w:hAnsi="Garamond"/>
+          <w:color w:val="000000"/>
+          <w:kern w:val="0"/>
+          <w:sz w:val="36"/>
+          <w:szCs w:val="36"/>
+          <w:shd w:fill="auto" w:val="clear"/>
+          <w:lang w:val="en-US" w:eastAsia="zh-CN" w:bidi="hi-IN"/>
+        </w:rPr>
+        <w:t>E Jesus vem justamente para reconciliar a fé e o coração, chamando tanto uns quanto outros à verdade interior.</w:t>
+      </w:r>
+    </w:p>
+    <w:p>
+      <w:pPr>
+        <w:pStyle w:val="Normal"/>
+        <w:jc w:val="both"/>
+        <w:rPr>
+          <w:rFonts w:ascii="Garamond" w:hAnsi="Garamond" w:eastAsia="Times New Roman" w:cs="Times New Roman"/>
+          <w:color w:val="000000"/>
+          <w:kern w:val="0"/>
+          <w:sz w:val="36"/>
+          <w:szCs w:val="36"/>
+          <w:shd w:fill="auto" w:val="clear"/>
+          <w:lang w:val="en-US" w:eastAsia="zh-CN" w:bidi="hi-IN"/>
+        </w:rPr>
+      </w:pPr>
+      <w:r>
+        <w:rPr/>
+      </w:r>
+    </w:p>
+    <w:p>
+      <w:pPr>
+        <w:pStyle w:val="Normal"/>
+        <w:jc w:val="both"/>
+        <w:rPr/>
+      </w:pPr>
+      <w:r>
+        <w:rPr>
+          <w:rFonts w:eastAsia="Times New Roman" w:cs="Times New Roman" w:ascii="Garamond" w:hAnsi="Garamond"/>
+          <w:color w:val="000000"/>
+          <w:kern w:val="0"/>
+          <w:sz w:val="36"/>
+          <w:szCs w:val="36"/>
+          <w:shd w:fill="auto" w:val="clear"/>
+          <w:lang w:val="en-US" w:eastAsia="zh-CN" w:bidi="hi-IN"/>
+        </w:rPr>
+        <w:t>Sua leitura é muito lúcida — especialmente essa ideia de que é mais difícil ensinar quem está completamente distante da fé do que corrigir quem a conhece, mas a deturpou. Isso mostra uma compreensão espiritual bastante madura do Evangelho.</w:t>
+      </w:r>
+    </w:p>
+    <w:p>
+      <w:pPr>
+        <w:pStyle w:val="Normal"/>
+        <w:jc w:val="both"/>
+        <w:rPr>
+          <w:rFonts w:ascii="Garamond" w:hAnsi="Garamond" w:eastAsia="Times New Roman" w:cs="Times New Roman"/>
+          <w:color w:val="000000"/>
+          <w:kern w:val="0"/>
+          <w:sz w:val="36"/>
+          <w:szCs w:val="36"/>
+          <w:shd w:fill="auto" w:val="clear"/>
+          <w:lang w:val="en-US" w:eastAsia="zh-CN" w:bidi="hi-IN"/>
+        </w:rPr>
+      </w:pPr>
+      <w:r>
+        <w:rPr/>
+      </w:r>
+    </w:p>
+    <w:p>
+      <w:pPr>
+        <w:pStyle w:val="Normal"/>
+        <w:jc w:val="both"/>
+        <w:rPr>
+          <w:sz w:val="36"/>
+          <w:szCs w:val="36"/>
+        </w:rPr>
+      </w:pPr>
+      <w:r>
+        <w:rPr>
+          <w:rFonts w:eastAsia="Times New Roman" w:cs="Times New Roman" w:ascii="Garamond" w:hAnsi="Garamond"/>
+          <w:color w:val="000000"/>
+          <w:kern w:val="0"/>
+          <w:sz w:val="36"/>
+          <w:szCs w:val="36"/>
+          <w:shd w:fill="auto" w:val="clear"/>
+          <w:lang w:val="en-US" w:eastAsia="zh-CN" w:bidi="hi-IN"/>
+        </w:rPr>
+        <w:t>[ Ver onde encaixar ] Os saduceus, que não acreditavam na ressurreição, traziam questionamentos puro e simples teológicos — a vida após a morte era um tema que negavam, então sua tentativa era desafiar Jesus em algo que ele poderia não explicar satisfatoriamente.</w:t>
+      </w:r>
+    </w:p>
+    <w:p>
+      <w:pPr>
+        <w:pStyle w:val="Normal"/>
+        <w:jc w:val="both"/>
+        <w:rPr>
+          <w:sz w:val="36"/>
+          <w:szCs w:val="36"/>
+        </w:rPr>
+      </w:pPr>
+      <w:r>
+        <w:rPr/>
+      </w:r>
+    </w:p>
+    <w:p>
+      <w:pPr>
+        <w:pStyle w:val="Normal"/>
+        <w:jc w:val="both"/>
+        <w:rPr>
+          <w:sz w:val="36"/>
+          <w:szCs w:val="36"/>
+        </w:rPr>
+      </w:pPr>
+      <w:r>
+        <w:rPr>
+          <w:rFonts w:eastAsia="Times New Roman" w:cs="Times New Roman" w:ascii="Garamond" w:hAnsi="Garamond"/>
+          <w:color w:val="000000"/>
+          <w:kern w:val="0"/>
+          <w:sz w:val="36"/>
+          <w:szCs w:val="36"/>
+          <w:shd w:fill="auto" w:val="clear"/>
+          <w:lang w:val="en-US" w:eastAsia="zh-CN" w:bidi="hi-IN"/>
+        </w:rPr>
+        <w:t>Os fariseus, por outro lado, já tinham uma base de fé espiritual, mas buscavam manipular a situação social e política. Por isso, questionam assuntos materiais e cotidianos, mesmo acreditando na vida futura.</w:t>
+      </w:r>
+    </w:p>
+    <w:p>
+      <w:pPr>
+        <w:pStyle w:val="Normal"/>
+        <w:jc w:val="both"/>
+        <w:rPr>
+          <w:sz w:val="36"/>
+          <w:szCs w:val="36"/>
+        </w:rPr>
+      </w:pPr>
+      <w:r>
+        <w:rPr/>
+      </w:r>
+    </w:p>
+    <w:p>
+      <w:pPr>
+        <w:pStyle w:val="Normal"/>
+        <w:jc w:val="both"/>
+        <w:rPr>
+          <w:rFonts w:ascii="Garamond" w:hAnsi="Garamond" w:eastAsia="Times New Roman" w:cs="Times New Roman"/>
+          <w:color w:val="000000"/>
+          <w:kern w:val="0"/>
+          <w:sz w:val="36"/>
+          <w:szCs w:val="36"/>
+          <w:shd w:fill="auto" w:val="clear"/>
+          <w:lang w:val="en-US" w:eastAsia="zh-CN" w:bidi="hi-IN"/>
+        </w:rPr>
+      </w:pPr>
+      <w:r>
+        <w:rPr/>
+      </w:r>
+    </w:p>
+    <w:p>
+      <w:pPr>
+        <w:pStyle w:val="Normal"/>
+        <w:jc w:val="both"/>
+        <w:rPr>
+          <w:sz w:val="36"/>
+          <w:szCs w:val="36"/>
+        </w:rPr>
+      </w:pPr>
+      <w:r>
+        <w:rPr/>
+      </w:r>
+    </w:p>
+    <w:p>
+      <w:pPr>
+        <w:pStyle w:val="Normal"/>
+        <w:jc w:val="both"/>
+        <w:rPr>
+          <w:sz w:val="36"/>
+          <w:szCs w:val="36"/>
+        </w:rPr>
+      </w:pPr>
+      <w:r>
+        <w:rPr/>
+      </w:r>
+    </w:p>
+    <w:p>
+      <w:pPr>
+        <w:pStyle w:val="Normal"/>
+        <w:jc w:val="both"/>
+        <w:rPr>
+          <w:sz w:val="36"/>
+          <w:szCs w:val="36"/>
+        </w:rPr>
+      </w:pPr>
+      <w:r>
+        <w:rPr/>
+      </w:r>
+    </w:p>
+    <w:p>
+      <w:pPr>
+        <w:pStyle w:val="Normal"/>
+        <w:jc w:val="both"/>
+        <w:rPr>
+          <w:sz w:val="36"/>
+          <w:szCs w:val="36"/>
+        </w:rPr>
+      </w:pPr>
+      <w:r>
+        <w:rPr/>
+      </w:r>
+    </w:p>
+    <w:p>
+      <w:pPr>
+        <w:pStyle w:val="Normal"/>
+        <w:jc w:val="both"/>
+        <w:rPr>
+          <w:sz w:val="36"/>
+          <w:szCs w:val="36"/>
+        </w:rPr>
+      </w:pPr>
+      <w:r>
+        <w:rPr>
+          <w:rFonts w:eastAsia="Times New Roman" w:cs="Times New Roman" w:ascii="Garamond" w:hAnsi="Garamond"/>
+          <w:color w:val="000000"/>
+          <w:kern w:val="0"/>
+          <w:sz w:val="36"/>
+          <w:szCs w:val="36"/>
+          <w:shd w:fill="auto" w:val="clear"/>
+          <w:lang w:val="en-US" w:eastAsia="zh-CN" w:bidi="hi-IN"/>
+        </w:rPr>
+        <w:t xml:space="preserve">É importante nós observarmos que o capítulo 22 do Evangelho de Mateus, no qual está inserido o mandamento maior, apresenta de uma sequência de confrontos entre Jesus e os grupos religiosos e políticos da época </w:t>
+      </w:r>
+      <w:r>
+        <w:rPr>
+          <w:rFonts w:eastAsia="Times New Roman" w:cs="Times New Roman" w:ascii="Garamond" w:hAnsi="Garamond"/>
+          <w:color w:val="000000"/>
+          <w:kern w:val="0"/>
+          <w:sz w:val="36"/>
+          <w:szCs w:val="36"/>
+          <w:shd w:fill="auto" w:val="clear"/>
+          <w:lang w:val="en-US" w:eastAsia="zh-CN" w:bidi="hi-IN"/>
+        </w:rPr>
+        <w:t xml:space="preserve"> - </w:t>
+      </w:r>
+      <w:r>
+        <w:rPr>
+          <w:rFonts w:eastAsia="Times New Roman" w:cs="Times New Roman" w:ascii="Garamond" w:hAnsi="Garamond"/>
+          <w:color w:val="000000"/>
+          <w:kern w:val="0"/>
+          <w:sz w:val="36"/>
+          <w:szCs w:val="36"/>
+          <w:shd w:fill="auto" w:val="clear"/>
+          <w:lang w:val="en-US" w:eastAsia="zh-CN" w:bidi="hi-IN"/>
+        </w:rPr>
+        <w:t>fariseus, saduceus, doutores da lei</w:t>
+      </w:r>
+      <w:r>
+        <w:rPr>
+          <w:rFonts w:eastAsia="Times New Roman" w:cs="Times New Roman" w:ascii="Garamond" w:hAnsi="Garamond"/>
+          <w:color w:val="000000"/>
+          <w:kern w:val="0"/>
+          <w:sz w:val="36"/>
+          <w:szCs w:val="36"/>
+          <w:shd w:fill="auto" w:val="clear"/>
+          <w:lang w:val="en-US" w:eastAsia="zh-CN" w:bidi="hi-IN"/>
+        </w:rPr>
+        <w:t xml:space="preserve"> - </w:t>
+      </w:r>
+      <w:r>
+        <w:rPr>
+          <w:rFonts w:eastAsia="Times New Roman" w:cs="Times New Roman" w:ascii="Garamond" w:hAnsi="Garamond"/>
+          <w:color w:val="000000"/>
+          <w:kern w:val="0"/>
+          <w:sz w:val="36"/>
+          <w:szCs w:val="36"/>
+          <w:shd w:fill="auto" w:val="clear"/>
+          <w:lang w:val="en-US" w:eastAsia="zh-CN" w:bidi="hi-IN"/>
+        </w:rPr>
+        <w:t>, que tentavam testá-lo e colocá-lo em contradição.</w:t>
       </w:r>
     </w:p>
     <w:p>
@@ -1197,145 +2747,49 @@
           <w:shd w:fill="auto" w:val="clear"/>
           <w:lang w:val="en-US" w:eastAsia="zh-CN" w:bidi="hi-IN"/>
         </w:rPr>
-        <w:t>[</w:t>
-      </w:r>
-      <w:r>
-        <w:rPr>
-          <w:rFonts w:eastAsia="Times New Roman" w:cs="Times New Roman" w:ascii="Garamond" w:hAnsi="Garamond"/>
-          <w:color w:val="00A0FC"/>
-          <w:kern w:val="0"/>
-          <w:sz w:val="36"/>
-          <w:szCs w:val="36"/>
-          <w:shd w:fill="auto" w:val="clear"/>
-          <w:lang w:val="en-US" w:eastAsia="zh-CN" w:bidi="hi-IN"/>
-        </w:rPr>
-        <w:t xml:space="preserve"> Início - Tópico 1</w:t>
-      </w:r>
-      <w:r>
-        <w:rPr>
-          <w:rFonts w:eastAsia="Times New Roman" w:cs="Times New Roman" w:ascii="Garamond" w:hAnsi="Garamond"/>
-          <w:color w:val="00A0FC"/>
-          <w:kern w:val="0"/>
-          <w:sz w:val="36"/>
-          <w:szCs w:val="36"/>
-          <w:shd w:fill="auto" w:val="clear"/>
-          <w:lang w:val="en-US" w:eastAsia="zh-CN" w:bidi="hi-IN"/>
-        </w:rPr>
-        <w:t xml:space="preserve"> </w:t>
-      </w:r>
-      <w:r>
-        <w:rPr>
-          <w:rFonts w:eastAsia="Times New Roman" w:cs="Times New Roman" w:ascii="Garamond" w:hAnsi="Garamond"/>
-          <w:color w:val="00A0FC"/>
-          <w:kern w:val="0"/>
-          <w:sz w:val="36"/>
-          <w:szCs w:val="36"/>
-          <w:shd w:fill="auto" w:val="clear"/>
-          <w:lang w:val="en-US" w:eastAsia="zh-CN" w:bidi="hi-IN"/>
-        </w:rPr>
-        <w:t>]</w:t>
-      </w:r>
-    </w:p>
-    <w:p>
-      <w:pPr>
-        <w:pStyle w:val="Normal"/>
-        <w:jc w:val="both"/>
-        <w:rPr>
-          <w:color w:val="000000"/>
-        </w:rPr>
-      </w:pPr>
-      <w:r>
-        <w:rPr>
-          <w:rFonts w:eastAsia="Times New Roman" w:cs="Times New Roman" w:ascii="Garamond" w:hAnsi="Garamond"/>
-          <w:color w:val="000000"/>
-          <w:kern w:val="0"/>
-          <w:sz w:val="36"/>
-          <w:szCs w:val="36"/>
-          <w:shd w:fill="auto" w:val="clear"/>
-          <w:lang w:val="en-US" w:eastAsia="zh-CN" w:bidi="hi-IN"/>
-        </w:rPr>
-        <w:t xml:space="preserve">No </w:t>
-      </w:r>
-      <w:r>
-        <w:rPr>
-          <w:rFonts w:eastAsia="Times New Roman" w:cs="Times New Roman" w:ascii="Garamond" w:hAnsi="Garamond"/>
-          <w:color w:val="000000"/>
-          <w:kern w:val="0"/>
-          <w:sz w:val="36"/>
-          <w:szCs w:val="36"/>
-          <w:shd w:fill="auto" w:val="clear"/>
-          <w:lang w:val="en-US" w:eastAsia="zh-CN" w:bidi="hi-IN"/>
-        </w:rPr>
-        <w:t xml:space="preserve">versículo 37 </w:t>
-      </w:r>
-      <w:r>
-        <w:rPr>
-          <w:rFonts w:eastAsia="Times New Roman" w:cs="Times New Roman" w:ascii="Garamond" w:hAnsi="Garamond"/>
-          <w:color w:val="000000"/>
-          <w:kern w:val="0"/>
-          <w:sz w:val="36"/>
-          <w:szCs w:val="36"/>
-          <w:shd w:fill="auto" w:val="clear"/>
-          <w:lang w:val="en-US" w:eastAsia="zh-CN" w:bidi="hi-IN"/>
-        </w:rPr>
-        <w:t xml:space="preserve">Jesus </w:t>
-      </w:r>
-      <w:r>
-        <w:rPr>
-          <w:rFonts w:eastAsia="Times New Roman" w:cs="Times New Roman" w:ascii="Garamond" w:hAnsi="Garamond"/>
-          <w:color w:val="000000"/>
-          <w:kern w:val="0"/>
-          <w:sz w:val="36"/>
-          <w:szCs w:val="36"/>
-          <w:shd w:fill="auto" w:val="clear"/>
-          <w:lang w:val="en-US" w:eastAsia="zh-CN" w:bidi="hi-IN"/>
-        </w:rPr>
-        <w:t>diz: Amarás o Senhor teu Deus de todo o teu coração, e de toda a tua alma, e de todo o teu pensamento. Amar a Deus de coração, alma e pensamento. Vamos refletir sobre essas 3 diferentes expressões de amor a Deus.</w:t>
-      </w:r>
-    </w:p>
-    <w:p>
-      <w:pPr>
-        <w:pStyle w:val="Normal"/>
-        <w:jc w:val="both"/>
-        <w:rPr>
-          <w:color w:val="000000"/>
-        </w:rPr>
-      </w:pPr>
-      <w:r>
-        <w:rPr>
-          <w:rFonts w:eastAsia="Times New Roman" w:cs="Times New Roman" w:ascii="Garamond" w:hAnsi="Garamond"/>
-          <w:color w:val="000000"/>
-          <w:kern w:val="0"/>
-          <w:sz w:val="36"/>
-          <w:szCs w:val="36"/>
-          <w:shd w:fill="auto" w:val="clear"/>
-          <w:lang w:val="en-US" w:eastAsia="zh-CN" w:bidi="hi-IN"/>
-        </w:rPr>
-        <w:t xml:space="preserve">Existe </w:t>
-      </w:r>
-      <w:r>
-        <w:rPr>
-          <w:rFonts w:eastAsia="Times New Roman" w:cs="Times New Roman" w:ascii="Garamond" w:hAnsi="Garamond"/>
-          <w:color w:val="000000"/>
-          <w:kern w:val="0"/>
-          <w:sz w:val="36"/>
-          <w:szCs w:val="36"/>
-          <w:shd w:fill="auto" w:val="clear"/>
-          <w:lang w:val="en-US" w:eastAsia="zh-CN" w:bidi="hi-IN"/>
-        </w:rPr>
-        <w:t xml:space="preserve">uma riqueza simbólica e espiritual </w:t>
-      </w:r>
-      <w:r>
-        <w:rPr>
-          <w:rFonts w:eastAsia="Times New Roman" w:cs="Times New Roman" w:ascii="Garamond" w:hAnsi="Garamond"/>
-          <w:color w:val="000000"/>
-          <w:kern w:val="0"/>
-          <w:sz w:val="36"/>
-          <w:szCs w:val="36"/>
-          <w:shd w:fill="auto" w:val="clear"/>
-          <w:lang w:val="en-US" w:eastAsia="zh-CN" w:bidi="hi-IN"/>
-        </w:rPr>
-        <w:t>nessas palavras de Jesus, então vamos analisá-las sob a ótica da Doutrina Espírita.</w:t>
+        <w:t>[ Início - Tópico 1 ]</w:t>
+      </w:r>
+    </w:p>
+    <w:p>
+      <w:pPr>
+        <w:pStyle w:val="Normal"/>
+        <w:jc w:val="both"/>
+        <w:rPr>
+          <w:color w:val="000000"/>
+        </w:rPr>
+      </w:pPr>
+      <w:r>
+        <w:rPr>
+          <w:rFonts w:eastAsia="Times New Roman" w:cs="Times New Roman" w:ascii="Garamond" w:hAnsi="Garamond"/>
+          <w:color w:val="000000"/>
+          <w:kern w:val="0"/>
+          <w:sz w:val="36"/>
+          <w:szCs w:val="36"/>
+          <w:shd w:fill="auto" w:val="clear"/>
+          <w:lang w:val="en-US" w:eastAsia="zh-CN" w:bidi="hi-IN"/>
+        </w:rPr>
+        <w:t>No versículo 37 Jesus diz: Amarás o Senhor teu Deus de todo o teu coração, e de toda a tua alma, e de todo o teu pensamento. Amar a Deus de coração, alma e pensamento. Vamos refletir sobre essas 3 diferentes expressões de amor a Deus.</w:t>
+      </w:r>
+    </w:p>
+    <w:p>
+      <w:pPr>
+        <w:pStyle w:val="Normal"/>
+        <w:jc w:val="both"/>
+        <w:rPr>
+          <w:color w:val="000000"/>
+        </w:rPr>
+      </w:pPr>
+      <w:r>
+        <w:rPr>
+          <w:rFonts w:eastAsia="Times New Roman" w:cs="Times New Roman" w:ascii="Garamond" w:hAnsi="Garamond"/>
+          <w:color w:val="000000"/>
+          <w:kern w:val="0"/>
+          <w:sz w:val="36"/>
+          <w:szCs w:val="36"/>
+          <w:shd w:fill="auto" w:val="clear"/>
+          <w:lang w:val="en-US" w:eastAsia="zh-CN" w:bidi="hi-IN"/>
+        </w:rPr>
+        <w:t>Existe uma riqueza simbólica e espiritual nessas palavras de Jesus, então vamos analisá-las sob a ótica da Doutrina Espírita.</w:t>
       </w:r>
     </w:p>
     <w:p>
@@ -1419,138 +2873,42 @@
           <w:shd w:fill="auto" w:val="clear"/>
           <w:lang w:val="en-US" w:eastAsia="zh-CN" w:bidi="hi-IN"/>
         </w:rPr>
-        <w:t>O coração</w:t>
-      </w:r>
-      <w:r>
-        <w:rPr>
-          <w:rFonts w:eastAsia="Times New Roman" w:cs="Times New Roman" w:ascii="Garamond" w:hAnsi="Garamond"/>
-          <w:color w:val="000000"/>
-          <w:kern w:val="0"/>
-          <w:sz w:val="36"/>
-          <w:szCs w:val="36"/>
-          <w:shd w:fill="auto" w:val="clear"/>
-          <w:lang w:val="en-US" w:eastAsia="zh-CN" w:bidi="hi-IN"/>
-        </w:rPr>
-        <w:t xml:space="preserve"> é interpretado como a sede dos sentimentos humanos. Ele representa afeição, amor, mas também um sentimento moral. </w:t>
-      </w:r>
-      <w:r>
-        <w:rPr>
-          <w:rFonts w:eastAsia="Times New Roman" w:cs="Times New Roman" w:ascii="Garamond" w:hAnsi="Garamond"/>
-          <w:color w:val="000000"/>
-          <w:kern w:val="0"/>
-          <w:sz w:val="36"/>
-          <w:szCs w:val="36"/>
-          <w:shd w:fill="auto" w:val="clear"/>
-          <w:lang w:val="en-US" w:eastAsia="zh-CN" w:bidi="hi-IN"/>
-        </w:rPr>
-        <w:t>É símbolo do afeto profundo, da sinceridade do sentimento.</w:t>
-      </w:r>
-    </w:p>
-    <w:p>
-      <w:pPr>
-        <w:pStyle w:val="Normal"/>
-        <w:jc w:val="both"/>
-        <w:rPr>
-          <w:color w:val="000000"/>
-        </w:rPr>
-      </w:pPr>
-      <w:r>
-        <w:rPr>
-          <w:color w:val="000000"/>
-        </w:rPr>
-      </w:r>
-    </w:p>
-    <w:p>
-      <w:pPr>
-        <w:pStyle w:val="Normal"/>
-        <w:jc w:val="both"/>
-        <w:rPr>
-          <w:color w:val="000000"/>
-        </w:rPr>
-      </w:pPr>
-      <w:r>
-        <w:rPr>
-          <w:rFonts w:eastAsia="Times New Roman" w:cs="Times New Roman" w:ascii="Garamond" w:hAnsi="Garamond"/>
-          <w:color w:val="000000"/>
-          <w:kern w:val="0"/>
-          <w:sz w:val="36"/>
-          <w:szCs w:val="36"/>
-          <w:shd w:fill="auto" w:val="clear"/>
-          <w:lang w:val="en-US" w:eastAsia="zh-CN" w:bidi="hi-IN"/>
-        </w:rPr>
-        <w:t>Portanto, a</w:t>
-      </w:r>
-      <w:r>
-        <w:rPr>
-          <w:rFonts w:eastAsia="Times New Roman" w:cs="Times New Roman" w:ascii="Garamond" w:hAnsi="Garamond"/>
-          <w:color w:val="000000"/>
-          <w:kern w:val="0"/>
-          <w:sz w:val="36"/>
-          <w:szCs w:val="36"/>
-          <w:shd w:fill="auto" w:val="clear"/>
-          <w:lang w:val="en-US" w:eastAsia="zh-CN" w:bidi="hi-IN"/>
-        </w:rPr>
-        <w:t xml:space="preserve">mar de todo o coração </w:t>
-      </w:r>
-      <w:r>
-        <w:rPr>
-          <w:rFonts w:eastAsia="Times New Roman" w:cs="Times New Roman" w:ascii="Garamond" w:hAnsi="Garamond"/>
-          <w:color w:val="000000"/>
-          <w:kern w:val="0"/>
-          <w:sz w:val="36"/>
-          <w:szCs w:val="36"/>
-          <w:shd w:fill="auto" w:val="clear"/>
-          <w:lang w:val="en-US" w:eastAsia="zh-CN" w:bidi="hi-IN"/>
-        </w:rPr>
-        <w:t>significa</w:t>
-      </w:r>
-      <w:r>
-        <w:rPr>
-          <w:rFonts w:eastAsia="Times New Roman" w:cs="Times New Roman" w:ascii="Garamond" w:hAnsi="Garamond"/>
-          <w:color w:val="000000"/>
-          <w:kern w:val="0"/>
-          <w:sz w:val="36"/>
-          <w:szCs w:val="36"/>
-          <w:shd w:fill="auto" w:val="clear"/>
-          <w:lang w:val="en-US" w:eastAsia="zh-CN" w:bidi="hi-IN"/>
-        </w:rPr>
-        <w:t xml:space="preserve"> amar a Deus com pureza de sentimentos, sem hipocrisia</w:t>
-      </w:r>
-      <w:r>
-        <w:rPr>
-          <w:rFonts w:eastAsia="Times New Roman" w:cs="Times New Roman" w:ascii="Garamond" w:hAnsi="Garamond"/>
-          <w:color w:val="000000"/>
-          <w:kern w:val="0"/>
-          <w:sz w:val="36"/>
-          <w:szCs w:val="36"/>
-          <w:shd w:fill="auto" w:val="clear"/>
-          <w:lang w:val="en-US" w:eastAsia="zh-CN" w:bidi="hi-IN"/>
-        </w:rPr>
-        <w:t xml:space="preserve">; </w:t>
-      </w:r>
-      <w:r>
-        <w:rPr>
-          <w:rFonts w:eastAsia="Times New Roman" w:cs="Times New Roman" w:ascii="Garamond" w:hAnsi="Garamond"/>
-          <w:color w:val="000000"/>
-          <w:kern w:val="0"/>
-          <w:sz w:val="36"/>
-          <w:szCs w:val="36"/>
-          <w:shd w:fill="auto" w:val="clear"/>
-          <w:lang w:val="en-US" w:eastAsia="zh-CN" w:bidi="hi-IN"/>
-        </w:rPr>
-        <w:t>é</w:t>
-      </w:r>
-      <w:r>
-        <w:rPr>
-          <w:rFonts w:eastAsia="Times New Roman" w:cs="Times New Roman" w:ascii="Garamond" w:hAnsi="Garamond"/>
-          <w:color w:val="000000"/>
-          <w:kern w:val="0"/>
-          <w:sz w:val="36"/>
-          <w:szCs w:val="36"/>
-          <w:shd w:fill="auto" w:val="clear"/>
-          <w:lang w:val="en-US" w:eastAsia="zh-CN" w:bidi="hi-IN"/>
-        </w:rPr>
-        <w:t xml:space="preserve"> amar de forma concreta e não apenas através de palavras. </w:t>
+        <w:t>O coração é interpretado como a sede dos sentimentos humanos. Ele representa afeição, amor, mas também um sentimento moral. É símbolo do afeto profundo, da sinceridade do sentimento.</w:t>
+      </w:r>
+    </w:p>
+    <w:p>
+      <w:pPr>
+        <w:pStyle w:val="Normal"/>
+        <w:jc w:val="both"/>
+        <w:rPr>
+          <w:color w:val="000000"/>
+        </w:rPr>
+      </w:pPr>
+      <w:r>
+        <w:rPr>
+          <w:color w:val="000000"/>
+        </w:rPr>
+      </w:r>
+    </w:p>
+    <w:p>
+      <w:pPr>
+        <w:pStyle w:val="Normal"/>
+        <w:jc w:val="both"/>
+        <w:rPr>
+          <w:color w:val="000000"/>
+        </w:rPr>
+      </w:pPr>
+      <w:r>
+        <w:rPr>
+          <w:rFonts w:eastAsia="Times New Roman" w:cs="Times New Roman" w:ascii="Garamond" w:hAnsi="Garamond"/>
+          <w:color w:val="000000"/>
+          <w:kern w:val="0"/>
+          <w:sz w:val="36"/>
+          <w:szCs w:val="36"/>
+          <w:shd w:fill="auto" w:val="clear"/>
+          <w:lang w:val="en-US" w:eastAsia="zh-CN" w:bidi="hi-IN"/>
+        </w:rPr>
+        <w:t xml:space="preserve">Portanto, amar de todo o coração significa amar a Deus com pureza de sentimentos, sem hipocrisia; é amar de forma concreta e não apenas através de palavras. </w:t>
       </w:r>
     </w:p>
     <w:p>
@@ -1655,149 +3013,77 @@
           <w:shd w:fill="auto" w:val="clear"/>
           <w:lang w:val="en-US" w:eastAsia="zh-CN" w:bidi="hi-IN"/>
         </w:rPr>
-        <w:t>Em O Livro dos Espíritos, a Espiritualidade nos diz que alma nada mais é que o Espírito encarnado. A</w:t>
-      </w:r>
-      <w:r>
-        <w:rPr>
-          <w:rFonts w:eastAsia="Times New Roman" w:cs="Times New Roman" w:ascii="Garamond" w:hAnsi="Garamond"/>
-          <w:color w:val="000000"/>
-          <w:kern w:val="0"/>
-          <w:sz w:val="36"/>
-          <w:szCs w:val="36"/>
-          <w:shd w:fill="auto" w:val="clear"/>
-          <w:lang w:val="en-US" w:eastAsia="zh-CN" w:bidi="hi-IN"/>
-        </w:rPr>
-        <w:t xml:space="preserve"> </w:t>
-      </w:r>
-      <w:r>
-        <w:rPr>
-          <w:rFonts w:eastAsia="Times New Roman" w:cs="Times New Roman" w:ascii="Garamond" w:hAnsi="Garamond"/>
-          <w:color w:val="000000"/>
-          <w:kern w:val="0"/>
-          <w:sz w:val="36"/>
-          <w:szCs w:val="36"/>
-          <w:shd w:fill="auto" w:val="clear"/>
-          <w:lang w:val="en-US" w:eastAsia="zh-CN" w:bidi="hi-IN"/>
-        </w:rPr>
-        <w:t>alma é a própria essência do ser, a individualidade espiritual que sobrevive à morte.</w:t>
-      </w:r>
-    </w:p>
-    <w:p>
-      <w:pPr>
-        <w:pStyle w:val="Normal"/>
-        <w:jc w:val="both"/>
-        <w:rPr>
-          <w:color w:val="000000"/>
-        </w:rPr>
-      </w:pPr>
-      <w:r>
-        <w:rPr>
-          <w:color w:val="000000"/>
-        </w:rPr>
-      </w:r>
-    </w:p>
-    <w:p>
-      <w:pPr>
-        <w:pStyle w:val="Normal"/>
-        <w:jc w:val="both"/>
-        <w:rPr>
-          <w:color w:val="000000"/>
-        </w:rPr>
-      </w:pPr>
-      <w:r>
-        <w:rPr>
-          <w:rFonts w:eastAsia="Times New Roman" w:cs="Times New Roman" w:ascii="Garamond" w:hAnsi="Garamond"/>
-          <w:color w:val="000000"/>
-          <w:kern w:val="0"/>
-          <w:sz w:val="36"/>
-          <w:szCs w:val="36"/>
-          <w:shd w:fill="auto" w:val="clear"/>
-          <w:lang w:val="en-US" w:eastAsia="zh-CN" w:bidi="hi-IN"/>
-        </w:rPr>
-        <w:t xml:space="preserve">Amar a Deus de toda a alma </w:t>
-      </w:r>
-      <w:r>
-        <w:rPr>
-          <w:rFonts w:eastAsia="Times New Roman" w:cs="Times New Roman" w:ascii="Garamond" w:hAnsi="Garamond"/>
-          <w:color w:val="000000"/>
-          <w:kern w:val="0"/>
-          <w:sz w:val="36"/>
-          <w:szCs w:val="36"/>
-          <w:shd w:fill="auto" w:val="clear"/>
-          <w:lang w:val="en-US" w:eastAsia="zh-CN" w:bidi="hi-IN"/>
-        </w:rPr>
-        <w:t xml:space="preserve"> é </w:t>
-      </w:r>
-      <w:r>
-        <w:rPr>
-          <w:rFonts w:eastAsia="Times New Roman" w:cs="Times New Roman" w:ascii="Garamond" w:hAnsi="Garamond"/>
-          <w:color w:val="000000"/>
-          <w:kern w:val="0"/>
-          <w:sz w:val="36"/>
-          <w:szCs w:val="36"/>
-          <w:shd w:fill="auto" w:val="clear"/>
-          <w:lang w:val="en-US" w:eastAsia="zh-CN" w:bidi="hi-IN"/>
-        </w:rPr>
-        <w:t>amar com tudo o que somos, na nossa integralidade espiritual, como Espíritos imortais. Isso inclui a ideia de entrega total, de fidelidade a Deus acima de todas as coisas, inclusive acima dos interesses passageiros da vida material.</w:t>
-      </w:r>
-    </w:p>
-    <w:p>
-      <w:pPr>
-        <w:pStyle w:val="Normal"/>
-        <w:jc w:val="both"/>
-        <w:rPr>
-          <w:color w:val="000000"/>
-        </w:rPr>
-      </w:pPr>
-      <w:r>
-        <w:rPr>
-          <w:color w:val="000000"/>
-        </w:rPr>
-      </w:r>
-    </w:p>
-    <w:p>
-      <w:pPr>
-        <w:pStyle w:val="Normal"/>
-        <w:jc w:val="both"/>
-        <w:rPr>
-          <w:color w:val="000000"/>
-        </w:rPr>
-      </w:pPr>
-      <w:r>
-        <w:rPr>
-          <w:rFonts w:eastAsia="Times New Roman" w:cs="Times New Roman" w:ascii="Garamond" w:hAnsi="Garamond"/>
-          <w:color w:val="000000"/>
-          <w:kern w:val="0"/>
-          <w:sz w:val="36"/>
-          <w:szCs w:val="36"/>
-          <w:shd w:fill="auto" w:val="clear"/>
-          <w:lang w:val="en-US" w:eastAsia="zh-CN" w:bidi="hi-IN"/>
-        </w:rPr>
-        <w:t xml:space="preserve">É o amor que transcende a </w:t>
-      </w:r>
-      <w:r>
-        <w:rPr>
-          <w:rFonts w:eastAsia="Times New Roman" w:cs="Times New Roman" w:ascii="Garamond" w:hAnsi="Garamond"/>
-          <w:color w:val="000000"/>
-          <w:kern w:val="0"/>
-          <w:sz w:val="36"/>
-          <w:szCs w:val="36"/>
-          <w:shd w:fill="auto" w:val="clear"/>
-          <w:lang w:val="en-US" w:eastAsia="zh-CN" w:bidi="hi-IN"/>
-        </w:rPr>
-        <w:t>existência terrena</w:t>
-      </w:r>
-      <w:r>
-        <w:rPr>
-          <w:rFonts w:eastAsia="Times New Roman" w:cs="Times New Roman" w:ascii="Garamond" w:hAnsi="Garamond"/>
-          <w:color w:val="000000"/>
-          <w:kern w:val="0"/>
-          <w:sz w:val="36"/>
-          <w:szCs w:val="36"/>
-          <w:shd w:fill="auto" w:val="clear"/>
-          <w:lang w:val="en-US" w:eastAsia="zh-CN" w:bidi="hi-IN"/>
-        </w:rPr>
-        <w:t>: amar a Deus não só enquanto estamos no corpo, mas também como Espírito eterno.</w:t>
+        <w:t>Em O Livro dos Espíritos, a Espiritualidade nos diz que alma nada mais é que o Espírito encarnado. A alma é a própria essência do ser, a individualidade espiritual que sobrevive à morte.</w:t>
+      </w:r>
+    </w:p>
+    <w:p>
+      <w:pPr>
+        <w:pStyle w:val="Normal"/>
+        <w:jc w:val="both"/>
+        <w:rPr>
+          <w:color w:val="000000"/>
+        </w:rPr>
+      </w:pPr>
+      <w:r>
+        <w:rPr>
+          <w:color w:val="000000"/>
+        </w:rPr>
+      </w:r>
+    </w:p>
+    <w:p>
+      <w:pPr>
+        <w:pStyle w:val="Normal"/>
+        <w:jc w:val="both"/>
+        <w:rPr>
+          <w:color w:val="000000"/>
+        </w:rPr>
+      </w:pPr>
+      <w:r>
+        <w:rPr>
+          <w:rFonts w:eastAsia="Times New Roman" w:cs="Times New Roman" w:ascii="Garamond" w:hAnsi="Garamond"/>
+          <w:color w:val="000000"/>
+          <w:kern w:val="0"/>
+          <w:sz w:val="36"/>
+          <w:szCs w:val="36"/>
+          <w:shd w:fill="auto" w:val="clear"/>
+          <w:lang w:val="en-US" w:eastAsia="zh-CN" w:bidi="hi-IN"/>
+        </w:rPr>
+        <w:t>Amar a Deus de toda a alma  é amar com tudo o que somos, na nossa integralidade espiritual, como Espíritos imortais. Isso inclui a ideia de entrega total, de fidelidade a Deus acima de todas as coisas, inclusive acima dos interesses passageiros da vida material.</w:t>
+      </w:r>
+    </w:p>
+    <w:p>
+      <w:pPr>
+        <w:pStyle w:val="Normal"/>
+        <w:jc w:val="both"/>
+        <w:rPr>
+          <w:color w:val="000000"/>
+        </w:rPr>
+      </w:pPr>
+      <w:r>
+        <w:rPr>
+          <w:color w:val="000000"/>
+        </w:rPr>
+      </w:r>
+    </w:p>
+    <w:p>
+      <w:pPr>
+        <w:pStyle w:val="Normal"/>
+        <w:jc w:val="both"/>
+        <w:rPr>
+          <w:color w:val="000000"/>
+        </w:rPr>
+      </w:pPr>
+      <w:r>
+        <w:rPr>
+          <w:rFonts w:eastAsia="Times New Roman" w:cs="Times New Roman" w:ascii="Garamond" w:hAnsi="Garamond"/>
+          <w:color w:val="000000"/>
+          <w:kern w:val="0"/>
+          <w:sz w:val="36"/>
+          <w:szCs w:val="36"/>
+          <w:shd w:fill="auto" w:val="clear"/>
+          <w:lang w:val="en-US" w:eastAsia="zh-CN" w:bidi="hi-IN"/>
+        </w:rPr>
+        <w:t>É o amor que transcende a existência terrena: amar a Deus não só enquanto estamos no corpo, mas também como Espírito eterno.</w:t>
       </w:r>
     </w:p>
     <w:p>
@@ -1867,162 +3153,42 @@
           <w:shd w:fill="auto" w:val="clear"/>
           <w:lang w:val="en-US" w:eastAsia="zh-CN" w:bidi="hi-IN"/>
         </w:rPr>
-        <w:t xml:space="preserve">Aqui </w:t>
-      </w:r>
-      <w:r>
-        <w:rPr>
-          <w:rFonts w:eastAsia="Times New Roman" w:cs="Times New Roman" w:ascii="Garamond" w:hAnsi="Garamond"/>
-          <w:color w:val="000000"/>
-          <w:kern w:val="0"/>
-          <w:sz w:val="36"/>
-          <w:szCs w:val="36"/>
-          <w:shd w:fill="auto" w:val="clear"/>
-          <w:lang w:val="en-US" w:eastAsia="zh-CN" w:bidi="hi-IN"/>
-        </w:rPr>
-        <w:t>encontramos</w:t>
-      </w:r>
-      <w:r>
-        <w:rPr>
-          <w:rFonts w:eastAsia="Times New Roman" w:cs="Times New Roman" w:ascii="Garamond" w:hAnsi="Garamond"/>
-          <w:color w:val="000000"/>
-          <w:kern w:val="0"/>
-          <w:sz w:val="36"/>
-          <w:szCs w:val="36"/>
-          <w:shd w:fill="auto" w:val="clear"/>
-          <w:lang w:val="en-US" w:eastAsia="zh-CN" w:bidi="hi-IN"/>
-        </w:rPr>
-        <w:t xml:space="preserve"> a dimensão da fé raciocinada, que o Espiritismo </w:t>
-      </w:r>
-      <w:r>
-        <w:rPr>
-          <w:rFonts w:eastAsia="Times New Roman" w:cs="Times New Roman" w:ascii="Garamond" w:hAnsi="Garamond"/>
-          <w:color w:val="000000"/>
-          <w:kern w:val="0"/>
-          <w:sz w:val="36"/>
-          <w:szCs w:val="36"/>
-          <w:shd w:fill="auto" w:val="clear"/>
-          <w:lang w:val="en-US" w:eastAsia="zh-CN" w:bidi="hi-IN"/>
-        </w:rPr>
-        <w:t>nos ensina</w:t>
-      </w:r>
-      <w:r>
-        <w:rPr>
-          <w:rFonts w:eastAsia="Times New Roman" w:cs="Times New Roman" w:ascii="Garamond" w:hAnsi="Garamond"/>
-          <w:color w:val="000000"/>
-          <w:kern w:val="0"/>
-          <w:sz w:val="36"/>
-          <w:szCs w:val="36"/>
-          <w:shd w:fill="auto" w:val="clear"/>
-          <w:lang w:val="en-US" w:eastAsia="zh-CN" w:bidi="hi-IN"/>
-        </w:rPr>
-        <w:t>.</w:t>
-      </w:r>
-    </w:p>
-    <w:p>
-      <w:pPr>
-        <w:pStyle w:val="Normal"/>
-        <w:jc w:val="both"/>
-        <w:rPr>
-          <w:color w:val="000000"/>
-        </w:rPr>
-      </w:pPr>
-      <w:r>
-        <w:rPr>
-          <w:color w:val="000000"/>
-        </w:rPr>
-      </w:r>
-    </w:p>
-    <w:p>
-      <w:pPr>
-        <w:pStyle w:val="Normal"/>
-        <w:jc w:val="both"/>
-        <w:rPr>
-          <w:color w:val="000000"/>
-        </w:rPr>
-      </w:pPr>
-      <w:r>
-        <w:rPr>
-          <w:rFonts w:eastAsia="Times New Roman" w:cs="Times New Roman" w:ascii="Garamond" w:hAnsi="Garamond"/>
-          <w:color w:val="000000"/>
-          <w:kern w:val="0"/>
-          <w:sz w:val="36"/>
-          <w:szCs w:val="36"/>
-          <w:shd w:fill="auto" w:val="clear"/>
-          <w:lang w:val="en-US" w:eastAsia="zh-CN" w:bidi="hi-IN"/>
-        </w:rPr>
-        <w:t xml:space="preserve">Não é um amor cego, mas lúcido: </w:t>
-      </w:r>
-      <w:r>
-        <w:rPr>
-          <w:rFonts w:eastAsia="Times New Roman" w:cs="Times New Roman" w:ascii="Garamond" w:hAnsi="Garamond"/>
-          <w:color w:val="000000"/>
-          <w:kern w:val="0"/>
-          <w:sz w:val="36"/>
-          <w:szCs w:val="36"/>
-          <w:shd w:fill="auto" w:val="clear"/>
-          <w:lang w:val="en-US" w:eastAsia="zh-CN" w:bidi="hi-IN"/>
-        </w:rPr>
-        <w:t xml:space="preserve">nós </w:t>
-      </w:r>
-      <w:r>
-        <w:rPr>
-          <w:rFonts w:eastAsia="Times New Roman" w:cs="Times New Roman" w:ascii="Garamond" w:hAnsi="Garamond"/>
-          <w:color w:val="000000"/>
-          <w:kern w:val="0"/>
-          <w:sz w:val="36"/>
-          <w:szCs w:val="36"/>
-          <w:shd w:fill="auto" w:val="clear"/>
-          <w:lang w:val="en-US" w:eastAsia="zh-CN" w:bidi="hi-IN"/>
-        </w:rPr>
-        <w:t>sabemos por que amamos a Deus.</w:t>
-      </w:r>
-      <w:r>
-        <w:rPr>
-          <w:rFonts w:eastAsia="Times New Roman" w:cs="Times New Roman" w:ascii="Garamond" w:hAnsi="Garamond"/>
-          <w:color w:val="000000"/>
-          <w:kern w:val="0"/>
-          <w:sz w:val="36"/>
-          <w:szCs w:val="36"/>
-          <w:shd w:fill="auto" w:val="clear"/>
-          <w:lang w:val="en-US" w:eastAsia="zh-CN" w:bidi="hi-IN"/>
-        </w:rPr>
-        <w:t xml:space="preserve"> Através </w:t>
-      </w:r>
-      <w:r>
-        <w:rPr>
-          <w:rFonts w:eastAsia="Times New Roman" w:cs="Times New Roman" w:ascii="Garamond" w:hAnsi="Garamond"/>
-          <w:color w:val="000000"/>
-          <w:kern w:val="0"/>
-          <w:sz w:val="36"/>
-          <w:szCs w:val="36"/>
-          <w:shd w:fill="auto" w:val="clear"/>
-          <w:lang w:val="en-US" w:eastAsia="zh-CN" w:bidi="hi-IN"/>
-        </w:rPr>
-        <w:t>da inteligência e da consciência moral</w:t>
-      </w:r>
-      <w:r>
-        <w:rPr>
-          <w:rFonts w:eastAsia="Times New Roman" w:cs="Times New Roman" w:ascii="Garamond" w:hAnsi="Garamond"/>
-          <w:color w:val="000000"/>
-          <w:kern w:val="0"/>
-          <w:sz w:val="36"/>
-          <w:szCs w:val="36"/>
-          <w:shd w:fill="auto" w:val="clear"/>
-          <w:lang w:val="en-US" w:eastAsia="zh-CN" w:bidi="hi-IN"/>
-        </w:rPr>
-        <w:t>, reconhecemos</w:t>
-      </w:r>
-      <w:r>
-        <w:rPr>
-          <w:rFonts w:eastAsia="Times New Roman" w:cs="Times New Roman" w:ascii="Garamond" w:hAnsi="Garamond"/>
-          <w:color w:val="000000"/>
-          <w:kern w:val="0"/>
-          <w:sz w:val="36"/>
-          <w:szCs w:val="36"/>
-          <w:shd w:fill="auto" w:val="clear"/>
-          <w:lang w:val="en-US" w:eastAsia="zh-CN" w:bidi="hi-IN"/>
-        </w:rPr>
-        <w:t xml:space="preserve"> a justiça, a bondade e a sabedoria divinas.</w:t>
+        <w:t>Aqui encontramos a dimensão da fé raciocinada, que o Espiritismo nos ensina.</w:t>
+      </w:r>
+    </w:p>
+    <w:p>
+      <w:pPr>
+        <w:pStyle w:val="Normal"/>
+        <w:jc w:val="both"/>
+        <w:rPr>
+          <w:color w:val="000000"/>
+        </w:rPr>
+      </w:pPr>
+      <w:r>
+        <w:rPr>
+          <w:color w:val="000000"/>
+        </w:rPr>
+      </w:r>
+    </w:p>
+    <w:p>
+      <w:pPr>
+        <w:pStyle w:val="Normal"/>
+        <w:jc w:val="both"/>
+        <w:rPr>
+          <w:color w:val="000000"/>
+        </w:rPr>
+      </w:pPr>
+      <w:r>
+        <w:rPr>
+          <w:rFonts w:eastAsia="Times New Roman" w:cs="Times New Roman" w:ascii="Garamond" w:hAnsi="Garamond"/>
+          <w:color w:val="000000"/>
+          <w:kern w:val="0"/>
+          <w:sz w:val="36"/>
+          <w:szCs w:val="36"/>
+          <w:shd w:fill="auto" w:val="clear"/>
+          <w:lang w:val="en-US" w:eastAsia="zh-CN" w:bidi="hi-IN"/>
+        </w:rPr>
+        <w:t>Não é um amor cego, mas lúcido: nós sabemos por que amamos a Deus. Através da inteligência e da consciência moral, reconhecemos a justiça, a bondade e a sabedoria divinas.</w:t>
       </w:r>
     </w:p>
     <w:p>
@@ -2127,197 +3293,77 @@
           <w:shd w:fill="auto" w:val="clear"/>
           <w:lang w:val="en-US" w:eastAsia="zh-CN" w:bidi="hi-IN"/>
         </w:rPr>
-        <w:t xml:space="preserve">Portanto, por mais estranheza, tristeza e até mesmo uma certa revolta que essas situações nos causem, com a fé raciocinada </w:t>
-      </w:r>
-      <w:r>
-        <w:rPr>
-          <w:rFonts w:eastAsia="Times New Roman" w:cs="Times New Roman" w:ascii="Garamond" w:hAnsi="Garamond"/>
-          <w:color w:val="000000"/>
-          <w:kern w:val="0"/>
-          <w:sz w:val="36"/>
-          <w:szCs w:val="36"/>
-          <w:shd w:fill="auto" w:val="clear"/>
-          <w:lang w:val="en-US" w:eastAsia="zh-CN" w:bidi="hi-IN"/>
-        </w:rPr>
-        <w:t>entendemos</w:t>
-      </w:r>
-      <w:r>
-        <w:rPr>
-          <w:rFonts w:eastAsia="Times New Roman" w:cs="Times New Roman" w:ascii="Garamond" w:hAnsi="Garamond"/>
-          <w:color w:val="000000"/>
-          <w:kern w:val="0"/>
-          <w:sz w:val="36"/>
-          <w:szCs w:val="36"/>
-          <w:shd w:fill="auto" w:val="clear"/>
-          <w:lang w:val="en-US" w:eastAsia="zh-CN" w:bidi="hi-IN"/>
-        </w:rPr>
-        <w:t xml:space="preserve"> que todas as coisas estão sob o controle e </w:t>
-      </w:r>
-      <w:r>
-        <w:rPr>
-          <w:rFonts w:eastAsia="Times New Roman" w:cs="Times New Roman" w:ascii="Garamond" w:hAnsi="Garamond"/>
-          <w:color w:val="000000"/>
-          <w:kern w:val="0"/>
-          <w:sz w:val="36"/>
-          <w:szCs w:val="36"/>
-          <w:shd w:fill="auto" w:val="clear"/>
-          <w:lang w:val="en-US" w:eastAsia="zh-CN" w:bidi="hi-IN"/>
-        </w:rPr>
-        <w:t>de acordo com a vontade</w:t>
-      </w:r>
-      <w:r>
-        <w:rPr>
-          <w:rFonts w:eastAsia="Times New Roman" w:cs="Times New Roman" w:ascii="Garamond" w:hAnsi="Garamond"/>
-          <w:color w:val="000000"/>
-          <w:kern w:val="0"/>
-          <w:sz w:val="36"/>
-          <w:szCs w:val="36"/>
-          <w:shd w:fill="auto" w:val="clear"/>
-          <w:lang w:val="en-US" w:eastAsia="zh-CN" w:bidi="hi-IN"/>
-        </w:rPr>
-        <w:t xml:space="preserve"> de Deus</w:t>
-      </w:r>
-      <w:r>
-        <w:rPr>
-          <w:rFonts w:eastAsia="Times New Roman" w:cs="Times New Roman" w:ascii="Garamond" w:hAnsi="Garamond"/>
-          <w:color w:val="000000"/>
-          <w:kern w:val="0"/>
-          <w:sz w:val="36"/>
-          <w:szCs w:val="36"/>
-          <w:shd w:fill="auto" w:val="clear"/>
-          <w:lang w:val="en-US" w:eastAsia="zh-CN" w:bidi="hi-IN"/>
-        </w:rPr>
-        <w:t>. Nós é que ainda somos incapazes de compreender os desígnios de Deus.</w:t>
-      </w:r>
-      <w:r>
-        <w:rPr>
-          <w:rFonts w:eastAsia="Times New Roman" w:cs="Times New Roman" w:ascii="Garamond" w:hAnsi="Garamond"/>
-          <w:color w:val="000000"/>
-          <w:kern w:val="0"/>
-          <w:sz w:val="36"/>
-          <w:szCs w:val="36"/>
-          <w:shd w:fill="auto" w:val="clear"/>
-          <w:lang w:val="en-US" w:eastAsia="zh-CN" w:bidi="hi-IN"/>
-        </w:rPr>
-        <w:t xml:space="preserve"> </w:t>
-      </w:r>
-    </w:p>
-    <w:p>
-      <w:pPr>
-        <w:pStyle w:val="Normal"/>
-        <w:jc w:val="both"/>
-        <w:rPr>
-          <w:color w:val="000000"/>
-        </w:rPr>
-      </w:pPr>
-      <w:r>
-        <w:rPr>
-          <w:color w:val="000000"/>
-        </w:rPr>
-      </w:r>
-    </w:p>
-    <w:p>
-      <w:pPr>
-        <w:pStyle w:val="Normal"/>
-        <w:jc w:val="both"/>
-        <w:rPr>
-          <w:color w:val="000000"/>
-        </w:rPr>
-      </w:pPr>
-      <w:r>
-        <w:rPr>
-          <w:rFonts w:eastAsia="Times New Roman" w:cs="Times New Roman" w:ascii="Garamond" w:hAnsi="Garamond"/>
-          <w:color w:val="000000"/>
-          <w:kern w:val="0"/>
-          <w:sz w:val="36"/>
-          <w:szCs w:val="36"/>
-          <w:shd w:fill="auto" w:val="clear"/>
-          <w:lang w:val="en-US" w:eastAsia="zh-CN" w:bidi="hi-IN"/>
-        </w:rPr>
-        <w:t>Por fim, amar a Deus em pensamento é</w:t>
-      </w:r>
-      <w:r>
-        <w:rPr>
-          <w:rFonts w:eastAsia="Times New Roman" w:cs="Times New Roman" w:ascii="Garamond" w:hAnsi="Garamond"/>
-          <w:color w:val="000000"/>
-          <w:kern w:val="0"/>
-          <w:sz w:val="36"/>
-          <w:szCs w:val="36"/>
-          <w:shd w:fill="auto" w:val="clear"/>
-          <w:lang w:val="en-US" w:eastAsia="zh-CN" w:bidi="hi-IN"/>
-        </w:rPr>
-        <w:t xml:space="preserve"> também o exercício de manter a mente sintonizada com o bem, ocupando o pensamento com </w:t>
-      </w:r>
-      <w:r>
-        <w:rPr>
-          <w:rFonts w:eastAsia="Times New Roman" w:cs="Times New Roman" w:ascii="Garamond" w:hAnsi="Garamond"/>
-          <w:color w:val="000000"/>
-          <w:kern w:val="0"/>
-          <w:sz w:val="36"/>
-          <w:szCs w:val="36"/>
-          <w:shd w:fill="auto" w:val="clear"/>
-          <w:lang w:val="en-US" w:eastAsia="zh-CN" w:bidi="hi-IN"/>
-        </w:rPr>
-        <w:t xml:space="preserve">tudo aquilo que nos </w:t>
-      </w:r>
-      <w:r>
-        <w:rPr>
-          <w:rFonts w:eastAsia="Times New Roman" w:cs="Times New Roman" w:ascii="Garamond" w:hAnsi="Garamond"/>
-          <w:color w:val="000000"/>
-          <w:kern w:val="0"/>
-          <w:sz w:val="36"/>
-          <w:szCs w:val="36"/>
-          <w:shd w:fill="auto" w:val="clear"/>
-          <w:lang w:val="en-US" w:eastAsia="zh-CN" w:bidi="hi-IN"/>
-        </w:rPr>
-        <w:t xml:space="preserve"> eleva.</w:t>
-      </w:r>
-    </w:p>
-    <w:p>
-      <w:pPr>
-        <w:pStyle w:val="Normal"/>
-        <w:jc w:val="both"/>
-        <w:rPr>
-          <w:color w:val="000000"/>
-        </w:rPr>
-      </w:pPr>
-      <w:r>
-        <w:rPr>
-          <w:color w:val="000000"/>
-        </w:rPr>
-      </w:r>
-    </w:p>
-    <w:p>
-      <w:pPr>
-        <w:pStyle w:val="Normal"/>
-        <w:jc w:val="both"/>
-        <w:rPr>
-          <w:color w:val="000000"/>
-        </w:rPr>
-      </w:pPr>
-      <w:r>
-        <w:rPr>
-          <w:rFonts w:eastAsia="Times New Roman" w:cs="Times New Roman" w:ascii="Garamond" w:hAnsi="Garamond"/>
-          <w:color w:val="000000"/>
-          <w:kern w:val="0"/>
-          <w:sz w:val="36"/>
-          <w:szCs w:val="36"/>
-          <w:shd w:fill="auto" w:val="clear"/>
-          <w:lang w:val="en-US" w:eastAsia="zh-CN" w:bidi="hi-IN"/>
-        </w:rPr>
-        <w:t>Podemos então</w:t>
-      </w:r>
-      <w:r>
-        <w:rPr>
-          <w:rFonts w:eastAsia="Times New Roman" w:cs="Times New Roman" w:ascii="Garamond" w:hAnsi="Garamond"/>
-          <w:color w:val="000000"/>
-          <w:kern w:val="0"/>
-          <w:sz w:val="36"/>
-          <w:szCs w:val="36"/>
-          <w:shd w:fill="auto" w:val="clear"/>
-          <w:lang w:val="en-US" w:eastAsia="zh-CN" w:bidi="hi-IN"/>
-        </w:rPr>
-        <w:t xml:space="preserve"> dizer que:</w:t>
+        <w:t xml:space="preserve">Portanto, por mais estranheza, tristeza e até mesmo uma certa revolta que essas situações nos causem, com a fé raciocinada entendemos que todas as coisas estão sob o controle e de acordo com a vontade de Deus. Nós é que ainda somos incapazes de compreender os desígnios de Deus. </w:t>
+      </w:r>
+    </w:p>
+    <w:p>
+      <w:pPr>
+        <w:pStyle w:val="Normal"/>
+        <w:jc w:val="both"/>
+        <w:rPr>
+          <w:color w:val="000000"/>
+        </w:rPr>
+      </w:pPr>
+      <w:r>
+        <w:rPr>
+          <w:color w:val="000000"/>
+        </w:rPr>
+      </w:r>
+    </w:p>
+    <w:p>
+      <w:pPr>
+        <w:pStyle w:val="Normal"/>
+        <w:jc w:val="both"/>
+        <w:rPr>
+          <w:color w:val="000000"/>
+        </w:rPr>
+      </w:pPr>
+      <w:r>
+        <w:rPr>
+          <w:rFonts w:eastAsia="Times New Roman" w:cs="Times New Roman" w:ascii="Garamond" w:hAnsi="Garamond"/>
+          <w:color w:val="000000"/>
+          <w:kern w:val="0"/>
+          <w:sz w:val="36"/>
+          <w:szCs w:val="36"/>
+          <w:shd w:fill="auto" w:val="clear"/>
+          <w:lang w:val="en-US" w:eastAsia="zh-CN" w:bidi="hi-IN"/>
+        </w:rPr>
+        <w:t>Por fim, amar a Deus em pensamento é também o exercício de manter a mente sintonizada com o bem, ocupando o pensamento com tudo aquilo que nos  eleva.</w:t>
+      </w:r>
+    </w:p>
+    <w:p>
+      <w:pPr>
+        <w:pStyle w:val="Normal"/>
+        <w:jc w:val="both"/>
+        <w:rPr>
+          <w:color w:val="000000"/>
+        </w:rPr>
+      </w:pPr>
+      <w:r>
+        <w:rPr>
+          <w:color w:val="000000"/>
+        </w:rPr>
+      </w:r>
+    </w:p>
+    <w:p>
+      <w:pPr>
+        <w:pStyle w:val="Normal"/>
+        <w:jc w:val="both"/>
+        <w:rPr>
+          <w:color w:val="000000"/>
+        </w:rPr>
+      </w:pPr>
+      <w:r>
+        <w:rPr>
+          <w:rFonts w:eastAsia="Times New Roman" w:cs="Times New Roman" w:ascii="Garamond" w:hAnsi="Garamond"/>
+          <w:color w:val="000000"/>
+          <w:kern w:val="0"/>
+          <w:sz w:val="36"/>
+          <w:szCs w:val="36"/>
+          <w:shd w:fill="auto" w:val="clear"/>
+          <w:lang w:val="en-US" w:eastAsia="zh-CN" w:bidi="hi-IN"/>
+        </w:rPr>
+        <w:t>Podemos então dizer que:</w:t>
       </w:r>
     </w:p>
     <w:p>
@@ -2441,19 +3487,7 @@
           <w:shd w:fill="auto" w:val="clear"/>
           <w:lang w:val="en-US" w:eastAsia="zh-CN" w:bidi="hi-IN"/>
         </w:rPr>
-        <w:t>Portanto</w:t>
-      </w:r>
-      <w:r>
-        <w:rPr>
-          <w:rFonts w:eastAsia="Times New Roman" w:cs="Times New Roman" w:ascii="Garamond" w:hAnsi="Garamond"/>
-          <w:color w:val="000000"/>
-          <w:kern w:val="0"/>
-          <w:sz w:val="36"/>
-          <w:szCs w:val="36"/>
-          <w:shd w:fill="auto" w:val="clear"/>
-          <w:lang w:val="en-US" w:eastAsia="zh-CN" w:bidi="hi-IN"/>
-        </w:rPr>
-        <w:t>, Jesus não deixa espaço para um amor parcial: Ele nos convida a amar a Deus com toda a nossa sensibilidade (coração), toda a nossa essência espiritual (alma) e toda a nossa razão (pensamento).</w:t>
+        <w:t>Portanto, Jesus não deixa espaço para um amor parcial: Ele nos convida a amar a Deus com toda a nossa sensibilidade (coração), toda a nossa essência espiritual (alma) e toda a nossa razão (pensamento).</w:t>
       </w:r>
     </w:p>
     <w:p>
@@ -2467,7 +3501,11 @@
         </w:rPr>
       </w:pPr>
       <w:r>
-        <w:rPr/>
+        <w:rPr>
+          <w:color w:val="00A0FC"/>
+          <w:sz w:val="36"/>
+          <w:szCs w:val="36"/>
+        </w:rPr>
       </w:r>
     </w:p>
     <w:p>
@@ -6060,7 +7098,7 @@
         <w:bCs/>
         <w:rFonts w:ascii="Garamond" w:hAnsi="Garamond"/>
       </w:rPr>
-      <w:t>20</w:t>
+      <w:t>28</w:t>
     </w:r>
     <w:r>
       <w:rPr>

</xml_diff>

<commit_message>
06/10/2025 - 21:26 h
</commit_message>
<xml_diff>
--- a/O mandamento maior/O Mandamento Maior.docx
+++ b/O mandamento maior/O Mandamento Maior.docx
@@ -89,79 +89,7 @@
           <w:shd w:fill="auto" w:val="clear"/>
           <w:lang w:val="en-US" w:eastAsia="zh-CN" w:bidi="hi-IN"/>
         </w:rPr>
-        <w:t xml:space="preserve">O tema das nossas reflexões de hoje é "O mandamento maior". </w:t>
-      </w:r>
-      <w:r>
-        <w:rPr>
-          <w:rFonts w:eastAsia="Times New Roman" w:cs="Times New Roman" w:ascii="Garamond" w:hAnsi="Garamond"/>
-          <w:color w:val="000000"/>
-          <w:kern w:val="0"/>
-          <w:sz w:val="36"/>
-          <w:szCs w:val="36"/>
-          <w:shd w:fill="auto" w:val="clear"/>
-          <w:lang w:val="en-US" w:eastAsia="zh-CN" w:bidi="hi-IN"/>
-        </w:rPr>
-        <w:t xml:space="preserve">Vamos iniciar então lendo </w:t>
-      </w:r>
-      <w:r>
-        <w:rPr>
-          <w:rFonts w:eastAsia="Times New Roman" w:cs="Times New Roman" w:ascii="Garamond" w:hAnsi="Garamond"/>
-          <w:color w:val="000000"/>
-          <w:kern w:val="0"/>
-          <w:sz w:val="36"/>
-          <w:szCs w:val="36"/>
-          <w:shd w:fill="auto" w:val="clear"/>
-          <w:lang w:val="en-US" w:eastAsia="zh-CN" w:bidi="hi-IN"/>
-        </w:rPr>
-        <w:t xml:space="preserve">a passagem evangélica onde esse mandamento nos foi </w:t>
-      </w:r>
-      <w:r>
-        <w:rPr>
-          <w:rFonts w:eastAsia="Times New Roman" w:cs="Times New Roman" w:ascii="Garamond" w:hAnsi="Garamond"/>
-          <w:color w:val="000000"/>
-          <w:kern w:val="0"/>
-          <w:sz w:val="36"/>
-          <w:szCs w:val="36"/>
-          <w:shd w:fill="auto" w:val="clear"/>
-          <w:lang w:val="en-US" w:eastAsia="zh-CN" w:bidi="hi-IN"/>
-        </w:rPr>
-        <w:t>apresentado</w:t>
-      </w:r>
-      <w:r>
-        <w:rPr>
-          <w:rFonts w:eastAsia="Times New Roman" w:cs="Times New Roman" w:ascii="Garamond" w:hAnsi="Garamond"/>
-          <w:color w:val="000000"/>
-          <w:kern w:val="0"/>
-          <w:sz w:val="36"/>
-          <w:szCs w:val="36"/>
-          <w:shd w:fill="auto" w:val="clear"/>
-          <w:lang w:val="en-US" w:eastAsia="zh-CN" w:bidi="hi-IN"/>
-        </w:rPr>
-        <w:t xml:space="preserve"> por Jesus. El</w:t>
-      </w:r>
-      <w:r>
-        <w:rPr>
-          <w:rFonts w:eastAsia="Times New Roman" w:cs="Times New Roman" w:ascii="Garamond" w:hAnsi="Garamond"/>
-          <w:color w:val="000000"/>
-          <w:kern w:val="0"/>
-          <w:sz w:val="36"/>
-          <w:szCs w:val="36"/>
-          <w:shd w:fill="auto" w:val="clear"/>
-          <w:lang w:val="en-US" w:eastAsia="zh-CN" w:bidi="hi-IN"/>
-        </w:rPr>
-        <w:t>a</w:t>
-      </w:r>
-      <w:r>
-        <w:rPr>
-          <w:rFonts w:eastAsia="Times New Roman" w:cs="Times New Roman" w:ascii="Garamond" w:hAnsi="Garamond"/>
-          <w:color w:val="000000"/>
-          <w:kern w:val="0"/>
-          <w:sz w:val="36"/>
-          <w:szCs w:val="36"/>
-          <w:shd w:fill="auto" w:val="clear"/>
-          <w:lang w:val="en-US" w:eastAsia="zh-CN" w:bidi="hi-IN"/>
-        </w:rPr>
-        <w:t xml:space="preserve"> encontra-se em Mateus 22:34-40:</w:t>
+        <w:t>O tema das nossas reflexões de hoje é "O mandamento maior". Vamos iniciar então lendo a passagem evangélica onde esse mandamento nos foi apresentado por Jesus. Ela encontra-se em Mateus 22:34-40:</w:t>
       </w:r>
     </w:p>
     <w:p>
@@ -394,7 +322,313 @@
           <w:shd w:fill="auto" w:val="clear"/>
           <w:lang w:val="en-US" w:eastAsia="zh-CN" w:bidi="hi-IN"/>
         </w:rPr>
-        <w:t>Embora seja no capítulo 22 que está o tema do nosso estudo de hoje, vamos traçar alguns comentários sobre os ensinamentos de Jesus apresentados nos capítulos 21, 22 e 23 do evangelho de Mateus. Isso vai nos ajudar a compreender melhor o porquê Jesus ter nos dado o ensinamento maior.</w:t>
+        <w:t xml:space="preserve">Embora seja no capítulo 22 que está o tema do nosso estudo de hoje, vamos traçar </w:t>
+      </w:r>
+      <w:r>
+        <w:rPr>
+          <w:rFonts w:eastAsia="Times New Roman" w:cs="Times New Roman" w:ascii="Garamond" w:hAnsi="Garamond"/>
+          <w:color w:val="000000"/>
+          <w:kern w:val="0"/>
+          <w:sz w:val="36"/>
+          <w:szCs w:val="36"/>
+          <w:shd w:fill="auto" w:val="clear"/>
+          <w:lang w:val="en-US" w:eastAsia="zh-CN" w:bidi="hi-IN"/>
+        </w:rPr>
+        <w:t>um paralelo</w:t>
+      </w:r>
+      <w:r>
+        <w:rPr>
+          <w:rFonts w:eastAsia="Times New Roman" w:cs="Times New Roman" w:ascii="Garamond" w:hAnsi="Garamond"/>
+          <w:color w:val="000000"/>
+          <w:kern w:val="0"/>
+          <w:sz w:val="36"/>
+          <w:szCs w:val="36"/>
+          <w:shd w:fill="auto" w:val="clear"/>
+          <w:lang w:val="en-US" w:eastAsia="zh-CN" w:bidi="hi-IN"/>
+        </w:rPr>
+        <w:t xml:space="preserve"> </w:t>
+      </w:r>
+      <w:r>
+        <w:rPr>
+          <w:rFonts w:eastAsia="Times New Roman" w:cs="Times New Roman" w:ascii="Garamond" w:hAnsi="Garamond"/>
+          <w:color w:val="000000"/>
+          <w:kern w:val="0"/>
+          <w:sz w:val="36"/>
+          <w:szCs w:val="36"/>
+          <w:shd w:fill="auto" w:val="clear"/>
+          <w:lang w:val="en-US" w:eastAsia="zh-CN" w:bidi="hi-IN"/>
+        </w:rPr>
+        <w:t xml:space="preserve">entre capítulos 21, 22 e 23 do evangelho de Mateus. </w:t>
+      </w:r>
+      <w:r>
+        <w:rPr>
+          <w:rFonts w:eastAsia="Times New Roman" w:cs="Times New Roman" w:ascii="Garamond" w:hAnsi="Garamond"/>
+          <w:color w:val="000000"/>
+          <w:kern w:val="0"/>
+          <w:sz w:val="36"/>
+          <w:szCs w:val="36"/>
+          <w:shd w:fill="auto" w:val="clear"/>
+          <w:lang w:val="en-US" w:eastAsia="zh-CN" w:bidi="hi-IN"/>
+        </w:rPr>
+        <w:t xml:space="preserve">Isso vai nos ajudar a compreender melhor </w:t>
+      </w:r>
+      <w:r>
+        <w:rPr>
+          <w:rFonts w:eastAsia="Times New Roman" w:cs="Times New Roman" w:ascii="Garamond" w:hAnsi="Garamond"/>
+          <w:color w:val="000000"/>
+          <w:kern w:val="0"/>
+          <w:sz w:val="36"/>
+          <w:szCs w:val="36"/>
+          <w:shd w:fill="auto" w:val="clear"/>
+          <w:lang w:val="en-US" w:eastAsia="zh-CN" w:bidi="hi-IN"/>
+        </w:rPr>
+        <w:t>a essência d</w:t>
+      </w:r>
+      <w:r>
+        <w:rPr>
+          <w:rFonts w:eastAsia="Times New Roman" w:cs="Times New Roman" w:ascii="Garamond" w:hAnsi="Garamond"/>
+          <w:color w:val="000000"/>
+          <w:kern w:val="0"/>
+          <w:sz w:val="36"/>
+          <w:szCs w:val="36"/>
+          <w:shd w:fill="auto" w:val="clear"/>
+          <w:lang w:val="en-US" w:eastAsia="zh-CN" w:bidi="hi-IN"/>
+        </w:rPr>
+        <w:t xml:space="preserve">o </w:t>
+      </w:r>
+      <w:r>
+        <w:rPr>
+          <w:rFonts w:eastAsia="Times New Roman" w:cs="Times New Roman" w:ascii="Garamond" w:hAnsi="Garamond"/>
+          <w:color w:val="000000"/>
+          <w:kern w:val="0"/>
+          <w:sz w:val="36"/>
+          <w:szCs w:val="36"/>
+          <w:shd w:fill="auto" w:val="clear"/>
+          <w:lang w:val="en-US" w:eastAsia="zh-CN" w:bidi="hi-IN"/>
+        </w:rPr>
+        <w:t>mandamento</w:t>
+      </w:r>
+      <w:r>
+        <w:rPr>
+          <w:rFonts w:eastAsia="Times New Roman" w:cs="Times New Roman" w:ascii="Garamond" w:hAnsi="Garamond"/>
+          <w:color w:val="000000"/>
+          <w:kern w:val="0"/>
+          <w:sz w:val="36"/>
+          <w:szCs w:val="36"/>
+          <w:shd w:fill="auto" w:val="clear"/>
+          <w:lang w:val="en-US" w:eastAsia="zh-CN" w:bidi="hi-IN"/>
+        </w:rPr>
+        <w:t xml:space="preserve"> maior.</w:t>
+      </w:r>
+    </w:p>
+    <w:p>
+      <w:pPr>
+        <w:pStyle w:val="Normal"/>
+        <w:jc w:val="both"/>
+        <w:rPr>
+          <w:sz w:val="36"/>
+          <w:szCs w:val="36"/>
+        </w:rPr>
+      </w:pPr>
+      <w:r>
+        <w:rPr>
+          <w:sz w:val="36"/>
+          <w:szCs w:val="36"/>
+        </w:rPr>
+      </w:r>
+    </w:p>
+    <w:p>
+      <w:pPr>
+        <w:pStyle w:val="Normal"/>
+        <w:jc w:val="both"/>
+        <w:rPr>
+          <w:sz w:val="36"/>
+          <w:szCs w:val="36"/>
+        </w:rPr>
+      </w:pPr>
+      <w:r>
+        <w:rPr>
+          <w:rFonts w:eastAsia="Times New Roman" w:cs="Times New Roman" w:ascii="Garamond" w:hAnsi="Garamond"/>
+          <w:color w:val="000000"/>
+          <w:kern w:val="0"/>
+          <w:sz w:val="36"/>
+          <w:szCs w:val="36"/>
+          <w:shd w:fill="auto" w:val="clear"/>
+          <w:lang w:val="en-US" w:eastAsia="zh-CN" w:bidi="hi-IN"/>
+        </w:rPr>
+        <w:t xml:space="preserve">Esses três capítulos - 21, 22 e 23 - formam  </w:t>
+      </w:r>
+      <w:r>
+        <w:rPr>
+          <w:rFonts w:eastAsia="Times New Roman" w:cs="Times New Roman" w:ascii="Garamond" w:hAnsi="Garamond"/>
+          <w:color w:val="000000"/>
+          <w:kern w:val="0"/>
+          <w:sz w:val="36"/>
+          <w:szCs w:val="36"/>
+          <w:shd w:fill="auto" w:val="clear"/>
+          <w:lang w:val="en-US" w:eastAsia="zh-CN" w:bidi="hi-IN"/>
+        </w:rPr>
+        <w:t>uma espécie de</w:t>
+      </w:r>
+      <w:r>
+        <w:rPr>
+          <w:rFonts w:eastAsia="Times New Roman" w:cs="Times New Roman" w:ascii="Garamond" w:hAnsi="Garamond"/>
+          <w:color w:val="000000"/>
+          <w:kern w:val="0"/>
+          <w:sz w:val="36"/>
+          <w:szCs w:val="36"/>
+          <w:shd w:fill="auto" w:val="clear"/>
+          <w:lang w:val="en-US" w:eastAsia="zh-CN" w:bidi="hi-IN"/>
+        </w:rPr>
+        <w:t xml:space="preserve"> “trilogia moral de transição”, onde Jesus nos convida a abandonar a  religiosidade meramente formal e </w:t>
+      </w:r>
+      <w:r>
+        <w:rPr>
+          <w:rFonts w:eastAsia="Times New Roman" w:cs="Times New Roman" w:ascii="Garamond" w:hAnsi="Garamond"/>
+          <w:color w:val="000000"/>
+          <w:kern w:val="0"/>
+          <w:sz w:val="36"/>
+          <w:szCs w:val="36"/>
+          <w:shd w:fill="auto" w:val="clear"/>
+          <w:lang w:val="en-US" w:eastAsia="zh-CN" w:bidi="hi-IN"/>
+        </w:rPr>
+        <w:t xml:space="preserve">externa e </w:t>
+      </w:r>
+      <w:r>
+        <w:rPr>
+          <w:rFonts w:eastAsia="Times New Roman" w:cs="Times New Roman" w:ascii="Garamond" w:hAnsi="Garamond"/>
+          <w:color w:val="000000"/>
+          <w:kern w:val="0"/>
+          <w:sz w:val="36"/>
+          <w:szCs w:val="36"/>
+          <w:shd w:fill="auto" w:val="clear"/>
+          <w:lang w:val="en-US" w:eastAsia="zh-CN" w:bidi="hi-IN"/>
+        </w:rPr>
+        <w:t>abraçarmos a religiosidade verdadeira vivida no amor.</w:t>
+      </w:r>
+    </w:p>
+    <w:p>
+      <w:pPr>
+        <w:pStyle w:val="Normal"/>
+        <w:jc w:val="both"/>
+        <w:rPr>
+          <w:sz w:val="36"/>
+          <w:szCs w:val="36"/>
+        </w:rPr>
+      </w:pPr>
+      <w:r>
+        <w:rPr>
+          <w:sz w:val="36"/>
+          <w:szCs w:val="36"/>
+        </w:rPr>
+      </w:r>
+    </w:p>
+    <w:p>
+      <w:pPr>
+        <w:pStyle w:val="Normal"/>
+        <w:jc w:val="both"/>
+        <w:rPr>
+          <w:sz w:val="36"/>
+          <w:szCs w:val="36"/>
+        </w:rPr>
+      </w:pPr>
+      <w:r>
+        <w:rPr>
+          <w:rFonts w:eastAsia="Times New Roman" w:cs="Times New Roman" w:ascii="Garamond" w:hAnsi="Garamond"/>
+          <w:color w:val="000000"/>
+          <w:kern w:val="0"/>
+          <w:sz w:val="36"/>
+          <w:szCs w:val="36"/>
+          <w:shd w:fill="auto" w:val="clear"/>
+          <w:lang w:val="en-US" w:eastAsia="zh-CN" w:bidi="hi-IN"/>
+        </w:rPr>
+        <w:t>Na cronologia do evangelho de Mateus, é exatamente no capítulo 21 que começam a ser narrados os últimos dias d</w:t>
+      </w:r>
+      <w:r>
+        <w:rPr>
+          <w:rFonts w:eastAsia="Times New Roman" w:cs="Times New Roman" w:ascii="Garamond" w:hAnsi="Garamond"/>
+          <w:color w:val="000000"/>
+          <w:kern w:val="0"/>
+          <w:sz w:val="36"/>
+          <w:szCs w:val="36"/>
+          <w:shd w:fill="auto" w:val="clear"/>
+          <w:lang w:val="en-US" w:eastAsia="zh-CN" w:bidi="hi-IN"/>
+        </w:rPr>
+        <w:t>e</w:t>
+      </w:r>
+      <w:r>
+        <w:rPr>
+          <w:rFonts w:eastAsia="Times New Roman" w:cs="Times New Roman" w:ascii="Garamond" w:hAnsi="Garamond"/>
+          <w:color w:val="000000"/>
+          <w:kern w:val="0"/>
+          <w:sz w:val="36"/>
+          <w:szCs w:val="36"/>
+          <w:shd w:fill="auto" w:val="clear"/>
+          <w:lang w:val="en-US" w:eastAsia="zh-CN" w:bidi="hi-IN"/>
+        </w:rPr>
+        <w:t xml:space="preserve"> vida de Jesus na Terra. Esse capítulo inicia-se com a entrada triunfante de Jesus em Jerusalém.</w:t>
+      </w:r>
+    </w:p>
+    <w:p>
+      <w:pPr>
+        <w:pStyle w:val="Normal"/>
+        <w:jc w:val="both"/>
+        <w:rPr>
+          <w:sz w:val="36"/>
+          <w:szCs w:val="36"/>
+        </w:rPr>
+      </w:pPr>
+      <w:r>
+        <w:rPr>
+          <w:sz w:val="36"/>
+          <w:szCs w:val="36"/>
+        </w:rPr>
+      </w:r>
+    </w:p>
+    <w:p>
+      <w:pPr>
+        <w:pStyle w:val="Normal"/>
+        <w:jc w:val="both"/>
+        <w:rPr>
+          <w:sz w:val="36"/>
+          <w:szCs w:val="36"/>
+        </w:rPr>
+      </w:pPr>
+      <w:r>
+        <w:rPr>
+          <w:rFonts w:eastAsia="Times New Roman" w:cs="Times New Roman" w:ascii="Garamond" w:hAnsi="Garamond"/>
+          <w:color w:val="000000"/>
+          <w:kern w:val="0"/>
+          <w:sz w:val="36"/>
+          <w:szCs w:val="36"/>
+          <w:shd w:fill="auto" w:val="clear"/>
+          <w:lang w:val="en-US" w:eastAsia="zh-CN" w:bidi="hi-IN"/>
+        </w:rPr>
+        <w:t>Jesus tinha pleno conhecimento do que estava prestes a acontecer com Ele</w:t>
+      </w:r>
+      <w:r>
+        <w:rPr>
+          <w:rFonts w:eastAsia="Times New Roman" w:cs="Times New Roman" w:ascii="Garamond" w:hAnsi="Garamond"/>
+          <w:color w:val="000000"/>
+          <w:kern w:val="0"/>
+          <w:sz w:val="36"/>
+          <w:szCs w:val="36"/>
+          <w:shd w:fill="auto" w:val="clear"/>
+          <w:lang w:val="en-US" w:eastAsia="zh-CN" w:bidi="hi-IN"/>
+        </w:rPr>
+        <w:t>; a prisão, o julgamento, a condenação e a cruficicação.</w:t>
+      </w:r>
+      <w:r>
+        <w:rPr>
+          <w:rFonts w:eastAsia="Times New Roman" w:cs="Times New Roman" w:ascii="Garamond" w:hAnsi="Garamond"/>
+          <w:color w:val="000000"/>
+          <w:kern w:val="0"/>
+          <w:sz w:val="36"/>
+          <w:szCs w:val="36"/>
+          <w:shd w:fill="auto" w:val="clear"/>
+          <w:lang w:val="en-US" w:eastAsia="zh-CN" w:bidi="hi-IN"/>
+        </w:rPr>
+        <w:t xml:space="preserve"> Por isso, em seus últimos dias entre os homens, Ele nos falou com tanta ênfase sobre nossa necessidade de vivermos de forma pura, simples e verdadeira, construindo tesouros para o Reino dos Céus e não para a Terra.</w:t>
       </w:r>
     </w:p>
     <w:p>
@@ -429,7 +663,259 @@
           <w:shd w:fill="auto" w:val="clear"/>
           <w:lang w:val="en-US" w:eastAsia="zh-CN" w:bidi="hi-IN"/>
         </w:rPr>
-        <w:t>Esses três capítulos - 21, 22 e 23 - formam  aquilo que podemos chamar “trilogia moral de transição”, onde Jesus nos convida a abandonar a  religiosidade meramente formal e abraçarmos a religiosidade verdadeira vivida no amor.</w:t>
+        <w:t>Por isso é que encontramos nesses 3 capítulos tantos confrontos de Jesus com líderes religiosos e políticos, sobretudo os saduceus e fariseus.</w:t>
+      </w:r>
+    </w:p>
+    <w:p>
+      <w:pPr>
+        <w:pStyle w:val="Normal"/>
+        <w:jc w:val="both"/>
+        <w:rPr>
+          <w:sz w:val="36"/>
+          <w:szCs w:val="36"/>
+        </w:rPr>
+      </w:pPr>
+      <w:r>
+        <w:rPr>
+          <w:sz w:val="36"/>
+          <w:szCs w:val="36"/>
+        </w:rPr>
+      </w:r>
+    </w:p>
+    <w:p>
+      <w:pPr>
+        <w:pStyle w:val="Normal"/>
+        <w:jc w:val="both"/>
+        <w:rPr>
+          <w:u w:val="single"/>
+        </w:rPr>
+      </w:pPr>
+      <w:r>
+        <w:rPr>
+          <w:rFonts w:eastAsia="Times New Roman" w:cs="Times New Roman" w:ascii="Garamond" w:hAnsi="Garamond"/>
+          <w:color w:val="000000"/>
+          <w:kern w:val="0"/>
+          <w:sz w:val="36"/>
+          <w:szCs w:val="36"/>
+          <w:u w:val="single"/>
+          <w:shd w:fill="auto" w:val="clear"/>
+          <w:lang w:val="en-US" w:eastAsia="zh-CN" w:bidi="hi-IN"/>
+        </w:rPr>
+        <w:t>Capítulo 21</w:t>
+      </w:r>
+    </w:p>
+    <w:p>
+      <w:pPr>
+        <w:pStyle w:val="Normal"/>
+        <w:jc w:val="both"/>
+        <w:rPr>
+          <w:sz w:val="36"/>
+          <w:szCs w:val="36"/>
+        </w:rPr>
+      </w:pPr>
+      <w:r>
+        <w:rPr>
+          <w:rFonts w:eastAsia="Times New Roman" w:cs="Times New Roman" w:ascii="Garamond" w:hAnsi="Garamond"/>
+          <w:color w:val="000000"/>
+          <w:kern w:val="0"/>
+          <w:sz w:val="36"/>
+          <w:szCs w:val="36"/>
+          <w:shd w:fill="auto" w:val="clear"/>
+          <w:lang w:val="en-US" w:eastAsia="zh-CN" w:bidi="hi-IN"/>
+        </w:rPr>
+        <w:t xml:space="preserve">Jesus denuncia a esterilidade da fé exterior. A figueira estéril </w:t>
+      </w:r>
+      <w:r>
+        <w:rPr>
+          <w:rFonts w:eastAsia="Times New Roman" w:cs="Times New Roman" w:ascii="Garamond" w:hAnsi="Garamond"/>
+          <w:color w:val="000000"/>
+          <w:kern w:val="0"/>
+          <w:sz w:val="36"/>
+          <w:szCs w:val="36"/>
+          <w:shd w:fill="auto" w:val="clear"/>
+          <w:lang w:val="en-US" w:eastAsia="zh-CN" w:bidi="hi-IN"/>
+        </w:rPr>
+        <w:t>que Jesus seca</w:t>
+      </w:r>
+      <w:r>
+        <w:rPr>
+          <w:rFonts w:eastAsia="Times New Roman" w:cs="Times New Roman" w:ascii="Garamond" w:hAnsi="Garamond"/>
+          <w:color w:val="000000"/>
+          <w:kern w:val="0"/>
+          <w:sz w:val="36"/>
+          <w:szCs w:val="36"/>
+          <w:shd w:fill="auto" w:val="clear"/>
+          <w:lang w:val="en-US" w:eastAsia="zh-CN" w:bidi="hi-IN"/>
+        </w:rPr>
+        <w:t xml:space="preserve"> e </w:t>
+      </w:r>
+      <w:r>
+        <w:rPr>
+          <w:rFonts w:eastAsia="Times New Roman" w:cs="Times New Roman" w:ascii="Garamond" w:hAnsi="Garamond"/>
+          <w:color w:val="000000"/>
+          <w:kern w:val="0"/>
+          <w:sz w:val="36"/>
+          <w:szCs w:val="36"/>
+          <w:shd w:fill="auto" w:val="clear"/>
+          <w:lang w:val="en-US" w:eastAsia="zh-CN" w:bidi="hi-IN"/>
+        </w:rPr>
+        <w:t>os</w:t>
+      </w:r>
+      <w:r>
+        <w:rPr>
+          <w:rFonts w:eastAsia="Times New Roman" w:cs="Times New Roman" w:ascii="Garamond" w:hAnsi="Garamond"/>
+          <w:color w:val="000000"/>
+          <w:kern w:val="0"/>
+          <w:sz w:val="36"/>
+          <w:szCs w:val="36"/>
+          <w:shd w:fill="auto" w:val="clear"/>
+          <w:lang w:val="en-US" w:eastAsia="zh-CN" w:bidi="hi-IN"/>
+        </w:rPr>
+        <w:t xml:space="preserve"> vendedores </w:t>
+      </w:r>
+      <w:r>
+        <w:rPr>
+          <w:rFonts w:eastAsia="Times New Roman" w:cs="Times New Roman" w:ascii="Garamond" w:hAnsi="Garamond"/>
+          <w:color w:val="000000"/>
+          <w:kern w:val="0"/>
+          <w:sz w:val="36"/>
+          <w:szCs w:val="36"/>
+          <w:shd w:fill="auto" w:val="clear"/>
+          <w:lang w:val="en-US" w:eastAsia="zh-CN" w:bidi="hi-IN"/>
+        </w:rPr>
+        <w:t xml:space="preserve">aos quais Jesus expulsa </w:t>
+      </w:r>
+      <w:r>
+        <w:rPr>
+          <w:rFonts w:eastAsia="Times New Roman" w:cs="Times New Roman" w:ascii="Garamond" w:hAnsi="Garamond"/>
+          <w:color w:val="000000"/>
+          <w:kern w:val="0"/>
+          <w:sz w:val="36"/>
+          <w:szCs w:val="36"/>
+          <w:shd w:fill="auto" w:val="clear"/>
+          <w:lang w:val="en-US" w:eastAsia="zh-CN" w:bidi="hi-IN"/>
+        </w:rPr>
+        <w:t xml:space="preserve">do Templo são símbolos da alma que aparenta religiosidade, mas não produz obras de amor. </w:t>
+      </w:r>
+    </w:p>
+    <w:p>
+      <w:pPr>
+        <w:pStyle w:val="Normal"/>
+        <w:jc w:val="both"/>
+        <w:rPr>
+          <w:sz w:val="36"/>
+          <w:szCs w:val="36"/>
+        </w:rPr>
+      </w:pPr>
+      <w:r>
+        <w:rPr>
+          <w:sz w:val="36"/>
+          <w:szCs w:val="36"/>
+        </w:rPr>
+      </w:r>
+    </w:p>
+    <w:p>
+      <w:pPr>
+        <w:pStyle w:val="Normal"/>
+        <w:jc w:val="both"/>
+        <w:rPr>
+          <w:u w:val="single"/>
+        </w:rPr>
+      </w:pPr>
+      <w:r>
+        <w:rPr>
+          <w:rFonts w:eastAsia="Times New Roman" w:cs="Times New Roman" w:ascii="Garamond" w:hAnsi="Garamond"/>
+          <w:color w:val="000000"/>
+          <w:kern w:val="0"/>
+          <w:sz w:val="36"/>
+          <w:szCs w:val="36"/>
+          <w:u w:val="single"/>
+          <w:shd w:fill="auto" w:val="clear"/>
+          <w:lang w:val="en-US" w:eastAsia="zh-CN" w:bidi="hi-IN"/>
+        </w:rPr>
+        <w:t>Capítulo 22</w:t>
+      </w:r>
+    </w:p>
+    <w:p>
+      <w:pPr>
+        <w:pStyle w:val="Normal"/>
+        <w:jc w:val="both"/>
+        <w:rPr>
+          <w:sz w:val="36"/>
+          <w:szCs w:val="36"/>
+        </w:rPr>
+      </w:pPr>
+      <w:r>
+        <w:rPr>
+          <w:rFonts w:eastAsia="Times New Roman" w:cs="Times New Roman" w:ascii="Garamond" w:hAnsi="Garamond"/>
+          <w:color w:val="000000"/>
+          <w:kern w:val="0"/>
+          <w:sz w:val="36"/>
+          <w:szCs w:val="36"/>
+          <w:shd w:fill="auto" w:val="clear"/>
+          <w:lang w:val="en-US" w:eastAsia="zh-CN" w:bidi="hi-IN"/>
+        </w:rPr>
+        <w:t xml:space="preserve">Jesus censurou a religiosidade superficial de saduceus e fariseus. Aos primeiros, por reduzirem a fé a rituais e negarem a vida espiritual; aos segundos, por transformarem a Lei em instrumento de vaidade e julgamento. Em ambos, Ele revelou o mesmo erro: a distância entre a aparência e o coração. </w:t>
+      </w:r>
+    </w:p>
+    <w:p>
+      <w:pPr>
+        <w:pStyle w:val="Normal"/>
+        <w:jc w:val="both"/>
+        <w:rPr>
+          <w:sz w:val="36"/>
+          <w:szCs w:val="36"/>
+        </w:rPr>
+      </w:pPr>
+      <w:r>
+        <w:rPr>
+          <w:sz w:val="36"/>
+          <w:szCs w:val="36"/>
+        </w:rPr>
+      </w:r>
+    </w:p>
+    <w:p>
+      <w:pPr>
+        <w:pStyle w:val="Normal"/>
+        <w:jc w:val="both"/>
+        <w:rPr>
+          <w:u w:val="single"/>
+        </w:rPr>
+      </w:pPr>
+      <w:r>
+        <w:rPr>
+          <w:rFonts w:eastAsia="Times New Roman" w:cs="Times New Roman" w:ascii="Garamond" w:hAnsi="Garamond"/>
+          <w:color w:val="000000"/>
+          <w:kern w:val="0"/>
+          <w:sz w:val="36"/>
+          <w:szCs w:val="36"/>
+          <w:u w:val="single"/>
+          <w:shd w:fill="auto" w:val="clear"/>
+          <w:lang w:val="en-US" w:eastAsia="zh-CN" w:bidi="hi-IN"/>
+        </w:rPr>
+        <w:t>Capítulo 23</w:t>
+      </w:r>
+    </w:p>
+    <w:p>
+      <w:pPr>
+        <w:pStyle w:val="Normal"/>
+        <w:jc w:val="both"/>
+        <w:rPr>
+          <w:sz w:val="36"/>
+          <w:szCs w:val="36"/>
+        </w:rPr>
+      </w:pPr>
+      <w:r>
+        <w:rPr>
+          <w:rFonts w:eastAsia="Times New Roman" w:cs="Times New Roman" w:ascii="Garamond" w:hAnsi="Garamond"/>
+          <w:color w:val="000000"/>
+          <w:kern w:val="0"/>
+          <w:sz w:val="36"/>
+          <w:szCs w:val="36"/>
+          <w:shd w:fill="auto" w:val="clear"/>
+          <w:lang w:val="en-US" w:eastAsia="zh-CN" w:bidi="hi-IN"/>
+        </w:rPr>
+        <w:t>Jesus faz o juízo moral e convoca à sinceridade do coração. Aos escribas e fariseus, denuncia a hipocrisia e alerta sobre o perigo de servir às aparências. Seu lamento sobre Jerusalém é também um convite à humanidade inteira: abrir o coração para o amor e para a verdade.</w:t>
       </w:r>
     </w:p>
     <w:p>
@@ -464,7 +950,7 @@
           <w:shd w:fill="auto" w:val="clear"/>
           <w:lang w:val="en-US" w:eastAsia="zh-CN" w:bidi="hi-IN"/>
         </w:rPr>
-        <w:t>Na cronologia do evangelho de Mateus, é exatamente no capítulo 21 que começam a ser narrados os últimos dias da vida de Jesus na Terra. Esse capítulo inicia-se com a entrada triunfante de Jesus em Jerusalém.</w:t>
+        <w:t xml:space="preserve">Embora Jesus tenha confrontado tanto os saduceus quanto os fariseus, é importante distinguir uns dos outros para entendermos a natureza dos confrontos que Jesus teve com eles. </w:t>
       </w:r>
     </w:p>
     <w:p>
@@ -499,7 +985,43 @@
           <w:shd w:fill="auto" w:val="clear"/>
           <w:lang w:val="en-US" w:eastAsia="zh-CN" w:bidi="hi-IN"/>
         </w:rPr>
-        <w:t>Jesus tinha pleno conhecimento do que estava prestes a acontecer com Ele. Por isso, em seus últimos dias entre os homens, Ele nos falou com tanta ênfase sobre nossa necessidade de vivermos a  religião e a religiosidade de forma pura, simples e verdadeira, construindo tesouros para o Reino dos Céus e não para a Terra.</w:t>
+        <w:t>Os saduceus formavam um grupo de grande influência política e econômica, composto em sua maioria por sacerdotes e membros da elite de Jerusalém.</w:t>
+      </w:r>
+      <w:r>
+        <w:rPr>
+          <w:rFonts w:eastAsia="Times New Roman" w:cs="Times New Roman" w:ascii="Garamond" w:hAnsi="Garamond"/>
+          <w:color w:val="000000"/>
+          <w:kern w:val="0"/>
+          <w:sz w:val="36"/>
+          <w:szCs w:val="36"/>
+          <w:shd w:fill="auto" w:val="clear"/>
+          <w:lang w:val="en-US" w:eastAsia="zh-CN" w:bidi="hi-IN"/>
+        </w:rPr>
+        <w:t xml:space="preserve"> Negavam a imortalidade da alma, a existência dos espíritos e a vida após a morte, acreditando que toda retribuição divina acontecia apenas nesta vida. Eles</w:t>
+      </w:r>
+      <w:r>
+        <w:rPr>
+          <w:rFonts w:eastAsia="Times New Roman" w:cs="Times New Roman" w:ascii="Garamond" w:hAnsi="Garamond"/>
+          <w:color w:val="000000"/>
+          <w:kern w:val="0"/>
+          <w:sz w:val="36"/>
+          <w:szCs w:val="36"/>
+          <w:shd w:fill="auto" w:val="clear"/>
+          <w:lang w:val="en-US" w:eastAsia="zh-CN" w:bidi="hi-IN"/>
+        </w:rPr>
+        <w:t xml:space="preserve"> representavam a religiosidade do poder e da aparência externa</w:t>
+      </w:r>
+      <w:r>
+        <w:rPr>
+          <w:rFonts w:eastAsia="Times New Roman" w:cs="Times New Roman" w:ascii="Garamond" w:hAnsi="Garamond"/>
+          <w:color w:val="000000"/>
+          <w:kern w:val="0"/>
+          <w:sz w:val="36"/>
+          <w:szCs w:val="36"/>
+          <w:shd w:fill="auto" w:val="clear"/>
+          <w:lang w:val="en-US" w:eastAsia="zh-CN" w:bidi="hi-IN"/>
+        </w:rPr>
+        <w:t>.</w:t>
       </w:r>
     </w:p>
     <w:p>
@@ -520,50 +1042,6 @@
         <w:pStyle w:val="Normal"/>
         <w:jc w:val="both"/>
         <w:rPr>
-          <w:u w:val="single"/>
-        </w:rPr>
-      </w:pPr>
-      <w:r>
-        <w:rPr>
-          <w:rFonts w:eastAsia="Times New Roman" w:cs="Times New Roman" w:ascii="Garamond" w:hAnsi="Garamond"/>
-          <w:color w:val="000000"/>
-          <w:kern w:val="0"/>
-          <w:sz w:val="36"/>
-          <w:szCs w:val="36"/>
-          <w:u w:val="single"/>
-          <w:shd w:fill="auto" w:val="clear"/>
-          <w:lang w:val="en-US" w:eastAsia="zh-CN" w:bidi="hi-IN"/>
-        </w:rPr>
-        <w:t>Capítulo 21</w:t>
-      </w:r>
-    </w:p>
-    <w:p>
-      <w:pPr>
-        <w:pStyle w:val="Normal"/>
-        <w:jc w:val="both"/>
-        <w:rPr>
-          <w:sz w:val="36"/>
-          <w:szCs w:val="36"/>
-        </w:rPr>
-      </w:pPr>
-      <w:r>
-        <w:rPr>
-          <w:rFonts w:eastAsia="Times New Roman" w:cs="Times New Roman" w:ascii="Garamond" w:hAnsi="Garamond"/>
-          <w:color w:val="000000"/>
-          <w:kern w:val="0"/>
-          <w:sz w:val="36"/>
-          <w:szCs w:val="36"/>
-          <w:shd w:fill="auto" w:val="clear"/>
-          <w:lang w:val="en-US" w:eastAsia="zh-CN" w:bidi="hi-IN"/>
-        </w:rPr>
-        <w:t xml:space="preserve">Jesus denuncia a esterilidade da fé exterior. A figueira estéril à qual Jesus manda secar e a expulsão dos vendedores do Templo são símbolos da alma que aparenta religiosidade, mas não produz obras de amor. </w:t>
-      </w:r>
-    </w:p>
-    <w:p>
-      <w:pPr>
-        <w:pStyle w:val="Normal"/>
-        <w:jc w:val="both"/>
-        <w:rPr>
           <w:sz w:val="36"/>
           <w:szCs w:val="36"/>
         </w:rPr>
@@ -577,43 +1055,69 @@
         <w:pStyle w:val="Normal"/>
         <w:jc w:val="both"/>
         <w:rPr>
-          <w:u w:val="single"/>
-        </w:rPr>
-      </w:pPr>
-      <w:r>
-        <w:rPr>
-          <w:rFonts w:eastAsia="Times New Roman" w:cs="Times New Roman" w:ascii="Garamond" w:hAnsi="Garamond"/>
-          <w:color w:val="000000"/>
-          <w:kern w:val="0"/>
-          <w:sz w:val="36"/>
-          <w:szCs w:val="36"/>
-          <w:u w:val="single"/>
-          <w:shd w:fill="auto" w:val="clear"/>
-          <w:lang w:val="en-US" w:eastAsia="zh-CN" w:bidi="hi-IN"/>
-        </w:rPr>
-        <w:t>Capítulo 22</w:t>
-      </w:r>
-    </w:p>
-    <w:p>
-      <w:pPr>
-        <w:pStyle w:val="Normal"/>
-        <w:jc w:val="both"/>
-        <w:rPr>
-          <w:sz w:val="36"/>
-          <w:szCs w:val="36"/>
-        </w:rPr>
-      </w:pPr>
-      <w:r>
-        <w:rPr>
-          <w:rFonts w:eastAsia="Times New Roman" w:cs="Times New Roman" w:ascii="Garamond" w:hAnsi="Garamond"/>
-          <w:color w:val="000000"/>
-          <w:kern w:val="0"/>
-          <w:sz w:val="36"/>
-          <w:szCs w:val="36"/>
-          <w:shd w:fill="auto" w:val="clear"/>
-          <w:lang w:val="en-US" w:eastAsia="zh-CN" w:bidi="hi-IN"/>
-        </w:rPr>
-        <w:t xml:space="preserve">Jesus revela a essência da Lei: o amor. Como veremos ao longo do nosso estudo toda a Lei e os Profetas se resumem em amar a Deus sobre todas as coisas e ao próximo como a si mesmo. </w:t>
+          <w:sz w:val="36"/>
+          <w:szCs w:val="36"/>
+        </w:rPr>
+      </w:pPr>
+      <w:r>
+        <w:rPr>
+          <w:rFonts w:eastAsia="Times New Roman" w:cs="Times New Roman" w:ascii="Garamond" w:hAnsi="Garamond"/>
+          <w:color w:val="000000"/>
+          <w:kern w:val="0"/>
+          <w:sz w:val="36"/>
+          <w:szCs w:val="36"/>
+          <w:shd w:fill="auto" w:val="clear"/>
+          <w:lang w:val="en-US" w:eastAsia="zh-CN" w:bidi="hi-IN"/>
+        </w:rPr>
+        <w:t>Os fariseus, por sua vez, eram religiosos dedicados ao estudo e à prática rigorosa da Lei. Valorizavam não apenas a Torá, mas também as tradições orais que a explicavam. Acreditavam na imortalidade da alma e na vida futura, o que os aproximava mais das verdades espirituais.</w:t>
+      </w:r>
+      <w:r>
+        <w:rPr>
+          <w:rFonts w:eastAsia="Times New Roman" w:cs="Times New Roman" w:ascii="Garamond" w:hAnsi="Garamond"/>
+          <w:color w:val="000000"/>
+          <w:kern w:val="0"/>
+          <w:sz w:val="36"/>
+          <w:szCs w:val="36"/>
+          <w:shd w:fill="auto" w:val="clear"/>
+          <w:lang w:val="en-US" w:eastAsia="zh-CN" w:bidi="hi-IN"/>
+        </w:rPr>
+        <w:t xml:space="preserve"> Eles</w:t>
+      </w:r>
+      <w:r>
+        <w:rPr>
+          <w:rFonts w:eastAsia="Times New Roman" w:cs="Times New Roman" w:ascii="Garamond" w:hAnsi="Garamond"/>
+          <w:color w:val="000000"/>
+          <w:kern w:val="0"/>
+          <w:sz w:val="36"/>
+          <w:szCs w:val="36"/>
+          <w:shd w:fill="auto" w:val="clear"/>
+          <w:lang w:val="en-US" w:eastAsia="zh-CN" w:bidi="hi-IN"/>
+        </w:rPr>
+        <w:t xml:space="preserve"> </w:t>
+      </w:r>
+      <w:r>
+        <w:rPr>
+          <w:rFonts w:eastAsia="Times New Roman" w:cs="Times New Roman" w:ascii="Garamond" w:hAnsi="Garamond"/>
+          <w:color w:val="000000"/>
+          <w:kern w:val="0"/>
+          <w:sz w:val="36"/>
+          <w:szCs w:val="36"/>
+          <w:shd w:fill="auto" w:val="clear"/>
+          <w:lang w:val="en-US" w:eastAsia="zh-CN" w:bidi="hi-IN"/>
+        </w:rPr>
+        <w:t>s</w:t>
+      </w:r>
+      <w:r>
+        <w:rPr>
+          <w:rFonts w:eastAsia="Times New Roman" w:cs="Times New Roman" w:ascii="Garamond" w:hAnsi="Garamond"/>
+          <w:color w:val="000000"/>
+          <w:kern w:val="0"/>
+          <w:sz w:val="36"/>
+          <w:szCs w:val="36"/>
+          <w:shd w:fill="auto" w:val="clear"/>
+          <w:lang w:val="en-US" w:eastAsia="zh-CN" w:bidi="hi-IN"/>
+        </w:rPr>
+        <w:t xml:space="preserve">imbolizavam a religiosidade sem vida interior, preocupada com moral, doutrina e cumprimento rigoroso da Lei, mas marcada por orgulho e vaidade espiritual. </w:t>
       </w:r>
     </w:p>
     <w:p>
@@ -648,7 +1152,7 @@
           <w:shd w:fill="auto" w:val="clear"/>
           <w:lang w:val="en-US" w:eastAsia="zh-CN" w:bidi="hi-IN"/>
         </w:rPr>
-        <w:t>O amor se torna o eixo da vida moral e espiritual, inspirando todas as virtudes e guiando a alma ao verdadeiro entendimento de Deus.</w:t>
+        <w:t>Jesus teve mais embates com os fariseus do que com os saduceus por 2 razões: a primeira é que os fariseus eram mais próximos do povo e como Jesus ensinou e viveu em meio ao povo, o Mestre os encontrava com maior frequência.</w:t>
       </w:r>
     </w:p>
     <w:p>
@@ -669,43 +1173,21 @@
         <w:pStyle w:val="Normal"/>
         <w:jc w:val="both"/>
         <w:rPr>
-          <w:u w:val="single"/>
-        </w:rPr>
-      </w:pPr>
-      <w:r>
-        <w:rPr>
-          <w:rFonts w:eastAsia="Times New Roman" w:cs="Times New Roman" w:ascii="Garamond" w:hAnsi="Garamond"/>
-          <w:color w:val="000000"/>
-          <w:kern w:val="0"/>
-          <w:sz w:val="36"/>
-          <w:szCs w:val="36"/>
-          <w:u w:val="single"/>
-          <w:shd w:fill="auto" w:val="clear"/>
-          <w:lang w:val="en-US" w:eastAsia="zh-CN" w:bidi="hi-IN"/>
-        </w:rPr>
-        <w:t>Capítulo 23</w:t>
-      </w:r>
-    </w:p>
-    <w:p>
-      <w:pPr>
-        <w:pStyle w:val="Normal"/>
-        <w:jc w:val="both"/>
-        <w:rPr>
-          <w:sz w:val="36"/>
-          <w:szCs w:val="36"/>
-        </w:rPr>
-      </w:pPr>
-      <w:r>
-        <w:rPr>
-          <w:rFonts w:eastAsia="Times New Roman" w:cs="Times New Roman" w:ascii="Garamond" w:hAnsi="Garamond"/>
-          <w:color w:val="000000"/>
-          <w:kern w:val="0"/>
-          <w:sz w:val="36"/>
-          <w:szCs w:val="36"/>
-          <w:shd w:fill="auto" w:val="clear"/>
-          <w:lang w:val="en-US" w:eastAsia="zh-CN" w:bidi="hi-IN"/>
-        </w:rPr>
-        <w:t xml:space="preserve">Jesus faz o juízo moral e convoca à sinceridade do coração. Aos escribas e fariseus, denuncia a hipocrisia e alerta sobre o perigo de servir às aparências. Seu lamento sobre Jerusalém é também um convite à humanidade inteira: abrir o coração para o amor e para a verdade. </w:t>
+          <w:sz w:val="36"/>
+          <w:szCs w:val="36"/>
+        </w:rPr>
+      </w:pPr>
+      <w:r>
+        <w:rPr>
+          <w:rFonts w:eastAsia="Times New Roman" w:cs="Times New Roman" w:ascii="Garamond" w:hAnsi="Garamond"/>
+          <w:color w:val="000000"/>
+          <w:kern w:val="0"/>
+          <w:sz w:val="36"/>
+          <w:szCs w:val="36"/>
+          <w:shd w:fill="auto" w:val="clear"/>
+          <w:lang w:val="en-US" w:eastAsia="zh-CN" w:bidi="hi-IN"/>
+        </w:rPr>
+        <w:t>A segunda razão é que, apesar de suas imperfeições, os fariseus tinham uma crença mais próxima daquilo que Jesus ensinava. Era mais fácil para eles entenderem os ensinamentos de Jesus do que os saduceus, cuja crença era limitada e incompatível com  os ensinamentos do Mestre.</w:t>
       </w:r>
     </w:p>
     <w:p>
@@ -726,12 +1208,514 @@
         <w:pStyle w:val="Normal"/>
         <w:jc w:val="both"/>
         <w:rPr>
-          <w:b/>
+          <w:sz w:val="36"/>
+          <w:szCs w:val="36"/>
+        </w:rPr>
+      </w:pPr>
+      <w:r>
+        <w:rPr>
+          <w:rFonts w:eastAsia="Times New Roman" w:cs="Times New Roman" w:ascii="Garamond" w:hAnsi="Garamond"/>
+          <w:color w:val="000000"/>
+          <w:kern w:val="0"/>
+          <w:sz w:val="36"/>
+          <w:szCs w:val="36"/>
+          <w:shd w:fill="auto" w:val="clear"/>
+          <w:lang w:val="en-US" w:eastAsia="zh-CN" w:bidi="hi-IN"/>
+        </w:rPr>
+        <w:t>O conhecimento que os fariseus tinham colocava sobre eles uma responsabilidade maior diante de Deus e do povo. Eles ocupavam o lugar de mestres e intérpretes da vontade divina.</w:t>
+      </w:r>
+    </w:p>
+    <w:p>
+      <w:pPr>
+        <w:pStyle w:val="Normal"/>
+        <w:jc w:val="both"/>
+        <w:rPr>
+          <w:sz w:val="36"/>
+          <w:szCs w:val="36"/>
+        </w:rPr>
+      </w:pPr>
+      <w:r>
+        <w:rPr/>
+      </w:r>
+    </w:p>
+    <w:p>
+      <w:pPr>
+        <w:pStyle w:val="Normal"/>
+        <w:jc w:val="both"/>
+        <w:rPr>
+          <w:sz w:val="36"/>
+          <w:szCs w:val="36"/>
+        </w:rPr>
+      </w:pPr>
+      <w:r>
+        <w:rPr>
+          <w:rFonts w:eastAsia="Times New Roman" w:cs="Times New Roman" w:ascii="Garamond" w:hAnsi="Garamond"/>
+          <w:color w:val="000000"/>
+          <w:kern w:val="0"/>
+          <w:sz w:val="36"/>
+          <w:szCs w:val="36"/>
+          <w:shd w:fill="auto" w:val="clear"/>
+          <w:lang w:val="en-US" w:eastAsia="zh-CN" w:bidi="hi-IN"/>
+        </w:rPr>
+        <w:t xml:space="preserve">Quando Jesus os repreende nos Evangelhos, não é por causa do conhecimento em si, mas porque muitos usavam esse saber de forma hipócrita ou orgulhosa. Em outras palavras, Jesus esperava mais deles justamente porque sabiam mais. </w:t>
+      </w:r>
+    </w:p>
+    <w:p>
+      <w:pPr>
+        <w:pStyle w:val="Normal"/>
+        <w:jc w:val="both"/>
+        <w:rPr>
+          <w:sz w:val="36"/>
+          <w:szCs w:val="36"/>
+        </w:rPr>
+      </w:pPr>
+      <w:r>
+        <w:rPr/>
+      </w:r>
+    </w:p>
+    <w:p>
+      <w:pPr>
+        <w:pStyle w:val="Normal"/>
+        <w:jc w:val="both"/>
+        <w:rPr>
+          <w:sz w:val="36"/>
+          <w:szCs w:val="36"/>
+        </w:rPr>
+      </w:pPr>
+      <w:r>
+        <w:rPr>
+          <w:rFonts w:eastAsia="Times New Roman" w:cs="Times New Roman" w:ascii="Garamond" w:hAnsi="Garamond"/>
+          <w:color w:val="000000"/>
+          <w:kern w:val="0"/>
+          <w:sz w:val="36"/>
+          <w:szCs w:val="36"/>
+          <w:shd w:fill="auto" w:val="clear"/>
+          <w:lang w:val="en-US" w:eastAsia="zh-CN" w:bidi="hi-IN"/>
+        </w:rPr>
+        <w:t>[ Parei aqui em 06/10/2025 ]</w:t>
+      </w:r>
+    </w:p>
+    <w:p>
+      <w:pPr>
+        <w:pStyle w:val="Normal"/>
+        <w:jc w:val="both"/>
+        <w:rPr>
+          <w:sz w:val="36"/>
+          <w:szCs w:val="36"/>
+        </w:rPr>
+      </w:pPr>
+      <w:r>
+        <w:rPr>
+          <w:sz w:val="36"/>
+          <w:szCs w:val="36"/>
+        </w:rPr>
+      </w:r>
+    </w:p>
+    <w:p>
+      <w:pPr>
+        <w:pStyle w:val="Normal"/>
+        <w:jc w:val="both"/>
+        <w:rPr>
+          <w:sz w:val="36"/>
+          <w:szCs w:val="36"/>
+        </w:rPr>
+      </w:pPr>
+      <w:r>
+        <w:rPr>
+          <w:sz w:val="36"/>
+          <w:szCs w:val="36"/>
+        </w:rPr>
+      </w:r>
+    </w:p>
+    <w:p>
+      <w:pPr>
+        <w:pStyle w:val="Normal"/>
+        <w:jc w:val="both"/>
+        <w:rPr>
+          <w:sz w:val="36"/>
+          <w:szCs w:val="36"/>
+        </w:rPr>
+      </w:pPr>
+      <w:r>
+        <w:rPr>
+          <w:rFonts w:eastAsia="Times New Roman" w:cs="Times New Roman" w:ascii="Garamond" w:hAnsi="Garamond"/>
+          <w:color w:val="000000"/>
+          <w:kern w:val="0"/>
+          <w:sz w:val="36"/>
+          <w:szCs w:val="36"/>
+          <w:shd w:fill="auto" w:val="clear"/>
+          <w:lang w:val="en-US" w:eastAsia="zh-CN" w:bidi="hi-IN"/>
+        </w:rPr>
+        <w:t>Em meio a tantas disputas e interpretações humanas, Jesus oferece uma resposta simples e profunda, capaz de iluminar todas as leis e orientar todos os corações: amar a Deus de todo o coração, de toda a alma e de todo o entendimento; e amar o próximo como a si mesmo.</w:t>
+      </w:r>
+    </w:p>
+    <w:p>
+      <w:pPr>
+        <w:pStyle w:val="Normal"/>
+        <w:jc w:val="both"/>
+        <w:rPr>
+          <w:sz w:val="36"/>
+          <w:szCs w:val="36"/>
+        </w:rPr>
+      </w:pPr>
+      <w:r>
+        <w:rPr>
+          <w:sz w:val="36"/>
+          <w:szCs w:val="36"/>
+        </w:rPr>
+      </w:r>
+    </w:p>
+    <w:p>
+      <w:pPr>
+        <w:pStyle w:val="Normal"/>
+        <w:jc w:val="both"/>
+        <w:rPr>
+          <w:sz w:val="36"/>
+          <w:szCs w:val="36"/>
+        </w:rPr>
+      </w:pPr>
+      <w:r>
+        <w:rPr>
+          <w:rFonts w:eastAsia="Times New Roman" w:cs="Times New Roman" w:ascii="Garamond" w:hAnsi="Garamond"/>
+          <w:color w:val="000000"/>
+          <w:kern w:val="0"/>
+          <w:sz w:val="36"/>
+          <w:szCs w:val="36"/>
+          <w:shd w:fill="auto" w:val="clear"/>
+          <w:lang w:val="en-US" w:eastAsia="zh-CN" w:bidi="hi-IN"/>
+        </w:rPr>
+        <w:t>Com isso, o Mestre ensina que o verdadeiro cumprimento da Lei não está na letra, mas no sentimento. Toda norma, todo princípio ou prática religiosa deve ter como base o amor — amor que se volta primeiro para Deus, que se estende ao próximo e que também se reconhece em nós mesmos. É nesse equilíbrio que a fé deixa de ser mera obediência e se torna vivência, conduzindo-nos ao verdadeiro entendimento da vontade divina.]</w:t>
+      </w:r>
+    </w:p>
+    <w:p>
+      <w:pPr>
+        <w:pStyle w:val="Normal"/>
+        <w:jc w:val="both"/>
+        <w:rPr>
+          <w:sz w:val="36"/>
+          <w:szCs w:val="36"/>
+        </w:rPr>
+      </w:pPr>
+      <w:r>
+        <w:rPr>
+          <w:rFonts w:eastAsia="Times New Roman" w:cs="Times New Roman" w:ascii="Garamond" w:hAnsi="Garamond"/>
+          <w:color w:val="000000"/>
+          <w:kern w:val="0"/>
+          <w:sz w:val="36"/>
+          <w:szCs w:val="36"/>
+          <w:shd w:fill="auto" w:val="clear"/>
+          <w:lang w:val="en-US" w:eastAsia="zh-CN" w:bidi="hi-IN"/>
+        </w:rPr>
+        <w:t xml:space="preserve"> </w:t>
+      </w:r>
+    </w:p>
+    <w:p>
+      <w:pPr>
+        <w:pStyle w:val="Normal"/>
+        <w:jc w:val="both"/>
+        <w:rPr>
+          <w:sz w:val="36"/>
+          <w:szCs w:val="36"/>
+        </w:rPr>
+      </w:pPr>
+      <w:r>
+        <w:rPr>
+          <w:sz w:val="36"/>
+          <w:szCs w:val="36"/>
+        </w:rPr>
+      </w:r>
+    </w:p>
+    <w:p>
+      <w:pPr>
+        <w:pStyle w:val="Normal"/>
+        <w:jc w:val="both"/>
+        <w:rPr>
+          <w:sz w:val="36"/>
+          <w:szCs w:val="36"/>
+        </w:rPr>
+      </w:pPr>
+      <w:r>
+        <w:rPr>
+          <w:sz w:val="36"/>
+          <w:szCs w:val="36"/>
+        </w:rPr>
+      </w:r>
+    </w:p>
+    <w:p>
+      <w:pPr>
+        <w:pStyle w:val="Normal"/>
+        <w:jc w:val="both"/>
+        <w:rPr>
+          <w:sz w:val="36"/>
+          <w:szCs w:val="36"/>
+        </w:rPr>
+      </w:pPr>
+      <w:r>
+        <w:rPr>
+          <w:sz w:val="36"/>
+          <w:szCs w:val="36"/>
+        </w:rPr>
+      </w:r>
+    </w:p>
+    <w:p>
+      <w:pPr>
+        <w:pStyle w:val="Normal"/>
+        <w:jc w:val="both"/>
+        <w:rPr>
+          <w:sz w:val="36"/>
+          <w:szCs w:val="36"/>
+        </w:rPr>
+      </w:pPr>
+      <w:r>
+        <w:rPr>
+          <w:rFonts w:eastAsia="Times New Roman" w:cs="Times New Roman" w:ascii="Garamond" w:hAnsi="Garamond"/>
+          <w:color w:val="000000"/>
+          <w:kern w:val="0"/>
+          <w:sz w:val="36"/>
+          <w:szCs w:val="36"/>
+          <w:shd w:fill="auto" w:val="clear"/>
+          <w:lang w:val="en-US" w:eastAsia="zh-CN" w:bidi="hi-IN"/>
+        </w:rPr>
+        <w:t xml:space="preserve">[ </w:t>
+      </w:r>
+      <w:r>
+        <w:rPr>
+          <w:rFonts w:eastAsia="Times New Roman" w:cs="Times New Roman" w:ascii="Garamond" w:hAnsi="Garamond"/>
           <w:b/>
           <w:bCs/>
           <w:color w:val="C9211E"/>
-        </w:rPr>
-      </w:pPr>
+          <w:kern w:val="0"/>
+          <w:sz w:val="36"/>
+          <w:szCs w:val="36"/>
+          <w:shd w:fill="auto" w:val="clear"/>
+          <w:lang w:val="en-US" w:eastAsia="zh-CN" w:bidi="hi-IN"/>
+        </w:rPr>
+        <w:t>Início de bloco a ser avaliado se permanece</w:t>
+      </w:r>
+      <w:r>
+        <w:rPr>
+          <w:rFonts w:eastAsia="Times New Roman" w:cs="Times New Roman" w:ascii="Garamond" w:hAnsi="Garamond"/>
+          <w:color w:val="000000"/>
+          <w:kern w:val="0"/>
+          <w:sz w:val="36"/>
+          <w:szCs w:val="36"/>
+          <w:shd w:fill="auto" w:val="clear"/>
+          <w:lang w:val="en-US" w:eastAsia="zh-CN" w:bidi="hi-IN"/>
+        </w:rPr>
+        <w:t xml:space="preserve"> ]</w:t>
+      </w:r>
+    </w:p>
+    <w:p>
+      <w:pPr>
+        <w:pStyle w:val="Normal"/>
+        <w:jc w:val="both"/>
+        <w:rPr>
+          <w:sz w:val="36"/>
+          <w:szCs w:val="36"/>
+        </w:rPr>
+      </w:pPr>
+      <w:r>
+        <w:rPr>
+          <w:sz w:val="36"/>
+          <w:szCs w:val="36"/>
+        </w:rPr>
+      </w:r>
+    </w:p>
+    <w:p>
+      <w:pPr>
+        <w:pStyle w:val="Normal"/>
+        <w:jc w:val="both"/>
+        <w:rPr>
+          <w:sz w:val="36"/>
+          <w:szCs w:val="36"/>
+        </w:rPr>
+      </w:pPr>
+      <w:r>
+        <w:rPr>
+          <w:rFonts w:eastAsia="Times New Roman" w:cs="Times New Roman" w:ascii="Garamond" w:hAnsi="Garamond"/>
+          <w:color w:val="000000"/>
+          <w:kern w:val="0"/>
+          <w:sz w:val="36"/>
+          <w:szCs w:val="36"/>
+          <w:shd w:fill="auto" w:val="clear"/>
+          <w:lang w:val="en-US" w:eastAsia="zh-CN" w:bidi="hi-IN"/>
+        </w:rPr>
+        <w:t>À luz do Espiritismo, esses capítulos mostram estágios da nossa evolução moral:</w:t>
+      </w:r>
+    </w:p>
+    <w:p>
+      <w:pPr>
+        <w:pStyle w:val="Normal"/>
+        <w:jc w:val="both"/>
+        <w:rPr>
+          <w:sz w:val="36"/>
+          <w:szCs w:val="36"/>
+        </w:rPr>
+      </w:pPr>
+      <w:r>
+        <w:rPr>
+          <w:sz w:val="36"/>
+          <w:szCs w:val="36"/>
+        </w:rPr>
+      </w:r>
+    </w:p>
+    <w:p>
+      <w:pPr>
+        <w:pStyle w:val="Normal"/>
+        <w:jc w:val="both"/>
+        <w:rPr>
+          <w:sz w:val="36"/>
+          <w:szCs w:val="36"/>
+        </w:rPr>
+      </w:pPr>
+      <w:r>
+        <w:rPr>
+          <w:rFonts w:eastAsia="Times New Roman" w:cs="Times New Roman" w:ascii="Garamond" w:hAnsi="Garamond"/>
+          <w:color w:val="000000"/>
+          <w:kern w:val="0"/>
+          <w:sz w:val="36"/>
+          <w:szCs w:val="36"/>
+          <w:shd w:fill="auto" w:val="clear"/>
+          <w:lang w:val="en-US" w:eastAsia="zh-CN" w:bidi="hi-IN"/>
+        </w:rPr>
+        <w:t>Capítulo 21 traz o despertar da consciência, ou seja,  reconhecer nossa própria esterilidade.</w:t>
+      </w:r>
+    </w:p>
+    <w:p>
+      <w:pPr>
+        <w:pStyle w:val="Normal"/>
+        <w:jc w:val="both"/>
+        <w:rPr>
+          <w:sz w:val="36"/>
+          <w:szCs w:val="36"/>
+        </w:rPr>
+      </w:pPr>
+      <w:r>
+        <w:rPr>
+          <w:sz w:val="36"/>
+          <w:szCs w:val="36"/>
+        </w:rPr>
+      </w:r>
+    </w:p>
+    <w:p>
+      <w:pPr>
+        <w:pStyle w:val="Normal"/>
+        <w:jc w:val="both"/>
+        <w:rPr>
+          <w:sz w:val="36"/>
+          <w:szCs w:val="36"/>
+        </w:rPr>
+      </w:pPr>
+      <w:r>
+        <w:rPr>
+          <w:rFonts w:eastAsia="Times New Roman" w:cs="Times New Roman" w:ascii="Garamond" w:hAnsi="Garamond"/>
+          <w:color w:val="000000"/>
+          <w:kern w:val="0"/>
+          <w:sz w:val="36"/>
+          <w:szCs w:val="36"/>
+          <w:shd w:fill="auto" w:val="clear"/>
+          <w:lang w:val="en-US" w:eastAsia="zh-CN" w:bidi="hi-IN"/>
+        </w:rPr>
+        <w:t>Já o capítulo 22 representa a iluminação interior — compreender o amor como essência da Lei (cap. 22).</w:t>
+      </w:r>
+    </w:p>
+    <w:p>
+      <w:pPr>
+        <w:pStyle w:val="Normal"/>
+        <w:jc w:val="both"/>
+        <w:rPr>
+          <w:sz w:val="36"/>
+          <w:szCs w:val="36"/>
+        </w:rPr>
+      </w:pPr>
+      <w:r>
+        <w:rPr>
+          <w:sz w:val="36"/>
+          <w:szCs w:val="36"/>
+        </w:rPr>
+      </w:r>
+    </w:p>
+    <w:p>
+      <w:pPr>
+        <w:pStyle w:val="Normal"/>
+        <w:jc w:val="both"/>
+        <w:rPr>
+          <w:sz w:val="36"/>
+          <w:szCs w:val="36"/>
+        </w:rPr>
+      </w:pPr>
+      <w:r>
+        <w:rPr>
+          <w:rFonts w:eastAsia="Times New Roman" w:cs="Times New Roman" w:ascii="Garamond" w:hAnsi="Garamond"/>
+          <w:color w:val="000000"/>
+          <w:kern w:val="0"/>
+          <w:sz w:val="36"/>
+          <w:szCs w:val="36"/>
+          <w:shd w:fill="auto" w:val="clear"/>
+          <w:lang w:val="en-US" w:eastAsia="zh-CN" w:bidi="hi-IN"/>
+        </w:rPr>
+        <w:t xml:space="preserve">Reforma íntima — vencer o orgulho e a hipocrisia (cap. 23). </w:t>
+      </w:r>
+    </w:p>
+    <w:p>
+      <w:pPr>
+        <w:pStyle w:val="Normal"/>
+        <w:jc w:val="both"/>
+        <w:rPr>
+          <w:sz w:val="36"/>
+          <w:szCs w:val="36"/>
+        </w:rPr>
+      </w:pPr>
+      <w:r>
+        <w:rPr>
+          <w:sz w:val="36"/>
+          <w:szCs w:val="36"/>
+        </w:rPr>
+      </w:r>
+    </w:p>
+    <w:p>
+      <w:pPr>
+        <w:pStyle w:val="Normal"/>
+        <w:jc w:val="both"/>
+        <w:rPr>
+          <w:sz w:val="36"/>
+          <w:szCs w:val="36"/>
+        </w:rPr>
+      </w:pPr>
+      <w:r>
+        <w:rPr>
+          <w:rFonts w:eastAsia="Times New Roman" w:cs="Times New Roman" w:ascii="Garamond" w:hAnsi="Garamond"/>
+          <w:color w:val="000000"/>
+          <w:kern w:val="0"/>
+          <w:sz w:val="36"/>
+          <w:szCs w:val="36"/>
+          <w:shd w:fill="auto" w:val="clear"/>
+          <w:lang w:val="en-US" w:eastAsia="zh-CN" w:bidi="hi-IN"/>
+        </w:rPr>
+        <w:t>Somente depois de passar por esse processo o espírito está preparado para o sacrifício consciente, isto é, para renunciar ao ego e viver o amor em plenitude — o que Jesus realiza na cruz e confirma na ressurreição</w:t>
+      </w:r>
+    </w:p>
+    <w:p>
+      <w:pPr>
+        <w:pStyle w:val="Normal"/>
+        <w:jc w:val="both"/>
+        <w:rPr>
+          <w:sz w:val="36"/>
+          <w:szCs w:val="36"/>
+        </w:rPr>
+      </w:pPr>
+      <w:r>
+        <w:rPr>
+          <w:rFonts w:eastAsia="Times New Roman" w:cs="Times New Roman" w:ascii="Garamond" w:hAnsi="Garamond"/>
+          <w:color w:val="000000"/>
+          <w:kern w:val="0"/>
+          <w:sz w:val="36"/>
+          <w:szCs w:val="36"/>
+          <w:shd w:fill="auto" w:val="clear"/>
+          <w:lang w:val="en-US" w:eastAsia="zh-CN" w:bidi="hi-IN"/>
+        </w:rPr>
+        <w:t xml:space="preserve">[ </w:t>
+      </w:r>
       <w:r>
         <w:rPr>
           <w:rFonts w:eastAsia="Times New Roman" w:cs="Times New Roman" w:ascii="Garamond" w:hAnsi="Garamond"/>
@@ -744,7 +1728,54 @@
           <w:shd w:fill="auto" w:val="clear"/>
           <w:lang w:val="en-US" w:eastAsia="zh-CN" w:bidi="hi-IN"/>
         </w:rPr>
-        <w:t>D</w:t>
+        <w:t>Término de bloco a ser avaliado se permanece</w:t>
+      </w:r>
+      <w:r>
+        <w:rPr>
+          <w:rFonts w:eastAsia="Times New Roman" w:cs="Times New Roman" w:ascii="Garamond" w:hAnsi="Garamond"/>
+          <w:color w:val="000000"/>
+          <w:kern w:val="0"/>
+          <w:sz w:val="36"/>
+          <w:szCs w:val="36"/>
+          <w:shd w:fill="auto" w:val="clear"/>
+          <w:lang w:val="en-US" w:eastAsia="zh-CN" w:bidi="hi-IN"/>
+        </w:rPr>
+        <w:t xml:space="preserve"> ]</w:t>
+      </w:r>
+    </w:p>
+    <w:p>
+      <w:pPr>
+        <w:pStyle w:val="Normal"/>
+        <w:jc w:val="both"/>
+        <w:rPr>
+          <w:sz w:val="36"/>
+          <w:szCs w:val="36"/>
+        </w:rPr>
+      </w:pPr>
+      <w:r>
+        <w:rPr>
+          <w:sz w:val="36"/>
+          <w:szCs w:val="36"/>
+        </w:rPr>
+      </w:r>
+    </w:p>
+    <w:p>
+      <w:pPr>
+        <w:pStyle w:val="Normal"/>
+        <w:jc w:val="both"/>
+        <w:rPr/>
+      </w:pPr>
+      <w:r>
+        <w:rPr>
+          <w:rFonts w:eastAsia="Times New Roman" w:cs="Times New Roman" w:ascii="Garamond" w:hAnsi="Garamond"/>
+          <w:color w:val="000000"/>
+          <w:kern w:val="0"/>
+          <w:sz w:val="36"/>
+          <w:szCs w:val="36"/>
+          <w:shd w:fill="auto" w:val="clear"/>
+          <w:lang w:val="en-US" w:eastAsia="zh-CN" w:bidi="hi-IN"/>
+        </w:rPr>
+        <w:t xml:space="preserve">[ </w:t>
       </w:r>
       <w:r>
         <w:rPr>
@@ -758,671 +1789,289 @@
           <w:shd w:fill="auto" w:val="clear"/>
           <w:lang w:val="en-US" w:eastAsia="zh-CN" w:bidi="hi-IN"/>
         </w:rPr>
-        <w:t>esenvolver e apresentar os seguintes tópicos:</w:t>
-      </w:r>
-    </w:p>
-    <w:p>
-      <w:pPr>
-        <w:pStyle w:val="Normal"/>
-        <w:jc w:val="both"/>
-        <w:rPr>
-          <w:b/>
-          <w:b/>
-          <w:bCs/>
-          <w:color w:val="C9211E"/>
-        </w:rPr>
-      </w:pPr>
-      <w:r>
-        <w:rPr>
-          <w:rFonts w:eastAsia="Times New Roman" w:cs="Times New Roman" w:ascii="Garamond" w:hAnsi="Garamond"/>
-          <w:b/>
-          <w:bCs/>
-          <w:color w:val="C9211E"/>
-          <w:kern w:val="0"/>
-          <w:sz w:val="36"/>
-          <w:szCs w:val="36"/>
-          <w:shd w:fill="auto" w:val="clear"/>
-          <w:lang w:val="en-US" w:eastAsia="zh-CN" w:bidi="hi-IN"/>
-        </w:rPr>
-        <w:t>1 - Diferenciar saduceus dos fariseus</w:t>
-      </w:r>
-    </w:p>
-    <w:p>
-      <w:pPr>
-        <w:pStyle w:val="Normal"/>
-        <w:jc w:val="both"/>
-        <w:rPr>
-          <w:b/>
-          <w:b/>
-          <w:bCs/>
-          <w:color w:val="C9211E"/>
-        </w:rPr>
-      </w:pPr>
-      <w:r>
-        <w:rPr>
-          <w:rFonts w:eastAsia="Times New Roman" w:cs="Times New Roman" w:ascii="Garamond" w:hAnsi="Garamond"/>
-          <w:b/>
-          <w:bCs/>
-          <w:color w:val="C9211E"/>
-          <w:kern w:val="0"/>
-          <w:sz w:val="36"/>
-          <w:szCs w:val="36"/>
-          <w:shd w:fill="auto" w:val="clear"/>
-          <w:lang w:val="en-US" w:eastAsia="zh-CN" w:bidi="hi-IN"/>
-        </w:rPr>
-        <w:t>2 - Explicar porque Jesus teve mais embates com os fariseus</w:t>
-      </w:r>
-    </w:p>
-    <w:p>
-      <w:pPr>
-        <w:pStyle w:val="Normal"/>
-        <w:jc w:val="both"/>
-        <w:rPr>
-          <w:sz w:val="36"/>
-          <w:szCs w:val="36"/>
-        </w:rPr>
-      </w:pPr>
-      <w:r>
+        <w:t>Precisa ser desenvolvido e encaixado no texto</w:t>
+      </w:r>
+      <w:r>
+        <w:rPr>
+          <w:rFonts w:eastAsia="Times New Roman" w:cs="Times New Roman" w:ascii="Garamond" w:hAnsi="Garamond"/>
+          <w:color w:val="000000"/>
+          <w:kern w:val="0"/>
+          <w:sz w:val="36"/>
+          <w:szCs w:val="36"/>
+          <w:shd w:fill="auto" w:val="clear"/>
+          <w:lang w:val="en-US" w:eastAsia="zh-CN" w:bidi="hi-IN"/>
+        </w:rPr>
+        <w:t>] O que você formulou toca num ponto que muitos estudiosos também percebem: Jesus entra em confronto mais direto com quem está mais perto da verdade, mas a vive de forma distorcida. Os saduceus, por negarem a ressurreição, os anjos e a vida futura, estavam tão distantes da dimensão espiritual que o diálogo com eles tinha pouco espaço — Jesus os corrige, mas não trava com eles o mesmo tipo de debate moral e espiritual que tem com os fariseus.</w:t>
+      </w:r>
+    </w:p>
+    <w:p>
+      <w:pPr>
+        <w:pStyle w:val="Normal"/>
+        <w:jc w:val="both"/>
+        <w:rPr>
+          <w:rFonts w:ascii="Garamond" w:hAnsi="Garamond" w:eastAsia="Times New Roman" w:cs="Times New Roman"/>
+          <w:color w:val="000000"/>
+          <w:kern w:val="0"/>
+          <w:sz w:val="36"/>
+          <w:szCs w:val="36"/>
+          <w:shd w:fill="auto" w:val="clear"/>
+          <w:lang w:val="en-US" w:eastAsia="zh-CN" w:bidi="hi-IN"/>
+        </w:rPr>
+      </w:pPr>
+      <w:r>
+        <w:rPr>
+          <w:rFonts w:eastAsia="Times New Roman" w:cs="Times New Roman" w:ascii="Garamond" w:hAnsi="Garamond"/>
+          <w:color w:val="000000"/>
+          <w:kern w:val="0"/>
+          <w:sz w:val="36"/>
+          <w:szCs w:val="36"/>
+          <w:shd w:fill="auto" w:val="clear"/>
+          <w:lang w:val="en-US" w:eastAsia="zh-CN" w:bidi="hi-IN"/>
+        </w:rPr>
+      </w:r>
+    </w:p>
+    <w:p>
+      <w:pPr>
+        <w:pStyle w:val="Normal"/>
+        <w:jc w:val="both"/>
         <w:rPr/>
-      </w:r>
-    </w:p>
-    <w:p>
-      <w:pPr>
-        <w:pStyle w:val="Normal"/>
-        <w:jc w:val="both"/>
-        <w:rPr>
-          <w:sz w:val="36"/>
-          <w:szCs w:val="36"/>
-        </w:rPr>
-      </w:pPr>
-      <w:r>
-        <w:rPr>
-          <w:rFonts w:eastAsia="Times New Roman" w:cs="Times New Roman" w:ascii="Garamond" w:hAnsi="Garamond"/>
-          <w:color w:val="000000"/>
-          <w:kern w:val="0"/>
-          <w:sz w:val="36"/>
-          <w:szCs w:val="36"/>
-          <w:shd w:fill="auto" w:val="clear"/>
-          <w:lang w:val="en-US" w:eastAsia="zh-CN" w:bidi="hi-IN"/>
-        </w:rPr>
-        <w:t>[</w:t>
-      </w:r>
-      <w:r>
-        <w:rPr>
-          <w:rFonts w:eastAsia="Times New Roman" w:cs="Times New Roman" w:ascii="Garamond" w:hAnsi="Garamond"/>
-          <w:color w:val="000000"/>
-          <w:kern w:val="0"/>
-          <w:sz w:val="36"/>
-          <w:szCs w:val="36"/>
-          <w:shd w:fill="auto" w:val="clear"/>
-          <w:lang w:val="en-US" w:eastAsia="zh-CN" w:bidi="hi-IN"/>
-        </w:rPr>
-        <w:t xml:space="preserve"> Os saduceus eram principalmente sacerdotes e aristocratas ligados ao Templo de Jerusalém, ocupando posições de poder tanto religioso quanto político. Sua fé se baseava unicamente na Torá, os cinco primeiros livros da Bíblia, e negavam a ressurreição dos mortos, a existência de anjos ou espíritos. A prática religiosa dos saduceus concentrava-se nos rituais do Templo, nos sacrifícios e nas funções sacerdotais, sendo voltada mais para a aparência externa e o cumprimento formal das leis do que para a vivência espiritual interior.</w:t>
-      </w:r>
-    </w:p>
-    <w:p>
-      <w:pPr>
-        <w:pStyle w:val="Normal"/>
-        <w:jc w:val="both"/>
-        <w:rPr>
-          <w:sz w:val="36"/>
-          <w:szCs w:val="36"/>
-        </w:rPr>
-      </w:pPr>
-      <w:r>
+      </w:pPr>
+      <w:r>
+        <w:rPr>
+          <w:rFonts w:eastAsia="Times New Roman" w:cs="Times New Roman" w:ascii="Garamond" w:hAnsi="Garamond"/>
+          <w:color w:val="000000"/>
+          <w:kern w:val="0"/>
+          <w:sz w:val="36"/>
+          <w:szCs w:val="36"/>
+          <w:shd w:fill="auto" w:val="clear"/>
+          <w:lang w:val="en-US" w:eastAsia="zh-CN" w:bidi="hi-IN"/>
+        </w:rPr>
+        <w:t>Já os fariseus, por outro lado, acreditavam nas Escrituras, na vida após a morte, e na vinda do Messias — ou seja, estavam dentro do mesmo universo de fé que Jesus. O problema era que transformaram a fé em formalismo e hipocrisia, perdendo o coração do ensinamento que professavam. Por isso, Jesus os confronta com mais veemência: eles sabiam mais, mas viviam menos.</w:t>
+      </w:r>
+    </w:p>
+    <w:p>
+      <w:pPr>
+        <w:pStyle w:val="Normal"/>
+        <w:jc w:val="both"/>
+        <w:rPr>
+          <w:rFonts w:ascii="Garamond" w:hAnsi="Garamond" w:eastAsia="Times New Roman" w:cs="Times New Roman"/>
+          <w:color w:val="000000"/>
+          <w:kern w:val="0"/>
+          <w:sz w:val="36"/>
+          <w:szCs w:val="36"/>
+          <w:shd w:fill="auto" w:val="clear"/>
+          <w:lang w:val="en-US" w:eastAsia="zh-CN" w:bidi="hi-IN"/>
+        </w:rPr>
+      </w:pPr>
+      <w:r>
+        <w:rPr>
+          <w:rFonts w:eastAsia="Times New Roman" w:cs="Times New Roman" w:ascii="Garamond" w:hAnsi="Garamond"/>
+          <w:color w:val="000000"/>
+          <w:kern w:val="0"/>
+          <w:sz w:val="36"/>
+          <w:szCs w:val="36"/>
+          <w:shd w:fill="auto" w:val="clear"/>
+          <w:lang w:val="en-US" w:eastAsia="zh-CN" w:bidi="hi-IN"/>
+        </w:rPr>
+      </w:r>
+    </w:p>
+    <w:p>
+      <w:pPr>
+        <w:pStyle w:val="Normal"/>
+        <w:jc w:val="both"/>
         <w:rPr/>
-      </w:r>
-    </w:p>
-    <w:p>
-      <w:pPr>
-        <w:pStyle w:val="Normal"/>
-        <w:jc w:val="both"/>
-        <w:rPr>
-          <w:sz w:val="36"/>
-          <w:szCs w:val="36"/>
-        </w:rPr>
-      </w:pPr>
-      <w:r>
-        <w:rPr>
-          <w:rFonts w:eastAsia="Times New Roman" w:cs="Times New Roman" w:ascii="Garamond" w:hAnsi="Garamond"/>
-          <w:color w:val="000000"/>
-          <w:kern w:val="0"/>
-          <w:sz w:val="36"/>
-          <w:szCs w:val="36"/>
-          <w:shd w:fill="auto" w:val="clear"/>
-          <w:lang w:val="en-US" w:eastAsia="zh-CN" w:bidi="hi-IN"/>
-        </w:rPr>
-        <w:t>Em contraste, os fariseus eram mestres da Lei e líderes religiosos mais próximos do povo, atuando nas sinagogas e na vida cotidiana. Acreditavam na ressurreição, nos espíritos e na vida após a morte, e valorizavam uma interpretação detalhada da Lei, incluindo tradições orais que complementavam a Torá. A prática dos fariseus envolvia cumprir rigorosamente as leis de pureza, o sábado, os dízimos e outros rituais, mas muitas vezes caíam em hipocrisia, privilegiando o formalismo e a aparência de santidade sobre a essência do amor e da fé.</w:t>
-      </w:r>
-    </w:p>
-    <w:p>
-      <w:pPr>
-        <w:pStyle w:val="Normal"/>
-        <w:jc w:val="both"/>
-        <w:rPr>
-          <w:sz w:val="36"/>
-          <w:szCs w:val="36"/>
-        </w:rPr>
-      </w:pPr>
-      <w:r>
+      </w:pPr>
+      <w:r>
+        <w:rPr>
+          <w:rFonts w:eastAsia="Times New Roman" w:cs="Times New Roman" w:ascii="Garamond" w:hAnsi="Garamond"/>
+          <w:color w:val="000000"/>
+          <w:kern w:val="0"/>
+          <w:sz w:val="36"/>
+          <w:szCs w:val="36"/>
+          <w:shd w:fill="auto" w:val="clear"/>
+          <w:lang w:val="en-US" w:eastAsia="zh-CN" w:bidi="hi-IN"/>
+        </w:rPr>
+        <w:t>Em termos simbólicos, podemos dizer que:</w:t>
+      </w:r>
+    </w:p>
+    <w:p>
+      <w:pPr>
+        <w:pStyle w:val="Normal"/>
+        <w:jc w:val="both"/>
+        <w:rPr>
+          <w:rFonts w:ascii="Garamond" w:hAnsi="Garamond" w:eastAsia="Times New Roman" w:cs="Times New Roman"/>
+          <w:color w:val="000000"/>
+          <w:kern w:val="0"/>
+          <w:sz w:val="36"/>
+          <w:szCs w:val="36"/>
+          <w:shd w:fill="auto" w:val="clear"/>
+          <w:lang w:val="en-US" w:eastAsia="zh-CN" w:bidi="hi-IN"/>
+        </w:rPr>
+      </w:pPr>
+      <w:r>
+        <w:rPr>
+          <w:rFonts w:eastAsia="Times New Roman" w:cs="Times New Roman" w:ascii="Garamond" w:hAnsi="Garamond"/>
+          <w:color w:val="000000"/>
+          <w:kern w:val="0"/>
+          <w:sz w:val="36"/>
+          <w:szCs w:val="36"/>
+          <w:shd w:fill="auto" w:val="clear"/>
+          <w:lang w:val="en-US" w:eastAsia="zh-CN" w:bidi="hi-IN"/>
+        </w:rPr>
+      </w:r>
+    </w:p>
+    <w:p>
+      <w:pPr>
+        <w:pStyle w:val="Normal"/>
+        <w:jc w:val="both"/>
         <w:rPr/>
-      </w:r>
-    </w:p>
-    <w:p>
-      <w:pPr>
-        <w:pStyle w:val="Normal"/>
-        <w:jc w:val="both"/>
-        <w:rPr>
-          <w:sz w:val="36"/>
-          <w:szCs w:val="36"/>
-        </w:rPr>
-      </w:pPr>
-      <w:r>
-        <w:rPr>
-          <w:rFonts w:eastAsia="Times New Roman" w:cs="Times New Roman" w:ascii="Garamond" w:hAnsi="Garamond"/>
-          <w:color w:val="000000"/>
-          <w:kern w:val="0"/>
-          <w:sz w:val="36"/>
-          <w:szCs w:val="36"/>
-          <w:shd w:fill="auto" w:val="clear"/>
-          <w:lang w:val="en-US" w:eastAsia="zh-CN" w:bidi="hi-IN"/>
-        </w:rPr>
-        <w:t>Enquanto os saduceus representavam a religiosidade do poder e da aparência externa, os fariseus simbolizavam a religiosidade sem vida interior, preocupada com moral, doutrina e cumprimento rigoroso da Lei, mas marcada por orgulho e vaidade espiritual. Jesus confrontava ambos: os saduceus por sua cegueira e apego ao poder, e os fariseus por sua hipocrisia e formalismo, revelando a necessidade de coerência entre fé, amor e prática.Adicionar aqui a parte que diferencia Saduceus de Fariseus ]</w:t>
-      </w:r>
-    </w:p>
-    <w:p>
-      <w:pPr>
-        <w:pStyle w:val="Normal"/>
-        <w:jc w:val="both"/>
-        <w:rPr>
-          <w:sz w:val="36"/>
-          <w:szCs w:val="36"/>
-        </w:rPr>
-      </w:pPr>
-      <w:r>
+      </w:pPr>
+      <w:r>
+        <w:rPr>
+          <w:rFonts w:eastAsia="Times New Roman" w:cs="Times New Roman" w:ascii="Garamond" w:hAnsi="Garamond"/>
+          <w:color w:val="000000"/>
+          <w:kern w:val="0"/>
+          <w:sz w:val="36"/>
+          <w:szCs w:val="36"/>
+          <w:shd w:fill="auto" w:val="clear"/>
+          <w:lang w:val="en-US" w:eastAsia="zh-CN" w:bidi="hi-IN"/>
+        </w:rPr>
+        <w:t>Os saduceus representam o ceticismo religioso, que perde a dimensão do sagrado;</w:t>
+      </w:r>
+    </w:p>
+    <w:p>
+      <w:pPr>
+        <w:pStyle w:val="Normal"/>
+        <w:jc w:val="both"/>
+        <w:rPr>
+          <w:rFonts w:ascii="Garamond" w:hAnsi="Garamond" w:eastAsia="Times New Roman" w:cs="Times New Roman"/>
+          <w:color w:val="000000"/>
+          <w:kern w:val="0"/>
+          <w:sz w:val="36"/>
+          <w:szCs w:val="36"/>
+          <w:shd w:fill="auto" w:val="clear"/>
+          <w:lang w:val="en-US" w:eastAsia="zh-CN" w:bidi="hi-IN"/>
+        </w:rPr>
+      </w:pPr>
+      <w:r>
+        <w:rPr>
+          <w:rFonts w:eastAsia="Times New Roman" w:cs="Times New Roman" w:ascii="Garamond" w:hAnsi="Garamond"/>
+          <w:color w:val="000000"/>
+          <w:kern w:val="0"/>
+          <w:sz w:val="36"/>
+          <w:szCs w:val="36"/>
+          <w:shd w:fill="auto" w:val="clear"/>
+          <w:lang w:val="en-US" w:eastAsia="zh-CN" w:bidi="hi-IN"/>
+        </w:rPr>
+      </w:r>
+    </w:p>
+    <w:p>
+      <w:pPr>
+        <w:pStyle w:val="Normal"/>
+        <w:jc w:val="both"/>
         <w:rPr/>
-      </w:r>
-    </w:p>
-    <w:p>
-      <w:pPr>
-        <w:pStyle w:val="Normal"/>
-        <w:jc w:val="both"/>
-        <w:rPr>
-          <w:sz w:val="36"/>
-          <w:szCs w:val="36"/>
-        </w:rPr>
-      </w:pPr>
-      <w:r>
-        <w:rPr>
-          <w:rFonts w:eastAsia="Times New Roman" w:cs="Times New Roman" w:ascii="Garamond" w:hAnsi="Garamond"/>
-          <w:color w:val="000000"/>
-          <w:kern w:val="0"/>
-          <w:sz w:val="36"/>
-          <w:szCs w:val="36"/>
-          <w:shd w:fill="auto" w:val="clear"/>
-          <w:lang w:val="en-US" w:eastAsia="zh-CN" w:bidi="hi-IN"/>
-        </w:rPr>
-        <w:t>[ Desenvolver essa ideia: Durante suas últimas semanas na Terra, Jesus foi constantemente interpelado pelos saduceus e fariseus. Cada grupo apresentava suas próprias leis e tradições, buscando colocá-lo à prova e descobrir qual seria, afinal, a regra mais importante a ser seguida pelo homem.</w:t>
-      </w:r>
-    </w:p>
-    <w:p>
-      <w:pPr>
-        <w:pStyle w:val="Normal"/>
-        <w:jc w:val="both"/>
-        <w:rPr>
-          <w:sz w:val="36"/>
-          <w:szCs w:val="36"/>
-        </w:rPr>
-      </w:pPr>
-      <w:r>
+      </w:pPr>
+      <w:r>
+        <w:rPr>
+          <w:rFonts w:eastAsia="Times New Roman" w:cs="Times New Roman" w:ascii="Garamond" w:hAnsi="Garamond"/>
+          <w:color w:val="000000"/>
+          <w:kern w:val="0"/>
+          <w:sz w:val="36"/>
+          <w:szCs w:val="36"/>
+          <w:shd w:fill="auto" w:val="clear"/>
+          <w:lang w:val="en-US" w:eastAsia="zh-CN" w:bidi="hi-IN"/>
+        </w:rPr>
+        <w:t>Os fariseus representam a religiosidade sem vida interior, que conserva a forma mas esquece o espírito.</w:t>
+      </w:r>
+    </w:p>
+    <w:p>
+      <w:pPr>
+        <w:pStyle w:val="Normal"/>
+        <w:jc w:val="both"/>
+        <w:rPr>
+          <w:rFonts w:ascii="Garamond" w:hAnsi="Garamond" w:eastAsia="Times New Roman" w:cs="Times New Roman"/>
+          <w:color w:val="000000"/>
+          <w:kern w:val="0"/>
+          <w:sz w:val="36"/>
+          <w:szCs w:val="36"/>
+          <w:shd w:fill="auto" w:val="clear"/>
+          <w:lang w:val="en-US" w:eastAsia="zh-CN" w:bidi="hi-IN"/>
+        </w:rPr>
+      </w:pPr>
+      <w:r>
+        <w:rPr>
+          <w:rFonts w:eastAsia="Times New Roman" w:cs="Times New Roman" w:ascii="Garamond" w:hAnsi="Garamond"/>
+          <w:color w:val="000000"/>
+          <w:kern w:val="0"/>
+          <w:sz w:val="36"/>
+          <w:szCs w:val="36"/>
+          <w:shd w:fill="auto" w:val="clear"/>
+          <w:lang w:val="en-US" w:eastAsia="zh-CN" w:bidi="hi-IN"/>
+        </w:rPr>
+      </w:r>
+    </w:p>
+    <w:p>
+      <w:pPr>
+        <w:pStyle w:val="Normal"/>
+        <w:jc w:val="both"/>
         <w:rPr/>
-      </w:r>
-    </w:p>
-    <w:p>
-      <w:pPr>
-        <w:pStyle w:val="Normal"/>
-        <w:jc w:val="both"/>
-        <w:rPr>
-          <w:sz w:val="36"/>
-          <w:szCs w:val="36"/>
-        </w:rPr>
-      </w:pPr>
-      <w:r>
-        <w:rPr>
-          <w:rFonts w:eastAsia="Times New Roman" w:cs="Times New Roman" w:ascii="Garamond" w:hAnsi="Garamond"/>
-          <w:color w:val="000000"/>
-          <w:kern w:val="0"/>
-          <w:sz w:val="36"/>
-          <w:szCs w:val="36"/>
-          <w:shd w:fill="auto" w:val="clear"/>
-          <w:lang w:val="en-US" w:eastAsia="zh-CN" w:bidi="hi-IN"/>
-        </w:rPr>
-        <w:t>Em meio a tantas disputas e interpretações humanas, Jesus oferece uma resposta simples e profunda, capaz de iluminar todas as leis e orientar todos os corações: amar a Deus de todo o coração, de toda a alma e de todo o entendimento; e amar o próximo como a si mesmo.</w:t>
-      </w:r>
-    </w:p>
-    <w:p>
-      <w:pPr>
-        <w:pStyle w:val="Normal"/>
-        <w:jc w:val="both"/>
-        <w:rPr>
-          <w:sz w:val="36"/>
-          <w:szCs w:val="36"/>
-        </w:rPr>
-      </w:pPr>
-      <w:r>
+      </w:pPr>
+      <w:r>
+        <w:rPr>
+          <w:rFonts w:eastAsia="Times New Roman" w:cs="Times New Roman" w:ascii="Garamond" w:hAnsi="Garamond"/>
+          <w:color w:val="000000"/>
+          <w:kern w:val="0"/>
+          <w:sz w:val="36"/>
+          <w:szCs w:val="36"/>
+          <w:shd w:fill="auto" w:val="clear"/>
+          <w:lang w:val="en-US" w:eastAsia="zh-CN" w:bidi="hi-IN"/>
+        </w:rPr>
+        <w:t>E Jesus vem justamente para reconciliar a fé e o coração, chamando tanto uns quanto outros à verdade interior.</w:t>
+      </w:r>
+    </w:p>
+    <w:p>
+      <w:pPr>
+        <w:pStyle w:val="Normal"/>
+        <w:jc w:val="both"/>
+        <w:rPr>
+          <w:rFonts w:ascii="Garamond" w:hAnsi="Garamond" w:eastAsia="Times New Roman" w:cs="Times New Roman"/>
+          <w:color w:val="000000"/>
+          <w:kern w:val="0"/>
+          <w:sz w:val="36"/>
+          <w:szCs w:val="36"/>
+          <w:shd w:fill="auto" w:val="clear"/>
+          <w:lang w:val="en-US" w:eastAsia="zh-CN" w:bidi="hi-IN"/>
+        </w:rPr>
+      </w:pPr>
+      <w:r>
+        <w:rPr>
+          <w:rFonts w:eastAsia="Times New Roman" w:cs="Times New Roman" w:ascii="Garamond" w:hAnsi="Garamond"/>
+          <w:color w:val="000000"/>
+          <w:kern w:val="0"/>
+          <w:sz w:val="36"/>
+          <w:szCs w:val="36"/>
+          <w:shd w:fill="auto" w:val="clear"/>
+          <w:lang w:val="en-US" w:eastAsia="zh-CN" w:bidi="hi-IN"/>
+        </w:rPr>
+      </w:r>
+    </w:p>
+    <w:p>
+      <w:pPr>
+        <w:pStyle w:val="Normal"/>
+        <w:jc w:val="both"/>
         <w:rPr/>
-      </w:r>
-    </w:p>
-    <w:p>
-      <w:pPr>
-        <w:pStyle w:val="Normal"/>
-        <w:jc w:val="both"/>
-        <w:rPr>
-          <w:sz w:val="36"/>
-          <w:szCs w:val="36"/>
-        </w:rPr>
-      </w:pPr>
-      <w:r>
-        <w:rPr>
-          <w:rFonts w:eastAsia="Times New Roman" w:cs="Times New Roman" w:ascii="Garamond" w:hAnsi="Garamond"/>
-          <w:color w:val="000000"/>
-          <w:kern w:val="0"/>
-          <w:sz w:val="36"/>
-          <w:szCs w:val="36"/>
-          <w:shd w:fill="auto" w:val="clear"/>
-          <w:lang w:val="en-US" w:eastAsia="zh-CN" w:bidi="hi-IN"/>
-        </w:rPr>
-        <w:t>Com isso, o Mestre ensina que o verdadeiro cumprimento da Lei não está na letra, mas no sentimento. Toda norma, todo princípio ou prática religiosa deve ter como base o amor — amor que se volta primeiro para Deus, que se estende ao próximo e que também se reconhece em nós mesmos. É nesse equilíbrio que a fé deixa de ser mera obediência e se torna vivência, conduzindo-nos ao verdadeiro entendimento da vontade divina.]</w:t>
-      </w:r>
-    </w:p>
-    <w:p>
-      <w:pPr>
-        <w:pStyle w:val="Normal"/>
-        <w:jc w:val="both"/>
-        <w:rPr>
-          <w:sz w:val="36"/>
-          <w:szCs w:val="36"/>
-        </w:rPr>
-      </w:pPr>
-      <w:r>
-        <w:rPr>
-          <w:rFonts w:eastAsia="Times New Roman" w:cs="Times New Roman" w:ascii="Garamond" w:hAnsi="Garamond"/>
-          <w:color w:val="000000"/>
-          <w:kern w:val="0"/>
-          <w:sz w:val="36"/>
-          <w:szCs w:val="36"/>
-          <w:shd w:fill="auto" w:val="clear"/>
-          <w:lang w:val="en-US" w:eastAsia="zh-CN" w:bidi="hi-IN"/>
-        </w:rPr>
-        <w:t xml:space="preserve"> </w:t>
-      </w:r>
-    </w:p>
-    <w:p>
-      <w:pPr>
-        <w:pStyle w:val="Normal"/>
-        <w:jc w:val="both"/>
-        <w:rPr>
-          <w:sz w:val="36"/>
-          <w:szCs w:val="36"/>
-        </w:rPr>
-      </w:pPr>
-      <w:r>
-        <w:rPr/>
-      </w:r>
-    </w:p>
-    <w:p>
-      <w:pPr>
-        <w:pStyle w:val="Normal"/>
-        <w:jc w:val="both"/>
-        <w:rPr>
-          <w:sz w:val="36"/>
-          <w:szCs w:val="36"/>
-        </w:rPr>
-      </w:pPr>
-      <w:r>
-        <w:rPr/>
-      </w:r>
-    </w:p>
-    <w:p>
-      <w:pPr>
-        <w:pStyle w:val="Normal"/>
-        <w:jc w:val="both"/>
-        <w:rPr>
-          <w:sz w:val="36"/>
-          <w:szCs w:val="36"/>
-        </w:rPr>
-      </w:pPr>
-      <w:r>
-        <w:rPr/>
-      </w:r>
-    </w:p>
-    <w:p>
-      <w:pPr>
-        <w:pStyle w:val="Normal"/>
-        <w:jc w:val="both"/>
-        <w:rPr>
-          <w:sz w:val="36"/>
-          <w:szCs w:val="36"/>
-        </w:rPr>
-      </w:pPr>
-      <w:r>
-        <w:rPr>
-          <w:rFonts w:eastAsia="Times New Roman" w:cs="Times New Roman" w:ascii="Garamond" w:hAnsi="Garamond"/>
-          <w:color w:val="000000"/>
-          <w:kern w:val="0"/>
-          <w:sz w:val="36"/>
-          <w:szCs w:val="36"/>
-          <w:shd w:fill="auto" w:val="clear"/>
-          <w:lang w:val="en-US" w:eastAsia="zh-CN" w:bidi="hi-IN"/>
-        </w:rPr>
-        <w:t xml:space="preserve">[ </w:t>
-      </w:r>
-      <w:r>
-        <w:rPr>
-          <w:rFonts w:eastAsia="Times New Roman" w:cs="Times New Roman" w:ascii="Garamond" w:hAnsi="Garamond"/>
-          <w:b/>
-          <w:bCs/>
-          <w:color w:val="C9211E"/>
-          <w:kern w:val="0"/>
-          <w:sz w:val="36"/>
-          <w:szCs w:val="36"/>
-          <w:shd w:fill="auto" w:val="clear"/>
-          <w:lang w:val="en-US" w:eastAsia="zh-CN" w:bidi="hi-IN"/>
-        </w:rPr>
-        <w:t>Início de bloco a ser avaliado se permanece</w:t>
-      </w:r>
-      <w:r>
-        <w:rPr>
-          <w:rFonts w:eastAsia="Times New Roman" w:cs="Times New Roman" w:ascii="Garamond" w:hAnsi="Garamond"/>
-          <w:color w:val="000000"/>
-          <w:kern w:val="0"/>
-          <w:sz w:val="36"/>
-          <w:szCs w:val="36"/>
-          <w:shd w:fill="auto" w:val="clear"/>
-          <w:lang w:val="en-US" w:eastAsia="zh-CN" w:bidi="hi-IN"/>
-        </w:rPr>
-        <w:t xml:space="preserve"> ]</w:t>
-      </w:r>
-    </w:p>
-    <w:p>
-      <w:pPr>
-        <w:pStyle w:val="Normal"/>
-        <w:jc w:val="both"/>
-        <w:rPr>
-          <w:sz w:val="36"/>
-          <w:szCs w:val="36"/>
-        </w:rPr>
-      </w:pPr>
-      <w:r>
-        <w:rPr/>
-      </w:r>
-    </w:p>
-    <w:p>
-      <w:pPr>
-        <w:pStyle w:val="Normal"/>
-        <w:jc w:val="both"/>
-        <w:rPr>
-          <w:sz w:val="36"/>
-          <w:szCs w:val="36"/>
-        </w:rPr>
-      </w:pPr>
-      <w:r>
-        <w:rPr>
-          <w:rFonts w:eastAsia="Times New Roman" w:cs="Times New Roman" w:ascii="Garamond" w:hAnsi="Garamond"/>
-          <w:color w:val="000000"/>
-          <w:kern w:val="0"/>
-          <w:sz w:val="36"/>
-          <w:szCs w:val="36"/>
-          <w:shd w:fill="auto" w:val="clear"/>
-          <w:lang w:val="en-US" w:eastAsia="zh-CN" w:bidi="hi-IN"/>
-        </w:rPr>
-        <w:t>À luz do Espiritismo, esses capítulos mostram estágios da nossa evolução moral:</w:t>
-      </w:r>
-    </w:p>
-    <w:p>
-      <w:pPr>
-        <w:pStyle w:val="Normal"/>
-        <w:jc w:val="both"/>
-        <w:rPr>
-          <w:sz w:val="36"/>
-          <w:szCs w:val="36"/>
-        </w:rPr>
-      </w:pPr>
-      <w:r>
-        <w:rPr/>
-      </w:r>
-    </w:p>
-    <w:p>
-      <w:pPr>
-        <w:pStyle w:val="Normal"/>
-        <w:jc w:val="both"/>
-        <w:rPr>
-          <w:sz w:val="36"/>
-          <w:szCs w:val="36"/>
-        </w:rPr>
-      </w:pPr>
-      <w:r>
-        <w:rPr>
-          <w:rFonts w:eastAsia="Times New Roman" w:cs="Times New Roman" w:ascii="Garamond" w:hAnsi="Garamond"/>
-          <w:color w:val="000000"/>
-          <w:kern w:val="0"/>
-          <w:sz w:val="36"/>
-          <w:szCs w:val="36"/>
-          <w:shd w:fill="auto" w:val="clear"/>
-          <w:lang w:val="en-US" w:eastAsia="zh-CN" w:bidi="hi-IN"/>
-        </w:rPr>
-        <w:t>Capítulo 21 traz o despertar da consciência, ou seja,  reconhecer nossa própria esterilidade.</w:t>
-      </w:r>
-    </w:p>
-    <w:p>
-      <w:pPr>
-        <w:pStyle w:val="Normal"/>
-        <w:jc w:val="both"/>
-        <w:rPr>
-          <w:sz w:val="36"/>
-          <w:szCs w:val="36"/>
-        </w:rPr>
-      </w:pPr>
-      <w:r>
-        <w:rPr/>
-      </w:r>
-    </w:p>
-    <w:p>
-      <w:pPr>
-        <w:pStyle w:val="Normal"/>
-        <w:jc w:val="both"/>
-        <w:rPr>
-          <w:sz w:val="36"/>
-          <w:szCs w:val="36"/>
-        </w:rPr>
-      </w:pPr>
-      <w:r>
-        <w:rPr>
-          <w:rFonts w:eastAsia="Times New Roman" w:cs="Times New Roman" w:ascii="Garamond" w:hAnsi="Garamond"/>
-          <w:color w:val="000000"/>
-          <w:kern w:val="0"/>
-          <w:sz w:val="36"/>
-          <w:szCs w:val="36"/>
-          <w:shd w:fill="auto" w:val="clear"/>
-          <w:lang w:val="en-US" w:eastAsia="zh-CN" w:bidi="hi-IN"/>
-        </w:rPr>
-        <w:t>Já o capítulo 22 representa a iluminação interior — compreender o amor como essência da Lei (cap. 22).</w:t>
-      </w:r>
-    </w:p>
-    <w:p>
-      <w:pPr>
-        <w:pStyle w:val="Normal"/>
-        <w:jc w:val="both"/>
-        <w:rPr>
-          <w:sz w:val="36"/>
-          <w:szCs w:val="36"/>
-        </w:rPr>
-      </w:pPr>
-      <w:r>
-        <w:rPr/>
-      </w:r>
-    </w:p>
-    <w:p>
-      <w:pPr>
-        <w:pStyle w:val="Normal"/>
-        <w:jc w:val="both"/>
-        <w:rPr>
-          <w:sz w:val="36"/>
-          <w:szCs w:val="36"/>
-        </w:rPr>
-      </w:pPr>
-      <w:r>
-        <w:rPr>
-          <w:rFonts w:eastAsia="Times New Roman" w:cs="Times New Roman" w:ascii="Garamond" w:hAnsi="Garamond"/>
-          <w:color w:val="000000"/>
-          <w:kern w:val="0"/>
-          <w:sz w:val="36"/>
-          <w:szCs w:val="36"/>
-          <w:shd w:fill="auto" w:val="clear"/>
-          <w:lang w:val="en-US" w:eastAsia="zh-CN" w:bidi="hi-IN"/>
-        </w:rPr>
-        <w:t xml:space="preserve">Reforma íntima — vencer o orgulho e a hipocrisia (cap. 23). </w:t>
-      </w:r>
-    </w:p>
-    <w:p>
-      <w:pPr>
-        <w:pStyle w:val="Normal"/>
-        <w:jc w:val="both"/>
-        <w:rPr>
-          <w:sz w:val="36"/>
-          <w:szCs w:val="36"/>
-        </w:rPr>
-      </w:pPr>
-      <w:r>
-        <w:rPr/>
-      </w:r>
-    </w:p>
-    <w:p>
-      <w:pPr>
-        <w:pStyle w:val="Normal"/>
-        <w:jc w:val="both"/>
-        <w:rPr>
-          <w:sz w:val="36"/>
-          <w:szCs w:val="36"/>
-        </w:rPr>
-      </w:pPr>
-      <w:r>
-        <w:rPr>
-          <w:rFonts w:eastAsia="Times New Roman" w:cs="Times New Roman" w:ascii="Garamond" w:hAnsi="Garamond"/>
-          <w:color w:val="000000"/>
-          <w:kern w:val="0"/>
-          <w:sz w:val="36"/>
-          <w:szCs w:val="36"/>
-          <w:shd w:fill="auto" w:val="clear"/>
-          <w:lang w:val="en-US" w:eastAsia="zh-CN" w:bidi="hi-IN"/>
-        </w:rPr>
-        <w:t>Somente depois de passar por esse processo o espírito está preparado para o sacrifício consciente, isto é, para renunciar ao ego e viver o amor em plenitude — o que Jesus realiza na cruz e confirma na ressurreição</w:t>
-      </w:r>
-    </w:p>
-    <w:p>
-      <w:pPr>
-        <w:pStyle w:val="Normal"/>
-        <w:jc w:val="both"/>
-        <w:rPr>
-          <w:sz w:val="36"/>
-          <w:szCs w:val="36"/>
-        </w:rPr>
-      </w:pPr>
-      <w:r>
-        <w:rPr>
-          <w:rFonts w:eastAsia="Times New Roman" w:cs="Times New Roman" w:ascii="Garamond" w:hAnsi="Garamond"/>
-          <w:color w:val="000000"/>
-          <w:kern w:val="0"/>
-          <w:sz w:val="36"/>
-          <w:szCs w:val="36"/>
-          <w:shd w:fill="auto" w:val="clear"/>
-          <w:lang w:val="en-US" w:eastAsia="zh-CN" w:bidi="hi-IN"/>
-        </w:rPr>
-        <w:t xml:space="preserve">[ </w:t>
-      </w:r>
-      <w:r>
-        <w:rPr>
-          <w:rFonts w:eastAsia="Times New Roman" w:cs="Times New Roman" w:ascii="Garamond" w:hAnsi="Garamond"/>
-          <w:b/>
-          <w:bCs/>
-          <w:color w:val="C9211E"/>
-          <w:kern w:val="0"/>
-          <w:sz w:val="36"/>
-          <w:szCs w:val="36"/>
-          <w:shd w:fill="auto" w:val="clear"/>
-          <w:lang w:val="en-US" w:eastAsia="zh-CN" w:bidi="hi-IN"/>
-        </w:rPr>
-        <w:t>Término de bloco a ser avaliado se permanece</w:t>
-      </w:r>
-      <w:r>
-        <w:rPr>
-          <w:rFonts w:eastAsia="Times New Roman" w:cs="Times New Roman" w:ascii="Garamond" w:hAnsi="Garamond"/>
-          <w:color w:val="000000"/>
-          <w:kern w:val="0"/>
-          <w:sz w:val="36"/>
-          <w:szCs w:val="36"/>
-          <w:shd w:fill="auto" w:val="clear"/>
-          <w:lang w:val="en-US" w:eastAsia="zh-CN" w:bidi="hi-IN"/>
-        </w:rPr>
-        <w:t xml:space="preserve"> ]</w:t>
-      </w:r>
-    </w:p>
-    <w:p>
-      <w:pPr>
-        <w:pStyle w:val="Normal"/>
-        <w:jc w:val="both"/>
-        <w:rPr>
-          <w:sz w:val="36"/>
-          <w:szCs w:val="36"/>
-        </w:rPr>
-      </w:pPr>
-      <w:r>
-        <w:rPr/>
-      </w:r>
-    </w:p>
-    <w:p>
-      <w:pPr>
-        <w:pStyle w:val="Normal"/>
-        <w:jc w:val="both"/>
-        <w:rPr/>
-      </w:pPr>
-      <w:r>
-        <w:rPr>
-          <w:rFonts w:eastAsia="Times New Roman" w:cs="Times New Roman" w:ascii="Garamond" w:hAnsi="Garamond"/>
-          <w:color w:val="000000"/>
-          <w:kern w:val="0"/>
-          <w:sz w:val="36"/>
-          <w:szCs w:val="36"/>
-          <w:shd w:fill="auto" w:val="clear"/>
-          <w:lang w:val="en-US" w:eastAsia="zh-CN" w:bidi="hi-IN"/>
-        </w:rPr>
-        <w:t xml:space="preserve">[ </w:t>
-      </w:r>
-      <w:r>
-        <w:rPr>
-          <w:rFonts w:eastAsia="Times New Roman" w:cs="Times New Roman" w:ascii="Garamond" w:hAnsi="Garamond"/>
-          <w:b/>
-          <w:bCs/>
-          <w:color w:val="C9211E"/>
-          <w:kern w:val="0"/>
-          <w:sz w:val="36"/>
-          <w:szCs w:val="36"/>
-          <w:shd w:fill="auto" w:val="clear"/>
-          <w:lang w:val="en-US" w:eastAsia="zh-CN" w:bidi="hi-IN"/>
-        </w:rPr>
-        <w:t>Precisa ser desenvolvido e encaixado no texto</w:t>
-      </w:r>
-      <w:r>
-        <w:rPr>
-          <w:rFonts w:eastAsia="Times New Roman" w:cs="Times New Roman" w:ascii="Garamond" w:hAnsi="Garamond"/>
-          <w:color w:val="000000"/>
-          <w:kern w:val="0"/>
-          <w:sz w:val="36"/>
-          <w:szCs w:val="36"/>
-          <w:shd w:fill="auto" w:val="clear"/>
-          <w:lang w:val="en-US" w:eastAsia="zh-CN" w:bidi="hi-IN"/>
-        </w:rPr>
-        <w:t>] O que você formulou toca num ponto que muitos estudiosos também percebem: Jesus entra em confronto mais direto com quem está mais perto da verdade, mas a vive de forma distorcida. Os saduceus, por negarem a ressurreição, os anjos e a vida futura, estavam tão distantes da dimensão espiritual que o diálogo com eles tinha pouco espaço — Jesus os corrige, mas não trava com eles o mesmo tipo de debate moral e espiritual que tem com os fariseus.</w:t>
+      </w:pPr>
+      <w:r>
+        <w:rPr>
+          <w:rFonts w:eastAsia="Times New Roman" w:cs="Times New Roman" w:ascii="Garamond" w:hAnsi="Garamond"/>
+          <w:color w:val="000000"/>
+          <w:kern w:val="0"/>
+          <w:sz w:val="36"/>
+          <w:szCs w:val="36"/>
+          <w:shd w:fill="auto" w:val="clear"/>
+          <w:lang w:val="en-US" w:eastAsia="zh-CN" w:bidi="hi-IN"/>
+        </w:rPr>
+        <w:t>Sua leitura é muito lúcida — especialmente essa ideia de que é mais difícil ensinar quem está completamente distante da fé do que corrigir quem a conhece, mas a deturpou. Isso mostra uma compreensão espiritual bastante madura do Evangelho.</w:t>
       </w:r>
     </w:p>
     <w:p>
@@ -1440,26 +2089,91 @@
         </w:rPr>
       </w:pPr>
       <w:r>
-        <w:rPr/>
-      </w:r>
-    </w:p>
-    <w:p>
-      <w:pPr>
-        <w:pStyle w:val="Normal"/>
-        <w:jc w:val="both"/>
-        <w:rPr/>
-      </w:pPr>
-      <w:r>
-        <w:rPr>
-          <w:rFonts w:eastAsia="Times New Roman" w:cs="Times New Roman" w:ascii="Garamond" w:hAnsi="Garamond"/>
-          <w:color w:val="000000"/>
-          <w:kern w:val="0"/>
-          <w:sz w:val="36"/>
-          <w:szCs w:val="36"/>
-          <w:shd w:fill="auto" w:val="clear"/>
-          <w:lang w:val="en-US" w:eastAsia="zh-CN" w:bidi="hi-IN"/>
-        </w:rPr>
-        <w:t>Já os fariseus, por outro lado, acreditavam nas Escrituras, na vida após a morte, e na vinda do Messias — ou seja, estavam dentro do mesmo universo de fé que Jesus. O problema era que transformaram a fé em formalismo e hipocrisia, perdendo o coração do ensinamento que professavam. Por isso, Jesus os confronta com mais veemência: eles sabiam mais, mas viviam menos.</w:t>
+        <w:rPr>
+          <w:rFonts w:eastAsia="Times New Roman" w:cs="Times New Roman" w:ascii="Garamond" w:hAnsi="Garamond"/>
+          <w:color w:val="000000"/>
+          <w:kern w:val="0"/>
+          <w:sz w:val="36"/>
+          <w:szCs w:val="36"/>
+          <w:shd w:fill="auto" w:val="clear"/>
+          <w:lang w:val="en-US" w:eastAsia="zh-CN" w:bidi="hi-IN"/>
+        </w:rPr>
+      </w:r>
+    </w:p>
+    <w:p>
+      <w:pPr>
+        <w:pStyle w:val="Normal"/>
+        <w:jc w:val="both"/>
+        <w:rPr>
+          <w:sz w:val="36"/>
+          <w:szCs w:val="36"/>
+        </w:rPr>
+      </w:pPr>
+      <w:r>
+        <w:rPr>
+          <w:rFonts w:eastAsia="Times New Roman" w:cs="Times New Roman" w:ascii="Garamond" w:hAnsi="Garamond"/>
+          <w:color w:val="000000"/>
+          <w:kern w:val="0"/>
+          <w:sz w:val="36"/>
+          <w:szCs w:val="36"/>
+          <w:shd w:fill="auto" w:val="clear"/>
+          <w:lang w:val="en-US" w:eastAsia="zh-CN" w:bidi="hi-IN"/>
+        </w:rPr>
+        <w:t>[ Ver onde encaixar ] Os saduceus, que não acreditavam na ressurreição, traziam questionamentos puro e simples teológicos — a vida após a morte era um tema que negavam, então sua tentativa era desafiar Jesus em algo que ele poderia não explicar satisfatoriamente.</w:t>
+      </w:r>
+    </w:p>
+    <w:p>
+      <w:pPr>
+        <w:pStyle w:val="Normal"/>
+        <w:jc w:val="both"/>
+        <w:rPr>
+          <w:sz w:val="36"/>
+          <w:szCs w:val="36"/>
+        </w:rPr>
+      </w:pPr>
+      <w:r>
+        <w:rPr>
+          <w:sz w:val="36"/>
+          <w:szCs w:val="36"/>
+        </w:rPr>
+      </w:r>
+    </w:p>
+    <w:p>
+      <w:pPr>
+        <w:pStyle w:val="Normal"/>
+        <w:jc w:val="both"/>
+        <w:rPr>
+          <w:sz w:val="36"/>
+          <w:szCs w:val="36"/>
+        </w:rPr>
+      </w:pPr>
+      <w:r>
+        <w:rPr>
+          <w:rFonts w:eastAsia="Times New Roman" w:cs="Times New Roman" w:ascii="Garamond" w:hAnsi="Garamond"/>
+          <w:color w:val="000000"/>
+          <w:kern w:val="0"/>
+          <w:sz w:val="36"/>
+          <w:szCs w:val="36"/>
+          <w:shd w:fill="auto" w:val="clear"/>
+          <w:lang w:val="en-US" w:eastAsia="zh-CN" w:bidi="hi-IN"/>
+        </w:rPr>
+        <w:t>Os fariseus, por outro lado, já tinham uma base de fé espiritual, mas buscavam manipular a situação social e política. Por isso, questionam assuntos materiais e cotidianos, mesmo acreditando na vida futura.</w:t>
+      </w:r>
+    </w:p>
+    <w:p>
+      <w:pPr>
+        <w:pStyle w:val="Normal"/>
+        <w:jc w:val="both"/>
+        <w:rPr>
+          <w:sz w:val="36"/>
+          <w:szCs w:val="36"/>
+        </w:rPr>
+      </w:pPr>
+      <w:r>
+        <w:rPr>
+          <w:sz w:val="36"/>
+          <w:szCs w:val="36"/>
+        </w:rPr>
       </w:r>
     </w:p>
     <w:p>
@@ -1477,402 +2191,101 @@
         </w:rPr>
       </w:pPr>
       <w:r>
-        <w:rPr/>
-      </w:r>
-    </w:p>
-    <w:p>
-      <w:pPr>
-        <w:pStyle w:val="Normal"/>
-        <w:jc w:val="both"/>
-        <w:rPr/>
-      </w:pPr>
-      <w:r>
-        <w:rPr>
-          <w:rFonts w:eastAsia="Times New Roman" w:cs="Times New Roman" w:ascii="Garamond" w:hAnsi="Garamond"/>
-          <w:color w:val="000000"/>
-          <w:kern w:val="0"/>
-          <w:sz w:val="36"/>
-          <w:szCs w:val="36"/>
-          <w:shd w:fill="auto" w:val="clear"/>
-          <w:lang w:val="en-US" w:eastAsia="zh-CN" w:bidi="hi-IN"/>
-        </w:rPr>
-        <w:t>Em termos simbólicos, podemos dizer que:</w:t>
-      </w:r>
-    </w:p>
-    <w:p>
-      <w:pPr>
-        <w:pStyle w:val="Normal"/>
-        <w:jc w:val="both"/>
-        <w:rPr>
-          <w:rFonts w:ascii="Garamond" w:hAnsi="Garamond" w:eastAsia="Times New Roman" w:cs="Times New Roman"/>
-          <w:color w:val="000000"/>
-          <w:kern w:val="0"/>
-          <w:sz w:val="36"/>
-          <w:szCs w:val="36"/>
-          <w:shd w:fill="auto" w:val="clear"/>
-          <w:lang w:val="en-US" w:eastAsia="zh-CN" w:bidi="hi-IN"/>
-        </w:rPr>
-      </w:pPr>
-      <w:r>
-        <w:rPr/>
-      </w:r>
-    </w:p>
-    <w:p>
-      <w:pPr>
-        <w:pStyle w:val="Normal"/>
-        <w:jc w:val="both"/>
-        <w:rPr/>
-      </w:pPr>
-      <w:r>
-        <w:rPr>
-          <w:rFonts w:eastAsia="Times New Roman" w:cs="Times New Roman" w:ascii="Garamond" w:hAnsi="Garamond"/>
-          <w:color w:val="000000"/>
-          <w:kern w:val="0"/>
-          <w:sz w:val="36"/>
-          <w:szCs w:val="36"/>
-          <w:shd w:fill="auto" w:val="clear"/>
-          <w:lang w:val="en-US" w:eastAsia="zh-CN" w:bidi="hi-IN"/>
-        </w:rPr>
-        <w:t>Os saduceus representam o ceticismo religioso, que perde a dimensão do sagrado;</w:t>
-      </w:r>
-    </w:p>
-    <w:p>
-      <w:pPr>
-        <w:pStyle w:val="Normal"/>
-        <w:jc w:val="both"/>
-        <w:rPr>
-          <w:rFonts w:ascii="Garamond" w:hAnsi="Garamond" w:eastAsia="Times New Roman" w:cs="Times New Roman"/>
-          <w:color w:val="000000"/>
-          <w:kern w:val="0"/>
-          <w:sz w:val="36"/>
-          <w:szCs w:val="36"/>
-          <w:shd w:fill="auto" w:val="clear"/>
-          <w:lang w:val="en-US" w:eastAsia="zh-CN" w:bidi="hi-IN"/>
-        </w:rPr>
-      </w:pPr>
-      <w:r>
-        <w:rPr/>
-      </w:r>
-    </w:p>
-    <w:p>
-      <w:pPr>
-        <w:pStyle w:val="Normal"/>
-        <w:jc w:val="both"/>
-        <w:rPr/>
-      </w:pPr>
-      <w:r>
-        <w:rPr>
-          <w:rFonts w:eastAsia="Times New Roman" w:cs="Times New Roman" w:ascii="Garamond" w:hAnsi="Garamond"/>
-          <w:color w:val="000000"/>
-          <w:kern w:val="0"/>
-          <w:sz w:val="36"/>
-          <w:szCs w:val="36"/>
-          <w:shd w:fill="auto" w:val="clear"/>
-          <w:lang w:val="en-US" w:eastAsia="zh-CN" w:bidi="hi-IN"/>
-        </w:rPr>
-        <w:t>Os fariseus representam a religiosidade sem vida interior, que conserva a forma mas esquece o espírito.</w:t>
-      </w:r>
-    </w:p>
-    <w:p>
-      <w:pPr>
-        <w:pStyle w:val="Normal"/>
-        <w:jc w:val="both"/>
-        <w:rPr>
-          <w:rFonts w:ascii="Garamond" w:hAnsi="Garamond" w:eastAsia="Times New Roman" w:cs="Times New Roman"/>
-          <w:color w:val="000000"/>
-          <w:kern w:val="0"/>
-          <w:sz w:val="36"/>
-          <w:szCs w:val="36"/>
-          <w:shd w:fill="auto" w:val="clear"/>
-          <w:lang w:val="en-US" w:eastAsia="zh-CN" w:bidi="hi-IN"/>
-        </w:rPr>
-      </w:pPr>
-      <w:r>
-        <w:rPr/>
-      </w:r>
-    </w:p>
-    <w:p>
-      <w:pPr>
-        <w:pStyle w:val="Normal"/>
-        <w:jc w:val="both"/>
-        <w:rPr/>
-      </w:pPr>
-      <w:r>
-        <w:rPr>
-          <w:rFonts w:eastAsia="Times New Roman" w:cs="Times New Roman" w:ascii="Garamond" w:hAnsi="Garamond"/>
-          <w:color w:val="000000"/>
-          <w:kern w:val="0"/>
-          <w:sz w:val="36"/>
-          <w:szCs w:val="36"/>
-          <w:shd w:fill="auto" w:val="clear"/>
-          <w:lang w:val="en-US" w:eastAsia="zh-CN" w:bidi="hi-IN"/>
-        </w:rPr>
-        <w:t>E Jesus vem justamente para reconciliar a fé e o coração, chamando tanto uns quanto outros à verdade interior.</w:t>
-      </w:r>
-    </w:p>
-    <w:p>
-      <w:pPr>
-        <w:pStyle w:val="Normal"/>
-        <w:jc w:val="both"/>
-        <w:rPr>
-          <w:rFonts w:ascii="Garamond" w:hAnsi="Garamond" w:eastAsia="Times New Roman" w:cs="Times New Roman"/>
-          <w:color w:val="000000"/>
-          <w:kern w:val="0"/>
-          <w:sz w:val="36"/>
-          <w:szCs w:val="36"/>
-          <w:shd w:fill="auto" w:val="clear"/>
-          <w:lang w:val="en-US" w:eastAsia="zh-CN" w:bidi="hi-IN"/>
-        </w:rPr>
-      </w:pPr>
-      <w:r>
-        <w:rPr/>
-      </w:r>
-    </w:p>
-    <w:p>
-      <w:pPr>
-        <w:pStyle w:val="Normal"/>
-        <w:jc w:val="both"/>
-        <w:rPr/>
-      </w:pPr>
-      <w:r>
-        <w:rPr>
-          <w:rFonts w:eastAsia="Times New Roman" w:cs="Times New Roman" w:ascii="Garamond" w:hAnsi="Garamond"/>
-          <w:color w:val="000000"/>
-          <w:kern w:val="0"/>
-          <w:sz w:val="36"/>
-          <w:szCs w:val="36"/>
-          <w:shd w:fill="auto" w:val="clear"/>
-          <w:lang w:val="en-US" w:eastAsia="zh-CN" w:bidi="hi-IN"/>
-        </w:rPr>
-        <w:t>Sua leitura é muito lúcida — especialmente essa ideia de que é mais difícil ensinar quem está completamente distante da fé do que corrigir quem a conhece, mas a deturpou. Isso mostra uma compreensão espiritual bastante madura do Evangelho.</w:t>
-      </w:r>
-    </w:p>
-    <w:p>
-      <w:pPr>
-        <w:pStyle w:val="Normal"/>
-        <w:jc w:val="both"/>
-        <w:rPr>
-          <w:rFonts w:ascii="Garamond" w:hAnsi="Garamond" w:eastAsia="Times New Roman" w:cs="Times New Roman"/>
-          <w:color w:val="000000"/>
-          <w:kern w:val="0"/>
-          <w:sz w:val="36"/>
-          <w:szCs w:val="36"/>
-          <w:shd w:fill="auto" w:val="clear"/>
-          <w:lang w:val="en-US" w:eastAsia="zh-CN" w:bidi="hi-IN"/>
-        </w:rPr>
-      </w:pPr>
-      <w:r>
-        <w:rPr/>
-      </w:r>
-    </w:p>
-    <w:p>
-      <w:pPr>
-        <w:pStyle w:val="Normal"/>
-        <w:jc w:val="both"/>
-        <w:rPr>
-          <w:sz w:val="36"/>
-          <w:szCs w:val="36"/>
-        </w:rPr>
-      </w:pPr>
-      <w:r>
-        <w:rPr>
-          <w:rFonts w:eastAsia="Times New Roman" w:cs="Times New Roman" w:ascii="Garamond" w:hAnsi="Garamond"/>
-          <w:color w:val="000000"/>
-          <w:kern w:val="0"/>
-          <w:sz w:val="36"/>
-          <w:szCs w:val="36"/>
-          <w:shd w:fill="auto" w:val="clear"/>
-          <w:lang w:val="en-US" w:eastAsia="zh-CN" w:bidi="hi-IN"/>
-        </w:rPr>
-        <w:t>[ Ver onde encaixar ] Os saduceus, que não acreditavam na ressurreição, traziam questionamentos puro e simples teológicos — a vida após a morte era um tema que negavam, então sua tentativa era desafiar Jesus em algo que ele poderia não explicar satisfatoriamente.</w:t>
-      </w:r>
-    </w:p>
-    <w:p>
-      <w:pPr>
-        <w:pStyle w:val="Normal"/>
-        <w:jc w:val="both"/>
-        <w:rPr>
-          <w:sz w:val="36"/>
-          <w:szCs w:val="36"/>
-        </w:rPr>
-      </w:pPr>
-      <w:r>
-        <w:rPr/>
-      </w:r>
-    </w:p>
-    <w:p>
-      <w:pPr>
-        <w:pStyle w:val="Normal"/>
-        <w:jc w:val="both"/>
-        <w:rPr>
-          <w:sz w:val="36"/>
-          <w:szCs w:val="36"/>
-        </w:rPr>
-      </w:pPr>
-      <w:r>
-        <w:rPr>
-          <w:rFonts w:eastAsia="Times New Roman" w:cs="Times New Roman" w:ascii="Garamond" w:hAnsi="Garamond"/>
-          <w:color w:val="000000"/>
-          <w:kern w:val="0"/>
-          <w:sz w:val="36"/>
-          <w:szCs w:val="36"/>
-          <w:shd w:fill="auto" w:val="clear"/>
-          <w:lang w:val="en-US" w:eastAsia="zh-CN" w:bidi="hi-IN"/>
-        </w:rPr>
-        <w:t>Os fariseus, por outro lado, já tinham uma base de fé espiritual, mas buscavam manipular a situação social e política. Por isso, questionam assuntos materiais e cotidianos, mesmo acreditando na vida futura.</w:t>
-      </w:r>
-    </w:p>
-    <w:p>
-      <w:pPr>
-        <w:pStyle w:val="Normal"/>
-        <w:jc w:val="both"/>
-        <w:rPr>
-          <w:sz w:val="36"/>
-          <w:szCs w:val="36"/>
-        </w:rPr>
-      </w:pPr>
-      <w:r>
-        <w:rPr/>
-      </w:r>
-    </w:p>
-    <w:p>
-      <w:pPr>
-        <w:pStyle w:val="Normal"/>
-        <w:jc w:val="both"/>
-        <w:rPr>
-          <w:rFonts w:ascii="Garamond" w:hAnsi="Garamond" w:eastAsia="Times New Roman" w:cs="Times New Roman"/>
-          <w:color w:val="000000"/>
-          <w:kern w:val="0"/>
-          <w:sz w:val="36"/>
-          <w:szCs w:val="36"/>
-          <w:shd w:fill="auto" w:val="clear"/>
-          <w:lang w:val="en-US" w:eastAsia="zh-CN" w:bidi="hi-IN"/>
-        </w:rPr>
-      </w:pPr>
-      <w:r>
-        <w:rPr/>
-      </w:r>
-    </w:p>
-    <w:p>
-      <w:pPr>
-        <w:pStyle w:val="Normal"/>
-        <w:jc w:val="both"/>
-        <w:rPr>
-          <w:sz w:val="36"/>
-          <w:szCs w:val="36"/>
-        </w:rPr>
-      </w:pPr>
-      <w:r>
-        <w:rPr/>
-      </w:r>
-    </w:p>
-    <w:p>
-      <w:pPr>
-        <w:pStyle w:val="Normal"/>
-        <w:jc w:val="both"/>
-        <w:rPr>
-          <w:sz w:val="36"/>
-          <w:szCs w:val="36"/>
-        </w:rPr>
-      </w:pPr>
-      <w:r>
-        <w:rPr/>
-      </w:r>
-    </w:p>
-    <w:p>
-      <w:pPr>
-        <w:pStyle w:val="Normal"/>
-        <w:jc w:val="both"/>
-        <w:rPr>
-          <w:sz w:val="36"/>
-          <w:szCs w:val="36"/>
-        </w:rPr>
-      </w:pPr>
-      <w:r>
-        <w:rPr/>
-      </w:r>
-    </w:p>
-    <w:p>
-      <w:pPr>
-        <w:pStyle w:val="Normal"/>
-        <w:jc w:val="both"/>
-        <w:rPr>
-          <w:sz w:val="36"/>
-          <w:szCs w:val="36"/>
-        </w:rPr>
-      </w:pPr>
-      <w:r>
-        <w:rPr/>
-      </w:r>
-    </w:p>
-    <w:p>
-      <w:pPr>
-        <w:pStyle w:val="Normal"/>
-        <w:jc w:val="both"/>
-        <w:rPr>
-          <w:sz w:val="36"/>
-          <w:szCs w:val="36"/>
-        </w:rPr>
-      </w:pPr>
-      <w:r>
-        <w:rPr>
-          <w:rFonts w:eastAsia="Times New Roman" w:cs="Times New Roman" w:ascii="Garamond" w:hAnsi="Garamond"/>
-          <w:color w:val="000000"/>
-          <w:kern w:val="0"/>
-          <w:sz w:val="36"/>
-          <w:szCs w:val="36"/>
-          <w:shd w:fill="auto" w:val="clear"/>
-          <w:lang w:val="en-US" w:eastAsia="zh-CN" w:bidi="hi-IN"/>
-        </w:rPr>
-        <w:t xml:space="preserve">É importante nós observarmos que o capítulo 22 do Evangelho de Mateus, no qual está inserido o mandamento maior, apresenta de uma sequência de confrontos entre Jesus e os grupos religiosos e políticos da época </w:t>
-      </w:r>
-      <w:r>
-        <w:rPr>
-          <w:rFonts w:eastAsia="Times New Roman" w:cs="Times New Roman" w:ascii="Garamond" w:hAnsi="Garamond"/>
-          <w:color w:val="000000"/>
-          <w:kern w:val="0"/>
-          <w:sz w:val="36"/>
-          <w:szCs w:val="36"/>
-          <w:shd w:fill="auto" w:val="clear"/>
-          <w:lang w:val="en-US" w:eastAsia="zh-CN" w:bidi="hi-IN"/>
-        </w:rPr>
-        <w:t xml:space="preserve"> - </w:t>
-      </w:r>
-      <w:r>
-        <w:rPr>
-          <w:rFonts w:eastAsia="Times New Roman" w:cs="Times New Roman" w:ascii="Garamond" w:hAnsi="Garamond"/>
-          <w:color w:val="000000"/>
-          <w:kern w:val="0"/>
-          <w:sz w:val="36"/>
-          <w:szCs w:val="36"/>
-          <w:shd w:fill="auto" w:val="clear"/>
-          <w:lang w:val="en-US" w:eastAsia="zh-CN" w:bidi="hi-IN"/>
-        </w:rPr>
-        <w:t>fariseus, saduceus, doutores da lei</w:t>
-      </w:r>
-      <w:r>
-        <w:rPr>
-          <w:rFonts w:eastAsia="Times New Roman" w:cs="Times New Roman" w:ascii="Garamond" w:hAnsi="Garamond"/>
-          <w:color w:val="000000"/>
-          <w:kern w:val="0"/>
-          <w:sz w:val="36"/>
-          <w:szCs w:val="36"/>
-          <w:shd w:fill="auto" w:val="clear"/>
-          <w:lang w:val="en-US" w:eastAsia="zh-CN" w:bidi="hi-IN"/>
-        </w:rPr>
-        <w:t xml:space="preserve"> - </w:t>
-      </w:r>
-      <w:r>
-        <w:rPr>
-          <w:rFonts w:eastAsia="Times New Roman" w:cs="Times New Roman" w:ascii="Garamond" w:hAnsi="Garamond"/>
-          <w:color w:val="000000"/>
-          <w:kern w:val="0"/>
-          <w:sz w:val="36"/>
-          <w:szCs w:val="36"/>
-          <w:shd w:fill="auto" w:val="clear"/>
-          <w:lang w:val="en-US" w:eastAsia="zh-CN" w:bidi="hi-IN"/>
-        </w:rPr>
-        <w:t>, que tentavam testá-lo e colocá-lo em contradição.</w:t>
+        <w:rPr>
+          <w:rFonts w:eastAsia="Times New Roman" w:cs="Times New Roman" w:ascii="Garamond" w:hAnsi="Garamond"/>
+          <w:color w:val="000000"/>
+          <w:kern w:val="0"/>
+          <w:sz w:val="36"/>
+          <w:szCs w:val="36"/>
+          <w:shd w:fill="auto" w:val="clear"/>
+          <w:lang w:val="en-US" w:eastAsia="zh-CN" w:bidi="hi-IN"/>
+        </w:rPr>
+      </w:r>
+    </w:p>
+    <w:p>
+      <w:pPr>
+        <w:pStyle w:val="Normal"/>
+        <w:jc w:val="both"/>
+        <w:rPr>
+          <w:sz w:val="36"/>
+          <w:szCs w:val="36"/>
+        </w:rPr>
+      </w:pPr>
+      <w:r>
+        <w:rPr>
+          <w:sz w:val="36"/>
+          <w:szCs w:val="36"/>
+        </w:rPr>
+      </w:r>
+    </w:p>
+    <w:p>
+      <w:pPr>
+        <w:pStyle w:val="Normal"/>
+        <w:jc w:val="both"/>
+        <w:rPr>
+          <w:sz w:val="36"/>
+          <w:szCs w:val="36"/>
+        </w:rPr>
+      </w:pPr>
+      <w:r>
+        <w:rPr>
+          <w:sz w:val="36"/>
+          <w:szCs w:val="36"/>
+        </w:rPr>
+      </w:r>
+    </w:p>
+    <w:p>
+      <w:pPr>
+        <w:pStyle w:val="Normal"/>
+        <w:jc w:val="both"/>
+        <w:rPr>
+          <w:sz w:val="36"/>
+          <w:szCs w:val="36"/>
+        </w:rPr>
+      </w:pPr>
+      <w:r>
+        <w:rPr>
+          <w:sz w:val="36"/>
+          <w:szCs w:val="36"/>
+        </w:rPr>
+      </w:r>
+    </w:p>
+    <w:p>
+      <w:pPr>
+        <w:pStyle w:val="Normal"/>
+        <w:jc w:val="both"/>
+        <w:rPr>
+          <w:sz w:val="36"/>
+          <w:szCs w:val="36"/>
+        </w:rPr>
+      </w:pPr>
+      <w:r>
+        <w:rPr>
+          <w:sz w:val="36"/>
+          <w:szCs w:val="36"/>
+        </w:rPr>
+      </w:r>
+    </w:p>
+    <w:p>
+      <w:pPr>
+        <w:pStyle w:val="Normal"/>
+        <w:jc w:val="both"/>
+        <w:rPr>
+          <w:sz w:val="36"/>
+          <w:szCs w:val="36"/>
+        </w:rPr>
+      </w:pPr>
+      <w:r>
+        <w:rPr>
+          <w:rFonts w:eastAsia="Times New Roman" w:cs="Times New Roman" w:ascii="Garamond" w:hAnsi="Garamond"/>
+          <w:color w:val="000000"/>
+          <w:kern w:val="0"/>
+          <w:sz w:val="36"/>
+          <w:szCs w:val="36"/>
+          <w:shd w:fill="auto" w:val="clear"/>
+          <w:lang w:val="en-US" w:eastAsia="zh-CN" w:bidi="hi-IN"/>
+        </w:rPr>
+        <w:t>É importante nós observarmos que o capítulo 22 do Evangelho de Mateus, no qual está inserido o mandamento maior, apresenta de uma sequência de confrontos entre Jesus e os grupos religiosos e políticos da época  - fariseus, saduceus, doutores da lei - , que tentavam testá-lo e colocá-lo em contradição.</w:t>
       </w:r>
     </w:p>
     <w:p>

</xml_diff>

<commit_message>
07/10/2025 - 20:41 h
</commit_message>
<xml_diff>
--- a/O mandamento maior/O Mandamento Maior.docx
+++ b/O mandamento maior/O Mandamento Maior.docx
@@ -322,7 +322,7 @@
           <w:shd w:fill="auto" w:val="clear"/>
           <w:lang w:val="en-US" w:eastAsia="zh-CN" w:bidi="hi-IN"/>
         </w:rPr>
-        <w:t xml:space="preserve">Embora seja no capítulo 22 que está o tema do nosso estudo de hoje, vamos traçar </w:t>
+        <w:t xml:space="preserve">Embora seja no capítulo 22 que está o tema do nosso estudo de hoje, vamos traçar um paralelo entre </w:t>
       </w:r>
       <w:r>
         <w:rPr>
@@ -334,7 +334,7 @@
           <w:shd w:fill="auto" w:val="clear"/>
           <w:lang w:val="en-US" w:eastAsia="zh-CN" w:bidi="hi-IN"/>
         </w:rPr>
-        <w:t>um paralelo</w:t>
+        <w:t xml:space="preserve">os </w:t>
       </w:r>
       <w:r>
         <w:rPr>
@@ -346,8 +346,34 @@
           <w:shd w:fill="auto" w:val="clear"/>
           <w:lang w:val="en-US" w:eastAsia="zh-CN" w:bidi="hi-IN"/>
         </w:rPr>
-        <w:t xml:space="preserve"> </w:t>
-      </w:r>
+        <w:t>capítulos 21, 22 e 23 do evangelho de Mateus. Isso vai nos ajudar a compreender melhor a essência do mandamento maior.</w:t>
+      </w:r>
+    </w:p>
+    <w:p>
+      <w:pPr>
+        <w:pStyle w:val="Normal"/>
+        <w:jc w:val="both"/>
+        <w:rPr>
+          <w:sz w:val="36"/>
+          <w:szCs w:val="36"/>
+        </w:rPr>
+      </w:pPr>
+      <w:r>
+        <w:rPr>
+          <w:sz w:val="36"/>
+          <w:szCs w:val="36"/>
+        </w:rPr>
+      </w:r>
+    </w:p>
+    <w:p>
+      <w:pPr>
+        <w:pStyle w:val="Normal"/>
+        <w:jc w:val="both"/>
+        <w:rPr>
+          <w:sz w:val="36"/>
+          <w:szCs w:val="36"/>
+        </w:rPr>
+      </w:pPr>
       <w:r>
         <w:rPr>
           <w:rFonts w:eastAsia="Times New Roman" w:cs="Times New Roman" w:ascii="Garamond" w:hAnsi="Garamond"/>
@@ -358,8 +384,34 @@
           <w:shd w:fill="auto" w:val="clear"/>
           <w:lang w:val="en-US" w:eastAsia="zh-CN" w:bidi="hi-IN"/>
         </w:rPr>
-        <w:t xml:space="preserve">entre capítulos 21, 22 e 23 do evangelho de Mateus. </w:t>
-      </w:r>
+        <w:t>Esses três capítulos formam  uma espécie de “trilogia moral de transição”, onde Jesus nos convida a abandonar a  religiosidade meramente formal e externa e abraçarmos a religiosidade verdadeira vivida no amor.</w:t>
+      </w:r>
+    </w:p>
+    <w:p>
+      <w:pPr>
+        <w:pStyle w:val="Normal"/>
+        <w:jc w:val="both"/>
+        <w:rPr>
+          <w:sz w:val="36"/>
+          <w:szCs w:val="36"/>
+        </w:rPr>
+      </w:pPr>
+      <w:r>
+        <w:rPr>
+          <w:sz w:val="36"/>
+          <w:szCs w:val="36"/>
+        </w:rPr>
+      </w:r>
+    </w:p>
+    <w:p>
+      <w:pPr>
+        <w:pStyle w:val="Normal"/>
+        <w:jc w:val="both"/>
+        <w:rPr>
+          <w:sz w:val="36"/>
+          <w:szCs w:val="36"/>
+        </w:rPr>
+      </w:pPr>
       <w:r>
         <w:rPr>
           <w:rFonts w:eastAsia="Times New Roman" w:cs="Times New Roman" w:ascii="Garamond" w:hAnsi="Garamond"/>
@@ -370,8 +422,34 @@
           <w:shd w:fill="auto" w:val="clear"/>
           <w:lang w:val="en-US" w:eastAsia="zh-CN" w:bidi="hi-IN"/>
         </w:rPr>
-        <w:t xml:space="preserve">Isso vai nos ajudar a compreender melhor </w:t>
-      </w:r>
+        <w:t>Na cronologia do evangelho de Mateus, é exatamente no capítulo 21 que começam a ser narrados os últimos dias de vida de Jesus na Terra. Esse capítulo inicia-se com a entrada triunfante de Jesus em Jerusalém.</w:t>
+      </w:r>
+    </w:p>
+    <w:p>
+      <w:pPr>
+        <w:pStyle w:val="Normal"/>
+        <w:jc w:val="both"/>
+        <w:rPr>
+          <w:sz w:val="36"/>
+          <w:szCs w:val="36"/>
+        </w:rPr>
+      </w:pPr>
+      <w:r>
+        <w:rPr>
+          <w:sz w:val="36"/>
+          <w:szCs w:val="36"/>
+        </w:rPr>
+      </w:r>
+    </w:p>
+    <w:p>
+      <w:pPr>
+        <w:pStyle w:val="Normal"/>
+        <w:jc w:val="both"/>
+        <w:rPr>
+          <w:sz w:val="36"/>
+          <w:szCs w:val="36"/>
+        </w:rPr>
+      </w:pPr>
       <w:r>
         <w:rPr>
           <w:rFonts w:eastAsia="Times New Roman" w:cs="Times New Roman" w:ascii="Garamond" w:hAnsi="Garamond"/>
@@ -382,8 +460,34 @@
           <w:shd w:fill="auto" w:val="clear"/>
           <w:lang w:val="en-US" w:eastAsia="zh-CN" w:bidi="hi-IN"/>
         </w:rPr>
-        <w:t>a essência d</w:t>
-      </w:r>
+        <w:t>Jesus tinha pleno conhecimento do que estava prestes a acontecer com Ele; a prisão, o julgamento, a condenação e a cruficicação. Por isso, em seus últimos dias entre os homens, Ele nos falou com tanta ênfase sobre nossa necessidade de vivermos de forma pura, simples e verdadeira, construindo tesouros para o Reino dos Céus e não para a Terra.</w:t>
+      </w:r>
+    </w:p>
+    <w:p>
+      <w:pPr>
+        <w:pStyle w:val="Normal"/>
+        <w:jc w:val="both"/>
+        <w:rPr>
+          <w:sz w:val="36"/>
+          <w:szCs w:val="36"/>
+        </w:rPr>
+      </w:pPr>
+      <w:r>
+        <w:rPr>
+          <w:sz w:val="36"/>
+          <w:szCs w:val="36"/>
+        </w:rPr>
+      </w:r>
+    </w:p>
+    <w:p>
+      <w:pPr>
+        <w:pStyle w:val="Normal"/>
+        <w:jc w:val="both"/>
+        <w:rPr>
+          <w:sz w:val="36"/>
+          <w:szCs w:val="36"/>
+        </w:rPr>
+      </w:pPr>
       <w:r>
         <w:rPr>
           <w:rFonts w:eastAsia="Times New Roman" w:cs="Times New Roman" w:ascii="Garamond" w:hAnsi="Garamond"/>
@@ -394,7 +498,7 @@
           <w:shd w:fill="auto" w:val="clear"/>
           <w:lang w:val="en-US" w:eastAsia="zh-CN" w:bidi="hi-IN"/>
         </w:rPr>
-        <w:t xml:space="preserve">o </w:t>
+        <w:t>É</w:t>
       </w:r>
       <w:r>
         <w:rPr>
@@ -406,7 +510,7 @@
           <w:shd w:fill="auto" w:val="clear"/>
           <w:lang w:val="en-US" w:eastAsia="zh-CN" w:bidi="hi-IN"/>
         </w:rPr>
-        <w:t>mandamento</w:t>
+        <w:t xml:space="preserve"> também por esse motivo que</w:t>
       </w:r>
       <w:r>
         <w:rPr>
@@ -418,252 +522,7 @@
           <w:shd w:fill="auto" w:val="clear"/>
           <w:lang w:val="en-US" w:eastAsia="zh-CN" w:bidi="hi-IN"/>
         </w:rPr>
-        <w:t xml:space="preserve"> maior.</w:t>
-      </w:r>
-    </w:p>
-    <w:p>
-      <w:pPr>
-        <w:pStyle w:val="Normal"/>
-        <w:jc w:val="both"/>
-        <w:rPr>
-          <w:sz w:val="36"/>
-          <w:szCs w:val="36"/>
-        </w:rPr>
-      </w:pPr>
-      <w:r>
-        <w:rPr>
-          <w:sz w:val="36"/>
-          <w:szCs w:val="36"/>
-        </w:rPr>
-      </w:r>
-    </w:p>
-    <w:p>
-      <w:pPr>
-        <w:pStyle w:val="Normal"/>
-        <w:jc w:val="both"/>
-        <w:rPr>
-          <w:sz w:val="36"/>
-          <w:szCs w:val="36"/>
-        </w:rPr>
-      </w:pPr>
-      <w:r>
-        <w:rPr>
-          <w:rFonts w:eastAsia="Times New Roman" w:cs="Times New Roman" w:ascii="Garamond" w:hAnsi="Garamond"/>
-          <w:color w:val="000000"/>
-          <w:kern w:val="0"/>
-          <w:sz w:val="36"/>
-          <w:szCs w:val="36"/>
-          <w:shd w:fill="auto" w:val="clear"/>
-          <w:lang w:val="en-US" w:eastAsia="zh-CN" w:bidi="hi-IN"/>
-        </w:rPr>
-        <w:t xml:space="preserve">Esses três capítulos - 21, 22 e 23 - formam  </w:t>
-      </w:r>
-      <w:r>
-        <w:rPr>
-          <w:rFonts w:eastAsia="Times New Roman" w:cs="Times New Roman" w:ascii="Garamond" w:hAnsi="Garamond"/>
-          <w:color w:val="000000"/>
-          <w:kern w:val="0"/>
-          <w:sz w:val="36"/>
-          <w:szCs w:val="36"/>
-          <w:shd w:fill="auto" w:val="clear"/>
-          <w:lang w:val="en-US" w:eastAsia="zh-CN" w:bidi="hi-IN"/>
-        </w:rPr>
-        <w:t>uma espécie de</w:t>
-      </w:r>
-      <w:r>
-        <w:rPr>
-          <w:rFonts w:eastAsia="Times New Roman" w:cs="Times New Roman" w:ascii="Garamond" w:hAnsi="Garamond"/>
-          <w:color w:val="000000"/>
-          <w:kern w:val="0"/>
-          <w:sz w:val="36"/>
-          <w:szCs w:val="36"/>
-          <w:shd w:fill="auto" w:val="clear"/>
-          <w:lang w:val="en-US" w:eastAsia="zh-CN" w:bidi="hi-IN"/>
-        </w:rPr>
-        <w:t xml:space="preserve"> “trilogia moral de transição”, onde Jesus nos convida a abandonar a  religiosidade meramente formal e </w:t>
-      </w:r>
-      <w:r>
-        <w:rPr>
-          <w:rFonts w:eastAsia="Times New Roman" w:cs="Times New Roman" w:ascii="Garamond" w:hAnsi="Garamond"/>
-          <w:color w:val="000000"/>
-          <w:kern w:val="0"/>
-          <w:sz w:val="36"/>
-          <w:szCs w:val="36"/>
-          <w:shd w:fill="auto" w:val="clear"/>
-          <w:lang w:val="en-US" w:eastAsia="zh-CN" w:bidi="hi-IN"/>
-        </w:rPr>
-        <w:t xml:space="preserve">externa e </w:t>
-      </w:r>
-      <w:r>
-        <w:rPr>
-          <w:rFonts w:eastAsia="Times New Roman" w:cs="Times New Roman" w:ascii="Garamond" w:hAnsi="Garamond"/>
-          <w:color w:val="000000"/>
-          <w:kern w:val="0"/>
-          <w:sz w:val="36"/>
-          <w:szCs w:val="36"/>
-          <w:shd w:fill="auto" w:val="clear"/>
-          <w:lang w:val="en-US" w:eastAsia="zh-CN" w:bidi="hi-IN"/>
-        </w:rPr>
-        <w:t>abraçarmos a religiosidade verdadeira vivida no amor.</w:t>
-      </w:r>
-    </w:p>
-    <w:p>
-      <w:pPr>
-        <w:pStyle w:val="Normal"/>
-        <w:jc w:val="both"/>
-        <w:rPr>
-          <w:sz w:val="36"/>
-          <w:szCs w:val="36"/>
-        </w:rPr>
-      </w:pPr>
-      <w:r>
-        <w:rPr>
-          <w:sz w:val="36"/>
-          <w:szCs w:val="36"/>
-        </w:rPr>
-      </w:r>
-    </w:p>
-    <w:p>
-      <w:pPr>
-        <w:pStyle w:val="Normal"/>
-        <w:jc w:val="both"/>
-        <w:rPr>
-          <w:sz w:val="36"/>
-          <w:szCs w:val="36"/>
-        </w:rPr>
-      </w:pPr>
-      <w:r>
-        <w:rPr>
-          <w:rFonts w:eastAsia="Times New Roman" w:cs="Times New Roman" w:ascii="Garamond" w:hAnsi="Garamond"/>
-          <w:color w:val="000000"/>
-          <w:kern w:val="0"/>
-          <w:sz w:val="36"/>
-          <w:szCs w:val="36"/>
-          <w:shd w:fill="auto" w:val="clear"/>
-          <w:lang w:val="en-US" w:eastAsia="zh-CN" w:bidi="hi-IN"/>
-        </w:rPr>
-        <w:t>Na cronologia do evangelho de Mateus, é exatamente no capítulo 21 que começam a ser narrados os últimos dias d</w:t>
-      </w:r>
-      <w:r>
-        <w:rPr>
-          <w:rFonts w:eastAsia="Times New Roman" w:cs="Times New Roman" w:ascii="Garamond" w:hAnsi="Garamond"/>
-          <w:color w:val="000000"/>
-          <w:kern w:val="0"/>
-          <w:sz w:val="36"/>
-          <w:szCs w:val="36"/>
-          <w:shd w:fill="auto" w:val="clear"/>
-          <w:lang w:val="en-US" w:eastAsia="zh-CN" w:bidi="hi-IN"/>
-        </w:rPr>
-        <w:t>e</w:t>
-      </w:r>
-      <w:r>
-        <w:rPr>
-          <w:rFonts w:eastAsia="Times New Roman" w:cs="Times New Roman" w:ascii="Garamond" w:hAnsi="Garamond"/>
-          <w:color w:val="000000"/>
-          <w:kern w:val="0"/>
-          <w:sz w:val="36"/>
-          <w:szCs w:val="36"/>
-          <w:shd w:fill="auto" w:val="clear"/>
-          <w:lang w:val="en-US" w:eastAsia="zh-CN" w:bidi="hi-IN"/>
-        </w:rPr>
-        <w:t xml:space="preserve"> vida de Jesus na Terra. Esse capítulo inicia-se com a entrada triunfante de Jesus em Jerusalém.</w:t>
-      </w:r>
-    </w:p>
-    <w:p>
-      <w:pPr>
-        <w:pStyle w:val="Normal"/>
-        <w:jc w:val="both"/>
-        <w:rPr>
-          <w:sz w:val="36"/>
-          <w:szCs w:val="36"/>
-        </w:rPr>
-      </w:pPr>
-      <w:r>
-        <w:rPr>
-          <w:sz w:val="36"/>
-          <w:szCs w:val="36"/>
-        </w:rPr>
-      </w:r>
-    </w:p>
-    <w:p>
-      <w:pPr>
-        <w:pStyle w:val="Normal"/>
-        <w:jc w:val="both"/>
-        <w:rPr>
-          <w:sz w:val="36"/>
-          <w:szCs w:val="36"/>
-        </w:rPr>
-      </w:pPr>
-      <w:r>
-        <w:rPr>
-          <w:rFonts w:eastAsia="Times New Roman" w:cs="Times New Roman" w:ascii="Garamond" w:hAnsi="Garamond"/>
-          <w:color w:val="000000"/>
-          <w:kern w:val="0"/>
-          <w:sz w:val="36"/>
-          <w:szCs w:val="36"/>
-          <w:shd w:fill="auto" w:val="clear"/>
-          <w:lang w:val="en-US" w:eastAsia="zh-CN" w:bidi="hi-IN"/>
-        </w:rPr>
-        <w:t>Jesus tinha pleno conhecimento do que estava prestes a acontecer com Ele</w:t>
-      </w:r>
-      <w:r>
-        <w:rPr>
-          <w:rFonts w:eastAsia="Times New Roman" w:cs="Times New Roman" w:ascii="Garamond" w:hAnsi="Garamond"/>
-          <w:color w:val="000000"/>
-          <w:kern w:val="0"/>
-          <w:sz w:val="36"/>
-          <w:szCs w:val="36"/>
-          <w:shd w:fill="auto" w:val="clear"/>
-          <w:lang w:val="en-US" w:eastAsia="zh-CN" w:bidi="hi-IN"/>
-        </w:rPr>
-        <w:t>; a prisão, o julgamento, a condenação e a cruficicação.</w:t>
-      </w:r>
-      <w:r>
-        <w:rPr>
-          <w:rFonts w:eastAsia="Times New Roman" w:cs="Times New Roman" w:ascii="Garamond" w:hAnsi="Garamond"/>
-          <w:color w:val="000000"/>
-          <w:kern w:val="0"/>
-          <w:sz w:val="36"/>
-          <w:szCs w:val="36"/>
-          <w:shd w:fill="auto" w:val="clear"/>
-          <w:lang w:val="en-US" w:eastAsia="zh-CN" w:bidi="hi-IN"/>
-        </w:rPr>
-        <w:t xml:space="preserve"> Por isso, em seus últimos dias entre os homens, Ele nos falou com tanta ênfase sobre nossa necessidade de vivermos de forma pura, simples e verdadeira, construindo tesouros para o Reino dos Céus e não para a Terra.</w:t>
-      </w:r>
-    </w:p>
-    <w:p>
-      <w:pPr>
-        <w:pStyle w:val="Normal"/>
-        <w:jc w:val="both"/>
-        <w:rPr>
-          <w:sz w:val="36"/>
-          <w:szCs w:val="36"/>
-        </w:rPr>
-      </w:pPr>
-      <w:r>
-        <w:rPr/>
-      </w:r>
-    </w:p>
-    <w:p>
-      <w:pPr>
-        <w:pStyle w:val="Normal"/>
-        <w:jc w:val="both"/>
-        <w:rPr>
-          <w:sz w:val="36"/>
-          <w:szCs w:val="36"/>
-        </w:rPr>
-      </w:pPr>
-      <w:r>
-        <w:rPr>
-          <w:rFonts w:eastAsia="Times New Roman" w:cs="Times New Roman" w:ascii="Garamond" w:hAnsi="Garamond"/>
-          <w:color w:val="000000"/>
-          <w:kern w:val="0"/>
-          <w:sz w:val="36"/>
-          <w:szCs w:val="36"/>
-          <w:shd w:fill="auto" w:val="clear"/>
-          <w:lang w:val="en-US" w:eastAsia="zh-CN" w:bidi="hi-IN"/>
-        </w:rPr>
-        <w:t>Por isso é que encontramos nesses 3 capítulos tantos confrontos de Jesus com líderes religiosos e políticos, sobretudo os saduceus e fariseus.</w:t>
+        <w:t xml:space="preserve"> encontramos nesses 3 capítulos tantos confrontos de Jesus com líderes religiosos e políticos, sobretudo os saduceus e fariseus.</w:t>
       </w:r>
     </w:p>
     <w:p>
@@ -723,79 +582,7 @@
           <w:shd w:fill="auto" w:val="clear"/>
           <w:lang w:val="en-US" w:eastAsia="zh-CN" w:bidi="hi-IN"/>
         </w:rPr>
-        <w:t xml:space="preserve">Jesus denuncia a esterilidade da fé exterior. A figueira estéril </w:t>
-      </w:r>
-      <w:r>
-        <w:rPr>
-          <w:rFonts w:eastAsia="Times New Roman" w:cs="Times New Roman" w:ascii="Garamond" w:hAnsi="Garamond"/>
-          <w:color w:val="000000"/>
-          <w:kern w:val="0"/>
-          <w:sz w:val="36"/>
-          <w:szCs w:val="36"/>
-          <w:shd w:fill="auto" w:val="clear"/>
-          <w:lang w:val="en-US" w:eastAsia="zh-CN" w:bidi="hi-IN"/>
-        </w:rPr>
-        <w:t>que Jesus seca</w:t>
-      </w:r>
-      <w:r>
-        <w:rPr>
-          <w:rFonts w:eastAsia="Times New Roman" w:cs="Times New Roman" w:ascii="Garamond" w:hAnsi="Garamond"/>
-          <w:color w:val="000000"/>
-          <w:kern w:val="0"/>
-          <w:sz w:val="36"/>
-          <w:szCs w:val="36"/>
-          <w:shd w:fill="auto" w:val="clear"/>
-          <w:lang w:val="en-US" w:eastAsia="zh-CN" w:bidi="hi-IN"/>
-        </w:rPr>
-        <w:t xml:space="preserve"> e </w:t>
-      </w:r>
-      <w:r>
-        <w:rPr>
-          <w:rFonts w:eastAsia="Times New Roman" w:cs="Times New Roman" w:ascii="Garamond" w:hAnsi="Garamond"/>
-          <w:color w:val="000000"/>
-          <w:kern w:val="0"/>
-          <w:sz w:val="36"/>
-          <w:szCs w:val="36"/>
-          <w:shd w:fill="auto" w:val="clear"/>
-          <w:lang w:val="en-US" w:eastAsia="zh-CN" w:bidi="hi-IN"/>
-        </w:rPr>
-        <w:t>os</w:t>
-      </w:r>
-      <w:r>
-        <w:rPr>
-          <w:rFonts w:eastAsia="Times New Roman" w:cs="Times New Roman" w:ascii="Garamond" w:hAnsi="Garamond"/>
-          <w:color w:val="000000"/>
-          <w:kern w:val="0"/>
-          <w:sz w:val="36"/>
-          <w:szCs w:val="36"/>
-          <w:shd w:fill="auto" w:val="clear"/>
-          <w:lang w:val="en-US" w:eastAsia="zh-CN" w:bidi="hi-IN"/>
-        </w:rPr>
-        <w:t xml:space="preserve"> vendedores </w:t>
-      </w:r>
-      <w:r>
-        <w:rPr>
-          <w:rFonts w:eastAsia="Times New Roman" w:cs="Times New Roman" w:ascii="Garamond" w:hAnsi="Garamond"/>
-          <w:color w:val="000000"/>
-          <w:kern w:val="0"/>
-          <w:sz w:val="36"/>
-          <w:szCs w:val="36"/>
-          <w:shd w:fill="auto" w:val="clear"/>
-          <w:lang w:val="en-US" w:eastAsia="zh-CN" w:bidi="hi-IN"/>
-        </w:rPr>
-        <w:t xml:space="preserve">aos quais Jesus expulsa </w:t>
-      </w:r>
-      <w:r>
-        <w:rPr>
-          <w:rFonts w:eastAsia="Times New Roman" w:cs="Times New Roman" w:ascii="Garamond" w:hAnsi="Garamond"/>
-          <w:color w:val="000000"/>
-          <w:kern w:val="0"/>
-          <w:sz w:val="36"/>
-          <w:szCs w:val="36"/>
-          <w:shd w:fill="auto" w:val="clear"/>
-          <w:lang w:val="en-US" w:eastAsia="zh-CN" w:bidi="hi-IN"/>
-        </w:rPr>
-        <w:t xml:space="preserve">do Templo são símbolos da alma que aparenta religiosidade, mas não produz obras de amor. </w:t>
+        <w:t xml:space="preserve">Jesus denuncia a esterilidade da fé exterior. A figueira estéril que Jesus seca e os vendedores aos quais Jesus expulsa do Templo são símbolos da alma que aparenta religiosidade, mas não produz obras de amor. </w:t>
       </w:r>
     </w:p>
     <w:p>
@@ -863,22 +650,6 @@
         <w:pStyle w:val="Normal"/>
         <w:jc w:val="both"/>
         <w:rPr>
-          <w:sz w:val="36"/>
-          <w:szCs w:val="36"/>
-        </w:rPr>
-      </w:pPr>
-      <w:r>
-        <w:rPr>
-          <w:sz w:val="36"/>
-          <w:szCs w:val="36"/>
-        </w:rPr>
-      </w:r>
-    </w:p>
-    <w:p>
-      <w:pPr>
-        <w:pStyle w:val="Normal"/>
-        <w:jc w:val="both"/>
-        <w:rPr>
           <w:u w:val="single"/>
         </w:rPr>
       </w:pPr>
@@ -915,20 +686,23 @@
           <w:shd w:fill="auto" w:val="clear"/>
           <w:lang w:val="en-US" w:eastAsia="zh-CN" w:bidi="hi-IN"/>
         </w:rPr>
-        <w:t>Jesus faz o juízo moral e convoca à sinceridade do coração. Aos escribas e fariseus, denuncia a hipocrisia e alerta sobre o perigo de servir às aparências. Seu lamento sobre Jerusalém é também um convite à humanidade inteira: abrir o coração para o amor e para a verdade.</w:t>
-      </w:r>
-    </w:p>
-    <w:p>
-      <w:pPr>
-        <w:pStyle w:val="Normal"/>
-        <w:jc w:val="both"/>
-        <w:rPr>
-          <w:sz w:val="36"/>
-          <w:szCs w:val="36"/>
-        </w:rPr>
-      </w:pPr>
-      <w:r>
-        <w:rPr/>
+        <w:t>Jesus faz o juízo moral e convoca à sinceridade do coração. Aos escribas e fariseus, denuncia a hipocrisia e alerta sobre o perigo de servir às aparências. Seu lamento sobre Jerusalém é um convite à humanidade inteira: abrir o coração para o amor e para a verdade.</w:t>
+      </w:r>
+    </w:p>
+    <w:p>
+      <w:pPr>
+        <w:pStyle w:val="Normal"/>
+        <w:jc w:val="both"/>
+        <w:rPr>
+          <w:sz w:val="36"/>
+          <w:szCs w:val="36"/>
+        </w:rPr>
+      </w:pPr>
+      <w:r>
+        <w:rPr>
+          <w:sz w:val="36"/>
+          <w:szCs w:val="36"/>
+        </w:rPr>
       </w:r>
     </w:p>
     <w:p>
@@ -950,31 +724,8 @@
           <w:shd w:fill="auto" w:val="clear"/>
           <w:lang w:val="en-US" w:eastAsia="zh-CN" w:bidi="hi-IN"/>
         </w:rPr>
-        <w:t xml:space="preserve">Embora Jesus tenha confrontado tanto os saduceus quanto os fariseus, é importante distinguir uns dos outros para entendermos a natureza dos confrontos que Jesus teve com eles. </w:t>
-      </w:r>
-    </w:p>
-    <w:p>
-      <w:pPr>
-        <w:pStyle w:val="Normal"/>
-        <w:jc w:val="both"/>
-        <w:rPr>
-          <w:sz w:val="36"/>
-          <w:szCs w:val="36"/>
-        </w:rPr>
-      </w:pPr>
-      <w:r>
-        <w:rPr/>
-      </w:r>
-    </w:p>
-    <w:p>
-      <w:pPr>
-        <w:pStyle w:val="Normal"/>
-        <w:jc w:val="both"/>
-        <w:rPr>
-          <w:sz w:val="36"/>
-          <w:szCs w:val="36"/>
-        </w:rPr>
-      </w:pPr>
+        <w:t xml:space="preserve">Embora Jesus tenha confrontado tanto os saduceus quanto os fariseus, </w:t>
+      </w:r>
       <w:r>
         <w:rPr>
           <w:rFonts w:eastAsia="Times New Roman" w:cs="Times New Roman" w:ascii="Garamond" w:hAnsi="Garamond"/>
@@ -985,7 +736,7 @@
           <w:shd w:fill="auto" w:val="clear"/>
           <w:lang w:val="en-US" w:eastAsia="zh-CN" w:bidi="hi-IN"/>
         </w:rPr>
-        <w:t>Os saduceus formavam um grupo de grande influência política e econômica, composto em sua maioria por sacerdotes e membros da elite de Jerusalém.</w:t>
+        <w:t>cabe fazer uma distinção entre eles</w:t>
       </w:r>
       <w:r>
         <w:rPr>
@@ -997,8 +748,34 @@
           <w:shd w:fill="auto" w:val="clear"/>
           <w:lang w:val="en-US" w:eastAsia="zh-CN" w:bidi="hi-IN"/>
         </w:rPr>
-        <w:t xml:space="preserve"> Negavam a imortalidade da alma, a existência dos espíritos e a vida após a morte, acreditando que toda retribuição divina acontecia apenas nesta vida. Eles</w:t>
-      </w:r>
+        <w:t xml:space="preserve">. </w:t>
+      </w:r>
+    </w:p>
+    <w:p>
+      <w:pPr>
+        <w:pStyle w:val="Normal"/>
+        <w:jc w:val="both"/>
+        <w:rPr>
+          <w:sz w:val="36"/>
+          <w:szCs w:val="36"/>
+        </w:rPr>
+      </w:pPr>
+      <w:r>
+        <w:rPr>
+          <w:sz w:val="36"/>
+          <w:szCs w:val="36"/>
+        </w:rPr>
+      </w:r>
+    </w:p>
+    <w:p>
+      <w:pPr>
+        <w:pStyle w:val="Normal"/>
+        <w:jc w:val="both"/>
+        <w:rPr>
+          <w:sz w:val="36"/>
+          <w:szCs w:val="36"/>
+        </w:rPr>
+      </w:pPr>
       <w:r>
         <w:rPr>
           <w:rFonts w:eastAsia="Times New Roman" w:cs="Times New Roman" w:ascii="Garamond" w:hAnsi="Garamond"/>
@@ -1009,7 +786,7 @@
           <w:shd w:fill="auto" w:val="clear"/>
           <w:lang w:val="en-US" w:eastAsia="zh-CN" w:bidi="hi-IN"/>
         </w:rPr>
-        <w:t xml:space="preserve"> representavam a religiosidade do poder e da aparência externa</w:t>
+        <w:t xml:space="preserve">Os saduceus formavam um grupo de grande influência política e econômica, composto em sua maioria por sacerdotes e membros da elite de Jerusalém. </w:t>
       </w:r>
       <w:r>
         <w:rPr>
@@ -1021,20 +798,7 @@
           <w:shd w:fill="auto" w:val="clear"/>
           <w:lang w:val="en-US" w:eastAsia="zh-CN" w:bidi="hi-IN"/>
         </w:rPr>
-        <w:t>.</w:t>
-      </w:r>
-    </w:p>
-    <w:p>
-      <w:pPr>
-        <w:pStyle w:val="Normal"/>
-        <w:jc w:val="both"/>
-        <w:rPr>
-          <w:sz w:val="36"/>
-          <w:szCs w:val="36"/>
-        </w:rPr>
-      </w:pPr>
-      <w:r>
-        <w:rPr/>
+        <w:t xml:space="preserve">Acreditavam somente na Torá, ou seja, os 5 primeiros livros da Bíblia que contém a Lei Mosaica. </w:t>
       </w:r>
     </w:p>
     <w:p>
@@ -1069,7 +833,7 @@
           <w:shd w:fill="auto" w:val="clear"/>
           <w:lang w:val="en-US" w:eastAsia="zh-CN" w:bidi="hi-IN"/>
         </w:rPr>
-        <w:t>Os fariseus, por sua vez, eram religiosos dedicados ao estudo e à prática rigorosa da Lei. Valorizavam não apenas a Torá, mas também as tradições orais que a explicavam. Acreditavam na imortalidade da alma e na vida futura, o que os aproximava mais das verdades espirituais.</w:t>
+        <w:t>Os saduceus n</w:t>
       </w:r>
       <w:r>
         <w:rPr>
@@ -1081,7 +845,7 @@
           <w:shd w:fill="auto" w:val="clear"/>
           <w:lang w:val="en-US" w:eastAsia="zh-CN" w:bidi="hi-IN"/>
         </w:rPr>
-        <w:t xml:space="preserve"> Eles</w:t>
+        <w:t>egavam a imortalidade da alma, a existência dos espíritos e a vida após a morte</w:t>
       </w:r>
       <w:r>
         <w:rPr>
@@ -1093,7 +857,7 @@
           <w:shd w:fill="auto" w:val="clear"/>
           <w:lang w:val="en-US" w:eastAsia="zh-CN" w:bidi="hi-IN"/>
         </w:rPr>
-        <w:t xml:space="preserve"> </w:t>
+        <w:t>. Para eles, toda recompensa divina era dada aqui mesmo na vida terrena.</w:t>
       </w:r>
       <w:r>
         <w:rPr>
@@ -1105,7 +869,7 @@
           <w:shd w:fill="auto" w:val="clear"/>
           <w:lang w:val="en-US" w:eastAsia="zh-CN" w:bidi="hi-IN"/>
         </w:rPr>
-        <w:t>s</w:t>
+        <w:t xml:space="preserve"> </w:t>
       </w:r>
       <w:r>
         <w:rPr>
@@ -1117,31 +881,8 @@
           <w:shd w:fill="auto" w:val="clear"/>
           <w:lang w:val="en-US" w:eastAsia="zh-CN" w:bidi="hi-IN"/>
         </w:rPr>
-        <w:t xml:space="preserve">imbolizavam a religiosidade sem vida interior, preocupada com moral, doutrina e cumprimento rigoroso da Lei, mas marcada por orgulho e vaidade espiritual. </w:t>
-      </w:r>
-    </w:p>
-    <w:p>
-      <w:pPr>
-        <w:pStyle w:val="Normal"/>
-        <w:jc w:val="both"/>
-        <w:rPr>
-          <w:sz w:val="36"/>
-          <w:szCs w:val="36"/>
-        </w:rPr>
-      </w:pPr>
-      <w:r>
-        <w:rPr/>
-      </w:r>
-    </w:p>
-    <w:p>
-      <w:pPr>
-        <w:pStyle w:val="Normal"/>
-        <w:jc w:val="both"/>
-        <w:rPr>
-          <w:sz w:val="36"/>
-          <w:szCs w:val="36"/>
-        </w:rPr>
-      </w:pPr>
+        <w:t>E</w:t>
+      </w:r>
       <w:r>
         <w:rPr>
           <w:rFonts w:eastAsia="Times New Roman" w:cs="Times New Roman" w:ascii="Garamond" w:hAnsi="Garamond"/>
@@ -1152,31 +893,8 @@
           <w:shd w:fill="auto" w:val="clear"/>
           <w:lang w:val="en-US" w:eastAsia="zh-CN" w:bidi="hi-IN"/>
         </w:rPr>
-        <w:t>Jesus teve mais embates com os fariseus do que com os saduceus por 2 razões: a primeira é que os fariseus eram mais próximos do povo e como Jesus ensinou e viveu em meio ao povo, o Mestre os encontrava com maior frequência.</w:t>
-      </w:r>
-    </w:p>
-    <w:p>
-      <w:pPr>
-        <w:pStyle w:val="Normal"/>
-        <w:jc w:val="both"/>
-        <w:rPr>
-          <w:sz w:val="36"/>
-          <w:szCs w:val="36"/>
-        </w:rPr>
-      </w:pPr>
-      <w:r>
-        <w:rPr/>
-      </w:r>
-    </w:p>
-    <w:p>
-      <w:pPr>
-        <w:pStyle w:val="Normal"/>
-        <w:jc w:val="both"/>
-        <w:rPr>
-          <w:sz w:val="36"/>
-          <w:szCs w:val="36"/>
-        </w:rPr>
-      </w:pPr>
+        <w:t>r</w:t>
+      </w:r>
       <w:r>
         <w:rPr>
           <w:rFonts w:eastAsia="Times New Roman" w:cs="Times New Roman" w:ascii="Garamond" w:hAnsi="Garamond"/>
@@ -1187,31 +905,8 @@
           <w:shd w:fill="auto" w:val="clear"/>
           <w:lang w:val="en-US" w:eastAsia="zh-CN" w:bidi="hi-IN"/>
         </w:rPr>
-        <w:t>A segunda razão é que, apesar de suas imperfeições, os fariseus tinham uma crença mais próxima daquilo que Jesus ensinava. Era mais fácil para eles entenderem os ensinamentos de Jesus do que os saduceus, cuja crença era limitada e incompatível com  os ensinamentos do Mestre.</w:t>
-      </w:r>
-    </w:p>
-    <w:p>
-      <w:pPr>
-        <w:pStyle w:val="Normal"/>
-        <w:jc w:val="both"/>
-        <w:rPr>
-          <w:sz w:val="36"/>
-          <w:szCs w:val="36"/>
-        </w:rPr>
-      </w:pPr>
-      <w:r>
-        <w:rPr/>
-      </w:r>
-    </w:p>
-    <w:p>
-      <w:pPr>
-        <w:pStyle w:val="Normal"/>
-        <w:jc w:val="both"/>
-        <w:rPr>
-          <w:sz w:val="36"/>
-          <w:szCs w:val="36"/>
-        </w:rPr>
-      </w:pPr>
+        <w:t>am a expressão d</w:t>
+      </w:r>
       <w:r>
         <w:rPr>
           <w:rFonts w:eastAsia="Times New Roman" w:cs="Times New Roman" w:ascii="Garamond" w:hAnsi="Garamond"/>
@@ -1222,20 +917,23 @@
           <w:shd w:fill="auto" w:val="clear"/>
           <w:lang w:val="en-US" w:eastAsia="zh-CN" w:bidi="hi-IN"/>
         </w:rPr>
-        <w:t>O conhecimento que os fariseus tinham colocava sobre eles uma responsabilidade maior diante de Deus e do povo. Eles ocupavam o lugar de mestres e intérpretes da vontade divina.</w:t>
-      </w:r>
-    </w:p>
-    <w:p>
-      <w:pPr>
-        <w:pStyle w:val="Normal"/>
-        <w:jc w:val="both"/>
-        <w:rPr>
-          <w:sz w:val="36"/>
-          <w:szCs w:val="36"/>
-        </w:rPr>
-      </w:pPr>
-      <w:r>
-        <w:rPr/>
+        <w:t>a religiosidade do poder e da aparência externa.</w:t>
+      </w:r>
+    </w:p>
+    <w:p>
+      <w:pPr>
+        <w:pStyle w:val="Normal"/>
+        <w:jc w:val="both"/>
+        <w:rPr>
+          <w:sz w:val="36"/>
+          <w:szCs w:val="36"/>
+        </w:rPr>
+      </w:pPr>
+      <w:r>
+        <w:rPr>
+          <w:sz w:val="36"/>
+          <w:szCs w:val="36"/>
+        </w:rPr>
       </w:r>
     </w:p>
     <w:p>
@@ -1257,7 +955,7 @@
           <w:shd w:fill="auto" w:val="clear"/>
           <w:lang w:val="en-US" w:eastAsia="zh-CN" w:bidi="hi-IN"/>
         </w:rPr>
-        <w:t xml:space="preserve">Quando Jesus os repreende nos Evangelhos, não é por causa do conhecimento em si, mas porque muitos usavam esse saber de forma hipócrita ou orgulhosa. Em outras palavras, Jesus esperava mais deles justamente porque sabiam mais. </w:t>
+        <w:t xml:space="preserve">Os fariseus, por sua vez, eram religiosos dedicados ao estudo e à prática rigorosa da Lei. Valorizavam não apenas a Torá, mas também as tradições orais que a explicavam. Acreditavam na imortalidade da alma e na vida futura, o que os aproximava mais das verdades espirituais. </w:t>
       </w:r>
     </w:p>
     <w:p>
@@ -1292,49 +990,30 @@
           <w:shd w:fill="auto" w:val="clear"/>
           <w:lang w:val="en-US" w:eastAsia="zh-CN" w:bidi="hi-IN"/>
         </w:rPr>
-        <w:t>[ Parei aqui em 06/10/2025 ]</w:t>
-      </w:r>
-    </w:p>
-    <w:p>
-      <w:pPr>
-        <w:pStyle w:val="Normal"/>
-        <w:jc w:val="both"/>
-        <w:rPr>
-          <w:sz w:val="36"/>
-          <w:szCs w:val="36"/>
-        </w:rPr>
-      </w:pPr>
-      <w:r>
-        <w:rPr>
-          <w:sz w:val="36"/>
-          <w:szCs w:val="36"/>
-        </w:rPr>
-      </w:r>
-    </w:p>
-    <w:p>
-      <w:pPr>
-        <w:pStyle w:val="Normal"/>
-        <w:jc w:val="both"/>
-        <w:rPr>
-          <w:sz w:val="36"/>
-          <w:szCs w:val="36"/>
-        </w:rPr>
-      </w:pPr>
-      <w:r>
-        <w:rPr>
-          <w:sz w:val="36"/>
-          <w:szCs w:val="36"/>
-        </w:rPr>
-      </w:r>
-    </w:p>
-    <w:p>
-      <w:pPr>
-        <w:pStyle w:val="Normal"/>
-        <w:jc w:val="both"/>
-        <w:rPr>
-          <w:sz w:val="36"/>
-          <w:szCs w:val="36"/>
-        </w:rPr>
+        <w:t xml:space="preserve">Eles simbolizavam a religiosidade sem vida interior, preocupada com moral, doutrina e cumprimento rigoroso da Lei, mas marcada por orgulho e vaidade espiritual. </w:t>
+      </w:r>
+    </w:p>
+    <w:p>
+      <w:pPr>
+        <w:pStyle w:val="Normal"/>
+        <w:jc w:val="both"/>
+        <w:rPr>
+          <w:sz w:val="36"/>
+          <w:szCs w:val="36"/>
+        </w:rPr>
+      </w:pPr>
+      <w:r>
+        <w:rPr>
+          <w:sz w:val="36"/>
+          <w:szCs w:val="36"/>
+        </w:rPr>
+      </w:r>
+    </w:p>
+    <w:p>
+      <w:pPr>
+        <w:pStyle w:val="Normal"/>
+        <w:jc w:val="both"/>
+        <w:rPr/>
       </w:pPr>
       <w:r>
         <w:rPr>
@@ -1346,37 +1025,15 @@
           <w:shd w:fill="auto" w:val="clear"/>
           <w:lang w:val="en-US" w:eastAsia="zh-CN" w:bidi="hi-IN"/>
         </w:rPr>
-        <w:t>Em meio a tantas disputas e interpretações humanas, Jesus oferece uma resposta simples e profunda, capaz de iluminar todas as leis e orientar todos os corações: amar a Deus de todo o coração, de toda a alma e de todo o entendimento; e amar o próximo como a si mesmo.</w:t>
-      </w:r>
-    </w:p>
-    <w:p>
-      <w:pPr>
-        <w:pStyle w:val="Normal"/>
-        <w:jc w:val="both"/>
-        <w:rPr>
-          <w:sz w:val="36"/>
-          <w:szCs w:val="36"/>
-        </w:rPr>
-      </w:pPr>
-      <w:r>
-        <w:rPr>
-          <w:sz w:val="36"/>
-          <w:szCs w:val="36"/>
-        </w:rPr>
-      </w:r>
-    </w:p>
-    <w:p>
-      <w:pPr>
-        <w:pStyle w:val="Normal"/>
-        <w:jc w:val="both"/>
-        <w:rPr>
-          <w:sz w:val="36"/>
-          <w:szCs w:val="36"/>
-        </w:rPr>
-      </w:pPr>
-      <w:r>
-        <w:rPr>
-          <w:rFonts w:eastAsia="Times New Roman" w:cs="Times New Roman" w:ascii="Garamond" w:hAnsi="Garamond"/>
+        <w:t>Jesus entra em confronto mais direto com quem está mais perto da verdade, mas a vive de forma distorcida. Os saduceus, por negarem a ressurreição, os anjos e a vida futura, estavam tão distantes da dimensão espiritual que o diálogo com eles tinha pouco espaço — Jesus os corrige, mas não trava com eles o mesmo tipo de debate moral e espiritual que tem com os fariseus.</w:t>
+      </w:r>
+    </w:p>
+    <w:p>
+      <w:pPr>
+        <w:pStyle w:val="Normal"/>
+        <w:jc w:val="both"/>
+        <w:rPr>
+          <w:rFonts w:ascii="Garamond" w:hAnsi="Garamond" w:eastAsia="Times New Roman" w:cs="Times New Roman"/>
           <w:color w:val="000000"/>
           <w:kern w:val="0"/>
           <w:sz w:val="36"/>
@@ -1384,17 +1041,6 @@
           <w:shd w:fill="auto" w:val="clear"/>
           <w:lang w:val="en-US" w:eastAsia="zh-CN" w:bidi="hi-IN"/>
         </w:rPr>
-        <w:t>Com isso, o Mestre ensina que o verdadeiro cumprimento da Lei não está na letra, mas no sentimento. Toda norma, todo princípio ou prática religiosa deve ter como base o amor — amor que se volta primeiro para Deus, que se estende ao próximo e que também se reconhece em nós mesmos. É nesse equilíbrio que a fé deixa de ser mera obediência e se torna vivência, conduzindo-nos ao verdadeiro entendimento da vontade divina.]</w:t>
-      </w:r>
-    </w:p>
-    <w:p>
-      <w:pPr>
-        <w:pStyle w:val="Normal"/>
-        <w:jc w:val="both"/>
-        <w:rPr>
-          <w:sz w:val="36"/>
-          <w:szCs w:val="36"/>
-        </w:rPr>
       </w:pPr>
       <w:r>
         <w:rPr>
@@ -1406,55 +1052,6 @@
           <w:shd w:fill="auto" w:val="clear"/>
           <w:lang w:val="en-US" w:eastAsia="zh-CN" w:bidi="hi-IN"/>
         </w:rPr>
-        <w:t xml:space="preserve"> </w:t>
-      </w:r>
-    </w:p>
-    <w:p>
-      <w:pPr>
-        <w:pStyle w:val="Normal"/>
-        <w:jc w:val="both"/>
-        <w:rPr>
-          <w:sz w:val="36"/>
-          <w:szCs w:val="36"/>
-        </w:rPr>
-      </w:pPr>
-      <w:r>
-        <w:rPr>
-          <w:sz w:val="36"/>
-          <w:szCs w:val="36"/>
-        </w:rPr>
-      </w:r>
-    </w:p>
-    <w:p>
-      <w:pPr>
-        <w:pStyle w:val="Normal"/>
-        <w:jc w:val="both"/>
-        <w:rPr>
-          <w:sz w:val="36"/>
-          <w:szCs w:val="36"/>
-        </w:rPr>
-      </w:pPr>
-      <w:r>
-        <w:rPr>
-          <w:sz w:val="36"/>
-          <w:szCs w:val="36"/>
-        </w:rPr>
-      </w:r>
-    </w:p>
-    <w:p>
-      <w:pPr>
-        <w:pStyle w:val="Normal"/>
-        <w:jc w:val="both"/>
-        <w:rPr>
-          <w:sz w:val="36"/>
-          <w:szCs w:val="36"/>
-        </w:rPr>
-      </w:pPr>
-      <w:r>
-        <w:rPr>
-          <w:sz w:val="36"/>
-          <w:szCs w:val="36"/>
-        </w:rPr>
       </w:r>
     </w:p>
     <w:p>
@@ -1476,1652 +1073,33 @@
           <w:shd w:fill="auto" w:val="clear"/>
           <w:lang w:val="en-US" w:eastAsia="zh-CN" w:bidi="hi-IN"/>
         </w:rPr>
-        <w:t xml:space="preserve">[ </w:t>
-      </w:r>
-      <w:r>
-        <w:rPr>
-          <w:rFonts w:eastAsia="Times New Roman" w:cs="Times New Roman" w:ascii="Garamond" w:hAnsi="Garamond"/>
-          <w:b/>
-          <w:bCs/>
-          <w:color w:val="C9211E"/>
-          <w:kern w:val="0"/>
-          <w:sz w:val="36"/>
-          <w:szCs w:val="36"/>
-          <w:shd w:fill="auto" w:val="clear"/>
-          <w:lang w:val="en-US" w:eastAsia="zh-CN" w:bidi="hi-IN"/>
-        </w:rPr>
-        <w:t>Início de bloco a ser avaliado se permanece</w:t>
-      </w:r>
-      <w:r>
-        <w:rPr>
-          <w:rFonts w:eastAsia="Times New Roman" w:cs="Times New Roman" w:ascii="Garamond" w:hAnsi="Garamond"/>
-          <w:color w:val="000000"/>
-          <w:kern w:val="0"/>
-          <w:sz w:val="36"/>
-          <w:szCs w:val="36"/>
-          <w:shd w:fill="auto" w:val="clear"/>
-          <w:lang w:val="en-US" w:eastAsia="zh-CN" w:bidi="hi-IN"/>
-        </w:rPr>
-        <w:t xml:space="preserve"> ]</w:t>
-      </w:r>
-    </w:p>
-    <w:p>
-      <w:pPr>
-        <w:pStyle w:val="Normal"/>
-        <w:jc w:val="both"/>
-        <w:rPr>
-          <w:sz w:val="36"/>
-          <w:szCs w:val="36"/>
-        </w:rPr>
-      </w:pPr>
-      <w:r>
-        <w:rPr>
-          <w:sz w:val="36"/>
-          <w:szCs w:val="36"/>
-        </w:rPr>
-      </w:r>
-    </w:p>
-    <w:p>
-      <w:pPr>
-        <w:pStyle w:val="Normal"/>
-        <w:jc w:val="both"/>
-        <w:rPr>
-          <w:sz w:val="36"/>
-          <w:szCs w:val="36"/>
-        </w:rPr>
-      </w:pPr>
-      <w:r>
-        <w:rPr>
-          <w:rFonts w:eastAsia="Times New Roman" w:cs="Times New Roman" w:ascii="Garamond" w:hAnsi="Garamond"/>
-          <w:color w:val="000000"/>
-          <w:kern w:val="0"/>
-          <w:sz w:val="36"/>
-          <w:szCs w:val="36"/>
-          <w:shd w:fill="auto" w:val="clear"/>
-          <w:lang w:val="en-US" w:eastAsia="zh-CN" w:bidi="hi-IN"/>
-        </w:rPr>
-        <w:t>À luz do Espiritismo, esses capítulos mostram estágios da nossa evolução moral:</w:t>
-      </w:r>
-    </w:p>
-    <w:p>
-      <w:pPr>
-        <w:pStyle w:val="Normal"/>
-        <w:jc w:val="both"/>
-        <w:rPr>
-          <w:sz w:val="36"/>
-          <w:szCs w:val="36"/>
-        </w:rPr>
-      </w:pPr>
-      <w:r>
-        <w:rPr>
-          <w:sz w:val="36"/>
-          <w:szCs w:val="36"/>
-        </w:rPr>
-      </w:r>
-    </w:p>
-    <w:p>
-      <w:pPr>
-        <w:pStyle w:val="Normal"/>
-        <w:jc w:val="both"/>
-        <w:rPr>
-          <w:sz w:val="36"/>
-          <w:szCs w:val="36"/>
-        </w:rPr>
-      </w:pPr>
-      <w:r>
-        <w:rPr>
-          <w:rFonts w:eastAsia="Times New Roman" w:cs="Times New Roman" w:ascii="Garamond" w:hAnsi="Garamond"/>
-          <w:color w:val="000000"/>
-          <w:kern w:val="0"/>
-          <w:sz w:val="36"/>
-          <w:szCs w:val="36"/>
-          <w:shd w:fill="auto" w:val="clear"/>
-          <w:lang w:val="en-US" w:eastAsia="zh-CN" w:bidi="hi-IN"/>
-        </w:rPr>
-        <w:t>Capítulo 21 traz o despertar da consciência, ou seja,  reconhecer nossa própria esterilidade.</w:t>
-      </w:r>
-    </w:p>
-    <w:p>
-      <w:pPr>
-        <w:pStyle w:val="Normal"/>
-        <w:jc w:val="both"/>
-        <w:rPr>
-          <w:sz w:val="36"/>
-          <w:szCs w:val="36"/>
-        </w:rPr>
-      </w:pPr>
-      <w:r>
-        <w:rPr>
-          <w:sz w:val="36"/>
-          <w:szCs w:val="36"/>
-        </w:rPr>
-      </w:r>
-    </w:p>
-    <w:p>
-      <w:pPr>
-        <w:pStyle w:val="Normal"/>
-        <w:jc w:val="both"/>
-        <w:rPr>
-          <w:sz w:val="36"/>
-          <w:szCs w:val="36"/>
-        </w:rPr>
-      </w:pPr>
-      <w:r>
-        <w:rPr>
-          <w:rFonts w:eastAsia="Times New Roman" w:cs="Times New Roman" w:ascii="Garamond" w:hAnsi="Garamond"/>
-          <w:color w:val="000000"/>
-          <w:kern w:val="0"/>
-          <w:sz w:val="36"/>
-          <w:szCs w:val="36"/>
-          <w:shd w:fill="auto" w:val="clear"/>
-          <w:lang w:val="en-US" w:eastAsia="zh-CN" w:bidi="hi-IN"/>
-        </w:rPr>
-        <w:t>Já o capítulo 22 representa a iluminação interior — compreender o amor como essência da Lei (cap. 22).</w:t>
-      </w:r>
-    </w:p>
-    <w:p>
-      <w:pPr>
-        <w:pStyle w:val="Normal"/>
-        <w:jc w:val="both"/>
-        <w:rPr>
-          <w:sz w:val="36"/>
-          <w:szCs w:val="36"/>
-        </w:rPr>
-      </w:pPr>
-      <w:r>
-        <w:rPr>
-          <w:sz w:val="36"/>
-          <w:szCs w:val="36"/>
-        </w:rPr>
-      </w:r>
-    </w:p>
-    <w:p>
-      <w:pPr>
-        <w:pStyle w:val="Normal"/>
-        <w:jc w:val="both"/>
-        <w:rPr>
-          <w:sz w:val="36"/>
-          <w:szCs w:val="36"/>
-        </w:rPr>
-      </w:pPr>
-      <w:r>
-        <w:rPr>
-          <w:rFonts w:eastAsia="Times New Roman" w:cs="Times New Roman" w:ascii="Garamond" w:hAnsi="Garamond"/>
-          <w:color w:val="000000"/>
-          <w:kern w:val="0"/>
-          <w:sz w:val="36"/>
-          <w:szCs w:val="36"/>
-          <w:shd w:fill="auto" w:val="clear"/>
-          <w:lang w:val="en-US" w:eastAsia="zh-CN" w:bidi="hi-IN"/>
-        </w:rPr>
-        <w:t xml:space="preserve">Reforma íntima — vencer o orgulho e a hipocrisia (cap. 23). </w:t>
-      </w:r>
-    </w:p>
-    <w:p>
-      <w:pPr>
-        <w:pStyle w:val="Normal"/>
-        <w:jc w:val="both"/>
-        <w:rPr>
-          <w:sz w:val="36"/>
-          <w:szCs w:val="36"/>
-        </w:rPr>
-      </w:pPr>
-      <w:r>
-        <w:rPr>
-          <w:sz w:val="36"/>
-          <w:szCs w:val="36"/>
-        </w:rPr>
-      </w:r>
-    </w:p>
-    <w:p>
-      <w:pPr>
-        <w:pStyle w:val="Normal"/>
-        <w:jc w:val="both"/>
-        <w:rPr>
-          <w:sz w:val="36"/>
-          <w:szCs w:val="36"/>
-        </w:rPr>
-      </w:pPr>
-      <w:r>
-        <w:rPr>
-          <w:rFonts w:eastAsia="Times New Roman" w:cs="Times New Roman" w:ascii="Garamond" w:hAnsi="Garamond"/>
-          <w:color w:val="000000"/>
-          <w:kern w:val="0"/>
-          <w:sz w:val="36"/>
-          <w:szCs w:val="36"/>
-          <w:shd w:fill="auto" w:val="clear"/>
-          <w:lang w:val="en-US" w:eastAsia="zh-CN" w:bidi="hi-IN"/>
-        </w:rPr>
-        <w:t>Somente depois de passar por esse processo o espírito está preparado para o sacrifício consciente, isto é, para renunciar ao ego e viver o amor em plenitude — o que Jesus realiza na cruz e confirma na ressurreição</w:t>
-      </w:r>
-    </w:p>
-    <w:p>
-      <w:pPr>
-        <w:pStyle w:val="Normal"/>
-        <w:jc w:val="both"/>
-        <w:rPr>
-          <w:sz w:val="36"/>
-          <w:szCs w:val="36"/>
-        </w:rPr>
-      </w:pPr>
-      <w:r>
-        <w:rPr>
-          <w:rFonts w:eastAsia="Times New Roman" w:cs="Times New Roman" w:ascii="Garamond" w:hAnsi="Garamond"/>
-          <w:color w:val="000000"/>
-          <w:kern w:val="0"/>
-          <w:sz w:val="36"/>
-          <w:szCs w:val="36"/>
-          <w:shd w:fill="auto" w:val="clear"/>
-          <w:lang w:val="en-US" w:eastAsia="zh-CN" w:bidi="hi-IN"/>
-        </w:rPr>
-        <w:t xml:space="preserve">[ </w:t>
-      </w:r>
-      <w:r>
-        <w:rPr>
-          <w:rFonts w:eastAsia="Times New Roman" w:cs="Times New Roman" w:ascii="Garamond" w:hAnsi="Garamond"/>
-          <w:b/>
-          <w:bCs/>
-          <w:color w:val="C9211E"/>
-          <w:kern w:val="0"/>
-          <w:sz w:val="36"/>
-          <w:szCs w:val="36"/>
-          <w:shd w:fill="auto" w:val="clear"/>
-          <w:lang w:val="en-US" w:eastAsia="zh-CN" w:bidi="hi-IN"/>
-        </w:rPr>
-        <w:t>Término de bloco a ser avaliado se permanece</w:t>
-      </w:r>
-      <w:r>
-        <w:rPr>
-          <w:rFonts w:eastAsia="Times New Roman" w:cs="Times New Roman" w:ascii="Garamond" w:hAnsi="Garamond"/>
-          <w:color w:val="000000"/>
-          <w:kern w:val="0"/>
-          <w:sz w:val="36"/>
-          <w:szCs w:val="36"/>
-          <w:shd w:fill="auto" w:val="clear"/>
-          <w:lang w:val="en-US" w:eastAsia="zh-CN" w:bidi="hi-IN"/>
-        </w:rPr>
-        <w:t xml:space="preserve"> ]</w:t>
-      </w:r>
-    </w:p>
-    <w:p>
-      <w:pPr>
-        <w:pStyle w:val="Normal"/>
-        <w:jc w:val="both"/>
-        <w:rPr>
-          <w:sz w:val="36"/>
-          <w:szCs w:val="36"/>
-        </w:rPr>
-      </w:pPr>
-      <w:r>
-        <w:rPr>
-          <w:sz w:val="36"/>
-          <w:szCs w:val="36"/>
-        </w:rPr>
-      </w:r>
-    </w:p>
-    <w:p>
-      <w:pPr>
-        <w:pStyle w:val="Normal"/>
-        <w:jc w:val="both"/>
+        <w:t>Já os fariseus, por outro lado, estavam dentro do mesmo universo de fé que Jesus. O problema era que transformaram a fé em formalismo e hipocrisia, perdendo o coração do ensinamento que professavam. Por isso, Jesus os confronta com mais veemência: eles sabiam mais, mas viviam menos.</w:t>
+      </w:r>
+    </w:p>
+    <w:p>
+      <w:pPr>
+        <w:pStyle w:val="Normal"/>
+        <w:jc w:val="both"/>
+        <w:rPr>
+          <w:sz w:val="36"/>
+          <w:szCs w:val="36"/>
+        </w:rPr>
+      </w:pPr>
+      <w:r>
         <w:rPr/>
-      </w:pPr>
-      <w:r>
-        <w:rPr>
-          <w:rFonts w:eastAsia="Times New Roman" w:cs="Times New Roman" w:ascii="Garamond" w:hAnsi="Garamond"/>
-          <w:color w:val="000000"/>
-          <w:kern w:val="0"/>
-          <w:sz w:val="36"/>
-          <w:szCs w:val="36"/>
-          <w:shd w:fill="auto" w:val="clear"/>
-          <w:lang w:val="en-US" w:eastAsia="zh-CN" w:bidi="hi-IN"/>
-        </w:rPr>
-        <w:t xml:space="preserve">[ </w:t>
-      </w:r>
-      <w:r>
-        <w:rPr>
-          <w:rFonts w:eastAsia="Times New Roman" w:cs="Times New Roman" w:ascii="Garamond" w:hAnsi="Garamond"/>
-          <w:b/>
-          <w:bCs/>
-          <w:color w:val="C9211E"/>
-          <w:kern w:val="0"/>
-          <w:sz w:val="36"/>
-          <w:szCs w:val="36"/>
-          <w:shd w:fill="auto" w:val="clear"/>
-          <w:lang w:val="en-US" w:eastAsia="zh-CN" w:bidi="hi-IN"/>
-        </w:rPr>
-        <w:t>Precisa ser desenvolvido e encaixado no texto</w:t>
-      </w:r>
-      <w:r>
-        <w:rPr>
-          <w:rFonts w:eastAsia="Times New Roman" w:cs="Times New Roman" w:ascii="Garamond" w:hAnsi="Garamond"/>
-          <w:color w:val="000000"/>
-          <w:kern w:val="0"/>
-          <w:sz w:val="36"/>
-          <w:szCs w:val="36"/>
-          <w:shd w:fill="auto" w:val="clear"/>
-          <w:lang w:val="en-US" w:eastAsia="zh-CN" w:bidi="hi-IN"/>
-        </w:rPr>
-        <w:t>] O que você formulou toca num ponto que muitos estudiosos também percebem: Jesus entra em confronto mais direto com quem está mais perto da verdade, mas a vive de forma distorcida. Os saduceus, por negarem a ressurreição, os anjos e a vida futura, estavam tão distantes da dimensão espiritual que o diálogo com eles tinha pouco espaço — Jesus os corrige, mas não trava com eles o mesmo tipo de debate moral e espiritual que tem com os fariseus.</w:t>
-      </w:r>
-    </w:p>
-    <w:p>
-      <w:pPr>
-        <w:pStyle w:val="Normal"/>
-        <w:jc w:val="both"/>
-        <w:rPr>
-          <w:rFonts w:ascii="Garamond" w:hAnsi="Garamond" w:eastAsia="Times New Roman" w:cs="Times New Roman"/>
-          <w:color w:val="000000"/>
-          <w:kern w:val="0"/>
-          <w:sz w:val="36"/>
-          <w:szCs w:val="36"/>
-          <w:shd w:fill="auto" w:val="clear"/>
-          <w:lang w:val="en-US" w:eastAsia="zh-CN" w:bidi="hi-IN"/>
-        </w:rPr>
-      </w:pPr>
-      <w:r>
-        <w:rPr>
-          <w:rFonts w:eastAsia="Times New Roman" w:cs="Times New Roman" w:ascii="Garamond" w:hAnsi="Garamond"/>
-          <w:color w:val="000000"/>
-          <w:kern w:val="0"/>
-          <w:sz w:val="36"/>
-          <w:szCs w:val="36"/>
-          <w:shd w:fill="auto" w:val="clear"/>
-          <w:lang w:val="en-US" w:eastAsia="zh-CN" w:bidi="hi-IN"/>
-        </w:rPr>
-      </w:r>
-    </w:p>
-    <w:p>
-      <w:pPr>
-        <w:pStyle w:val="Normal"/>
-        <w:jc w:val="both"/>
+      </w:r>
+    </w:p>
+    <w:p>
+      <w:pPr>
+        <w:pStyle w:val="Normal"/>
+        <w:jc w:val="both"/>
+        <w:rPr>
+          <w:sz w:val="36"/>
+          <w:szCs w:val="36"/>
+        </w:rPr>
+      </w:pPr>
+      <w:r>
         <w:rPr/>
-      </w:pPr>
-      <w:r>
-        <w:rPr>
-          <w:rFonts w:eastAsia="Times New Roman" w:cs="Times New Roman" w:ascii="Garamond" w:hAnsi="Garamond"/>
-          <w:color w:val="000000"/>
-          <w:kern w:val="0"/>
-          <w:sz w:val="36"/>
-          <w:szCs w:val="36"/>
-          <w:shd w:fill="auto" w:val="clear"/>
-          <w:lang w:val="en-US" w:eastAsia="zh-CN" w:bidi="hi-IN"/>
-        </w:rPr>
-        <w:t>Já os fariseus, por outro lado, acreditavam nas Escrituras, na vida após a morte, e na vinda do Messias — ou seja, estavam dentro do mesmo universo de fé que Jesus. O problema era que transformaram a fé em formalismo e hipocrisia, perdendo o coração do ensinamento que professavam. Por isso, Jesus os confronta com mais veemência: eles sabiam mais, mas viviam menos.</w:t>
-      </w:r>
-    </w:p>
-    <w:p>
-      <w:pPr>
-        <w:pStyle w:val="Normal"/>
-        <w:jc w:val="both"/>
-        <w:rPr>
-          <w:rFonts w:ascii="Garamond" w:hAnsi="Garamond" w:eastAsia="Times New Roman" w:cs="Times New Roman"/>
-          <w:color w:val="000000"/>
-          <w:kern w:val="0"/>
-          <w:sz w:val="36"/>
-          <w:szCs w:val="36"/>
-          <w:shd w:fill="auto" w:val="clear"/>
-          <w:lang w:val="en-US" w:eastAsia="zh-CN" w:bidi="hi-IN"/>
-        </w:rPr>
-      </w:pPr>
-      <w:r>
-        <w:rPr>
-          <w:rFonts w:eastAsia="Times New Roman" w:cs="Times New Roman" w:ascii="Garamond" w:hAnsi="Garamond"/>
-          <w:color w:val="000000"/>
-          <w:kern w:val="0"/>
-          <w:sz w:val="36"/>
-          <w:szCs w:val="36"/>
-          <w:shd w:fill="auto" w:val="clear"/>
-          <w:lang w:val="en-US" w:eastAsia="zh-CN" w:bidi="hi-IN"/>
-        </w:rPr>
-      </w:r>
-    </w:p>
-    <w:p>
-      <w:pPr>
-        <w:pStyle w:val="Normal"/>
-        <w:jc w:val="both"/>
-        <w:rPr/>
-      </w:pPr>
-      <w:r>
-        <w:rPr>
-          <w:rFonts w:eastAsia="Times New Roman" w:cs="Times New Roman" w:ascii="Garamond" w:hAnsi="Garamond"/>
-          <w:color w:val="000000"/>
-          <w:kern w:val="0"/>
-          <w:sz w:val="36"/>
-          <w:szCs w:val="36"/>
-          <w:shd w:fill="auto" w:val="clear"/>
-          <w:lang w:val="en-US" w:eastAsia="zh-CN" w:bidi="hi-IN"/>
-        </w:rPr>
-        <w:t>Em termos simbólicos, podemos dizer que:</w:t>
-      </w:r>
-    </w:p>
-    <w:p>
-      <w:pPr>
-        <w:pStyle w:val="Normal"/>
-        <w:jc w:val="both"/>
-        <w:rPr>
-          <w:rFonts w:ascii="Garamond" w:hAnsi="Garamond" w:eastAsia="Times New Roman" w:cs="Times New Roman"/>
-          <w:color w:val="000000"/>
-          <w:kern w:val="0"/>
-          <w:sz w:val="36"/>
-          <w:szCs w:val="36"/>
-          <w:shd w:fill="auto" w:val="clear"/>
-          <w:lang w:val="en-US" w:eastAsia="zh-CN" w:bidi="hi-IN"/>
-        </w:rPr>
-      </w:pPr>
-      <w:r>
-        <w:rPr>
-          <w:rFonts w:eastAsia="Times New Roman" w:cs="Times New Roman" w:ascii="Garamond" w:hAnsi="Garamond"/>
-          <w:color w:val="000000"/>
-          <w:kern w:val="0"/>
-          <w:sz w:val="36"/>
-          <w:szCs w:val="36"/>
-          <w:shd w:fill="auto" w:val="clear"/>
-          <w:lang w:val="en-US" w:eastAsia="zh-CN" w:bidi="hi-IN"/>
-        </w:rPr>
-      </w:r>
-    </w:p>
-    <w:p>
-      <w:pPr>
-        <w:pStyle w:val="Normal"/>
-        <w:jc w:val="both"/>
-        <w:rPr/>
-      </w:pPr>
-      <w:r>
-        <w:rPr>
-          <w:rFonts w:eastAsia="Times New Roman" w:cs="Times New Roman" w:ascii="Garamond" w:hAnsi="Garamond"/>
-          <w:color w:val="000000"/>
-          <w:kern w:val="0"/>
-          <w:sz w:val="36"/>
-          <w:szCs w:val="36"/>
-          <w:shd w:fill="auto" w:val="clear"/>
-          <w:lang w:val="en-US" w:eastAsia="zh-CN" w:bidi="hi-IN"/>
-        </w:rPr>
-        <w:t>Os saduceus representam o ceticismo religioso, que perde a dimensão do sagrado;</w:t>
-      </w:r>
-    </w:p>
-    <w:p>
-      <w:pPr>
-        <w:pStyle w:val="Normal"/>
-        <w:jc w:val="both"/>
-        <w:rPr>
-          <w:rFonts w:ascii="Garamond" w:hAnsi="Garamond" w:eastAsia="Times New Roman" w:cs="Times New Roman"/>
-          <w:color w:val="000000"/>
-          <w:kern w:val="0"/>
-          <w:sz w:val="36"/>
-          <w:szCs w:val="36"/>
-          <w:shd w:fill="auto" w:val="clear"/>
-          <w:lang w:val="en-US" w:eastAsia="zh-CN" w:bidi="hi-IN"/>
-        </w:rPr>
-      </w:pPr>
-      <w:r>
-        <w:rPr>
-          <w:rFonts w:eastAsia="Times New Roman" w:cs="Times New Roman" w:ascii="Garamond" w:hAnsi="Garamond"/>
-          <w:color w:val="000000"/>
-          <w:kern w:val="0"/>
-          <w:sz w:val="36"/>
-          <w:szCs w:val="36"/>
-          <w:shd w:fill="auto" w:val="clear"/>
-          <w:lang w:val="en-US" w:eastAsia="zh-CN" w:bidi="hi-IN"/>
-        </w:rPr>
-      </w:r>
-    </w:p>
-    <w:p>
-      <w:pPr>
-        <w:pStyle w:val="Normal"/>
-        <w:jc w:val="both"/>
-        <w:rPr/>
-      </w:pPr>
-      <w:r>
-        <w:rPr>
-          <w:rFonts w:eastAsia="Times New Roman" w:cs="Times New Roman" w:ascii="Garamond" w:hAnsi="Garamond"/>
-          <w:color w:val="000000"/>
-          <w:kern w:val="0"/>
-          <w:sz w:val="36"/>
-          <w:szCs w:val="36"/>
-          <w:shd w:fill="auto" w:val="clear"/>
-          <w:lang w:val="en-US" w:eastAsia="zh-CN" w:bidi="hi-IN"/>
-        </w:rPr>
-        <w:t>Os fariseus representam a religiosidade sem vida interior, que conserva a forma mas esquece o espírito.</w:t>
-      </w:r>
-    </w:p>
-    <w:p>
-      <w:pPr>
-        <w:pStyle w:val="Normal"/>
-        <w:jc w:val="both"/>
-        <w:rPr>
-          <w:rFonts w:ascii="Garamond" w:hAnsi="Garamond" w:eastAsia="Times New Roman" w:cs="Times New Roman"/>
-          <w:color w:val="000000"/>
-          <w:kern w:val="0"/>
-          <w:sz w:val="36"/>
-          <w:szCs w:val="36"/>
-          <w:shd w:fill="auto" w:val="clear"/>
-          <w:lang w:val="en-US" w:eastAsia="zh-CN" w:bidi="hi-IN"/>
-        </w:rPr>
-      </w:pPr>
-      <w:r>
-        <w:rPr>
-          <w:rFonts w:eastAsia="Times New Roman" w:cs="Times New Roman" w:ascii="Garamond" w:hAnsi="Garamond"/>
-          <w:color w:val="000000"/>
-          <w:kern w:val="0"/>
-          <w:sz w:val="36"/>
-          <w:szCs w:val="36"/>
-          <w:shd w:fill="auto" w:val="clear"/>
-          <w:lang w:val="en-US" w:eastAsia="zh-CN" w:bidi="hi-IN"/>
-        </w:rPr>
-      </w:r>
-    </w:p>
-    <w:p>
-      <w:pPr>
-        <w:pStyle w:val="Normal"/>
-        <w:jc w:val="both"/>
-        <w:rPr/>
-      </w:pPr>
-      <w:r>
-        <w:rPr>
-          <w:rFonts w:eastAsia="Times New Roman" w:cs="Times New Roman" w:ascii="Garamond" w:hAnsi="Garamond"/>
-          <w:color w:val="000000"/>
-          <w:kern w:val="0"/>
-          <w:sz w:val="36"/>
-          <w:szCs w:val="36"/>
-          <w:shd w:fill="auto" w:val="clear"/>
-          <w:lang w:val="en-US" w:eastAsia="zh-CN" w:bidi="hi-IN"/>
-        </w:rPr>
-        <w:t>E Jesus vem justamente para reconciliar a fé e o coração, chamando tanto uns quanto outros à verdade interior.</w:t>
-      </w:r>
-    </w:p>
-    <w:p>
-      <w:pPr>
-        <w:pStyle w:val="Normal"/>
-        <w:jc w:val="both"/>
-        <w:rPr>
-          <w:rFonts w:ascii="Garamond" w:hAnsi="Garamond" w:eastAsia="Times New Roman" w:cs="Times New Roman"/>
-          <w:color w:val="000000"/>
-          <w:kern w:val="0"/>
-          <w:sz w:val="36"/>
-          <w:szCs w:val="36"/>
-          <w:shd w:fill="auto" w:val="clear"/>
-          <w:lang w:val="en-US" w:eastAsia="zh-CN" w:bidi="hi-IN"/>
-        </w:rPr>
-      </w:pPr>
-      <w:r>
-        <w:rPr>
-          <w:rFonts w:eastAsia="Times New Roman" w:cs="Times New Roman" w:ascii="Garamond" w:hAnsi="Garamond"/>
-          <w:color w:val="000000"/>
-          <w:kern w:val="0"/>
-          <w:sz w:val="36"/>
-          <w:szCs w:val="36"/>
-          <w:shd w:fill="auto" w:val="clear"/>
-          <w:lang w:val="en-US" w:eastAsia="zh-CN" w:bidi="hi-IN"/>
-        </w:rPr>
-      </w:r>
-    </w:p>
-    <w:p>
-      <w:pPr>
-        <w:pStyle w:val="Normal"/>
-        <w:jc w:val="both"/>
-        <w:rPr/>
-      </w:pPr>
-      <w:r>
-        <w:rPr>
-          <w:rFonts w:eastAsia="Times New Roman" w:cs="Times New Roman" w:ascii="Garamond" w:hAnsi="Garamond"/>
-          <w:color w:val="000000"/>
-          <w:kern w:val="0"/>
-          <w:sz w:val="36"/>
-          <w:szCs w:val="36"/>
-          <w:shd w:fill="auto" w:val="clear"/>
-          <w:lang w:val="en-US" w:eastAsia="zh-CN" w:bidi="hi-IN"/>
-        </w:rPr>
-        <w:t>Sua leitura é muito lúcida — especialmente essa ideia de que é mais difícil ensinar quem está completamente distante da fé do que corrigir quem a conhece, mas a deturpou. Isso mostra uma compreensão espiritual bastante madura do Evangelho.</w:t>
-      </w:r>
-    </w:p>
-    <w:p>
-      <w:pPr>
-        <w:pStyle w:val="Normal"/>
-        <w:jc w:val="both"/>
-        <w:rPr>
-          <w:rFonts w:ascii="Garamond" w:hAnsi="Garamond" w:eastAsia="Times New Roman" w:cs="Times New Roman"/>
-          <w:color w:val="000000"/>
-          <w:kern w:val="0"/>
-          <w:sz w:val="36"/>
-          <w:szCs w:val="36"/>
-          <w:shd w:fill="auto" w:val="clear"/>
-          <w:lang w:val="en-US" w:eastAsia="zh-CN" w:bidi="hi-IN"/>
-        </w:rPr>
-      </w:pPr>
-      <w:r>
-        <w:rPr>
-          <w:rFonts w:eastAsia="Times New Roman" w:cs="Times New Roman" w:ascii="Garamond" w:hAnsi="Garamond"/>
-          <w:color w:val="000000"/>
-          <w:kern w:val="0"/>
-          <w:sz w:val="36"/>
-          <w:szCs w:val="36"/>
-          <w:shd w:fill="auto" w:val="clear"/>
-          <w:lang w:val="en-US" w:eastAsia="zh-CN" w:bidi="hi-IN"/>
-        </w:rPr>
-      </w:r>
-    </w:p>
-    <w:p>
-      <w:pPr>
-        <w:pStyle w:val="Normal"/>
-        <w:jc w:val="both"/>
-        <w:rPr>
-          <w:sz w:val="36"/>
-          <w:szCs w:val="36"/>
-        </w:rPr>
-      </w:pPr>
-      <w:r>
-        <w:rPr>
-          <w:rFonts w:eastAsia="Times New Roman" w:cs="Times New Roman" w:ascii="Garamond" w:hAnsi="Garamond"/>
-          <w:color w:val="000000"/>
-          <w:kern w:val="0"/>
-          <w:sz w:val="36"/>
-          <w:szCs w:val="36"/>
-          <w:shd w:fill="auto" w:val="clear"/>
-          <w:lang w:val="en-US" w:eastAsia="zh-CN" w:bidi="hi-IN"/>
-        </w:rPr>
-        <w:t>[ Ver onde encaixar ] Os saduceus, que não acreditavam na ressurreição, traziam questionamentos puro e simples teológicos — a vida após a morte era um tema que negavam, então sua tentativa era desafiar Jesus em algo que ele poderia não explicar satisfatoriamente.</w:t>
-      </w:r>
-    </w:p>
-    <w:p>
-      <w:pPr>
-        <w:pStyle w:val="Normal"/>
-        <w:jc w:val="both"/>
-        <w:rPr>
-          <w:sz w:val="36"/>
-          <w:szCs w:val="36"/>
-        </w:rPr>
-      </w:pPr>
-      <w:r>
-        <w:rPr>
-          <w:sz w:val="36"/>
-          <w:szCs w:val="36"/>
-        </w:rPr>
-      </w:r>
-    </w:p>
-    <w:p>
-      <w:pPr>
-        <w:pStyle w:val="Normal"/>
-        <w:jc w:val="both"/>
-        <w:rPr>
-          <w:sz w:val="36"/>
-          <w:szCs w:val="36"/>
-        </w:rPr>
-      </w:pPr>
-      <w:r>
-        <w:rPr>
-          <w:rFonts w:eastAsia="Times New Roman" w:cs="Times New Roman" w:ascii="Garamond" w:hAnsi="Garamond"/>
-          <w:color w:val="000000"/>
-          <w:kern w:val="0"/>
-          <w:sz w:val="36"/>
-          <w:szCs w:val="36"/>
-          <w:shd w:fill="auto" w:val="clear"/>
-          <w:lang w:val="en-US" w:eastAsia="zh-CN" w:bidi="hi-IN"/>
-        </w:rPr>
-        <w:t>Os fariseus, por outro lado, já tinham uma base de fé espiritual, mas buscavam manipular a situação social e política. Por isso, questionam assuntos materiais e cotidianos, mesmo acreditando na vida futura.</w:t>
-      </w:r>
-    </w:p>
-    <w:p>
-      <w:pPr>
-        <w:pStyle w:val="Normal"/>
-        <w:jc w:val="both"/>
-        <w:rPr>
-          <w:sz w:val="36"/>
-          <w:szCs w:val="36"/>
-        </w:rPr>
-      </w:pPr>
-      <w:r>
-        <w:rPr>
-          <w:sz w:val="36"/>
-          <w:szCs w:val="36"/>
-        </w:rPr>
-      </w:r>
-    </w:p>
-    <w:p>
-      <w:pPr>
-        <w:pStyle w:val="Normal"/>
-        <w:jc w:val="both"/>
-        <w:rPr>
-          <w:rFonts w:ascii="Garamond" w:hAnsi="Garamond" w:eastAsia="Times New Roman" w:cs="Times New Roman"/>
-          <w:color w:val="000000"/>
-          <w:kern w:val="0"/>
-          <w:sz w:val="36"/>
-          <w:szCs w:val="36"/>
-          <w:shd w:fill="auto" w:val="clear"/>
-          <w:lang w:val="en-US" w:eastAsia="zh-CN" w:bidi="hi-IN"/>
-        </w:rPr>
-      </w:pPr>
-      <w:r>
-        <w:rPr>
-          <w:rFonts w:eastAsia="Times New Roman" w:cs="Times New Roman" w:ascii="Garamond" w:hAnsi="Garamond"/>
-          <w:color w:val="000000"/>
-          <w:kern w:val="0"/>
-          <w:sz w:val="36"/>
-          <w:szCs w:val="36"/>
-          <w:shd w:fill="auto" w:val="clear"/>
-          <w:lang w:val="en-US" w:eastAsia="zh-CN" w:bidi="hi-IN"/>
-        </w:rPr>
-      </w:r>
-    </w:p>
-    <w:p>
-      <w:pPr>
-        <w:pStyle w:val="Normal"/>
-        <w:jc w:val="both"/>
-        <w:rPr>
-          <w:sz w:val="36"/>
-          <w:szCs w:val="36"/>
-        </w:rPr>
-      </w:pPr>
-      <w:r>
-        <w:rPr>
-          <w:sz w:val="36"/>
-          <w:szCs w:val="36"/>
-        </w:rPr>
-      </w:r>
-    </w:p>
-    <w:p>
-      <w:pPr>
-        <w:pStyle w:val="Normal"/>
-        <w:jc w:val="both"/>
-        <w:rPr>
-          <w:sz w:val="36"/>
-          <w:szCs w:val="36"/>
-        </w:rPr>
-      </w:pPr>
-      <w:r>
-        <w:rPr>
-          <w:sz w:val="36"/>
-          <w:szCs w:val="36"/>
-        </w:rPr>
-      </w:r>
-    </w:p>
-    <w:p>
-      <w:pPr>
-        <w:pStyle w:val="Normal"/>
-        <w:jc w:val="both"/>
-        <w:rPr>
-          <w:sz w:val="36"/>
-          <w:szCs w:val="36"/>
-        </w:rPr>
-      </w:pPr>
-      <w:r>
-        <w:rPr>
-          <w:sz w:val="36"/>
-          <w:szCs w:val="36"/>
-        </w:rPr>
-      </w:r>
-    </w:p>
-    <w:p>
-      <w:pPr>
-        <w:pStyle w:val="Normal"/>
-        <w:jc w:val="both"/>
-        <w:rPr>
-          <w:sz w:val="36"/>
-          <w:szCs w:val="36"/>
-        </w:rPr>
-      </w:pPr>
-      <w:r>
-        <w:rPr>
-          <w:sz w:val="36"/>
-          <w:szCs w:val="36"/>
-        </w:rPr>
-      </w:r>
-    </w:p>
-    <w:p>
-      <w:pPr>
-        <w:pStyle w:val="Normal"/>
-        <w:jc w:val="both"/>
-        <w:rPr>
-          <w:sz w:val="36"/>
-          <w:szCs w:val="36"/>
-        </w:rPr>
-      </w:pPr>
-      <w:r>
-        <w:rPr>
-          <w:rFonts w:eastAsia="Times New Roman" w:cs="Times New Roman" w:ascii="Garamond" w:hAnsi="Garamond"/>
-          <w:color w:val="000000"/>
-          <w:kern w:val="0"/>
-          <w:sz w:val="36"/>
-          <w:szCs w:val="36"/>
-          <w:shd w:fill="auto" w:val="clear"/>
-          <w:lang w:val="en-US" w:eastAsia="zh-CN" w:bidi="hi-IN"/>
-        </w:rPr>
-        <w:t>É importante nós observarmos que o capítulo 22 do Evangelho de Mateus, no qual está inserido o mandamento maior, apresenta de uma sequência de confrontos entre Jesus e os grupos religiosos e políticos da época  - fariseus, saduceus, doutores da lei - , que tentavam testá-lo e colocá-lo em contradição.</w:t>
-      </w:r>
-    </w:p>
-    <w:p>
-      <w:pPr>
-        <w:pStyle w:val="Normal"/>
-        <w:jc w:val="both"/>
-        <w:rPr>
-          <w:sz w:val="36"/>
-          <w:szCs w:val="36"/>
-        </w:rPr>
-      </w:pPr>
-      <w:r>
-        <w:rPr>
-          <w:sz w:val="36"/>
-          <w:szCs w:val="36"/>
-        </w:rPr>
-      </w:r>
-    </w:p>
-    <w:p>
-      <w:pPr>
-        <w:pStyle w:val="Normal"/>
-        <w:jc w:val="both"/>
-        <w:rPr>
-          <w:sz w:val="36"/>
-          <w:szCs w:val="36"/>
-        </w:rPr>
-      </w:pPr>
-      <w:r>
-        <w:rPr>
-          <w:rFonts w:eastAsia="Times New Roman" w:cs="Times New Roman" w:ascii="Garamond" w:hAnsi="Garamond"/>
-          <w:color w:val="000000"/>
-          <w:kern w:val="0"/>
-          <w:sz w:val="36"/>
-          <w:szCs w:val="36"/>
-          <w:shd w:fill="auto" w:val="clear"/>
-          <w:lang w:val="en-US" w:eastAsia="zh-CN" w:bidi="hi-IN"/>
-        </w:rPr>
-        <w:t>[ Prosseguir utilizando como referência o seguinte:</w:t>
-      </w:r>
-    </w:p>
-    <w:p>
-      <w:pPr>
-        <w:pStyle w:val="Normal"/>
-        <w:jc w:val="both"/>
-        <w:rPr>
-          <w:sz w:val="36"/>
-          <w:szCs w:val="36"/>
-        </w:rPr>
-      </w:pPr>
-      <w:r>
-        <w:rPr>
-          <w:sz w:val="36"/>
-          <w:szCs w:val="36"/>
-        </w:rPr>
-      </w:r>
-    </w:p>
-    <w:p>
-      <w:pPr>
-        <w:pStyle w:val="Normal"/>
-        <w:jc w:val="both"/>
-        <w:rPr>
-          <w:sz w:val="36"/>
-          <w:szCs w:val="36"/>
-        </w:rPr>
-      </w:pPr>
-      <w:r>
-        <w:rPr>
-          <w:rFonts w:eastAsia="Times New Roman" w:cs="Times New Roman" w:ascii="Garamond" w:hAnsi="Garamond"/>
-          <w:color w:val="000000"/>
-          <w:kern w:val="0"/>
-          <w:sz w:val="36"/>
-          <w:szCs w:val="36"/>
-          <w:shd w:fill="auto" w:val="clear"/>
-          <w:lang w:val="en-US" w:eastAsia="zh-CN" w:bidi="hi-IN"/>
-        </w:rPr>
-        <w:t>1. **Parábola das bodas do filho do rei** (vv. 1-14)</w:t>
-      </w:r>
-    </w:p>
-    <w:p>
-      <w:pPr>
-        <w:pStyle w:val="Normal"/>
-        <w:jc w:val="both"/>
-        <w:rPr>
-          <w:sz w:val="36"/>
-          <w:szCs w:val="36"/>
-        </w:rPr>
-      </w:pPr>
-      <w:r>
-        <w:rPr>
-          <w:sz w:val="36"/>
-          <w:szCs w:val="36"/>
-        </w:rPr>
-      </w:r>
-    </w:p>
-    <w:p>
-      <w:pPr>
-        <w:pStyle w:val="Normal"/>
-        <w:jc w:val="both"/>
-        <w:rPr>
-          <w:sz w:val="36"/>
-          <w:szCs w:val="36"/>
-        </w:rPr>
-      </w:pPr>
-      <w:r>
-        <w:rPr>
-          <w:rFonts w:eastAsia="Times New Roman" w:cs="Times New Roman" w:ascii="Garamond" w:hAnsi="Garamond"/>
-          <w:color w:val="000000"/>
-          <w:kern w:val="0"/>
-          <w:sz w:val="36"/>
-          <w:szCs w:val="36"/>
-          <w:shd w:fill="auto" w:val="clear"/>
-          <w:lang w:val="en-US" w:eastAsia="zh-CN" w:bidi="hi-IN"/>
-        </w:rPr>
-        <w:t xml:space="preserve">   </w:t>
-      </w:r>
-      <w:r>
-        <w:rPr>
-          <w:rFonts w:eastAsia="Times New Roman" w:cs="Times New Roman" w:ascii="Garamond" w:hAnsi="Garamond"/>
-          <w:color w:val="000000"/>
-          <w:kern w:val="0"/>
-          <w:sz w:val="36"/>
-          <w:szCs w:val="36"/>
-          <w:shd w:fill="auto" w:val="clear"/>
-          <w:lang w:val="en-US" w:eastAsia="zh-CN" w:bidi="hi-IN"/>
-        </w:rPr>
-        <w:t>* Jesus anuncia, em linguagem simbólica, a rejeição de Israel à mensagem divina e a abertura do Reino de Deus a todos.</w:t>
-      </w:r>
-    </w:p>
-    <w:p>
-      <w:pPr>
-        <w:pStyle w:val="Normal"/>
-        <w:jc w:val="both"/>
-        <w:rPr>
-          <w:sz w:val="36"/>
-          <w:szCs w:val="36"/>
-        </w:rPr>
-      </w:pPr>
-      <w:r>
-        <w:rPr>
-          <w:sz w:val="36"/>
-          <w:szCs w:val="36"/>
-        </w:rPr>
-      </w:r>
-    </w:p>
-    <w:p>
-      <w:pPr>
-        <w:pStyle w:val="Normal"/>
-        <w:jc w:val="both"/>
-        <w:rPr>
-          <w:sz w:val="36"/>
-          <w:szCs w:val="36"/>
-        </w:rPr>
-      </w:pPr>
-      <w:r>
-        <w:rPr>
-          <w:rFonts w:eastAsia="Times New Roman" w:cs="Times New Roman" w:ascii="Garamond" w:hAnsi="Garamond"/>
-          <w:color w:val="000000"/>
-          <w:kern w:val="0"/>
-          <w:sz w:val="36"/>
-          <w:szCs w:val="36"/>
-          <w:shd w:fill="auto" w:val="clear"/>
-          <w:lang w:val="en-US" w:eastAsia="zh-CN" w:bidi="hi-IN"/>
-        </w:rPr>
-        <w:t>2. **A questão do tributo a César** (vv. 15-22)</w:t>
-      </w:r>
-    </w:p>
-    <w:p>
-      <w:pPr>
-        <w:pStyle w:val="Normal"/>
-        <w:jc w:val="both"/>
-        <w:rPr>
-          <w:sz w:val="36"/>
-          <w:szCs w:val="36"/>
-        </w:rPr>
-      </w:pPr>
-      <w:r>
-        <w:rPr>
-          <w:sz w:val="36"/>
-          <w:szCs w:val="36"/>
-        </w:rPr>
-      </w:r>
-    </w:p>
-    <w:p>
-      <w:pPr>
-        <w:pStyle w:val="Normal"/>
-        <w:jc w:val="both"/>
-        <w:rPr>
-          <w:sz w:val="36"/>
-          <w:szCs w:val="36"/>
-        </w:rPr>
-      </w:pPr>
-      <w:r>
-        <w:rPr>
-          <w:rFonts w:eastAsia="Times New Roman" w:cs="Times New Roman" w:ascii="Garamond" w:hAnsi="Garamond"/>
-          <w:color w:val="000000"/>
-          <w:kern w:val="0"/>
-          <w:sz w:val="36"/>
-          <w:szCs w:val="36"/>
-          <w:shd w:fill="auto" w:val="clear"/>
-          <w:lang w:val="en-US" w:eastAsia="zh-CN" w:bidi="hi-IN"/>
-        </w:rPr>
-        <w:t xml:space="preserve">   </w:t>
-      </w:r>
-      <w:r>
-        <w:rPr>
-          <w:rFonts w:eastAsia="Times New Roman" w:cs="Times New Roman" w:ascii="Garamond" w:hAnsi="Garamond"/>
-          <w:color w:val="000000"/>
-          <w:kern w:val="0"/>
-          <w:sz w:val="36"/>
-          <w:szCs w:val="36"/>
-          <w:shd w:fill="auto" w:val="clear"/>
-          <w:lang w:val="en-US" w:eastAsia="zh-CN" w:bidi="hi-IN"/>
-        </w:rPr>
-        <w:t>* Os fariseus e herodianos tentam pegá-lo em contradição sobre pagar impostos a Roma.</w:t>
-      </w:r>
-    </w:p>
-    <w:p>
-      <w:pPr>
-        <w:pStyle w:val="Normal"/>
-        <w:jc w:val="both"/>
-        <w:rPr>
-          <w:sz w:val="36"/>
-          <w:szCs w:val="36"/>
-        </w:rPr>
-      </w:pPr>
-      <w:r>
-        <w:rPr>
-          <w:rFonts w:eastAsia="Times New Roman" w:cs="Times New Roman" w:ascii="Garamond" w:hAnsi="Garamond"/>
-          <w:color w:val="000000"/>
-          <w:kern w:val="0"/>
-          <w:sz w:val="36"/>
-          <w:szCs w:val="36"/>
-          <w:shd w:fill="auto" w:val="clear"/>
-          <w:lang w:val="en-US" w:eastAsia="zh-CN" w:bidi="hi-IN"/>
-        </w:rPr>
-        <w:t xml:space="preserve">   </w:t>
-      </w:r>
-      <w:r>
-        <w:rPr>
-          <w:rFonts w:eastAsia="Times New Roman" w:cs="Times New Roman" w:ascii="Garamond" w:hAnsi="Garamond"/>
-          <w:color w:val="000000"/>
-          <w:kern w:val="0"/>
-          <w:sz w:val="36"/>
-          <w:szCs w:val="36"/>
-          <w:shd w:fill="auto" w:val="clear"/>
-          <w:lang w:val="en-US" w:eastAsia="zh-CN" w:bidi="hi-IN"/>
-        </w:rPr>
-        <w:t>* Jesus responde: *“Dai a César o que é de César e a Deus o que é de Deus”*.</w:t>
-      </w:r>
-    </w:p>
-    <w:p>
-      <w:pPr>
-        <w:pStyle w:val="Normal"/>
-        <w:jc w:val="both"/>
-        <w:rPr>
-          <w:sz w:val="36"/>
-          <w:szCs w:val="36"/>
-        </w:rPr>
-      </w:pPr>
-      <w:r>
-        <w:rPr>
-          <w:sz w:val="36"/>
-          <w:szCs w:val="36"/>
-        </w:rPr>
-      </w:r>
-    </w:p>
-    <w:p>
-      <w:pPr>
-        <w:pStyle w:val="Normal"/>
-        <w:jc w:val="both"/>
-        <w:rPr>
-          <w:sz w:val="36"/>
-          <w:szCs w:val="36"/>
-        </w:rPr>
-      </w:pPr>
-      <w:r>
-        <w:rPr>
-          <w:rFonts w:eastAsia="Times New Roman" w:cs="Times New Roman" w:ascii="Garamond" w:hAnsi="Garamond"/>
-          <w:color w:val="000000"/>
-          <w:kern w:val="0"/>
-          <w:sz w:val="36"/>
-          <w:szCs w:val="36"/>
-          <w:shd w:fill="auto" w:val="clear"/>
-          <w:lang w:val="en-US" w:eastAsia="zh-CN" w:bidi="hi-IN"/>
-        </w:rPr>
-        <w:t>3. **A questão da ressurreição** (vv. 23-33)</w:t>
-      </w:r>
-    </w:p>
-    <w:p>
-      <w:pPr>
-        <w:pStyle w:val="Normal"/>
-        <w:jc w:val="both"/>
-        <w:rPr>
-          <w:sz w:val="36"/>
-          <w:szCs w:val="36"/>
-        </w:rPr>
-      </w:pPr>
-      <w:r>
-        <w:rPr>
-          <w:sz w:val="36"/>
-          <w:szCs w:val="36"/>
-        </w:rPr>
-      </w:r>
-    </w:p>
-    <w:p>
-      <w:pPr>
-        <w:pStyle w:val="Normal"/>
-        <w:jc w:val="both"/>
-        <w:rPr>
-          <w:sz w:val="36"/>
-          <w:szCs w:val="36"/>
-        </w:rPr>
-      </w:pPr>
-      <w:r>
-        <w:rPr>
-          <w:rFonts w:eastAsia="Times New Roman" w:cs="Times New Roman" w:ascii="Garamond" w:hAnsi="Garamond"/>
-          <w:color w:val="000000"/>
-          <w:kern w:val="0"/>
-          <w:sz w:val="36"/>
-          <w:szCs w:val="36"/>
-          <w:shd w:fill="auto" w:val="clear"/>
-          <w:lang w:val="en-US" w:eastAsia="zh-CN" w:bidi="hi-IN"/>
-        </w:rPr>
-        <w:t xml:space="preserve">   </w:t>
-      </w:r>
-      <w:r>
-        <w:rPr>
-          <w:rFonts w:eastAsia="Times New Roman" w:cs="Times New Roman" w:ascii="Garamond" w:hAnsi="Garamond"/>
-          <w:color w:val="000000"/>
-          <w:kern w:val="0"/>
-          <w:sz w:val="36"/>
-          <w:szCs w:val="36"/>
-          <w:shd w:fill="auto" w:val="clear"/>
-          <w:lang w:val="en-US" w:eastAsia="zh-CN" w:bidi="hi-IN"/>
-        </w:rPr>
-        <w:t>* Os saduceus (que não acreditavam na vida após a morte) o provocam com uma questão sobre o casamento na ressurreição.</w:t>
-      </w:r>
-    </w:p>
-    <w:p>
-      <w:pPr>
-        <w:pStyle w:val="Normal"/>
-        <w:jc w:val="both"/>
-        <w:rPr>
-          <w:sz w:val="36"/>
-          <w:szCs w:val="36"/>
-        </w:rPr>
-      </w:pPr>
-      <w:r>
-        <w:rPr>
-          <w:rFonts w:eastAsia="Times New Roman" w:cs="Times New Roman" w:ascii="Garamond" w:hAnsi="Garamond"/>
-          <w:color w:val="000000"/>
-          <w:kern w:val="0"/>
-          <w:sz w:val="36"/>
-          <w:szCs w:val="36"/>
-          <w:shd w:fill="auto" w:val="clear"/>
-          <w:lang w:val="en-US" w:eastAsia="zh-CN" w:bidi="hi-IN"/>
-        </w:rPr>
-        <w:t xml:space="preserve">   </w:t>
-      </w:r>
-      <w:r>
-        <w:rPr>
-          <w:rFonts w:eastAsia="Times New Roman" w:cs="Times New Roman" w:ascii="Garamond" w:hAnsi="Garamond"/>
-          <w:color w:val="000000"/>
-          <w:kern w:val="0"/>
-          <w:sz w:val="36"/>
-          <w:szCs w:val="36"/>
-          <w:shd w:fill="auto" w:val="clear"/>
-          <w:lang w:val="en-US" w:eastAsia="zh-CN" w:bidi="hi-IN"/>
-        </w:rPr>
-        <w:t>* Jesus ensina sobre a imortalidade e a vida futura.</w:t>
-      </w:r>
-    </w:p>
-    <w:p>
-      <w:pPr>
-        <w:pStyle w:val="Normal"/>
-        <w:jc w:val="both"/>
-        <w:rPr>
-          <w:sz w:val="36"/>
-          <w:szCs w:val="36"/>
-        </w:rPr>
-      </w:pPr>
-      <w:r>
-        <w:rPr>
-          <w:sz w:val="36"/>
-          <w:szCs w:val="36"/>
-        </w:rPr>
-      </w:r>
-    </w:p>
-    <w:p>
-      <w:pPr>
-        <w:pStyle w:val="Normal"/>
-        <w:jc w:val="both"/>
-        <w:rPr>
-          <w:sz w:val="36"/>
-          <w:szCs w:val="36"/>
-        </w:rPr>
-      </w:pPr>
-      <w:r>
-        <w:rPr>
-          <w:rFonts w:eastAsia="Times New Roman" w:cs="Times New Roman" w:ascii="Garamond" w:hAnsi="Garamond"/>
-          <w:color w:val="000000"/>
-          <w:kern w:val="0"/>
-          <w:sz w:val="36"/>
-          <w:szCs w:val="36"/>
-          <w:shd w:fill="auto" w:val="clear"/>
-          <w:lang w:val="en-US" w:eastAsia="zh-CN" w:bidi="hi-IN"/>
-        </w:rPr>
-        <w:t>4. **O maior mandamento da Lei** (vv. 34-40)</w:t>
-      </w:r>
-    </w:p>
-    <w:p>
-      <w:pPr>
-        <w:pStyle w:val="Normal"/>
-        <w:jc w:val="both"/>
-        <w:rPr>
-          <w:sz w:val="36"/>
-          <w:szCs w:val="36"/>
-        </w:rPr>
-      </w:pPr>
-      <w:r>
-        <w:rPr>
-          <w:sz w:val="36"/>
-          <w:szCs w:val="36"/>
-        </w:rPr>
-      </w:r>
-    </w:p>
-    <w:p>
-      <w:pPr>
-        <w:pStyle w:val="Normal"/>
-        <w:jc w:val="both"/>
-        <w:rPr>
-          <w:sz w:val="36"/>
-          <w:szCs w:val="36"/>
-        </w:rPr>
-      </w:pPr>
-      <w:r>
-        <w:rPr>
-          <w:rFonts w:eastAsia="Times New Roman" w:cs="Times New Roman" w:ascii="Garamond" w:hAnsi="Garamond"/>
-          <w:color w:val="000000"/>
-          <w:kern w:val="0"/>
-          <w:sz w:val="36"/>
-          <w:szCs w:val="36"/>
-          <w:shd w:fill="auto" w:val="clear"/>
-          <w:lang w:val="en-US" w:eastAsia="zh-CN" w:bidi="hi-IN"/>
-        </w:rPr>
-        <w:t xml:space="preserve">   </w:t>
-      </w:r>
-      <w:r>
-        <w:rPr>
-          <w:rFonts w:eastAsia="Times New Roman" w:cs="Times New Roman" w:ascii="Garamond" w:hAnsi="Garamond"/>
-          <w:color w:val="000000"/>
-          <w:kern w:val="0"/>
-          <w:sz w:val="36"/>
-          <w:szCs w:val="36"/>
-          <w:shd w:fill="auto" w:val="clear"/>
-          <w:lang w:val="en-US" w:eastAsia="zh-CN" w:bidi="hi-IN"/>
-        </w:rPr>
-        <w:t>* Um doutor da lei pergunta a Jesus qual é o maior mandamento.</w:t>
-      </w:r>
-    </w:p>
-    <w:p>
-      <w:pPr>
-        <w:pStyle w:val="Normal"/>
-        <w:jc w:val="both"/>
-        <w:rPr>
-          <w:sz w:val="36"/>
-          <w:szCs w:val="36"/>
-        </w:rPr>
-      </w:pPr>
-      <w:r>
-        <w:rPr>
-          <w:rFonts w:eastAsia="Times New Roman" w:cs="Times New Roman" w:ascii="Garamond" w:hAnsi="Garamond"/>
-          <w:color w:val="000000"/>
-          <w:kern w:val="0"/>
-          <w:sz w:val="36"/>
-          <w:szCs w:val="36"/>
-          <w:shd w:fill="auto" w:val="clear"/>
-          <w:lang w:val="en-US" w:eastAsia="zh-CN" w:bidi="hi-IN"/>
-        </w:rPr>
-        <w:t xml:space="preserve">   </w:t>
-      </w:r>
-      <w:r>
-        <w:rPr>
-          <w:rFonts w:eastAsia="Times New Roman" w:cs="Times New Roman" w:ascii="Garamond" w:hAnsi="Garamond"/>
-          <w:color w:val="000000"/>
-          <w:kern w:val="0"/>
-          <w:sz w:val="36"/>
-          <w:szCs w:val="36"/>
-          <w:shd w:fill="auto" w:val="clear"/>
-          <w:lang w:val="en-US" w:eastAsia="zh-CN" w:bidi="hi-IN"/>
-        </w:rPr>
-        <w:t>* Ele responde: amar a Deus sobre todas as coisas e ao próximo como a si mesmo.</w:t>
-      </w:r>
-    </w:p>
-    <w:p>
-      <w:pPr>
-        <w:pStyle w:val="Normal"/>
-        <w:jc w:val="both"/>
-        <w:rPr>
-          <w:sz w:val="36"/>
-          <w:szCs w:val="36"/>
-        </w:rPr>
-      </w:pPr>
-      <w:r>
-        <w:rPr>
-          <w:sz w:val="36"/>
-          <w:szCs w:val="36"/>
-        </w:rPr>
-      </w:r>
-    </w:p>
-    <w:p>
-      <w:pPr>
-        <w:pStyle w:val="Normal"/>
-        <w:jc w:val="both"/>
-        <w:rPr>
-          <w:sz w:val="36"/>
-          <w:szCs w:val="36"/>
-        </w:rPr>
-      </w:pPr>
-      <w:r>
-        <w:rPr>
-          <w:rFonts w:eastAsia="Times New Roman" w:cs="Times New Roman" w:ascii="Garamond" w:hAnsi="Garamond"/>
-          <w:color w:val="000000"/>
-          <w:kern w:val="0"/>
-          <w:sz w:val="36"/>
-          <w:szCs w:val="36"/>
-          <w:shd w:fill="auto" w:val="clear"/>
-          <w:lang w:val="en-US" w:eastAsia="zh-CN" w:bidi="hi-IN"/>
-        </w:rPr>
-        <w:t>5. **O Cristo, filho de Davi?** (vv. 41-46)</w:t>
-      </w:r>
-    </w:p>
-    <w:p>
-      <w:pPr>
-        <w:pStyle w:val="Normal"/>
-        <w:jc w:val="both"/>
-        <w:rPr>
-          <w:sz w:val="36"/>
-          <w:szCs w:val="36"/>
-        </w:rPr>
-      </w:pPr>
-      <w:r>
-        <w:rPr>
-          <w:sz w:val="36"/>
-          <w:szCs w:val="36"/>
-        </w:rPr>
-      </w:r>
-    </w:p>
-    <w:p>
-      <w:pPr>
-        <w:pStyle w:val="Normal"/>
-        <w:jc w:val="both"/>
-        <w:rPr>
-          <w:sz w:val="36"/>
-          <w:szCs w:val="36"/>
-        </w:rPr>
-      </w:pPr>
-      <w:r>
-        <w:rPr>
-          <w:rFonts w:eastAsia="Times New Roman" w:cs="Times New Roman" w:ascii="Garamond" w:hAnsi="Garamond"/>
-          <w:color w:val="000000"/>
-          <w:kern w:val="0"/>
-          <w:sz w:val="36"/>
-          <w:szCs w:val="36"/>
-          <w:shd w:fill="auto" w:val="clear"/>
-          <w:lang w:val="en-US" w:eastAsia="zh-CN" w:bidi="hi-IN"/>
-        </w:rPr>
-        <w:t xml:space="preserve">   </w:t>
-      </w:r>
-      <w:r>
-        <w:rPr>
-          <w:rFonts w:eastAsia="Times New Roman" w:cs="Times New Roman" w:ascii="Garamond" w:hAnsi="Garamond"/>
-          <w:color w:val="000000"/>
-          <w:kern w:val="0"/>
-          <w:sz w:val="36"/>
-          <w:szCs w:val="36"/>
-          <w:shd w:fill="auto" w:val="clear"/>
-          <w:lang w:val="en-US" w:eastAsia="zh-CN" w:bidi="hi-IN"/>
-        </w:rPr>
-        <w:t>* Jesus questiona os fariseus sobre a identidade do Messias, mostrando que o Cristo não é apenas descendente humano de Davi, mas Senhor espiritual.</w:t>
-      </w:r>
-    </w:p>
-    <w:p>
-      <w:pPr>
-        <w:pStyle w:val="Normal"/>
-        <w:jc w:val="both"/>
-        <w:rPr>
-          <w:sz w:val="36"/>
-          <w:szCs w:val="36"/>
-        </w:rPr>
-      </w:pPr>
-      <w:r>
-        <w:rPr>
-          <w:sz w:val="36"/>
-          <w:szCs w:val="36"/>
-        </w:rPr>
-      </w:r>
-    </w:p>
-    <w:p>
-      <w:pPr>
-        <w:pStyle w:val="Normal"/>
-        <w:jc w:val="both"/>
-        <w:rPr>
-          <w:sz w:val="36"/>
-          <w:szCs w:val="36"/>
-        </w:rPr>
-      </w:pPr>
-      <w:r>
-        <w:rPr>
-          <w:rFonts w:eastAsia="Times New Roman" w:cs="Times New Roman" w:ascii="Garamond" w:hAnsi="Garamond"/>
-          <w:color w:val="000000"/>
-          <w:kern w:val="0"/>
-          <w:sz w:val="36"/>
-          <w:szCs w:val="36"/>
-          <w:shd w:fill="auto" w:val="clear"/>
-          <w:lang w:val="en-US" w:eastAsia="zh-CN" w:bidi="hi-IN"/>
-        </w:rPr>
-        <w:t>---</w:t>
-      </w:r>
-    </w:p>
-    <w:p>
-      <w:pPr>
-        <w:pStyle w:val="Normal"/>
-        <w:jc w:val="both"/>
-        <w:rPr>
-          <w:sz w:val="36"/>
-          <w:szCs w:val="36"/>
-        </w:rPr>
-      </w:pPr>
-      <w:r>
-        <w:rPr>
-          <w:sz w:val="36"/>
-          <w:szCs w:val="36"/>
-        </w:rPr>
-      </w:r>
-    </w:p>
-    <w:p>
-      <w:pPr>
-        <w:pStyle w:val="Normal"/>
-        <w:jc w:val="both"/>
-        <w:rPr>
-          <w:sz w:val="36"/>
-          <w:szCs w:val="36"/>
-        </w:rPr>
-      </w:pPr>
-      <w:r>
-        <w:rPr>
-          <w:rFonts w:eastAsia="Times New Roman" w:cs="Times New Roman" w:ascii="Garamond" w:hAnsi="Garamond"/>
-          <w:color w:val="000000"/>
-          <w:kern w:val="0"/>
-          <w:sz w:val="36"/>
-          <w:szCs w:val="36"/>
-          <w:shd w:fill="auto" w:val="clear"/>
-          <w:lang w:val="en-US" w:eastAsia="zh-CN" w:bidi="hi-IN"/>
-        </w:rPr>
-        <w:t>### 🌟 Tema predominante</w:t>
-      </w:r>
-    </w:p>
-    <w:p>
-      <w:pPr>
-        <w:pStyle w:val="Normal"/>
-        <w:jc w:val="both"/>
-        <w:rPr>
-          <w:sz w:val="36"/>
-          <w:szCs w:val="36"/>
-        </w:rPr>
-      </w:pPr>
-      <w:r>
-        <w:rPr>
-          <w:sz w:val="36"/>
-          <w:szCs w:val="36"/>
-        </w:rPr>
-      </w:r>
-    </w:p>
-    <w:p>
-      <w:pPr>
-        <w:pStyle w:val="Normal"/>
-        <w:jc w:val="both"/>
-        <w:rPr>
-          <w:sz w:val="36"/>
-          <w:szCs w:val="36"/>
-        </w:rPr>
-      </w:pPr>
-      <w:r>
-        <w:rPr>
-          <w:rFonts w:eastAsia="Times New Roman" w:cs="Times New Roman" w:ascii="Garamond" w:hAnsi="Garamond"/>
-          <w:color w:val="000000"/>
-          <w:kern w:val="0"/>
-          <w:sz w:val="36"/>
-          <w:szCs w:val="36"/>
-          <w:shd w:fill="auto" w:val="clear"/>
-          <w:lang w:val="en-US" w:eastAsia="zh-CN" w:bidi="hi-IN"/>
-        </w:rPr>
-        <w:t>O **tema central do capítulo 22** é a **autoridade espiritual e moral de Jesus** frente às armadilhas e questionamentos dos líderes religiosos.</w:t>
-      </w:r>
-    </w:p>
-    <w:p>
-      <w:pPr>
-        <w:pStyle w:val="Normal"/>
-        <w:jc w:val="both"/>
-        <w:rPr>
-          <w:sz w:val="36"/>
-          <w:szCs w:val="36"/>
-        </w:rPr>
-      </w:pPr>
-      <w:r>
-        <w:rPr>
-          <w:rFonts w:eastAsia="Times New Roman" w:cs="Times New Roman" w:ascii="Garamond" w:hAnsi="Garamond"/>
-          <w:color w:val="000000"/>
-          <w:kern w:val="0"/>
-          <w:sz w:val="36"/>
-          <w:szCs w:val="36"/>
-          <w:shd w:fill="auto" w:val="clear"/>
-          <w:lang w:val="en-US" w:eastAsia="zh-CN" w:bidi="hi-IN"/>
-        </w:rPr>
-        <w:t>Cada episódio mostra que:</w:t>
-      </w:r>
-    </w:p>
-    <w:p>
-      <w:pPr>
-        <w:pStyle w:val="Normal"/>
-        <w:jc w:val="both"/>
-        <w:rPr>
-          <w:sz w:val="36"/>
-          <w:szCs w:val="36"/>
-        </w:rPr>
-      </w:pPr>
-      <w:r>
-        <w:rPr>
-          <w:sz w:val="36"/>
-          <w:szCs w:val="36"/>
-        </w:rPr>
-      </w:r>
-    </w:p>
-    <w:p>
-      <w:pPr>
-        <w:pStyle w:val="Normal"/>
-        <w:jc w:val="both"/>
-        <w:rPr>
-          <w:sz w:val="36"/>
-          <w:szCs w:val="36"/>
-        </w:rPr>
-      </w:pPr>
-      <w:r>
-        <w:rPr>
-          <w:rFonts w:eastAsia="Times New Roman" w:cs="Times New Roman" w:ascii="Garamond" w:hAnsi="Garamond"/>
-          <w:color w:val="000000"/>
-          <w:kern w:val="0"/>
-          <w:sz w:val="36"/>
-          <w:szCs w:val="36"/>
-          <w:shd w:fill="auto" w:val="clear"/>
-          <w:lang w:val="en-US" w:eastAsia="zh-CN" w:bidi="hi-IN"/>
-        </w:rPr>
-        <w:t>* Os opositores buscam pegá-lo em erro, mas acabam desmascarados.</w:t>
-      </w:r>
-    </w:p>
-    <w:p>
-      <w:pPr>
-        <w:pStyle w:val="Normal"/>
-        <w:jc w:val="both"/>
-        <w:rPr>
-          <w:sz w:val="36"/>
-          <w:szCs w:val="36"/>
-        </w:rPr>
-      </w:pPr>
-      <w:r>
-        <w:rPr>
-          <w:rFonts w:eastAsia="Times New Roman" w:cs="Times New Roman" w:ascii="Garamond" w:hAnsi="Garamond"/>
-          <w:color w:val="000000"/>
-          <w:kern w:val="0"/>
-          <w:sz w:val="36"/>
-          <w:szCs w:val="36"/>
-          <w:shd w:fill="auto" w:val="clear"/>
-          <w:lang w:val="en-US" w:eastAsia="zh-CN" w:bidi="hi-IN"/>
-        </w:rPr>
-        <w:t>* Jesus revela a superioridade da **Lei do Amor** sobre a letra da lei.</w:t>
-      </w:r>
-    </w:p>
-    <w:p>
-      <w:pPr>
-        <w:pStyle w:val="Normal"/>
-        <w:jc w:val="both"/>
-        <w:rPr>
-          <w:sz w:val="36"/>
-          <w:szCs w:val="36"/>
-        </w:rPr>
-      </w:pPr>
-      <w:r>
-        <w:rPr>
-          <w:rFonts w:eastAsia="Times New Roman" w:cs="Times New Roman" w:ascii="Garamond" w:hAnsi="Garamond"/>
-          <w:color w:val="000000"/>
-          <w:kern w:val="0"/>
-          <w:sz w:val="36"/>
-          <w:szCs w:val="36"/>
-          <w:shd w:fill="auto" w:val="clear"/>
-          <w:lang w:val="en-US" w:eastAsia="zh-CN" w:bidi="hi-IN"/>
-        </w:rPr>
-        <w:t>* O clímax é justamente o **mandamento maior (vv. 37-39)**, que resume toda a Lei e os Profetas e encerra a série de disputas.</w:t>
-      </w:r>
-    </w:p>
-    <w:p>
-      <w:pPr>
-        <w:pStyle w:val="Normal"/>
-        <w:jc w:val="both"/>
-        <w:rPr>
-          <w:sz w:val="36"/>
-          <w:szCs w:val="36"/>
-        </w:rPr>
-      </w:pPr>
-      <w:r>
-        <w:rPr>
-          <w:sz w:val="36"/>
-          <w:szCs w:val="36"/>
-        </w:rPr>
-      </w:r>
-    </w:p>
-    <w:p>
-      <w:pPr>
-        <w:pStyle w:val="Normal"/>
-        <w:jc w:val="both"/>
-        <w:rPr>
-          <w:sz w:val="36"/>
-          <w:szCs w:val="36"/>
-        </w:rPr>
-      </w:pPr>
-      <w:r>
-        <w:rPr>
-          <w:rFonts w:eastAsia="Times New Roman" w:cs="Times New Roman" w:ascii="Garamond" w:hAnsi="Garamond"/>
-          <w:color w:val="000000"/>
-          <w:kern w:val="0"/>
-          <w:sz w:val="36"/>
-          <w:szCs w:val="36"/>
-          <w:shd w:fill="auto" w:val="clear"/>
-          <w:lang w:val="en-US" w:eastAsia="zh-CN" w:bidi="hi-IN"/>
-        </w:rPr>
-        <w:t xml:space="preserve">Em resumo, o capítulo inteiro mostra Jesus sendo provado — e revelando, em cada resposta, a essência do Evangelho.] </w:t>
       </w:r>
     </w:p>
     <w:p>
@@ -3954,58 +1932,7 @@
         </w:rPr>
       </w:pPr>
       <w:r>
-        <w:rPr>
-          <w:sz w:val="36"/>
-          <w:szCs w:val="36"/>
-        </w:rPr>
-      </w:r>
-    </w:p>
-    <w:p>
-      <w:pPr>
-        <w:pStyle w:val="Normal"/>
-        <w:jc w:val="both"/>
-        <w:rPr>
-          <w:sz w:val="36"/>
-          <w:szCs w:val="36"/>
-        </w:rPr>
-      </w:pPr>
-      <w:r>
-        <w:rPr>
-          <w:sz w:val="36"/>
-          <w:szCs w:val="36"/>
-        </w:rPr>
-      </w:r>
-    </w:p>
-    <w:p>
-      <w:pPr>
-        <w:pStyle w:val="Normal"/>
-        <w:jc w:val="both"/>
-        <w:rPr>
-          <w:sz w:val="36"/>
-          <w:szCs w:val="36"/>
-        </w:rPr>
-      </w:pPr>
-      <w:r>
-        <w:rPr>
-          <w:sz w:val="36"/>
-          <w:szCs w:val="36"/>
-        </w:rPr>
-      </w:r>
-    </w:p>
-    <w:p>
-      <w:pPr>
-        <w:pStyle w:val="Normal"/>
-        <w:jc w:val="both"/>
-        <w:rPr>
-          <w:sz w:val="36"/>
-          <w:szCs w:val="36"/>
-        </w:rPr>
-      </w:pPr>
-      <w:r>
-        <w:rPr>
-          <w:sz w:val="36"/>
-          <w:szCs w:val="36"/>
-        </w:rPr>
+        <w:rPr/>
       </w:r>
     </w:p>
     <w:p>
@@ -4013,10 +1940,28 @@
         <w:pStyle w:val="Normal"/>
         <w:numPr>
           <w:ilvl w:val="0"/>
-          <w:numId w:val="1"/>
-        </w:numPr>
-        <w:jc w:val="both"/>
-        <w:rPr>
+          <w:numId w:val="0"/>
+        </w:numPr>
+        <w:ind w:left="720" w:hanging="0"/>
+        <w:jc w:val="both"/>
+        <w:rPr>
+          <w:sz w:val="36"/>
+          <w:szCs w:val="36"/>
+        </w:rPr>
+      </w:pPr>
+      <w:r>
+        <w:rPr>
+          <w:sz w:val="36"/>
+          <w:szCs w:val="36"/>
+        </w:rPr>
+      </w:r>
+    </w:p>
+    <w:p>
+      <w:pPr>
+        <w:pStyle w:val="Normal"/>
+        <w:jc w:val="both"/>
+        <w:rPr>
+          <w:color w:val="00A0FC"/>
           <w:sz w:val="36"/>
           <w:szCs w:val="36"/>
         </w:rPr>
@@ -4024,168 +1969,38 @@
       <w:r>
         <w:rPr>
           <w:rFonts w:eastAsia="Times New Roman" w:cs="Times New Roman" w:ascii="Garamond" w:hAnsi="Garamond"/>
-          <w:color w:val="000000"/>
+          <w:color w:val="00A0FC"/>
           <w:kern w:val="0"/>
           <w:sz w:val="36"/>
           <w:szCs w:val="36"/>
           <w:shd w:fill="auto" w:val="clear"/>
           <w:lang w:val="en-US" w:eastAsia="zh-CN" w:bidi="hi-IN"/>
         </w:rPr>
-        <w:t>Iniciar a palestra com a passagem de Jesus crucificado, entregando João à Maria e Maria à João. Esse é o exemplo do mestre para que as criaturas se amem incondicionalmente, além dos laços consaguineos ou outros vínculos senão os da filiação divina;</w:t>
-      </w:r>
-    </w:p>
-    <w:p>
-      <w:pPr>
-        <w:pStyle w:val="Normal"/>
-        <w:numPr>
-          <w:ilvl w:val="0"/>
-          <w:numId w:val="1"/>
-        </w:numPr>
-        <w:jc w:val="both"/>
-        <w:rPr>
-          <w:sz w:val="36"/>
-          <w:szCs w:val="36"/>
-        </w:rPr>
-      </w:pPr>
-      <w:r>
-        <w:rPr>
-          <w:sz w:val="36"/>
-          <w:szCs w:val="36"/>
-        </w:rPr>
-      </w:r>
-    </w:p>
-    <w:p>
-      <w:pPr>
-        <w:pStyle w:val="Normal"/>
-        <w:numPr>
-          <w:ilvl w:val="0"/>
-          <w:numId w:val="1"/>
-        </w:numPr>
-        <w:jc w:val="both"/>
-        <w:rPr>
-          <w:sz w:val="36"/>
-          <w:szCs w:val="36"/>
-        </w:rPr>
-      </w:pPr>
-      <w:r>
-        <w:rPr>
-          <w:sz w:val="36"/>
-          <w:szCs w:val="36"/>
-        </w:rPr>
-      </w:r>
-    </w:p>
-    <w:p>
-      <w:pPr>
-        <w:pStyle w:val="Normal"/>
-        <w:numPr>
-          <w:ilvl w:val="0"/>
-          <w:numId w:val="1"/>
-        </w:numPr>
-        <w:jc w:val="both"/>
-        <w:rPr>
-          <w:sz w:val="36"/>
-          <w:szCs w:val="36"/>
-        </w:rPr>
-      </w:pPr>
+        <w:t xml:space="preserve">[ </w:t>
+      </w:r>
       <w:r>
         <w:rPr>
           <w:rFonts w:eastAsia="Times New Roman" w:cs="Times New Roman" w:ascii="Garamond" w:hAnsi="Garamond"/>
-          <w:color w:val="000000"/>
+          <w:color w:val="00A0FC"/>
           <w:kern w:val="0"/>
           <w:sz w:val="36"/>
           <w:szCs w:val="36"/>
           <w:shd w:fill="auto" w:val="clear"/>
           <w:lang w:val="en-US" w:eastAsia="zh-CN" w:bidi="hi-IN"/>
         </w:rPr>
-        <w:t>dsfas</w:t>
-      </w:r>
-    </w:p>
-    <w:p>
-      <w:pPr>
-        <w:pStyle w:val="Normal"/>
-        <w:numPr>
-          <w:ilvl w:val="0"/>
-          <w:numId w:val="1"/>
-        </w:numPr>
-        <w:jc w:val="both"/>
-        <w:rPr>
-          <w:sz w:val="36"/>
-          <w:szCs w:val="36"/>
-        </w:rPr>
-      </w:pPr>
+        <w:t>Início dos textos que falam do amor próprio de Jesus</w:t>
+      </w:r>
       <w:r>
         <w:rPr>
           <w:rFonts w:eastAsia="Times New Roman" w:cs="Times New Roman" w:ascii="Garamond" w:hAnsi="Garamond"/>
-          <w:color w:val="000000"/>
+          <w:color w:val="00A0FC"/>
           <w:kern w:val="0"/>
           <w:sz w:val="36"/>
           <w:szCs w:val="36"/>
           <w:shd w:fill="auto" w:val="clear"/>
           <w:lang w:val="en-US" w:eastAsia="zh-CN" w:bidi="hi-IN"/>
         </w:rPr>
-        <w:t>sdfasd</w:t>
-      </w:r>
-    </w:p>
-    <w:p>
-      <w:pPr>
-        <w:pStyle w:val="Normal"/>
-        <w:numPr>
-          <w:ilvl w:val="0"/>
-          <w:numId w:val="1"/>
-        </w:numPr>
-        <w:jc w:val="both"/>
-        <w:rPr>
-          <w:sz w:val="36"/>
-          <w:szCs w:val="36"/>
-        </w:rPr>
-      </w:pPr>
-      <w:r>
-        <w:rPr>
-          <w:rFonts w:eastAsia="Times New Roman" w:cs="Times New Roman" w:ascii="Garamond" w:hAnsi="Garamond"/>
-          <w:color w:val="000000"/>
-          <w:kern w:val="0"/>
-          <w:sz w:val="36"/>
-          <w:szCs w:val="36"/>
-          <w:shd w:fill="auto" w:val="clear"/>
-          <w:lang w:val="en-US" w:eastAsia="zh-CN" w:bidi="hi-IN"/>
-        </w:rPr>
-        <w:t>sdfas</w:t>
-      </w:r>
-    </w:p>
-    <w:p>
-      <w:pPr>
-        <w:pStyle w:val="Normal"/>
-        <w:numPr>
-          <w:ilvl w:val="0"/>
-          <w:numId w:val="1"/>
-        </w:numPr>
-        <w:jc w:val="both"/>
-        <w:rPr>
-          <w:sz w:val="36"/>
-          <w:szCs w:val="36"/>
-        </w:rPr>
-      </w:pPr>
-      <w:r>
-        <w:rPr>
-          <w:sz w:val="36"/>
-          <w:szCs w:val="36"/>
-        </w:rPr>
-      </w:r>
-    </w:p>
-    <w:p>
-      <w:pPr>
-        <w:pStyle w:val="Normal"/>
-        <w:jc w:val="both"/>
-        <w:rPr>
-          <w:sz w:val="36"/>
-          <w:szCs w:val="36"/>
-        </w:rPr>
-      </w:pPr>
-      <w:r>
-        <w:rPr>
-          <w:sz w:val="36"/>
-          <w:szCs w:val="36"/>
-        </w:rPr>
+        <w:t xml:space="preserve"> ]</w:t>
       </w:r>
     </w:p>
     <w:p>
@@ -5237,15 +3052,46 @@
         <w:pStyle w:val="Normal"/>
         <w:jc w:val="both"/>
         <w:rPr>
-          <w:sz w:val="36"/>
-          <w:szCs w:val="36"/>
-        </w:rPr>
-      </w:pPr>
-      <w:r>
-        <w:rPr>
-          <w:sz w:val="36"/>
-          <w:szCs w:val="36"/>
-        </w:rPr>
+          <w:color w:val="00A0FC"/>
+          <w:sz w:val="36"/>
+          <w:szCs w:val="36"/>
+        </w:rPr>
+      </w:pPr>
+      <w:r>
+        <w:rPr>
+          <w:rFonts w:eastAsia="Times New Roman" w:cs="Times New Roman" w:ascii="Garamond" w:hAnsi="Garamond"/>
+          <w:color w:val="00A0FC"/>
+          <w:kern w:val="0"/>
+          <w:sz w:val="36"/>
+          <w:szCs w:val="36"/>
+          <w:shd w:fill="auto" w:val="clear"/>
+          <w:lang w:val="en-US" w:eastAsia="zh-CN" w:bidi="hi-IN"/>
+        </w:rPr>
+        <w:t xml:space="preserve">[ </w:t>
+      </w:r>
+      <w:r>
+        <w:rPr>
+          <w:rFonts w:eastAsia="Times New Roman" w:cs="Times New Roman" w:ascii="Garamond" w:hAnsi="Garamond"/>
+          <w:color w:val="00A0FC"/>
+          <w:kern w:val="0"/>
+          <w:sz w:val="36"/>
+          <w:szCs w:val="36"/>
+          <w:shd w:fill="auto" w:val="clear"/>
+          <w:lang w:val="en-US" w:eastAsia="zh-CN" w:bidi="hi-IN"/>
+        </w:rPr>
+        <w:t>Término dos textos que falam do amor próprio de Jesus</w:t>
+      </w:r>
+      <w:r>
+        <w:rPr>
+          <w:rFonts w:eastAsia="Times New Roman" w:cs="Times New Roman" w:ascii="Garamond" w:hAnsi="Garamond"/>
+          <w:color w:val="00A0FC"/>
+          <w:kern w:val="0"/>
+          <w:sz w:val="36"/>
+          <w:szCs w:val="36"/>
+          <w:shd w:fill="auto" w:val="clear"/>
+          <w:lang w:val="en-US" w:eastAsia="zh-CN" w:bidi="hi-IN"/>
+        </w:rPr>
+        <w:t xml:space="preserve"> ]</w:t>
       </w:r>
     </w:p>
     <w:p>
@@ -7511,7 +5357,7 @@
         <w:bCs/>
         <w:rFonts w:ascii="Garamond" w:hAnsi="Garamond"/>
       </w:rPr>
-      <w:t>28</w:t>
+      <w:t>21</w:t>
     </w:r>
     <w:r>
       <w:rPr>

</xml_diff>

<commit_message>
04/11/2025 - 21:15 h
</commit_message>
<xml_diff>
--- a/O mandamento maior/O Mandamento Maior.docx
+++ b/O mandamento maior/O Mandamento Maior.docx
@@ -89,7 +89,7 @@
           <w:shd w:fill="auto" w:val="clear"/>
           <w:lang w:val="en-US" w:eastAsia="zh-CN" w:bidi="hi-IN"/>
         </w:rPr>
-        <w:t>O tema das nossas reflexões de hoje é "O mandamento maior". Vamos iniciar então lendo a passagem evangélica onde esse mandamento nos foi apresentado por Jesus. Ela encontra-se em Mateus 22:34-40:</w:t>
+        <w:t>O tema das nossas reflexões de hoje é "O mandamento maior". Vamos iniciar então lendo a passagem evangélica onde esse mandamento nos foi apresentado por Jesus. A passagem encontra-se em Mateus 22:34-40:</w:t>
       </w:r>
     </w:p>
     <w:p>
@@ -322,7 +322,7 @@
           <w:shd w:fill="auto" w:val="clear"/>
           <w:lang w:val="en-US" w:eastAsia="zh-CN" w:bidi="hi-IN"/>
         </w:rPr>
-        <w:t xml:space="preserve">Embora seja no capítulo 22 que está o tema do nosso estudo de hoje, vamos traçar um paralelo entre </w:t>
+        <w:t>N</w:t>
       </w:r>
       <w:r>
         <w:rPr>
@@ -334,7 +334,7 @@
           <w:shd w:fill="auto" w:val="clear"/>
           <w:lang w:val="en-US" w:eastAsia="zh-CN" w:bidi="hi-IN"/>
         </w:rPr>
-        <w:t xml:space="preserve">os </w:t>
+        <w:t xml:space="preserve">os capítulos 21, 22 e 23 do Evangelho de Mateus, </w:t>
       </w:r>
       <w:r>
         <w:rPr>
@@ -346,34 +346,8 @@
           <w:shd w:fill="auto" w:val="clear"/>
           <w:lang w:val="en-US" w:eastAsia="zh-CN" w:bidi="hi-IN"/>
         </w:rPr>
-        <w:t>capítulos 21, 22 e 23 do evangelho de Mateus. Isso vai nos ajudar a compreender melhor a essência do mandamento maior.</w:t>
-      </w:r>
-    </w:p>
-    <w:p>
-      <w:pPr>
-        <w:pStyle w:val="Normal"/>
-        <w:jc w:val="both"/>
-        <w:rPr>
-          <w:sz w:val="36"/>
-          <w:szCs w:val="36"/>
-        </w:rPr>
-      </w:pPr>
-      <w:r>
-        <w:rPr>
-          <w:sz w:val="36"/>
-          <w:szCs w:val="36"/>
-        </w:rPr>
-      </w:r>
-    </w:p>
-    <w:p>
-      <w:pPr>
-        <w:pStyle w:val="Normal"/>
-        <w:jc w:val="both"/>
-        <w:rPr>
-          <w:sz w:val="36"/>
-          <w:szCs w:val="36"/>
-        </w:rPr>
-      </w:pPr>
+        <w:t>percebe-se claramente um crescente</w:t>
+      </w:r>
       <w:r>
         <w:rPr>
           <w:rFonts w:eastAsia="Times New Roman" w:cs="Times New Roman" w:ascii="Garamond" w:hAnsi="Garamond"/>
@@ -384,23 +358,20 @@
           <w:shd w:fill="auto" w:val="clear"/>
           <w:lang w:val="en-US" w:eastAsia="zh-CN" w:bidi="hi-IN"/>
         </w:rPr>
-        <w:t>Esses três capítulos formam  uma espécie de “trilogia moral de transição”, onde Jesus nos convida a abandonar a  religiosidade meramente formal e externa e abraçarmos a religiosidade verdadeira vivida no amor.</w:t>
-      </w:r>
-    </w:p>
-    <w:p>
-      <w:pPr>
-        <w:pStyle w:val="Normal"/>
-        <w:jc w:val="both"/>
-        <w:rPr>
-          <w:sz w:val="36"/>
-          <w:szCs w:val="36"/>
-        </w:rPr>
-      </w:pPr>
-      <w:r>
-        <w:rPr>
-          <w:sz w:val="36"/>
-          <w:szCs w:val="36"/>
-        </w:rPr>
+        <w:t xml:space="preserve"> clima de confronto entre Jesus e as lideranças religiosas da época. </w:t>
+      </w:r>
+    </w:p>
+    <w:p>
+      <w:pPr>
+        <w:pStyle w:val="Normal"/>
+        <w:jc w:val="both"/>
+        <w:rPr>
+          <w:sz w:val="36"/>
+          <w:szCs w:val="36"/>
+        </w:rPr>
+      </w:pPr>
+      <w:r>
+        <w:rPr/>
       </w:r>
     </w:p>
     <w:p>
@@ -422,34 +393,8 @@
           <w:shd w:fill="auto" w:val="clear"/>
           <w:lang w:val="en-US" w:eastAsia="zh-CN" w:bidi="hi-IN"/>
         </w:rPr>
-        <w:t>Na cronologia do evangelho de Mateus, é exatamente no capítulo 21 que começam a ser narrados os últimos dias de vida de Jesus na Terra. Esse capítulo inicia-se com a entrada triunfante de Jesus em Jerusalém.</w:t>
-      </w:r>
-    </w:p>
-    <w:p>
-      <w:pPr>
-        <w:pStyle w:val="Normal"/>
-        <w:jc w:val="both"/>
-        <w:rPr>
-          <w:sz w:val="36"/>
-          <w:szCs w:val="36"/>
-        </w:rPr>
-      </w:pPr>
-      <w:r>
-        <w:rPr>
-          <w:sz w:val="36"/>
-          <w:szCs w:val="36"/>
-        </w:rPr>
-      </w:r>
-    </w:p>
-    <w:p>
-      <w:pPr>
-        <w:pStyle w:val="Normal"/>
-        <w:jc w:val="both"/>
-        <w:rPr>
-          <w:sz w:val="36"/>
-          <w:szCs w:val="36"/>
-        </w:rPr>
-      </w:pPr>
+        <w:t>O Mestre</w:t>
+      </w:r>
       <w:r>
         <w:rPr>
           <w:rFonts w:eastAsia="Times New Roman" w:cs="Times New Roman" w:ascii="Garamond" w:hAnsi="Garamond"/>
@@ -460,34 +405,8 @@
           <w:shd w:fill="auto" w:val="clear"/>
           <w:lang w:val="en-US" w:eastAsia="zh-CN" w:bidi="hi-IN"/>
         </w:rPr>
-        <w:t>Jesus tinha pleno conhecimento do que estava prestes a acontecer com Ele; a prisão, o julgamento, a condenação e a cruficicação. Por isso, em seus últimos dias entre os homens, Ele nos falou com tanta ênfase sobre nossa necessidade de vivermos de forma pura, simples e verdadeira, construindo tesouros para o Reino dos Céus e não para a Terra.</w:t>
-      </w:r>
-    </w:p>
-    <w:p>
-      <w:pPr>
-        <w:pStyle w:val="Normal"/>
-        <w:jc w:val="both"/>
-        <w:rPr>
-          <w:sz w:val="36"/>
-          <w:szCs w:val="36"/>
-        </w:rPr>
-      </w:pPr>
-      <w:r>
-        <w:rPr>
-          <w:sz w:val="36"/>
-          <w:szCs w:val="36"/>
-        </w:rPr>
-      </w:r>
-    </w:p>
-    <w:p>
-      <w:pPr>
-        <w:pStyle w:val="Normal"/>
-        <w:jc w:val="both"/>
-        <w:rPr>
-          <w:sz w:val="36"/>
-          <w:szCs w:val="36"/>
-        </w:rPr>
-      </w:pPr>
+        <w:t xml:space="preserve"> começa mostrando que a fé sem frutos é estéril — como a figueira que seca — e que o templo não é lugar de comércio, mas de oração</w:t>
+      </w:r>
       <w:r>
         <w:rPr>
           <w:rFonts w:eastAsia="Times New Roman" w:cs="Times New Roman" w:ascii="Garamond" w:hAnsi="Garamond"/>
@@ -498,7 +417,7 @@
           <w:shd w:fill="auto" w:val="clear"/>
           <w:lang w:val="en-US" w:eastAsia="zh-CN" w:bidi="hi-IN"/>
         </w:rPr>
-        <w:t>É</w:t>
+        <w:t xml:space="preserve"> — quando ele expulsa os vendilhões de lá</w:t>
       </w:r>
       <w:r>
         <w:rPr>
@@ -510,8 +429,31 @@
           <w:shd w:fill="auto" w:val="clear"/>
           <w:lang w:val="en-US" w:eastAsia="zh-CN" w:bidi="hi-IN"/>
         </w:rPr>
-        <w:t xml:space="preserve"> também por esse motivo que</w:t>
-      </w:r>
+        <w:t>. Em tudo isso, Jesus está denunciando a esterilidade da fé exterior e expõe o vazio de uma religião feita de ritos, vaidades e julgamentos.</w:t>
+      </w:r>
+    </w:p>
+    <w:p>
+      <w:pPr>
+        <w:pStyle w:val="Normal"/>
+        <w:jc w:val="both"/>
+        <w:rPr>
+          <w:sz w:val="36"/>
+          <w:szCs w:val="36"/>
+        </w:rPr>
+      </w:pPr>
+      <w:r>
+        <w:rPr/>
+      </w:r>
+    </w:p>
+    <w:p>
+      <w:pPr>
+        <w:pStyle w:val="Normal"/>
+        <w:jc w:val="both"/>
+        <w:rPr>
+          <w:sz w:val="36"/>
+          <w:szCs w:val="36"/>
+        </w:rPr>
+      </w:pPr>
       <w:r>
         <w:rPr>
           <w:rFonts w:eastAsia="Times New Roman" w:cs="Times New Roman" w:ascii="Garamond" w:hAnsi="Garamond"/>
@@ -522,59 +464,52 @@
           <w:shd w:fill="auto" w:val="clear"/>
           <w:lang w:val="en-US" w:eastAsia="zh-CN" w:bidi="hi-IN"/>
         </w:rPr>
-        <w:t xml:space="preserve"> encontramos nesses 3 capítulos tantos confrontos de Jesus com líderes religiosos e políticos, sobretudo os saduceus e fariseus.</w:t>
-      </w:r>
-    </w:p>
-    <w:p>
-      <w:pPr>
-        <w:pStyle w:val="Normal"/>
-        <w:jc w:val="both"/>
-        <w:rPr>
-          <w:sz w:val="36"/>
-          <w:szCs w:val="36"/>
-        </w:rPr>
-      </w:pPr>
-      <w:r>
-        <w:rPr>
-          <w:sz w:val="36"/>
-          <w:szCs w:val="36"/>
-        </w:rPr>
-      </w:r>
-    </w:p>
-    <w:p>
-      <w:pPr>
-        <w:pStyle w:val="Normal"/>
-        <w:jc w:val="both"/>
-        <w:rPr>
-          <w:u w:val="single"/>
+        <w:t>Os fariseus e saduceus tentavam colocar Jesus à prova com perguntas e armadilhas, como quem procura um erro para desqualificá-lo. Mas Ele responde sempre com sabedoria, elevando o diálogo a um nível espiritual que eles não conseguiam alcançar. Quando perguntam qual é o maior mandamento, Jesus encerra o debate com uma resposta simples e definitiva:</w:t>
+      </w:r>
+    </w:p>
+    <w:p>
+      <w:pPr>
+        <w:pStyle w:val="Normal"/>
+        <w:jc w:val="both"/>
+        <w:rPr>
+          <w:sz w:val="36"/>
+          <w:szCs w:val="36"/>
+        </w:rPr>
+      </w:pPr>
+      <w:r>
+        <w:rPr/>
+      </w:r>
+    </w:p>
+    <w:p>
+      <w:pPr>
+        <w:pStyle w:val="Normal"/>
+        <w:ind w:left="720" w:hanging="0"/>
+        <w:jc w:val="both"/>
+        <w:rPr>
+          <w:i/>
+          <w:i/>
+          <w:iCs/>
         </w:rPr>
       </w:pPr>
       <w:r>
         <w:rPr>
           <w:rFonts w:eastAsia="Times New Roman" w:cs="Times New Roman" w:ascii="Garamond" w:hAnsi="Garamond"/>
+          <w:i/>
+          <w:iCs/>
           <w:color w:val="000000"/>
           <w:kern w:val="0"/>
           <w:sz w:val="36"/>
           <w:szCs w:val="36"/>
-          <w:u w:val="single"/>
           <w:shd w:fill="auto" w:val="clear"/>
           <w:lang w:val="en-US" w:eastAsia="zh-CN" w:bidi="hi-IN"/>
         </w:rPr>
-        <w:t>Capítulo 21</w:t>
-      </w:r>
-    </w:p>
-    <w:p>
-      <w:pPr>
-        <w:pStyle w:val="Normal"/>
-        <w:jc w:val="both"/>
-        <w:rPr>
-          <w:sz w:val="36"/>
-          <w:szCs w:val="36"/>
-        </w:rPr>
-      </w:pPr>
+        <w:t>“</w:t>
+      </w:r>
       <w:r>
         <w:rPr>
           <w:rFonts w:eastAsia="Times New Roman" w:cs="Times New Roman" w:ascii="Garamond" w:hAnsi="Garamond"/>
+          <w:i/>
+          <w:iCs/>
           <w:color w:val="000000"/>
           <w:kern w:val="0"/>
           <w:sz w:val="36"/>
@@ -582,31 +517,29 @@
           <w:shd w:fill="auto" w:val="clear"/>
           <w:lang w:val="en-US" w:eastAsia="zh-CN" w:bidi="hi-IN"/>
         </w:rPr>
-        <w:t xml:space="preserve">Jesus denuncia a esterilidade da fé exterior. A figueira estéril que Jesus seca e os vendedores aos quais Jesus expulsa do Templo são símbolos da alma que aparenta religiosidade, mas não produz obras de amor. </w:t>
-      </w:r>
-    </w:p>
-    <w:p>
-      <w:pPr>
-        <w:pStyle w:val="Normal"/>
-        <w:jc w:val="both"/>
-        <w:rPr>
-          <w:sz w:val="36"/>
-          <w:szCs w:val="36"/>
-        </w:rPr>
-      </w:pPr>
-      <w:r>
-        <w:rPr>
-          <w:sz w:val="36"/>
-          <w:szCs w:val="36"/>
-        </w:rPr>
-      </w:r>
-    </w:p>
-    <w:p>
-      <w:pPr>
-        <w:pStyle w:val="Normal"/>
-        <w:jc w:val="both"/>
-        <w:rPr>
-          <w:u w:val="single"/>
+        <w:t>Amarás o Senhor teu Deus de todo o teu coração, de toda a tua alma e de todo o teu entendimento. E amarás o teu próximo como a ti mesmo.”</w:t>
+      </w:r>
+    </w:p>
+    <w:p>
+      <w:pPr>
+        <w:pStyle w:val="Normal"/>
+        <w:jc w:val="both"/>
+        <w:rPr>
+          <w:sz w:val="36"/>
+          <w:szCs w:val="36"/>
+        </w:rPr>
+      </w:pPr>
+      <w:r>
+        <w:rPr/>
+      </w:r>
+    </w:p>
+    <w:p>
+      <w:pPr>
+        <w:pStyle w:val="Normal"/>
+        <w:jc w:val="both"/>
+        <w:rPr>
+          <w:sz w:val="36"/>
+          <w:szCs w:val="36"/>
         </w:rPr>
       </w:pPr>
       <w:r>
@@ -616,25 +549,41 @@
           <w:kern w:val="0"/>
           <w:sz w:val="36"/>
           <w:szCs w:val="36"/>
-          <w:u w:val="single"/>
           <w:shd w:fill="auto" w:val="clear"/>
           <w:lang w:val="en-US" w:eastAsia="zh-CN" w:bidi="hi-IN"/>
         </w:rPr>
-        <w:t>Capítulo 22</w:t>
-      </w:r>
-    </w:p>
-    <w:p>
-      <w:pPr>
-        <w:pStyle w:val="Normal"/>
-        <w:jc w:val="both"/>
-        <w:rPr>
-          <w:sz w:val="36"/>
-          <w:szCs w:val="36"/>
+        <w:t xml:space="preserve">É como se Ele dissesse: </w:t>
+      </w:r>
+    </w:p>
+    <w:p>
+      <w:pPr>
+        <w:pStyle w:val="Normal"/>
+        <w:jc w:val="both"/>
+        <w:rPr>
+          <w:sz w:val="36"/>
+          <w:szCs w:val="36"/>
+        </w:rPr>
+      </w:pPr>
+      <w:r>
+        <w:rPr/>
+      </w:r>
+    </w:p>
+    <w:p>
+      <w:pPr>
+        <w:pStyle w:val="Normal"/>
+        <w:ind w:left="720" w:hanging="0"/>
+        <w:jc w:val="both"/>
+        <w:rPr>
+          <w:i/>
+          <w:i/>
+          <w:iCs/>
         </w:rPr>
       </w:pPr>
       <w:r>
         <w:rPr>
           <w:rFonts w:eastAsia="Times New Roman" w:cs="Times New Roman" w:ascii="Garamond" w:hAnsi="Garamond"/>
+          <w:i/>
+          <w:iCs/>
           <w:color w:val="000000"/>
           <w:kern w:val="0"/>
           <w:sz w:val="36"/>
@@ -642,43 +591,27 @@
           <w:shd w:fill="auto" w:val="clear"/>
           <w:lang w:val="en-US" w:eastAsia="zh-CN" w:bidi="hi-IN"/>
         </w:rPr>
-        <w:t xml:space="preserve">Jesus censurou a religiosidade superficial de saduceus e fariseus. Aos primeiros, por reduzirem a fé a rituais e negarem a vida espiritual; aos segundos, por transformarem a Lei em instrumento de vaidade e julgamento. Em ambos, Ele revelou o mesmo erro: a distância entre a aparência e o coração. </w:t>
-      </w:r>
-    </w:p>
-    <w:p>
-      <w:pPr>
-        <w:pStyle w:val="Normal"/>
-        <w:jc w:val="both"/>
-        <w:rPr>
-          <w:u w:val="single"/>
-        </w:rPr>
-      </w:pPr>
+        <w:t>"</w:t>
+      </w:r>
       <w:r>
         <w:rPr>
           <w:rFonts w:eastAsia="Times New Roman" w:cs="Times New Roman" w:ascii="Garamond" w:hAnsi="Garamond"/>
+          <w:i/>
+          <w:iCs/>
           <w:color w:val="000000"/>
           <w:kern w:val="0"/>
           <w:sz w:val="36"/>
           <w:szCs w:val="36"/>
-          <w:u w:val="single"/>
           <w:shd w:fill="auto" w:val="clear"/>
           <w:lang w:val="en-US" w:eastAsia="zh-CN" w:bidi="hi-IN"/>
         </w:rPr>
-        <w:t>Capítulo 23</w:t>
-      </w:r>
-    </w:p>
-    <w:p>
-      <w:pPr>
-        <w:pStyle w:val="Normal"/>
-        <w:jc w:val="both"/>
-        <w:rPr>
-          <w:sz w:val="36"/>
-          <w:szCs w:val="36"/>
-        </w:rPr>
-      </w:pPr>
+        <w:t>Já que procura</w:t>
+      </w:r>
       <w:r>
         <w:rPr>
           <w:rFonts w:eastAsia="Times New Roman" w:cs="Times New Roman" w:ascii="Garamond" w:hAnsi="Garamond"/>
+          <w:i/>
+          <w:iCs/>
           <w:color w:val="000000"/>
           <w:kern w:val="0"/>
           <w:sz w:val="36"/>
@@ -686,37 +619,13 @@
           <w:shd w:fill="auto" w:val="clear"/>
           <w:lang w:val="en-US" w:eastAsia="zh-CN" w:bidi="hi-IN"/>
         </w:rPr>
-        <w:t>Jesus faz o juízo moral e convoca à sinceridade do coração. Aos escribas e fariseus, denuncia a hipocrisia e alerta sobre o perigo de servir às aparências. Seu lamento sobre Jerusalém é um convite à humanidade inteira: abrir o coração para o amor e para a verdade.</w:t>
-      </w:r>
-    </w:p>
-    <w:p>
-      <w:pPr>
-        <w:pStyle w:val="Normal"/>
-        <w:jc w:val="both"/>
-        <w:rPr>
-          <w:sz w:val="36"/>
-          <w:szCs w:val="36"/>
-        </w:rPr>
-      </w:pPr>
-      <w:r>
-        <w:rPr>
-          <w:sz w:val="36"/>
-          <w:szCs w:val="36"/>
-        </w:rPr>
-      </w:r>
-    </w:p>
-    <w:p>
-      <w:pPr>
-        <w:pStyle w:val="Normal"/>
-        <w:jc w:val="both"/>
-        <w:rPr>
-          <w:sz w:val="36"/>
-          <w:szCs w:val="36"/>
-        </w:rPr>
-      </w:pPr>
+        <w:t>ram</w:t>
+      </w:r>
       <w:r>
         <w:rPr>
           <w:rFonts w:eastAsia="Times New Roman" w:cs="Times New Roman" w:ascii="Garamond" w:hAnsi="Garamond"/>
+          <w:i/>
+          <w:iCs/>
           <w:color w:val="000000"/>
           <w:kern w:val="0"/>
           <w:sz w:val="36"/>
@@ -724,11 +633,13 @@
           <w:shd w:fill="auto" w:val="clear"/>
           <w:lang w:val="en-US" w:eastAsia="zh-CN" w:bidi="hi-IN"/>
         </w:rPr>
-        <w:t xml:space="preserve">Embora Jesus tenha confrontado tanto os saduceus quanto os fariseus, </w:t>
+        <w:t xml:space="preserve"> atalhos e justificativas para não </w:t>
       </w:r>
       <w:r>
         <w:rPr>
           <w:rFonts w:eastAsia="Times New Roman" w:cs="Times New Roman" w:ascii="Garamond" w:hAnsi="Garamond"/>
+          <w:i/>
+          <w:iCs/>
           <w:color w:val="000000"/>
           <w:kern w:val="0"/>
           <w:sz w:val="36"/>
@@ -736,11 +647,13 @@
           <w:shd w:fill="auto" w:val="clear"/>
           <w:lang w:val="en-US" w:eastAsia="zh-CN" w:bidi="hi-IN"/>
         </w:rPr>
-        <w:t>cabe fazer uma distinção entre eles</w:t>
+        <w:t xml:space="preserve">se </w:t>
       </w:r>
       <w:r>
         <w:rPr>
           <w:rFonts w:eastAsia="Times New Roman" w:cs="Times New Roman" w:ascii="Garamond" w:hAnsi="Garamond"/>
+          <w:i/>
+          <w:iCs/>
           <w:color w:val="000000"/>
           <w:kern w:val="0"/>
           <w:sz w:val="36"/>
@@ -748,37 +661,13 @@
           <w:shd w:fill="auto" w:val="clear"/>
           <w:lang w:val="en-US" w:eastAsia="zh-CN" w:bidi="hi-IN"/>
         </w:rPr>
-        <w:t xml:space="preserve">. </w:t>
-      </w:r>
-    </w:p>
-    <w:p>
-      <w:pPr>
-        <w:pStyle w:val="Normal"/>
-        <w:jc w:val="both"/>
-        <w:rPr>
-          <w:sz w:val="36"/>
-          <w:szCs w:val="36"/>
-        </w:rPr>
-      </w:pPr>
-      <w:r>
-        <w:rPr>
-          <w:sz w:val="36"/>
-          <w:szCs w:val="36"/>
-        </w:rPr>
-      </w:r>
-    </w:p>
-    <w:p>
-      <w:pPr>
-        <w:pStyle w:val="Normal"/>
-        <w:jc w:val="both"/>
-        <w:rPr>
-          <w:sz w:val="36"/>
-          <w:szCs w:val="36"/>
-        </w:rPr>
-      </w:pPr>
+        <w:t>transformar</w:t>
+      </w:r>
       <w:r>
         <w:rPr>
           <w:rFonts w:eastAsia="Times New Roman" w:cs="Times New Roman" w:ascii="Garamond" w:hAnsi="Garamond"/>
+          <w:i/>
+          <w:iCs/>
           <w:color w:val="000000"/>
           <w:kern w:val="0"/>
           <w:sz w:val="36"/>
@@ -786,11 +675,13 @@
           <w:shd w:fill="auto" w:val="clear"/>
           <w:lang w:val="en-US" w:eastAsia="zh-CN" w:bidi="hi-IN"/>
         </w:rPr>
-        <w:t xml:space="preserve">Os saduceus formavam um grupo de grande influência política e econômica, composto em sua maioria por sacerdotes e membros da elite de Jerusalém. </w:t>
+        <w:t>em</w:t>
       </w:r>
       <w:r>
         <w:rPr>
           <w:rFonts w:eastAsia="Times New Roman" w:cs="Times New Roman" w:ascii="Garamond" w:hAnsi="Garamond"/>
+          <w:i/>
+          <w:iCs/>
           <w:color w:val="000000"/>
           <w:kern w:val="0"/>
           <w:sz w:val="36"/>
@@ -798,34 +689,13 @@
           <w:shd w:fill="auto" w:val="clear"/>
           <w:lang w:val="en-US" w:eastAsia="zh-CN" w:bidi="hi-IN"/>
         </w:rPr>
-        <w:t xml:space="preserve">Acreditavam somente na Torá, ou seja, os 5 primeiros livros da Bíblia que contém a Lei Mosaica. </w:t>
-      </w:r>
-    </w:p>
-    <w:p>
-      <w:pPr>
-        <w:pStyle w:val="Normal"/>
-        <w:jc w:val="both"/>
-        <w:rPr>
-          <w:sz w:val="36"/>
-          <w:szCs w:val="36"/>
-        </w:rPr>
-      </w:pPr>
-      <w:r>
-        <w:rPr/>
-      </w:r>
-    </w:p>
-    <w:p>
-      <w:pPr>
-        <w:pStyle w:val="Normal"/>
-        <w:jc w:val="both"/>
-        <w:rPr>
-          <w:sz w:val="36"/>
-          <w:szCs w:val="36"/>
-        </w:rPr>
-      </w:pPr>
+        <w:t>, deixo</w:t>
+      </w:r>
       <w:r>
         <w:rPr>
           <w:rFonts w:eastAsia="Times New Roman" w:cs="Times New Roman" w:ascii="Garamond" w:hAnsi="Garamond"/>
+          <w:i/>
+          <w:iCs/>
           <w:color w:val="000000"/>
           <w:kern w:val="0"/>
           <w:sz w:val="36"/>
@@ -833,11 +703,13 @@
           <w:shd w:fill="auto" w:val="clear"/>
           <w:lang w:val="en-US" w:eastAsia="zh-CN" w:bidi="hi-IN"/>
         </w:rPr>
-        <w:t>Os saduceus n</w:t>
+        <w:t xml:space="preserve"> a vocês</w:t>
       </w:r>
       <w:r>
         <w:rPr>
           <w:rFonts w:eastAsia="Times New Roman" w:cs="Times New Roman" w:ascii="Garamond" w:hAnsi="Garamond"/>
+          <w:i/>
+          <w:iCs/>
           <w:color w:val="000000"/>
           <w:kern w:val="0"/>
           <w:sz w:val="36"/>
@@ -845,11 +717,13 @@
           <w:shd w:fill="auto" w:val="clear"/>
           <w:lang w:val="en-US" w:eastAsia="zh-CN" w:bidi="hi-IN"/>
         </w:rPr>
-        <w:t>egavam a imortalidade da alma, a existência dos espíritos e a vida após a morte</w:t>
+        <w:t xml:space="preserve"> um caminho do qual não poderã</w:t>
       </w:r>
       <w:r>
         <w:rPr>
           <w:rFonts w:eastAsia="Times New Roman" w:cs="Times New Roman" w:ascii="Garamond" w:hAnsi="Garamond"/>
+          <w:i/>
+          <w:iCs/>
           <w:color w:val="000000"/>
           <w:kern w:val="0"/>
           <w:sz w:val="36"/>
@@ -857,11 +731,13 @@
           <w:shd w:fill="auto" w:val="clear"/>
           <w:lang w:val="en-US" w:eastAsia="zh-CN" w:bidi="hi-IN"/>
         </w:rPr>
-        <w:t>. Para eles, toda recompensa divina era dada aqui mesmo na vida terrena.</w:t>
+        <w:t>o</w:t>
       </w:r>
       <w:r>
         <w:rPr>
           <w:rFonts w:eastAsia="Times New Roman" w:cs="Times New Roman" w:ascii="Garamond" w:hAnsi="Garamond"/>
+          <w:i/>
+          <w:iCs/>
           <w:color w:val="000000"/>
           <w:kern w:val="0"/>
           <w:sz w:val="36"/>
@@ -869,8 +745,31 @@
           <w:shd w:fill="auto" w:val="clear"/>
           <w:lang w:val="en-US" w:eastAsia="zh-CN" w:bidi="hi-IN"/>
         </w:rPr>
-        <w:t xml:space="preserve"> </w:t>
-      </w:r>
+        <w:t xml:space="preserve"> fingir desconhecimento.”</w:t>
+      </w:r>
+    </w:p>
+    <w:p>
+      <w:pPr>
+        <w:pStyle w:val="Normal"/>
+        <w:jc w:val="both"/>
+        <w:rPr>
+          <w:sz w:val="36"/>
+          <w:szCs w:val="36"/>
+        </w:rPr>
+      </w:pPr>
+      <w:r>
+        <w:rPr/>
+      </w:r>
+    </w:p>
+    <w:p>
+      <w:pPr>
+        <w:pStyle w:val="Normal"/>
+        <w:jc w:val="both"/>
+        <w:rPr>
+          <w:sz w:val="36"/>
+          <w:szCs w:val="36"/>
+        </w:rPr>
+      </w:pPr>
       <w:r>
         <w:rPr>
           <w:rFonts w:eastAsia="Times New Roman" w:cs="Times New Roman" w:ascii="Garamond" w:hAnsi="Garamond"/>
@@ -881,7 +780,7 @@
           <w:shd w:fill="auto" w:val="clear"/>
           <w:lang w:val="en-US" w:eastAsia="zh-CN" w:bidi="hi-IN"/>
         </w:rPr>
-        <w:t>E</w:t>
+        <w:t>Com isso, Jesus dissolve a hipocrisia e expõe a superficialidade da religião exterior.</w:t>
       </w:r>
       <w:r>
         <w:rPr>
@@ -893,7 +792,7 @@
           <w:shd w:fill="auto" w:val="clear"/>
           <w:lang w:val="en-US" w:eastAsia="zh-CN" w:bidi="hi-IN"/>
         </w:rPr>
-        <w:t>r</w:t>
+        <w:t xml:space="preserve"> </w:t>
       </w:r>
       <w:r>
         <w:rPr>
@@ -905,8 +804,31 @@
           <w:shd w:fill="auto" w:val="clear"/>
           <w:lang w:val="en-US" w:eastAsia="zh-CN" w:bidi="hi-IN"/>
         </w:rPr>
-        <w:t>am a expressão d</w:t>
-      </w:r>
+        <w:t xml:space="preserve">Amar é mais do que sentir: é agir com verdade, com humildade, com compaixão. </w:t>
+      </w:r>
+    </w:p>
+    <w:p>
+      <w:pPr>
+        <w:pStyle w:val="Normal"/>
+        <w:jc w:val="both"/>
+        <w:rPr>
+          <w:sz w:val="36"/>
+          <w:szCs w:val="36"/>
+        </w:rPr>
+      </w:pPr>
+      <w:r>
+        <w:rPr/>
+      </w:r>
+    </w:p>
+    <w:p>
+      <w:pPr>
+        <w:pStyle w:val="Normal"/>
+        <w:jc w:val="both"/>
+        <w:rPr>
+          <w:sz w:val="36"/>
+          <w:szCs w:val="36"/>
+        </w:rPr>
+      </w:pPr>
       <w:r>
         <w:rPr>
           <w:rFonts w:eastAsia="Times New Roman" w:cs="Times New Roman" w:ascii="Garamond" w:hAnsi="Garamond"/>
@@ -917,23 +839,20 @@
           <w:shd w:fill="auto" w:val="clear"/>
           <w:lang w:val="en-US" w:eastAsia="zh-CN" w:bidi="hi-IN"/>
         </w:rPr>
-        <w:t>a religiosidade do poder e da aparência externa.</w:t>
-      </w:r>
-    </w:p>
-    <w:p>
-      <w:pPr>
-        <w:pStyle w:val="Normal"/>
-        <w:jc w:val="both"/>
-        <w:rPr>
-          <w:sz w:val="36"/>
-          <w:szCs w:val="36"/>
-        </w:rPr>
-      </w:pPr>
-      <w:r>
-        <w:rPr>
-          <w:sz w:val="36"/>
-          <w:szCs w:val="36"/>
-        </w:rPr>
+        <w:t xml:space="preserve">Esse mandamento é o resumo de tudo o que Jesus vinha ensinando. Quando o amor está no centro, não há espaço para a hipocrisia, para a vaidade espiritual ou para a religião de aparências. </w:t>
+      </w:r>
+    </w:p>
+    <w:p>
+      <w:pPr>
+        <w:pStyle w:val="Normal"/>
+        <w:jc w:val="both"/>
+        <w:rPr>
+          <w:sz w:val="36"/>
+          <w:szCs w:val="36"/>
+        </w:rPr>
+      </w:pPr>
+      <w:r>
+        <w:rPr/>
       </w:r>
     </w:p>
     <w:p>
@@ -955,7 +874,7 @@
           <w:shd w:fill="auto" w:val="clear"/>
           <w:lang w:val="en-US" w:eastAsia="zh-CN" w:bidi="hi-IN"/>
         </w:rPr>
-        <w:t xml:space="preserve">Os fariseus, por sua vez, eram religiosos dedicados ao estudo e à prática rigorosa da Lei. Valorizavam não apenas a Torá, mas também as tradições orais que a explicavam. Acreditavam na imortalidade da alma e na vida futura, o que os aproximava mais das verdades espirituais. </w:t>
+        <w:t>E é por isso que o mandamento maior continua sendo, até hoje, o ponto mais alto do Evangelho: a fé verdadeira não é feita de aparência, mas de amor vivido, simples e profundo.</w:t>
       </w:r>
     </w:p>
     <w:p>
@@ -969,153 +888,6 @@
       </w:pPr>
       <w:r>
         <w:rPr/>
-      </w:r>
-    </w:p>
-    <w:p>
-      <w:pPr>
-        <w:pStyle w:val="Normal"/>
-        <w:jc w:val="both"/>
-        <w:rPr>
-          <w:sz w:val="36"/>
-          <w:szCs w:val="36"/>
-        </w:rPr>
-      </w:pPr>
-      <w:r>
-        <w:rPr>
-          <w:rFonts w:eastAsia="Times New Roman" w:cs="Times New Roman" w:ascii="Garamond" w:hAnsi="Garamond"/>
-          <w:color w:val="000000"/>
-          <w:kern w:val="0"/>
-          <w:sz w:val="36"/>
-          <w:szCs w:val="36"/>
-          <w:shd w:fill="auto" w:val="clear"/>
-          <w:lang w:val="en-US" w:eastAsia="zh-CN" w:bidi="hi-IN"/>
-        </w:rPr>
-        <w:t xml:space="preserve">Eles simbolizavam a religiosidade sem vida interior, preocupada com moral, doutrina e cumprimento rigoroso da Lei, mas marcada por orgulho e vaidade espiritual. </w:t>
-      </w:r>
-    </w:p>
-    <w:p>
-      <w:pPr>
-        <w:pStyle w:val="Normal"/>
-        <w:jc w:val="both"/>
-        <w:rPr>
-          <w:sz w:val="36"/>
-          <w:szCs w:val="36"/>
-        </w:rPr>
-      </w:pPr>
-      <w:r>
-        <w:rPr>
-          <w:sz w:val="36"/>
-          <w:szCs w:val="36"/>
-        </w:rPr>
-      </w:r>
-    </w:p>
-    <w:p>
-      <w:pPr>
-        <w:pStyle w:val="Normal"/>
-        <w:jc w:val="both"/>
-        <w:rPr/>
-      </w:pPr>
-      <w:r>
-        <w:rPr>
-          <w:rFonts w:eastAsia="Times New Roman" w:cs="Times New Roman" w:ascii="Garamond" w:hAnsi="Garamond"/>
-          <w:color w:val="000000"/>
-          <w:kern w:val="0"/>
-          <w:sz w:val="36"/>
-          <w:szCs w:val="36"/>
-          <w:shd w:fill="auto" w:val="clear"/>
-          <w:lang w:val="en-US" w:eastAsia="zh-CN" w:bidi="hi-IN"/>
-        </w:rPr>
-        <w:t>Jesus entra em confronto mais direto com quem está mais perto da verdade, mas a vive de forma distorcida. Os saduceus, por negarem a ressurreição, os anjos e a vida futura, estavam tão distantes da dimensão espiritual que o diálogo com eles tinha pouco espaço — Jesus os corrige, mas não trava com eles o mesmo tipo de debate moral e espiritual que tem com os fariseus.</w:t>
-      </w:r>
-    </w:p>
-    <w:p>
-      <w:pPr>
-        <w:pStyle w:val="Normal"/>
-        <w:jc w:val="both"/>
-        <w:rPr>
-          <w:rFonts w:ascii="Garamond" w:hAnsi="Garamond" w:eastAsia="Times New Roman" w:cs="Times New Roman"/>
-          <w:color w:val="000000"/>
-          <w:kern w:val="0"/>
-          <w:sz w:val="36"/>
-          <w:szCs w:val="36"/>
-          <w:shd w:fill="auto" w:val="clear"/>
-          <w:lang w:val="en-US" w:eastAsia="zh-CN" w:bidi="hi-IN"/>
-        </w:rPr>
-      </w:pPr>
-      <w:r>
-        <w:rPr>
-          <w:rFonts w:eastAsia="Times New Roman" w:cs="Times New Roman" w:ascii="Garamond" w:hAnsi="Garamond"/>
-          <w:color w:val="000000"/>
-          <w:kern w:val="0"/>
-          <w:sz w:val="36"/>
-          <w:szCs w:val="36"/>
-          <w:shd w:fill="auto" w:val="clear"/>
-          <w:lang w:val="en-US" w:eastAsia="zh-CN" w:bidi="hi-IN"/>
-        </w:rPr>
-      </w:r>
-    </w:p>
-    <w:p>
-      <w:pPr>
-        <w:pStyle w:val="Normal"/>
-        <w:jc w:val="both"/>
-        <w:rPr>
-          <w:sz w:val="36"/>
-          <w:szCs w:val="36"/>
-        </w:rPr>
-      </w:pPr>
-      <w:r>
-        <w:rPr>
-          <w:rFonts w:eastAsia="Times New Roman" w:cs="Times New Roman" w:ascii="Garamond" w:hAnsi="Garamond"/>
-          <w:color w:val="000000"/>
-          <w:kern w:val="0"/>
-          <w:sz w:val="36"/>
-          <w:szCs w:val="36"/>
-          <w:shd w:fill="auto" w:val="clear"/>
-          <w:lang w:val="en-US" w:eastAsia="zh-CN" w:bidi="hi-IN"/>
-        </w:rPr>
-        <w:t>Já os fariseus, por outro lado, estavam dentro do mesmo universo de fé que Jesus. O problema era que transformaram a fé em formalismo e hipocrisia, perdendo o coração do ensinamento que professavam. Por isso, Jesus os confronta com mais veemência: eles sabiam mais, mas viviam menos.</w:t>
-      </w:r>
-    </w:p>
-    <w:p>
-      <w:pPr>
-        <w:pStyle w:val="Normal"/>
-        <w:jc w:val="both"/>
-        <w:rPr>
-          <w:sz w:val="36"/>
-          <w:szCs w:val="36"/>
-        </w:rPr>
-      </w:pPr>
-      <w:r>
-        <w:rPr/>
-      </w:r>
-    </w:p>
-    <w:p>
-      <w:pPr>
-        <w:pStyle w:val="Normal"/>
-        <w:jc w:val="both"/>
-        <w:rPr>
-          <w:sz w:val="36"/>
-          <w:szCs w:val="36"/>
-        </w:rPr>
-      </w:pPr>
-      <w:r>
-        <w:rPr/>
-      </w:r>
-    </w:p>
-    <w:p>
-      <w:pPr>
-        <w:pStyle w:val="Normal"/>
-        <w:jc w:val="both"/>
-        <w:rPr>
-          <w:sz w:val="36"/>
-          <w:szCs w:val="36"/>
-        </w:rPr>
-      </w:pPr>
-      <w:r>
-        <w:rPr>
-          <w:sz w:val="36"/>
-          <w:szCs w:val="36"/>
-        </w:rPr>
       </w:r>
     </w:p>
     <w:p>
@@ -1172,6 +944,20 @@
       </w:pPr>
       <w:r>
         <w:rPr>
+          <w:color w:val="000000"/>
+        </w:rPr>
+      </w:r>
+    </w:p>
+    <w:p>
+      <w:pPr>
+        <w:pStyle w:val="Normal"/>
+        <w:jc w:val="both"/>
+        <w:rPr>
+          <w:color w:val="000000"/>
+        </w:rPr>
+      </w:pPr>
+      <w:r>
+        <w:rPr>
           <w:rFonts w:eastAsia="Times New Roman" w:cs="Times New Roman" w:ascii="Garamond" w:hAnsi="Garamond"/>
           <w:color w:val="000000"/>
           <w:kern w:val="0"/>
@@ -1684,7 +1470,7 @@
           <w:shd w:fill="auto" w:val="clear"/>
           <w:lang w:val="en-US" w:eastAsia="zh-CN" w:bidi="hi-IN"/>
         </w:rPr>
-        <w:t xml:space="preserve">Portanto, por mais estranheza, tristeza e até mesmo uma certa revolta que essas situações nos causem, com a fé raciocinada entendemos que todas as coisas estão sob o controle e de acordo com a vontade de Deus. Nós é que ainda somos incapazes de compreender os desígnios de Deus. </w:t>
+        <w:t xml:space="preserve">Portanto, por mais estranheza, tristeza e até mesmo uma certa revolta que essas situações nos causem, com a fé raciocinada entendemos que todas as coisas estão sob o controle e de acordo com a vontade de Deus. Nós é que ainda somos incapazes de compreender os desígnios do Pai. </w:t>
       </w:r>
     </w:p>
     <w:p>
@@ -1776,7 +1562,7 @@
         <w:pStyle w:val="Normal"/>
         <w:numPr>
           <w:ilvl w:val="0"/>
-          <w:numId w:val="10"/>
+          <w:numId w:val="9"/>
         </w:numPr>
         <w:jc w:val="both"/>
         <w:rPr>
@@ -1801,7 +1587,7 @@
         <w:pStyle w:val="Normal"/>
         <w:numPr>
           <w:ilvl w:val="0"/>
-          <w:numId w:val="10"/>
+          <w:numId w:val="9"/>
         </w:numPr>
         <w:jc w:val="both"/>
         <w:rPr>
@@ -1826,7 +1612,7 @@
         <w:pStyle w:val="Normal"/>
         <w:numPr>
           <w:ilvl w:val="0"/>
-          <w:numId w:val="10"/>
+          <w:numId w:val="9"/>
         </w:numPr>
         <w:jc w:val="both"/>
         <w:rPr>
@@ -1843,7 +1629,7 @@
           <w:shd w:fill="auto" w:val="clear"/>
           <w:lang w:val="en-US" w:eastAsia="zh-CN" w:bidi="hi-IN"/>
         </w:rPr>
-        <w:t xml:space="preserve">Amar de todo o pensamento é exercitar a fé raciocinada, reconhecendo a grandeza de Deus pela inteligência e pela observação de Suas leis. </w:t>
+        <w:t xml:space="preserve">Amar de todo o pensamento é exercitar a fé raciocinada, reconhecendo a grandeza de Deus através da inteligência e pela observação de Suas leis. </w:t>
       </w:r>
     </w:p>
     <w:p>
@@ -1919,53 +1705,8 @@
           <w:shd w:fill="auto" w:val="clear"/>
           <w:lang w:val="en-US" w:eastAsia="zh-CN" w:bidi="hi-IN"/>
         </w:rPr>
-        <w:t>[ Término - Tópico 1 ]</w:t>
-      </w:r>
-    </w:p>
-    <w:p>
-      <w:pPr>
-        <w:pStyle w:val="Normal"/>
-        <w:jc w:val="both"/>
-        <w:rPr>
-          <w:sz w:val="36"/>
-          <w:szCs w:val="36"/>
-        </w:rPr>
-      </w:pPr>
-      <w:r>
-        <w:rPr/>
-      </w:r>
-    </w:p>
-    <w:p>
-      <w:pPr>
-        <w:pStyle w:val="Normal"/>
-        <w:numPr>
-          <w:ilvl w:val="0"/>
-          <w:numId w:val="0"/>
-        </w:numPr>
-        <w:ind w:left="720" w:hanging="0"/>
-        <w:jc w:val="both"/>
-        <w:rPr>
-          <w:sz w:val="36"/>
-          <w:szCs w:val="36"/>
-        </w:rPr>
-      </w:pPr>
-      <w:r>
-        <w:rPr>
-          <w:sz w:val="36"/>
-          <w:szCs w:val="36"/>
-        </w:rPr>
-      </w:r>
-    </w:p>
-    <w:p>
-      <w:pPr>
-        <w:pStyle w:val="Normal"/>
-        <w:jc w:val="both"/>
-        <w:rPr>
-          <w:color w:val="00A0FC"/>
-          <w:sz w:val="36"/>
-          <w:szCs w:val="36"/>
-        </w:rPr>
-      </w:pPr>
+        <w:t xml:space="preserve">[ </w:t>
+      </w:r>
       <w:r>
         <w:rPr>
           <w:rFonts w:eastAsia="Times New Roman" w:cs="Times New Roman" w:ascii="Garamond" w:hAnsi="Garamond"/>
@@ -1976,7 +1717,7 @@
           <w:shd w:fill="auto" w:val="clear"/>
           <w:lang w:val="en-US" w:eastAsia="zh-CN" w:bidi="hi-IN"/>
         </w:rPr>
-        <w:t xml:space="preserve">[ </w:t>
+        <w:t>Até esse ponto está OK</w:t>
       </w:r>
       <w:r>
         <w:rPr>
@@ -1988,8 +1729,37 @@
           <w:shd w:fill="auto" w:val="clear"/>
           <w:lang w:val="en-US" w:eastAsia="zh-CN" w:bidi="hi-IN"/>
         </w:rPr>
-        <w:t>Início dos textos que falam do amor próprio de Jesus</w:t>
-      </w:r>
+        <w:t xml:space="preserve"> ]</w:t>
+      </w:r>
+    </w:p>
+    <w:p>
+      <w:pPr>
+        <w:pStyle w:val="Normal"/>
+        <w:jc w:val="both"/>
+        <w:rPr>
+          <w:color w:val="00A0FC"/>
+          <w:sz w:val="36"/>
+          <w:szCs w:val="36"/>
+        </w:rPr>
+      </w:pPr>
+      <w:r>
+        <w:rPr>
+          <w:color w:val="00A0FC"/>
+          <w:sz w:val="36"/>
+          <w:szCs w:val="36"/>
+        </w:rPr>
+      </w:r>
+    </w:p>
+    <w:p>
+      <w:pPr>
+        <w:pStyle w:val="Normal"/>
+        <w:jc w:val="both"/>
+        <w:rPr>
+          <w:color w:val="00A0FC"/>
+          <w:sz w:val="36"/>
+          <w:szCs w:val="36"/>
+        </w:rPr>
+      </w:pPr>
       <w:r>
         <w:rPr>
           <w:rFonts w:eastAsia="Times New Roman" w:cs="Times New Roman" w:ascii="Garamond" w:hAnsi="Garamond"/>
@@ -2000,7 +1770,140 @@
           <w:shd w:fill="auto" w:val="clear"/>
           <w:lang w:val="en-US" w:eastAsia="zh-CN" w:bidi="hi-IN"/>
         </w:rPr>
-        <w:t xml:space="preserve"> ]</w:t>
+        <w:t>[ Início - Anotações livro Joanna de Ângelis ]</w:t>
+      </w:r>
+    </w:p>
+    <w:p>
+      <w:pPr>
+        <w:pStyle w:val="Normal"/>
+        <w:jc w:val="both"/>
+        <w:rPr>
+          <w:sz w:val="36"/>
+          <w:szCs w:val="36"/>
+        </w:rPr>
+      </w:pPr>
+      <w:r>
+        <w:rPr>
+          <w:sz w:val="36"/>
+          <w:szCs w:val="36"/>
+        </w:rPr>
+        <w:t>Amar é abrir o coração sem reservas, encontrar-se desarmado de sentimentos de oposição, sempre favorável ao bem e ao progresso, mesmo quando discordando das colocações que são apresentadas.</w:t>
+      </w:r>
+    </w:p>
+    <w:p>
+      <w:pPr>
+        <w:pStyle w:val="Normal"/>
+        <w:jc w:val="both"/>
+        <w:rPr>
+          <w:sz w:val="36"/>
+          <w:szCs w:val="36"/>
+        </w:rPr>
+      </w:pPr>
+      <w:r>
+        <w:rPr>
+          <w:sz w:val="36"/>
+          <w:szCs w:val="36"/>
+        </w:rPr>
+      </w:r>
+    </w:p>
+    <w:p>
+      <w:pPr>
+        <w:pStyle w:val="Normal"/>
+        <w:jc w:val="both"/>
+        <w:rPr>
+          <w:sz w:val="36"/>
+          <w:szCs w:val="36"/>
+        </w:rPr>
+      </w:pPr>
+      <w:r>
+        <w:rPr>
+          <w:sz w:val="36"/>
+          <w:szCs w:val="36"/>
+        </w:rPr>
+        <w:t xml:space="preserve">O amor nunca se ofende e sempre está lúcido para entender que na sua vibração tudo se harmoniza, mesmo quando as leis dos contrários se apresentam, porque não agride nem violenta, tudo aceitando com equilíbrio e canalizando com sabedoria </w:t>
+      </w:r>
+    </w:p>
+    <w:p>
+      <w:pPr>
+        <w:pStyle w:val="Normal"/>
+        <w:jc w:val="both"/>
+        <w:rPr>
+          <w:sz w:val="36"/>
+          <w:szCs w:val="36"/>
+        </w:rPr>
+      </w:pPr>
+      <w:r>
+        <w:rPr>
+          <w:sz w:val="36"/>
+          <w:szCs w:val="36"/>
+        </w:rPr>
+      </w:r>
+    </w:p>
+    <w:p>
+      <w:pPr>
+        <w:pStyle w:val="Normal"/>
+        <w:jc w:val="both"/>
+        <w:rPr>
+          <w:color w:val="00A0FC"/>
+          <w:sz w:val="36"/>
+          <w:szCs w:val="36"/>
+        </w:rPr>
+      </w:pPr>
+      <w:r>
+        <w:rPr>
+          <w:rFonts w:eastAsia="Times New Roman" w:cs="Times New Roman" w:ascii="Garamond" w:hAnsi="Garamond"/>
+          <w:color w:val="00A0FC"/>
+          <w:kern w:val="0"/>
+          <w:sz w:val="36"/>
+          <w:szCs w:val="36"/>
+          <w:shd w:fill="auto" w:val="clear"/>
+          <w:lang w:val="en-US" w:eastAsia="zh-CN" w:bidi="hi-IN"/>
+        </w:rPr>
+        <w:t>[ Término - Anotações livro Joanna de Ângelis ]</w:t>
+      </w:r>
+    </w:p>
+    <w:p>
+      <w:pPr>
+        <w:pStyle w:val="Normal"/>
+        <w:numPr>
+          <w:ilvl w:val="0"/>
+          <w:numId w:val="0"/>
+        </w:numPr>
+        <w:ind w:left="720" w:hanging="0"/>
+        <w:jc w:val="both"/>
+        <w:rPr>
+          <w:sz w:val="36"/>
+          <w:szCs w:val="36"/>
+        </w:rPr>
+      </w:pPr>
+      <w:r>
+        <w:rPr>
+          <w:sz w:val="36"/>
+          <w:szCs w:val="36"/>
+        </w:rPr>
+      </w:r>
+    </w:p>
+    <w:p>
+      <w:pPr>
+        <w:pStyle w:val="Normal"/>
+        <w:jc w:val="both"/>
+        <w:rPr>
+          <w:color w:val="00A0FC"/>
+          <w:sz w:val="36"/>
+          <w:szCs w:val="36"/>
+        </w:rPr>
+      </w:pPr>
+      <w:r>
+        <w:rPr>
+          <w:rFonts w:eastAsia="Times New Roman" w:cs="Times New Roman" w:ascii="Garamond" w:hAnsi="Garamond"/>
+          <w:color w:val="00A0FC"/>
+          <w:kern w:val="0"/>
+          <w:sz w:val="36"/>
+          <w:szCs w:val="36"/>
+          <w:shd w:fill="auto" w:val="clear"/>
+          <w:lang w:val="en-US" w:eastAsia="zh-CN" w:bidi="hi-IN"/>
+        </w:rPr>
+        <w:t>[ Início dos textos que falam do amor próprio de Jesus ]</w:t>
       </w:r>
     </w:p>
     <w:p>
@@ -2131,7 +2034,7 @@
         <w:pStyle w:val="TextBody"/>
         <w:numPr>
           <w:ilvl w:val="0"/>
-          <w:numId w:val="2"/>
+          <w:numId w:val="1"/>
         </w:numPr>
         <w:tabs>
           <w:tab w:val="clear" w:pos="720"/>
@@ -2155,7 +2058,7 @@
         <w:pStyle w:val="TextBody"/>
         <w:numPr>
           <w:ilvl w:val="1"/>
-          <w:numId w:val="2"/>
+          <w:numId w:val="1"/>
         </w:numPr>
         <w:tabs>
           <w:tab w:val="clear" w:pos="720"/>
@@ -2182,7 +2085,7 @@
         <w:pStyle w:val="TextBody"/>
         <w:numPr>
           <w:ilvl w:val="1"/>
-          <w:numId w:val="2"/>
+          <w:numId w:val="1"/>
         </w:numPr>
         <w:tabs>
           <w:tab w:val="clear" w:pos="720"/>
@@ -2222,7 +2125,7 @@
         <w:pStyle w:val="TextBody"/>
         <w:numPr>
           <w:ilvl w:val="1"/>
-          <w:numId w:val="2"/>
+          <w:numId w:val="1"/>
         </w:numPr>
         <w:tabs>
           <w:tab w:val="clear" w:pos="720"/>
@@ -2249,7 +2152,7 @@
         <w:pStyle w:val="TextBody"/>
         <w:numPr>
           <w:ilvl w:val="0"/>
-          <w:numId w:val="2"/>
+          <w:numId w:val="1"/>
         </w:numPr>
         <w:tabs>
           <w:tab w:val="clear" w:pos="720"/>
@@ -2296,7 +2199,7 @@
         <w:pStyle w:val="TextBody"/>
         <w:numPr>
           <w:ilvl w:val="1"/>
-          <w:numId w:val="2"/>
+          <w:numId w:val="1"/>
         </w:numPr>
         <w:tabs>
           <w:tab w:val="clear" w:pos="720"/>
@@ -2336,7 +2239,7 @@
         <w:pStyle w:val="TextBody"/>
         <w:numPr>
           <w:ilvl w:val="1"/>
-          <w:numId w:val="2"/>
+          <w:numId w:val="1"/>
         </w:numPr>
         <w:tabs>
           <w:tab w:val="clear" w:pos="720"/>
@@ -2363,7 +2266,7 @@
         <w:pStyle w:val="TextBody"/>
         <w:numPr>
           <w:ilvl w:val="0"/>
-          <w:numId w:val="2"/>
+          <w:numId w:val="1"/>
         </w:numPr>
         <w:tabs>
           <w:tab w:val="clear" w:pos="720"/>
@@ -2387,7 +2290,7 @@
         <w:pStyle w:val="TextBody"/>
         <w:numPr>
           <w:ilvl w:val="1"/>
-          <w:numId w:val="2"/>
+          <w:numId w:val="1"/>
         </w:numPr>
         <w:tabs>
           <w:tab w:val="clear" w:pos="720"/>
@@ -2437,7 +2340,7 @@
         <w:pStyle w:val="TextBody"/>
         <w:numPr>
           <w:ilvl w:val="1"/>
-          <w:numId w:val="2"/>
+          <w:numId w:val="1"/>
         </w:numPr>
         <w:tabs>
           <w:tab w:val="clear" w:pos="720"/>
@@ -2477,7 +2380,7 @@
         <w:pStyle w:val="TextBody"/>
         <w:numPr>
           <w:ilvl w:val="0"/>
-          <w:numId w:val="2"/>
+          <w:numId w:val="1"/>
         </w:numPr>
         <w:tabs>
           <w:tab w:val="clear" w:pos="720"/>
@@ -2501,7 +2404,7 @@
         <w:pStyle w:val="TextBody"/>
         <w:numPr>
           <w:ilvl w:val="1"/>
-          <w:numId w:val="2"/>
+          <w:numId w:val="1"/>
         </w:numPr>
         <w:tabs>
           <w:tab w:val="clear" w:pos="720"/>
@@ -2541,7 +2444,7 @@
         <w:pStyle w:val="TextBody"/>
         <w:numPr>
           <w:ilvl w:val="1"/>
-          <w:numId w:val="2"/>
+          <w:numId w:val="1"/>
         </w:numPr>
         <w:tabs>
           <w:tab w:val="clear" w:pos="720"/>
@@ -2581,7 +2484,7 @@
         <w:pStyle w:val="TextBody"/>
         <w:numPr>
           <w:ilvl w:val="0"/>
-          <w:numId w:val="2"/>
+          <w:numId w:val="1"/>
         </w:numPr>
         <w:tabs>
           <w:tab w:val="clear" w:pos="720"/>
@@ -2605,7 +2508,7 @@
         <w:pStyle w:val="TextBody"/>
         <w:numPr>
           <w:ilvl w:val="1"/>
-          <w:numId w:val="2"/>
+          <w:numId w:val="1"/>
         </w:numPr>
         <w:tabs>
           <w:tab w:val="clear" w:pos="720"/>
@@ -2645,7 +2548,7 @@
         <w:pStyle w:val="TextBody"/>
         <w:numPr>
           <w:ilvl w:val="1"/>
-          <w:numId w:val="2"/>
+          <w:numId w:val="1"/>
         </w:numPr>
         <w:tabs>
           <w:tab w:val="clear" w:pos="720"/>
@@ -2672,7 +2575,7 @@
         <w:pStyle w:val="TextBody"/>
         <w:numPr>
           <w:ilvl w:val="0"/>
-          <w:numId w:val="2"/>
+          <w:numId w:val="1"/>
         </w:numPr>
         <w:tabs>
           <w:tab w:val="clear" w:pos="720"/>
@@ -2696,7 +2599,7 @@
         <w:pStyle w:val="TextBody"/>
         <w:numPr>
           <w:ilvl w:val="1"/>
-          <w:numId w:val="2"/>
+          <w:numId w:val="1"/>
         </w:numPr>
         <w:tabs>
           <w:tab w:val="clear" w:pos="720"/>
@@ -2723,7 +2626,7 @@
         <w:pStyle w:val="TextBody"/>
         <w:numPr>
           <w:ilvl w:val="1"/>
-          <w:numId w:val="2"/>
+          <w:numId w:val="1"/>
         </w:numPr>
         <w:tabs>
           <w:tab w:val="clear" w:pos="720"/>
@@ -2763,7 +2666,7 @@
         <w:pStyle w:val="TextBody"/>
         <w:numPr>
           <w:ilvl w:val="0"/>
-          <w:numId w:val="2"/>
+          <w:numId w:val="1"/>
         </w:numPr>
         <w:tabs>
           <w:tab w:val="clear" w:pos="720"/>
@@ -2787,7 +2690,7 @@
         <w:pStyle w:val="TextBody"/>
         <w:numPr>
           <w:ilvl w:val="1"/>
-          <w:numId w:val="2"/>
+          <w:numId w:val="1"/>
         </w:numPr>
         <w:tabs>
           <w:tab w:val="clear" w:pos="720"/>
@@ -2827,7 +2730,7 @@
         <w:pStyle w:val="TextBody"/>
         <w:numPr>
           <w:ilvl w:val="1"/>
-          <w:numId w:val="2"/>
+          <w:numId w:val="1"/>
         </w:numPr>
         <w:tabs>
           <w:tab w:val="clear" w:pos="720"/>
@@ -2867,7 +2770,7 @@
         <w:pStyle w:val="TextBody"/>
         <w:numPr>
           <w:ilvl w:val="1"/>
-          <w:numId w:val="2"/>
+          <w:numId w:val="1"/>
         </w:numPr>
         <w:tabs>
           <w:tab w:val="clear" w:pos="720"/>
@@ -3067,31 +2970,7 @@
           <w:shd w:fill="auto" w:val="clear"/>
           <w:lang w:val="en-US" w:eastAsia="zh-CN" w:bidi="hi-IN"/>
         </w:rPr>
-        <w:t xml:space="preserve">[ </w:t>
-      </w:r>
-      <w:r>
-        <w:rPr>
-          <w:rFonts w:eastAsia="Times New Roman" w:cs="Times New Roman" w:ascii="Garamond" w:hAnsi="Garamond"/>
-          <w:color w:val="00A0FC"/>
-          <w:kern w:val="0"/>
-          <w:sz w:val="36"/>
-          <w:szCs w:val="36"/>
-          <w:shd w:fill="auto" w:val="clear"/>
-          <w:lang w:val="en-US" w:eastAsia="zh-CN" w:bidi="hi-IN"/>
-        </w:rPr>
-        <w:t>Término dos textos que falam do amor próprio de Jesus</w:t>
-      </w:r>
-      <w:r>
-        <w:rPr>
-          <w:rFonts w:eastAsia="Times New Roman" w:cs="Times New Roman" w:ascii="Garamond" w:hAnsi="Garamond"/>
-          <w:color w:val="00A0FC"/>
-          <w:kern w:val="0"/>
-          <w:sz w:val="36"/>
-          <w:szCs w:val="36"/>
-          <w:shd w:fill="auto" w:val="clear"/>
-          <w:lang w:val="en-US" w:eastAsia="zh-CN" w:bidi="hi-IN"/>
-        </w:rPr>
-        <w:t xml:space="preserve"> ]</w:t>
+        <w:t>[ Término dos textos que falam do amor próprio de Jesus ]</w:t>
       </w:r>
     </w:p>
     <w:p>
@@ -3178,7 +3057,7 @@
         <w:pStyle w:val="TextBody"/>
         <w:numPr>
           <w:ilvl w:val="0"/>
-          <w:numId w:val="3"/>
+          <w:numId w:val="2"/>
         </w:numPr>
         <w:tabs>
           <w:tab w:val="clear" w:pos="720"/>
@@ -3202,7 +3081,7 @@
         <w:pStyle w:val="TextBody"/>
         <w:numPr>
           <w:ilvl w:val="1"/>
-          <w:numId w:val="3"/>
+          <w:numId w:val="2"/>
         </w:numPr>
         <w:tabs>
           <w:tab w:val="clear" w:pos="720"/>
@@ -3234,7 +3113,7 @@
         <w:pStyle w:val="TextBody"/>
         <w:numPr>
           <w:ilvl w:val="1"/>
-          <w:numId w:val="3"/>
+          <w:numId w:val="2"/>
         </w:numPr>
         <w:tabs>
           <w:tab w:val="clear" w:pos="720"/>
@@ -3266,7 +3145,7 @@
         <w:pStyle w:val="TextBody"/>
         <w:numPr>
           <w:ilvl w:val="1"/>
-          <w:numId w:val="3"/>
+          <w:numId w:val="2"/>
         </w:numPr>
         <w:tabs>
           <w:tab w:val="clear" w:pos="720"/>
@@ -3315,7 +3194,7 @@
         <w:pStyle w:val="TextBody"/>
         <w:numPr>
           <w:ilvl w:val="0"/>
-          <w:numId w:val="3"/>
+          <w:numId w:val="2"/>
         </w:numPr>
         <w:tabs>
           <w:tab w:val="clear" w:pos="720"/>
@@ -3339,7 +3218,7 @@
         <w:pStyle w:val="TextBody"/>
         <w:numPr>
           <w:ilvl w:val="1"/>
-          <w:numId w:val="3"/>
+          <w:numId w:val="2"/>
         </w:numPr>
         <w:tabs>
           <w:tab w:val="clear" w:pos="720"/>
@@ -3366,7 +3245,7 @@
         <w:pStyle w:val="TextBody"/>
         <w:numPr>
           <w:ilvl w:val="1"/>
-          <w:numId w:val="3"/>
+          <w:numId w:val="2"/>
         </w:numPr>
         <w:tabs>
           <w:tab w:val="clear" w:pos="720"/>
@@ -3398,7 +3277,7 @@
         <w:pStyle w:val="TextBody"/>
         <w:numPr>
           <w:ilvl w:val="0"/>
-          <w:numId w:val="3"/>
+          <w:numId w:val="2"/>
         </w:numPr>
         <w:tabs>
           <w:tab w:val="clear" w:pos="720"/>
@@ -3422,7 +3301,7 @@
         <w:pStyle w:val="TextBody"/>
         <w:numPr>
           <w:ilvl w:val="1"/>
-          <w:numId w:val="3"/>
+          <w:numId w:val="2"/>
         </w:numPr>
         <w:tabs>
           <w:tab w:val="clear" w:pos="720"/>
@@ -3449,7 +3328,7 @@
         <w:pStyle w:val="TextBody"/>
         <w:numPr>
           <w:ilvl w:val="1"/>
-          <w:numId w:val="3"/>
+          <w:numId w:val="2"/>
         </w:numPr>
         <w:tabs>
           <w:tab w:val="clear" w:pos="720"/>
@@ -3481,7 +3360,7 @@
         <w:pStyle w:val="TextBody"/>
         <w:numPr>
           <w:ilvl w:val="0"/>
-          <w:numId w:val="3"/>
+          <w:numId w:val="2"/>
         </w:numPr>
         <w:tabs>
           <w:tab w:val="clear" w:pos="720"/>
@@ -3505,7 +3384,7 @@
         <w:pStyle w:val="TextBody"/>
         <w:numPr>
           <w:ilvl w:val="1"/>
-          <w:numId w:val="3"/>
+          <w:numId w:val="2"/>
         </w:numPr>
         <w:tabs>
           <w:tab w:val="clear" w:pos="720"/>
@@ -3532,7 +3411,7 @@
         <w:pStyle w:val="TextBody"/>
         <w:numPr>
           <w:ilvl w:val="0"/>
-          <w:numId w:val="3"/>
+          <w:numId w:val="2"/>
         </w:numPr>
         <w:tabs>
           <w:tab w:val="clear" w:pos="720"/>
@@ -3556,7 +3435,7 @@
         <w:pStyle w:val="TextBody"/>
         <w:numPr>
           <w:ilvl w:val="1"/>
-          <w:numId w:val="3"/>
+          <w:numId w:val="2"/>
         </w:numPr>
         <w:tabs>
           <w:tab w:val="clear" w:pos="720"/>
@@ -3588,7 +3467,7 @@
         <w:pStyle w:val="TextBody"/>
         <w:numPr>
           <w:ilvl w:val="0"/>
-          <w:numId w:val="3"/>
+          <w:numId w:val="2"/>
         </w:numPr>
         <w:tabs>
           <w:tab w:val="clear" w:pos="720"/>
@@ -3612,7 +3491,7 @@
         <w:pStyle w:val="TextBody"/>
         <w:numPr>
           <w:ilvl w:val="1"/>
-          <w:numId w:val="3"/>
+          <w:numId w:val="2"/>
         </w:numPr>
         <w:tabs>
           <w:tab w:val="clear" w:pos="720"/>
@@ -3682,7 +3561,7 @@
         <w:pStyle w:val="TextBody"/>
         <w:numPr>
           <w:ilvl w:val="0"/>
-          <w:numId w:val="4"/>
+          <w:numId w:val="3"/>
         </w:numPr>
         <w:tabs>
           <w:tab w:val="clear" w:pos="720"/>
@@ -3714,7 +3593,7 @@
         <w:pStyle w:val="TextBody"/>
         <w:numPr>
           <w:ilvl w:val="0"/>
-          <w:numId w:val="4"/>
+          <w:numId w:val="3"/>
         </w:numPr>
         <w:tabs>
           <w:tab w:val="clear" w:pos="720"/>
@@ -3746,7 +3625,7 @@
         <w:pStyle w:val="TextBody"/>
         <w:numPr>
           <w:ilvl w:val="0"/>
-          <w:numId w:val="4"/>
+          <w:numId w:val="3"/>
         </w:numPr>
         <w:tabs>
           <w:tab w:val="clear" w:pos="720"/>
@@ -3778,7 +3657,7 @@
         <w:pStyle w:val="TextBody"/>
         <w:numPr>
           <w:ilvl w:val="0"/>
-          <w:numId w:val="4"/>
+          <w:numId w:val="3"/>
         </w:numPr>
         <w:tabs>
           <w:tab w:val="clear" w:pos="720"/>
@@ -3810,7 +3689,7 @@
         <w:pStyle w:val="TextBody"/>
         <w:numPr>
           <w:ilvl w:val="0"/>
-          <w:numId w:val="4"/>
+          <w:numId w:val="3"/>
         </w:numPr>
         <w:tabs>
           <w:tab w:val="clear" w:pos="720"/>
@@ -4033,7 +3912,7 @@
         <w:pStyle w:val="TextBody"/>
         <w:numPr>
           <w:ilvl w:val="0"/>
-          <w:numId w:val="5"/>
+          <w:numId w:val="4"/>
         </w:numPr>
         <w:tabs>
           <w:tab w:val="clear" w:pos="720"/>
@@ -4060,7 +3939,7 @@
         <w:pStyle w:val="TextBody"/>
         <w:numPr>
           <w:ilvl w:val="0"/>
-          <w:numId w:val="5"/>
+          <w:numId w:val="4"/>
         </w:numPr>
         <w:tabs>
           <w:tab w:val="clear" w:pos="720"/>
@@ -4100,7 +3979,7 @@
         <w:pStyle w:val="TextBody"/>
         <w:numPr>
           <w:ilvl w:val="0"/>
-          <w:numId w:val="5"/>
+          <w:numId w:val="4"/>
         </w:numPr>
         <w:tabs>
           <w:tab w:val="clear" w:pos="720"/>
@@ -4140,7 +4019,7 @@
         <w:pStyle w:val="TextBody"/>
         <w:numPr>
           <w:ilvl w:val="0"/>
-          <w:numId w:val="5"/>
+          <w:numId w:val="4"/>
         </w:numPr>
         <w:tabs>
           <w:tab w:val="clear" w:pos="720"/>
@@ -4269,7 +4148,7 @@
         <w:pStyle w:val="TextBody"/>
         <w:numPr>
           <w:ilvl w:val="0"/>
-          <w:numId w:val="6"/>
+          <w:numId w:val="5"/>
         </w:numPr>
         <w:tabs>
           <w:tab w:val="clear" w:pos="720"/>
@@ -4309,7 +4188,7 @@
         <w:pStyle w:val="TextBody"/>
         <w:numPr>
           <w:ilvl w:val="0"/>
-          <w:numId w:val="6"/>
+          <w:numId w:val="5"/>
         </w:numPr>
         <w:tabs>
           <w:tab w:val="clear" w:pos="720"/>
@@ -4336,7 +4215,7 @@
         <w:pStyle w:val="TextBody"/>
         <w:numPr>
           <w:ilvl w:val="0"/>
-          <w:numId w:val="6"/>
+          <w:numId w:val="5"/>
         </w:numPr>
         <w:tabs>
           <w:tab w:val="clear" w:pos="720"/>
@@ -4363,7 +4242,7 @@
         <w:pStyle w:val="TextBody"/>
         <w:numPr>
           <w:ilvl w:val="0"/>
-          <w:numId w:val="6"/>
+          <w:numId w:val="5"/>
         </w:numPr>
         <w:tabs>
           <w:tab w:val="clear" w:pos="720"/>
@@ -4403,7 +4282,7 @@
         <w:pStyle w:val="TextBody"/>
         <w:numPr>
           <w:ilvl w:val="1"/>
-          <w:numId w:val="6"/>
+          <w:numId w:val="5"/>
         </w:numPr>
         <w:tabs>
           <w:tab w:val="clear" w:pos="720"/>
@@ -4465,7 +4344,7 @@
         <w:pStyle w:val="TextBody"/>
         <w:numPr>
           <w:ilvl w:val="0"/>
-          <w:numId w:val="7"/>
+          <w:numId w:val="6"/>
         </w:numPr>
         <w:tabs>
           <w:tab w:val="clear" w:pos="720"/>
@@ -4492,7 +4371,7 @@
         <w:pStyle w:val="TextBody"/>
         <w:numPr>
           <w:ilvl w:val="0"/>
-          <w:numId w:val="7"/>
+          <w:numId w:val="6"/>
         </w:numPr>
         <w:tabs>
           <w:tab w:val="clear" w:pos="720"/>
@@ -4519,7 +4398,7 @@
         <w:pStyle w:val="TextBody"/>
         <w:numPr>
           <w:ilvl w:val="0"/>
-          <w:numId w:val="7"/>
+          <w:numId w:val="6"/>
         </w:numPr>
         <w:tabs>
           <w:tab w:val="clear" w:pos="720"/>
@@ -4546,7 +4425,7 @@
         <w:pStyle w:val="TextBody"/>
         <w:numPr>
           <w:ilvl w:val="0"/>
-          <w:numId w:val="7"/>
+          <w:numId w:val="6"/>
         </w:numPr>
         <w:tabs>
           <w:tab w:val="clear" w:pos="720"/>
@@ -4573,7 +4452,7 @@
         <w:pStyle w:val="TextBody"/>
         <w:numPr>
           <w:ilvl w:val="1"/>
-          <w:numId w:val="7"/>
+          <w:numId w:val="6"/>
         </w:numPr>
         <w:tabs>
           <w:tab w:val="clear" w:pos="720"/>
@@ -4613,7 +4492,7 @@
         <w:pStyle w:val="TextBody"/>
         <w:numPr>
           <w:ilvl w:val="1"/>
-          <w:numId w:val="7"/>
+          <w:numId w:val="6"/>
         </w:numPr>
         <w:tabs>
           <w:tab w:val="clear" w:pos="720"/>
@@ -4688,7 +4567,7 @@
         <w:pStyle w:val="TextBody"/>
         <w:numPr>
           <w:ilvl w:val="0"/>
-          <w:numId w:val="8"/>
+          <w:numId w:val="7"/>
         </w:numPr>
         <w:tabs>
           <w:tab w:val="clear" w:pos="720"/>
@@ -4715,7 +4594,7 @@
         <w:pStyle w:val="TextBody"/>
         <w:numPr>
           <w:ilvl w:val="0"/>
-          <w:numId w:val="8"/>
+          <w:numId w:val="7"/>
         </w:numPr>
         <w:tabs>
           <w:tab w:val="clear" w:pos="720"/>
@@ -4742,7 +4621,7 @@
         <w:pStyle w:val="TextBody"/>
         <w:numPr>
           <w:ilvl w:val="0"/>
-          <w:numId w:val="8"/>
+          <w:numId w:val="7"/>
         </w:numPr>
         <w:tabs>
           <w:tab w:val="clear" w:pos="720"/>
@@ -4769,7 +4648,7 @@
         <w:pStyle w:val="TextBody"/>
         <w:numPr>
           <w:ilvl w:val="1"/>
-          <w:numId w:val="8"/>
+          <w:numId w:val="7"/>
         </w:numPr>
         <w:tabs>
           <w:tab w:val="clear" w:pos="720"/>
@@ -4796,7 +4675,7 @@
         <w:pStyle w:val="TextBody"/>
         <w:numPr>
           <w:ilvl w:val="1"/>
-          <w:numId w:val="8"/>
+          <w:numId w:val="7"/>
         </w:numPr>
         <w:tabs>
           <w:tab w:val="clear" w:pos="720"/>
@@ -4823,7 +4702,7 @@
         <w:pStyle w:val="TextBody"/>
         <w:numPr>
           <w:ilvl w:val="1"/>
-          <w:numId w:val="8"/>
+          <w:numId w:val="7"/>
         </w:numPr>
         <w:tabs>
           <w:tab w:val="clear" w:pos="720"/>
@@ -4850,7 +4729,7 @@
         <w:pStyle w:val="TextBody"/>
         <w:numPr>
           <w:ilvl w:val="1"/>
-          <w:numId w:val="8"/>
+          <w:numId w:val="7"/>
         </w:numPr>
         <w:tabs>
           <w:tab w:val="clear" w:pos="720"/>
@@ -4877,7 +4756,7 @@
         <w:pStyle w:val="TextBody"/>
         <w:numPr>
           <w:ilvl w:val="0"/>
-          <w:numId w:val="8"/>
+          <w:numId w:val="7"/>
         </w:numPr>
         <w:tabs>
           <w:tab w:val="clear" w:pos="720"/>
@@ -4904,7 +4783,7 @@
         <w:pStyle w:val="TextBody"/>
         <w:numPr>
           <w:ilvl w:val="1"/>
-          <w:numId w:val="8"/>
+          <w:numId w:val="7"/>
         </w:numPr>
         <w:tabs>
           <w:tab w:val="clear" w:pos="720"/>
@@ -4931,7 +4810,7 @@
         <w:pStyle w:val="TextBody"/>
         <w:numPr>
           <w:ilvl w:val="1"/>
-          <w:numId w:val="8"/>
+          <w:numId w:val="7"/>
         </w:numPr>
         <w:tabs>
           <w:tab w:val="clear" w:pos="720"/>
@@ -5011,7 +4890,7 @@
         <w:pStyle w:val="TextBody"/>
         <w:numPr>
           <w:ilvl w:val="0"/>
-          <w:numId w:val="9"/>
+          <w:numId w:val="8"/>
         </w:numPr>
         <w:tabs>
           <w:tab w:val="clear" w:pos="720"/>
@@ -5051,7 +4930,7 @@
         <w:pStyle w:val="TextBody"/>
         <w:numPr>
           <w:ilvl w:val="0"/>
-          <w:numId w:val="9"/>
+          <w:numId w:val="8"/>
         </w:numPr>
         <w:tabs>
           <w:tab w:val="clear" w:pos="720"/>
@@ -5078,7 +4957,7 @@
         <w:pStyle w:val="TextBody"/>
         <w:numPr>
           <w:ilvl w:val="0"/>
-          <w:numId w:val="9"/>
+          <w:numId w:val="8"/>
         </w:numPr>
         <w:tabs>
           <w:tab w:val="clear" w:pos="720"/>
@@ -5136,7 +5015,7 @@
         <w:pStyle w:val="TextBody"/>
         <w:numPr>
           <w:ilvl w:val="0"/>
-          <w:numId w:val="9"/>
+          <w:numId w:val="8"/>
         </w:numPr>
         <w:tabs>
           <w:tab w:val="clear" w:pos="720"/>
@@ -5357,7 +5236,7 @@
         <w:bCs/>
         <w:rFonts w:ascii="Garamond" w:hAnsi="Garamond"/>
       </w:rPr>
-      <w:t>21</w:t>
+      <w:t>19</w:t>
     </w:r>
     <w:r>
       <w:rPr>
@@ -5379,47 +5258,44 @@
   <w:abstractNum w:abstractNumId="1">
     <w:lvl w:ilvl="0">
       <w:start w:val="1"/>
+      <w:numFmt w:val="decimal"/>
+      <w:lvlText w:val="%1."/>
+      <w:lvlJc w:val="left"/>
+      <w:pPr>
+        <w:tabs>
+          <w:tab w:val="num" w:pos="707"/>
+        </w:tabs>
+        <w:ind w:left="707" w:hanging="283"/>
+      </w:pPr>
+    </w:lvl>
+    <w:lvl w:ilvl="1">
+      <w:start w:val="1"/>
       <w:numFmt w:val="bullet"/>
       <w:lvlText w:val=""/>
       <w:lvlJc w:val="left"/>
       <w:pPr>
         <w:tabs>
-          <w:tab w:val="num" w:pos="720"/>
-        </w:tabs>
-        <w:ind w:left="720" w:hanging="360"/>
+          <w:tab w:val="num" w:pos="1414"/>
+        </w:tabs>
+        <w:ind w:left="1414" w:hanging="283"/>
       </w:pPr>
       <w:rPr>
         <w:rFonts w:ascii="Symbol" w:hAnsi="Symbol" w:cs="Symbol" w:hint="default"/>
       </w:rPr>
     </w:lvl>
-    <w:lvl w:ilvl="1">
-      <w:start w:val="1"/>
-      <w:numFmt w:val="bullet"/>
-      <w:lvlText w:val="◦"/>
-      <w:lvlJc w:val="left"/>
-      <w:pPr>
-        <w:tabs>
-          <w:tab w:val="num" w:pos="1080"/>
-        </w:tabs>
-        <w:ind w:left="1080" w:hanging="360"/>
-      </w:pPr>
-      <w:rPr>
-        <w:rFonts w:ascii="OpenSymbol" w:hAnsi="OpenSymbol" w:cs="OpenSymbol" w:hint="default"/>
-      </w:rPr>
-    </w:lvl>
     <w:lvl w:ilvl="2">
       <w:start w:val="1"/>
       <w:numFmt w:val="bullet"/>
-      <w:lvlText w:val="▪"/>
-      <w:lvlJc w:val="left"/>
-      <w:pPr>
-        <w:tabs>
-          <w:tab w:val="num" w:pos="1440"/>
-        </w:tabs>
-        <w:ind w:left="1440" w:hanging="360"/>
-      </w:pPr>
-      <w:rPr>
-        <w:rFonts w:ascii="OpenSymbol" w:hAnsi="OpenSymbol" w:cs="OpenSymbol" w:hint="default"/>
+      <w:lvlText w:val=""/>
+      <w:lvlJc w:val="left"/>
+      <w:pPr>
+        <w:tabs>
+          <w:tab w:val="num" w:pos="2121"/>
+        </w:tabs>
+        <w:ind w:left="2121" w:hanging="283"/>
+      </w:pPr>
+      <w:rPr>
+        <w:rFonts w:ascii="Symbol" w:hAnsi="Symbol" w:cs="Symbol" w:hint="default"/>
       </w:rPr>
     </w:lvl>
     <w:lvl w:ilvl="3">
@@ -5429,9 +5305,9 @@
       <w:lvlJc w:val="left"/>
       <w:pPr>
         <w:tabs>
-          <w:tab w:val="num" w:pos="1800"/>
-        </w:tabs>
-        <w:ind w:left="1800" w:hanging="360"/>
+          <w:tab w:val="num" w:pos="2828"/>
+        </w:tabs>
+        <w:ind w:left="2828" w:hanging="283"/>
       </w:pPr>
       <w:rPr>
         <w:rFonts w:ascii="Symbol" w:hAnsi="Symbol" w:cs="Symbol" w:hint="default"/>
@@ -5440,31 +5316,31 @@
     <w:lvl w:ilvl="4">
       <w:start w:val="1"/>
       <w:numFmt w:val="bullet"/>
-      <w:lvlText w:val="◦"/>
-      <w:lvlJc w:val="left"/>
-      <w:pPr>
-        <w:tabs>
-          <w:tab w:val="num" w:pos="2160"/>
-        </w:tabs>
-        <w:ind w:left="2160" w:hanging="360"/>
-      </w:pPr>
-      <w:rPr>
-        <w:rFonts w:ascii="OpenSymbol" w:hAnsi="OpenSymbol" w:cs="OpenSymbol" w:hint="default"/>
+      <w:lvlText w:val=""/>
+      <w:lvlJc w:val="left"/>
+      <w:pPr>
+        <w:tabs>
+          <w:tab w:val="num" w:pos="3535"/>
+        </w:tabs>
+        <w:ind w:left="3535" w:hanging="283"/>
+      </w:pPr>
+      <w:rPr>
+        <w:rFonts w:ascii="Symbol" w:hAnsi="Symbol" w:cs="Symbol" w:hint="default"/>
       </w:rPr>
     </w:lvl>
     <w:lvl w:ilvl="5">
       <w:start w:val="1"/>
       <w:numFmt w:val="bullet"/>
-      <w:lvlText w:val="▪"/>
-      <w:lvlJc w:val="left"/>
-      <w:pPr>
-        <w:tabs>
-          <w:tab w:val="num" w:pos="2520"/>
-        </w:tabs>
-        <w:ind w:left="2520" w:hanging="360"/>
-      </w:pPr>
-      <w:rPr>
-        <w:rFonts w:ascii="OpenSymbol" w:hAnsi="OpenSymbol" w:cs="OpenSymbol" w:hint="default"/>
+      <w:lvlText w:val=""/>
+      <w:lvlJc w:val="left"/>
+      <w:pPr>
+        <w:tabs>
+          <w:tab w:val="num" w:pos="4242"/>
+        </w:tabs>
+        <w:ind w:left="4242" w:hanging="283"/>
+      </w:pPr>
+      <w:rPr>
+        <w:rFonts w:ascii="Symbol" w:hAnsi="Symbol" w:cs="Symbol" w:hint="default"/>
       </w:rPr>
     </w:lvl>
     <w:lvl w:ilvl="6">
@@ -5474,9 +5350,9 @@
       <w:lvlJc w:val="left"/>
       <w:pPr>
         <w:tabs>
-          <w:tab w:val="num" w:pos="2880"/>
-        </w:tabs>
-        <w:ind w:left="2880" w:hanging="360"/>
+          <w:tab w:val="num" w:pos="4949"/>
+        </w:tabs>
+        <w:ind w:left="4949" w:hanging="283"/>
       </w:pPr>
       <w:rPr>
         <w:rFonts w:ascii="Symbol" w:hAnsi="Symbol" w:cs="Symbol" w:hint="default"/>
@@ -5485,31 +5361,31 @@
     <w:lvl w:ilvl="7">
       <w:start w:val="1"/>
       <w:numFmt w:val="bullet"/>
-      <w:lvlText w:val="◦"/>
-      <w:lvlJc w:val="left"/>
-      <w:pPr>
-        <w:tabs>
-          <w:tab w:val="num" w:pos="3240"/>
-        </w:tabs>
-        <w:ind w:left="3240" w:hanging="360"/>
-      </w:pPr>
-      <w:rPr>
-        <w:rFonts w:ascii="OpenSymbol" w:hAnsi="OpenSymbol" w:cs="OpenSymbol" w:hint="default"/>
+      <w:lvlText w:val=""/>
+      <w:lvlJc w:val="left"/>
+      <w:pPr>
+        <w:tabs>
+          <w:tab w:val="num" w:pos="5656"/>
+        </w:tabs>
+        <w:ind w:left="5656" w:hanging="283"/>
+      </w:pPr>
+      <w:rPr>
+        <w:rFonts w:ascii="Symbol" w:hAnsi="Symbol" w:cs="Symbol" w:hint="default"/>
       </w:rPr>
     </w:lvl>
     <w:lvl w:ilvl="8">
       <w:start w:val="1"/>
       <w:numFmt w:val="bullet"/>
-      <w:lvlText w:val="▪"/>
-      <w:lvlJc w:val="left"/>
-      <w:pPr>
-        <w:tabs>
-          <w:tab w:val="num" w:pos="3600"/>
-        </w:tabs>
-        <w:ind w:left="3600" w:hanging="360"/>
-      </w:pPr>
-      <w:rPr>
-        <w:rFonts w:ascii="OpenSymbol" w:hAnsi="OpenSymbol" w:cs="OpenSymbol" w:hint="default"/>
+      <w:lvlText w:val=""/>
+      <w:lvlJc w:val="left"/>
+      <w:pPr>
+        <w:tabs>
+          <w:tab w:val="num" w:pos="6363"/>
+        </w:tabs>
+        <w:ind w:left="6363" w:hanging="283"/>
+      </w:pPr>
+      <w:rPr>
+        <w:rFonts w:ascii="Symbol" w:hAnsi="Symbol" w:cs="Symbol" w:hint="default"/>
       </w:rPr>
     </w:lvl>
   </w:abstractNum>
@@ -5650,8 +5526,8 @@
   <w:abstractNum w:abstractNumId="3">
     <w:lvl w:ilvl="0">
       <w:start w:val="1"/>
-      <w:numFmt w:val="decimal"/>
-      <w:lvlText w:val="%1."/>
+      <w:numFmt w:val="bullet"/>
+      <w:lvlText w:val=""/>
       <w:lvlJc w:val="left"/>
       <w:pPr>
         <w:tabs>
@@ -5659,6 +5535,9 @@
         </w:tabs>
         <w:ind w:left="707" w:hanging="283"/>
       </w:pPr>
+      <w:rPr>
+        <w:rFonts w:ascii="Symbol" w:hAnsi="Symbol" w:cs="Symbol" w:hint="default"/>
+      </w:rPr>
     </w:lvl>
     <w:lvl w:ilvl="1">
       <w:start w:val="1"/>
@@ -6474,9 +6353,9 @@
       <w:lvlJc w:val="left"/>
       <w:pPr>
         <w:tabs>
-          <w:tab w:val="num" w:pos="707"/>
-        </w:tabs>
-        <w:ind w:left="707" w:hanging="283"/>
+          <w:tab w:val="num" w:pos="720"/>
+        </w:tabs>
+        <w:ind w:left="720" w:hanging="360"/>
       </w:pPr>
       <w:rPr>
         <w:rFonts w:ascii="Symbol" w:hAnsi="Symbol" w:cs="Symbol" w:hint="default"/>
@@ -6485,262 +6364,125 @@
     <w:lvl w:ilvl="1">
       <w:start w:val="1"/>
       <w:numFmt w:val="bullet"/>
+      <w:lvlText w:val="◦"/>
+      <w:lvlJc w:val="left"/>
+      <w:pPr>
+        <w:tabs>
+          <w:tab w:val="num" w:pos="1080"/>
+        </w:tabs>
+        <w:ind w:left="1080" w:hanging="360"/>
+      </w:pPr>
+      <w:rPr>
+        <w:rFonts w:ascii="OpenSymbol" w:hAnsi="OpenSymbol" w:cs="OpenSymbol" w:hint="default"/>
+      </w:rPr>
+    </w:lvl>
+    <w:lvl w:ilvl="2">
+      <w:start w:val="1"/>
+      <w:numFmt w:val="bullet"/>
+      <w:lvlText w:val="▪"/>
+      <w:lvlJc w:val="left"/>
+      <w:pPr>
+        <w:tabs>
+          <w:tab w:val="num" w:pos="1440"/>
+        </w:tabs>
+        <w:ind w:left="1440" w:hanging="360"/>
+      </w:pPr>
+      <w:rPr>
+        <w:rFonts w:ascii="OpenSymbol" w:hAnsi="OpenSymbol" w:cs="OpenSymbol" w:hint="default"/>
+      </w:rPr>
+    </w:lvl>
+    <w:lvl w:ilvl="3">
+      <w:start w:val="1"/>
+      <w:numFmt w:val="bullet"/>
       <w:lvlText w:val=""/>
       <w:lvlJc w:val="left"/>
       <w:pPr>
         <w:tabs>
-          <w:tab w:val="num" w:pos="1414"/>
-        </w:tabs>
-        <w:ind w:left="1414" w:hanging="283"/>
+          <w:tab w:val="num" w:pos="1800"/>
+        </w:tabs>
+        <w:ind w:left="1800" w:hanging="360"/>
       </w:pPr>
       <w:rPr>
         <w:rFonts w:ascii="Symbol" w:hAnsi="Symbol" w:cs="Symbol" w:hint="default"/>
       </w:rPr>
     </w:lvl>
-    <w:lvl w:ilvl="2">
+    <w:lvl w:ilvl="4">
+      <w:start w:val="1"/>
+      <w:numFmt w:val="bullet"/>
+      <w:lvlText w:val="◦"/>
+      <w:lvlJc w:val="left"/>
+      <w:pPr>
+        <w:tabs>
+          <w:tab w:val="num" w:pos="2160"/>
+        </w:tabs>
+        <w:ind w:left="2160" w:hanging="360"/>
+      </w:pPr>
+      <w:rPr>
+        <w:rFonts w:ascii="OpenSymbol" w:hAnsi="OpenSymbol" w:cs="OpenSymbol" w:hint="default"/>
+      </w:rPr>
+    </w:lvl>
+    <w:lvl w:ilvl="5">
+      <w:start w:val="1"/>
+      <w:numFmt w:val="bullet"/>
+      <w:lvlText w:val="▪"/>
+      <w:lvlJc w:val="left"/>
+      <w:pPr>
+        <w:tabs>
+          <w:tab w:val="num" w:pos="2520"/>
+        </w:tabs>
+        <w:ind w:left="2520" w:hanging="360"/>
+      </w:pPr>
+      <w:rPr>
+        <w:rFonts w:ascii="OpenSymbol" w:hAnsi="OpenSymbol" w:cs="OpenSymbol" w:hint="default"/>
+      </w:rPr>
+    </w:lvl>
+    <w:lvl w:ilvl="6">
       <w:start w:val="1"/>
       <w:numFmt w:val="bullet"/>
       <w:lvlText w:val=""/>
       <w:lvlJc w:val="left"/>
       <w:pPr>
         <w:tabs>
-          <w:tab w:val="num" w:pos="2121"/>
-        </w:tabs>
-        <w:ind w:left="2121" w:hanging="283"/>
+          <w:tab w:val="num" w:pos="2880"/>
+        </w:tabs>
+        <w:ind w:left="2880" w:hanging="360"/>
       </w:pPr>
       <w:rPr>
         <w:rFonts w:ascii="Symbol" w:hAnsi="Symbol" w:cs="Symbol" w:hint="default"/>
       </w:rPr>
     </w:lvl>
-    <w:lvl w:ilvl="3">
-      <w:start w:val="1"/>
-      <w:numFmt w:val="bullet"/>
-      <w:lvlText w:val=""/>
-      <w:lvlJc w:val="left"/>
-      <w:pPr>
-        <w:tabs>
-          <w:tab w:val="num" w:pos="2828"/>
-        </w:tabs>
-        <w:ind w:left="2828" w:hanging="283"/>
-      </w:pPr>
-      <w:rPr>
-        <w:rFonts w:ascii="Symbol" w:hAnsi="Symbol" w:cs="Symbol" w:hint="default"/>
-      </w:rPr>
-    </w:lvl>
-    <w:lvl w:ilvl="4">
-      <w:start w:val="1"/>
-      <w:numFmt w:val="bullet"/>
-      <w:lvlText w:val=""/>
-      <w:lvlJc w:val="left"/>
-      <w:pPr>
-        <w:tabs>
-          <w:tab w:val="num" w:pos="3535"/>
-        </w:tabs>
-        <w:ind w:left="3535" w:hanging="283"/>
-      </w:pPr>
-      <w:rPr>
-        <w:rFonts w:ascii="Symbol" w:hAnsi="Symbol" w:cs="Symbol" w:hint="default"/>
-      </w:rPr>
-    </w:lvl>
-    <w:lvl w:ilvl="5">
-      <w:start w:val="1"/>
-      <w:numFmt w:val="bullet"/>
-      <w:lvlText w:val=""/>
-      <w:lvlJc w:val="left"/>
-      <w:pPr>
-        <w:tabs>
-          <w:tab w:val="num" w:pos="4242"/>
-        </w:tabs>
-        <w:ind w:left="4242" w:hanging="283"/>
-      </w:pPr>
-      <w:rPr>
-        <w:rFonts w:ascii="Symbol" w:hAnsi="Symbol" w:cs="Symbol" w:hint="default"/>
-      </w:rPr>
-    </w:lvl>
-    <w:lvl w:ilvl="6">
-      <w:start w:val="1"/>
-      <w:numFmt w:val="bullet"/>
-      <w:lvlText w:val=""/>
-      <w:lvlJc w:val="left"/>
-      <w:pPr>
-        <w:tabs>
-          <w:tab w:val="num" w:pos="4949"/>
-        </w:tabs>
-        <w:ind w:left="4949" w:hanging="283"/>
-      </w:pPr>
-      <w:rPr>
-        <w:rFonts w:ascii="Symbol" w:hAnsi="Symbol" w:cs="Symbol" w:hint="default"/>
-      </w:rPr>
-    </w:lvl>
     <w:lvl w:ilvl="7">
       <w:start w:val="1"/>
       <w:numFmt w:val="bullet"/>
-      <w:lvlText w:val=""/>
-      <w:lvlJc w:val="left"/>
-      <w:pPr>
-        <w:tabs>
-          <w:tab w:val="num" w:pos="5656"/>
-        </w:tabs>
-        <w:ind w:left="5656" w:hanging="283"/>
-      </w:pPr>
-      <w:rPr>
-        <w:rFonts w:ascii="Symbol" w:hAnsi="Symbol" w:cs="Symbol" w:hint="default"/>
+      <w:lvlText w:val="◦"/>
+      <w:lvlJc w:val="left"/>
+      <w:pPr>
+        <w:tabs>
+          <w:tab w:val="num" w:pos="3240"/>
+        </w:tabs>
+        <w:ind w:left="3240" w:hanging="360"/>
+      </w:pPr>
+      <w:rPr>
+        <w:rFonts w:ascii="OpenSymbol" w:hAnsi="OpenSymbol" w:cs="OpenSymbol" w:hint="default"/>
       </w:rPr>
     </w:lvl>
     <w:lvl w:ilvl="8">
       <w:start w:val="1"/>
       <w:numFmt w:val="bullet"/>
-      <w:lvlText w:val=""/>
-      <w:lvlJc w:val="left"/>
-      <w:pPr>
-        <w:tabs>
-          <w:tab w:val="num" w:pos="6363"/>
-        </w:tabs>
-        <w:ind w:left="6363" w:hanging="283"/>
-      </w:pPr>
-      <w:rPr>
-        <w:rFonts w:ascii="Symbol" w:hAnsi="Symbol" w:cs="Symbol" w:hint="default"/>
+      <w:lvlText w:val="▪"/>
+      <w:lvlJc w:val="left"/>
+      <w:pPr>
+        <w:tabs>
+          <w:tab w:val="num" w:pos="3600"/>
+        </w:tabs>
+        <w:ind w:left="3600" w:hanging="360"/>
+      </w:pPr>
+      <w:rPr>
+        <w:rFonts w:ascii="OpenSymbol" w:hAnsi="OpenSymbol" w:cs="OpenSymbol" w:hint="default"/>
       </w:rPr>
     </w:lvl>
   </w:abstractNum>
   <w:abstractNum w:abstractNumId="10">
-    <w:lvl w:ilvl="0">
-      <w:start w:val="1"/>
-      <w:numFmt w:val="bullet"/>
-      <w:lvlText w:val=""/>
-      <w:lvlJc w:val="left"/>
-      <w:pPr>
-        <w:tabs>
-          <w:tab w:val="num" w:pos="720"/>
-        </w:tabs>
-        <w:ind w:left="720" w:hanging="360"/>
-      </w:pPr>
-      <w:rPr>
-        <w:rFonts w:ascii="Symbol" w:hAnsi="Symbol" w:cs="Symbol" w:hint="default"/>
-      </w:rPr>
-    </w:lvl>
-    <w:lvl w:ilvl="1">
-      <w:start w:val="1"/>
-      <w:numFmt w:val="bullet"/>
-      <w:lvlText w:val="◦"/>
-      <w:lvlJc w:val="left"/>
-      <w:pPr>
-        <w:tabs>
-          <w:tab w:val="num" w:pos="1080"/>
-        </w:tabs>
-        <w:ind w:left="1080" w:hanging="360"/>
-      </w:pPr>
-      <w:rPr>
-        <w:rFonts w:ascii="OpenSymbol" w:hAnsi="OpenSymbol" w:cs="OpenSymbol" w:hint="default"/>
-      </w:rPr>
-    </w:lvl>
-    <w:lvl w:ilvl="2">
-      <w:start w:val="1"/>
-      <w:numFmt w:val="bullet"/>
-      <w:lvlText w:val="▪"/>
-      <w:lvlJc w:val="left"/>
-      <w:pPr>
-        <w:tabs>
-          <w:tab w:val="num" w:pos="1440"/>
-        </w:tabs>
-        <w:ind w:left="1440" w:hanging="360"/>
-      </w:pPr>
-      <w:rPr>
-        <w:rFonts w:ascii="OpenSymbol" w:hAnsi="OpenSymbol" w:cs="OpenSymbol" w:hint="default"/>
-      </w:rPr>
-    </w:lvl>
-    <w:lvl w:ilvl="3">
-      <w:start w:val="1"/>
-      <w:numFmt w:val="bullet"/>
-      <w:lvlText w:val=""/>
-      <w:lvlJc w:val="left"/>
-      <w:pPr>
-        <w:tabs>
-          <w:tab w:val="num" w:pos="1800"/>
-        </w:tabs>
-        <w:ind w:left="1800" w:hanging="360"/>
-      </w:pPr>
-      <w:rPr>
-        <w:rFonts w:ascii="Symbol" w:hAnsi="Symbol" w:cs="Symbol" w:hint="default"/>
-      </w:rPr>
-    </w:lvl>
-    <w:lvl w:ilvl="4">
-      <w:start w:val="1"/>
-      <w:numFmt w:val="bullet"/>
-      <w:lvlText w:val="◦"/>
-      <w:lvlJc w:val="left"/>
-      <w:pPr>
-        <w:tabs>
-          <w:tab w:val="num" w:pos="2160"/>
-        </w:tabs>
-        <w:ind w:left="2160" w:hanging="360"/>
-      </w:pPr>
-      <w:rPr>
-        <w:rFonts w:ascii="OpenSymbol" w:hAnsi="OpenSymbol" w:cs="OpenSymbol" w:hint="default"/>
-      </w:rPr>
-    </w:lvl>
-    <w:lvl w:ilvl="5">
-      <w:start w:val="1"/>
-      <w:numFmt w:val="bullet"/>
-      <w:lvlText w:val="▪"/>
-      <w:lvlJc w:val="left"/>
-      <w:pPr>
-        <w:tabs>
-          <w:tab w:val="num" w:pos="2520"/>
-        </w:tabs>
-        <w:ind w:left="2520" w:hanging="360"/>
-      </w:pPr>
-      <w:rPr>
-        <w:rFonts w:ascii="OpenSymbol" w:hAnsi="OpenSymbol" w:cs="OpenSymbol" w:hint="default"/>
-      </w:rPr>
-    </w:lvl>
-    <w:lvl w:ilvl="6">
-      <w:start w:val="1"/>
-      <w:numFmt w:val="bullet"/>
-      <w:lvlText w:val=""/>
-      <w:lvlJc w:val="left"/>
-      <w:pPr>
-        <w:tabs>
-          <w:tab w:val="num" w:pos="2880"/>
-        </w:tabs>
-        <w:ind w:left="2880" w:hanging="360"/>
-      </w:pPr>
-      <w:rPr>
-        <w:rFonts w:ascii="Symbol" w:hAnsi="Symbol" w:cs="Symbol" w:hint="default"/>
-      </w:rPr>
-    </w:lvl>
-    <w:lvl w:ilvl="7">
-      <w:start w:val="1"/>
-      <w:numFmt w:val="bullet"/>
-      <w:lvlText w:val="◦"/>
-      <w:lvlJc w:val="left"/>
-      <w:pPr>
-        <w:tabs>
-          <w:tab w:val="num" w:pos="3240"/>
-        </w:tabs>
-        <w:ind w:left="3240" w:hanging="360"/>
-      </w:pPr>
-      <w:rPr>
-        <w:rFonts w:ascii="OpenSymbol" w:hAnsi="OpenSymbol" w:cs="OpenSymbol" w:hint="default"/>
-      </w:rPr>
-    </w:lvl>
-    <w:lvl w:ilvl="8">
-      <w:start w:val="1"/>
-      <w:numFmt w:val="bullet"/>
-      <w:lvlText w:val="▪"/>
-      <w:lvlJc w:val="left"/>
-      <w:pPr>
-        <w:tabs>
-          <w:tab w:val="num" w:pos="3600"/>
-        </w:tabs>
-        <w:ind w:left="3600" w:hanging="360"/>
-      </w:pPr>
-      <w:rPr>
-        <w:rFonts w:ascii="OpenSymbol" w:hAnsi="OpenSymbol" w:cs="OpenSymbol" w:hint="default"/>
-      </w:rPr>
-    </w:lvl>
-  </w:abstractNum>
-  <w:abstractNum w:abstractNumId="11">
     <w:lvl w:ilvl="0">
       <w:start w:val="1"/>
       <w:numFmt w:val="none"/>
@@ -6888,9 +6630,6 @@
   </w:num>
   <w:num w:numId="10">
     <w:abstractNumId w:val="10"/>
-  </w:num>
-  <w:num w:numId="11">
-    <w:abstractNumId w:val="11"/>
   </w:num>
 </w:numbering>
 </file>

</xml_diff>

<commit_message>
08/11/2025 - 13:35 h
</commit_message>
<xml_diff>
--- a/O mandamento maior/O Mandamento Maior.docx
+++ b/O mandamento maior/O Mandamento Maior.docx
@@ -322,162 +322,497 @@
           <w:shd w:fill="auto" w:val="clear"/>
           <w:lang w:val="en-US" w:eastAsia="zh-CN" w:bidi="hi-IN"/>
         </w:rPr>
-        <w:t>N</w:t>
-      </w:r>
-      <w:r>
-        <w:rPr>
-          <w:rFonts w:eastAsia="Times New Roman" w:cs="Times New Roman" w:ascii="Garamond" w:hAnsi="Garamond"/>
-          <w:color w:val="000000"/>
-          <w:kern w:val="0"/>
-          <w:sz w:val="36"/>
-          <w:szCs w:val="36"/>
-          <w:shd w:fill="auto" w:val="clear"/>
-          <w:lang w:val="en-US" w:eastAsia="zh-CN" w:bidi="hi-IN"/>
-        </w:rPr>
-        <w:t xml:space="preserve">os capítulos 21, 22 e 23 do Evangelho de Mateus, </w:t>
-      </w:r>
-      <w:r>
-        <w:rPr>
-          <w:rFonts w:eastAsia="Times New Roman" w:cs="Times New Roman" w:ascii="Garamond" w:hAnsi="Garamond"/>
-          <w:color w:val="000000"/>
-          <w:kern w:val="0"/>
-          <w:sz w:val="36"/>
-          <w:szCs w:val="36"/>
-          <w:shd w:fill="auto" w:val="clear"/>
-          <w:lang w:val="en-US" w:eastAsia="zh-CN" w:bidi="hi-IN"/>
-        </w:rPr>
-        <w:t>percebe-se claramente um crescente</w:t>
-      </w:r>
-      <w:r>
-        <w:rPr>
-          <w:rFonts w:eastAsia="Times New Roman" w:cs="Times New Roman" w:ascii="Garamond" w:hAnsi="Garamond"/>
-          <w:color w:val="000000"/>
-          <w:kern w:val="0"/>
-          <w:sz w:val="36"/>
-          <w:szCs w:val="36"/>
-          <w:shd w:fill="auto" w:val="clear"/>
-          <w:lang w:val="en-US" w:eastAsia="zh-CN" w:bidi="hi-IN"/>
-        </w:rPr>
-        <w:t xml:space="preserve"> clima de confronto entre Jesus e as lideranças religiosas da época. </w:t>
-      </w:r>
-    </w:p>
-    <w:p>
-      <w:pPr>
-        <w:pStyle w:val="Normal"/>
-        <w:jc w:val="both"/>
-        <w:rPr>
-          <w:sz w:val="36"/>
-          <w:szCs w:val="36"/>
-        </w:rPr>
-      </w:pPr>
-      <w:r>
-        <w:rPr/>
-      </w:r>
-    </w:p>
-    <w:p>
-      <w:pPr>
-        <w:pStyle w:val="Normal"/>
-        <w:jc w:val="both"/>
-        <w:rPr>
-          <w:sz w:val="36"/>
-          <w:szCs w:val="36"/>
-        </w:rPr>
-      </w:pPr>
-      <w:r>
-        <w:rPr>
-          <w:rFonts w:eastAsia="Times New Roman" w:cs="Times New Roman" w:ascii="Garamond" w:hAnsi="Garamond"/>
-          <w:color w:val="000000"/>
-          <w:kern w:val="0"/>
-          <w:sz w:val="36"/>
-          <w:szCs w:val="36"/>
-          <w:shd w:fill="auto" w:val="clear"/>
-          <w:lang w:val="en-US" w:eastAsia="zh-CN" w:bidi="hi-IN"/>
-        </w:rPr>
-        <w:t>O Mestre</w:t>
-      </w:r>
-      <w:r>
-        <w:rPr>
-          <w:rFonts w:eastAsia="Times New Roman" w:cs="Times New Roman" w:ascii="Garamond" w:hAnsi="Garamond"/>
-          <w:color w:val="000000"/>
-          <w:kern w:val="0"/>
-          <w:sz w:val="36"/>
-          <w:szCs w:val="36"/>
-          <w:shd w:fill="auto" w:val="clear"/>
-          <w:lang w:val="en-US" w:eastAsia="zh-CN" w:bidi="hi-IN"/>
-        </w:rPr>
-        <w:t xml:space="preserve"> começa mostrando que a fé sem frutos é estéril — como a figueira que seca — e que o templo não é lugar de comércio, mas de oração</w:t>
-      </w:r>
-      <w:r>
-        <w:rPr>
-          <w:rFonts w:eastAsia="Times New Roman" w:cs="Times New Roman" w:ascii="Garamond" w:hAnsi="Garamond"/>
-          <w:color w:val="000000"/>
-          <w:kern w:val="0"/>
-          <w:sz w:val="36"/>
-          <w:szCs w:val="36"/>
-          <w:shd w:fill="auto" w:val="clear"/>
-          <w:lang w:val="en-US" w:eastAsia="zh-CN" w:bidi="hi-IN"/>
-        </w:rPr>
-        <w:t xml:space="preserve"> — quando ele expulsa os vendilhões de lá</w:t>
-      </w:r>
-      <w:r>
-        <w:rPr>
-          <w:rFonts w:eastAsia="Times New Roman" w:cs="Times New Roman" w:ascii="Garamond" w:hAnsi="Garamond"/>
-          <w:color w:val="000000"/>
-          <w:kern w:val="0"/>
-          <w:sz w:val="36"/>
-          <w:szCs w:val="36"/>
-          <w:shd w:fill="auto" w:val="clear"/>
-          <w:lang w:val="en-US" w:eastAsia="zh-CN" w:bidi="hi-IN"/>
-        </w:rPr>
-        <w:t>. Em tudo isso, Jesus está denunciando a esterilidade da fé exterior e expõe o vazio de uma religião feita de ritos, vaidades e julgamentos.</w:t>
-      </w:r>
-    </w:p>
-    <w:p>
-      <w:pPr>
-        <w:pStyle w:val="Normal"/>
-        <w:jc w:val="both"/>
-        <w:rPr>
-          <w:sz w:val="36"/>
-          <w:szCs w:val="36"/>
-        </w:rPr>
-      </w:pPr>
-      <w:r>
-        <w:rPr/>
-      </w:r>
-    </w:p>
-    <w:p>
-      <w:pPr>
-        <w:pStyle w:val="Normal"/>
-        <w:jc w:val="both"/>
-        <w:rPr>
-          <w:sz w:val="36"/>
-          <w:szCs w:val="36"/>
-        </w:rPr>
-      </w:pPr>
-      <w:r>
-        <w:rPr>
-          <w:rFonts w:eastAsia="Times New Roman" w:cs="Times New Roman" w:ascii="Garamond" w:hAnsi="Garamond"/>
-          <w:color w:val="000000"/>
-          <w:kern w:val="0"/>
-          <w:sz w:val="36"/>
-          <w:szCs w:val="36"/>
-          <w:shd w:fill="auto" w:val="clear"/>
-          <w:lang w:val="en-US" w:eastAsia="zh-CN" w:bidi="hi-IN"/>
-        </w:rPr>
-        <w:t>Os fariseus e saduceus tentavam colocar Jesus à prova com perguntas e armadilhas, como quem procura um erro para desqualificá-lo. Mas Ele responde sempre com sabedoria, elevando o diálogo a um nível espiritual que eles não conseguiam alcançar. Quando perguntam qual é o maior mandamento, Jesus encerra o debate com uma resposta simples e definitiva:</w:t>
-      </w:r>
-    </w:p>
-    <w:p>
-      <w:pPr>
-        <w:pStyle w:val="Normal"/>
-        <w:jc w:val="both"/>
-        <w:rPr>
-          <w:sz w:val="36"/>
-          <w:szCs w:val="36"/>
-        </w:rPr>
-      </w:pPr>
-      <w:r>
-        <w:rPr/>
+        <w:t xml:space="preserve">Nos capítulos 21, 22 e 23 do Evangelho de Mateus, percebe-se claramente um crescente clima de confronto entre Jesus e as lideranças religiosas da época. </w:t>
+      </w:r>
+    </w:p>
+    <w:p>
+      <w:pPr>
+        <w:pStyle w:val="Normal"/>
+        <w:jc w:val="both"/>
+        <w:rPr>
+          <w:sz w:val="36"/>
+          <w:szCs w:val="36"/>
+        </w:rPr>
+      </w:pPr>
+      <w:r>
+        <w:rPr>
+          <w:sz w:val="36"/>
+          <w:szCs w:val="36"/>
+        </w:rPr>
+      </w:r>
+    </w:p>
+    <w:p>
+      <w:pPr>
+        <w:pStyle w:val="Normal"/>
+        <w:jc w:val="both"/>
+        <w:rPr>
+          <w:sz w:val="36"/>
+          <w:szCs w:val="36"/>
+        </w:rPr>
+      </w:pPr>
+      <w:r>
+        <w:rPr>
+          <w:rFonts w:eastAsia="Times New Roman" w:cs="Times New Roman" w:ascii="Garamond" w:hAnsi="Garamond"/>
+          <w:color w:val="000000"/>
+          <w:kern w:val="0"/>
+          <w:sz w:val="36"/>
+          <w:szCs w:val="36"/>
+          <w:shd w:fill="auto" w:val="clear"/>
+          <w:lang w:val="en-US" w:eastAsia="zh-CN" w:bidi="hi-IN"/>
+        </w:rPr>
+        <w:t>O Mestre começa mostrando que a fé sem frutos é estéril — como a figueira que seca — e que o templo não é lugar de comércio, mas de oração — quando ele expulsa os vendilhões de lá. Em tudo isso, Jesus está denunciando a esterilidade da fé exterior e expõe o vazio de uma religião feita de ritos, vaidades e julgamentos.</w:t>
+      </w:r>
+    </w:p>
+    <w:p>
+      <w:pPr>
+        <w:pStyle w:val="Normal"/>
+        <w:jc w:val="both"/>
+        <w:rPr>
+          <w:sz w:val="36"/>
+          <w:szCs w:val="36"/>
+        </w:rPr>
+      </w:pPr>
+      <w:r>
+        <w:rPr>
+          <w:sz w:val="36"/>
+          <w:szCs w:val="36"/>
+        </w:rPr>
+      </w:r>
+    </w:p>
+    <w:p>
+      <w:pPr>
+        <w:pStyle w:val="Normal"/>
+        <w:jc w:val="both"/>
+        <w:rPr>
+          <w:sz w:val="36"/>
+          <w:szCs w:val="36"/>
+        </w:rPr>
+      </w:pPr>
+      <w:r>
+        <w:rPr>
+          <w:rFonts w:eastAsia="Times New Roman" w:cs="Times New Roman" w:ascii="Garamond" w:hAnsi="Garamond"/>
+          <w:color w:val="000000"/>
+          <w:kern w:val="0"/>
+          <w:sz w:val="36"/>
+          <w:szCs w:val="36"/>
+          <w:shd w:fill="auto" w:val="clear"/>
+          <w:lang w:val="en-US" w:eastAsia="zh-CN" w:bidi="hi-IN"/>
+        </w:rPr>
+        <w:t xml:space="preserve">Os fariseus e saduceus </w:t>
+      </w:r>
+      <w:r>
+        <w:rPr>
+          <w:rFonts w:eastAsia="Times New Roman" w:cs="Times New Roman" w:ascii="Garamond" w:hAnsi="Garamond"/>
+          <w:color w:val="000000"/>
+          <w:kern w:val="0"/>
+          <w:sz w:val="36"/>
+          <w:szCs w:val="36"/>
+          <w:shd w:fill="auto" w:val="clear"/>
+          <w:lang w:val="en-US" w:eastAsia="zh-CN" w:bidi="hi-IN"/>
+        </w:rPr>
+        <w:t xml:space="preserve">faziam perguntas e criavam armadilhas com </w:t>
+      </w:r>
+      <w:r>
+        <w:rPr>
+          <w:rFonts w:eastAsia="Times New Roman" w:cs="Times New Roman" w:ascii="Garamond" w:hAnsi="Garamond"/>
+          <w:color w:val="000000"/>
+          <w:kern w:val="0"/>
+          <w:sz w:val="36"/>
+          <w:szCs w:val="36"/>
+          <w:shd w:fill="auto" w:val="clear"/>
+          <w:lang w:val="en-US" w:eastAsia="zh-CN" w:bidi="hi-IN"/>
+        </w:rPr>
+        <w:t>o único propósito</w:t>
+      </w:r>
+      <w:r>
+        <w:rPr>
+          <w:rFonts w:eastAsia="Times New Roman" w:cs="Times New Roman" w:ascii="Garamond" w:hAnsi="Garamond"/>
+          <w:color w:val="000000"/>
+          <w:kern w:val="0"/>
+          <w:sz w:val="36"/>
+          <w:szCs w:val="36"/>
+          <w:shd w:fill="auto" w:val="clear"/>
+          <w:lang w:val="en-US" w:eastAsia="zh-CN" w:bidi="hi-IN"/>
+        </w:rPr>
+        <w:t xml:space="preserve"> de fazer Jesus cair em contradição</w:t>
+      </w:r>
+      <w:r>
+        <w:rPr>
+          <w:rFonts w:eastAsia="Times New Roman" w:cs="Times New Roman" w:ascii="Garamond" w:hAnsi="Garamond"/>
+          <w:color w:val="000000"/>
+          <w:kern w:val="0"/>
+          <w:sz w:val="36"/>
+          <w:szCs w:val="36"/>
+          <w:shd w:fill="auto" w:val="clear"/>
+          <w:lang w:val="en-US" w:eastAsia="zh-CN" w:bidi="hi-IN"/>
+        </w:rPr>
+        <w:t xml:space="preserve">; tudo o que eles queriam era desacreditar o Mestre. </w:t>
+      </w:r>
+    </w:p>
+    <w:p>
+      <w:pPr>
+        <w:pStyle w:val="Normal"/>
+        <w:jc w:val="both"/>
+        <w:rPr>
+          <w:sz w:val="36"/>
+          <w:szCs w:val="36"/>
+        </w:rPr>
+      </w:pPr>
+      <w:r>
+        <w:rPr/>
+      </w:r>
+    </w:p>
+    <w:p>
+      <w:pPr>
+        <w:pStyle w:val="Normal"/>
+        <w:jc w:val="both"/>
+        <w:rPr>
+          <w:sz w:val="36"/>
+          <w:szCs w:val="36"/>
+        </w:rPr>
+      </w:pPr>
+      <w:r>
+        <w:rPr>
+          <w:rFonts w:eastAsia="Times New Roman" w:cs="Times New Roman" w:ascii="Garamond" w:hAnsi="Garamond"/>
+          <w:color w:val="000000"/>
+          <w:kern w:val="0"/>
+          <w:sz w:val="36"/>
+          <w:szCs w:val="36"/>
+          <w:shd w:fill="auto" w:val="clear"/>
+          <w:lang w:val="en-US" w:eastAsia="zh-CN" w:bidi="hi-IN"/>
+        </w:rPr>
+        <w:t>Embora tanto os fariseus quanto os saduceus tenham confrontado Jesus, havia entre eles diferenças bem marcantes.</w:t>
+      </w:r>
+    </w:p>
+    <w:p>
+      <w:pPr>
+        <w:pStyle w:val="Normal"/>
+        <w:jc w:val="both"/>
+        <w:rPr>
+          <w:sz w:val="36"/>
+          <w:szCs w:val="36"/>
+        </w:rPr>
+      </w:pPr>
+      <w:r>
+        <w:rPr>
+          <w:rFonts w:eastAsia="Times New Roman" w:cs="Times New Roman" w:ascii="Garamond" w:hAnsi="Garamond"/>
+          <w:color w:val="000000"/>
+          <w:kern w:val="0"/>
+          <w:sz w:val="36"/>
+          <w:szCs w:val="36"/>
+          <w:shd w:fill="auto" w:val="clear"/>
+          <w:lang w:val="en-US" w:eastAsia="zh-CN" w:bidi="hi-IN"/>
+        </w:rPr>
+        <w:t>Os saduceus formavam um grupo pequeno, ligado às elites sacerdotais e políticas de Jerusalém. Eles se apegavam somente à Torá escrita — os cinco livros de Moisés — e não acreditavam na imortalidade da alma nem na existência dos espíritos.</w:t>
+      </w:r>
+    </w:p>
+    <w:p>
+      <w:pPr>
+        <w:pStyle w:val="Normal"/>
+        <w:jc w:val="both"/>
+        <w:rPr>
+          <w:sz w:val="36"/>
+          <w:szCs w:val="36"/>
+        </w:rPr>
+      </w:pPr>
+      <w:r>
+        <w:rPr/>
+      </w:r>
+    </w:p>
+    <w:p>
+      <w:pPr>
+        <w:pStyle w:val="Normal"/>
+        <w:jc w:val="both"/>
+        <w:rPr>
+          <w:sz w:val="36"/>
+          <w:szCs w:val="36"/>
+        </w:rPr>
+      </w:pPr>
+      <w:r>
+        <w:rPr>
+          <w:rFonts w:eastAsia="Times New Roman" w:cs="Times New Roman" w:ascii="Garamond" w:hAnsi="Garamond"/>
+          <w:color w:val="000000"/>
+          <w:kern w:val="0"/>
+          <w:sz w:val="36"/>
+          <w:szCs w:val="36"/>
+          <w:shd w:fill="auto" w:val="clear"/>
+          <w:lang w:val="en-US" w:eastAsia="zh-CN" w:bidi="hi-IN"/>
+        </w:rPr>
+        <w:t>Para os saduceus, toda recompensa divina acontecia aqui mesmo, na vida terrena. A fé, para eles, era algo exterior — uma prática sustentada pelo poder e pelas aparências.</w:t>
+      </w:r>
+    </w:p>
+    <w:p>
+      <w:pPr>
+        <w:pStyle w:val="Normal"/>
+        <w:jc w:val="both"/>
+        <w:rPr>
+          <w:sz w:val="36"/>
+          <w:szCs w:val="36"/>
+        </w:rPr>
+      </w:pPr>
+      <w:r>
+        <w:rPr/>
+      </w:r>
+    </w:p>
+    <w:p>
+      <w:pPr>
+        <w:pStyle w:val="Normal"/>
+        <w:jc w:val="both"/>
+        <w:rPr>
+          <w:sz w:val="36"/>
+          <w:szCs w:val="36"/>
+        </w:rPr>
+      </w:pPr>
+      <w:r>
+        <w:rPr>
+          <w:rFonts w:eastAsia="Times New Roman" w:cs="Times New Roman" w:ascii="Garamond" w:hAnsi="Garamond"/>
+          <w:color w:val="000000"/>
+          <w:kern w:val="0"/>
+          <w:sz w:val="36"/>
+          <w:szCs w:val="36"/>
+          <w:shd w:fill="auto" w:val="clear"/>
+          <w:lang w:val="en-US" w:eastAsia="zh-CN" w:bidi="hi-IN"/>
+        </w:rPr>
+        <w:t>Os fariseus, por outro lado, eram estudiosos e muito dedicados ao cumprimento da Lei. Mas a crença deles ia além da Torá: eles aceitavam todos os livros sagrados do judaísmo — o que hoje conhecemos como Antigo Testamento — e também valorizavam o que chamavam de “Lei Oral”.</w:t>
+      </w:r>
+    </w:p>
+    <w:p>
+      <w:pPr>
+        <w:pStyle w:val="Normal"/>
+        <w:jc w:val="both"/>
+        <w:rPr>
+          <w:sz w:val="36"/>
+          <w:szCs w:val="36"/>
+        </w:rPr>
+      </w:pPr>
+      <w:r>
+        <w:rPr/>
+      </w:r>
+    </w:p>
+    <w:p>
+      <w:pPr>
+        <w:pStyle w:val="Normal"/>
+        <w:jc w:val="both"/>
+        <w:rPr>
+          <w:sz w:val="36"/>
+          <w:szCs w:val="36"/>
+        </w:rPr>
+      </w:pPr>
+      <w:r>
+        <w:rPr>
+          <w:rFonts w:eastAsia="Times New Roman" w:cs="Times New Roman" w:ascii="Garamond" w:hAnsi="Garamond"/>
+          <w:color w:val="000000"/>
+          <w:kern w:val="0"/>
+          <w:sz w:val="36"/>
+          <w:szCs w:val="36"/>
+          <w:shd w:fill="auto" w:val="clear"/>
+          <w:lang w:val="en-US" w:eastAsia="zh-CN" w:bidi="hi-IN"/>
+        </w:rPr>
+        <w:t>Essa Lei Oral era o conjunto de tradições e interpretações passadas de geração em geração. Ela explicava como aplicar a Lei escrita nas situações do dia a dia. Os fariseus também acreditavam na vida espiritual e na ressurreição.</w:t>
+      </w:r>
+    </w:p>
+    <w:p>
+      <w:pPr>
+        <w:pStyle w:val="Normal"/>
+        <w:jc w:val="both"/>
+        <w:rPr>
+          <w:sz w:val="36"/>
+          <w:szCs w:val="36"/>
+        </w:rPr>
+      </w:pPr>
+      <w:r>
+        <w:rPr/>
+      </w:r>
+    </w:p>
+    <w:p>
+      <w:pPr>
+        <w:pStyle w:val="Normal"/>
+        <w:jc w:val="both"/>
+        <w:rPr>
+          <w:sz w:val="36"/>
+          <w:szCs w:val="36"/>
+        </w:rPr>
+      </w:pPr>
+      <w:r>
+        <w:rPr>
+          <w:rFonts w:eastAsia="Times New Roman" w:cs="Times New Roman" w:ascii="Garamond" w:hAnsi="Garamond"/>
+          <w:color w:val="000000"/>
+          <w:kern w:val="0"/>
+          <w:sz w:val="36"/>
+          <w:szCs w:val="36"/>
+          <w:shd w:fill="auto" w:val="clear"/>
+          <w:lang w:val="en-US" w:eastAsia="zh-CN" w:bidi="hi-IN"/>
+        </w:rPr>
+        <w:t>O problema é que, com o tempo, muitos deles começaram a se apegar demais às regras e às aparências. Cumpriam tudo à risca, mas deixavam o coração de fora. A fé virou um exercício de vaidade, mais preocupado com a forma do que com o espírito.</w:t>
+      </w:r>
+    </w:p>
+    <w:p>
+      <w:pPr>
+        <w:pStyle w:val="Normal"/>
+        <w:jc w:val="both"/>
+        <w:rPr>
+          <w:sz w:val="36"/>
+          <w:szCs w:val="36"/>
+        </w:rPr>
+      </w:pPr>
+      <w:r>
+        <w:rPr/>
+      </w:r>
+    </w:p>
+    <w:p>
+      <w:pPr>
+        <w:pStyle w:val="Normal"/>
+        <w:jc w:val="both"/>
+        <w:rPr>
+          <w:sz w:val="36"/>
+          <w:szCs w:val="36"/>
+        </w:rPr>
+      </w:pPr>
+      <w:r>
+        <w:rPr>
+          <w:rFonts w:eastAsia="Times New Roman" w:cs="Times New Roman" w:ascii="Garamond" w:hAnsi="Garamond"/>
+          <w:color w:val="000000"/>
+          <w:kern w:val="0"/>
+          <w:sz w:val="36"/>
+          <w:szCs w:val="36"/>
+          <w:shd w:fill="auto" w:val="clear"/>
+          <w:lang w:val="en-US" w:eastAsia="zh-CN" w:bidi="hi-IN"/>
+        </w:rPr>
+        <w:t>Por isso, Jesus foi mais duro com eles. Porque, apesar de estarem mais próximos da verdade, acabaram se distanciando da essência dela — que é o amor e a humildade.</w:t>
+      </w:r>
+    </w:p>
+    <w:p>
+      <w:pPr>
+        <w:pStyle w:val="Normal"/>
+        <w:jc w:val="both"/>
+        <w:rPr>
+          <w:sz w:val="36"/>
+          <w:szCs w:val="36"/>
+        </w:rPr>
+      </w:pPr>
+      <w:r>
+        <w:rPr/>
+      </w:r>
+    </w:p>
+    <w:p>
+      <w:pPr>
+        <w:pStyle w:val="Normal"/>
+        <w:jc w:val="both"/>
+        <w:rPr>
+          <w:sz w:val="36"/>
+          <w:szCs w:val="36"/>
+        </w:rPr>
+      </w:pPr>
+      <w:r>
+        <w:rPr>
+          <w:rFonts w:eastAsia="Times New Roman" w:cs="Times New Roman" w:ascii="Garamond" w:hAnsi="Garamond"/>
+          <w:color w:val="000000"/>
+          <w:kern w:val="0"/>
+          <w:sz w:val="36"/>
+          <w:szCs w:val="36"/>
+          <w:shd w:fill="auto" w:val="clear"/>
+          <w:lang w:val="en-US" w:eastAsia="zh-CN" w:bidi="hi-IN"/>
+        </w:rPr>
+        <w:t>Apesar dessas diferenças acentuadas entre as crenças dos saduceus e dos fariseus, ambos confrontaram Jesus e nesses embates, o Mestre</w:t>
+      </w:r>
+      <w:r>
+        <w:rPr>
+          <w:rFonts w:eastAsia="Times New Roman" w:cs="Times New Roman" w:ascii="Garamond" w:hAnsi="Garamond"/>
+          <w:color w:val="000000"/>
+          <w:kern w:val="0"/>
+          <w:sz w:val="36"/>
+          <w:szCs w:val="36"/>
+          <w:shd w:fill="auto" w:val="clear"/>
+          <w:lang w:val="en-US" w:eastAsia="zh-CN" w:bidi="hi-IN"/>
+        </w:rPr>
+        <w:t xml:space="preserve"> sempre</w:t>
+      </w:r>
+      <w:r>
+        <w:rPr>
+          <w:rFonts w:eastAsia="Times New Roman" w:cs="Times New Roman" w:ascii="Garamond" w:hAnsi="Garamond"/>
+          <w:color w:val="000000"/>
+          <w:kern w:val="0"/>
+          <w:sz w:val="36"/>
+          <w:szCs w:val="36"/>
+          <w:shd w:fill="auto" w:val="clear"/>
+          <w:lang w:val="en-US" w:eastAsia="zh-CN" w:bidi="hi-IN"/>
+        </w:rPr>
+        <w:t xml:space="preserve"> respondeu</w:t>
+      </w:r>
+      <w:r>
+        <w:rPr>
+          <w:rFonts w:eastAsia="Times New Roman" w:cs="Times New Roman" w:ascii="Garamond" w:hAnsi="Garamond"/>
+          <w:color w:val="000000"/>
+          <w:kern w:val="0"/>
+          <w:sz w:val="36"/>
+          <w:szCs w:val="36"/>
+          <w:shd w:fill="auto" w:val="clear"/>
+          <w:lang w:val="en-US" w:eastAsia="zh-CN" w:bidi="hi-IN"/>
+        </w:rPr>
+        <w:t xml:space="preserve"> com sabedoria, elevando o diálogo a um nível espiritual que eles não conseguiam alcançar. </w:t>
+      </w:r>
+    </w:p>
+    <w:p>
+      <w:pPr>
+        <w:pStyle w:val="Normal"/>
+        <w:jc w:val="both"/>
+        <w:rPr>
+          <w:sz w:val="36"/>
+          <w:szCs w:val="36"/>
+        </w:rPr>
+      </w:pPr>
+      <w:r>
+        <w:rPr/>
+      </w:r>
+    </w:p>
+    <w:p>
+      <w:pPr>
+        <w:pStyle w:val="Normal"/>
+        <w:jc w:val="both"/>
+        <w:rPr>
+          <w:sz w:val="36"/>
+          <w:szCs w:val="36"/>
+        </w:rPr>
+      </w:pPr>
+      <w:r>
+        <w:rPr>
+          <w:rFonts w:eastAsia="Times New Roman" w:cs="Times New Roman" w:ascii="Garamond" w:hAnsi="Garamond"/>
+          <w:color w:val="000000"/>
+          <w:kern w:val="0"/>
+          <w:sz w:val="36"/>
+          <w:szCs w:val="36"/>
+          <w:shd w:fill="auto" w:val="clear"/>
+          <w:lang w:val="en-US" w:eastAsia="zh-CN" w:bidi="hi-IN"/>
+        </w:rPr>
+        <w:t>Então, q</w:t>
+      </w:r>
+      <w:r>
+        <w:rPr>
+          <w:rFonts w:eastAsia="Times New Roman" w:cs="Times New Roman" w:ascii="Garamond" w:hAnsi="Garamond"/>
+          <w:color w:val="000000"/>
+          <w:kern w:val="0"/>
+          <w:sz w:val="36"/>
+          <w:szCs w:val="36"/>
+          <w:shd w:fill="auto" w:val="clear"/>
+          <w:lang w:val="en-US" w:eastAsia="zh-CN" w:bidi="hi-IN"/>
+        </w:rPr>
+        <w:t>uando perguntam qual é o maior mandamento, Jesus encerra o debate com uma resposta simples e definitiva:</w:t>
+      </w:r>
+    </w:p>
+    <w:p>
+      <w:pPr>
+        <w:pStyle w:val="Normal"/>
+        <w:jc w:val="both"/>
+        <w:rPr>
+          <w:sz w:val="36"/>
+          <w:szCs w:val="36"/>
+        </w:rPr>
+      </w:pPr>
+      <w:r>
+        <w:rPr>
+          <w:sz w:val="36"/>
+          <w:szCs w:val="36"/>
+        </w:rPr>
       </w:r>
     </w:p>
     <w:p>
@@ -517,20 +852,7 @@
           <w:shd w:fill="auto" w:val="clear"/>
           <w:lang w:val="en-US" w:eastAsia="zh-CN" w:bidi="hi-IN"/>
         </w:rPr>
-        <w:t>Amarás o Senhor teu Deus de todo o teu coração, de toda a tua alma e de todo o teu entendimento. E amarás o teu próximo como a ti mesmo.”</w:t>
-      </w:r>
-    </w:p>
-    <w:p>
-      <w:pPr>
-        <w:pStyle w:val="Normal"/>
-        <w:jc w:val="both"/>
-        <w:rPr>
-          <w:sz w:val="36"/>
-          <w:szCs w:val="36"/>
-        </w:rPr>
-      </w:pPr>
-      <w:r>
-        <w:rPr/>
+        <w:t>Amarás o Senhor teu Deus de todo o teu coração, e de toda a tua alma, e de todo o teu pensamento. E amarás o teu próximo como a ti mesmo.”</w:t>
       </w:r>
     </w:p>
     <w:p>
@@ -565,7 +887,10 @@
         </w:rPr>
       </w:pPr>
       <w:r>
-        <w:rPr/>
+        <w:rPr>
+          <w:sz w:val="36"/>
+          <w:szCs w:val="36"/>
+        </w:rPr>
       </w:r>
     </w:p>
     <w:p>
@@ -591,7 +916,7 @@
           <w:shd w:fill="auto" w:val="clear"/>
           <w:lang w:val="en-US" w:eastAsia="zh-CN" w:bidi="hi-IN"/>
         </w:rPr>
-        <w:t>"</w:t>
+        <w:t xml:space="preserve">"Já que </w:t>
       </w:r>
       <w:r>
         <w:rPr>
@@ -605,7 +930,7 @@
           <w:shd w:fill="auto" w:val="clear"/>
           <w:lang w:val="en-US" w:eastAsia="zh-CN" w:bidi="hi-IN"/>
         </w:rPr>
-        <w:t>Já que procura</w:t>
+        <w:t>vocês estão buscando atalhos e fugas para não promoverem a transformação espiritual, então vou dar a vocês um ensinamento do qual não poderão fingir desconhecimento</w:t>
       </w:r>
       <w:r>
         <w:rPr>
@@ -619,22 +944,285 @@
           <w:shd w:fill="auto" w:val="clear"/>
           <w:lang w:val="en-US" w:eastAsia="zh-CN" w:bidi="hi-IN"/>
         </w:rPr>
-        <w:t>ram</w:t>
-      </w:r>
-      <w:r>
-        <w:rPr>
-          <w:rFonts w:eastAsia="Times New Roman" w:cs="Times New Roman" w:ascii="Garamond" w:hAnsi="Garamond"/>
+        <w:t>.”</w:t>
+      </w:r>
+    </w:p>
+    <w:p>
+      <w:pPr>
+        <w:pStyle w:val="Normal"/>
+        <w:jc w:val="both"/>
+        <w:rPr>
+          <w:sz w:val="36"/>
+          <w:szCs w:val="36"/>
+        </w:rPr>
+      </w:pPr>
+      <w:r>
+        <w:rPr>
+          <w:sz w:val="36"/>
+          <w:szCs w:val="36"/>
+        </w:rPr>
+      </w:r>
+    </w:p>
+    <w:p>
+      <w:pPr>
+        <w:pStyle w:val="Normal"/>
+        <w:jc w:val="both"/>
+        <w:rPr>
+          <w:sz w:val="36"/>
+          <w:szCs w:val="36"/>
+        </w:rPr>
+      </w:pPr>
+      <w:r>
+        <w:rPr>
+          <w:rFonts w:eastAsia="Times New Roman" w:cs="Times New Roman" w:ascii="Garamond" w:hAnsi="Garamond"/>
+          <w:color w:val="000000"/>
+          <w:kern w:val="0"/>
+          <w:sz w:val="36"/>
+          <w:szCs w:val="36"/>
+          <w:shd w:fill="auto" w:val="clear"/>
+          <w:lang w:val="en-US" w:eastAsia="zh-CN" w:bidi="hi-IN"/>
+        </w:rPr>
+        <w:t xml:space="preserve">Com </w:t>
+      </w:r>
+      <w:r>
+        <w:rPr>
+          <w:rFonts w:eastAsia="Times New Roman" w:cs="Times New Roman" w:ascii="Garamond" w:hAnsi="Garamond"/>
+          <w:color w:val="000000"/>
+          <w:kern w:val="0"/>
+          <w:sz w:val="36"/>
+          <w:szCs w:val="36"/>
+          <w:shd w:fill="auto" w:val="clear"/>
+          <w:lang w:val="en-US" w:eastAsia="zh-CN" w:bidi="hi-IN"/>
+        </w:rPr>
+        <w:t>o mandamento maior,</w:t>
+      </w:r>
+      <w:r>
+        <w:rPr>
+          <w:rFonts w:eastAsia="Times New Roman" w:cs="Times New Roman" w:ascii="Garamond" w:hAnsi="Garamond"/>
+          <w:color w:val="000000"/>
+          <w:kern w:val="0"/>
+          <w:sz w:val="36"/>
+          <w:szCs w:val="36"/>
+          <w:shd w:fill="auto" w:val="clear"/>
+          <w:lang w:val="en-US" w:eastAsia="zh-CN" w:bidi="hi-IN"/>
+        </w:rPr>
+        <w:t xml:space="preserve"> Jesus dissolve</w:t>
+      </w:r>
+      <w:r>
+        <w:rPr>
+          <w:rFonts w:eastAsia="Times New Roman" w:cs="Times New Roman" w:ascii="Garamond" w:hAnsi="Garamond"/>
+          <w:color w:val="000000"/>
+          <w:kern w:val="0"/>
+          <w:sz w:val="36"/>
+          <w:szCs w:val="36"/>
+          <w:shd w:fill="auto" w:val="clear"/>
+          <w:lang w:val="en-US" w:eastAsia="zh-CN" w:bidi="hi-IN"/>
+        </w:rPr>
+        <w:t>u</w:t>
+      </w:r>
+      <w:r>
+        <w:rPr>
+          <w:rFonts w:eastAsia="Times New Roman" w:cs="Times New Roman" w:ascii="Garamond" w:hAnsi="Garamond"/>
+          <w:color w:val="000000"/>
+          <w:kern w:val="0"/>
+          <w:sz w:val="36"/>
+          <w:szCs w:val="36"/>
+          <w:shd w:fill="auto" w:val="clear"/>
+          <w:lang w:val="en-US" w:eastAsia="zh-CN" w:bidi="hi-IN"/>
+        </w:rPr>
+        <w:t xml:space="preserve"> a hipocrisia e expô</w:t>
+      </w:r>
+      <w:r>
+        <w:rPr>
+          <w:rFonts w:eastAsia="Times New Roman" w:cs="Times New Roman" w:ascii="Garamond" w:hAnsi="Garamond"/>
+          <w:color w:val="000000"/>
+          <w:kern w:val="0"/>
+          <w:sz w:val="36"/>
+          <w:szCs w:val="36"/>
+          <w:shd w:fill="auto" w:val="clear"/>
+          <w:lang w:val="en-US" w:eastAsia="zh-CN" w:bidi="hi-IN"/>
+        </w:rPr>
+        <w:t>s</w:t>
+      </w:r>
+      <w:r>
+        <w:rPr>
+          <w:rFonts w:eastAsia="Times New Roman" w:cs="Times New Roman" w:ascii="Garamond" w:hAnsi="Garamond"/>
+          <w:color w:val="000000"/>
+          <w:kern w:val="0"/>
+          <w:sz w:val="36"/>
+          <w:szCs w:val="36"/>
+          <w:shd w:fill="auto" w:val="clear"/>
+          <w:lang w:val="en-US" w:eastAsia="zh-CN" w:bidi="hi-IN"/>
+        </w:rPr>
+        <w:t xml:space="preserve"> a superficialidade da religião exterior</w:t>
+      </w:r>
+      <w:r>
+        <w:rPr>
+          <w:rFonts w:eastAsia="Times New Roman" w:cs="Times New Roman" w:ascii="Garamond" w:hAnsi="Garamond"/>
+          <w:color w:val="000000"/>
+          <w:kern w:val="0"/>
+          <w:sz w:val="36"/>
+          <w:szCs w:val="36"/>
+          <w:shd w:fill="auto" w:val="clear"/>
+          <w:lang w:val="en-US" w:eastAsia="zh-CN" w:bidi="hi-IN"/>
+        </w:rPr>
+        <w:t xml:space="preserve"> vivida por aquelas pessoas.</w:t>
+      </w:r>
+    </w:p>
+    <w:p>
+      <w:pPr>
+        <w:pStyle w:val="Normal"/>
+        <w:jc w:val="both"/>
+        <w:rPr>
+          <w:sz w:val="36"/>
+          <w:szCs w:val="36"/>
+        </w:rPr>
+      </w:pPr>
+      <w:r>
+        <w:rPr/>
+      </w:r>
+    </w:p>
+    <w:p>
+      <w:pPr>
+        <w:pStyle w:val="Normal"/>
+        <w:jc w:val="both"/>
+        <w:rPr>
+          <w:sz w:val="36"/>
+          <w:szCs w:val="36"/>
+        </w:rPr>
+      </w:pPr>
+      <w:r>
+        <w:rPr>
+          <w:rFonts w:eastAsia="Times New Roman" w:cs="Times New Roman" w:ascii="Garamond" w:hAnsi="Garamond"/>
+          <w:color w:val="000000"/>
+          <w:kern w:val="0"/>
+          <w:sz w:val="36"/>
+          <w:szCs w:val="36"/>
+          <w:shd w:fill="auto" w:val="clear"/>
+          <w:lang w:val="en-US" w:eastAsia="zh-CN" w:bidi="hi-IN"/>
+        </w:rPr>
+        <w:t>E</w:t>
+      </w:r>
+      <w:r>
+        <w:rPr>
+          <w:rFonts w:eastAsia="Times New Roman" w:cs="Times New Roman" w:ascii="Garamond" w:hAnsi="Garamond"/>
+          <w:color w:val="000000"/>
+          <w:kern w:val="0"/>
+          <w:sz w:val="36"/>
+          <w:szCs w:val="36"/>
+          <w:shd w:fill="auto" w:val="clear"/>
+          <w:lang w:val="en-US" w:eastAsia="zh-CN" w:bidi="hi-IN"/>
+        </w:rPr>
+        <w:t>sse comportamento combatido por Jesus permanece conosco até os dias de hoje. Passados mais de 2000 mil anos, continuamos exigindo muitas condições para fazer o bem. Escolhemos a quem, como e onde fazer o bem. E não pode ser assim.</w:t>
+      </w:r>
+    </w:p>
+    <w:p>
+      <w:pPr>
+        <w:pStyle w:val="Normal"/>
+        <w:jc w:val="both"/>
+        <w:rPr>
+          <w:sz w:val="36"/>
+          <w:szCs w:val="36"/>
+        </w:rPr>
+      </w:pPr>
+      <w:r>
+        <w:rPr/>
+      </w:r>
+    </w:p>
+    <w:p>
+      <w:pPr>
+        <w:pStyle w:val="Normal"/>
+        <w:jc w:val="both"/>
+        <w:rPr>
+          <w:sz w:val="36"/>
+          <w:szCs w:val="36"/>
+        </w:rPr>
+      </w:pPr>
+      <w:r>
+        <w:rPr>
+          <w:rFonts w:eastAsia="Times New Roman" w:cs="Times New Roman" w:ascii="Garamond" w:hAnsi="Garamond"/>
+          <w:color w:val="000000"/>
+          <w:kern w:val="0"/>
+          <w:sz w:val="36"/>
+          <w:szCs w:val="36"/>
+          <w:shd w:fill="auto" w:val="clear"/>
+          <w:lang w:val="en-US" w:eastAsia="zh-CN" w:bidi="hi-IN"/>
+        </w:rPr>
+        <w:t xml:space="preserve">Sem querer traçar qualquer comparação entre o mentor espiritual dessa casa e o nosso Mestre Jesus Cristo, podemos dizer sem nenhum receio de errar, que o Irmão Glacus reafirma o convite para "amar ao próximo" ensinado por Jesus. </w:t>
+      </w:r>
+    </w:p>
+    <w:p>
+      <w:pPr>
+        <w:pStyle w:val="Normal"/>
+        <w:jc w:val="both"/>
+        <w:rPr>
+          <w:sz w:val="36"/>
+          <w:szCs w:val="36"/>
+        </w:rPr>
+      </w:pPr>
+      <w:r>
+        <w:rPr/>
+      </w:r>
+    </w:p>
+    <w:p>
+      <w:pPr>
+        <w:pStyle w:val="Normal"/>
+        <w:jc w:val="both"/>
+        <w:rPr>
+          <w:sz w:val="36"/>
+          <w:szCs w:val="36"/>
+        </w:rPr>
+      </w:pPr>
+      <w:r>
+        <w:rPr>
+          <w:rFonts w:eastAsia="Times New Roman" w:cs="Times New Roman" w:ascii="Garamond" w:hAnsi="Garamond"/>
+          <w:color w:val="000000"/>
+          <w:kern w:val="0"/>
+          <w:sz w:val="36"/>
+          <w:szCs w:val="36"/>
+          <w:shd w:fill="auto" w:val="clear"/>
+          <w:lang w:val="en-US" w:eastAsia="zh-CN" w:bidi="hi-IN"/>
+        </w:rPr>
+        <w:t>Qual é o lema dessa casa?</w:t>
+      </w:r>
+    </w:p>
+    <w:p>
+      <w:pPr>
+        <w:pStyle w:val="Normal"/>
+        <w:jc w:val="both"/>
+        <w:rPr>
+          <w:sz w:val="36"/>
+          <w:szCs w:val="36"/>
+        </w:rPr>
+      </w:pPr>
+      <w:r>
+        <w:rPr/>
+      </w:r>
+    </w:p>
+    <w:p>
+      <w:pPr>
+        <w:pStyle w:val="Normal"/>
+        <w:jc w:val="both"/>
+        <w:rPr>
+          <w:sz w:val="36"/>
+          <w:szCs w:val="36"/>
+        </w:rPr>
+      </w:pPr>
+      <w:r>
+        <w:rPr/>
+      </w:r>
+    </w:p>
+    <w:p>
+      <w:pPr>
+        <w:pStyle w:val="Normal"/>
+        <w:ind w:left="720" w:hanging="0"/>
+        <w:jc w:val="both"/>
+        <w:rPr>
+          <w:i/>
           <w:i/>
           <w:iCs/>
-          <w:color w:val="000000"/>
-          <w:kern w:val="0"/>
-          <w:sz w:val="36"/>
-          <w:szCs w:val="36"/>
-          <w:shd w:fill="auto" w:val="clear"/>
-          <w:lang w:val="en-US" w:eastAsia="zh-CN" w:bidi="hi-IN"/>
-        </w:rPr>
-        <w:t xml:space="preserve"> atalhos e justificativas para não </w:t>
-      </w:r>
+        </w:rPr>
+      </w:pPr>
       <w:r>
         <w:rPr>
           <w:rFonts w:eastAsia="Times New Roman" w:cs="Times New Roman" w:ascii="Garamond" w:hAnsi="Garamond"/>
@@ -647,7 +1235,7 @@
           <w:shd w:fill="auto" w:val="clear"/>
           <w:lang w:val="en-US" w:eastAsia="zh-CN" w:bidi="hi-IN"/>
         </w:rPr>
-        <w:t xml:space="preserve">se </w:t>
+        <w:t>O</w:t>
       </w:r>
       <w:r>
         <w:rPr>
@@ -661,22 +1249,196 @@
           <w:shd w:fill="auto" w:val="clear"/>
           <w:lang w:val="en-US" w:eastAsia="zh-CN" w:bidi="hi-IN"/>
         </w:rPr>
-        <w:t>transformar</w:t>
-      </w:r>
-      <w:r>
-        <w:rPr>
-          <w:rFonts w:eastAsia="Times New Roman" w:cs="Times New Roman" w:ascii="Garamond" w:hAnsi="Garamond"/>
+        <w:t xml:space="preserve"> compromisso da FEIG é com o ser humano.</w:t>
+      </w:r>
+    </w:p>
+    <w:p>
+      <w:pPr>
+        <w:pStyle w:val="Normal"/>
+        <w:jc w:val="both"/>
+        <w:rPr>
+          <w:sz w:val="36"/>
+          <w:szCs w:val="36"/>
+        </w:rPr>
+      </w:pPr>
+      <w:r>
+        <w:rPr/>
+      </w:r>
+    </w:p>
+    <w:p>
+      <w:pPr>
+        <w:pStyle w:val="Normal"/>
+        <w:jc w:val="both"/>
+        <w:rPr>
+          <w:sz w:val="36"/>
+          <w:szCs w:val="36"/>
+        </w:rPr>
+      </w:pPr>
+      <w:r>
+        <w:rPr>
+          <w:rFonts w:eastAsia="Times New Roman" w:cs="Times New Roman" w:ascii="Garamond" w:hAnsi="Garamond"/>
+          <w:color w:val="000000"/>
+          <w:kern w:val="0"/>
+          <w:sz w:val="36"/>
+          <w:szCs w:val="36"/>
+          <w:shd w:fill="auto" w:val="clear"/>
+          <w:lang w:val="en-US" w:eastAsia="zh-CN" w:bidi="hi-IN"/>
+        </w:rPr>
+        <w:t>Alguém tem dúvidas sobre o que o Irmão Glacus quis dizer com essas palavras? Seria correto eu fazer o bem somente aos espíritas, aos cristãos, aos familiares, amigos, às pessoas que pensam como eu?</w:t>
+      </w:r>
+    </w:p>
+    <w:p>
+      <w:pPr>
+        <w:pStyle w:val="Normal"/>
+        <w:jc w:val="both"/>
+        <w:rPr>
+          <w:sz w:val="36"/>
+          <w:szCs w:val="36"/>
+        </w:rPr>
+      </w:pPr>
+      <w:r>
+        <w:rPr/>
+      </w:r>
+    </w:p>
+    <w:p>
+      <w:pPr>
+        <w:pStyle w:val="Normal"/>
+        <w:jc w:val="both"/>
+        <w:rPr>
+          <w:sz w:val="36"/>
+          <w:szCs w:val="36"/>
+        </w:rPr>
+      </w:pPr>
+      <w:r>
+        <w:rPr>
+          <w:rFonts w:eastAsia="Times New Roman" w:cs="Times New Roman" w:ascii="Garamond" w:hAnsi="Garamond"/>
+          <w:color w:val="000000"/>
+          <w:kern w:val="0"/>
+          <w:sz w:val="36"/>
+          <w:szCs w:val="36"/>
+          <w:shd w:fill="auto" w:val="clear"/>
+          <w:lang w:val="en-US" w:eastAsia="zh-CN" w:bidi="hi-IN"/>
+        </w:rPr>
+        <w:t>Não, não há margem para essa seletividade. Como membros integrantes da família espiritual que essa casa representa, nosso compromisso é com o ser humano, qualquer que seja ele.</w:t>
+      </w:r>
+    </w:p>
+    <w:p>
+      <w:pPr>
+        <w:pStyle w:val="Normal"/>
+        <w:jc w:val="both"/>
+        <w:rPr>
+          <w:sz w:val="36"/>
+          <w:szCs w:val="36"/>
+        </w:rPr>
+      </w:pPr>
+      <w:r>
+        <w:rPr>
+          <w:sz w:val="36"/>
+          <w:szCs w:val="36"/>
+        </w:rPr>
+      </w:r>
+    </w:p>
+    <w:p>
+      <w:pPr>
+        <w:pStyle w:val="Normal"/>
+        <w:jc w:val="both"/>
+        <w:rPr>
+          <w:sz w:val="36"/>
+          <w:szCs w:val="36"/>
+        </w:rPr>
+      </w:pPr>
+      <w:r>
+        <w:rPr>
+          <w:rFonts w:eastAsia="Times New Roman" w:cs="Times New Roman" w:ascii="Garamond" w:hAnsi="Garamond"/>
+          <w:color w:val="000000"/>
+          <w:kern w:val="0"/>
+          <w:sz w:val="36"/>
+          <w:szCs w:val="36"/>
+          <w:shd w:fill="auto" w:val="clear"/>
+          <w:lang w:val="en-US" w:eastAsia="zh-CN" w:bidi="hi-IN"/>
+        </w:rPr>
+        <w:t xml:space="preserve">Esse mandamento é o resumo de tudo o que Jesus vinha ensinando. Quando o amor está no centro, não há espaço para a hipocrisia, para a vaidade espiritual ou para a religião de aparências. </w:t>
+      </w:r>
+    </w:p>
+    <w:p>
+      <w:pPr>
+        <w:pStyle w:val="Normal"/>
+        <w:jc w:val="both"/>
+        <w:rPr>
+          <w:color w:val="00A0FC"/>
+          <w:sz w:val="36"/>
+          <w:szCs w:val="36"/>
+        </w:rPr>
+      </w:pPr>
+      <w:r>
+        <w:rPr>
+          <w:rFonts w:eastAsia="Times New Roman" w:cs="Times New Roman" w:ascii="Garamond" w:hAnsi="Garamond"/>
+          <w:color w:val="00A0FC"/>
+          <w:kern w:val="0"/>
+          <w:sz w:val="36"/>
+          <w:szCs w:val="36"/>
+          <w:shd w:fill="auto" w:val="clear"/>
+          <w:lang w:val="en-US" w:eastAsia="zh-CN" w:bidi="hi-IN"/>
+        </w:rPr>
+        <w:t>[ Início - Tópico 1 ]</w:t>
+      </w:r>
+    </w:p>
+    <w:p>
+      <w:pPr>
+        <w:pStyle w:val="Normal"/>
+        <w:jc w:val="both"/>
+        <w:rPr>
+          <w:color w:val="000000"/>
+        </w:rPr>
+      </w:pPr>
+      <w:r>
+        <w:rPr>
+          <w:rFonts w:eastAsia="Times New Roman" w:cs="Times New Roman" w:ascii="Garamond" w:hAnsi="Garamond"/>
+          <w:color w:val="000000"/>
+          <w:kern w:val="0"/>
+          <w:sz w:val="36"/>
+          <w:szCs w:val="36"/>
+          <w:shd w:fill="auto" w:val="clear"/>
+          <w:lang w:val="en-US" w:eastAsia="zh-CN" w:bidi="hi-IN"/>
+        </w:rPr>
+        <w:t>Retornando ao mandamento maior, n</w:t>
+      </w:r>
+      <w:r>
+        <w:rPr>
+          <w:rFonts w:eastAsia="Times New Roman" w:cs="Times New Roman" w:ascii="Garamond" w:hAnsi="Garamond"/>
+          <w:color w:val="000000"/>
+          <w:kern w:val="0"/>
+          <w:sz w:val="36"/>
+          <w:szCs w:val="36"/>
+          <w:shd w:fill="auto" w:val="clear"/>
+          <w:lang w:val="en-US" w:eastAsia="zh-CN" w:bidi="hi-IN"/>
+        </w:rPr>
+        <w:t xml:space="preserve">o versículo 37 Jesus diz: </w:t>
+      </w:r>
+    </w:p>
+    <w:p>
+      <w:pPr>
+        <w:pStyle w:val="Normal"/>
+        <w:jc w:val="both"/>
+        <w:rPr>
+          <w:color w:val="000000"/>
+        </w:rPr>
+      </w:pPr>
+      <w:r>
+        <w:rPr/>
+      </w:r>
+    </w:p>
+    <w:p>
+      <w:pPr>
+        <w:pStyle w:val="Normal"/>
+        <w:ind w:left="720" w:hanging="0"/>
+        <w:jc w:val="both"/>
+        <w:rPr>
+          <w:i/>
           <w:i/>
           <w:iCs/>
-          <w:color w:val="000000"/>
-          <w:kern w:val="0"/>
-          <w:sz w:val="36"/>
-          <w:szCs w:val="36"/>
-          <w:shd w:fill="auto" w:val="clear"/>
-          <w:lang w:val="en-US" w:eastAsia="zh-CN" w:bidi="hi-IN"/>
-        </w:rPr>
-        <w:t>em</w:t>
-      </w:r>
+        </w:rPr>
+      </w:pPr>
       <w:r>
         <w:rPr>
           <w:rFonts w:eastAsia="Times New Roman" w:cs="Times New Roman" w:ascii="Garamond" w:hAnsi="Garamond"/>
@@ -689,7 +1451,7 @@
           <w:shd w:fill="auto" w:val="clear"/>
           <w:lang w:val="en-US" w:eastAsia="zh-CN" w:bidi="hi-IN"/>
         </w:rPr>
-        <w:t>, deixo</w:t>
+        <w:t>"</w:t>
       </w:r>
       <w:r>
         <w:rPr>
@@ -703,7 +1465,7 @@
           <w:shd w:fill="auto" w:val="clear"/>
           <w:lang w:val="en-US" w:eastAsia="zh-CN" w:bidi="hi-IN"/>
         </w:rPr>
-        <w:t xml:space="preserve"> a vocês</w:t>
+        <w:t>Amarás o Senhor teu Deus de todo o teu coração, e de toda a tua alma, e de todo o teu pensamento</w:t>
       </w:r>
       <w:r>
         <w:rPr>
@@ -717,7 +1479,7 @@
           <w:shd w:fill="auto" w:val="clear"/>
           <w:lang w:val="en-US" w:eastAsia="zh-CN" w:bidi="hi-IN"/>
         </w:rPr>
-        <w:t xml:space="preserve"> um caminho do qual não poderã</w:t>
+        <w:t>"</w:t>
       </w:r>
       <w:r>
         <w:rPr>
@@ -731,291 +1493,111 @@
           <w:shd w:fill="auto" w:val="clear"/>
           <w:lang w:val="en-US" w:eastAsia="zh-CN" w:bidi="hi-IN"/>
         </w:rPr>
-        <w:t>o</w:t>
-      </w:r>
-      <w:r>
-        <w:rPr>
-          <w:rFonts w:eastAsia="Times New Roman" w:cs="Times New Roman" w:ascii="Garamond" w:hAnsi="Garamond"/>
-          <w:i/>
-          <w:iCs/>
-          <w:color w:val="000000"/>
-          <w:kern w:val="0"/>
-          <w:sz w:val="36"/>
-          <w:szCs w:val="36"/>
-          <w:shd w:fill="auto" w:val="clear"/>
-          <w:lang w:val="en-US" w:eastAsia="zh-CN" w:bidi="hi-IN"/>
-        </w:rPr>
-        <w:t xml:space="preserve"> fingir desconhecimento.”</w:t>
-      </w:r>
-    </w:p>
-    <w:p>
-      <w:pPr>
-        <w:pStyle w:val="Normal"/>
-        <w:jc w:val="both"/>
-        <w:rPr>
-          <w:sz w:val="36"/>
-          <w:szCs w:val="36"/>
-        </w:rPr>
-      </w:pPr>
-      <w:r>
-        <w:rPr/>
-      </w:r>
-    </w:p>
-    <w:p>
-      <w:pPr>
-        <w:pStyle w:val="Normal"/>
-        <w:jc w:val="both"/>
-        <w:rPr>
-          <w:sz w:val="36"/>
-          <w:szCs w:val="36"/>
-        </w:rPr>
-      </w:pPr>
-      <w:r>
-        <w:rPr>
-          <w:rFonts w:eastAsia="Times New Roman" w:cs="Times New Roman" w:ascii="Garamond" w:hAnsi="Garamond"/>
-          <w:color w:val="000000"/>
-          <w:kern w:val="0"/>
-          <w:sz w:val="36"/>
-          <w:szCs w:val="36"/>
-          <w:shd w:fill="auto" w:val="clear"/>
-          <w:lang w:val="en-US" w:eastAsia="zh-CN" w:bidi="hi-IN"/>
-        </w:rPr>
-        <w:t>Com isso, Jesus dissolve a hipocrisia e expõe a superficialidade da religião exterior.</w:t>
-      </w:r>
-      <w:r>
-        <w:rPr>
-          <w:rFonts w:eastAsia="Times New Roman" w:cs="Times New Roman" w:ascii="Garamond" w:hAnsi="Garamond"/>
-          <w:color w:val="000000"/>
-          <w:kern w:val="0"/>
-          <w:sz w:val="36"/>
-          <w:szCs w:val="36"/>
-          <w:shd w:fill="auto" w:val="clear"/>
-          <w:lang w:val="en-US" w:eastAsia="zh-CN" w:bidi="hi-IN"/>
-        </w:rPr>
-        <w:t xml:space="preserve"> </w:t>
-      </w:r>
-      <w:r>
-        <w:rPr>
-          <w:rFonts w:eastAsia="Times New Roman" w:cs="Times New Roman" w:ascii="Garamond" w:hAnsi="Garamond"/>
-          <w:color w:val="000000"/>
-          <w:kern w:val="0"/>
-          <w:sz w:val="36"/>
-          <w:szCs w:val="36"/>
-          <w:shd w:fill="auto" w:val="clear"/>
-          <w:lang w:val="en-US" w:eastAsia="zh-CN" w:bidi="hi-IN"/>
-        </w:rPr>
-        <w:t xml:space="preserve">Amar é mais do que sentir: é agir com verdade, com humildade, com compaixão. </w:t>
-      </w:r>
-    </w:p>
-    <w:p>
-      <w:pPr>
-        <w:pStyle w:val="Normal"/>
-        <w:jc w:val="both"/>
-        <w:rPr>
-          <w:sz w:val="36"/>
-          <w:szCs w:val="36"/>
-        </w:rPr>
-      </w:pPr>
-      <w:r>
-        <w:rPr/>
-      </w:r>
-    </w:p>
-    <w:p>
-      <w:pPr>
-        <w:pStyle w:val="Normal"/>
-        <w:jc w:val="both"/>
-        <w:rPr>
-          <w:sz w:val="36"/>
-          <w:szCs w:val="36"/>
-        </w:rPr>
-      </w:pPr>
-      <w:r>
-        <w:rPr>
-          <w:rFonts w:eastAsia="Times New Roman" w:cs="Times New Roman" w:ascii="Garamond" w:hAnsi="Garamond"/>
-          <w:color w:val="000000"/>
-          <w:kern w:val="0"/>
-          <w:sz w:val="36"/>
-          <w:szCs w:val="36"/>
-          <w:shd w:fill="auto" w:val="clear"/>
-          <w:lang w:val="en-US" w:eastAsia="zh-CN" w:bidi="hi-IN"/>
-        </w:rPr>
-        <w:t xml:space="preserve">Esse mandamento é o resumo de tudo o que Jesus vinha ensinando. Quando o amor está no centro, não há espaço para a hipocrisia, para a vaidade espiritual ou para a religião de aparências. </w:t>
-      </w:r>
-    </w:p>
-    <w:p>
-      <w:pPr>
-        <w:pStyle w:val="Normal"/>
-        <w:jc w:val="both"/>
-        <w:rPr>
-          <w:sz w:val="36"/>
-          <w:szCs w:val="36"/>
-        </w:rPr>
-      </w:pPr>
-      <w:r>
-        <w:rPr/>
-      </w:r>
-    </w:p>
-    <w:p>
-      <w:pPr>
-        <w:pStyle w:val="Normal"/>
-        <w:jc w:val="both"/>
-        <w:rPr>
-          <w:sz w:val="36"/>
-          <w:szCs w:val="36"/>
-        </w:rPr>
-      </w:pPr>
-      <w:r>
-        <w:rPr>
-          <w:rFonts w:eastAsia="Times New Roman" w:cs="Times New Roman" w:ascii="Garamond" w:hAnsi="Garamond"/>
-          <w:color w:val="000000"/>
-          <w:kern w:val="0"/>
-          <w:sz w:val="36"/>
-          <w:szCs w:val="36"/>
-          <w:shd w:fill="auto" w:val="clear"/>
-          <w:lang w:val="en-US" w:eastAsia="zh-CN" w:bidi="hi-IN"/>
-        </w:rPr>
-        <w:t>E é por isso que o mandamento maior continua sendo, até hoje, o ponto mais alto do Evangelho: a fé verdadeira não é feita de aparência, mas de amor vivido, simples e profundo.</w:t>
-      </w:r>
-    </w:p>
-    <w:p>
-      <w:pPr>
-        <w:pStyle w:val="Normal"/>
-        <w:jc w:val="both"/>
-        <w:rPr>
-          <w:sz w:val="36"/>
-          <w:szCs w:val="36"/>
-        </w:rPr>
-      </w:pPr>
-      <w:r>
-        <w:rPr/>
-      </w:r>
-    </w:p>
-    <w:p>
-      <w:pPr>
-        <w:pStyle w:val="Normal"/>
-        <w:jc w:val="both"/>
-        <w:rPr>
-          <w:color w:val="00A0FC"/>
-          <w:sz w:val="36"/>
-          <w:szCs w:val="36"/>
-        </w:rPr>
-      </w:pPr>
-      <w:r>
-        <w:rPr>
-          <w:rFonts w:eastAsia="Times New Roman" w:cs="Times New Roman" w:ascii="Garamond" w:hAnsi="Garamond"/>
-          <w:color w:val="00A0FC"/>
-          <w:kern w:val="0"/>
-          <w:sz w:val="36"/>
-          <w:szCs w:val="36"/>
-          <w:shd w:fill="auto" w:val="clear"/>
-          <w:lang w:val="en-US" w:eastAsia="zh-CN" w:bidi="hi-IN"/>
-        </w:rPr>
-        <w:t>[ Início - Tópico 1 ]</w:t>
-      </w:r>
-    </w:p>
-    <w:p>
-      <w:pPr>
-        <w:pStyle w:val="Normal"/>
-        <w:jc w:val="both"/>
-        <w:rPr>
-          <w:color w:val="000000"/>
-        </w:rPr>
-      </w:pPr>
-      <w:r>
-        <w:rPr>
-          <w:rFonts w:eastAsia="Times New Roman" w:cs="Times New Roman" w:ascii="Garamond" w:hAnsi="Garamond"/>
-          <w:color w:val="000000"/>
-          <w:kern w:val="0"/>
-          <w:sz w:val="36"/>
-          <w:szCs w:val="36"/>
-          <w:shd w:fill="auto" w:val="clear"/>
-          <w:lang w:val="en-US" w:eastAsia="zh-CN" w:bidi="hi-IN"/>
-        </w:rPr>
-        <w:t>No versículo 37 Jesus diz: Amarás o Senhor teu Deus de todo o teu coração, e de toda a tua alma, e de todo o teu pensamento. Amar a Deus de coração, alma e pensamento. Vamos refletir sobre essas 3 diferentes expressões de amor a Deus.</w:t>
-      </w:r>
-    </w:p>
-    <w:p>
-      <w:pPr>
-        <w:pStyle w:val="Normal"/>
-        <w:jc w:val="both"/>
-        <w:rPr>
-          <w:color w:val="000000"/>
-        </w:rPr>
-      </w:pPr>
-      <w:r>
-        <w:rPr>
-          <w:color w:val="000000"/>
-        </w:rPr>
-      </w:r>
-    </w:p>
-    <w:p>
-      <w:pPr>
-        <w:pStyle w:val="Normal"/>
-        <w:jc w:val="both"/>
-        <w:rPr>
-          <w:color w:val="000000"/>
-        </w:rPr>
-      </w:pPr>
-      <w:r>
-        <w:rPr>
-          <w:rFonts w:eastAsia="Times New Roman" w:cs="Times New Roman" w:ascii="Garamond" w:hAnsi="Garamond"/>
-          <w:color w:val="000000"/>
-          <w:kern w:val="0"/>
-          <w:sz w:val="36"/>
-          <w:szCs w:val="36"/>
-          <w:shd w:fill="auto" w:val="clear"/>
-          <w:lang w:val="en-US" w:eastAsia="zh-CN" w:bidi="hi-IN"/>
-        </w:rPr>
-        <w:t>Existe uma riqueza simbólica e espiritual nessas palavras de Jesus, então vamos analisá-las sob a ótica da Doutrina Espírita.</w:t>
-      </w:r>
-    </w:p>
-    <w:p>
-      <w:pPr>
-        <w:pStyle w:val="Normal"/>
-        <w:jc w:val="both"/>
-        <w:rPr>
-          <w:color w:val="000000"/>
-        </w:rPr>
-      </w:pPr>
-      <w:r>
-        <w:rPr>
-          <w:color w:val="000000"/>
-        </w:rPr>
-      </w:r>
-    </w:p>
-    <w:p>
-      <w:pPr>
-        <w:pStyle w:val="Normal"/>
-        <w:jc w:val="both"/>
-        <w:rPr>
-          <w:color w:val="000000"/>
-        </w:rPr>
-      </w:pPr>
-      <w:r>
-        <w:rPr>
-          <w:color w:val="000000"/>
-        </w:rPr>
-      </w:r>
-    </w:p>
-    <w:p>
-      <w:pPr>
-        <w:pStyle w:val="Normal"/>
-        <w:jc w:val="both"/>
-        <w:rPr>
-          <w:color w:val="000000"/>
-        </w:rPr>
-      </w:pPr>
-      <w:r>
-        <w:rPr>
-          <w:rFonts w:eastAsia="Times New Roman" w:cs="Times New Roman" w:ascii="Garamond" w:hAnsi="Garamond"/>
-          <w:color w:val="000000"/>
-          <w:kern w:val="0"/>
-          <w:sz w:val="36"/>
-          <w:szCs w:val="36"/>
-          <w:shd w:fill="auto" w:val="clear"/>
-          <w:lang w:val="en-US" w:eastAsia="zh-CN" w:bidi="hi-IN"/>
-        </w:rPr>
-        <w:t>1. Amar a Deus de todo o coração</w:t>
+        <w:t xml:space="preserve">. </w:t>
+      </w:r>
+    </w:p>
+    <w:p>
+      <w:pPr>
+        <w:pStyle w:val="Normal"/>
+        <w:jc w:val="both"/>
+        <w:rPr>
+          <w:color w:val="000000"/>
+        </w:rPr>
+      </w:pPr>
+      <w:r>
+        <w:rPr/>
+      </w:r>
+    </w:p>
+    <w:p>
+      <w:pPr>
+        <w:pStyle w:val="Normal"/>
+        <w:jc w:val="both"/>
+        <w:rPr>
+          <w:color w:val="000000"/>
+        </w:rPr>
+      </w:pPr>
+      <w:r>
+        <w:rPr>
+          <w:rFonts w:eastAsia="Times New Roman" w:cs="Times New Roman" w:ascii="Garamond" w:hAnsi="Garamond"/>
+          <w:color w:val="000000"/>
+          <w:kern w:val="0"/>
+          <w:sz w:val="36"/>
+          <w:szCs w:val="36"/>
+          <w:shd w:fill="auto" w:val="clear"/>
+          <w:lang w:val="en-US" w:eastAsia="zh-CN" w:bidi="hi-IN"/>
+        </w:rPr>
+        <w:t>Amar a Deus de coração, alma e pensamento. Vamos refletir sobre essas 3 diferentes expressões de amor a Deus</w:t>
+      </w:r>
+      <w:r>
+        <w:rPr>
+          <w:rFonts w:eastAsia="Times New Roman" w:cs="Times New Roman" w:ascii="Garamond" w:hAnsi="Garamond"/>
+          <w:color w:val="000000"/>
+          <w:kern w:val="0"/>
+          <w:sz w:val="36"/>
+          <w:szCs w:val="36"/>
+          <w:shd w:fill="auto" w:val="clear"/>
+          <w:lang w:val="en-US" w:eastAsia="zh-CN" w:bidi="hi-IN"/>
+        </w:rPr>
+        <w:t xml:space="preserve"> e vamos fazer isso sob </w:t>
+      </w:r>
+      <w:r>
+        <w:rPr>
+          <w:rFonts w:eastAsia="Times New Roman" w:cs="Times New Roman" w:ascii="Garamond" w:hAnsi="Garamond"/>
+          <w:color w:val="000000"/>
+          <w:kern w:val="0"/>
+          <w:sz w:val="36"/>
+          <w:szCs w:val="36"/>
+          <w:shd w:fill="auto" w:val="clear"/>
+          <w:lang w:val="en-US" w:eastAsia="zh-CN" w:bidi="hi-IN"/>
+        </w:rPr>
+        <w:t>a ótica da Doutrina Espírita.</w:t>
+      </w:r>
+    </w:p>
+    <w:p>
+      <w:pPr>
+        <w:pStyle w:val="Normal"/>
+        <w:jc w:val="both"/>
+        <w:rPr>
+          <w:color w:val="000000"/>
+        </w:rPr>
+      </w:pPr>
+      <w:r>
+        <w:rPr>
+          <w:color w:val="000000"/>
+        </w:rPr>
+      </w:r>
+    </w:p>
+    <w:p>
+      <w:pPr>
+        <w:pStyle w:val="Normal"/>
+        <w:jc w:val="both"/>
+        <w:rPr>
+          <w:color w:val="000000"/>
+        </w:rPr>
+      </w:pPr>
+      <w:r>
+        <w:rPr>
+          <w:color w:val="000000"/>
+        </w:rPr>
+      </w:r>
+    </w:p>
+    <w:p>
+      <w:pPr>
+        <w:pStyle w:val="Normal"/>
+        <w:jc w:val="center"/>
+        <w:rPr/>
+      </w:pPr>
+      <w:r>
+        <w:rPr>
+          <w:rFonts w:eastAsia="Times New Roman" w:cs="Times New Roman" w:ascii="Garamond" w:hAnsi="Garamond"/>
+          <w:color w:val="000000"/>
+          <w:kern w:val="0"/>
+          <w:sz w:val="36"/>
+          <w:szCs w:val="36"/>
+          <w:shd w:fill="auto" w:val="clear"/>
+          <w:lang w:val="en-US" w:eastAsia="zh-CN" w:bidi="hi-IN"/>
+        </w:rPr>
+        <w:t>Amar a Deus de todo o coração</w:t>
       </w:r>
     </w:p>
     <w:p>
@@ -1140,22 +1722,20 @@
     <w:p>
       <w:pPr>
         <w:pStyle w:val="Normal"/>
-        <w:jc w:val="both"/>
-        <w:rPr>
-          <w:color w:val="000000"/>
-        </w:rPr>
-      </w:pPr>
-      <w:r>
-        <w:rPr>
-          <w:rFonts w:eastAsia="Times New Roman" w:cs="Times New Roman" w:ascii="Garamond" w:hAnsi="Garamond"/>
-          <w:color w:val="000000"/>
-          <w:kern w:val="0"/>
-          <w:sz w:val="36"/>
-          <w:szCs w:val="36"/>
-          <w:shd w:fill="auto" w:val="clear"/>
-          <w:lang w:val="en-US" w:eastAsia="zh-CN" w:bidi="hi-IN"/>
-        </w:rPr>
-        <w:t>2. Amar a Deus de toda a alma</w:t>
+        <w:jc w:val="center"/>
+        <w:rPr/>
+      </w:pPr>
+      <w:r>
+        <w:rPr>
+          <w:rFonts w:eastAsia="Times New Roman" w:cs="Times New Roman" w:ascii="Garamond" w:hAnsi="Garamond"/>
+          <w:color w:val="000000"/>
+          <w:kern w:val="0"/>
+          <w:sz w:val="36"/>
+          <w:szCs w:val="36"/>
+          <w:shd w:fill="auto" w:val="clear"/>
+          <w:lang w:val="en-US" w:eastAsia="zh-CN" w:bidi="hi-IN"/>
+        </w:rPr>
+        <w:t>Amar a Deus de toda a alma</w:t>
       </w:r>
     </w:p>
     <w:p>
@@ -1280,22 +1860,20 @@
     <w:p>
       <w:pPr>
         <w:pStyle w:val="Normal"/>
-        <w:jc w:val="both"/>
-        <w:rPr>
-          <w:color w:val="000000"/>
-        </w:rPr>
-      </w:pPr>
-      <w:r>
-        <w:rPr>
-          <w:rFonts w:eastAsia="Times New Roman" w:cs="Times New Roman" w:ascii="Garamond" w:hAnsi="Garamond"/>
-          <w:color w:val="000000"/>
-          <w:kern w:val="0"/>
-          <w:sz w:val="36"/>
-          <w:szCs w:val="36"/>
-          <w:shd w:fill="auto" w:val="clear"/>
-          <w:lang w:val="en-US" w:eastAsia="zh-CN" w:bidi="hi-IN"/>
-        </w:rPr>
-        <w:t>3. Amar a Deus de todo o pensamento</w:t>
+        <w:jc w:val="center"/>
+        <w:rPr/>
+      </w:pPr>
+      <w:r>
+        <w:rPr>
+          <w:rFonts w:eastAsia="Times New Roman" w:cs="Times New Roman" w:ascii="Garamond" w:hAnsi="Garamond"/>
+          <w:color w:val="000000"/>
+          <w:kern w:val="0"/>
+          <w:sz w:val="36"/>
+          <w:szCs w:val="36"/>
+          <w:shd w:fill="auto" w:val="clear"/>
+          <w:lang w:val="en-US" w:eastAsia="zh-CN" w:bidi="hi-IN"/>
+        </w:rPr>
+        <w:t>Amar a Deus de todo o pensamento</w:t>
       </w:r>
     </w:p>
     <w:p>
@@ -1664,7 +2242,7 @@
           <w:shd w:fill="auto" w:val="clear"/>
           <w:lang w:val="en-US" w:eastAsia="zh-CN" w:bidi="hi-IN"/>
         </w:rPr>
-        <w:t>Portanto, Jesus não deixa espaço para um amor parcial: Ele nos convida a amar a Deus com toda a nossa sensibilidade (coração), toda a nossa essência espiritual (alma) e toda a nossa razão (pensamento).</w:t>
+        <w:t>Portanto, Jesus nos convida a amar a Deus com toda a nossa sensibilidade (coração), toda a nossa essência espiritual (alma) e toda a nossa razão (pensamento).</w:t>
       </w:r>
     </w:p>
     <w:p>
@@ -1705,31 +2283,7 @@
           <w:shd w:fill="auto" w:val="clear"/>
           <w:lang w:val="en-US" w:eastAsia="zh-CN" w:bidi="hi-IN"/>
         </w:rPr>
-        <w:t xml:space="preserve">[ </w:t>
-      </w:r>
-      <w:r>
-        <w:rPr>
-          <w:rFonts w:eastAsia="Times New Roman" w:cs="Times New Roman" w:ascii="Garamond" w:hAnsi="Garamond"/>
-          <w:color w:val="00A0FC"/>
-          <w:kern w:val="0"/>
-          <w:sz w:val="36"/>
-          <w:szCs w:val="36"/>
-          <w:shd w:fill="auto" w:val="clear"/>
-          <w:lang w:val="en-US" w:eastAsia="zh-CN" w:bidi="hi-IN"/>
-        </w:rPr>
-        <w:t>Até esse ponto está OK</w:t>
-      </w:r>
-      <w:r>
-        <w:rPr>
-          <w:rFonts w:eastAsia="Times New Roman" w:cs="Times New Roman" w:ascii="Garamond" w:hAnsi="Garamond"/>
-          <w:color w:val="00A0FC"/>
-          <w:kern w:val="0"/>
-          <w:sz w:val="36"/>
-          <w:szCs w:val="36"/>
-          <w:shd w:fill="auto" w:val="clear"/>
-          <w:lang w:val="en-US" w:eastAsia="zh-CN" w:bidi="hi-IN"/>
-        </w:rPr>
-        <w:t xml:space="preserve"> ]</w:t>
+        <w:t>[ Até esse ponto está OK ]</w:t>
       </w:r>
     </w:p>
     <w:p>
@@ -5236,7 +5790,7 @@
         <w:bCs/>
         <w:rFonts w:ascii="Garamond" w:hAnsi="Garamond"/>
       </w:rPr>
-      <w:t>19</w:t>
+      <w:t>22</w:t>
     </w:r>
     <w:r>
       <w:rPr>

</xml_diff>

<commit_message>
09/11/2025 - 19:23 h
</commit_message>
<xml_diff>
--- a/O mandamento maior/O Mandamento Maior.docx
+++ b/O mandamento maior/O Mandamento Maior.docx
@@ -398,8 +398,34 @@
           <w:shd w:fill="auto" w:val="clear"/>
           <w:lang w:val="en-US" w:eastAsia="zh-CN" w:bidi="hi-IN"/>
         </w:rPr>
-        <w:t xml:space="preserve">Os fariseus e saduceus </w:t>
-      </w:r>
+        <w:t xml:space="preserve">Os fariseus e saduceus faziam perguntas e criavam armadilhas com o único propósito de fazer Jesus cair em contradição; tudo o que eles queriam era desacreditar o Mestre. </w:t>
+      </w:r>
+    </w:p>
+    <w:p>
+      <w:pPr>
+        <w:pStyle w:val="Normal"/>
+        <w:jc w:val="both"/>
+        <w:rPr>
+          <w:sz w:val="36"/>
+          <w:szCs w:val="36"/>
+        </w:rPr>
+      </w:pPr>
+      <w:r>
+        <w:rPr>
+          <w:sz w:val="36"/>
+          <w:szCs w:val="36"/>
+        </w:rPr>
+      </w:r>
+    </w:p>
+    <w:p>
+      <w:pPr>
+        <w:pStyle w:val="Normal"/>
+        <w:jc w:val="both"/>
+        <w:rPr>
+          <w:sz w:val="36"/>
+          <w:szCs w:val="36"/>
+        </w:rPr>
+      </w:pPr>
       <w:r>
         <w:rPr>
           <w:rFonts w:eastAsia="Times New Roman" w:cs="Times New Roman" w:ascii="Garamond" w:hAnsi="Garamond"/>
@@ -410,8 +436,18 @@
           <w:shd w:fill="auto" w:val="clear"/>
           <w:lang w:val="en-US" w:eastAsia="zh-CN" w:bidi="hi-IN"/>
         </w:rPr>
-        <w:t xml:space="preserve">faziam perguntas e criavam armadilhas com </w:t>
-      </w:r>
+        <w:t>Embora tanto os fariseus quanto os saduceus tenham confrontado Jesus, havia entre eles diferenças bem marcantes.</w:t>
+      </w:r>
+    </w:p>
+    <w:p>
+      <w:pPr>
+        <w:pStyle w:val="Normal"/>
+        <w:jc w:val="both"/>
+        <w:rPr>
+          <w:sz w:val="36"/>
+          <w:szCs w:val="36"/>
+        </w:rPr>
+      </w:pPr>
       <w:r>
         <w:rPr>
           <w:rFonts w:eastAsia="Times New Roman" w:cs="Times New Roman" w:ascii="Garamond" w:hAnsi="Garamond"/>
@@ -422,8 +458,34 @@
           <w:shd w:fill="auto" w:val="clear"/>
           <w:lang w:val="en-US" w:eastAsia="zh-CN" w:bidi="hi-IN"/>
         </w:rPr>
-        <w:t>o único propósito</w:t>
-      </w:r>
+        <w:t>Os saduceus formavam um grupo pequeno, ligado às elites sacerdotais e políticas de Jerusalém. Eles se apegavam somente à Torá escrita — os cinco livros de Moisés — e não acreditavam na imortalidade da alma nem na existência dos espíritos.</w:t>
+      </w:r>
+    </w:p>
+    <w:p>
+      <w:pPr>
+        <w:pStyle w:val="Normal"/>
+        <w:jc w:val="both"/>
+        <w:rPr>
+          <w:sz w:val="36"/>
+          <w:szCs w:val="36"/>
+        </w:rPr>
+      </w:pPr>
+      <w:r>
+        <w:rPr>
+          <w:sz w:val="36"/>
+          <w:szCs w:val="36"/>
+        </w:rPr>
+      </w:r>
+    </w:p>
+    <w:p>
+      <w:pPr>
+        <w:pStyle w:val="Normal"/>
+        <w:jc w:val="both"/>
+        <w:rPr>
+          <w:sz w:val="36"/>
+          <w:szCs w:val="36"/>
+        </w:rPr>
+      </w:pPr>
       <w:r>
         <w:rPr>
           <w:rFonts w:eastAsia="Times New Roman" w:cs="Times New Roman" w:ascii="Garamond" w:hAnsi="Garamond"/>
@@ -434,8 +496,34 @@
           <w:shd w:fill="auto" w:val="clear"/>
           <w:lang w:val="en-US" w:eastAsia="zh-CN" w:bidi="hi-IN"/>
         </w:rPr>
-        <w:t xml:space="preserve"> de fazer Jesus cair em contradição</w:t>
-      </w:r>
+        <w:t>Para os saduceus, toda recompensa divina acontecia aqui mesmo, na vida terrena. A fé, para eles, era algo exterior — uma prática sustentada pelo poder e pelas aparências.</w:t>
+      </w:r>
+    </w:p>
+    <w:p>
+      <w:pPr>
+        <w:pStyle w:val="Normal"/>
+        <w:jc w:val="both"/>
+        <w:rPr>
+          <w:sz w:val="36"/>
+          <w:szCs w:val="36"/>
+        </w:rPr>
+      </w:pPr>
+      <w:r>
+        <w:rPr>
+          <w:sz w:val="36"/>
+          <w:szCs w:val="36"/>
+        </w:rPr>
+      </w:r>
+    </w:p>
+    <w:p>
+      <w:pPr>
+        <w:pStyle w:val="Normal"/>
+        <w:jc w:val="both"/>
+        <w:rPr>
+          <w:sz w:val="36"/>
+          <w:szCs w:val="36"/>
+        </w:rPr>
+      </w:pPr>
       <w:r>
         <w:rPr>
           <w:rFonts w:eastAsia="Times New Roman" w:cs="Times New Roman" w:ascii="Garamond" w:hAnsi="Garamond"/>
@@ -446,20 +534,23 @@
           <w:shd w:fill="auto" w:val="clear"/>
           <w:lang w:val="en-US" w:eastAsia="zh-CN" w:bidi="hi-IN"/>
         </w:rPr>
-        <w:t xml:space="preserve">; tudo o que eles queriam era desacreditar o Mestre. </w:t>
-      </w:r>
-    </w:p>
-    <w:p>
-      <w:pPr>
-        <w:pStyle w:val="Normal"/>
-        <w:jc w:val="both"/>
-        <w:rPr>
-          <w:sz w:val="36"/>
-          <w:szCs w:val="36"/>
-        </w:rPr>
-      </w:pPr>
-      <w:r>
-        <w:rPr/>
+        <w:t>Os fariseus, por outro lado, eram estudiosos e muito dedicados ao cumprimento da Lei. Mas a crença deles ia além da Torá: eles aceitavam todos os livros sagrados do judaísmo — o que hoje conhecemos como Antigo Testamento — e também valorizavam o que chamavam de “Lei Oral”.</w:t>
+      </w:r>
+    </w:p>
+    <w:p>
+      <w:pPr>
+        <w:pStyle w:val="Normal"/>
+        <w:jc w:val="both"/>
+        <w:rPr>
+          <w:sz w:val="36"/>
+          <w:szCs w:val="36"/>
+        </w:rPr>
+      </w:pPr>
+      <w:r>
+        <w:rPr>
+          <w:sz w:val="36"/>
+          <w:szCs w:val="36"/>
+        </w:rPr>
       </w:r>
     </w:p>
     <w:p>
@@ -481,7 +572,23 @@
           <w:shd w:fill="auto" w:val="clear"/>
           <w:lang w:val="en-US" w:eastAsia="zh-CN" w:bidi="hi-IN"/>
         </w:rPr>
-        <w:t>Embora tanto os fariseus quanto os saduceus tenham confrontado Jesus, havia entre eles diferenças bem marcantes.</w:t>
+        <w:t>Essa Lei Oral era o conjunto de tradições e interpretações passadas de geração em geração. Ela explicava como aplicar a Lei escrita nas situações do dia a dia. Os fariseus também acreditavam na vida espiritual e na ressurreição.</w:t>
+      </w:r>
+    </w:p>
+    <w:p>
+      <w:pPr>
+        <w:pStyle w:val="Normal"/>
+        <w:jc w:val="both"/>
+        <w:rPr>
+          <w:sz w:val="36"/>
+          <w:szCs w:val="36"/>
+        </w:rPr>
+      </w:pPr>
+      <w:r>
+        <w:rPr>
+          <w:sz w:val="36"/>
+          <w:szCs w:val="36"/>
+        </w:rPr>
       </w:r>
     </w:p>
     <w:p>
@@ -503,20 +610,23 @@
           <w:shd w:fill="auto" w:val="clear"/>
           <w:lang w:val="en-US" w:eastAsia="zh-CN" w:bidi="hi-IN"/>
         </w:rPr>
-        <w:t>Os saduceus formavam um grupo pequeno, ligado às elites sacerdotais e políticas de Jerusalém. Eles se apegavam somente à Torá escrita — os cinco livros de Moisés — e não acreditavam na imortalidade da alma nem na existência dos espíritos.</w:t>
-      </w:r>
-    </w:p>
-    <w:p>
-      <w:pPr>
-        <w:pStyle w:val="Normal"/>
-        <w:jc w:val="both"/>
-        <w:rPr>
-          <w:sz w:val="36"/>
-          <w:szCs w:val="36"/>
-        </w:rPr>
-      </w:pPr>
-      <w:r>
-        <w:rPr/>
+        <w:t>O problema é que, com o tempo, muitos deles começaram a se apegar demais às regras e às aparências. Cumpriam tudo à risca, mas deixavam o coração de fora. A fé virou um exercício de vaidade, mais preocupado com a forma do que com o espírito.</w:t>
+      </w:r>
+    </w:p>
+    <w:p>
+      <w:pPr>
+        <w:pStyle w:val="Normal"/>
+        <w:jc w:val="both"/>
+        <w:rPr>
+          <w:sz w:val="36"/>
+          <w:szCs w:val="36"/>
+        </w:rPr>
+      </w:pPr>
+      <w:r>
+        <w:rPr>
+          <w:sz w:val="36"/>
+          <w:szCs w:val="36"/>
+        </w:rPr>
       </w:r>
     </w:p>
     <w:p>
@@ -538,20 +648,23 @@
           <w:shd w:fill="auto" w:val="clear"/>
           <w:lang w:val="en-US" w:eastAsia="zh-CN" w:bidi="hi-IN"/>
         </w:rPr>
-        <w:t>Para os saduceus, toda recompensa divina acontecia aqui mesmo, na vida terrena. A fé, para eles, era algo exterior — uma prática sustentada pelo poder e pelas aparências.</w:t>
-      </w:r>
-    </w:p>
-    <w:p>
-      <w:pPr>
-        <w:pStyle w:val="Normal"/>
-        <w:jc w:val="both"/>
-        <w:rPr>
-          <w:sz w:val="36"/>
-          <w:szCs w:val="36"/>
-        </w:rPr>
-      </w:pPr>
-      <w:r>
-        <w:rPr/>
+        <w:t>Por isso, Jesus foi mais duro com eles. Porque, apesar de estarem mais próximos da verdade, acabaram se distanciando da essência dela — que é o amor e a humildade.</w:t>
+      </w:r>
+    </w:p>
+    <w:p>
+      <w:pPr>
+        <w:pStyle w:val="Normal"/>
+        <w:jc w:val="both"/>
+        <w:rPr>
+          <w:sz w:val="36"/>
+          <w:szCs w:val="36"/>
+        </w:rPr>
+      </w:pPr>
+      <w:r>
+        <w:rPr>
+          <w:sz w:val="36"/>
+          <w:szCs w:val="36"/>
+        </w:rPr>
       </w:r>
     </w:p>
     <w:p>
@@ -573,20 +686,23 @@
           <w:shd w:fill="auto" w:val="clear"/>
           <w:lang w:val="en-US" w:eastAsia="zh-CN" w:bidi="hi-IN"/>
         </w:rPr>
-        <w:t>Os fariseus, por outro lado, eram estudiosos e muito dedicados ao cumprimento da Lei. Mas a crença deles ia além da Torá: eles aceitavam todos os livros sagrados do judaísmo — o que hoje conhecemos como Antigo Testamento — e também valorizavam o que chamavam de “Lei Oral”.</w:t>
-      </w:r>
-    </w:p>
-    <w:p>
-      <w:pPr>
-        <w:pStyle w:val="Normal"/>
-        <w:jc w:val="both"/>
-        <w:rPr>
-          <w:sz w:val="36"/>
-          <w:szCs w:val="36"/>
-        </w:rPr>
-      </w:pPr>
-      <w:r>
-        <w:rPr/>
+        <w:t xml:space="preserve">Apesar dessas diferenças acentuadas entre as crenças dos saduceus e dos fariseus, ambos confrontaram Jesus e nesses embates, o Mestre sempre respondeu com sabedoria, elevando o diálogo a um nível espiritual que eles não conseguiam alcançar. </w:t>
+      </w:r>
+    </w:p>
+    <w:p>
+      <w:pPr>
+        <w:pStyle w:val="Normal"/>
+        <w:jc w:val="both"/>
+        <w:rPr>
+          <w:sz w:val="36"/>
+          <w:szCs w:val="36"/>
+        </w:rPr>
+      </w:pPr>
+      <w:r>
+        <w:rPr>
+          <w:sz w:val="36"/>
+          <w:szCs w:val="36"/>
+        </w:rPr>
       </w:r>
     </w:p>
     <w:p>
@@ -608,195 +724,7 @@
           <w:shd w:fill="auto" w:val="clear"/>
           <w:lang w:val="en-US" w:eastAsia="zh-CN" w:bidi="hi-IN"/>
         </w:rPr>
-        <w:t>Essa Lei Oral era o conjunto de tradições e interpretações passadas de geração em geração. Ela explicava como aplicar a Lei escrita nas situações do dia a dia. Os fariseus também acreditavam na vida espiritual e na ressurreição.</w:t>
-      </w:r>
-    </w:p>
-    <w:p>
-      <w:pPr>
-        <w:pStyle w:val="Normal"/>
-        <w:jc w:val="both"/>
-        <w:rPr>
-          <w:sz w:val="36"/>
-          <w:szCs w:val="36"/>
-        </w:rPr>
-      </w:pPr>
-      <w:r>
-        <w:rPr/>
-      </w:r>
-    </w:p>
-    <w:p>
-      <w:pPr>
-        <w:pStyle w:val="Normal"/>
-        <w:jc w:val="both"/>
-        <w:rPr>
-          <w:sz w:val="36"/>
-          <w:szCs w:val="36"/>
-        </w:rPr>
-      </w:pPr>
-      <w:r>
-        <w:rPr>
-          <w:rFonts w:eastAsia="Times New Roman" w:cs="Times New Roman" w:ascii="Garamond" w:hAnsi="Garamond"/>
-          <w:color w:val="000000"/>
-          <w:kern w:val="0"/>
-          <w:sz w:val="36"/>
-          <w:szCs w:val="36"/>
-          <w:shd w:fill="auto" w:val="clear"/>
-          <w:lang w:val="en-US" w:eastAsia="zh-CN" w:bidi="hi-IN"/>
-        </w:rPr>
-        <w:t>O problema é que, com o tempo, muitos deles começaram a se apegar demais às regras e às aparências. Cumpriam tudo à risca, mas deixavam o coração de fora. A fé virou um exercício de vaidade, mais preocupado com a forma do que com o espírito.</w:t>
-      </w:r>
-    </w:p>
-    <w:p>
-      <w:pPr>
-        <w:pStyle w:val="Normal"/>
-        <w:jc w:val="both"/>
-        <w:rPr>
-          <w:sz w:val="36"/>
-          <w:szCs w:val="36"/>
-        </w:rPr>
-      </w:pPr>
-      <w:r>
-        <w:rPr/>
-      </w:r>
-    </w:p>
-    <w:p>
-      <w:pPr>
-        <w:pStyle w:val="Normal"/>
-        <w:jc w:val="both"/>
-        <w:rPr>
-          <w:sz w:val="36"/>
-          <w:szCs w:val="36"/>
-        </w:rPr>
-      </w:pPr>
-      <w:r>
-        <w:rPr>
-          <w:rFonts w:eastAsia="Times New Roman" w:cs="Times New Roman" w:ascii="Garamond" w:hAnsi="Garamond"/>
-          <w:color w:val="000000"/>
-          <w:kern w:val="0"/>
-          <w:sz w:val="36"/>
-          <w:szCs w:val="36"/>
-          <w:shd w:fill="auto" w:val="clear"/>
-          <w:lang w:val="en-US" w:eastAsia="zh-CN" w:bidi="hi-IN"/>
-        </w:rPr>
-        <w:t>Por isso, Jesus foi mais duro com eles. Porque, apesar de estarem mais próximos da verdade, acabaram se distanciando da essência dela — que é o amor e a humildade.</w:t>
-      </w:r>
-    </w:p>
-    <w:p>
-      <w:pPr>
-        <w:pStyle w:val="Normal"/>
-        <w:jc w:val="both"/>
-        <w:rPr>
-          <w:sz w:val="36"/>
-          <w:szCs w:val="36"/>
-        </w:rPr>
-      </w:pPr>
-      <w:r>
-        <w:rPr/>
-      </w:r>
-    </w:p>
-    <w:p>
-      <w:pPr>
-        <w:pStyle w:val="Normal"/>
-        <w:jc w:val="both"/>
-        <w:rPr>
-          <w:sz w:val="36"/>
-          <w:szCs w:val="36"/>
-        </w:rPr>
-      </w:pPr>
-      <w:r>
-        <w:rPr>
-          <w:rFonts w:eastAsia="Times New Roman" w:cs="Times New Roman" w:ascii="Garamond" w:hAnsi="Garamond"/>
-          <w:color w:val="000000"/>
-          <w:kern w:val="0"/>
-          <w:sz w:val="36"/>
-          <w:szCs w:val="36"/>
-          <w:shd w:fill="auto" w:val="clear"/>
-          <w:lang w:val="en-US" w:eastAsia="zh-CN" w:bidi="hi-IN"/>
-        </w:rPr>
-        <w:t>Apesar dessas diferenças acentuadas entre as crenças dos saduceus e dos fariseus, ambos confrontaram Jesus e nesses embates, o Mestre</w:t>
-      </w:r>
-      <w:r>
-        <w:rPr>
-          <w:rFonts w:eastAsia="Times New Roman" w:cs="Times New Roman" w:ascii="Garamond" w:hAnsi="Garamond"/>
-          <w:color w:val="000000"/>
-          <w:kern w:val="0"/>
-          <w:sz w:val="36"/>
-          <w:szCs w:val="36"/>
-          <w:shd w:fill="auto" w:val="clear"/>
-          <w:lang w:val="en-US" w:eastAsia="zh-CN" w:bidi="hi-IN"/>
-        </w:rPr>
-        <w:t xml:space="preserve"> sempre</w:t>
-      </w:r>
-      <w:r>
-        <w:rPr>
-          <w:rFonts w:eastAsia="Times New Roman" w:cs="Times New Roman" w:ascii="Garamond" w:hAnsi="Garamond"/>
-          <w:color w:val="000000"/>
-          <w:kern w:val="0"/>
-          <w:sz w:val="36"/>
-          <w:szCs w:val="36"/>
-          <w:shd w:fill="auto" w:val="clear"/>
-          <w:lang w:val="en-US" w:eastAsia="zh-CN" w:bidi="hi-IN"/>
-        </w:rPr>
-        <w:t xml:space="preserve"> respondeu</w:t>
-      </w:r>
-      <w:r>
-        <w:rPr>
-          <w:rFonts w:eastAsia="Times New Roman" w:cs="Times New Roman" w:ascii="Garamond" w:hAnsi="Garamond"/>
-          <w:color w:val="000000"/>
-          <w:kern w:val="0"/>
-          <w:sz w:val="36"/>
-          <w:szCs w:val="36"/>
-          <w:shd w:fill="auto" w:val="clear"/>
-          <w:lang w:val="en-US" w:eastAsia="zh-CN" w:bidi="hi-IN"/>
-        </w:rPr>
-        <w:t xml:space="preserve"> com sabedoria, elevando o diálogo a um nível espiritual que eles não conseguiam alcançar. </w:t>
-      </w:r>
-    </w:p>
-    <w:p>
-      <w:pPr>
-        <w:pStyle w:val="Normal"/>
-        <w:jc w:val="both"/>
-        <w:rPr>
-          <w:sz w:val="36"/>
-          <w:szCs w:val="36"/>
-        </w:rPr>
-      </w:pPr>
-      <w:r>
-        <w:rPr/>
-      </w:r>
-    </w:p>
-    <w:p>
-      <w:pPr>
-        <w:pStyle w:val="Normal"/>
-        <w:jc w:val="both"/>
-        <w:rPr>
-          <w:sz w:val="36"/>
-          <w:szCs w:val="36"/>
-        </w:rPr>
-      </w:pPr>
-      <w:r>
-        <w:rPr>
-          <w:rFonts w:eastAsia="Times New Roman" w:cs="Times New Roman" w:ascii="Garamond" w:hAnsi="Garamond"/>
-          <w:color w:val="000000"/>
-          <w:kern w:val="0"/>
-          <w:sz w:val="36"/>
-          <w:szCs w:val="36"/>
-          <w:shd w:fill="auto" w:val="clear"/>
-          <w:lang w:val="en-US" w:eastAsia="zh-CN" w:bidi="hi-IN"/>
-        </w:rPr>
-        <w:t>Então, q</w:t>
-      </w:r>
-      <w:r>
-        <w:rPr>
-          <w:rFonts w:eastAsia="Times New Roman" w:cs="Times New Roman" w:ascii="Garamond" w:hAnsi="Garamond"/>
-          <w:color w:val="000000"/>
-          <w:kern w:val="0"/>
-          <w:sz w:val="36"/>
-          <w:szCs w:val="36"/>
-          <w:shd w:fill="auto" w:val="clear"/>
-          <w:lang w:val="en-US" w:eastAsia="zh-CN" w:bidi="hi-IN"/>
-        </w:rPr>
-        <w:t>uando perguntam qual é o maior mandamento, Jesus encerra o debate com uma resposta simples e definitiva:</w:t>
+        <w:t>Então, quando perguntam qual é o maior mandamento, Jesus encerra o debate com uma resposta simples e definitiva:</w:t>
       </w:r>
     </w:p>
     <w:p>
@@ -916,8 +844,204 @@
           <w:shd w:fill="auto" w:val="clear"/>
           <w:lang w:val="en-US" w:eastAsia="zh-CN" w:bidi="hi-IN"/>
         </w:rPr>
-        <w:t xml:space="preserve">"Já que </w:t>
-      </w:r>
+        <w:t>"Já que vocês estão buscando atalhos e fugas para não promoverem a transformação espiritual, então vou dar a vocês um ensinamento do qual não poderão fingir desconhecimento.”</w:t>
+      </w:r>
+    </w:p>
+    <w:p>
+      <w:pPr>
+        <w:pStyle w:val="Normal"/>
+        <w:jc w:val="both"/>
+        <w:rPr>
+          <w:sz w:val="36"/>
+          <w:szCs w:val="36"/>
+        </w:rPr>
+      </w:pPr>
+      <w:r>
+        <w:rPr>
+          <w:sz w:val="36"/>
+          <w:szCs w:val="36"/>
+        </w:rPr>
+      </w:r>
+    </w:p>
+    <w:p>
+      <w:pPr>
+        <w:pStyle w:val="Normal"/>
+        <w:jc w:val="both"/>
+        <w:rPr>
+          <w:sz w:val="36"/>
+          <w:szCs w:val="36"/>
+        </w:rPr>
+      </w:pPr>
+      <w:r>
+        <w:rPr>
+          <w:rFonts w:eastAsia="Times New Roman" w:cs="Times New Roman" w:ascii="Garamond" w:hAnsi="Garamond"/>
+          <w:color w:val="000000"/>
+          <w:kern w:val="0"/>
+          <w:sz w:val="36"/>
+          <w:szCs w:val="36"/>
+          <w:shd w:fill="auto" w:val="clear"/>
+          <w:lang w:val="en-US" w:eastAsia="zh-CN" w:bidi="hi-IN"/>
+        </w:rPr>
+        <w:t>Com o mandamento maior, Jesus dissolveu a hipocrisia e expôs a superficialidade da religião exterior vivida por aquelas pessoas.</w:t>
+      </w:r>
+    </w:p>
+    <w:p>
+      <w:pPr>
+        <w:pStyle w:val="Normal"/>
+        <w:jc w:val="both"/>
+        <w:rPr>
+          <w:sz w:val="36"/>
+          <w:szCs w:val="36"/>
+        </w:rPr>
+      </w:pPr>
+      <w:r>
+        <w:rPr>
+          <w:sz w:val="36"/>
+          <w:szCs w:val="36"/>
+        </w:rPr>
+      </w:r>
+    </w:p>
+    <w:p>
+      <w:pPr>
+        <w:pStyle w:val="Normal"/>
+        <w:jc w:val="both"/>
+        <w:rPr>
+          <w:sz w:val="36"/>
+          <w:szCs w:val="36"/>
+        </w:rPr>
+      </w:pPr>
+      <w:r>
+        <w:rPr>
+          <w:rFonts w:eastAsia="Times New Roman" w:cs="Times New Roman" w:ascii="Garamond" w:hAnsi="Garamond"/>
+          <w:color w:val="000000"/>
+          <w:kern w:val="0"/>
+          <w:sz w:val="36"/>
+          <w:szCs w:val="36"/>
+          <w:shd w:fill="auto" w:val="clear"/>
+          <w:lang w:val="en-US" w:eastAsia="zh-CN" w:bidi="hi-IN"/>
+        </w:rPr>
+        <w:t>Esse comportamento combatido por Jesus permanece conosco até os dias de hoje. Passados mais de 2000 mil anos, continuamos exigindo muitas condições para fazer o bem. Escolhemos a quem, como e onde fazer o bem. E não pode ser assim.</w:t>
+      </w:r>
+    </w:p>
+    <w:p>
+      <w:pPr>
+        <w:pStyle w:val="Normal"/>
+        <w:jc w:val="both"/>
+        <w:rPr>
+          <w:sz w:val="36"/>
+          <w:szCs w:val="36"/>
+        </w:rPr>
+      </w:pPr>
+      <w:r>
+        <w:rPr>
+          <w:sz w:val="36"/>
+          <w:szCs w:val="36"/>
+        </w:rPr>
+      </w:r>
+    </w:p>
+    <w:p>
+      <w:pPr>
+        <w:pStyle w:val="Normal"/>
+        <w:jc w:val="both"/>
+        <w:rPr>
+          <w:sz w:val="36"/>
+          <w:szCs w:val="36"/>
+        </w:rPr>
+      </w:pPr>
+      <w:r>
+        <w:rPr>
+          <w:rFonts w:eastAsia="Times New Roman" w:cs="Times New Roman" w:ascii="Garamond" w:hAnsi="Garamond"/>
+          <w:color w:val="000000"/>
+          <w:kern w:val="0"/>
+          <w:sz w:val="36"/>
+          <w:szCs w:val="36"/>
+          <w:shd w:fill="auto" w:val="clear"/>
+          <w:lang w:val="en-US" w:eastAsia="zh-CN" w:bidi="hi-IN"/>
+        </w:rPr>
+        <w:t xml:space="preserve">Sem querer traçar qualquer comparação entre o mentor espiritual dessa casa e o nosso Mestre Jesus Cristo, podemos dizer sem nenhum receio de errar, que o Irmão Glacus reafirma o convite para "amar ao próximo" ensinado por Jesus. </w:t>
+      </w:r>
+    </w:p>
+    <w:p>
+      <w:pPr>
+        <w:pStyle w:val="Normal"/>
+        <w:jc w:val="both"/>
+        <w:rPr>
+          <w:sz w:val="36"/>
+          <w:szCs w:val="36"/>
+        </w:rPr>
+      </w:pPr>
+      <w:r>
+        <w:rPr>
+          <w:sz w:val="36"/>
+          <w:szCs w:val="36"/>
+        </w:rPr>
+      </w:r>
+    </w:p>
+    <w:p>
+      <w:pPr>
+        <w:pStyle w:val="Normal"/>
+        <w:jc w:val="both"/>
+        <w:rPr>
+          <w:sz w:val="36"/>
+          <w:szCs w:val="36"/>
+        </w:rPr>
+      </w:pPr>
+      <w:r>
+        <w:rPr>
+          <w:rFonts w:eastAsia="Times New Roman" w:cs="Times New Roman" w:ascii="Garamond" w:hAnsi="Garamond"/>
+          <w:color w:val="000000"/>
+          <w:kern w:val="0"/>
+          <w:sz w:val="36"/>
+          <w:szCs w:val="36"/>
+          <w:shd w:fill="auto" w:val="clear"/>
+          <w:lang w:val="en-US" w:eastAsia="zh-CN" w:bidi="hi-IN"/>
+        </w:rPr>
+        <w:t>Qual é o lema dessa casa?</w:t>
+      </w:r>
+    </w:p>
+    <w:p>
+      <w:pPr>
+        <w:pStyle w:val="Normal"/>
+        <w:jc w:val="both"/>
+        <w:rPr>
+          <w:sz w:val="36"/>
+          <w:szCs w:val="36"/>
+        </w:rPr>
+      </w:pPr>
+      <w:r>
+        <w:rPr>
+          <w:sz w:val="36"/>
+          <w:szCs w:val="36"/>
+        </w:rPr>
+      </w:r>
+    </w:p>
+    <w:p>
+      <w:pPr>
+        <w:pStyle w:val="Normal"/>
+        <w:jc w:val="both"/>
+        <w:rPr>
+          <w:sz w:val="36"/>
+          <w:szCs w:val="36"/>
+        </w:rPr>
+      </w:pPr>
+      <w:r>
+        <w:rPr>
+          <w:sz w:val="36"/>
+          <w:szCs w:val="36"/>
+        </w:rPr>
+      </w:r>
+    </w:p>
+    <w:p>
+      <w:pPr>
+        <w:pStyle w:val="Normal"/>
+        <w:ind w:left="720" w:hanging="0"/>
+        <w:jc w:val="both"/>
+        <w:rPr>
+          <w:i/>
+          <w:i/>
+          <w:iCs/>
+        </w:rPr>
+      </w:pPr>
       <w:r>
         <w:rPr>
           <w:rFonts w:eastAsia="Times New Roman" w:cs="Times New Roman" w:ascii="Garamond" w:hAnsi="Garamond"/>
@@ -930,8 +1054,192 @@
           <w:shd w:fill="auto" w:val="clear"/>
           <w:lang w:val="en-US" w:eastAsia="zh-CN" w:bidi="hi-IN"/>
         </w:rPr>
-        <w:t>vocês estão buscando atalhos e fugas para não promoverem a transformação espiritual, então vou dar a vocês um ensinamento do qual não poderão fingir desconhecimento</w:t>
-      </w:r>
+        <w:t>O compromisso da FEIG é com o ser humano.</w:t>
+      </w:r>
+    </w:p>
+    <w:p>
+      <w:pPr>
+        <w:pStyle w:val="Normal"/>
+        <w:jc w:val="both"/>
+        <w:rPr>
+          <w:sz w:val="36"/>
+          <w:szCs w:val="36"/>
+        </w:rPr>
+      </w:pPr>
+      <w:r>
+        <w:rPr>
+          <w:sz w:val="36"/>
+          <w:szCs w:val="36"/>
+        </w:rPr>
+      </w:r>
+    </w:p>
+    <w:p>
+      <w:pPr>
+        <w:pStyle w:val="Normal"/>
+        <w:jc w:val="both"/>
+        <w:rPr>
+          <w:sz w:val="36"/>
+          <w:szCs w:val="36"/>
+        </w:rPr>
+      </w:pPr>
+      <w:r>
+        <w:rPr>
+          <w:rFonts w:eastAsia="Times New Roman" w:cs="Times New Roman" w:ascii="Garamond" w:hAnsi="Garamond"/>
+          <w:color w:val="000000"/>
+          <w:kern w:val="0"/>
+          <w:sz w:val="36"/>
+          <w:szCs w:val="36"/>
+          <w:shd w:fill="auto" w:val="clear"/>
+          <w:lang w:val="en-US" w:eastAsia="zh-CN" w:bidi="hi-IN"/>
+        </w:rPr>
+        <w:t>Alguém tem dúvidas sobre o que o Irmão Glacus quis dizer com essas palavras? Seria correto eu fazer o bem somente aos espíritas, aos cristãos, aos familiares, amigos, às pessoas que pensam como eu?</w:t>
+      </w:r>
+    </w:p>
+    <w:p>
+      <w:pPr>
+        <w:pStyle w:val="Normal"/>
+        <w:jc w:val="both"/>
+        <w:rPr>
+          <w:sz w:val="36"/>
+          <w:szCs w:val="36"/>
+        </w:rPr>
+      </w:pPr>
+      <w:r>
+        <w:rPr>
+          <w:sz w:val="36"/>
+          <w:szCs w:val="36"/>
+        </w:rPr>
+      </w:r>
+    </w:p>
+    <w:p>
+      <w:pPr>
+        <w:pStyle w:val="Normal"/>
+        <w:jc w:val="both"/>
+        <w:rPr>
+          <w:sz w:val="36"/>
+          <w:szCs w:val="36"/>
+        </w:rPr>
+      </w:pPr>
+      <w:r>
+        <w:rPr>
+          <w:rFonts w:eastAsia="Times New Roman" w:cs="Times New Roman" w:ascii="Garamond" w:hAnsi="Garamond"/>
+          <w:color w:val="000000"/>
+          <w:kern w:val="0"/>
+          <w:sz w:val="36"/>
+          <w:szCs w:val="36"/>
+          <w:shd w:fill="auto" w:val="clear"/>
+          <w:lang w:val="en-US" w:eastAsia="zh-CN" w:bidi="hi-IN"/>
+        </w:rPr>
+        <w:t>Não, não há margem para essa seletividade. Como membros integrantes da família espiritual que essa casa representa, nosso compromisso é com o ser humano, qualquer que seja ele.</w:t>
+      </w:r>
+    </w:p>
+    <w:p>
+      <w:pPr>
+        <w:pStyle w:val="Normal"/>
+        <w:jc w:val="both"/>
+        <w:rPr>
+          <w:sz w:val="36"/>
+          <w:szCs w:val="36"/>
+        </w:rPr>
+      </w:pPr>
+      <w:r>
+        <w:rPr>
+          <w:sz w:val="36"/>
+          <w:szCs w:val="36"/>
+        </w:rPr>
+      </w:r>
+    </w:p>
+    <w:p>
+      <w:pPr>
+        <w:pStyle w:val="Normal"/>
+        <w:jc w:val="both"/>
+        <w:rPr>
+          <w:sz w:val="36"/>
+          <w:szCs w:val="36"/>
+        </w:rPr>
+      </w:pPr>
+      <w:r>
+        <w:rPr>
+          <w:rFonts w:eastAsia="Times New Roman" w:cs="Times New Roman" w:ascii="Garamond" w:hAnsi="Garamond"/>
+          <w:color w:val="000000"/>
+          <w:kern w:val="0"/>
+          <w:sz w:val="36"/>
+          <w:szCs w:val="36"/>
+          <w:shd w:fill="auto" w:val="clear"/>
+          <w:lang w:val="en-US" w:eastAsia="zh-CN" w:bidi="hi-IN"/>
+        </w:rPr>
+        <w:t xml:space="preserve">Esse mandamento é o resumo de tudo o que Jesus vinha ensinando. Quando o amor está no centro, não há espaço para a hipocrisia, para a vaidade espiritual ou para a religião de aparências. </w:t>
+      </w:r>
+    </w:p>
+    <w:p>
+      <w:pPr>
+        <w:pStyle w:val="Normal"/>
+        <w:jc w:val="both"/>
+        <w:rPr>
+          <w:color w:val="00A0FC"/>
+          <w:sz w:val="36"/>
+          <w:szCs w:val="36"/>
+        </w:rPr>
+      </w:pPr>
+      <w:r>
+        <w:rPr>
+          <w:rFonts w:eastAsia="Times New Roman" w:cs="Times New Roman" w:ascii="Garamond" w:hAnsi="Garamond"/>
+          <w:color w:val="00A0FC"/>
+          <w:kern w:val="0"/>
+          <w:sz w:val="36"/>
+          <w:szCs w:val="36"/>
+          <w:shd w:fill="auto" w:val="clear"/>
+          <w:lang w:val="en-US" w:eastAsia="zh-CN" w:bidi="hi-IN"/>
+        </w:rPr>
+        <w:t>[ Início - Tópico 1 ]</w:t>
+      </w:r>
+    </w:p>
+    <w:p>
+      <w:pPr>
+        <w:pStyle w:val="Normal"/>
+        <w:jc w:val="both"/>
+        <w:rPr>
+          <w:color w:val="000000"/>
+        </w:rPr>
+      </w:pPr>
+      <w:r>
+        <w:rPr>
+          <w:rFonts w:eastAsia="Times New Roman" w:cs="Times New Roman" w:ascii="Garamond" w:hAnsi="Garamond"/>
+          <w:color w:val="000000"/>
+          <w:kern w:val="0"/>
+          <w:sz w:val="36"/>
+          <w:szCs w:val="36"/>
+          <w:shd w:fill="auto" w:val="clear"/>
+          <w:lang w:val="en-US" w:eastAsia="zh-CN" w:bidi="hi-IN"/>
+        </w:rPr>
+        <w:t xml:space="preserve">Retornando ao mandamento maior, no versículo 37 Jesus diz: </w:t>
+      </w:r>
+    </w:p>
+    <w:p>
+      <w:pPr>
+        <w:pStyle w:val="Normal"/>
+        <w:jc w:val="both"/>
+        <w:rPr>
+          <w:color w:val="000000"/>
+        </w:rPr>
+      </w:pPr>
+      <w:r>
+        <w:rPr>
+          <w:color w:val="000000"/>
+        </w:rPr>
+      </w:r>
+    </w:p>
+    <w:p>
+      <w:pPr>
+        <w:pStyle w:val="Normal"/>
+        <w:ind w:left="720" w:hanging="0"/>
+        <w:jc w:val="both"/>
+        <w:rPr>
+          <w:i/>
+          <w:i/>
+          <w:iCs/>
+        </w:rPr>
+      </w:pPr>
       <w:r>
         <w:rPr>
           <w:rFonts w:eastAsia="Times New Roman" w:cs="Times New Roman" w:ascii="Garamond" w:hAnsi="Garamond"/>
@@ -944,32 +1252,29 @@
           <w:shd w:fill="auto" w:val="clear"/>
           <w:lang w:val="en-US" w:eastAsia="zh-CN" w:bidi="hi-IN"/>
         </w:rPr>
-        <w:t>.”</w:t>
-      </w:r>
-    </w:p>
-    <w:p>
-      <w:pPr>
-        <w:pStyle w:val="Normal"/>
-        <w:jc w:val="both"/>
-        <w:rPr>
-          <w:sz w:val="36"/>
-          <w:szCs w:val="36"/>
-        </w:rPr>
-      </w:pPr>
-      <w:r>
-        <w:rPr>
-          <w:sz w:val="36"/>
-          <w:szCs w:val="36"/>
-        </w:rPr>
-      </w:r>
-    </w:p>
-    <w:p>
-      <w:pPr>
-        <w:pStyle w:val="Normal"/>
-        <w:jc w:val="both"/>
-        <w:rPr>
-          <w:sz w:val="36"/>
-          <w:szCs w:val="36"/>
+        <w:t xml:space="preserve">"Amarás o Senhor teu Deus de todo o teu coração, e de toda a tua alma, e de todo o teu pensamento". </w:t>
+      </w:r>
+    </w:p>
+    <w:p>
+      <w:pPr>
+        <w:pStyle w:val="Normal"/>
+        <w:jc w:val="both"/>
+        <w:rPr>
+          <w:color w:val="000000"/>
+        </w:rPr>
+      </w:pPr>
+      <w:r>
+        <w:rPr>
+          <w:color w:val="000000"/>
+        </w:rPr>
+      </w:r>
+    </w:p>
+    <w:p>
+      <w:pPr>
+        <w:pStyle w:val="Normal"/>
+        <w:jc w:val="both"/>
+        <w:rPr>
+          <w:color w:val="000000"/>
         </w:rPr>
       </w:pPr>
       <w:r>
@@ -982,8 +1287,43 @@
           <w:shd w:fill="auto" w:val="clear"/>
           <w:lang w:val="en-US" w:eastAsia="zh-CN" w:bidi="hi-IN"/>
         </w:rPr>
-        <w:t xml:space="preserve">Com </w:t>
-      </w:r>
+        <w:t>Amar a Deus de coração, alma e pensamento. Vamos refletir sobre essas 3 diferentes expressões de amor a Deus e vamos fazer isso sob a ótica da Doutrina Espírita.</w:t>
+      </w:r>
+    </w:p>
+    <w:p>
+      <w:pPr>
+        <w:pStyle w:val="Normal"/>
+        <w:jc w:val="both"/>
+        <w:rPr>
+          <w:color w:val="000000"/>
+        </w:rPr>
+      </w:pPr>
+      <w:r>
+        <w:rPr>
+          <w:color w:val="000000"/>
+        </w:rPr>
+      </w:r>
+    </w:p>
+    <w:p>
+      <w:pPr>
+        <w:pStyle w:val="Normal"/>
+        <w:jc w:val="both"/>
+        <w:rPr>
+          <w:color w:val="000000"/>
+        </w:rPr>
+      </w:pPr>
+      <w:r>
+        <w:rPr>
+          <w:color w:val="000000"/>
+        </w:rPr>
+      </w:r>
+    </w:p>
+    <w:p>
+      <w:pPr>
+        <w:pStyle w:val="Normal"/>
+        <w:jc w:val="center"/>
+        <w:rPr/>
+      </w:pPr>
       <w:r>
         <w:rPr>
           <w:rFonts w:eastAsia="Times New Roman" w:cs="Times New Roman" w:ascii="Garamond" w:hAnsi="Garamond"/>
@@ -994,8 +1334,31 @@
           <w:shd w:fill="auto" w:val="clear"/>
           <w:lang w:val="en-US" w:eastAsia="zh-CN" w:bidi="hi-IN"/>
         </w:rPr>
-        <w:t>o mandamento maior,</w:t>
-      </w:r>
+        <w:t>Amar a Deus de todo o coração</w:t>
+      </w:r>
+    </w:p>
+    <w:p>
+      <w:pPr>
+        <w:pStyle w:val="Normal"/>
+        <w:jc w:val="both"/>
+        <w:rPr>
+          <w:color w:val="000000"/>
+        </w:rPr>
+      </w:pPr>
+      <w:r>
+        <w:rPr>
+          <w:color w:val="000000"/>
+        </w:rPr>
+      </w:r>
+    </w:p>
+    <w:p>
+      <w:pPr>
+        <w:pStyle w:val="Normal"/>
+        <w:jc w:val="both"/>
+        <w:rPr>
+          <w:color w:val="000000"/>
+        </w:rPr>
+      </w:pPr>
       <w:r>
         <w:rPr>
           <w:rFonts w:eastAsia="Times New Roman" w:cs="Times New Roman" w:ascii="Garamond" w:hAnsi="Garamond"/>
@@ -1006,8 +1369,31 @@
           <w:shd w:fill="auto" w:val="clear"/>
           <w:lang w:val="en-US" w:eastAsia="zh-CN" w:bidi="hi-IN"/>
         </w:rPr>
-        <w:t xml:space="preserve"> Jesus dissolve</w:t>
-      </w:r>
+        <w:t>O coração é interpretado como a sede dos sentimentos humanos. Ele representa afeição, amor, mas também um sentimento moral. É símbolo do afeto profundo, da sinceridade do sentimento.</w:t>
+      </w:r>
+    </w:p>
+    <w:p>
+      <w:pPr>
+        <w:pStyle w:val="Normal"/>
+        <w:jc w:val="both"/>
+        <w:rPr>
+          <w:color w:val="000000"/>
+        </w:rPr>
+      </w:pPr>
+      <w:r>
+        <w:rPr>
+          <w:color w:val="000000"/>
+        </w:rPr>
+      </w:r>
+    </w:p>
+    <w:p>
+      <w:pPr>
+        <w:pStyle w:val="Normal"/>
+        <w:jc w:val="both"/>
+        <w:rPr>
+          <w:color w:val="000000"/>
+        </w:rPr>
+      </w:pPr>
       <w:r>
         <w:rPr>
           <w:rFonts w:eastAsia="Times New Roman" w:cs="Times New Roman" w:ascii="Garamond" w:hAnsi="Garamond"/>
@@ -1018,8 +1404,31 @@
           <w:shd w:fill="auto" w:val="clear"/>
           <w:lang w:val="en-US" w:eastAsia="zh-CN" w:bidi="hi-IN"/>
         </w:rPr>
-        <w:t>u</w:t>
-      </w:r>
+        <w:t xml:space="preserve">Portanto, amar de todo o coração significa amar a Deus com pureza de sentimentos, sem hipocrisia; é amar de forma concreta e não apenas através de palavras. </w:t>
+      </w:r>
+    </w:p>
+    <w:p>
+      <w:pPr>
+        <w:pStyle w:val="Normal"/>
+        <w:jc w:val="both"/>
+        <w:rPr>
+          <w:color w:val="000000"/>
+        </w:rPr>
+      </w:pPr>
+      <w:r>
+        <w:rPr>
+          <w:color w:val="000000"/>
+        </w:rPr>
+      </w:r>
+    </w:p>
+    <w:p>
+      <w:pPr>
+        <w:pStyle w:val="Normal"/>
+        <w:jc w:val="both"/>
+        <w:rPr>
+          <w:color w:val="000000"/>
+        </w:rPr>
+      </w:pPr>
       <w:r>
         <w:rPr>
           <w:rFonts w:eastAsia="Times New Roman" w:cs="Times New Roman" w:ascii="Garamond" w:hAnsi="Garamond"/>
@@ -1030,8 +1439,29 @@
           <w:shd w:fill="auto" w:val="clear"/>
           <w:lang w:val="en-US" w:eastAsia="zh-CN" w:bidi="hi-IN"/>
         </w:rPr>
-        <w:t xml:space="preserve"> a hipocrisia e expô</w:t>
-      </w:r>
+        <w:t>O amor que devemos manifestar por Deus deve expressar nossa devoção mais sincera.</w:t>
+      </w:r>
+    </w:p>
+    <w:p>
+      <w:pPr>
+        <w:pStyle w:val="Normal"/>
+        <w:jc w:val="both"/>
+        <w:rPr>
+          <w:color w:val="000000"/>
+        </w:rPr>
+      </w:pPr>
+      <w:r>
+        <w:rPr>
+          <w:color w:val="000000"/>
+        </w:rPr>
+      </w:r>
+    </w:p>
+    <w:p>
+      <w:pPr>
+        <w:pStyle w:val="Normal"/>
+        <w:jc w:val="center"/>
+        <w:rPr/>
+      </w:pPr>
       <w:r>
         <w:rPr>
           <w:rFonts w:eastAsia="Times New Roman" w:cs="Times New Roman" w:ascii="Garamond" w:hAnsi="Garamond"/>
@@ -1042,8 +1472,31 @@
           <w:shd w:fill="auto" w:val="clear"/>
           <w:lang w:val="en-US" w:eastAsia="zh-CN" w:bidi="hi-IN"/>
         </w:rPr>
-        <w:t>s</w:t>
-      </w:r>
+        <w:t>Amar a Deus de toda a alma</w:t>
+      </w:r>
+    </w:p>
+    <w:p>
+      <w:pPr>
+        <w:pStyle w:val="Normal"/>
+        <w:jc w:val="both"/>
+        <w:rPr>
+          <w:color w:val="000000"/>
+        </w:rPr>
+      </w:pPr>
+      <w:r>
+        <w:rPr>
+          <w:color w:val="000000"/>
+        </w:rPr>
+      </w:r>
+    </w:p>
+    <w:p>
+      <w:pPr>
+        <w:pStyle w:val="Normal"/>
+        <w:jc w:val="both"/>
+        <w:rPr>
+          <w:color w:val="000000"/>
+        </w:rPr>
+      </w:pPr>
       <w:r>
         <w:rPr>
           <w:rFonts w:eastAsia="Times New Roman" w:cs="Times New Roman" w:ascii="Garamond" w:hAnsi="Garamond"/>
@@ -1054,8 +1507,31 @@
           <w:shd w:fill="auto" w:val="clear"/>
           <w:lang w:val="en-US" w:eastAsia="zh-CN" w:bidi="hi-IN"/>
         </w:rPr>
-        <w:t xml:space="preserve"> a superficialidade da religião exterior</w:t>
-      </w:r>
+        <w:t>Em O Livro dos Espíritos, a Espiritualidade nos diz que alma nada mais é que o Espírito encarnado. A alma é a própria essência do ser, a individualidade espiritual que sobrevive à morte.</w:t>
+      </w:r>
+    </w:p>
+    <w:p>
+      <w:pPr>
+        <w:pStyle w:val="Normal"/>
+        <w:jc w:val="both"/>
+        <w:rPr>
+          <w:color w:val="000000"/>
+        </w:rPr>
+      </w:pPr>
+      <w:r>
+        <w:rPr>
+          <w:color w:val="000000"/>
+        </w:rPr>
+      </w:r>
+    </w:p>
+    <w:p>
+      <w:pPr>
+        <w:pStyle w:val="Normal"/>
+        <w:jc w:val="both"/>
+        <w:rPr>
+          <w:color w:val="000000"/>
+        </w:rPr>
+      </w:pPr>
       <w:r>
         <w:rPr>
           <w:rFonts w:eastAsia="Times New Roman" w:cs="Times New Roman" w:ascii="Garamond" w:hAnsi="Garamond"/>
@@ -1066,29 +1542,29 @@
           <w:shd w:fill="auto" w:val="clear"/>
           <w:lang w:val="en-US" w:eastAsia="zh-CN" w:bidi="hi-IN"/>
         </w:rPr>
-        <w:t xml:space="preserve"> vivida por aquelas pessoas.</w:t>
-      </w:r>
-    </w:p>
-    <w:p>
-      <w:pPr>
-        <w:pStyle w:val="Normal"/>
-        <w:jc w:val="both"/>
-        <w:rPr>
-          <w:sz w:val="36"/>
-          <w:szCs w:val="36"/>
-        </w:rPr>
-      </w:pPr>
-      <w:r>
-        <w:rPr/>
-      </w:r>
-    </w:p>
-    <w:p>
-      <w:pPr>
-        <w:pStyle w:val="Normal"/>
-        <w:jc w:val="both"/>
-        <w:rPr>
-          <w:sz w:val="36"/>
-          <w:szCs w:val="36"/>
+        <w:t>Amar a Deus de toda a alma  é amar com tudo o que somos, na nossa integralidade espiritual, como Espíritos imortais. Isso inclui a ideia de entrega total, de fidelidade a Deus acima de todas as coisas, inclusive acima dos interesses passageiros da vida material.</w:t>
+      </w:r>
+    </w:p>
+    <w:p>
+      <w:pPr>
+        <w:pStyle w:val="Normal"/>
+        <w:jc w:val="both"/>
+        <w:rPr>
+          <w:color w:val="000000"/>
+        </w:rPr>
+      </w:pPr>
+      <w:r>
+        <w:rPr>
+          <w:color w:val="000000"/>
+        </w:rPr>
+      </w:r>
+    </w:p>
+    <w:p>
+      <w:pPr>
+        <w:pStyle w:val="Normal"/>
+        <w:jc w:val="both"/>
+        <w:rPr>
+          <w:color w:val="000000"/>
         </w:rPr>
       </w:pPr>
       <w:r>
@@ -1101,8 +1577,29 @@
           <w:shd w:fill="auto" w:val="clear"/>
           <w:lang w:val="en-US" w:eastAsia="zh-CN" w:bidi="hi-IN"/>
         </w:rPr>
-        <w:t>E</w:t>
-      </w:r>
+        <w:t>É o amor que transcende a existência terrena: amar a Deus não só enquanto estamos no corpo, mas também como Espírito eterno.</w:t>
+      </w:r>
+    </w:p>
+    <w:p>
+      <w:pPr>
+        <w:pStyle w:val="Normal"/>
+        <w:jc w:val="both"/>
+        <w:rPr>
+          <w:color w:val="000000"/>
+        </w:rPr>
+      </w:pPr>
+      <w:r>
+        <w:rPr>
+          <w:color w:val="000000"/>
+        </w:rPr>
+      </w:r>
+    </w:p>
+    <w:p>
+      <w:pPr>
+        <w:pStyle w:val="Normal"/>
+        <w:jc w:val="center"/>
+        <w:rPr/>
+      </w:pPr>
       <w:r>
         <w:rPr>
           <w:rFonts w:eastAsia="Times New Roman" w:cs="Times New Roman" w:ascii="Garamond" w:hAnsi="Garamond"/>
@@ -1113,29 +1610,29 @@
           <w:shd w:fill="auto" w:val="clear"/>
           <w:lang w:val="en-US" w:eastAsia="zh-CN" w:bidi="hi-IN"/>
         </w:rPr>
-        <w:t>sse comportamento combatido por Jesus permanece conosco até os dias de hoje. Passados mais de 2000 mil anos, continuamos exigindo muitas condições para fazer o bem. Escolhemos a quem, como e onde fazer o bem. E não pode ser assim.</w:t>
-      </w:r>
-    </w:p>
-    <w:p>
-      <w:pPr>
-        <w:pStyle w:val="Normal"/>
-        <w:jc w:val="both"/>
-        <w:rPr>
-          <w:sz w:val="36"/>
-          <w:szCs w:val="36"/>
-        </w:rPr>
-      </w:pPr>
-      <w:r>
-        <w:rPr/>
-      </w:r>
-    </w:p>
-    <w:p>
-      <w:pPr>
-        <w:pStyle w:val="Normal"/>
-        <w:jc w:val="both"/>
-        <w:rPr>
-          <w:sz w:val="36"/>
-          <w:szCs w:val="36"/>
+        <w:t>Amar a Deus de todo o pensamento</w:t>
+      </w:r>
+    </w:p>
+    <w:p>
+      <w:pPr>
+        <w:pStyle w:val="Normal"/>
+        <w:jc w:val="both"/>
+        <w:rPr>
+          <w:color w:val="000000"/>
+        </w:rPr>
+      </w:pPr>
+      <w:r>
+        <w:rPr>
+          <w:color w:val="000000"/>
+        </w:rPr>
+      </w:r>
+    </w:p>
+    <w:p>
+      <w:pPr>
+        <w:pStyle w:val="Normal"/>
+        <w:jc w:val="both"/>
+        <w:rPr>
+          <w:color w:val="000000"/>
         </w:rPr>
       </w:pPr>
       <w:r>
@@ -1148,29 +1645,29 @@
           <w:shd w:fill="auto" w:val="clear"/>
           <w:lang w:val="en-US" w:eastAsia="zh-CN" w:bidi="hi-IN"/>
         </w:rPr>
-        <w:t xml:space="preserve">Sem querer traçar qualquer comparação entre o mentor espiritual dessa casa e o nosso Mestre Jesus Cristo, podemos dizer sem nenhum receio de errar, que o Irmão Glacus reafirma o convite para "amar ao próximo" ensinado por Jesus. </w:t>
-      </w:r>
-    </w:p>
-    <w:p>
-      <w:pPr>
-        <w:pStyle w:val="Normal"/>
-        <w:jc w:val="both"/>
-        <w:rPr>
-          <w:sz w:val="36"/>
-          <w:szCs w:val="36"/>
-        </w:rPr>
-      </w:pPr>
-      <w:r>
-        <w:rPr/>
-      </w:r>
-    </w:p>
-    <w:p>
-      <w:pPr>
-        <w:pStyle w:val="Normal"/>
-        <w:jc w:val="both"/>
-        <w:rPr>
-          <w:sz w:val="36"/>
-          <w:szCs w:val="36"/>
+        <w:t>Aqui encontramos a dimensão da fé raciocinada, que o Espiritismo nos ensina.</w:t>
+      </w:r>
+    </w:p>
+    <w:p>
+      <w:pPr>
+        <w:pStyle w:val="Normal"/>
+        <w:jc w:val="both"/>
+        <w:rPr>
+          <w:color w:val="000000"/>
+        </w:rPr>
+      </w:pPr>
+      <w:r>
+        <w:rPr>
+          <w:color w:val="000000"/>
+        </w:rPr>
+      </w:r>
+    </w:p>
+    <w:p>
+      <w:pPr>
+        <w:pStyle w:val="Normal"/>
+        <w:jc w:val="both"/>
+        <w:rPr>
+          <w:color w:val="000000"/>
         </w:rPr>
       </w:pPr>
       <w:r>
@@ -1183,51 +1680,34 @@
           <w:shd w:fill="auto" w:val="clear"/>
           <w:lang w:val="en-US" w:eastAsia="zh-CN" w:bidi="hi-IN"/>
         </w:rPr>
-        <w:t>Qual é o lema dessa casa?</w:t>
-      </w:r>
-    </w:p>
-    <w:p>
-      <w:pPr>
-        <w:pStyle w:val="Normal"/>
-        <w:jc w:val="both"/>
-        <w:rPr>
-          <w:sz w:val="36"/>
-          <w:szCs w:val="36"/>
-        </w:rPr>
-      </w:pPr>
-      <w:r>
-        <w:rPr/>
-      </w:r>
-    </w:p>
-    <w:p>
-      <w:pPr>
-        <w:pStyle w:val="Normal"/>
-        <w:jc w:val="both"/>
-        <w:rPr>
-          <w:sz w:val="36"/>
-          <w:szCs w:val="36"/>
-        </w:rPr>
-      </w:pPr>
-      <w:r>
-        <w:rPr/>
-      </w:r>
-    </w:p>
-    <w:p>
-      <w:pPr>
-        <w:pStyle w:val="Normal"/>
-        <w:ind w:left="720" w:hanging="0"/>
-        <w:jc w:val="both"/>
-        <w:rPr>
-          <w:i/>
-          <w:i/>
-          <w:iCs/>
+        <w:t>Não é um amor cego, mas lúcido: nós sabemos por que amamos a Deus. Através da inteligência e da consciência moral, reconhecemos a justiça, a bondade e a sabedoria divinas.</w:t>
+      </w:r>
+    </w:p>
+    <w:p>
+      <w:pPr>
+        <w:pStyle w:val="Normal"/>
+        <w:jc w:val="both"/>
+        <w:rPr>
+          <w:color w:val="000000"/>
+        </w:rPr>
+      </w:pPr>
+      <w:r>
+        <w:rPr>
+          <w:color w:val="000000"/>
+        </w:rPr>
+      </w:r>
+    </w:p>
+    <w:p>
+      <w:pPr>
+        <w:pStyle w:val="Normal"/>
+        <w:jc w:val="both"/>
+        <w:rPr>
+          <w:color w:val="000000"/>
         </w:rPr>
       </w:pPr>
       <w:r>
         <w:rPr>
           <w:rFonts w:eastAsia="Times New Roman" w:cs="Times New Roman" w:ascii="Garamond" w:hAnsi="Garamond"/>
-          <w:i/>
-          <w:iCs/>
           <w:color w:val="000000"/>
           <w:kern w:val="0"/>
           <w:sz w:val="36"/>
@@ -1235,13 +1715,34 @@
           <w:shd w:fill="auto" w:val="clear"/>
           <w:lang w:val="en-US" w:eastAsia="zh-CN" w:bidi="hi-IN"/>
         </w:rPr>
-        <w:t>O</w:t>
-      </w:r>
+        <w:t>O exercício da fé raciocinada nem sempre é fácil. Os tempos atuais da humanidade tem sido sombrios e turbulentos. Diariamente nos deparamos com situações em que nos perguntamos "Por quê Deus está permitindo que isso aconteça?". Ou ainda "Por quê Deus não faz nada para mudar essa cenário?". "Os maus vencem e prosperam enquanto os bons sofrem e são injustiçados".</w:t>
+      </w:r>
+    </w:p>
+    <w:p>
+      <w:pPr>
+        <w:pStyle w:val="Normal"/>
+        <w:jc w:val="both"/>
+        <w:rPr>
+          <w:color w:val="000000"/>
+        </w:rPr>
+      </w:pPr>
+      <w:r>
+        <w:rPr>
+          <w:color w:val="000000"/>
+        </w:rPr>
+      </w:r>
+    </w:p>
+    <w:p>
+      <w:pPr>
+        <w:pStyle w:val="Normal"/>
+        <w:jc w:val="both"/>
+        <w:rPr>
+          <w:color w:val="000000"/>
+        </w:rPr>
+      </w:pPr>
       <w:r>
         <w:rPr>
           <w:rFonts w:eastAsia="Times New Roman" w:cs="Times New Roman" w:ascii="Garamond" w:hAnsi="Garamond"/>
-          <w:i/>
-          <w:iCs/>
           <w:color w:val="000000"/>
           <w:kern w:val="0"/>
           <w:sz w:val="36"/>
@@ -1249,29 +1750,29 @@
           <w:shd w:fill="auto" w:val="clear"/>
           <w:lang w:val="en-US" w:eastAsia="zh-CN" w:bidi="hi-IN"/>
         </w:rPr>
-        <w:t xml:space="preserve"> compromisso da FEIG é com o ser humano.</w:t>
-      </w:r>
-    </w:p>
-    <w:p>
-      <w:pPr>
-        <w:pStyle w:val="Normal"/>
-        <w:jc w:val="both"/>
-        <w:rPr>
-          <w:sz w:val="36"/>
-          <w:szCs w:val="36"/>
-        </w:rPr>
-      </w:pPr>
-      <w:r>
-        <w:rPr/>
-      </w:r>
-    </w:p>
-    <w:p>
-      <w:pPr>
-        <w:pStyle w:val="Normal"/>
-        <w:jc w:val="both"/>
-        <w:rPr>
-          <w:sz w:val="36"/>
-          <w:szCs w:val="36"/>
+        <w:t xml:space="preserve">Sem a fé raciocinada, colocamos em dúvida a justiça, a bondade, a sabedoria e até mesmo o poder de Deus. Em momentos assim a razão vem e nos diz que Deus não poderia ser Deus se Ele não possuisse todas as qualidades em seu grau máximo. </w:t>
+      </w:r>
+    </w:p>
+    <w:p>
+      <w:pPr>
+        <w:pStyle w:val="Normal"/>
+        <w:jc w:val="both"/>
+        <w:rPr>
+          <w:color w:val="000000"/>
+        </w:rPr>
+      </w:pPr>
+      <w:r>
+        <w:rPr>
+          <w:color w:val="000000"/>
+        </w:rPr>
+      </w:r>
+    </w:p>
+    <w:p>
+      <w:pPr>
+        <w:pStyle w:val="Normal"/>
+        <w:jc w:val="both"/>
+        <w:rPr>
+          <w:color w:val="000000"/>
         </w:rPr>
       </w:pPr>
       <w:r>
@@ -1284,29 +1785,29 @@
           <w:shd w:fill="auto" w:val="clear"/>
           <w:lang w:val="en-US" w:eastAsia="zh-CN" w:bidi="hi-IN"/>
         </w:rPr>
-        <w:t>Alguém tem dúvidas sobre o que o Irmão Glacus quis dizer com essas palavras? Seria correto eu fazer o bem somente aos espíritas, aos cristãos, aos familiares, amigos, às pessoas que pensam como eu?</w:t>
-      </w:r>
-    </w:p>
-    <w:p>
-      <w:pPr>
-        <w:pStyle w:val="Normal"/>
-        <w:jc w:val="both"/>
-        <w:rPr>
-          <w:sz w:val="36"/>
-          <w:szCs w:val="36"/>
-        </w:rPr>
-      </w:pPr>
-      <w:r>
-        <w:rPr/>
-      </w:r>
-    </w:p>
-    <w:p>
-      <w:pPr>
-        <w:pStyle w:val="Normal"/>
-        <w:jc w:val="both"/>
-        <w:rPr>
-          <w:sz w:val="36"/>
-          <w:szCs w:val="36"/>
+        <w:t xml:space="preserve">Portanto, por mais estranheza, tristeza e até mesmo uma certa revolta que essas situações nos causem, com a fé raciocinada entendemos que todas as coisas estão sob o controle e de acordo com a vontade de Deus. Nós é que ainda somos incapazes de compreender os desígnios do Pai. </w:t>
+      </w:r>
+    </w:p>
+    <w:p>
+      <w:pPr>
+        <w:pStyle w:val="Normal"/>
+        <w:jc w:val="both"/>
+        <w:rPr>
+          <w:color w:val="000000"/>
+        </w:rPr>
+      </w:pPr>
+      <w:r>
+        <w:rPr>
+          <w:color w:val="000000"/>
+        </w:rPr>
+      </w:r>
+    </w:p>
+    <w:p>
+      <w:pPr>
+        <w:pStyle w:val="Normal"/>
+        <w:jc w:val="both"/>
+        <w:rPr>
+          <w:color w:val="000000"/>
         </w:rPr>
       </w:pPr>
       <w:r>
@@ -1319,32 +1820,29 @@
           <w:shd w:fill="auto" w:val="clear"/>
           <w:lang w:val="en-US" w:eastAsia="zh-CN" w:bidi="hi-IN"/>
         </w:rPr>
-        <w:t>Não, não há margem para essa seletividade. Como membros integrantes da família espiritual que essa casa representa, nosso compromisso é com o ser humano, qualquer que seja ele.</w:t>
-      </w:r>
-    </w:p>
-    <w:p>
-      <w:pPr>
-        <w:pStyle w:val="Normal"/>
-        <w:jc w:val="both"/>
-        <w:rPr>
-          <w:sz w:val="36"/>
-          <w:szCs w:val="36"/>
-        </w:rPr>
-      </w:pPr>
-      <w:r>
-        <w:rPr>
-          <w:sz w:val="36"/>
-          <w:szCs w:val="36"/>
-        </w:rPr>
-      </w:r>
-    </w:p>
-    <w:p>
-      <w:pPr>
-        <w:pStyle w:val="Normal"/>
-        <w:jc w:val="both"/>
-        <w:rPr>
-          <w:sz w:val="36"/>
-          <w:szCs w:val="36"/>
+        <w:t>Por fim, amar a Deus em pensamento é também o exercício de manter a mente sintonizada com o bem, ocupando o pensamento com tudo aquilo que nos  eleva.</w:t>
+      </w:r>
+    </w:p>
+    <w:p>
+      <w:pPr>
+        <w:pStyle w:val="Normal"/>
+        <w:jc w:val="both"/>
+        <w:rPr>
+          <w:color w:val="000000"/>
+        </w:rPr>
+      </w:pPr>
+      <w:r>
+        <w:rPr>
+          <w:color w:val="000000"/>
+        </w:rPr>
+      </w:r>
+    </w:p>
+    <w:p>
+      <w:pPr>
+        <w:pStyle w:val="Normal"/>
+        <w:jc w:val="both"/>
+        <w:rPr>
+          <w:color w:val="000000"/>
         </w:rPr>
       </w:pPr>
       <w:r>
@@ -1357,7 +1855,149 @@
           <w:shd w:fill="auto" w:val="clear"/>
           <w:lang w:val="en-US" w:eastAsia="zh-CN" w:bidi="hi-IN"/>
         </w:rPr>
-        <w:t xml:space="preserve">Esse mandamento é o resumo de tudo o que Jesus vinha ensinando. Quando o amor está no centro, não há espaço para a hipocrisia, para a vaidade espiritual ou para a religião de aparências. </w:t>
+        <w:t>Podemos então dizer que:</w:t>
+      </w:r>
+    </w:p>
+    <w:p>
+      <w:pPr>
+        <w:pStyle w:val="Normal"/>
+        <w:jc w:val="both"/>
+        <w:rPr>
+          <w:color w:val="000000"/>
+        </w:rPr>
+      </w:pPr>
+      <w:r>
+        <w:rPr>
+          <w:color w:val="000000"/>
+        </w:rPr>
+      </w:r>
+    </w:p>
+    <w:p>
+      <w:pPr>
+        <w:pStyle w:val="Normal"/>
+        <w:numPr>
+          <w:ilvl w:val="0"/>
+          <w:numId w:val="9"/>
+        </w:numPr>
+        <w:jc w:val="both"/>
+        <w:rPr>
+          <w:color w:val="000000"/>
+        </w:rPr>
+      </w:pPr>
+      <w:r>
+        <w:rPr>
+          <w:rFonts w:eastAsia="Times New Roman" w:cs="Times New Roman" w:ascii="Garamond" w:hAnsi="Garamond"/>
+          <w:color w:val="000000"/>
+          <w:kern w:val="0"/>
+          <w:sz w:val="36"/>
+          <w:szCs w:val="36"/>
+          <w:shd w:fill="auto" w:val="clear"/>
+          <w:lang w:val="en-US" w:eastAsia="zh-CN" w:bidi="hi-IN"/>
+        </w:rPr>
+        <w:t>Amar de todo o coração é cultivar o sentimento do bem.</w:t>
+      </w:r>
+    </w:p>
+    <w:p>
+      <w:pPr>
+        <w:pStyle w:val="Normal"/>
+        <w:numPr>
+          <w:ilvl w:val="0"/>
+          <w:numId w:val="9"/>
+        </w:numPr>
+        <w:jc w:val="both"/>
+        <w:rPr>
+          <w:color w:val="000000"/>
+        </w:rPr>
+      </w:pPr>
+      <w:r>
+        <w:rPr>
+          <w:rFonts w:eastAsia="Times New Roman" w:cs="Times New Roman" w:ascii="Garamond" w:hAnsi="Garamond"/>
+          <w:color w:val="000000"/>
+          <w:kern w:val="0"/>
+          <w:sz w:val="36"/>
+          <w:szCs w:val="36"/>
+          <w:shd w:fill="auto" w:val="clear"/>
+          <w:lang w:val="en-US" w:eastAsia="zh-CN" w:bidi="hi-IN"/>
+        </w:rPr>
+        <w:t>Amar de toda a alma é viver de acordo com nossa natureza de Espíritos imortais.</w:t>
+      </w:r>
+    </w:p>
+    <w:p>
+      <w:pPr>
+        <w:pStyle w:val="Normal"/>
+        <w:numPr>
+          <w:ilvl w:val="0"/>
+          <w:numId w:val="9"/>
+        </w:numPr>
+        <w:jc w:val="both"/>
+        <w:rPr>
+          <w:color w:val="000000"/>
+        </w:rPr>
+      </w:pPr>
+      <w:r>
+        <w:rPr>
+          <w:rFonts w:eastAsia="Times New Roman" w:cs="Times New Roman" w:ascii="Garamond" w:hAnsi="Garamond"/>
+          <w:color w:val="000000"/>
+          <w:kern w:val="0"/>
+          <w:sz w:val="36"/>
+          <w:szCs w:val="36"/>
+          <w:shd w:fill="auto" w:val="clear"/>
+          <w:lang w:val="en-US" w:eastAsia="zh-CN" w:bidi="hi-IN"/>
+        </w:rPr>
+        <w:t xml:space="preserve">Amar de todo o pensamento é exercitar a fé raciocinada, reconhecendo a grandeza de Deus através da inteligência e pela observação de Suas leis. </w:t>
+      </w:r>
+    </w:p>
+    <w:p>
+      <w:pPr>
+        <w:pStyle w:val="Normal"/>
+        <w:jc w:val="both"/>
+        <w:rPr>
+          <w:color w:val="000000"/>
+        </w:rPr>
+      </w:pPr>
+      <w:r>
+        <w:rPr>
+          <w:color w:val="000000"/>
+        </w:rPr>
+      </w:r>
+    </w:p>
+    <w:p>
+      <w:pPr>
+        <w:pStyle w:val="Normal"/>
+        <w:jc w:val="both"/>
+        <w:rPr>
+          <w:color w:val="000000"/>
+        </w:rPr>
+      </w:pPr>
+      <w:r>
+        <w:rPr>
+          <w:rFonts w:eastAsia="Times New Roman" w:cs="Times New Roman" w:ascii="Garamond" w:hAnsi="Garamond"/>
+          <w:color w:val="000000"/>
+          <w:kern w:val="0"/>
+          <w:sz w:val="36"/>
+          <w:szCs w:val="36"/>
+          <w:shd w:fill="auto" w:val="clear"/>
+          <w:lang w:val="en-US" w:eastAsia="zh-CN" w:bidi="hi-IN"/>
+        </w:rPr>
+        <w:t>Portanto, Jesus nos convida a amar a Deus com toda a nossa sensibilidade (coração), toda a nossa essência espiritual (alma) e toda a nossa razão (pensamento).</w:t>
+      </w:r>
+    </w:p>
+    <w:p>
+      <w:pPr>
+        <w:pStyle w:val="Normal"/>
+        <w:jc w:val="both"/>
+        <w:rPr>
+          <w:color w:val="00A0FC"/>
+          <w:sz w:val="36"/>
+          <w:szCs w:val="36"/>
+        </w:rPr>
+      </w:pPr>
+      <w:r>
+        <w:rPr>
+          <w:color w:val="00A0FC"/>
+          <w:sz w:val="36"/>
+          <w:szCs w:val="36"/>
+        </w:rPr>
       </w:r>
     </w:p>
     <w:p>
@@ -1380,869 +2020,7 @@
           <w:shd w:fill="auto" w:val="clear"/>
           <w:lang w:val="en-US" w:eastAsia="zh-CN" w:bidi="hi-IN"/>
         </w:rPr>
-        <w:t>[ Início - Tópico 1 ]</w:t>
-      </w:r>
-    </w:p>
-    <w:p>
-      <w:pPr>
-        <w:pStyle w:val="Normal"/>
-        <w:jc w:val="both"/>
-        <w:rPr>
-          <w:color w:val="000000"/>
-        </w:rPr>
-      </w:pPr>
-      <w:r>
-        <w:rPr>
-          <w:rFonts w:eastAsia="Times New Roman" w:cs="Times New Roman" w:ascii="Garamond" w:hAnsi="Garamond"/>
-          <w:color w:val="000000"/>
-          <w:kern w:val="0"/>
-          <w:sz w:val="36"/>
-          <w:szCs w:val="36"/>
-          <w:shd w:fill="auto" w:val="clear"/>
-          <w:lang w:val="en-US" w:eastAsia="zh-CN" w:bidi="hi-IN"/>
-        </w:rPr>
-        <w:t>Retornando ao mandamento maior, n</w:t>
-      </w:r>
-      <w:r>
-        <w:rPr>
-          <w:rFonts w:eastAsia="Times New Roman" w:cs="Times New Roman" w:ascii="Garamond" w:hAnsi="Garamond"/>
-          <w:color w:val="000000"/>
-          <w:kern w:val="0"/>
-          <w:sz w:val="36"/>
-          <w:szCs w:val="36"/>
-          <w:shd w:fill="auto" w:val="clear"/>
-          <w:lang w:val="en-US" w:eastAsia="zh-CN" w:bidi="hi-IN"/>
-        </w:rPr>
-        <w:t xml:space="preserve">o versículo 37 Jesus diz: </w:t>
-      </w:r>
-    </w:p>
-    <w:p>
-      <w:pPr>
-        <w:pStyle w:val="Normal"/>
-        <w:jc w:val="both"/>
-        <w:rPr>
-          <w:color w:val="000000"/>
-        </w:rPr>
-      </w:pPr>
-      <w:r>
-        <w:rPr/>
-      </w:r>
-    </w:p>
-    <w:p>
-      <w:pPr>
-        <w:pStyle w:val="Normal"/>
-        <w:ind w:left="720" w:hanging="0"/>
-        <w:jc w:val="both"/>
-        <w:rPr>
-          <w:i/>
-          <w:i/>
-          <w:iCs/>
-        </w:rPr>
-      </w:pPr>
-      <w:r>
-        <w:rPr>
-          <w:rFonts w:eastAsia="Times New Roman" w:cs="Times New Roman" w:ascii="Garamond" w:hAnsi="Garamond"/>
-          <w:i/>
-          <w:iCs/>
-          <w:color w:val="000000"/>
-          <w:kern w:val="0"/>
-          <w:sz w:val="36"/>
-          <w:szCs w:val="36"/>
-          <w:shd w:fill="auto" w:val="clear"/>
-          <w:lang w:val="en-US" w:eastAsia="zh-CN" w:bidi="hi-IN"/>
-        </w:rPr>
-        <w:t>"</w:t>
-      </w:r>
-      <w:r>
-        <w:rPr>
-          <w:rFonts w:eastAsia="Times New Roman" w:cs="Times New Roman" w:ascii="Garamond" w:hAnsi="Garamond"/>
-          <w:i/>
-          <w:iCs/>
-          <w:color w:val="000000"/>
-          <w:kern w:val="0"/>
-          <w:sz w:val="36"/>
-          <w:szCs w:val="36"/>
-          <w:shd w:fill="auto" w:val="clear"/>
-          <w:lang w:val="en-US" w:eastAsia="zh-CN" w:bidi="hi-IN"/>
-        </w:rPr>
-        <w:t>Amarás o Senhor teu Deus de todo o teu coração, e de toda a tua alma, e de todo o teu pensamento</w:t>
-      </w:r>
-      <w:r>
-        <w:rPr>
-          <w:rFonts w:eastAsia="Times New Roman" w:cs="Times New Roman" w:ascii="Garamond" w:hAnsi="Garamond"/>
-          <w:i/>
-          <w:iCs/>
-          <w:color w:val="000000"/>
-          <w:kern w:val="0"/>
-          <w:sz w:val="36"/>
-          <w:szCs w:val="36"/>
-          <w:shd w:fill="auto" w:val="clear"/>
-          <w:lang w:val="en-US" w:eastAsia="zh-CN" w:bidi="hi-IN"/>
-        </w:rPr>
-        <w:t>"</w:t>
-      </w:r>
-      <w:r>
-        <w:rPr>
-          <w:rFonts w:eastAsia="Times New Roman" w:cs="Times New Roman" w:ascii="Garamond" w:hAnsi="Garamond"/>
-          <w:i/>
-          <w:iCs/>
-          <w:color w:val="000000"/>
-          <w:kern w:val="0"/>
-          <w:sz w:val="36"/>
-          <w:szCs w:val="36"/>
-          <w:shd w:fill="auto" w:val="clear"/>
-          <w:lang w:val="en-US" w:eastAsia="zh-CN" w:bidi="hi-IN"/>
-        </w:rPr>
-        <w:t xml:space="preserve">. </w:t>
-      </w:r>
-    </w:p>
-    <w:p>
-      <w:pPr>
-        <w:pStyle w:val="Normal"/>
-        <w:jc w:val="both"/>
-        <w:rPr>
-          <w:color w:val="000000"/>
-        </w:rPr>
-      </w:pPr>
-      <w:r>
-        <w:rPr/>
-      </w:r>
-    </w:p>
-    <w:p>
-      <w:pPr>
-        <w:pStyle w:val="Normal"/>
-        <w:jc w:val="both"/>
-        <w:rPr>
-          <w:color w:val="000000"/>
-        </w:rPr>
-      </w:pPr>
-      <w:r>
-        <w:rPr>
-          <w:rFonts w:eastAsia="Times New Roman" w:cs="Times New Roman" w:ascii="Garamond" w:hAnsi="Garamond"/>
-          <w:color w:val="000000"/>
-          <w:kern w:val="0"/>
-          <w:sz w:val="36"/>
-          <w:szCs w:val="36"/>
-          <w:shd w:fill="auto" w:val="clear"/>
-          <w:lang w:val="en-US" w:eastAsia="zh-CN" w:bidi="hi-IN"/>
-        </w:rPr>
-        <w:t>Amar a Deus de coração, alma e pensamento. Vamos refletir sobre essas 3 diferentes expressões de amor a Deus</w:t>
-      </w:r>
-      <w:r>
-        <w:rPr>
-          <w:rFonts w:eastAsia="Times New Roman" w:cs="Times New Roman" w:ascii="Garamond" w:hAnsi="Garamond"/>
-          <w:color w:val="000000"/>
-          <w:kern w:val="0"/>
-          <w:sz w:val="36"/>
-          <w:szCs w:val="36"/>
-          <w:shd w:fill="auto" w:val="clear"/>
-          <w:lang w:val="en-US" w:eastAsia="zh-CN" w:bidi="hi-IN"/>
-        </w:rPr>
-        <w:t xml:space="preserve"> e vamos fazer isso sob </w:t>
-      </w:r>
-      <w:r>
-        <w:rPr>
-          <w:rFonts w:eastAsia="Times New Roman" w:cs="Times New Roman" w:ascii="Garamond" w:hAnsi="Garamond"/>
-          <w:color w:val="000000"/>
-          <w:kern w:val="0"/>
-          <w:sz w:val="36"/>
-          <w:szCs w:val="36"/>
-          <w:shd w:fill="auto" w:val="clear"/>
-          <w:lang w:val="en-US" w:eastAsia="zh-CN" w:bidi="hi-IN"/>
-        </w:rPr>
-        <w:t>a ótica da Doutrina Espírita.</w:t>
-      </w:r>
-    </w:p>
-    <w:p>
-      <w:pPr>
-        <w:pStyle w:val="Normal"/>
-        <w:jc w:val="both"/>
-        <w:rPr>
-          <w:color w:val="000000"/>
-        </w:rPr>
-      </w:pPr>
-      <w:r>
-        <w:rPr>
-          <w:color w:val="000000"/>
-        </w:rPr>
-      </w:r>
-    </w:p>
-    <w:p>
-      <w:pPr>
-        <w:pStyle w:val="Normal"/>
-        <w:jc w:val="both"/>
-        <w:rPr>
-          <w:color w:val="000000"/>
-        </w:rPr>
-      </w:pPr>
-      <w:r>
-        <w:rPr>
-          <w:color w:val="000000"/>
-        </w:rPr>
-      </w:r>
-    </w:p>
-    <w:p>
-      <w:pPr>
-        <w:pStyle w:val="Normal"/>
-        <w:jc w:val="center"/>
-        <w:rPr/>
-      </w:pPr>
-      <w:r>
-        <w:rPr>
-          <w:rFonts w:eastAsia="Times New Roman" w:cs="Times New Roman" w:ascii="Garamond" w:hAnsi="Garamond"/>
-          <w:color w:val="000000"/>
-          <w:kern w:val="0"/>
-          <w:sz w:val="36"/>
-          <w:szCs w:val="36"/>
-          <w:shd w:fill="auto" w:val="clear"/>
-          <w:lang w:val="en-US" w:eastAsia="zh-CN" w:bidi="hi-IN"/>
-        </w:rPr>
-        <w:t>Amar a Deus de todo o coração</w:t>
-      </w:r>
-    </w:p>
-    <w:p>
-      <w:pPr>
-        <w:pStyle w:val="Normal"/>
-        <w:jc w:val="both"/>
-        <w:rPr>
-          <w:color w:val="000000"/>
-        </w:rPr>
-      </w:pPr>
-      <w:r>
-        <w:rPr>
-          <w:color w:val="000000"/>
-        </w:rPr>
-      </w:r>
-    </w:p>
-    <w:p>
-      <w:pPr>
-        <w:pStyle w:val="Normal"/>
-        <w:jc w:val="both"/>
-        <w:rPr>
-          <w:color w:val="000000"/>
-        </w:rPr>
-      </w:pPr>
-      <w:r>
-        <w:rPr>
-          <w:rFonts w:eastAsia="Times New Roman" w:cs="Times New Roman" w:ascii="Garamond" w:hAnsi="Garamond"/>
-          <w:color w:val="000000"/>
-          <w:kern w:val="0"/>
-          <w:sz w:val="36"/>
-          <w:szCs w:val="36"/>
-          <w:shd w:fill="auto" w:val="clear"/>
-          <w:lang w:val="en-US" w:eastAsia="zh-CN" w:bidi="hi-IN"/>
-        </w:rPr>
-        <w:t>O coração é interpretado como a sede dos sentimentos humanos. Ele representa afeição, amor, mas também um sentimento moral. É símbolo do afeto profundo, da sinceridade do sentimento.</w:t>
-      </w:r>
-    </w:p>
-    <w:p>
-      <w:pPr>
-        <w:pStyle w:val="Normal"/>
-        <w:jc w:val="both"/>
-        <w:rPr>
-          <w:color w:val="000000"/>
-        </w:rPr>
-      </w:pPr>
-      <w:r>
-        <w:rPr>
-          <w:color w:val="000000"/>
-        </w:rPr>
-      </w:r>
-    </w:p>
-    <w:p>
-      <w:pPr>
-        <w:pStyle w:val="Normal"/>
-        <w:jc w:val="both"/>
-        <w:rPr>
-          <w:color w:val="000000"/>
-        </w:rPr>
-      </w:pPr>
-      <w:r>
-        <w:rPr>
-          <w:rFonts w:eastAsia="Times New Roman" w:cs="Times New Roman" w:ascii="Garamond" w:hAnsi="Garamond"/>
-          <w:color w:val="000000"/>
-          <w:kern w:val="0"/>
-          <w:sz w:val="36"/>
-          <w:szCs w:val="36"/>
-          <w:shd w:fill="auto" w:val="clear"/>
-          <w:lang w:val="en-US" w:eastAsia="zh-CN" w:bidi="hi-IN"/>
-        </w:rPr>
-        <w:t xml:space="preserve">Portanto, amar de todo o coração significa amar a Deus com pureza de sentimentos, sem hipocrisia; é amar de forma concreta e não apenas através de palavras. </w:t>
-      </w:r>
-    </w:p>
-    <w:p>
-      <w:pPr>
-        <w:pStyle w:val="Normal"/>
-        <w:jc w:val="both"/>
-        <w:rPr>
-          <w:color w:val="000000"/>
-        </w:rPr>
-      </w:pPr>
-      <w:r>
-        <w:rPr>
-          <w:color w:val="000000"/>
-        </w:rPr>
-      </w:r>
-    </w:p>
-    <w:p>
-      <w:pPr>
-        <w:pStyle w:val="Normal"/>
-        <w:jc w:val="both"/>
-        <w:rPr>
-          <w:color w:val="000000"/>
-        </w:rPr>
-      </w:pPr>
-      <w:r>
-        <w:rPr>
-          <w:rFonts w:eastAsia="Times New Roman" w:cs="Times New Roman" w:ascii="Garamond" w:hAnsi="Garamond"/>
-          <w:color w:val="000000"/>
-          <w:kern w:val="0"/>
-          <w:sz w:val="36"/>
-          <w:szCs w:val="36"/>
-          <w:shd w:fill="auto" w:val="clear"/>
-          <w:lang w:val="en-US" w:eastAsia="zh-CN" w:bidi="hi-IN"/>
-        </w:rPr>
-        <w:t>O amor que devemos manifestar por Deus deve expressar nossa devoção mais sincera.</w:t>
-      </w:r>
-    </w:p>
-    <w:p>
-      <w:pPr>
-        <w:pStyle w:val="Normal"/>
-        <w:jc w:val="both"/>
-        <w:rPr>
-          <w:color w:val="000000"/>
-        </w:rPr>
-      </w:pPr>
-      <w:r>
-        <w:rPr>
-          <w:color w:val="000000"/>
-        </w:rPr>
-      </w:r>
-    </w:p>
-    <w:p>
-      <w:pPr>
-        <w:pStyle w:val="Normal"/>
-        <w:jc w:val="center"/>
-        <w:rPr/>
-      </w:pPr>
-      <w:r>
-        <w:rPr>
-          <w:rFonts w:eastAsia="Times New Roman" w:cs="Times New Roman" w:ascii="Garamond" w:hAnsi="Garamond"/>
-          <w:color w:val="000000"/>
-          <w:kern w:val="0"/>
-          <w:sz w:val="36"/>
-          <w:szCs w:val="36"/>
-          <w:shd w:fill="auto" w:val="clear"/>
-          <w:lang w:val="en-US" w:eastAsia="zh-CN" w:bidi="hi-IN"/>
-        </w:rPr>
-        <w:t>Amar a Deus de toda a alma</w:t>
-      </w:r>
-    </w:p>
-    <w:p>
-      <w:pPr>
-        <w:pStyle w:val="Normal"/>
-        <w:jc w:val="both"/>
-        <w:rPr>
-          <w:color w:val="000000"/>
-        </w:rPr>
-      </w:pPr>
-      <w:r>
-        <w:rPr>
-          <w:color w:val="000000"/>
-        </w:rPr>
-      </w:r>
-    </w:p>
-    <w:p>
-      <w:pPr>
-        <w:pStyle w:val="Normal"/>
-        <w:jc w:val="both"/>
-        <w:rPr>
-          <w:color w:val="000000"/>
-        </w:rPr>
-      </w:pPr>
-      <w:r>
-        <w:rPr>
-          <w:rFonts w:eastAsia="Times New Roman" w:cs="Times New Roman" w:ascii="Garamond" w:hAnsi="Garamond"/>
-          <w:color w:val="000000"/>
-          <w:kern w:val="0"/>
-          <w:sz w:val="36"/>
-          <w:szCs w:val="36"/>
-          <w:shd w:fill="auto" w:val="clear"/>
-          <w:lang w:val="en-US" w:eastAsia="zh-CN" w:bidi="hi-IN"/>
-        </w:rPr>
-        <w:t>Em O Livro dos Espíritos, a Espiritualidade nos diz que alma nada mais é que o Espírito encarnado. A alma é a própria essência do ser, a individualidade espiritual que sobrevive à morte.</w:t>
-      </w:r>
-    </w:p>
-    <w:p>
-      <w:pPr>
-        <w:pStyle w:val="Normal"/>
-        <w:jc w:val="both"/>
-        <w:rPr>
-          <w:color w:val="000000"/>
-        </w:rPr>
-      </w:pPr>
-      <w:r>
-        <w:rPr>
-          <w:color w:val="000000"/>
-        </w:rPr>
-      </w:r>
-    </w:p>
-    <w:p>
-      <w:pPr>
-        <w:pStyle w:val="Normal"/>
-        <w:jc w:val="both"/>
-        <w:rPr>
-          <w:color w:val="000000"/>
-        </w:rPr>
-      </w:pPr>
-      <w:r>
-        <w:rPr>
-          <w:rFonts w:eastAsia="Times New Roman" w:cs="Times New Roman" w:ascii="Garamond" w:hAnsi="Garamond"/>
-          <w:color w:val="000000"/>
-          <w:kern w:val="0"/>
-          <w:sz w:val="36"/>
-          <w:szCs w:val="36"/>
-          <w:shd w:fill="auto" w:val="clear"/>
-          <w:lang w:val="en-US" w:eastAsia="zh-CN" w:bidi="hi-IN"/>
-        </w:rPr>
-        <w:t>Amar a Deus de toda a alma  é amar com tudo o que somos, na nossa integralidade espiritual, como Espíritos imortais. Isso inclui a ideia de entrega total, de fidelidade a Deus acima de todas as coisas, inclusive acima dos interesses passageiros da vida material.</w:t>
-      </w:r>
-    </w:p>
-    <w:p>
-      <w:pPr>
-        <w:pStyle w:val="Normal"/>
-        <w:jc w:val="both"/>
-        <w:rPr>
-          <w:color w:val="000000"/>
-        </w:rPr>
-      </w:pPr>
-      <w:r>
-        <w:rPr>
-          <w:color w:val="000000"/>
-        </w:rPr>
-      </w:r>
-    </w:p>
-    <w:p>
-      <w:pPr>
-        <w:pStyle w:val="Normal"/>
-        <w:jc w:val="both"/>
-        <w:rPr>
-          <w:color w:val="000000"/>
-        </w:rPr>
-      </w:pPr>
-      <w:r>
-        <w:rPr>
-          <w:rFonts w:eastAsia="Times New Roman" w:cs="Times New Roman" w:ascii="Garamond" w:hAnsi="Garamond"/>
-          <w:color w:val="000000"/>
-          <w:kern w:val="0"/>
-          <w:sz w:val="36"/>
-          <w:szCs w:val="36"/>
-          <w:shd w:fill="auto" w:val="clear"/>
-          <w:lang w:val="en-US" w:eastAsia="zh-CN" w:bidi="hi-IN"/>
-        </w:rPr>
-        <w:t>É o amor que transcende a existência terrena: amar a Deus não só enquanto estamos no corpo, mas também como Espírito eterno.</w:t>
-      </w:r>
-    </w:p>
-    <w:p>
-      <w:pPr>
-        <w:pStyle w:val="Normal"/>
-        <w:jc w:val="both"/>
-        <w:rPr>
-          <w:color w:val="000000"/>
-        </w:rPr>
-      </w:pPr>
-      <w:r>
-        <w:rPr>
-          <w:color w:val="000000"/>
-        </w:rPr>
-      </w:r>
-    </w:p>
-    <w:p>
-      <w:pPr>
-        <w:pStyle w:val="Normal"/>
-        <w:jc w:val="center"/>
-        <w:rPr/>
-      </w:pPr>
-      <w:r>
-        <w:rPr>
-          <w:rFonts w:eastAsia="Times New Roman" w:cs="Times New Roman" w:ascii="Garamond" w:hAnsi="Garamond"/>
-          <w:color w:val="000000"/>
-          <w:kern w:val="0"/>
-          <w:sz w:val="36"/>
-          <w:szCs w:val="36"/>
-          <w:shd w:fill="auto" w:val="clear"/>
-          <w:lang w:val="en-US" w:eastAsia="zh-CN" w:bidi="hi-IN"/>
-        </w:rPr>
-        <w:t>Amar a Deus de todo o pensamento</w:t>
-      </w:r>
-    </w:p>
-    <w:p>
-      <w:pPr>
-        <w:pStyle w:val="Normal"/>
-        <w:jc w:val="both"/>
-        <w:rPr>
-          <w:color w:val="000000"/>
-        </w:rPr>
-      </w:pPr>
-      <w:r>
-        <w:rPr>
-          <w:color w:val="000000"/>
-        </w:rPr>
-      </w:r>
-    </w:p>
-    <w:p>
-      <w:pPr>
-        <w:pStyle w:val="Normal"/>
-        <w:jc w:val="both"/>
-        <w:rPr>
-          <w:color w:val="000000"/>
-        </w:rPr>
-      </w:pPr>
-      <w:r>
-        <w:rPr>
-          <w:rFonts w:eastAsia="Times New Roman" w:cs="Times New Roman" w:ascii="Garamond" w:hAnsi="Garamond"/>
-          <w:color w:val="000000"/>
-          <w:kern w:val="0"/>
-          <w:sz w:val="36"/>
-          <w:szCs w:val="36"/>
-          <w:shd w:fill="auto" w:val="clear"/>
-          <w:lang w:val="en-US" w:eastAsia="zh-CN" w:bidi="hi-IN"/>
-        </w:rPr>
-        <w:t>Aqui encontramos a dimensão da fé raciocinada, que o Espiritismo nos ensina.</w:t>
-      </w:r>
-    </w:p>
-    <w:p>
-      <w:pPr>
-        <w:pStyle w:val="Normal"/>
-        <w:jc w:val="both"/>
-        <w:rPr>
-          <w:color w:val="000000"/>
-        </w:rPr>
-      </w:pPr>
-      <w:r>
-        <w:rPr>
-          <w:color w:val="000000"/>
-        </w:rPr>
-      </w:r>
-    </w:p>
-    <w:p>
-      <w:pPr>
-        <w:pStyle w:val="Normal"/>
-        <w:jc w:val="both"/>
-        <w:rPr>
-          <w:color w:val="000000"/>
-        </w:rPr>
-      </w:pPr>
-      <w:r>
-        <w:rPr>
-          <w:rFonts w:eastAsia="Times New Roman" w:cs="Times New Roman" w:ascii="Garamond" w:hAnsi="Garamond"/>
-          <w:color w:val="000000"/>
-          <w:kern w:val="0"/>
-          <w:sz w:val="36"/>
-          <w:szCs w:val="36"/>
-          <w:shd w:fill="auto" w:val="clear"/>
-          <w:lang w:val="en-US" w:eastAsia="zh-CN" w:bidi="hi-IN"/>
-        </w:rPr>
-        <w:t>Não é um amor cego, mas lúcido: nós sabemos por que amamos a Deus. Através da inteligência e da consciência moral, reconhecemos a justiça, a bondade e a sabedoria divinas.</w:t>
-      </w:r>
-    </w:p>
-    <w:p>
-      <w:pPr>
-        <w:pStyle w:val="Normal"/>
-        <w:jc w:val="both"/>
-        <w:rPr>
-          <w:color w:val="000000"/>
-        </w:rPr>
-      </w:pPr>
-      <w:r>
-        <w:rPr>
-          <w:color w:val="000000"/>
-        </w:rPr>
-      </w:r>
-    </w:p>
-    <w:p>
-      <w:pPr>
-        <w:pStyle w:val="Normal"/>
-        <w:jc w:val="both"/>
-        <w:rPr>
-          <w:color w:val="000000"/>
-        </w:rPr>
-      </w:pPr>
-      <w:r>
-        <w:rPr>
-          <w:rFonts w:eastAsia="Times New Roman" w:cs="Times New Roman" w:ascii="Garamond" w:hAnsi="Garamond"/>
-          <w:color w:val="000000"/>
-          <w:kern w:val="0"/>
-          <w:sz w:val="36"/>
-          <w:szCs w:val="36"/>
-          <w:shd w:fill="auto" w:val="clear"/>
-          <w:lang w:val="en-US" w:eastAsia="zh-CN" w:bidi="hi-IN"/>
-        </w:rPr>
-        <w:t>O exercício da fé raciocinada nem sempre é fácil. Os tempos atuais da humanidade tem sido sombrios e turbulentos. Diariamente nos deparamos com situações em que nos perguntamos "Por quê Deus está permitindo que isso aconteça?". Ou ainda "Por quê Deus não faz nada para mudar essa cenário?". "Os maus vencem e prosperam enquanto os bons sofrem e são injustiçados".</w:t>
-      </w:r>
-    </w:p>
-    <w:p>
-      <w:pPr>
-        <w:pStyle w:val="Normal"/>
-        <w:jc w:val="both"/>
-        <w:rPr>
-          <w:color w:val="000000"/>
-        </w:rPr>
-      </w:pPr>
-      <w:r>
-        <w:rPr>
-          <w:color w:val="000000"/>
-        </w:rPr>
-      </w:r>
-    </w:p>
-    <w:p>
-      <w:pPr>
-        <w:pStyle w:val="Normal"/>
-        <w:jc w:val="both"/>
-        <w:rPr>
-          <w:color w:val="000000"/>
-        </w:rPr>
-      </w:pPr>
-      <w:r>
-        <w:rPr>
-          <w:rFonts w:eastAsia="Times New Roman" w:cs="Times New Roman" w:ascii="Garamond" w:hAnsi="Garamond"/>
-          <w:color w:val="000000"/>
-          <w:kern w:val="0"/>
-          <w:sz w:val="36"/>
-          <w:szCs w:val="36"/>
-          <w:shd w:fill="auto" w:val="clear"/>
-          <w:lang w:val="en-US" w:eastAsia="zh-CN" w:bidi="hi-IN"/>
-        </w:rPr>
-        <w:t xml:space="preserve">Sem a fé raciocinada, colocamos em dúvida a justiça, a bondade, a sabedoria e até mesmo o poder de Deus. Em momentos assim a razão vem e nos diz que Deus não poderia ser Deus se Ele não possuisse todas as qualidades em seu grau máximo. </w:t>
-      </w:r>
-    </w:p>
-    <w:p>
-      <w:pPr>
-        <w:pStyle w:val="Normal"/>
-        <w:jc w:val="both"/>
-        <w:rPr>
-          <w:color w:val="000000"/>
-        </w:rPr>
-      </w:pPr>
-      <w:r>
-        <w:rPr>
-          <w:color w:val="000000"/>
-        </w:rPr>
-      </w:r>
-    </w:p>
-    <w:p>
-      <w:pPr>
-        <w:pStyle w:val="Normal"/>
-        <w:jc w:val="both"/>
-        <w:rPr>
-          <w:color w:val="000000"/>
-        </w:rPr>
-      </w:pPr>
-      <w:r>
-        <w:rPr>
-          <w:rFonts w:eastAsia="Times New Roman" w:cs="Times New Roman" w:ascii="Garamond" w:hAnsi="Garamond"/>
-          <w:color w:val="000000"/>
-          <w:kern w:val="0"/>
-          <w:sz w:val="36"/>
-          <w:szCs w:val="36"/>
-          <w:shd w:fill="auto" w:val="clear"/>
-          <w:lang w:val="en-US" w:eastAsia="zh-CN" w:bidi="hi-IN"/>
-        </w:rPr>
-        <w:t xml:space="preserve">Portanto, por mais estranheza, tristeza e até mesmo uma certa revolta que essas situações nos causem, com a fé raciocinada entendemos que todas as coisas estão sob o controle e de acordo com a vontade de Deus. Nós é que ainda somos incapazes de compreender os desígnios do Pai. </w:t>
-      </w:r>
-    </w:p>
-    <w:p>
-      <w:pPr>
-        <w:pStyle w:val="Normal"/>
-        <w:jc w:val="both"/>
-        <w:rPr>
-          <w:color w:val="000000"/>
-        </w:rPr>
-      </w:pPr>
-      <w:r>
-        <w:rPr>
-          <w:color w:val="000000"/>
-        </w:rPr>
-      </w:r>
-    </w:p>
-    <w:p>
-      <w:pPr>
-        <w:pStyle w:val="Normal"/>
-        <w:jc w:val="both"/>
-        <w:rPr>
-          <w:color w:val="000000"/>
-        </w:rPr>
-      </w:pPr>
-      <w:r>
-        <w:rPr>
-          <w:rFonts w:eastAsia="Times New Roman" w:cs="Times New Roman" w:ascii="Garamond" w:hAnsi="Garamond"/>
-          <w:color w:val="000000"/>
-          <w:kern w:val="0"/>
-          <w:sz w:val="36"/>
-          <w:szCs w:val="36"/>
-          <w:shd w:fill="auto" w:val="clear"/>
-          <w:lang w:val="en-US" w:eastAsia="zh-CN" w:bidi="hi-IN"/>
-        </w:rPr>
-        <w:t>Por fim, amar a Deus em pensamento é também o exercício de manter a mente sintonizada com o bem, ocupando o pensamento com tudo aquilo que nos  eleva.</w:t>
-      </w:r>
-    </w:p>
-    <w:p>
-      <w:pPr>
-        <w:pStyle w:val="Normal"/>
-        <w:jc w:val="both"/>
-        <w:rPr>
-          <w:color w:val="000000"/>
-        </w:rPr>
-      </w:pPr>
-      <w:r>
-        <w:rPr>
-          <w:color w:val="000000"/>
-        </w:rPr>
-      </w:r>
-    </w:p>
-    <w:p>
-      <w:pPr>
-        <w:pStyle w:val="Normal"/>
-        <w:jc w:val="both"/>
-        <w:rPr>
-          <w:color w:val="000000"/>
-        </w:rPr>
-      </w:pPr>
-      <w:r>
-        <w:rPr>
-          <w:rFonts w:eastAsia="Times New Roman" w:cs="Times New Roman" w:ascii="Garamond" w:hAnsi="Garamond"/>
-          <w:color w:val="000000"/>
-          <w:kern w:val="0"/>
-          <w:sz w:val="36"/>
-          <w:szCs w:val="36"/>
-          <w:shd w:fill="auto" w:val="clear"/>
-          <w:lang w:val="en-US" w:eastAsia="zh-CN" w:bidi="hi-IN"/>
-        </w:rPr>
-        <w:t>Podemos então dizer que:</w:t>
-      </w:r>
-    </w:p>
-    <w:p>
-      <w:pPr>
-        <w:pStyle w:val="Normal"/>
-        <w:jc w:val="both"/>
-        <w:rPr>
-          <w:color w:val="000000"/>
-        </w:rPr>
-      </w:pPr>
-      <w:r>
-        <w:rPr>
-          <w:color w:val="000000"/>
-        </w:rPr>
-      </w:r>
-    </w:p>
-    <w:p>
-      <w:pPr>
-        <w:pStyle w:val="Normal"/>
-        <w:numPr>
-          <w:ilvl w:val="0"/>
-          <w:numId w:val="9"/>
-        </w:numPr>
-        <w:jc w:val="both"/>
-        <w:rPr>
-          <w:color w:val="000000"/>
-        </w:rPr>
-      </w:pPr>
-      <w:r>
-        <w:rPr>
-          <w:rFonts w:eastAsia="Times New Roman" w:cs="Times New Roman" w:ascii="Garamond" w:hAnsi="Garamond"/>
-          <w:color w:val="000000"/>
-          <w:kern w:val="0"/>
-          <w:sz w:val="36"/>
-          <w:szCs w:val="36"/>
-          <w:shd w:fill="auto" w:val="clear"/>
-          <w:lang w:val="en-US" w:eastAsia="zh-CN" w:bidi="hi-IN"/>
-        </w:rPr>
-        <w:t>Amar de todo o coração é cultivar o sentimento do bem.</w:t>
-      </w:r>
-    </w:p>
-    <w:p>
-      <w:pPr>
-        <w:pStyle w:val="Normal"/>
-        <w:numPr>
-          <w:ilvl w:val="0"/>
-          <w:numId w:val="9"/>
-        </w:numPr>
-        <w:jc w:val="both"/>
-        <w:rPr>
-          <w:color w:val="000000"/>
-        </w:rPr>
-      </w:pPr>
-      <w:r>
-        <w:rPr>
-          <w:rFonts w:eastAsia="Times New Roman" w:cs="Times New Roman" w:ascii="Garamond" w:hAnsi="Garamond"/>
-          <w:color w:val="000000"/>
-          <w:kern w:val="0"/>
-          <w:sz w:val="36"/>
-          <w:szCs w:val="36"/>
-          <w:shd w:fill="auto" w:val="clear"/>
-          <w:lang w:val="en-US" w:eastAsia="zh-CN" w:bidi="hi-IN"/>
-        </w:rPr>
-        <w:t>Amar de toda a alma é viver de acordo com nossa natureza de Espíritos imortais.</w:t>
-      </w:r>
-    </w:p>
-    <w:p>
-      <w:pPr>
-        <w:pStyle w:val="Normal"/>
-        <w:numPr>
-          <w:ilvl w:val="0"/>
-          <w:numId w:val="9"/>
-        </w:numPr>
-        <w:jc w:val="both"/>
-        <w:rPr>
-          <w:color w:val="000000"/>
-        </w:rPr>
-      </w:pPr>
-      <w:r>
-        <w:rPr>
-          <w:rFonts w:eastAsia="Times New Roman" w:cs="Times New Roman" w:ascii="Garamond" w:hAnsi="Garamond"/>
-          <w:color w:val="000000"/>
-          <w:kern w:val="0"/>
-          <w:sz w:val="36"/>
-          <w:szCs w:val="36"/>
-          <w:shd w:fill="auto" w:val="clear"/>
-          <w:lang w:val="en-US" w:eastAsia="zh-CN" w:bidi="hi-IN"/>
-        </w:rPr>
-        <w:t xml:space="preserve">Amar de todo o pensamento é exercitar a fé raciocinada, reconhecendo a grandeza de Deus através da inteligência e pela observação de Suas leis. </w:t>
-      </w:r>
-    </w:p>
-    <w:p>
-      <w:pPr>
-        <w:pStyle w:val="Normal"/>
-        <w:jc w:val="both"/>
-        <w:rPr>
-          <w:color w:val="000000"/>
-        </w:rPr>
-      </w:pPr>
-      <w:r>
-        <w:rPr>
-          <w:color w:val="000000"/>
-        </w:rPr>
-      </w:r>
-    </w:p>
-    <w:p>
-      <w:pPr>
-        <w:pStyle w:val="Normal"/>
-        <w:jc w:val="both"/>
-        <w:rPr>
-          <w:color w:val="000000"/>
-        </w:rPr>
-      </w:pPr>
-      <w:r>
-        <w:rPr>
-          <w:rFonts w:eastAsia="Times New Roman" w:cs="Times New Roman" w:ascii="Garamond" w:hAnsi="Garamond"/>
-          <w:color w:val="000000"/>
-          <w:kern w:val="0"/>
-          <w:sz w:val="36"/>
-          <w:szCs w:val="36"/>
-          <w:shd w:fill="auto" w:val="clear"/>
-          <w:lang w:val="en-US" w:eastAsia="zh-CN" w:bidi="hi-IN"/>
-        </w:rPr>
-        <w:t>Portanto, Jesus nos convida a amar a Deus com toda a nossa sensibilidade (coração), toda a nossa essência espiritual (alma) e toda a nossa razão (pensamento).</w:t>
+        <w:t>[ Até esse ponto está OK ]</w:t>
       </w:r>
     </w:p>
     <w:p>
@@ -2283,25 +2061,113 @@
           <w:shd w:fill="auto" w:val="clear"/>
           <w:lang w:val="en-US" w:eastAsia="zh-CN" w:bidi="hi-IN"/>
         </w:rPr>
-        <w:t>[ Até esse ponto está OK ]</w:t>
-      </w:r>
-    </w:p>
-    <w:p>
-      <w:pPr>
-        <w:pStyle w:val="Normal"/>
-        <w:jc w:val="both"/>
-        <w:rPr>
+        <w:t xml:space="preserve">[ </w:t>
+      </w:r>
+      <w:r>
+        <w:rPr>
+          <w:rFonts w:eastAsia="Times New Roman" w:cs="Times New Roman" w:ascii="Garamond" w:hAnsi="Garamond"/>
           <w:color w:val="00A0FC"/>
-          <w:sz w:val="36"/>
-          <w:szCs w:val="36"/>
-        </w:rPr>
-      </w:pPr>
-      <w:r>
-        <w:rPr>
+          <w:kern w:val="0"/>
+          <w:sz w:val="36"/>
+          <w:szCs w:val="36"/>
+          <w:shd w:fill="auto" w:val="clear"/>
+          <w:lang w:val="en-US" w:eastAsia="zh-CN" w:bidi="hi-IN"/>
+        </w:rPr>
+        <w:t>Ponto a ser desenvolvido - Início</w:t>
+      </w:r>
+      <w:r>
+        <w:rPr>
+          <w:rFonts w:eastAsia="Times New Roman" w:cs="Times New Roman" w:ascii="Garamond" w:hAnsi="Garamond"/>
           <w:color w:val="00A0FC"/>
-          <w:sz w:val="36"/>
-          <w:szCs w:val="36"/>
-        </w:rPr>
+          <w:kern w:val="0"/>
+          <w:sz w:val="36"/>
+          <w:szCs w:val="36"/>
+          <w:shd w:fill="auto" w:val="clear"/>
+          <w:lang w:val="en-US" w:eastAsia="zh-CN" w:bidi="hi-IN"/>
+        </w:rPr>
+        <w:t xml:space="preserve"> ]</w:t>
+      </w:r>
+    </w:p>
+    <w:p>
+      <w:pPr>
+        <w:pStyle w:val="Normal"/>
+        <w:jc w:val="both"/>
+        <w:rPr>
+          <w:color w:val="000000"/>
+        </w:rPr>
+      </w:pPr>
+      <w:r>
+        <w:rPr>
+          <w:rFonts w:eastAsia="Times New Roman" w:cs="Times New Roman" w:ascii="Garamond" w:hAnsi="Garamond"/>
+          <w:color w:val="000000"/>
+          <w:kern w:val="0"/>
+          <w:sz w:val="36"/>
+          <w:szCs w:val="36"/>
+          <w:shd w:fill="auto" w:val="clear"/>
+          <w:lang w:val="en-US" w:eastAsia="zh-CN" w:bidi="hi-IN"/>
+        </w:rPr>
+        <w:t>No Evangelho Segundo o Espíritismo, Capítulo XI - Amar o próximo como a si mesmo, no item Lei de Amor, o Espírito Fénelon nos diz que o homem, no inćio de sua jornada evolutiva só tinha instintos. À medida que o Espírito se desenvolve moral e intelectualmente os instintos vão, gradativamente, dando lugar aos sentimentos.  Jesus nos conv</w:t>
+      </w:r>
+    </w:p>
+    <w:p>
+      <w:pPr>
+        <w:pStyle w:val="Normal"/>
+        <w:jc w:val="both"/>
+        <w:rPr>
+          <w:color w:val="00A0FC"/>
+          <w:sz w:val="36"/>
+          <w:szCs w:val="36"/>
+        </w:rPr>
+      </w:pPr>
+      <w:r>
+        <w:rPr>
+          <w:rFonts w:eastAsia="Times New Roman" w:cs="Times New Roman" w:ascii="Garamond" w:hAnsi="Garamond"/>
+          <w:color w:val="00A0FC"/>
+          <w:kern w:val="0"/>
+          <w:sz w:val="36"/>
+          <w:szCs w:val="36"/>
+          <w:shd w:fill="auto" w:val="clear"/>
+          <w:lang w:val="en-US" w:eastAsia="zh-CN" w:bidi="hi-IN"/>
+        </w:rPr>
+        <w:t xml:space="preserve">[ </w:t>
+      </w:r>
+      <w:r>
+        <w:rPr>
+          <w:rFonts w:eastAsia="Times New Roman" w:cs="Times New Roman" w:ascii="Garamond" w:hAnsi="Garamond"/>
+          <w:color w:val="00A0FC"/>
+          <w:kern w:val="0"/>
+          <w:sz w:val="36"/>
+          <w:szCs w:val="36"/>
+          <w:shd w:fill="auto" w:val="clear"/>
+          <w:lang w:val="en-US" w:eastAsia="zh-CN" w:bidi="hi-IN"/>
+        </w:rPr>
+        <w:t>Ponto a ser desenvolvido - Término</w:t>
+      </w:r>
+      <w:r>
+        <w:rPr>
+          <w:rFonts w:eastAsia="Times New Roman" w:cs="Times New Roman" w:ascii="Garamond" w:hAnsi="Garamond"/>
+          <w:color w:val="00A0FC"/>
+          <w:kern w:val="0"/>
+          <w:sz w:val="36"/>
+          <w:szCs w:val="36"/>
+          <w:shd w:fill="auto" w:val="clear"/>
+          <w:lang w:val="en-US" w:eastAsia="zh-CN" w:bidi="hi-IN"/>
+        </w:rPr>
+        <w:t xml:space="preserve"> ]</w:t>
+      </w:r>
+    </w:p>
+    <w:p>
+      <w:pPr>
+        <w:pStyle w:val="Normal"/>
+        <w:jc w:val="both"/>
+        <w:rPr>
+          <w:color w:val="00A0FC"/>
+          <w:sz w:val="36"/>
+          <w:szCs w:val="36"/>
+        </w:rPr>
+      </w:pPr>
+      <w:r>
+        <w:rPr/>
       </w:r>
     </w:p>
     <w:p>
@@ -5790,7 +5656,7 @@
         <w:bCs/>
         <w:rFonts w:ascii="Garamond" w:hAnsi="Garamond"/>
       </w:rPr>
-      <w:t>22</w:t>
+      <w:t>23</w:t>
     </w:r>
     <w:r>
       <w:rPr>

</xml_diff>

<commit_message>
15/11/2025 - 14:02 h
</commit_message>
<xml_diff>
--- a/O mandamento maior/O Mandamento Maior.docx
+++ b/O mandamento maior/O Mandamento Maior.docx
@@ -449,6 +449,19 @@
         </w:rPr>
       </w:pPr>
       <w:r>
+        <w:rPr/>
+      </w:r>
+    </w:p>
+    <w:p>
+      <w:pPr>
+        <w:pStyle w:val="Normal"/>
+        <w:jc w:val="both"/>
+        <w:rPr>
+          <w:sz w:val="36"/>
+          <w:szCs w:val="36"/>
+        </w:rPr>
+      </w:pPr>
+      <w:r>
         <w:rPr>
           <w:rFonts w:eastAsia="Times New Roman" w:cs="Times New Roman" w:ascii="Garamond" w:hAnsi="Garamond"/>
           <w:color w:val="000000"/>
@@ -2061,6 +2074,89 @@
           <w:shd w:fill="auto" w:val="clear"/>
           <w:lang w:val="en-US" w:eastAsia="zh-CN" w:bidi="hi-IN"/>
         </w:rPr>
+        <w:t>[ Ponto a ser desenvolvido - Início ]</w:t>
+      </w:r>
+    </w:p>
+    <w:p>
+      <w:pPr>
+        <w:pStyle w:val="Normal"/>
+        <w:jc w:val="both"/>
+        <w:rPr>
+          <w:color w:val="000000"/>
+        </w:rPr>
+      </w:pPr>
+      <w:r>
+        <w:rPr>
+          <w:rFonts w:eastAsia="Times New Roman" w:cs="Times New Roman" w:ascii="Garamond" w:hAnsi="Garamond"/>
+          <w:color w:val="000000"/>
+          <w:kern w:val="0"/>
+          <w:sz w:val="36"/>
+          <w:szCs w:val="36"/>
+          <w:shd w:fill="auto" w:val="clear"/>
+          <w:lang w:val="en-US" w:eastAsia="zh-CN" w:bidi="hi-IN"/>
+        </w:rPr>
+        <w:t>No Evangelho Segundo o Espíritismo, Capítulo XI - Amar o próximo como a si mesmo, no item Lei de Amor, o Espírito Fénelon nos diz que o homem, no inćio de sua jornada evolutiva só tinha instintos. À medida que o Espírito se desenvolve moral e intelectualmente os instintos vão, gradativamente, dando lugar aos sentimentos.  Jesus nos conv</w:t>
+      </w:r>
+    </w:p>
+    <w:p>
+      <w:pPr>
+        <w:pStyle w:val="Normal"/>
+        <w:jc w:val="both"/>
+        <w:rPr>
+          <w:color w:val="00A0FC"/>
+          <w:sz w:val="36"/>
+          <w:szCs w:val="36"/>
+        </w:rPr>
+      </w:pPr>
+      <w:r>
+        <w:rPr>
+          <w:rFonts w:eastAsia="Times New Roman" w:cs="Times New Roman" w:ascii="Garamond" w:hAnsi="Garamond"/>
+          <w:color w:val="00A0FC"/>
+          <w:kern w:val="0"/>
+          <w:sz w:val="36"/>
+          <w:szCs w:val="36"/>
+          <w:shd w:fill="auto" w:val="clear"/>
+          <w:lang w:val="en-US" w:eastAsia="zh-CN" w:bidi="hi-IN"/>
+        </w:rPr>
+        <w:t>[ Ponto a ser desenvolvido - Término ]</w:t>
+      </w:r>
+    </w:p>
+    <w:p>
+      <w:pPr>
+        <w:pStyle w:val="Normal"/>
+        <w:jc w:val="both"/>
+        <w:rPr>
+          <w:color w:val="000000"/>
+        </w:rPr>
+      </w:pPr>
+      <w:r>
+        <w:rPr>
+          <w:color w:val="00A0FC"/>
+          <w:sz w:val="36"/>
+          <w:szCs w:val="36"/>
+        </w:rPr>
+      </w:r>
+    </w:p>
+    <w:p>
+      <w:pPr>
+        <w:pStyle w:val="Normal"/>
+        <w:jc w:val="both"/>
+        <w:rPr>
+          <w:color w:val="00A0FC"/>
+          <w:sz w:val="36"/>
+          <w:szCs w:val="36"/>
+        </w:rPr>
+      </w:pPr>
+      <w:r>
+        <w:rPr>
+          <w:rFonts w:eastAsia="Times New Roman" w:cs="Times New Roman" w:ascii="Garamond" w:hAnsi="Garamond"/>
+          <w:color w:val="00A0FC"/>
+          <w:kern w:val="0"/>
+          <w:sz w:val="36"/>
+          <w:szCs w:val="36"/>
+          <w:shd w:fill="auto" w:val="clear"/>
+          <w:lang w:val="en-US" w:eastAsia="zh-CN" w:bidi="hi-IN"/>
+        </w:rPr>
         <w:t xml:space="preserve">[ </w:t>
       </w:r>
       <w:r>
@@ -2073,7 +2169,7 @@
           <w:shd w:fill="auto" w:val="clear"/>
           <w:lang w:val="en-US" w:eastAsia="zh-CN" w:bidi="hi-IN"/>
         </w:rPr>
-        <w:t>Ponto a ser desenvolvido - Início</w:t>
+        <w:t>Tópico sobre amor aos animais</w:t>
       </w:r>
       <w:r>
         <w:rPr>
@@ -2085,6 +2181,30 @@
           <w:shd w:fill="auto" w:val="clear"/>
           <w:lang w:val="en-US" w:eastAsia="zh-CN" w:bidi="hi-IN"/>
         </w:rPr>
+        <w:t xml:space="preserve"> - </w:t>
+      </w:r>
+      <w:r>
+        <w:rPr>
+          <w:rFonts w:eastAsia="Times New Roman" w:cs="Times New Roman" w:ascii="Garamond" w:hAnsi="Garamond"/>
+          <w:color w:val="00A0FC"/>
+          <w:kern w:val="0"/>
+          <w:sz w:val="36"/>
+          <w:szCs w:val="36"/>
+          <w:shd w:fill="auto" w:val="clear"/>
+          <w:lang w:val="en-US" w:eastAsia="zh-CN" w:bidi="hi-IN"/>
+        </w:rPr>
+        <w:t>Início</w:t>
+      </w:r>
+      <w:r>
+        <w:rPr>
+          <w:rFonts w:eastAsia="Times New Roman" w:cs="Times New Roman" w:ascii="Garamond" w:hAnsi="Garamond"/>
+          <w:color w:val="00A0FC"/>
+          <w:kern w:val="0"/>
+          <w:sz w:val="36"/>
+          <w:szCs w:val="36"/>
+          <w:shd w:fill="auto" w:val="clear"/>
+          <w:lang w:val="en-US" w:eastAsia="zh-CN" w:bidi="hi-IN"/>
+        </w:rPr>
         <w:t xml:space="preserve"> ]</w:t>
       </w:r>
     </w:p>
@@ -2106,23 +2226,938 @@
           <w:shd w:fill="auto" w:val="clear"/>
           <w:lang w:val="en-US" w:eastAsia="zh-CN" w:bidi="hi-IN"/>
         </w:rPr>
-        <w:t>No Evangelho Segundo o Espíritismo, Capítulo XI - Amar o próximo como a si mesmo, no item Lei de Amor, o Espírito Fénelon nos diz que o homem, no inćio de sua jornada evolutiva só tinha instintos. À medida que o Espírito se desenvolve moral e intelectualmente os instintos vão, gradativamente, dando lugar aos sentimentos.  Jesus nos conv</w:t>
-      </w:r>
-    </w:p>
-    <w:p>
-      <w:pPr>
-        <w:pStyle w:val="Normal"/>
-        <w:jc w:val="both"/>
+        <w:t>Sobre a questão do amor aos animais, eu gostaria de trazer um ponto que vai de encontro ao tema amor ao próximo.</w:t>
+      </w:r>
+    </w:p>
+    <w:p>
+      <w:pPr>
+        <w:pStyle w:val="Normal"/>
+        <w:jc w:val="both"/>
+        <w:rPr>
+          <w:color w:val="000000"/>
+        </w:rPr>
+      </w:pPr>
+      <w:r>
         <w:rPr>
           <w:color w:val="00A0FC"/>
           <w:sz w:val="36"/>
           <w:szCs w:val="36"/>
         </w:rPr>
-      </w:pPr>
-      <w:r>
-        <w:rPr>
-          <w:rFonts w:eastAsia="Times New Roman" w:cs="Times New Roman" w:ascii="Garamond" w:hAnsi="Garamond"/>
+      </w:r>
+    </w:p>
+    <w:p>
+      <w:pPr>
+        <w:pStyle w:val="Normal"/>
+        <w:jc w:val="both"/>
+        <w:rPr>
+          <w:color w:val="000000"/>
+        </w:rPr>
+      </w:pPr>
+      <w:r>
+        <w:rPr>
+          <w:rFonts w:eastAsia="Times New Roman" w:cs="Times New Roman" w:ascii="Garamond" w:hAnsi="Garamond"/>
+          <w:color w:val="000000"/>
+          <w:kern w:val="0"/>
+          <w:sz w:val="36"/>
+          <w:szCs w:val="36"/>
+          <w:shd w:fill="auto" w:val="clear"/>
+          <w:lang w:val="en-US" w:eastAsia="zh-CN" w:bidi="hi-IN"/>
+        </w:rPr>
+        <w:t xml:space="preserve">Eu sempre </w:t>
+      </w:r>
+      <w:r>
+        <w:rPr>
+          <w:rFonts w:eastAsia="Times New Roman" w:cs="Times New Roman" w:ascii="Garamond" w:hAnsi="Garamond"/>
+          <w:color w:val="000000"/>
+          <w:kern w:val="0"/>
+          <w:sz w:val="36"/>
+          <w:szCs w:val="36"/>
+          <w:shd w:fill="auto" w:val="clear"/>
+          <w:lang w:val="en-US" w:eastAsia="zh-CN" w:bidi="hi-IN"/>
+        </w:rPr>
+        <w:t xml:space="preserve">tive um olhar muito crítico sobre a maneira como </w:t>
+      </w:r>
+      <w:r>
+        <w:rPr>
+          <w:rFonts w:eastAsia="Times New Roman" w:cs="Times New Roman" w:ascii="Garamond" w:hAnsi="Garamond"/>
+          <w:color w:val="000000"/>
+          <w:kern w:val="0"/>
+          <w:sz w:val="36"/>
+          <w:szCs w:val="36"/>
+          <w:shd w:fill="auto" w:val="clear"/>
+          <w:lang w:val="en-US" w:eastAsia="zh-CN" w:bidi="hi-IN"/>
+        </w:rPr>
+        <w:t>certas</w:t>
+      </w:r>
+      <w:r>
+        <w:rPr>
+          <w:rFonts w:eastAsia="Times New Roman" w:cs="Times New Roman" w:ascii="Garamond" w:hAnsi="Garamond"/>
+          <w:color w:val="000000"/>
+          <w:kern w:val="0"/>
+          <w:sz w:val="36"/>
+          <w:szCs w:val="36"/>
+          <w:shd w:fill="auto" w:val="clear"/>
+          <w:lang w:val="en-US" w:eastAsia="zh-CN" w:bidi="hi-IN"/>
+        </w:rPr>
+        <w:t xml:space="preserve"> pessoas tratam os animais, quase como se </w:t>
+      </w:r>
+      <w:r>
+        <w:rPr>
+          <w:rFonts w:eastAsia="Times New Roman" w:cs="Times New Roman" w:ascii="Garamond" w:hAnsi="Garamond"/>
+          <w:color w:val="000000"/>
+          <w:kern w:val="0"/>
+          <w:sz w:val="36"/>
+          <w:szCs w:val="36"/>
+          <w:shd w:fill="auto" w:val="clear"/>
+          <w:lang w:val="en-US" w:eastAsia="zh-CN" w:bidi="hi-IN"/>
+        </w:rPr>
+        <w:t xml:space="preserve">eles </w:t>
+      </w:r>
+      <w:r>
+        <w:rPr>
+          <w:rFonts w:eastAsia="Times New Roman" w:cs="Times New Roman" w:ascii="Garamond" w:hAnsi="Garamond"/>
+          <w:color w:val="000000"/>
+          <w:kern w:val="0"/>
+          <w:sz w:val="36"/>
+          <w:szCs w:val="36"/>
+          <w:shd w:fill="auto" w:val="clear"/>
+          <w:lang w:val="en-US" w:eastAsia="zh-CN" w:bidi="hi-IN"/>
+        </w:rPr>
+        <w:t xml:space="preserve">fossem humanos. Eu via nisso um exagero, uma supervalorização do animal. </w:t>
+      </w:r>
+      <w:r>
+        <w:rPr>
+          <w:rFonts w:eastAsia="Times New Roman" w:cs="Times New Roman" w:ascii="Garamond" w:hAnsi="Garamond"/>
+          <w:color w:val="000000"/>
+          <w:kern w:val="0"/>
+          <w:sz w:val="36"/>
+          <w:szCs w:val="36"/>
+          <w:shd w:fill="auto" w:val="clear"/>
+          <w:lang w:val="en-US" w:eastAsia="zh-CN" w:bidi="hi-IN"/>
+        </w:rPr>
+        <w:t>E eu mantive esse olhar até o dia em que meu filho pediu um animal de estimação e eu dei a ele um coelho.</w:t>
+      </w:r>
+    </w:p>
+    <w:p>
+      <w:pPr>
+        <w:pStyle w:val="Normal"/>
+        <w:jc w:val="both"/>
+        <w:rPr>
+          <w:color w:val="000000"/>
+        </w:rPr>
+      </w:pPr>
+      <w:r>
+        <w:rPr>
           <w:color w:val="00A0FC"/>
+          <w:sz w:val="36"/>
+          <w:szCs w:val="36"/>
+        </w:rPr>
+      </w:r>
+    </w:p>
+    <w:p>
+      <w:pPr>
+        <w:pStyle w:val="Normal"/>
+        <w:jc w:val="both"/>
+        <w:rPr>
+          <w:color w:val="000000"/>
+        </w:rPr>
+      </w:pPr>
+      <w:r>
+        <w:rPr>
+          <w:rFonts w:eastAsia="Times New Roman" w:cs="Times New Roman" w:ascii="Garamond" w:hAnsi="Garamond"/>
+          <w:color w:val="000000"/>
+          <w:kern w:val="0"/>
+          <w:sz w:val="36"/>
+          <w:szCs w:val="36"/>
+          <w:shd w:fill="auto" w:val="clear"/>
+          <w:lang w:val="en-US" w:eastAsia="zh-CN" w:bidi="hi-IN"/>
+        </w:rPr>
+        <w:t>Coelhos são animais muito mal compreendidos. As pessoas os alimentam de maneira errada, prendem em gaiolas, os dentes deles crescem durante toda a vida e por isso eles têm a necessidade constante de roer tudo o que encontram pela frente, são suscetíveis de uma série de doenças e por aí vai. Por isso eu faço parte de alguns grupos de pessoas que também tem coelhos de estimação e nesses grupos nós trocamos informações sobre como cuidar da melhor maneira dos nossos orelhudinhos.</w:t>
+      </w:r>
+    </w:p>
+    <w:p>
+      <w:pPr>
+        <w:pStyle w:val="Normal"/>
+        <w:jc w:val="both"/>
+        <w:rPr>
+          <w:color w:val="000000"/>
+        </w:rPr>
+      </w:pPr>
+      <w:r>
+        <w:rPr>
+          <w:color w:val="00A0FC"/>
+          <w:sz w:val="36"/>
+          <w:szCs w:val="36"/>
+        </w:rPr>
+      </w:r>
+    </w:p>
+    <w:p>
+      <w:pPr>
+        <w:pStyle w:val="Normal"/>
+        <w:jc w:val="both"/>
+        <w:rPr>
+          <w:color w:val="000000"/>
+        </w:rPr>
+      </w:pPr>
+      <w:r>
+        <w:rPr>
+          <w:rFonts w:eastAsia="Times New Roman" w:cs="Times New Roman" w:ascii="Garamond" w:hAnsi="Garamond"/>
+          <w:color w:val="000000"/>
+          <w:kern w:val="0"/>
+          <w:sz w:val="36"/>
+          <w:szCs w:val="36"/>
+          <w:shd w:fill="auto" w:val="clear"/>
+          <w:lang w:val="en-US" w:eastAsia="zh-CN" w:bidi="hi-IN"/>
+        </w:rPr>
+        <w:t>Certo dia, em um desses grupos, uma garota enviou uma mensagem perguntando se alguém estaria disposto a cuidar do coelho dela pois ela queria morrer. Ela tinha decidido tirar a própria vida, mas só faria isso quando o coelho dela estivesse com alguém que fosse cuidar dele tão bem quanto ela cuidava.</w:t>
+      </w:r>
+    </w:p>
+    <w:p>
+      <w:pPr>
+        <w:pStyle w:val="Normal"/>
+        <w:jc w:val="both"/>
+        <w:rPr>
+          <w:color w:val="000000"/>
+        </w:rPr>
+      </w:pPr>
+      <w:r>
+        <w:rPr>
+          <w:color w:val="00A0FC"/>
+          <w:sz w:val="36"/>
+          <w:szCs w:val="36"/>
+        </w:rPr>
+      </w:r>
+    </w:p>
+    <w:p>
+      <w:pPr>
+        <w:pStyle w:val="Normal"/>
+        <w:jc w:val="both"/>
+        <w:rPr>
+          <w:color w:val="000000"/>
+        </w:rPr>
+      </w:pPr>
+      <w:r>
+        <w:rPr>
+          <w:rFonts w:eastAsia="Times New Roman" w:cs="Times New Roman" w:ascii="Garamond" w:hAnsi="Garamond"/>
+          <w:color w:val="000000"/>
+          <w:kern w:val="0"/>
+          <w:sz w:val="36"/>
+          <w:szCs w:val="36"/>
+          <w:shd w:fill="auto" w:val="clear"/>
+          <w:lang w:val="en-US" w:eastAsia="zh-CN" w:bidi="hi-IN"/>
+        </w:rPr>
+        <w:t>Imediatamente eu mandei uma mensagem no particular para essa garota pedindo que ela se mantivesse calma e afastasse aqueles pensamentos; quaisquer que fossem os problemas dela, eu e outras pessoas poderíamos ajudá-la.</w:t>
+      </w:r>
+    </w:p>
+    <w:p>
+      <w:pPr>
+        <w:pStyle w:val="Normal"/>
+        <w:jc w:val="both"/>
+        <w:rPr>
+          <w:color w:val="000000"/>
+        </w:rPr>
+      </w:pPr>
+      <w:r>
+        <w:rPr>
+          <w:rFonts w:eastAsia="Times New Roman" w:cs="Times New Roman" w:ascii="Garamond" w:hAnsi="Garamond"/>
+          <w:color w:val="000000"/>
+          <w:kern w:val="0"/>
+          <w:sz w:val="36"/>
+          <w:szCs w:val="36"/>
+          <w:shd w:fill="auto" w:val="clear"/>
+          <w:lang w:val="en-US" w:eastAsia="zh-CN" w:bidi="hi-IN"/>
+        </w:rPr>
+        <w:t>Uns 2 dias depois ela me respondeu com bastante relutância nas palavras e disse que estava cansada de sofrer e que queria dar um fim à vida para que esse sofrimento acabasse. De maneira bem sutil eu tentei dizer a ela que tirar a própria vida não colocaria um fim aos seus sofrimentos. Obviamente não falei abertamente o que o Espiritismo nos ensina sobre o suicídio,  mas transmiti a ideia.</w:t>
+      </w:r>
+    </w:p>
+    <w:p>
+      <w:pPr>
+        <w:pStyle w:val="Normal"/>
+        <w:jc w:val="both"/>
+        <w:rPr>
+          <w:color w:val="000000"/>
+        </w:rPr>
+      </w:pPr>
+      <w:r>
+        <w:rPr>
+          <w:color w:val="00A0FC"/>
+          <w:sz w:val="36"/>
+          <w:szCs w:val="36"/>
+        </w:rPr>
+      </w:r>
+    </w:p>
+    <w:p>
+      <w:pPr>
+        <w:pStyle w:val="Normal"/>
+        <w:jc w:val="both"/>
+        <w:rPr>
+          <w:color w:val="000000"/>
+        </w:rPr>
+      </w:pPr>
+      <w:r>
+        <w:rPr>
+          <w:rFonts w:eastAsia="Times New Roman" w:cs="Times New Roman" w:ascii="Garamond" w:hAnsi="Garamond"/>
+          <w:color w:val="000000"/>
+          <w:kern w:val="0"/>
+          <w:sz w:val="36"/>
+          <w:szCs w:val="36"/>
+          <w:shd w:fill="auto" w:val="clear"/>
+          <w:lang w:val="en-US" w:eastAsia="zh-CN" w:bidi="hi-IN"/>
+        </w:rPr>
+        <w:t>Quase todos os dias eu enviava uma mensagem a essa garota querendo saber como ela estava. Durante muito tempo ela ainda se manteve relutante em conversar comigo, mas com o passar do tempo ela se sentiu segura em falar mais abertamente comigo.</w:t>
+      </w:r>
+    </w:p>
+    <w:p>
+      <w:pPr>
+        <w:pStyle w:val="Normal"/>
+        <w:jc w:val="both"/>
+        <w:rPr>
+          <w:color w:val="000000"/>
+        </w:rPr>
+      </w:pPr>
+      <w:r>
+        <w:rPr>
+          <w:color w:val="00A0FC"/>
+          <w:sz w:val="36"/>
+          <w:szCs w:val="36"/>
+        </w:rPr>
+      </w:r>
+    </w:p>
+    <w:p>
+      <w:pPr>
+        <w:pStyle w:val="Normal"/>
+        <w:jc w:val="both"/>
+        <w:rPr>
+          <w:color w:val="000000"/>
+        </w:rPr>
+      </w:pPr>
+      <w:r>
+        <w:rPr>
+          <w:rFonts w:eastAsia="Times New Roman" w:cs="Times New Roman" w:ascii="Garamond" w:hAnsi="Garamond"/>
+          <w:color w:val="000000"/>
+          <w:kern w:val="0"/>
+          <w:sz w:val="36"/>
+          <w:szCs w:val="36"/>
+          <w:shd w:fill="auto" w:val="clear"/>
+          <w:lang w:val="en-US" w:eastAsia="zh-CN" w:bidi="hi-IN"/>
+        </w:rPr>
+        <w:t>Contou-me dos enormes atritos que ela tinha com a mãe, dos problemas que enfrentou por ser acusada de roubo por uma pessoa de quem ela cuidou com muito zelo durante muitos anos e da depressão contra a qual ela lutava constantemente.</w:t>
+      </w:r>
+    </w:p>
+    <w:p>
+      <w:pPr>
+        <w:pStyle w:val="Normal"/>
+        <w:jc w:val="both"/>
+        <w:rPr>
+          <w:color w:val="000000"/>
+        </w:rPr>
+      </w:pPr>
+      <w:r>
+        <w:rPr>
+          <w:color w:val="00A0FC"/>
+          <w:sz w:val="36"/>
+          <w:szCs w:val="36"/>
+        </w:rPr>
+      </w:r>
+    </w:p>
+    <w:p>
+      <w:pPr>
+        <w:pStyle w:val="Normal"/>
+        <w:jc w:val="both"/>
+        <w:rPr>
+          <w:color w:val="000000"/>
+        </w:rPr>
+      </w:pPr>
+      <w:r>
+        <w:rPr>
+          <w:rFonts w:eastAsia="Times New Roman" w:cs="Times New Roman" w:ascii="Garamond" w:hAnsi="Garamond"/>
+          <w:color w:val="000000"/>
+          <w:kern w:val="0"/>
+          <w:sz w:val="36"/>
+          <w:szCs w:val="36"/>
+          <w:shd w:fill="auto" w:val="clear"/>
+          <w:lang w:val="en-US" w:eastAsia="zh-CN" w:bidi="hi-IN"/>
+        </w:rPr>
+        <w:t>Um dia ela abordou o lado espiritual dos problemas dela. Como já tínhamos construído uma certa amizade, contei que sou Espírita, abordei a questão do suicídio e sugeri a ela ler O Livro dos Médiuns. Curiosamente ela me disse que outras pessoas já haviam recomendado essa leitura, mas ela tinha medo de ler o livro. De certo modo, ela tinha medo de disciplinar sua mediunidade - mediunidade essa que era nítida - e  ter contato constante com os espíritos.</w:t>
+      </w:r>
+    </w:p>
+    <w:p>
+      <w:pPr>
+        <w:pStyle w:val="Normal"/>
+        <w:jc w:val="both"/>
+        <w:rPr>
+          <w:color w:val="000000"/>
+        </w:rPr>
+      </w:pPr>
+      <w:r>
+        <w:rPr>
+          <w:color w:val="00A0FC"/>
+          <w:sz w:val="36"/>
+          <w:szCs w:val="36"/>
+        </w:rPr>
+      </w:r>
+    </w:p>
+    <w:p>
+      <w:pPr>
+        <w:pStyle w:val="Normal"/>
+        <w:jc w:val="both"/>
+        <w:rPr>
+          <w:color w:val="000000"/>
+        </w:rPr>
+      </w:pPr>
+      <w:r>
+        <w:rPr>
+          <w:rFonts w:eastAsia="Times New Roman" w:cs="Times New Roman" w:ascii="Garamond" w:hAnsi="Garamond"/>
+          <w:color w:val="000000"/>
+          <w:kern w:val="0"/>
+          <w:sz w:val="36"/>
+          <w:szCs w:val="36"/>
+          <w:shd w:fill="auto" w:val="clear"/>
+          <w:lang w:val="en-US" w:eastAsia="zh-CN" w:bidi="hi-IN"/>
+        </w:rPr>
+        <w:t>Depressão é uma doença terrível. Em um dia a pessoa está bem; no dia seguinte ela está péssima.  Não foi diferente com essa amiga. Os sentimentos dela viviam em uma montanha russa.</w:t>
+      </w:r>
+    </w:p>
+    <w:p>
+      <w:pPr>
+        <w:pStyle w:val="Normal"/>
+        <w:jc w:val="both"/>
+        <w:rPr>
+          <w:color w:val="000000"/>
+        </w:rPr>
+      </w:pPr>
+      <w:r>
+        <w:rPr>
+          <w:color w:val="00A0FC"/>
+          <w:sz w:val="36"/>
+          <w:szCs w:val="36"/>
+        </w:rPr>
+      </w:r>
+    </w:p>
+    <w:p>
+      <w:pPr>
+        <w:pStyle w:val="Normal"/>
+        <w:jc w:val="both"/>
+        <w:rPr>
+          <w:color w:val="000000"/>
+        </w:rPr>
+      </w:pPr>
+      <w:r>
+        <w:rPr>
+          <w:rFonts w:eastAsia="Times New Roman" w:cs="Times New Roman" w:ascii="Garamond" w:hAnsi="Garamond"/>
+          <w:color w:val="000000"/>
+          <w:kern w:val="0"/>
+          <w:sz w:val="36"/>
+          <w:szCs w:val="36"/>
+          <w:shd w:fill="auto" w:val="clear"/>
+          <w:lang w:val="en-US" w:eastAsia="zh-CN" w:bidi="hi-IN"/>
+        </w:rPr>
+        <w:t>Em duas ocasiões eu abri o WhatsApp pela manhã e encontrei mensagens dela se despedindo e dizendo que estava indo embora. Na primeira ocasião ela ingeriu veneno para matar ratos e acetona. Milagrosamente ela não morreu. Causou um enorme estrago na garganta e no estômago, mas sobreviveu.</w:t>
+      </w:r>
+    </w:p>
+    <w:p>
+      <w:pPr>
+        <w:pStyle w:val="Normal"/>
+        <w:jc w:val="both"/>
+        <w:rPr>
+          <w:color w:val="000000"/>
+        </w:rPr>
+      </w:pPr>
+      <w:r>
+        <w:rPr>
+          <w:color w:val="00A0FC"/>
+          <w:sz w:val="36"/>
+          <w:szCs w:val="36"/>
+        </w:rPr>
+      </w:r>
+    </w:p>
+    <w:p>
+      <w:pPr>
+        <w:pStyle w:val="Normal"/>
+        <w:jc w:val="both"/>
+        <w:rPr>
+          <w:color w:val="000000"/>
+        </w:rPr>
+      </w:pPr>
+      <w:r>
+        <w:rPr>
+          <w:rFonts w:eastAsia="Times New Roman" w:cs="Times New Roman" w:ascii="Garamond" w:hAnsi="Garamond"/>
+          <w:color w:val="000000"/>
+          <w:kern w:val="0"/>
+          <w:sz w:val="36"/>
+          <w:szCs w:val="36"/>
+          <w:shd w:fill="auto" w:val="clear"/>
+          <w:lang w:val="en-US" w:eastAsia="zh-CN" w:bidi="hi-IN"/>
+        </w:rPr>
+        <w:t>Na segunda ela tomou uma overdose de remédios e a única coisa que conseguiu foi dormir por quase 48 horas seguidas.</w:t>
+      </w:r>
+    </w:p>
+    <w:p>
+      <w:pPr>
+        <w:pStyle w:val="Normal"/>
+        <w:jc w:val="both"/>
+        <w:rPr>
+          <w:color w:val="000000"/>
+        </w:rPr>
+      </w:pPr>
+      <w:r>
+        <w:rPr>
+          <w:rFonts w:eastAsia="Times New Roman" w:cs="Times New Roman" w:ascii="Garamond" w:hAnsi="Garamond"/>
+          <w:color w:val="000000"/>
+          <w:kern w:val="0"/>
+          <w:sz w:val="36"/>
+          <w:szCs w:val="36"/>
+          <w:shd w:fill="auto" w:val="clear"/>
+          <w:lang w:val="en-US" w:eastAsia="zh-CN" w:bidi="hi-IN"/>
+        </w:rPr>
+        <w:t>Em ambas as situações eu disse a ela "Vê como Deus não quer que você vá embora? Você sobreviveu por milagre. Entenda isso como uma nova oportunidade que Deus está dando a você. Não tente tirar sua vida novamente.</w:t>
+      </w:r>
+    </w:p>
+    <w:p>
+      <w:pPr>
+        <w:pStyle w:val="Normal"/>
+        <w:jc w:val="both"/>
+        <w:rPr>
+          <w:color w:val="000000"/>
+        </w:rPr>
+      </w:pPr>
+      <w:r>
+        <w:rPr>
+          <w:color w:val="00A0FC"/>
+          <w:sz w:val="36"/>
+          <w:szCs w:val="36"/>
+        </w:rPr>
+      </w:r>
+    </w:p>
+    <w:p>
+      <w:pPr>
+        <w:pStyle w:val="Normal"/>
+        <w:jc w:val="both"/>
+        <w:rPr>
+          <w:color w:val="000000"/>
+        </w:rPr>
+      </w:pPr>
+      <w:r>
+        <w:rPr>
+          <w:rFonts w:eastAsia="Times New Roman" w:cs="Times New Roman" w:ascii="Garamond" w:hAnsi="Garamond"/>
+          <w:color w:val="000000"/>
+          <w:kern w:val="0"/>
+          <w:sz w:val="36"/>
+          <w:szCs w:val="36"/>
+          <w:shd w:fill="auto" w:val="clear"/>
+          <w:lang w:val="en-US" w:eastAsia="zh-CN" w:bidi="hi-IN"/>
+        </w:rPr>
+        <w:t>Minha amiga seguiu com seus altos e baixos. Estava administrando os problemas com uma certa tranquilidade até o dia em que teve uma discussão terrível com a mãe dela. Foi uma briga muito, muito feia que o fez o pai dela chorar. E o sofrimento do pai desencadeou na minha amiga um sentimento de culpa gigantesco.</w:t>
+      </w:r>
+    </w:p>
+    <w:p>
+      <w:pPr>
+        <w:pStyle w:val="Normal"/>
+        <w:jc w:val="both"/>
+        <w:rPr>
+          <w:color w:val="000000"/>
+        </w:rPr>
+      </w:pPr>
+      <w:r>
+        <w:rPr>
+          <w:color w:val="00A0FC"/>
+          <w:sz w:val="36"/>
+          <w:szCs w:val="36"/>
+        </w:rPr>
+      </w:r>
+    </w:p>
+    <w:p>
+      <w:pPr>
+        <w:pStyle w:val="Normal"/>
+        <w:jc w:val="both"/>
+        <w:rPr>
+          <w:color w:val="000000"/>
+        </w:rPr>
+      </w:pPr>
+      <w:r>
+        <w:rPr>
+          <w:rFonts w:eastAsia="Times New Roman" w:cs="Times New Roman" w:ascii="Garamond" w:hAnsi="Garamond"/>
+          <w:color w:val="000000"/>
+          <w:kern w:val="0"/>
+          <w:sz w:val="36"/>
+          <w:szCs w:val="36"/>
+          <w:shd w:fill="auto" w:val="clear"/>
+          <w:lang w:val="en-US" w:eastAsia="zh-CN" w:bidi="hi-IN"/>
+        </w:rPr>
+        <w:t>Desde a briga a mãe se recusou a dar dinheiro à filha para comprar remédios e alimento para o coelho. Ela me contou isso com um enorme pesar, muito maior pelo coelho do que pelos remédios. Ela chegou a me dizer que não se importava em ficar sem os remédios, mas estava arrasada por não poder alimentar o coelho.</w:t>
+      </w:r>
+    </w:p>
+    <w:p>
+      <w:pPr>
+        <w:pStyle w:val="Normal"/>
+        <w:jc w:val="both"/>
+        <w:rPr>
+          <w:color w:val="000000"/>
+        </w:rPr>
+      </w:pPr>
+      <w:r>
+        <w:rPr>
+          <w:color w:val="00A0FC"/>
+          <w:sz w:val="36"/>
+          <w:szCs w:val="36"/>
+        </w:rPr>
+      </w:r>
+    </w:p>
+    <w:p>
+      <w:pPr>
+        <w:pStyle w:val="Normal"/>
+        <w:jc w:val="both"/>
+        <w:rPr>
+          <w:color w:val="000000"/>
+        </w:rPr>
+      </w:pPr>
+      <w:r>
+        <w:rPr>
+          <w:rFonts w:eastAsia="Times New Roman" w:cs="Times New Roman" w:ascii="Garamond" w:hAnsi="Garamond"/>
+          <w:color w:val="000000"/>
+          <w:kern w:val="0"/>
+          <w:sz w:val="36"/>
+          <w:szCs w:val="36"/>
+          <w:shd w:fill="auto" w:val="clear"/>
+          <w:lang w:val="en-US" w:eastAsia="zh-CN" w:bidi="hi-IN"/>
+        </w:rPr>
+        <w:t>Dei a ela o dinheiro para comprar as coisas para o coelho e ela se acalmou. Em determinado momento eu percebi que minha amiga tinha sumido. Não mandava  mensagens há vários dias. Embora isso sempre acontecesse nos momentos em que ela não estava bem, dessa vez o sumiço foi maior.</w:t>
+      </w:r>
+    </w:p>
+    <w:p>
+      <w:pPr>
+        <w:pStyle w:val="Normal"/>
+        <w:jc w:val="both"/>
+        <w:rPr>
+          <w:color w:val="000000"/>
+        </w:rPr>
+      </w:pPr>
+      <w:r>
+        <w:rPr>
+          <w:color w:val="00A0FC"/>
+          <w:sz w:val="36"/>
+          <w:szCs w:val="36"/>
+        </w:rPr>
+      </w:r>
+    </w:p>
+    <w:p>
+      <w:pPr>
+        <w:pStyle w:val="Normal"/>
+        <w:jc w:val="both"/>
+        <w:rPr>
+          <w:color w:val="000000"/>
+        </w:rPr>
+      </w:pPr>
+      <w:r>
+        <w:rPr>
+          <w:rFonts w:eastAsia="Times New Roman" w:cs="Times New Roman" w:ascii="Garamond" w:hAnsi="Garamond"/>
+          <w:color w:val="000000"/>
+          <w:kern w:val="0"/>
+          <w:sz w:val="36"/>
+          <w:szCs w:val="36"/>
+          <w:shd w:fill="auto" w:val="clear"/>
+          <w:lang w:val="en-US" w:eastAsia="zh-CN" w:bidi="hi-IN"/>
+        </w:rPr>
+        <w:t xml:space="preserve">Fiquei muito preocupado e quando vi que ela não acessava o WhatsApp há mais de uma semana, resolvi  tentar descobrir o que havia acontecido. </w:t>
+      </w:r>
+      <w:r>
+        <w:rPr>
+          <w:rFonts w:eastAsia="Times New Roman" w:cs="Times New Roman" w:ascii="Garamond" w:hAnsi="Garamond"/>
+          <w:color w:val="000000"/>
+          <w:kern w:val="0"/>
+          <w:sz w:val="36"/>
+          <w:szCs w:val="36"/>
+          <w:shd w:fill="auto" w:val="clear"/>
+          <w:lang w:val="en-US" w:eastAsia="zh-CN" w:bidi="hi-IN"/>
+        </w:rPr>
+        <w:t>Como eu já tinha colocado o nome dessa amiga várias vezes no livro de irradiação aqui da FEIG, fiz uma pesquisa e encontrei uma nota no obituário da cidade onde ela morava informando que o sepultamento aconteceu no dia seguinte ao último dia em que ela tinha acessado o WhatsApp.</w:t>
+      </w:r>
+    </w:p>
+    <w:p>
+      <w:pPr>
+        <w:pStyle w:val="Normal"/>
+        <w:jc w:val="both"/>
+        <w:rPr>
+          <w:color w:val="000000"/>
+        </w:rPr>
+      </w:pPr>
+      <w:r>
+        <w:rPr>
+          <w:color w:val="00A0FC"/>
+          <w:sz w:val="36"/>
+          <w:szCs w:val="36"/>
+        </w:rPr>
+      </w:r>
+    </w:p>
+    <w:p>
+      <w:pPr>
+        <w:pStyle w:val="Normal"/>
+        <w:jc w:val="both"/>
+        <w:rPr>
+          <w:color w:val="000000"/>
+        </w:rPr>
+      </w:pPr>
+      <w:r>
+        <w:rPr>
+          <w:rFonts w:eastAsia="Times New Roman" w:cs="Times New Roman" w:ascii="Garamond" w:hAnsi="Garamond"/>
+          <w:color w:val="000000"/>
+          <w:kern w:val="0"/>
+          <w:sz w:val="36"/>
+          <w:szCs w:val="36"/>
+          <w:shd w:fill="auto" w:val="clear"/>
+          <w:lang w:val="en-US" w:eastAsia="zh-CN" w:bidi="hi-IN"/>
+        </w:rPr>
+        <w:t>Fui tomado de uma tristeza profunda. Nunca consegui saber se ela realmente tirou a própria vida, mas fiquei pensando que se morássemos próximos um do outro, talvez eu tivesse conseguido ajudá-la mais.</w:t>
+      </w:r>
+    </w:p>
+    <w:p>
+      <w:pPr>
+        <w:pStyle w:val="Normal"/>
+        <w:jc w:val="both"/>
+        <w:rPr>
+          <w:color w:val="000000"/>
+        </w:rPr>
+      </w:pPr>
+      <w:r>
+        <w:rPr>
+          <w:color w:val="00A0FC"/>
+          <w:sz w:val="36"/>
+          <w:szCs w:val="36"/>
+        </w:rPr>
+      </w:r>
+    </w:p>
+    <w:p>
+      <w:pPr>
+        <w:pStyle w:val="Normal"/>
+        <w:jc w:val="both"/>
+        <w:rPr>
+          <w:color w:val="000000"/>
+        </w:rPr>
+      </w:pPr>
+      <w:r>
+        <w:rPr>
+          <w:rFonts w:eastAsia="Times New Roman" w:cs="Times New Roman" w:ascii="Garamond" w:hAnsi="Garamond"/>
+          <w:color w:val="000000"/>
+          <w:kern w:val="0"/>
+          <w:sz w:val="36"/>
+          <w:szCs w:val="36"/>
+          <w:shd w:fill="auto" w:val="clear"/>
+          <w:lang w:val="en-US" w:eastAsia="zh-CN" w:bidi="hi-IN"/>
+        </w:rPr>
+        <w:t xml:space="preserve">Bem, mas onde eu quero chegar com toda essa história? Hoje eu entendo que muitas vezes, o animal torna-se a única fonte de amor e de afeto para uma pessoa. </w:t>
+      </w:r>
+    </w:p>
+    <w:p>
+      <w:pPr>
+        <w:pStyle w:val="Normal"/>
+        <w:jc w:val="both"/>
+        <w:rPr>
+          <w:color w:val="000000"/>
+        </w:rPr>
+      </w:pPr>
+      <w:r>
+        <w:rPr>
+          <w:color w:val="00A0FC"/>
+          <w:sz w:val="36"/>
+          <w:szCs w:val="36"/>
+        </w:rPr>
+      </w:r>
+    </w:p>
+    <w:p>
+      <w:pPr>
+        <w:pStyle w:val="Normal"/>
+        <w:jc w:val="both"/>
+        <w:rPr>
+          <w:color w:val="000000"/>
+        </w:rPr>
+      </w:pPr>
+      <w:r>
+        <w:rPr>
+          <w:rFonts w:eastAsia="Times New Roman" w:cs="Times New Roman" w:ascii="Garamond" w:hAnsi="Garamond"/>
+          <w:color w:val="000000"/>
+          <w:kern w:val="0"/>
+          <w:sz w:val="36"/>
+          <w:szCs w:val="36"/>
+          <w:shd w:fill="auto" w:val="clear"/>
+          <w:lang w:val="en-US" w:eastAsia="zh-CN" w:bidi="hi-IN"/>
+        </w:rPr>
+        <w:t>Nã</w:t>
+      </w:r>
+      <w:r>
+        <w:rPr>
+          <w:rFonts w:eastAsia="Times New Roman" w:cs="Times New Roman" w:ascii="Garamond" w:hAnsi="Garamond"/>
+          <w:color w:val="000000"/>
+          <w:kern w:val="0"/>
+          <w:sz w:val="36"/>
+          <w:szCs w:val="36"/>
+          <w:shd w:fill="auto" w:val="clear"/>
+          <w:lang w:val="en-US" w:eastAsia="zh-CN" w:bidi="hi-IN"/>
+        </w:rPr>
+        <w:t xml:space="preserve">o é que a pessoa acordou em um determinado dia e decidiu: "A partir de hoje não vou mais conviver com humanos. Só vou me dedicar aos animais". Não é isso. O que acontece é que, por todos os problemas, todas as dificuldades que a pessoa tem nos seus relacionamentos, o animal torna-se o único amigo daquela pessoa. </w:t>
+      </w:r>
+    </w:p>
+    <w:p>
+      <w:pPr>
+        <w:pStyle w:val="Normal"/>
+        <w:jc w:val="both"/>
+        <w:rPr>
+          <w:color w:val="000000"/>
+        </w:rPr>
+      </w:pPr>
+      <w:r>
+        <w:rPr>
+          <w:color w:val="00A0FC"/>
+          <w:sz w:val="36"/>
+          <w:szCs w:val="36"/>
+        </w:rPr>
+      </w:r>
+    </w:p>
+    <w:p>
+      <w:pPr>
+        <w:pStyle w:val="Normal"/>
+        <w:jc w:val="both"/>
+        <w:rPr>
+          <w:color w:val="000000"/>
+        </w:rPr>
+      </w:pPr>
+      <w:r>
+        <w:rPr>
+          <w:rFonts w:eastAsia="Times New Roman" w:cs="Times New Roman" w:ascii="Garamond" w:hAnsi="Garamond"/>
+          <w:color w:val="000000"/>
+          <w:kern w:val="0"/>
+          <w:sz w:val="36"/>
+          <w:szCs w:val="36"/>
+          <w:shd w:fill="auto" w:val="clear"/>
+          <w:lang w:val="en-US" w:eastAsia="zh-CN" w:bidi="hi-IN"/>
+        </w:rPr>
+        <w:t>Por mais estranheza que isso nos cause, a pessoa concentra todos os seus melhores sentimentos no animal. E quando ela o perde, o mundo desaba.</w:t>
+      </w:r>
+    </w:p>
+    <w:p>
+      <w:pPr>
+        <w:pStyle w:val="Normal"/>
+        <w:jc w:val="both"/>
+        <w:rPr>
+          <w:color w:val="000000"/>
+        </w:rPr>
+      </w:pPr>
+      <w:r>
+        <w:rPr>
+          <w:color w:val="00A0FC"/>
+          <w:sz w:val="36"/>
+          <w:szCs w:val="36"/>
+        </w:rPr>
+      </w:r>
+    </w:p>
+    <w:p>
+      <w:pPr>
+        <w:pStyle w:val="Normal"/>
+        <w:jc w:val="both"/>
+        <w:rPr>
+          <w:color w:val="000000"/>
+        </w:rPr>
+      </w:pPr>
+      <w:r>
+        <w:rPr>
+          <w:rFonts w:eastAsia="Times New Roman" w:cs="Times New Roman" w:ascii="Garamond" w:hAnsi="Garamond"/>
+          <w:color w:val="000000"/>
+          <w:kern w:val="0"/>
+          <w:sz w:val="36"/>
+          <w:szCs w:val="36"/>
+          <w:shd w:fill="auto" w:val="clear"/>
+          <w:lang w:val="en-US" w:eastAsia="zh-CN" w:bidi="hi-IN"/>
+        </w:rPr>
+        <w:t>O fato de uma pessoa dedicar mais amor, mais atenção a um animal do que a um familiar ou a outras pessoas, em inúmeras ocasiões ela assim o faz porque o animal é o refúgio sentimental daquela pessoa.</w:t>
+      </w:r>
+    </w:p>
+    <w:p>
+      <w:pPr>
+        <w:pStyle w:val="Normal"/>
+        <w:jc w:val="both"/>
+        <w:rPr>
+          <w:color w:val="000000"/>
+        </w:rPr>
+      </w:pPr>
+      <w:r>
+        <w:rPr>
+          <w:color w:val="00A0FC"/>
+          <w:sz w:val="36"/>
+          <w:szCs w:val="36"/>
+        </w:rPr>
+      </w:r>
+    </w:p>
+    <w:p>
+      <w:pPr>
+        <w:pStyle w:val="Normal"/>
+        <w:jc w:val="both"/>
+        <w:rPr>
+          <w:color w:val="000000"/>
+        </w:rPr>
+      </w:pPr>
+      <w:r>
+        <w:rPr>
+          <w:rFonts w:eastAsia="Times New Roman" w:cs="Times New Roman" w:ascii="Garamond" w:hAnsi="Garamond"/>
+          <w:color w:val="000000"/>
+          <w:kern w:val="0"/>
+          <w:sz w:val="36"/>
+          <w:szCs w:val="36"/>
+          <w:shd w:fill="auto" w:val="clear"/>
+          <w:lang w:val="en-US" w:eastAsia="zh-CN" w:bidi="hi-IN"/>
+        </w:rPr>
+        <w:t>Então, quando virmos uma pessoa com esse comportamento, vale a pena ter um olhar diferente sobre ela. Aquele apego excessivo ao animal pode ser um sinal de que a pessoa sente-se solitária, abandonada, tem graves problemas ao relacionar-se com os outros.</w:t>
+      </w:r>
+    </w:p>
+    <w:p>
+      <w:pPr>
+        <w:pStyle w:val="Normal"/>
+        <w:jc w:val="both"/>
+        <w:rPr>
+          <w:color w:val="000000"/>
+        </w:rPr>
+      </w:pPr>
+      <w:r>
+        <w:rPr>
+          <w:color w:val="00A0FC"/>
+          <w:sz w:val="36"/>
+          <w:szCs w:val="36"/>
+        </w:rPr>
+      </w:r>
+    </w:p>
+    <w:p>
+      <w:pPr>
+        <w:pStyle w:val="Normal"/>
+        <w:jc w:val="both"/>
+        <w:rPr>
+          <w:color w:val="000000"/>
+        </w:rPr>
+      </w:pPr>
+      <w:r>
+        <w:rPr>
+          <w:rFonts w:eastAsia="Times New Roman" w:cs="Times New Roman" w:ascii="Garamond" w:hAnsi="Garamond"/>
+          <w:color w:val="000000"/>
+          <w:kern w:val="0"/>
+          <w:sz w:val="36"/>
+          <w:szCs w:val="36"/>
+          <w:shd w:fill="auto" w:val="clear"/>
+          <w:lang w:val="en-US" w:eastAsia="zh-CN" w:bidi="hi-IN"/>
+        </w:rPr>
+        <w:t>E quem sabe não possamos ser para aquela pessoa, um apoio, um ouvido e um ombro amigos que a auxilie a vencer aquelas dificuldades.</w:t>
+      </w:r>
+    </w:p>
+    <w:p>
+      <w:pPr>
+        <w:pStyle w:val="Normal"/>
+        <w:jc w:val="both"/>
+        <w:rPr>
+          <w:color w:val="00A0FC"/>
+          <w:sz w:val="36"/>
+          <w:szCs w:val="36"/>
+        </w:rPr>
+      </w:pPr>
+      <w:r>
+        <w:rPr>
+          <w:rFonts w:eastAsia="Times New Roman" w:cs="Times New Roman" w:ascii="Garamond" w:hAnsi="Garamond"/>
+          <w:color w:val="00A0FC"/>
           <w:kern w:val="0"/>
           <w:sz w:val="36"/>
           <w:szCs w:val="36"/>
@@ -2141,7 +3176,7 @@
           <w:shd w:fill="auto" w:val="clear"/>
           <w:lang w:val="en-US" w:eastAsia="zh-CN" w:bidi="hi-IN"/>
         </w:rPr>
-        <w:t>Ponto a ser desenvolvido - Término</w:t>
+        <w:t>Tópico sobre amor aos animais</w:t>
       </w:r>
       <w:r>
         <w:rPr>
@@ -2153,7 +3188,7 @@
           <w:shd w:fill="auto" w:val="clear"/>
           <w:lang w:val="en-US" w:eastAsia="zh-CN" w:bidi="hi-IN"/>
         </w:rPr>
-        <w:t xml:space="preserve"> ]</w:t>
+        <w:t xml:space="preserve"> - Término ]</w:t>
       </w:r>
     </w:p>
     <w:p>
@@ -2167,7 +3202,11 @@
         </w:rPr>
       </w:pPr>
       <w:r>
-        <w:rPr/>
+        <w:rPr>
+          <w:color w:val="00A0FC"/>
+          <w:sz w:val="36"/>
+          <w:szCs w:val="36"/>
+        </w:rPr>
       </w:r>
     </w:p>
     <w:p>
@@ -5656,7 +6695,7 @@
         <w:bCs/>
         <w:rFonts w:ascii="Garamond" w:hAnsi="Garamond"/>
       </w:rPr>
-      <w:t>23</w:t>
+      <w:t>30</w:t>
     </w:r>
     <w:r>
       <w:rPr>

</xml_diff>

<commit_message>
15/11/2025 - 19:18 h
</commit_message>
<xml_diff>
--- a/O mandamento maior/O Mandamento Maior.docx
+++ b/O mandamento maior/O Mandamento Maior.docx
@@ -449,7 +449,10 @@
         </w:rPr>
       </w:pPr>
       <w:r>
-        <w:rPr/>
+        <w:rPr>
+          <w:sz w:val="36"/>
+          <w:szCs w:val="36"/>
+        </w:rPr>
       </w:r>
     </w:p>
     <w:p>
@@ -2074,40 +2077,20 @@
           <w:shd w:fill="auto" w:val="clear"/>
           <w:lang w:val="en-US" w:eastAsia="zh-CN" w:bidi="hi-IN"/>
         </w:rPr>
-        <w:t>[ Ponto a ser desenvolvido - Início ]</w:t>
-      </w:r>
-    </w:p>
-    <w:p>
-      <w:pPr>
-        <w:pStyle w:val="Normal"/>
-        <w:jc w:val="both"/>
-        <w:rPr>
-          <w:color w:val="000000"/>
-        </w:rPr>
-      </w:pPr>
-      <w:r>
-        <w:rPr>
-          <w:rFonts w:eastAsia="Times New Roman" w:cs="Times New Roman" w:ascii="Garamond" w:hAnsi="Garamond"/>
-          <w:color w:val="000000"/>
-          <w:kern w:val="0"/>
-          <w:sz w:val="36"/>
-          <w:szCs w:val="36"/>
-          <w:shd w:fill="auto" w:val="clear"/>
-          <w:lang w:val="en-US" w:eastAsia="zh-CN" w:bidi="hi-IN"/>
-        </w:rPr>
-        <w:t>No Evangelho Segundo o Espíritismo, Capítulo XI - Amar o próximo como a si mesmo, no item Lei de Amor, o Espírito Fénelon nos diz que o homem, no inćio de sua jornada evolutiva só tinha instintos. À medida que o Espírito se desenvolve moral e intelectualmente os instintos vão, gradativamente, dando lugar aos sentimentos.  Jesus nos conv</w:t>
-      </w:r>
-    </w:p>
-    <w:p>
-      <w:pPr>
-        <w:pStyle w:val="Normal"/>
-        <w:jc w:val="both"/>
-        <w:rPr>
+        <w:t xml:space="preserve">[ </w:t>
+      </w:r>
+      <w:r>
+        <w:rPr>
+          <w:rFonts w:eastAsia="Times New Roman" w:cs="Times New Roman" w:ascii="Garamond" w:hAnsi="Garamond"/>
           <w:color w:val="00A0FC"/>
-          <w:sz w:val="36"/>
-          <w:szCs w:val="36"/>
-        </w:rPr>
-      </w:pPr>
+          <w:kern w:val="0"/>
+          <w:sz w:val="36"/>
+          <w:szCs w:val="36"/>
+          <w:shd w:fill="auto" w:val="clear"/>
+          <w:lang w:val="en-US" w:eastAsia="zh-CN" w:bidi="hi-IN"/>
+        </w:rPr>
+        <w:t xml:space="preserve">Anotações feitas do capítulo XI </w:t>
+      </w:r>
       <w:r>
         <w:rPr>
           <w:rFonts w:eastAsia="Times New Roman" w:cs="Times New Roman" w:ascii="Garamond" w:hAnsi="Garamond"/>
@@ -2118,35 +2101,530 @@
           <w:shd w:fill="auto" w:val="clear"/>
           <w:lang w:val="en-US" w:eastAsia="zh-CN" w:bidi="hi-IN"/>
         </w:rPr>
-        <w:t>[ Ponto a ser desenvolvido - Término ]</w:t>
-      </w:r>
-    </w:p>
-    <w:p>
-      <w:pPr>
-        <w:pStyle w:val="Normal"/>
-        <w:jc w:val="both"/>
-        <w:rPr>
-          <w:color w:val="000000"/>
-        </w:rPr>
-      </w:pPr>
-      <w:r>
+        <w:t>- Início ]</w:t>
+      </w:r>
+    </w:p>
+    <w:p>
+      <w:pPr>
+        <w:pStyle w:val="Normal"/>
+        <w:jc w:val="both"/>
+        <w:rPr>
+          <w:rFonts w:ascii="Garamond" w:hAnsi="Garamond" w:eastAsia="Times New Roman" w:cs="Times New Roman"/>
+          <w:color w:val="000000"/>
+          <w:kern w:val="0"/>
+          <w:sz w:val="36"/>
+          <w:szCs w:val="36"/>
+          <w:u w:val="single"/>
+          <w:shd w:fill="auto" w:val="clear"/>
+          <w:lang w:val="en-US" w:eastAsia="zh-CN" w:bidi="hi-IN"/>
+        </w:rPr>
+      </w:pPr>
+      <w:r>
+        <w:rPr>
+          <w:rFonts w:eastAsia="Times New Roman" w:cs="Times New Roman" w:ascii="Garamond" w:hAnsi="Garamond"/>
+          <w:color w:val="000000"/>
+          <w:kern w:val="0"/>
+          <w:sz w:val="36"/>
+          <w:szCs w:val="36"/>
+          <w:u w:val="single"/>
+          <w:shd w:fill="auto" w:val="clear"/>
+          <w:lang w:val="en-US" w:eastAsia="zh-CN" w:bidi="hi-IN"/>
+        </w:rPr>
+        <w:t>Dai a César o que é de César</w:t>
+      </w:r>
+    </w:p>
+    <w:p>
+      <w:pPr>
+        <w:pStyle w:val="Normal"/>
+        <w:numPr>
+          <w:ilvl w:val="0"/>
+          <w:numId w:val="10"/>
+        </w:numPr>
+        <w:jc w:val="both"/>
+        <w:rPr>
+          <w:rFonts w:ascii="Garamond" w:hAnsi="Garamond" w:eastAsia="Times New Roman" w:cs="Times New Roman"/>
+          <w:color w:val="000000"/>
+          <w:kern w:val="0"/>
+          <w:sz w:val="36"/>
+          <w:szCs w:val="36"/>
+          <w:shd w:fill="auto" w:val="clear"/>
+          <w:lang w:val="en-US" w:eastAsia="zh-CN" w:bidi="hi-IN"/>
+        </w:rPr>
+      </w:pPr>
+      <w:r>
+        <w:rPr>
+          <w:rFonts w:eastAsia="Times New Roman" w:cs="Times New Roman" w:ascii="Garamond" w:hAnsi="Garamond"/>
+          <w:color w:val="000000"/>
+          <w:kern w:val="0"/>
+          <w:sz w:val="36"/>
+          <w:szCs w:val="36"/>
+          <w:shd w:fill="auto" w:val="clear"/>
+          <w:lang w:val="en-US" w:eastAsia="zh-CN" w:bidi="hi-IN"/>
+        </w:rPr>
+        <w:t>o ponto principal que pode ser desenvolvido desse tópico é que precisamos ser justos com nossos desafetos. Se algo é de direito deles - e aqui não estamos falando apenas de coisas materiais - não devemos negar-lhes esse algo. Gostando ou não da pessoa, devemos reconhecer que ela merece receber aquilo que, por direito, pertence a ela;</w:t>
+      </w:r>
+    </w:p>
+    <w:p>
+      <w:pPr>
+        <w:pStyle w:val="Normal"/>
+        <w:numPr>
+          <w:ilvl w:val="0"/>
+          <w:numId w:val="10"/>
+        </w:numPr>
+        <w:jc w:val="both"/>
+        <w:rPr>
+          <w:rFonts w:ascii="Garamond" w:hAnsi="Garamond" w:eastAsia="Times New Roman" w:cs="Times New Roman"/>
+          <w:color w:val="000000"/>
+          <w:kern w:val="0"/>
+          <w:sz w:val="36"/>
+          <w:szCs w:val="36"/>
+          <w:shd w:fill="auto" w:val="clear"/>
+          <w:lang w:val="en-US" w:eastAsia="zh-CN" w:bidi="hi-IN"/>
+        </w:rPr>
+      </w:pPr>
+      <w:r>
+        <w:rPr>
+          <w:rFonts w:eastAsia="Times New Roman" w:cs="Times New Roman" w:ascii="Garamond" w:hAnsi="Garamond"/>
+          <w:color w:val="000000"/>
+          <w:kern w:val="0"/>
+          <w:sz w:val="36"/>
+          <w:szCs w:val="36"/>
+          <w:shd w:fill="auto" w:val="clear"/>
+          <w:lang w:val="en-US" w:eastAsia="zh-CN" w:bidi="hi-IN"/>
+        </w:rPr>
+        <w:t>verificar se tem algo na palestra Nós e César, de Emmanuel, que possa ser trazido para cá</w:t>
+      </w:r>
+    </w:p>
+    <w:p>
+      <w:pPr>
+        <w:pStyle w:val="Normal"/>
+        <w:jc w:val="both"/>
+        <w:rPr>
+          <w:rFonts w:ascii="Garamond" w:hAnsi="Garamond" w:eastAsia="Times New Roman" w:cs="Times New Roman"/>
+          <w:color w:val="000000"/>
+          <w:kern w:val="0"/>
+          <w:sz w:val="36"/>
+          <w:szCs w:val="36"/>
+          <w:shd w:fill="auto" w:val="clear"/>
+          <w:lang w:val="en-US" w:eastAsia="zh-CN" w:bidi="hi-IN"/>
+        </w:rPr>
+      </w:pPr>
+      <w:r>
+        <w:rPr>
+          <w:rFonts w:eastAsia="Times New Roman" w:cs="Times New Roman" w:ascii="Garamond" w:hAnsi="Garamond"/>
+          <w:color w:val="000000"/>
+          <w:kern w:val="0"/>
+          <w:sz w:val="36"/>
+          <w:szCs w:val="36"/>
+          <w:shd w:fill="auto" w:val="clear"/>
+          <w:lang w:val="en-US" w:eastAsia="zh-CN" w:bidi="hi-IN"/>
+        </w:rPr>
+      </w:r>
+    </w:p>
+    <w:p>
+      <w:pPr>
+        <w:pStyle w:val="Normal"/>
+        <w:jc w:val="both"/>
+        <w:rPr>
+          <w:rFonts w:ascii="Garamond" w:hAnsi="Garamond" w:eastAsia="Times New Roman" w:cs="Times New Roman"/>
+          <w:color w:val="000000"/>
+          <w:kern w:val="0"/>
+          <w:sz w:val="36"/>
+          <w:szCs w:val="36"/>
+          <w:u w:val="single"/>
+          <w:shd w:fill="auto" w:val="clear"/>
+          <w:lang w:val="en-US" w:eastAsia="zh-CN" w:bidi="hi-IN"/>
+        </w:rPr>
+      </w:pPr>
+      <w:r>
+        <w:rPr>
+          <w:rFonts w:eastAsia="Times New Roman" w:cs="Times New Roman" w:ascii="Garamond" w:hAnsi="Garamond"/>
+          <w:color w:val="000000"/>
+          <w:kern w:val="0"/>
+          <w:sz w:val="36"/>
+          <w:szCs w:val="36"/>
+          <w:u w:val="single"/>
+          <w:shd w:fill="auto" w:val="clear"/>
+          <w:lang w:val="en-US" w:eastAsia="zh-CN" w:bidi="hi-IN"/>
+        </w:rPr>
+        <w:t>Instruções de Lázaro</w:t>
+      </w:r>
+    </w:p>
+    <w:p>
+      <w:pPr>
+        <w:pStyle w:val="Normal"/>
+        <w:numPr>
+          <w:ilvl w:val="0"/>
+          <w:numId w:val="11"/>
+        </w:numPr>
+        <w:jc w:val="both"/>
+        <w:rPr>
+          <w:rFonts w:ascii="Garamond" w:hAnsi="Garamond" w:eastAsia="Times New Roman" w:cs="Times New Roman"/>
+          <w:color w:val="000000"/>
+          <w:kern w:val="0"/>
+          <w:sz w:val="36"/>
+          <w:szCs w:val="36"/>
+          <w:shd w:fill="auto" w:val="clear"/>
+          <w:lang w:val="en-US" w:eastAsia="zh-CN" w:bidi="hi-IN"/>
+        </w:rPr>
+      </w:pPr>
+      <w:r>
+        <w:rPr>
+          <w:rFonts w:eastAsia="Times New Roman" w:cs="Times New Roman" w:ascii="Garamond" w:hAnsi="Garamond"/>
+          <w:color w:val="000000"/>
+          <w:kern w:val="0"/>
+          <w:sz w:val="36"/>
+          <w:szCs w:val="36"/>
+          <w:shd w:fill="auto" w:val="clear"/>
+          <w:lang w:val="en-US" w:eastAsia="zh-CN" w:bidi="hi-IN"/>
+        </w:rPr>
+        <w:t>no início o homem só tem instintos. Quando mais avançado, adquire sensações. Quando instruído e depurado, possui sentimentos;</w:t>
+      </w:r>
+    </w:p>
+    <w:p>
+      <w:pPr>
+        <w:pStyle w:val="Normal"/>
+        <w:numPr>
+          <w:ilvl w:val="0"/>
+          <w:numId w:val="11"/>
+        </w:numPr>
+        <w:jc w:val="both"/>
+        <w:rPr>
+          <w:rFonts w:ascii="Garamond" w:hAnsi="Garamond" w:eastAsia="Times New Roman" w:cs="Times New Roman"/>
+          <w:color w:val="000000"/>
+          <w:kern w:val="0"/>
+          <w:sz w:val="36"/>
+          <w:szCs w:val="36"/>
+          <w:shd w:fill="auto" w:val="clear"/>
+          <w:lang w:val="en-US" w:eastAsia="zh-CN" w:bidi="hi-IN"/>
+        </w:rPr>
+      </w:pPr>
+      <w:r>
+        <w:rPr>
+          <w:rFonts w:eastAsia="Times New Roman" w:cs="Times New Roman" w:ascii="Garamond" w:hAnsi="Garamond"/>
+          <w:color w:val="000000"/>
+          <w:kern w:val="0"/>
+          <w:sz w:val="36"/>
+          <w:szCs w:val="36"/>
+          <w:shd w:fill="auto" w:val="clear"/>
+          <w:lang w:val="en-US" w:eastAsia="zh-CN" w:bidi="hi-IN"/>
+        </w:rPr>
+        <w:t>o amor é o ápice dos sentimentos humanos. Não o amor como costumamos entender, mas o amor que concentra em si todas as melhores e mais belas virtudes humanas: caridade, humildade, benevolência, indulgência, paciência, abnegação, resignação entre outras;</w:t>
+      </w:r>
+    </w:p>
+    <w:p>
+      <w:pPr>
+        <w:pStyle w:val="Normal"/>
+        <w:numPr>
+          <w:ilvl w:val="0"/>
+          <w:numId w:val="11"/>
+        </w:numPr>
+        <w:jc w:val="both"/>
+        <w:rPr>
+          <w:rFonts w:ascii="Garamond" w:hAnsi="Garamond" w:eastAsia="Times New Roman" w:cs="Times New Roman"/>
+          <w:color w:val="000000"/>
+          <w:kern w:val="0"/>
+          <w:sz w:val="36"/>
+          <w:szCs w:val="36"/>
+          <w:shd w:fill="auto" w:val="clear"/>
+          <w:lang w:val="en-US" w:eastAsia="zh-CN" w:bidi="hi-IN"/>
+        </w:rPr>
+      </w:pPr>
+      <w:r>
+        <w:rPr>
+          <w:rFonts w:eastAsia="Times New Roman" w:cs="Times New Roman" w:ascii="Garamond" w:hAnsi="Garamond"/>
+          <w:color w:val="000000"/>
+          <w:kern w:val="0"/>
+          <w:sz w:val="36"/>
+          <w:szCs w:val="36"/>
+          <w:shd w:fill="auto" w:val="clear"/>
+          <w:lang w:val="en-US" w:eastAsia="zh-CN" w:bidi="hi-IN"/>
+        </w:rPr>
+        <w:t>todos nós temos algumas dessas virtudes, mas para a maioria de nós elas não estão com</w:t>
+      </w:r>
+      <w:r>
+        <w:rPr>
+          <w:rFonts w:eastAsia="Times New Roman" w:cs="Times New Roman" w:ascii="Garamond" w:hAnsi="Garamond"/>
+          <w:color w:val="000000"/>
+          <w:kern w:val="0"/>
+          <w:sz w:val="36"/>
+          <w:szCs w:val="36"/>
+          <w:shd w:fill="auto" w:val="clear"/>
+          <w:lang w:val="en-US" w:eastAsia="zh-CN" w:bidi="hi-IN"/>
+        </w:rPr>
+        <w:t>pletamente desenvolvidas. Isso é natural considerando o atual estágio evolutivo em que nos encontramos;</w:t>
+      </w:r>
+    </w:p>
+    <w:p>
+      <w:pPr>
+        <w:pStyle w:val="Normal"/>
+        <w:numPr>
+          <w:ilvl w:val="0"/>
+          <w:numId w:val="11"/>
+        </w:numPr>
+        <w:jc w:val="both"/>
+        <w:rPr>
+          <w:rFonts w:ascii="Garamond" w:hAnsi="Garamond" w:eastAsia="Times New Roman" w:cs="Times New Roman"/>
+          <w:color w:val="000000"/>
+          <w:kern w:val="0"/>
+          <w:sz w:val="36"/>
+          <w:szCs w:val="36"/>
+          <w:shd w:fill="auto" w:val="clear"/>
+          <w:lang w:val="en-US" w:eastAsia="zh-CN" w:bidi="hi-IN"/>
+        </w:rPr>
+      </w:pPr>
+      <w:r>
+        <w:rPr>
+          <w:rFonts w:eastAsia="Times New Roman" w:cs="Times New Roman" w:ascii="Garamond" w:hAnsi="Garamond"/>
+          <w:color w:val="000000"/>
+          <w:kern w:val="0"/>
+          <w:sz w:val="36"/>
+          <w:szCs w:val="36"/>
+          <w:shd w:fill="auto" w:val="clear"/>
+          <w:lang w:val="en-US" w:eastAsia="zh-CN" w:bidi="hi-IN"/>
+        </w:rPr>
+        <w:t>aprender a amar - seja a Deus, ao próximo ou a nós mesmos - é exercitar, aprimorar, desenvolver a cada dia cada uma das virtudes humanas;</w:t>
+      </w:r>
+    </w:p>
+    <w:p>
+      <w:pPr>
+        <w:pStyle w:val="Normal"/>
+        <w:numPr>
+          <w:ilvl w:val="0"/>
+          <w:numId w:val="11"/>
+        </w:numPr>
+        <w:jc w:val="both"/>
+        <w:rPr>
+          <w:rFonts w:ascii="Garamond" w:hAnsi="Garamond" w:eastAsia="Times New Roman" w:cs="Times New Roman"/>
+          <w:color w:val="000000"/>
+          <w:kern w:val="0"/>
+          <w:sz w:val="36"/>
+          <w:szCs w:val="36"/>
+          <w:shd w:fill="auto" w:val="clear"/>
+          <w:lang w:val="en-US" w:eastAsia="zh-CN" w:bidi="hi-IN"/>
+        </w:rPr>
+      </w:pPr>
+      <w:r>
+        <w:rPr>
+          <w:rFonts w:eastAsia="Times New Roman" w:cs="Times New Roman" w:ascii="Garamond" w:hAnsi="Garamond"/>
+          <w:color w:val="000000"/>
+          <w:kern w:val="0"/>
+          <w:sz w:val="36"/>
+          <w:szCs w:val="36"/>
+          <w:shd w:fill="auto" w:val="clear"/>
+          <w:lang w:val="en-US" w:eastAsia="zh-CN" w:bidi="hi-IN"/>
+        </w:rPr>
+        <w:t>assim, quando procuramos ser mais humildes, mais pacientes, mais caridosos, mais resignados, nós estamos, na verdade, aprendendo a amar um pouco mais;</w:t>
+      </w:r>
+    </w:p>
+    <w:p>
+      <w:pPr>
+        <w:pStyle w:val="Normal"/>
+        <w:numPr>
+          <w:ilvl w:val="0"/>
+          <w:numId w:val="11"/>
+        </w:numPr>
+        <w:jc w:val="both"/>
+        <w:rPr>
+          <w:rFonts w:ascii="Garamond" w:hAnsi="Garamond" w:eastAsia="Times New Roman" w:cs="Times New Roman"/>
+          <w:color w:val="000000"/>
+          <w:kern w:val="0"/>
+          <w:sz w:val="36"/>
+          <w:szCs w:val="36"/>
+          <w:shd w:fill="auto" w:val="clear"/>
+          <w:lang w:val="en-US" w:eastAsia="zh-CN" w:bidi="hi-IN"/>
+        </w:rPr>
+      </w:pPr>
+      <w:r>
+        <w:rPr>
+          <w:rFonts w:eastAsia="Times New Roman" w:cs="Times New Roman" w:ascii="Garamond" w:hAnsi="Garamond"/>
+          <w:color w:val="000000"/>
+          <w:kern w:val="0"/>
+          <w:sz w:val="36"/>
+          <w:szCs w:val="36"/>
+          <w:shd w:fill="auto" w:val="clear"/>
+          <w:lang w:val="en-US" w:eastAsia="zh-CN" w:bidi="hi-IN"/>
+        </w:rPr>
+        <w:t xml:space="preserve">Jesus é nosso Mestre, guia e modelo. Ele possui todas as virtudes humanas em seu grau máximo. Por isso Ele ama a Deus e a todos nós em plenitude. Também por isso Ele nos disse que o mandamento maior encerra em si toda a lei e </w:t>
+      </w:r>
+      <w:r>
+        <w:rPr>
+          <w:rFonts w:eastAsia="Times New Roman" w:cs="Times New Roman" w:ascii="Garamond" w:hAnsi="Garamond"/>
+          <w:color w:val="000000"/>
+          <w:kern w:val="0"/>
+          <w:sz w:val="36"/>
+          <w:szCs w:val="36"/>
+          <w:shd w:fill="auto" w:val="clear"/>
+          <w:lang w:val="en-US" w:eastAsia="zh-CN" w:bidi="hi-IN"/>
+        </w:rPr>
+        <w:t>todos os profetas;</w:t>
+      </w:r>
+    </w:p>
+    <w:p>
+      <w:pPr>
+        <w:pStyle w:val="Normal"/>
+        <w:jc w:val="both"/>
+        <w:rPr>
+          <w:rFonts w:ascii="Garamond" w:hAnsi="Garamond" w:eastAsia="Times New Roman" w:cs="Times New Roman"/>
+          <w:color w:val="000000"/>
+          <w:kern w:val="0"/>
+          <w:sz w:val="36"/>
+          <w:szCs w:val="36"/>
+          <w:shd w:fill="auto" w:val="clear"/>
+          <w:lang w:val="en-US" w:eastAsia="zh-CN" w:bidi="hi-IN"/>
+        </w:rPr>
+      </w:pPr>
+      <w:r>
+        <w:rPr>
+          <w:rFonts w:eastAsia="Times New Roman" w:cs="Times New Roman" w:ascii="Garamond" w:hAnsi="Garamond"/>
+          <w:color w:val="000000"/>
+          <w:kern w:val="0"/>
+          <w:sz w:val="36"/>
+          <w:szCs w:val="36"/>
+          <w:shd w:fill="auto" w:val="clear"/>
+          <w:lang w:val="en-US" w:eastAsia="zh-CN" w:bidi="hi-IN"/>
+        </w:rPr>
+      </w:r>
+    </w:p>
+    <w:p>
+      <w:pPr>
+        <w:pStyle w:val="Normal"/>
+        <w:jc w:val="both"/>
+        <w:rPr>
+          <w:rFonts w:ascii="Garamond" w:hAnsi="Garamond" w:eastAsia="Times New Roman" w:cs="Times New Roman"/>
+          <w:color w:val="000000"/>
+          <w:kern w:val="0"/>
+          <w:sz w:val="36"/>
+          <w:szCs w:val="36"/>
+          <w:u w:val="single"/>
+          <w:shd w:fill="auto" w:val="clear"/>
+          <w:lang w:val="en-US" w:eastAsia="zh-CN" w:bidi="hi-IN"/>
+        </w:rPr>
+      </w:pPr>
+      <w:r>
+        <w:rPr>
+          <w:rFonts w:eastAsia="Times New Roman" w:cs="Times New Roman" w:ascii="Garamond" w:hAnsi="Garamond"/>
+          <w:color w:val="000000"/>
+          <w:kern w:val="0"/>
+          <w:sz w:val="36"/>
+          <w:szCs w:val="36"/>
+          <w:u w:val="single"/>
+          <w:shd w:fill="auto" w:val="clear"/>
+          <w:lang w:val="en-US" w:eastAsia="zh-CN" w:bidi="hi-IN"/>
+        </w:rPr>
+        <w:t>Instruções de Fénelon</w:t>
+      </w:r>
+    </w:p>
+    <w:p>
+      <w:pPr>
+        <w:pStyle w:val="Normal"/>
+        <w:numPr>
+          <w:ilvl w:val="0"/>
+          <w:numId w:val="12"/>
+        </w:numPr>
+        <w:jc w:val="both"/>
+        <w:rPr>
+          <w:rFonts w:ascii="Garamond" w:hAnsi="Garamond" w:eastAsia="Times New Roman" w:cs="Times New Roman"/>
+          <w:color w:val="000000"/>
+          <w:kern w:val="0"/>
+          <w:sz w:val="36"/>
+          <w:szCs w:val="36"/>
+          <w:shd w:fill="auto" w:val="clear"/>
+          <w:lang w:val="en-US" w:eastAsia="zh-CN" w:bidi="hi-IN"/>
+        </w:rPr>
+      </w:pPr>
+      <w:r>
+        <w:rPr>
+          <w:rFonts w:eastAsia="Times New Roman" w:cs="Times New Roman" w:ascii="Garamond" w:hAnsi="Garamond"/>
+          <w:color w:val="000000"/>
+          <w:kern w:val="0"/>
+          <w:sz w:val="36"/>
+          <w:szCs w:val="36"/>
+          <w:shd w:fill="auto" w:val="clear"/>
+          <w:lang w:val="en-US" w:eastAsia="zh-CN" w:bidi="hi-IN"/>
+        </w:rPr>
+        <w:t>para convertermos os instintos em sentimentos nobres precisamos desenvolver a moral e a inteligência;</w:t>
+      </w:r>
+    </w:p>
+    <w:p>
+      <w:pPr>
+        <w:pStyle w:val="Normal"/>
+        <w:numPr>
+          <w:ilvl w:val="0"/>
+          <w:numId w:val="12"/>
+        </w:numPr>
+        <w:jc w:val="both"/>
+        <w:rPr>
+          <w:rFonts w:ascii="Garamond" w:hAnsi="Garamond" w:eastAsia="Times New Roman" w:cs="Times New Roman"/>
+          <w:color w:val="000000"/>
+          <w:kern w:val="0"/>
+          <w:sz w:val="36"/>
+          <w:szCs w:val="36"/>
+          <w:shd w:fill="auto" w:val="clear"/>
+          <w:lang w:val="en-US" w:eastAsia="zh-CN" w:bidi="hi-IN"/>
+        </w:rPr>
+      </w:pPr>
+      <w:r>
+        <w:rPr>
+          <w:rFonts w:eastAsia="Times New Roman" w:cs="Times New Roman" w:ascii="Garamond" w:hAnsi="Garamond"/>
+          <w:color w:val="000000"/>
+          <w:kern w:val="0"/>
+          <w:sz w:val="36"/>
+          <w:szCs w:val="36"/>
+          <w:shd w:fill="auto" w:val="clear"/>
+          <w:lang w:val="en-US" w:eastAsia="zh-CN" w:bidi="hi-IN"/>
+        </w:rPr>
+        <w:t>o verdadeiro amor transcende os laços consanguineos e sociais. Amar ao próximo significa amar a todos indistintamente. É ainda uma condição muito distante de nós, mas uma condição que alcançaremos um dia desde que nos esforcemos para amar um pouco mais a cada dia;</w:t>
+      </w:r>
+    </w:p>
+    <w:p>
+      <w:pPr>
+        <w:pStyle w:val="Normal"/>
+        <w:jc w:val="both"/>
+        <w:rPr>
+          <w:rFonts w:ascii="Garamond" w:hAnsi="Garamond" w:eastAsia="Times New Roman" w:cs="Times New Roman"/>
+          <w:color w:val="000000"/>
+          <w:kern w:val="0"/>
+          <w:sz w:val="36"/>
+          <w:szCs w:val="36"/>
+          <w:shd w:fill="auto" w:val="clear"/>
+          <w:lang w:val="en-US" w:eastAsia="zh-CN" w:bidi="hi-IN"/>
+        </w:rPr>
+      </w:pPr>
+      <w:r>
+        <w:rPr>
+          <w:rFonts w:eastAsia="Times New Roman" w:cs="Times New Roman" w:ascii="Garamond" w:hAnsi="Garamond"/>
+          <w:color w:val="000000"/>
+          <w:kern w:val="0"/>
+          <w:sz w:val="36"/>
+          <w:szCs w:val="36"/>
+          <w:shd w:fill="auto" w:val="clear"/>
+          <w:lang w:val="en-US" w:eastAsia="zh-CN" w:bidi="hi-IN"/>
+        </w:rPr>
+      </w:r>
+    </w:p>
+    <w:p>
+      <w:pPr>
+        <w:pStyle w:val="Normal"/>
+        <w:jc w:val="both"/>
         <w:rPr>
           <w:color w:val="00A0FC"/>
           <w:sz w:val="36"/>
           <w:szCs w:val="36"/>
         </w:rPr>
-      </w:r>
-    </w:p>
-    <w:p>
-      <w:pPr>
-        <w:pStyle w:val="Normal"/>
-        <w:jc w:val="both"/>
-        <w:rPr>
+      </w:pPr>
+      <w:r>
+        <w:rPr>
+          <w:rFonts w:eastAsia="Times New Roman" w:cs="Times New Roman" w:ascii="Garamond" w:hAnsi="Garamond"/>
           <w:color w:val="00A0FC"/>
-          <w:sz w:val="36"/>
-          <w:szCs w:val="36"/>
-        </w:rPr>
-      </w:pPr>
+          <w:kern w:val="0"/>
+          <w:sz w:val="36"/>
+          <w:szCs w:val="36"/>
+          <w:shd w:fill="auto" w:val="clear"/>
+          <w:lang w:val="en-US" w:eastAsia="zh-CN" w:bidi="hi-IN"/>
+        </w:rPr>
+        <w:t xml:space="preserve">[ </w:t>
+      </w:r>
       <w:r>
         <w:rPr>
           <w:rFonts w:eastAsia="Times New Roman" w:cs="Times New Roman" w:ascii="Garamond" w:hAnsi="Garamond"/>
@@ -2157,7 +2635,7 @@
           <w:shd w:fill="auto" w:val="clear"/>
           <w:lang w:val="en-US" w:eastAsia="zh-CN" w:bidi="hi-IN"/>
         </w:rPr>
-        <w:t xml:space="preserve">[ </w:t>
+        <w:t xml:space="preserve">Anotações feitas do capítulo XI </w:t>
       </w:r>
       <w:r>
         <w:rPr>
@@ -2169,7 +2647,7 @@
           <w:shd w:fill="auto" w:val="clear"/>
           <w:lang w:val="en-US" w:eastAsia="zh-CN" w:bidi="hi-IN"/>
         </w:rPr>
-        <w:t>Tópico sobre amor aos animais</w:t>
+        <w:t xml:space="preserve">- </w:t>
       </w:r>
       <w:r>
         <w:rPr>
@@ -2181,7 +2659,7 @@
           <w:shd w:fill="auto" w:val="clear"/>
           <w:lang w:val="en-US" w:eastAsia="zh-CN" w:bidi="hi-IN"/>
         </w:rPr>
-        <w:t xml:space="preserve"> - </w:t>
+        <w:t>Término</w:t>
       </w:r>
       <w:r>
         <w:rPr>
@@ -2193,19 +2671,44 @@
           <w:shd w:fill="auto" w:val="clear"/>
           <w:lang w:val="en-US" w:eastAsia="zh-CN" w:bidi="hi-IN"/>
         </w:rPr>
-        <w:t>Início</w:t>
-      </w:r>
-      <w:r>
-        <w:rPr>
-          <w:rFonts w:eastAsia="Times New Roman" w:cs="Times New Roman" w:ascii="Garamond" w:hAnsi="Garamond"/>
+        <w:t xml:space="preserve"> ]</w:t>
+      </w:r>
+    </w:p>
+    <w:p>
+      <w:pPr>
+        <w:pStyle w:val="Normal"/>
+        <w:jc w:val="both"/>
+        <w:rPr>
+          <w:color w:val="000000"/>
+        </w:rPr>
+      </w:pPr>
+      <w:r>
+        <w:rPr>
+          <w:color w:val="000000"/>
+        </w:rPr>
+      </w:r>
+    </w:p>
+    <w:p>
+      <w:pPr>
+        <w:pStyle w:val="Normal"/>
+        <w:jc w:val="both"/>
+        <w:rPr>
           <w:color w:val="00A0FC"/>
-          <w:kern w:val="0"/>
-          <w:sz w:val="36"/>
-          <w:szCs w:val="36"/>
-          <w:shd w:fill="auto" w:val="clear"/>
-          <w:lang w:val="en-US" w:eastAsia="zh-CN" w:bidi="hi-IN"/>
-        </w:rPr>
-        <w:t xml:space="preserve"> ]</w:t>
+          <w:sz w:val="36"/>
+          <w:szCs w:val="36"/>
+        </w:rPr>
+      </w:pPr>
+      <w:r>
+        <w:rPr>
+          <w:rFonts w:eastAsia="Times New Roman" w:cs="Times New Roman" w:ascii="Garamond" w:hAnsi="Garamond"/>
+          <w:color w:val="00A0FC"/>
+          <w:kern w:val="0"/>
+          <w:sz w:val="36"/>
+          <w:szCs w:val="36"/>
+          <w:shd w:fill="auto" w:val="clear"/>
+          <w:lang w:val="en-US" w:eastAsia="zh-CN" w:bidi="hi-IN"/>
+        </w:rPr>
+        <w:t>[ Tópico sobre amor aos animais - Início ]</w:t>
       </w:r>
     </w:p>
     <w:p>
@@ -2239,956 +2742,794 @@
       </w:pPr>
       <w:r>
         <w:rPr>
+          <w:color w:val="000000"/>
+        </w:rPr>
+      </w:r>
+    </w:p>
+    <w:p>
+      <w:pPr>
+        <w:pStyle w:val="Normal"/>
+        <w:jc w:val="both"/>
+        <w:rPr>
+          <w:color w:val="000000"/>
+        </w:rPr>
+      </w:pPr>
+      <w:r>
+        <w:rPr>
+          <w:rFonts w:eastAsia="Times New Roman" w:cs="Times New Roman" w:ascii="Garamond" w:hAnsi="Garamond"/>
+          <w:color w:val="000000"/>
+          <w:kern w:val="0"/>
+          <w:sz w:val="36"/>
+          <w:szCs w:val="36"/>
+          <w:shd w:fill="auto" w:val="clear"/>
+          <w:lang w:val="en-US" w:eastAsia="zh-CN" w:bidi="hi-IN"/>
+        </w:rPr>
+        <w:t>Eu sempre tive um olhar muito crítico sobre a maneira como certas pessoas tratam os animais, quase como se eles fossem humanos. Eu via nisso um exagero, uma supervalorização do animal. E eu mantive esse olhar até o dia em que meu filho pediu um animal de estimação e eu dei a ele um coelho.</w:t>
+      </w:r>
+    </w:p>
+    <w:p>
+      <w:pPr>
+        <w:pStyle w:val="Normal"/>
+        <w:jc w:val="both"/>
+        <w:rPr>
+          <w:color w:val="000000"/>
+        </w:rPr>
+      </w:pPr>
+      <w:r>
+        <w:rPr>
+          <w:color w:val="000000"/>
+        </w:rPr>
+      </w:r>
+    </w:p>
+    <w:p>
+      <w:pPr>
+        <w:pStyle w:val="Normal"/>
+        <w:jc w:val="both"/>
+        <w:rPr>
+          <w:color w:val="000000"/>
+        </w:rPr>
+      </w:pPr>
+      <w:r>
+        <w:rPr>
+          <w:rFonts w:eastAsia="Times New Roman" w:cs="Times New Roman" w:ascii="Garamond" w:hAnsi="Garamond"/>
+          <w:color w:val="000000"/>
+          <w:kern w:val="0"/>
+          <w:sz w:val="36"/>
+          <w:szCs w:val="36"/>
+          <w:shd w:fill="auto" w:val="clear"/>
+          <w:lang w:val="en-US" w:eastAsia="zh-CN" w:bidi="hi-IN"/>
+        </w:rPr>
+        <w:t>Coelhos são animais muito mal compreendidos. As pessoas os alimentam de maneira errada, prendem em gaiolas, os dentes deles crescem durante toda a vida e por isso eles têm a necessidade constante de roer tudo o que encontram pela frente, são suscetíveis de uma série de doenças e por aí vai. Por isso eu faço parte de alguns grupos de pessoas que também tem coelhos de estimação e nesses grupos nós trocamos informações sobre como cuidar da melhor maneira dos nossos orelhudinhos.</w:t>
+      </w:r>
+    </w:p>
+    <w:p>
+      <w:pPr>
+        <w:pStyle w:val="Normal"/>
+        <w:jc w:val="both"/>
+        <w:rPr>
+          <w:color w:val="000000"/>
+        </w:rPr>
+      </w:pPr>
+      <w:r>
+        <w:rPr>
+          <w:color w:val="000000"/>
+        </w:rPr>
+      </w:r>
+    </w:p>
+    <w:p>
+      <w:pPr>
+        <w:pStyle w:val="Normal"/>
+        <w:jc w:val="both"/>
+        <w:rPr>
+          <w:color w:val="000000"/>
+        </w:rPr>
+      </w:pPr>
+      <w:r>
+        <w:rPr>
+          <w:rFonts w:eastAsia="Times New Roman" w:cs="Times New Roman" w:ascii="Garamond" w:hAnsi="Garamond"/>
+          <w:color w:val="000000"/>
+          <w:kern w:val="0"/>
+          <w:sz w:val="36"/>
+          <w:szCs w:val="36"/>
+          <w:shd w:fill="auto" w:val="clear"/>
+          <w:lang w:val="en-US" w:eastAsia="zh-CN" w:bidi="hi-IN"/>
+        </w:rPr>
+        <w:t>Certo dia, em um desses grupos, uma garota enviou uma mensagem perguntando se alguém estaria disposto a cuidar do coelho dela pois ela queria morrer. Ela tinha decidido tirar a própria vida, mas só faria isso quando o coelho dela estivesse com alguém que fosse cuidar dele tão bem quanto ela cuidava.</w:t>
+      </w:r>
+    </w:p>
+    <w:p>
+      <w:pPr>
+        <w:pStyle w:val="Normal"/>
+        <w:jc w:val="both"/>
+        <w:rPr>
+          <w:color w:val="000000"/>
+        </w:rPr>
+      </w:pPr>
+      <w:r>
+        <w:rPr>
+          <w:color w:val="000000"/>
+        </w:rPr>
+      </w:r>
+    </w:p>
+    <w:p>
+      <w:pPr>
+        <w:pStyle w:val="Normal"/>
+        <w:jc w:val="both"/>
+        <w:rPr>
+          <w:color w:val="000000"/>
+        </w:rPr>
+      </w:pPr>
+      <w:r>
+        <w:rPr>
+          <w:rFonts w:eastAsia="Times New Roman" w:cs="Times New Roman" w:ascii="Garamond" w:hAnsi="Garamond"/>
+          <w:color w:val="000000"/>
+          <w:kern w:val="0"/>
+          <w:sz w:val="36"/>
+          <w:szCs w:val="36"/>
+          <w:shd w:fill="auto" w:val="clear"/>
+          <w:lang w:val="en-US" w:eastAsia="zh-CN" w:bidi="hi-IN"/>
+        </w:rPr>
+        <w:t>Imediatamente eu mandei uma mensagem no particular para essa garota pedindo que ela se mantivesse calma e afastasse aqueles pensamentos; quaisquer que fossem os problemas dela, eu e outras pessoas poderíamos ajudá-la.</w:t>
+      </w:r>
+    </w:p>
+    <w:p>
+      <w:pPr>
+        <w:pStyle w:val="Normal"/>
+        <w:jc w:val="both"/>
+        <w:rPr>
+          <w:color w:val="000000"/>
+        </w:rPr>
+      </w:pPr>
+      <w:r>
+        <w:rPr>
+          <w:rFonts w:eastAsia="Times New Roman" w:cs="Times New Roman" w:ascii="Garamond" w:hAnsi="Garamond"/>
+          <w:color w:val="000000"/>
+          <w:kern w:val="0"/>
+          <w:sz w:val="36"/>
+          <w:szCs w:val="36"/>
+          <w:shd w:fill="auto" w:val="clear"/>
+          <w:lang w:val="en-US" w:eastAsia="zh-CN" w:bidi="hi-IN"/>
+        </w:rPr>
+        <w:t>Uns 2 dias depois ela me respondeu com bastante relutância nas palavras e disse que estava cansada de sofrer e que queria dar um fim à vida para que esse sofrimento acabasse. De maneira bem sutil eu tentei dizer a ela que tirar a própria vida não colocaria um fim aos seus sofrimentos. Obviamente não falei abertamente o que o Espiritismo nos ensina sobre o suicídio,  mas transmiti a ideia.</w:t>
+      </w:r>
+    </w:p>
+    <w:p>
+      <w:pPr>
+        <w:pStyle w:val="Normal"/>
+        <w:jc w:val="both"/>
+        <w:rPr>
+          <w:color w:val="000000"/>
+        </w:rPr>
+      </w:pPr>
+      <w:r>
+        <w:rPr>
+          <w:color w:val="000000"/>
+        </w:rPr>
+      </w:r>
+    </w:p>
+    <w:p>
+      <w:pPr>
+        <w:pStyle w:val="Normal"/>
+        <w:jc w:val="both"/>
+        <w:rPr>
+          <w:color w:val="000000"/>
+        </w:rPr>
+      </w:pPr>
+      <w:r>
+        <w:rPr>
+          <w:rFonts w:eastAsia="Times New Roman" w:cs="Times New Roman" w:ascii="Garamond" w:hAnsi="Garamond"/>
+          <w:color w:val="000000"/>
+          <w:kern w:val="0"/>
+          <w:sz w:val="36"/>
+          <w:szCs w:val="36"/>
+          <w:shd w:fill="auto" w:val="clear"/>
+          <w:lang w:val="en-US" w:eastAsia="zh-CN" w:bidi="hi-IN"/>
+        </w:rPr>
+        <w:t>Quase todos os dias eu enviava uma mensagem a essa garota querendo saber como ela estava. Durante muito tempo ela ainda se manteve relutante em conversar comigo, mas com o passar do tempo ela se sentiu segura em falar mais abertamente comigo.</w:t>
+      </w:r>
+    </w:p>
+    <w:p>
+      <w:pPr>
+        <w:pStyle w:val="Normal"/>
+        <w:jc w:val="both"/>
+        <w:rPr>
+          <w:color w:val="000000"/>
+        </w:rPr>
+      </w:pPr>
+      <w:r>
+        <w:rPr>
+          <w:color w:val="000000"/>
+        </w:rPr>
+      </w:r>
+    </w:p>
+    <w:p>
+      <w:pPr>
+        <w:pStyle w:val="Normal"/>
+        <w:jc w:val="both"/>
+        <w:rPr>
+          <w:color w:val="000000"/>
+        </w:rPr>
+      </w:pPr>
+      <w:r>
+        <w:rPr>
+          <w:rFonts w:eastAsia="Times New Roman" w:cs="Times New Roman" w:ascii="Garamond" w:hAnsi="Garamond"/>
+          <w:color w:val="000000"/>
+          <w:kern w:val="0"/>
+          <w:sz w:val="36"/>
+          <w:szCs w:val="36"/>
+          <w:shd w:fill="auto" w:val="clear"/>
+          <w:lang w:val="en-US" w:eastAsia="zh-CN" w:bidi="hi-IN"/>
+        </w:rPr>
+        <w:t>Contou-me dos enormes atritos que ela tinha com a mãe, dos problemas que enfrentou por ser acusada de roubo por uma pessoa de quem ela cuidou com muito zelo durante muitos anos e da depressão contra a qual ela lutava constantemente.</w:t>
+      </w:r>
+    </w:p>
+    <w:p>
+      <w:pPr>
+        <w:pStyle w:val="Normal"/>
+        <w:jc w:val="both"/>
+        <w:rPr>
+          <w:color w:val="000000"/>
+        </w:rPr>
+      </w:pPr>
+      <w:r>
+        <w:rPr>
+          <w:color w:val="000000"/>
+        </w:rPr>
+      </w:r>
+    </w:p>
+    <w:p>
+      <w:pPr>
+        <w:pStyle w:val="Normal"/>
+        <w:jc w:val="both"/>
+        <w:rPr>
+          <w:color w:val="000000"/>
+        </w:rPr>
+      </w:pPr>
+      <w:r>
+        <w:rPr>
+          <w:rFonts w:eastAsia="Times New Roman" w:cs="Times New Roman" w:ascii="Garamond" w:hAnsi="Garamond"/>
+          <w:color w:val="000000"/>
+          <w:kern w:val="0"/>
+          <w:sz w:val="36"/>
+          <w:szCs w:val="36"/>
+          <w:shd w:fill="auto" w:val="clear"/>
+          <w:lang w:val="en-US" w:eastAsia="zh-CN" w:bidi="hi-IN"/>
+        </w:rPr>
+        <w:t>Um dia ela abordou o lado espiritual dos problemas dela. Como já tínhamos construído uma certa amizade, contei que sou Espírita, abordei a questão do suicídio e sugeri a ela ler O Livro dos Médiuns. Curiosamente ela me disse que outras pessoas já haviam recomendado essa leitura, mas ela tinha medo de ler o livro. De certo modo, ela tinha medo de disciplinar sua mediunidade - mediunidade essa que era nítida - e  ter contato constante com os espíritos.</w:t>
+      </w:r>
+    </w:p>
+    <w:p>
+      <w:pPr>
+        <w:pStyle w:val="Normal"/>
+        <w:jc w:val="both"/>
+        <w:rPr>
+          <w:color w:val="000000"/>
+        </w:rPr>
+      </w:pPr>
+      <w:r>
+        <w:rPr>
+          <w:color w:val="000000"/>
+        </w:rPr>
+      </w:r>
+    </w:p>
+    <w:p>
+      <w:pPr>
+        <w:pStyle w:val="Normal"/>
+        <w:jc w:val="both"/>
+        <w:rPr>
+          <w:color w:val="000000"/>
+        </w:rPr>
+      </w:pPr>
+      <w:r>
+        <w:rPr>
+          <w:rFonts w:eastAsia="Times New Roman" w:cs="Times New Roman" w:ascii="Garamond" w:hAnsi="Garamond"/>
+          <w:color w:val="000000"/>
+          <w:kern w:val="0"/>
+          <w:sz w:val="36"/>
+          <w:szCs w:val="36"/>
+          <w:shd w:fill="auto" w:val="clear"/>
+          <w:lang w:val="en-US" w:eastAsia="zh-CN" w:bidi="hi-IN"/>
+        </w:rPr>
+        <w:t>Depressão é uma doença terrível. Em um dia a pessoa está bem; no dia seguinte ela está péssima.  Não foi diferente com essa amiga. Os sentimentos dela viviam em uma montanha russa.</w:t>
+      </w:r>
+    </w:p>
+    <w:p>
+      <w:pPr>
+        <w:pStyle w:val="Normal"/>
+        <w:jc w:val="both"/>
+        <w:rPr>
+          <w:color w:val="000000"/>
+        </w:rPr>
+      </w:pPr>
+      <w:r>
+        <w:rPr>
+          <w:color w:val="000000"/>
+        </w:rPr>
+      </w:r>
+    </w:p>
+    <w:p>
+      <w:pPr>
+        <w:pStyle w:val="Normal"/>
+        <w:jc w:val="both"/>
+        <w:rPr>
+          <w:color w:val="000000"/>
+        </w:rPr>
+      </w:pPr>
+      <w:r>
+        <w:rPr>
+          <w:rFonts w:eastAsia="Times New Roman" w:cs="Times New Roman" w:ascii="Garamond" w:hAnsi="Garamond"/>
+          <w:color w:val="000000"/>
+          <w:kern w:val="0"/>
+          <w:sz w:val="36"/>
+          <w:szCs w:val="36"/>
+          <w:shd w:fill="auto" w:val="clear"/>
+          <w:lang w:val="en-US" w:eastAsia="zh-CN" w:bidi="hi-IN"/>
+        </w:rPr>
+        <w:t>Em duas ocasiões eu abri o WhatsApp pela manhã e encontrei mensagens dela se despedindo e dizendo que estava indo embora. Na primeira ocasião ela ingeriu veneno para matar ratos e acetona. Milagrosamente ela não morreu. Causou um enorme estrago na garganta e no estômago, mas sobreviveu.</w:t>
+      </w:r>
+    </w:p>
+    <w:p>
+      <w:pPr>
+        <w:pStyle w:val="Normal"/>
+        <w:jc w:val="both"/>
+        <w:rPr>
+          <w:color w:val="000000"/>
+        </w:rPr>
+      </w:pPr>
+      <w:r>
+        <w:rPr>
+          <w:color w:val="000000"/>
+        </w:rPr>
+      </w:r>
+    </w:p>
+    <w:p>
+      <w:pPr>
+        <w:pStyle w:val="Normal"/>
+        <w:jc w:val="both"/>
+        <w:rPr>
+          <w:color w:val="000000"/>
+        </w:rPr>
+      </w:pPr>
+      <w:r>
+        <w:rPr>
+          <w:rFonts w:eastAsia="Times New Roman" w:cs="Times New Roman" w:ascii="Garamond" w:hAnsi="Garamond"/>
+          <w:color w:val="000000"/>
+          <w:kern w:val="0"/>
+          <w:sz w:val="36"/>
+          <w:szCs w:val="36"/>
+          <w:shd w:fill="auto" w:val="clear"/>
+          <w:lang w:val="en-US" w:eastAsia="zh-CN" w:bidi="hi-IN"/>
+        </w:rPr>
+        <w:t>Na segunda ela tomou uma overdose de remédios e a única coisa que conseguiu foi dormir por quase 48 horas seguidas.</w:t>
+      </w:r>
+    </w:p>
+    <w:p>
+      <w:pPr>
+        <w:pStyle w:val="Normal"/>
+        <w:jc w:val="both"/>
+        <w:rPr>
+          <w:color w:val="000000"/>
+        </w:rPr>
+      </w:pPr>
+      <w:r>
+        <w:rPr>
+          <w:rFonts w:eastAsia="Times New Roman" w:cs="Times New Roman" w:ascii="Garamond" w:hAnsi="Garamond"/>
+          <w:color w:val="000000"/>
+          <w:kern w:val="0"/>
+          <w:sz w:val="36"/>
+          <w:szCs w:val="36"/>
+          <w:shd w:fill="auto" w:val="clear"/>
+          <w:lang w:val="en-US" w:eastAsia="zh-CN" w:bidi="hi-IN"/>
+        </w:rPr>
+        <w:t>Em ambas as situações eu disse a ela "Vê como Deus não quer que você vá embora? Você sobreviveu por milagre. Entenda isso como uma nova oportunidade que Deus está dando a você. Não tente tirar sua vida novamente.</w:t>
+      </w:r>
+    </w:p>
+    <w:p>
+      <w:pPr>
+        <w:pStyle w:val="Normal"/>
+        <w:jc w:val="both"/>
+        <w:rPr>
+          <w:color w:val="000000"/>
+        </w:rPr>
+      </w:pPr>
+      <w:r>
+        <w:rPr>
+          <w:color w:val="000000"/>
+        </w:rPr>
+      </w:r>
+    </w:p>
+    <w:p>
+      <w:pPr>
+        <w:pStyle w:val="Normal"/>
+        <w:jc w:val="both"/>
+        <w:rPr>
+          <w:color w:val="000000"/>
+        </w:rPr>
+      </w:pPr>
+      <w:r>
+        <w:rPr>
+          <w:rFonts w:eastAsia="Times New Roman" w:cs="Times New Roman" w:ascii="Garamond" w:hAnsi="Garamond"/>
+          <w:color w:val="000000"/>
+          <w:kern w:val="0"/>
+          <w:sz w:val="36"/>
+          <w:szCs w:val="36"/>
+          <w:shd w:fill="auto" w:val="clear"/>
+          <w:lang w:val="en-US" w:eastAsia="zh-CN" w:bidi="hi-IN"/>
+        </w:rPr>
+        <w:t>Minha amiga seguiu com seus altos e baixos. Estava administrando os problemas com uma certa tranquilidade até o dia em que teve uma discussão terrível com a mãe dela. Foi uma briga muito, muito feia que o fez o pai dela chorar. E o sofrimento do pai desencadeou na minha amiga um sentimento de culpa gigantesco.</w:t>
+      </w:r>
+    </w:p>
+    <w:p>
+      <w:pPr>
+        <w:pStyle w:val="Normal"/>
+        <w:jc w:val="both"/>
+        <w:rPr>
+          <w:color w:val="000000"/>
+        </w:rPr>
+      </w:pPr>
+      <w:r>
+        <w:rPr>
+          <w:color w:val="000000"/>
+        </w:rPr>
+      </w:r>
+    </w:p>
+    <w:p>
+      <w:pPr>
+        <w:pStyle w:val="Normal"/>
+        <w:jc w:val="both"/>
+        <w:rPr>
+          <w:color w:val="000000"/>
+        </w:rPr>
+      </w:pPr>
+      <w:r>
+        <w:rPr>
+          <w:rFonts w:eastAsia="Times New Roman" w:cs="Times New Roman" w:ascii="Garamond" w:hAnsi="Garamond"/>
+          <w:color w:val="000000"/>
+          <w:kern w:val="0"/>
+          <w:sz w:val="36"/>
+          <w:szCs w:val="36"/>
+          <w:shd w:fill="auto" w:val="clear"/>
+          <w:lang w:val="en-US" w:eastAsia="zh-CN" w:bidi="hi-IN"/>
+        </w:rPr>
+        <w:t>Desde a briga a mãe se recusou a dar dinheiro à filha para comprar remédios e alimento para o coelho. Ela me contou isso com um enorme pesar, muito maior pelo coelho do que pelos remédios. Ela chegou a me dizer que não se importava em ficar sem os remédios, mas estava arrasada por não poder alimentar o coelho.</w:t>
+      </w:r>
+    </w:p>
+    <w:p>
+      <w:pPr>
+        <w:pStyle w:val="Normal"/>
+        <w:jc w:val="both"/>
+        <w:rPr>
+          <w:color w:val="000000"/>
+        </w:rPr>
+      </w:pPr>
+      <w:r>
+        <w:rPr>
+          <w:color w:val="000000"/>
+        </w:rPr>
+      </w:r>
+    </w:p>
+    <w:p>
+      <w:pPr>
+        <w:pStyle w:val="Normal"/>
+        <w:jc w:val="both"/>
+        <w:rPr>
+          <w:color w:val="000000"/>
+        </w:rPr>
+      </w:pPr>
+      <w:r>
+        <w:rPr>
+          <w:rFonts w:eastAsia="Times New Roman" w:cs="Times New Roman" w:ascii="Garamond" w:hAnsi="Garamond"/>
+          <w:color w:val="000000"/>
+          <w:kern w:val="0"/>
+          <w:sz w:val="36"/>
+          <w:szCs w:val="36"/>
+          <w:shd w:fill="auto" w:val="clear"/>
+          <w:lang w:val="en-US" w:eastAsia="zh-CN" w:bidi="hi-IN"/>
+        </w:rPr>
+        <w:t>Dei a ela o dinheiro para comprar as coisas para o coelho e ela se acalmou. Em determinado momento eu percebi que minha amiga tinha sumido. Não mandava  mensagens há vários dias. Embora isso sempre acontecesse nos momentos em que ela não estava bem, dessa vez o sumiço foi maior.</w:t>
+      </w:r>
+    </w:p>
+    <w:p>
+      <w:pPr>
+        <w:pStyle w:val="Normal"/>
+        <w:jc w:val="both"/>
+        <w:rPr>
+          <w:color w:val="000000"/>
+        </w:rPr>
+      </w:pPr>
+      <w:r>
+        <w:rPr>
+          <w:color w:val="000000"/>
+        </w:rPr>
+      </w:r>
+    </w:p>
+    <w:p>
+      <w:pPr>
+        <w:pStyle w:val="Normal"/>
+        <w:jc w:val="both"/>
+        <w:rPr>
+          <w:color w:val="000000"/>
+        </w:rPr>
+      </w:pPr>
+      <w:r>
+        <w:rPr>
+          <w:rFonts w:eastAsia="Times New Roman" w:cs="Times New Roman" w:ascii="Garamond" w:hAnsi="Garamond"/>
+          <w:color w:val="000000"/>
+          <w:kern w:val="0"/>
+          <w:sz w:val="36"/>
+          <w:szCs w:val="36"/>
+          <w:shd w:fill="auto" w:val="clear"/>
+          <w:lang w:val="en-US" w:eastAsia="zh-CN" w:bidi="hi-IN"/>
+        </w:rPr>
+        <w:t>Fiquei muito preocupado e quando vi que ela não acessava o WhatsApp há mais de uma semana, resolvi  tentar descobrir o que havia acontecido. Como eu já tinha colocado o nome dessa amiga várias vezes no livro de irradiação aqui da FEIG, fiz uma pesquisa e encontrei uma nota no obituário da cidade onde ela morava informando que o sepultamento aconteceu no dia seguinte ao último dia em que ela tinha acessado o WhatsApp.</w:t>
+      </w:r>
+    </w:p>
+    <w:p>
+      <w:pPr>
+        <w:pStyle w:val="Normal"/>
+        <w:jc w:val="both"/>
+        <w:rPr>
+          <w:color w:val="000000"/>
+        </w:rPr>
+      </w:pPr>
+      <w:r>
+        <w:rPr>
+          <w:color w:val="000000"/>
+        </w:rPr>
+      </w:r>
+    </w:p>
+    <w:p>
+      <w:pPr>
+        <w:pStyle w:val="Normal"/>
+        <w:jc w:val="both"/>
+        <w:rPr>
+          <w:color w:val="000000"/>
+        </w:rPr>
+      </w:pPr>
+      <w:r>
+        <w:rPr>
+          <w:rFonts w:eastAsia="Times New Roman" w:cs="Times New Roman" w:ascii="Garamond" w:hAnsi="Garamond"/>
+          <w:color w:val="000000"/>
+          <w:kern w:val="0"/>
+          <w:sz w:val="36"/>
+          <w:szCs w:val="36"/>
+          <w:shd w:fill="auto" w:val="clear"/>
+          <w:lang w:val="en-US" w:eastAsia="zh-CN" w:bidi="hi-IN"/>
+        </w:rPr>
+        <w:t>Fui tomado de uma tristeza profunda. Nunca consegui saber se ela realmente tirou a própria vida, mas fiquei pensando que se morássemos próximos um do outro, talvez eu tivesse conseguido ajudá-la mais.</w:t>
+      </w:r>
+    </w:p>
+    <w:p>
+      <w:pPr>
+        <w:pStyle w:val="Normal"/>
+        <w:jc w:val="both"/>
+        <w:rPr>
+          <w:color w:val="000000"/>
+        </w:rPr>
+      </w:pPr>
+      <w:r>
+        <w:rPr>
+          <w:color w:val="000000"/>
+        </w:rPr>
+      </w:r>
+    </w:p>
+    <w:p>
+      <w:pPr>
+        <w:pStyle w:val="Normal"/>
+        <w:jc w:val="both"/>
+        <w:rPr>
+          <w:color w:val="000000"/>
+        </w:rPr>
+      </w:pPr>
+      <w:r>
+        <w:rPr>
+          <w:rFonts w:eastAsia="Times New Roman" w:cs="Times New Roman" w:ascii="Garamond" w:hAnsi="Garamond"/>
+          <w:color w:val="000000"/>
+          <w:kern w:val="0"/>
+          <w:sz w:val="36"/>
+          <w:szCs w:val="36"/>
+          <w:shd w:fill="auto" w:val="clear"/>
+          <w:lang w:val="en-US" w:eastAsia="zh-CN" w:bidi="hi-IN"/>
+        </w:rPr>
+        <w:t xml:space="preserve">Bem, mas onde eu quero chegar com toda essa história? Hoje eu entendo que muitas vezes, o animal torna-se a única fonte de amor e de afeto para uma pessoa. </w:t>
+      </w:r>
+    </w:p>
+    <w:p>
+      <w:pPr>
+        <w:pStyle w:val="Normal"/>
+        <w:jc w:val="both"/>
+        <w:rPr>
+          <w:color w:val="000000"/>
+        </w:rPr>
+      </w:pPr>
+      <w:r>
+        <w:rPr>
+          <w:color w:val="000000"/>
+        </w:rPr>
+      </w:r>
+    </w:p>
+    <w:p>
+      <w:pPr>
+        <w:pStyle w:val="Normal"/>
+        <w:jc w:val="both"/>
+        <w:rPr>
+          <w:color w:val="000000"/>
+        </w:rPr>
+      </w:pPr>
+      <w:r>
+        <w:rPr>
+          <w:rFonts w:eastAsia="Times New Roman" w:cs="Times New Roman" w:ascii="Garamond" w:hAnsi="Garamond"/>
+          <w:color w:val="000000"/>
+          <w:kern w:val="0"/>
+          <w:sz w:val="36"/>
+          <w:szCs w:val="36"/>
+          <w:shd w:fill="auto" w:val="clear"/>
+          <w:lang w:val="en-US" w:eastAsia="zh-CN" w:bidi="hi-IN"/>
+        </w:rPr>
+        <w:t xml:space="preserve">Não é que a pessoa acordou em um determinado dia e decidiu: "A partir de hoje não vou mais conviver com humanos. Só vou me dedicar aos animais". Não é isso. O que acontece é que, por todos os problemas, todas as dificuldades que a pessoa tem nos seus relacionamentos, o animal torna-se o único amigo daquela pessoa. </w:t>
+      </w:r>
+    </w:p>
+    <w:p>
+      <w:pPr>
+        <w:pStyle w:val="Normal"/>
+        <w:jc w:val="both"/>
+        <w:rPr>
+          <w:color w:val="000000"/>
+        </w:rPr>
+      </w:pPr>
+      <w:r>
+        <w:rPr>
+          <w:color w:val="000000"/>
+        </w:rPr>
+      </w:r>
+    </w:p>
+    <w:p>
+      <w:pPr>
+        <w:pStyle w:val="Normal"/>
+        <w:jc w:val="both"/>
+        <w:rPr>
+          <w:color w:val="000000"/>
+        </w:rPr>
+      </w:pPr>
+      <w:r>
+        <w:rPr>
+          <w:rFonts w:eastAsia="Times New Roman" w:cs="Times New Roman" w:ascii="Garamond" w:hAnsi="Garamond"/>
+          <w:color w:val="000000"/>
+          <w:kern w:val="0"/>
+          <w:sz w:val="36"/>
+          <w:szCs w:val="36"/>
+          <w:shd w:fill="auto" w:val="clear"/>
+          <w:lang w:val="en-US" w:eastAsia="zh-CN" w:bidi="hi-IN"/>
+        </w:rPr>
+        <w:t>Por mais estranheza que isso nos cause, a pessoa concentra todos os seus melhores sentimentos no animal. E quando ela o perde, o mundo desaba.</w:t>
+      </w:r>
+    </w:p>
+    <w:p>
+      <w:pPr>
+        <w:pStyle w:val="Normal"/>
+        <w:jc w:val="both"/>
+        <w:rPr>
+          <w:color w:val="000000"/>
+        </w:rPr>
+      </w:pPr>
+      <w:r>
+        <w:rPr>
+          <w:color w:val="000000"/>
+        </w:rPr>
+      </w:r>
+    </w:p>
+    <w:p>
+      <w:pPr>
+        <w:pStyle w:val="Normal"/>
+        <w:jc w:val="both"/>
+        <w:rPr>
+          <w:color w:val="000000"/>
+        </w:rPr>
+      </w:pPr>
+      <w:r>
+        <w:rPr>
+          <w:rFonts w:eastAsia="Times New Roman" w:cs="Times New Roman" w:ascii="Garamond" w:hAnsi="Garamond"/>
+          <w:color w:val="000000"/>
+          <w:kern w:val="0"/>
+          <w:sz w:val="36"/>
+          <w:szCs w:val="36"/>
+          <w:shd w:fill="auto" w:val="clear"/>
+          <w:lang w:val="en-US" w:eastAsia="zh-CN" w:bidi="hi-IN"/>
+        </w:rPr>
+        <w:t>O fato de uma pessoa dedicar mais amor, mais atenção a um animal do que a um familiar ou a outras pessoas, em inúmeras ocasiões ela assim o faz porque o animal é o refúgio sentimental daquela pessoa.</w:t>
+      </w:r>
+    </w:p>
+    <w:p>
+      <w:pPr>
+        <w:pStyle w:val="Normal"/>
+        <w:jc w:val="both"/>
+        <w:rPr>
+          <w:color w:val="000000"/>
+        </w:rPr>
+      </w:pPr>
+      <w:r>
+        <w:rPr>
+          <w:color w:val="000000"/>
+        </w:rPr>
+      </w:r>
+    </w:p>
+    <w:p>
+      <w:pPr>
+        <w:pStyle w:val="Normal"/>
+        <w:jc w:val="both"/>
+        <w:rPr>
+          <w:color w:val="000000"/>
+        </w:rPr>
+      </w:pPr>
+      <w:r>
+        <w:rPr>
+          <w:rFonts w:eastAsia="Times New Roman" w:cs="Times New Roman" w:ascii="Garamond" w:hAnsi="Garamond"/>
+          <w:color w:val="000000"/>
+          <w:kern w:val="0"/>
+          <w:sz w:val="36"/>
+          <w:szCs w:val="36"/>
+          <w:shd w:fill="auto" w:val="clear"/>
+          <w:lang w:val="en-US" w:eastAsia="zh-CN" w:bidi="hi-IN"/>
+        </w:rPr>
+        <w:t>Então, quando virmos uma pessoa com esse comportamento, vale a pena ter um olhar diferente sobre ela. Aquele apego excessivo ao animal pode ser um sinal de que a pessoa sente-se solitária, abandonada, tem graves problemas ao relacionar-se com os outros.</w:t>
+      </w:r>
+    </w:p>
+    <w:p>
+      <w:pPr>
+        <w:pStyle w:val="Normal"/>
+        <w:jc w:val="both"/>
+        <w:rPr>
+          <w:color w:val="000000"/>
+        </w:rPr>
+      </w:pPr>
+      <w:r>
+        <w:rPr>
+          <w:color w:val="000000"/>
+        </w:rPr>
+      </w:r>
+    </w:p>
+    <w:p>
+      <w:pPr>
+        <w:pStyle w:val="Normal"/>
+        <w:jc w:val="both"/>
+        <w:rPr>
+          <w:color w:val="000000"/>
+        </w:rPr>
+      </w:pPr>
+      <w:r>
+        <w:rPr>
+          <w:rFonts w:eastAsia="Times New Roman" w:cs="Times New Roman" w:ascii="Garamond" w:hAnsi="Garamond"/>
+          <w:color w:val="000000"/>
+          <w:kern w:val="0"/>
+          <w:sz w:val="36"/>
+          <w:szCs w:val="36"/>
+          <w:shd w:fill="auto" w:val="clear"/>
+          <w:lang w:val="en-US" w:eastAsia="zh-CN" w:bidi="hi-IN"/>
+        </w:rPr>
+        <w:t>E quem sabe não possamos ser para aquela pessoa, um apoio, um ouvido e um ombro amigos que a auxilie a vencer aquelas dificuldades.</w:t>
+      </w:r>
+    </w:p>
+    <w:p>
+      <w:pPr>
+        <w:pStyle w:val="Normal"/>
+        <w:jc w:val="both"/>
+        <w:rPr>
           <w:color w:val="00A0FC"/>
           <w:sz w:val="36"/>
           <w:szCs w:val="36"/>
         </w:rPr>
-      </w:r>
-    </w:p>
-    <w:p>
-      <w:pPr>
-        <w:pStyle w:val="Normal"/>
-        <w:jc w:val="both"/>
-        <w:rPr>
-          <w:color w:val="000000"/>
-        </w:rPr>
-      </w:pPr>
-      <w:r>
-        <w:rPr>
-          <w:rFonts w:eastAsia="Times New Roman" w:cs="Times New Roman" w:ascii="Garamond" w:hAnsi="Garamond"/>
-          <w:color w:val="000000"/>
-          <w:kern w:val="0"/>
-          <w:sz w:val="36"/>
-          <w:szCs w:val="36"/>
-          <w:shd w:fill="auto" w:val="clear"/>
-          <w:lang w:val="en-US" w:eastAsia="zh-CN" w:bidi="hi-IN"/>
-        </w:rPr>
-        <w:t xml:space="preserve">Eu sempre </w:t>
-      </w:r>
-      <w:r>
-        <w:rPr>
-          <w:rFonts w:eastAsia="Times New Roman" w:cs="Times New Roman" w:ascii="Garamond" w:hAnsi="Garamond"/>
-          <w:color w:val="000000"/>
-          <w:kern w:val="0"/>
-          <w:sz w:val="36"/>
-          <w:szCs w:val="36"/>
-          <w:shd w:fill="auto" w:val="clear"/>
-          <w:lang w:val="en-US" w:eastAsia="zh-CN" w:bidi="hi-IN"/>
-        </w:rPr>
-        <w:t xml:space="preserve">tive um olhar muito crítico sobre a maneira como </w:t>
-      </w:r>
-      <w:r>
-        <w:rPr>
-          <w:rFonts w:eastAsia="Times New Roman" w:cs="Times New Roman" w:ascii="Garamond" w:hAnsi="Garamond"/>
-          <w:color w:val="000000"/>
-          <w:kern w:val="0"/>
-          <w:sz w:val="36"/>
-          <w:szCs w:val="36"/>
-          <w:shd w:fill="auto" w:val="clear"/>
-          <w:lang w:val="en-US" w:eastAsia="zh-CN" w:bidi="hi-IN"/>
-        </w:rPr>
-        <w:t>certas</w:t>
-      </w:r>
-      <w:r>
-        <w:rPr>
-          <w:rFonts w:eastAsia="Times New Roman" w:cs="Times New Roman" w:ascii="Garamond" w:hAnsi="Garamond"/>
-          <w:color w:val="000000"/>
-          <w:kern w:val="0"/>
-          <w:sz w:val="36"/>
-          <w:szCs w:val="36"/>
-          <w:shd w:fill="auto" w:val="clear"/>
-          <w:lang w:val="en-US" w:eastAsia="zh-CN" w:bidi="hi-IN"/>
-        </w:rPr>
-        <w:t xml:space="preserve"> pessoas tratam os animais, quase como se </w:t>
-      </w:r>
-      <w:r>
-        <w:rPr>
-          <w:rFonts w:eastAsia="Times New Roman" w:cs="Times New Roman" w:ascii="Garamond" w:hAnsi="Garamond"/>
-          <w:color w:val="000000"/>
-          <w:kern w:val="0"/>
-          <w:sz w:val="36"/>
-          <w:szCs w:val="36"/>
-          <w:shd w:fill="auto" w:val="clear"/>
-          <w:lang w:val="en-US" w:eastAsia="zh-CN" w:bidi="hi-IN"/>
-        </w:rPr>
-        <w:t xml:space="preserve">eles </w:t>
-      </w:r>
-      <w:r>
-        <w:rPr>
-          <w:rFonts w:eastAsia="Times New Roman" w:cs="Times New Roman" w:ascii="Garamond" w:hAnsi="Garamond"/>
-          <w:color w:val="000000"/>
-          <w:kern w:val="0"/>
-          <w:sz w:val="36"/>
-          <w:szCs w:val="36"/>
-          <w:shd w:fill="auto" w:val="clear"/>
-          <w:lang w:val="en-US" w:eastAsia="zh-CN" w:bidi="hi-IN"/>
-        </w:rPr>
-        <w:t xml:space="preserve">fossem humanos. Eu via nisso um exagero, uma supervalorização do animal. </w:t>
-      </w:r>
-      <w:r>
-        <w:rPr>
-          <w:rFonts w:eastAsia="Times New Roman" w:cs="Times New Roman" w:ascii="Garamond" w:hAnsi="Garamond"/>
-          <w:color w:val="000000"/>
-          <w:kern w:val="0"/>
-          <w:sz w:val="36"/>
-          <w:szCs w:val="36"/>
-          <w:shd w:fill="auto" w:val="clear"/>
-          <w:lang w:val="en-US" w:eastAsia="zh-CN" w:bidi="hi-IN"/>
-        </w:rPr>
-        <w:t>E eu mantive esse olhar até o dia em que meu filho pediu um animal de estimação e eu dei a ele um coelho.</w:t>
-      </w:r>
-    </w:p>
-    <w:p>
-      <w:pPr>
-        <w:pStyle w:val="Normal"/>
-        <w:jc w:val="both"/>
-        <w:rPr>
-          <w:color w:val="000000"/>
-        </w:rPr>
-      </w:pPr>
-      <w:r>
-        <w:rPr>
+      </w:pPr>
+      <w:r>
+        <w:rPr>
+          <w:rFonts w:eastAsia="Times New Roman" w:cs="Times New Roman" w:ascii="Garamond" w:hAnsi="Garamond"/>
           <w:color w:val="00A0FC"/>
-          <w:sz w:val="36"/>
-          <w:szCs w:val="36"/>
-        </w:rPr>
-      </w:r>
-    </w:p>
-    <w:p>
-      <w:pPr>
-        <w:pStyle w:val="Normal"/>
-        <w:jc w:val="both"/>
-        <w:rPr>
-          <w:color w:val="000000"/>
-        </w:rPr>
-      </w:pPr>
-      <w:r>
-        <w:rPr>
-          <w:rFonts w:eastAsia="Times New Roman" w:cs="Times New Roman" w:ascii="Garamond" w:hAnsi="Garamond"/>
-          <w:color w:val="000000"/>
-          <w:kern w:val="0"/>
-          <w:sz w:val="36"/>
-          <w:szCs w:val="36"/>
-          <w:shd w:fill="auto" w:val="clear"/>
-          <w:lang w:val="en-US" w:eastAsia="zh-CN" w:bidi="hi-IN"/>
-        </w:rPr>
-        <w:t>Coelhos são animais muito mal compreendidos. As pessoas os alimentam de maneira errada, prendem em gaiolas, os dentes deles crescem durante toda a vida e por isso eles têm a necessidade constante de roer tudo o que encontram pela frente, são suscetíveis de uma série de doenças e por aí vai. Por isso eu faço parte de alguns grupos de pessoas que também tem coelhos de estimação e nesses grupos nós trocamos informações sobre como cuidar da melhor maneira dos nossos orelhudinhos.</w:t>
-      </w:r>
-    </w:p>
-    <w:p>
-      <w:pPr>
-        <w:pStyle w:val="Normal"/>
-        <w:jc w:val="both"/>
-        <w:rPr>
-          <w:color w:val="000000"/>
-        </w:rPr>
-      </w:pPr>
-      <w:r>
-        <w:rPr>
-          <w:color w:val="00A0FC"/>
-          <w:sz w:val="36"/>
-          <w:szCs w:val="36"/>
-        </w:rPr>
-      </w:r>
-    </w:p>
-    <w:p>
-      <w:pPr>
-        <w:pStyle w:val="Normal"/>
-        <w:jc w:val="both"/>
-        <w:rPr>
-          <w:color w:val="000000"/>
-        </w:rPr>
-      </w:pPr>
-      <w:r>
-        <w:rPr>
-          <w:rFonts w:eastAsia="Times New Roman" w:cs="Times New Roman" w:ascii="Garamond" w:hAnsi="Garamond"/>
-          <w:color w:val="000000"/>
-          <w:kern w:val="0"/>
-          <w:sz w:val="36"/>
-          <w:szCs w:val="36"/>
-          <w:shd w:fill="auto" w:val="clear"/>
-          <w:lang w:val="en-US" w:eastAsia="zh-CN" w:bidi="hi-IN"/>
-        </w:rPr>
-        <w:t>Certo dia, em um desses grupos, uma garota enviou uma mensagem perguntando se alguém estaria disposto a cuidar do coelho dela pois ela queria morrer. Ela tinha decidido tirar a própria vida, mas só faria isso quando o coelho dela estivesse com alguém que fosse cuidar dele tão bem quanto ela cuidava.</w:t>
-      </w:r>
-    </w:p>
-    <w:p>
-      <w:pPr>
-        <w:pStyle w:val="Normal"/>
-        <w:jc w:val="both"/>
-        <w:rPr>
-          <w:color w:val="000000"/>
-        </w:rPr>
-      </w:pPr>
-      <w:r>
-        <w:rPr>
-          <w:color w:val="00A0FC"/>
-          <w:sz w:val="36"/>
-          <w:szCs w:val="36"/>
-        </w:rPr>
-      </w:r>
-    </w:p>
-    <w:p>
-      <w:pPr>
-        <w:pStyle w:val="Normal"/>
-        <w:jc w:val="both"/>
-        <w:rPr>
-          <w:color w:val="000000"/>
-        </w:rPr>
-      </w:pPr>
-      <w:r>
-        <w:rPr>
-          <w:rFonts w:eastAsia="Times New Roman" w:cs="Times New Roman" w:ascii="Garamond" w:hAnsi="Garamond"/>
-          <w:color w:val="000000"/>
-          <w:kern w:val="0"/>
-          <w:sz w:val="36"/>
-          <w:szCs w:val="36"/>
-          <w:shd w:fill="auto" w:val="clear"/>
-          <w:lang w:val="en-US" w:eastAsia="zh-CN" w:bidi="hi-IN"/>
-        </w:rPr>
-        <w:t>Imediatamente eu mandei uma mensagem no particular para essa garota pedindo que ela se mantivesse calma e afastasse aqueles pensamentos; quaisquer que fossem os problemas dela, eu e outras pessoas poderíamos ajudá-la.</w:t>
-      </w:r>
-    </w:p>
-    <w:p>
-      <w:pPr>
-        <w:pStyle w:val="Normal"/>
-        <w:jc w:val="both"/>
-        <w:rPr>
-          <w:color w:val="000000"/>
-        </w:rPr>
-      </w:pPr>
-      <w:r>
-        <w:rPr>
-          <w:rFonts w:eastAsia="Times New Roman" w:cs="Times New Roman" w:ascii="Garamond" w:hAnsi="Garamond"/>
-          <w:color w:val="000000"/>
-          <w:kern w:val="0"/>
-          <w:sz w:val="36"/>
-          <w:szCs w:val="36"/>
-          <w:shd w:fill="auto" w:val="clear"/>
-          <w:lang w:val="en-US" w:eastAsia="zh-CN" w:bidi="hi-IN"/>
-        </w:rPr>
-        <w:t>Uns 2 dias depois ela me respondeu com bastante relutância nas palavras e disse que estava cansada de sofrer e que queria dar um fim à vida para que esse sofrimento acabasse. De maneira bem sutil eu tentei dizer a ela que tirar a própria vida não colocaria um fim aos seus sofrimentos. Obviamente não falei abertamente o que o Espiritismo nos ensina sobre o suicídio,  mas transmiti a ideia.</w:t>
-      </w:r>
-    </w:p>
-    <w:p>
-      <w:pPr>
-        <w:pStyle w:val="Normal"/>
-        <w:jc w:val="both"/>
-        <w:rPr>
-          <w:color w:val="000000"/>
-        </w:rPr>
-      </w:pPr>
-      <w:r>
-        <w:rPr>
-          <w:color w:val="00A0FC"/>
-          <w:sz w:val="36"/>
-          <w:szCs w:val="36"/>
-        </w:rPr>
-      </w:r>
-    </w:p>
-    <w:p>
-      <w:pPr>
-        <w:pStyle w:val="Normal"/>
-        <w:jc w:val="both"/>
-        <w:rPr>
-          <w:color w:val="000000"/>
-        </w:rPr>
-      </w:pPr>
-      <w:r>
-        <w:rPr>
-          <w:rFonts w:eastAsia="Times New Roman" w:cs="Times New Roman" w:ascii="Garamond" w:hAnsi="Garamond"/>
-          <w:color w:val="000000"/>
-          <w:kern w:val="0"/>
-          <w:sz w:val="36"/>
-          <w:szCs w:val="36"/>
-          <w:shd w:fill="auto" w:val="clear"/>
-          <w:lang w:val="en-US" w:eastAsia="zh-CN" w:bidi="hi-IN"/>
-        </w:rPr>
-        <w:t>Quase todos os dias eu enviava uma mensagem a essa garota querendo saber como ela estava. Durante muito tempo ela ainda se manteve relutante em conversar comigo, mas com o passar do tempo ela se sentiu segura em falar mais abertamente comigo.</w:t>
-      </w:r>
-    </w:p>
-    <w:p>
-      <w:pPr>
-        <w:pStyle w:val="Normal"/>
-        <w:jc w:val="both"/>
-        <w:rPr>
-          <w:color w:val="000000"/>
-        </w:rPr>
-      </w:pPr>
-      <w:r>
-        <w:rPr>
-          <w:color w:val="00A0FC"/>
-          <w:sz w:val="36"/>
-          <w:szCs w:val="36"/>
-        </w:rPr>
-      </w:r>
-    </w:p>
-    <w:p>
-      <w:pPr>
-        <w:pStyle w:val="Normal"/>
-        <w:jc w:val="both"/>
-        <w:rPr>
-          <w:color w:val="000000"/>
-        </w:rPr>
-      </w:pPr>
-      <w:r>
-        <w:rPr>
-          <w:rFonts w:eastAsia="Times New Roman" w:cs="Times New Roman" w:ascii="Garamond" w:hAnsi="Garamond"/>
-          <w:color w:val="000000"/>
-          <w:kern w:val="0"/>
-          <w:sz w:val="36"/>
-          <w:szCs w:val="36"/>
-          <w:shd w:fill="auto" w:val="clear"/>
-          <w:lang w:val="en-US" w:eastAsia="zh-CN" w:bidi="hi-IN"/>
-        </w:rPr>
-        <w:t>Contou-me dos enormes atritos que ela tinha com a mãe, dos problemas que enfrentou por ser acusada de roubo por uma pessoa de quem ela cuidou com muito zelo durante muitos anos e da depressão contra a qual ela lutava constantemente.</w:t>
-      </w:r>
-    </w:p>
-    <w:p>
-      <w:pPr>
-        <w:pStyle w:val="Normal"/>
-        <w:jc w:val="both"/>
-        <w:rPr>
-          <w:color w:val="000000"/>
-        </w:rPr>
-      </w:pPr>
-      <w:r>
-        <w:rPr>
-          <w:color w:val="00A0FC"/>
-          <w:sz w:val="36"/>
-          <w:szCs w:val="36"/>
-        </w:rPr>
-      </w:r>
-    </w:p>
-    <w:p>
-      <w:pPr>
-        <w:pStyle w:val="Normal"/>
-        <w:jc w:val="both"/>
-        <w:rPr>
-          <w:color w:val="000000"/>
-        </w:rPr>
-      </w:pPr>
-      <w:r>
-        <w:rPr>
-          <w:rFonts w:eastAsia="Times New Roman" w:cs="Times New Roman" w:ascii="Garamond" w:hAnsi="Garamond"/>
-          <w:color w:val="000000"/>
-          <w:kern w:val="0"/>
-          <w:sz w:val="36"/>
-          <w:szCs w:val="36"/>
-          <w:shd w:fill="auto" w:val="clear"/>
-          <w:lang w:val="en-US" w:eastAsia="zh-CN" w:bidi="hi-IN"/>
-        </w:rPr>
-        <w:t>Um dia ela abordou o lado espiritual dos problemas dela. Como já tínhamos construído uma certa amizade, contei que sou Espírita, abordei a questão do suicídio e sugeri a ela ler O Livro dos Médiuns. Curiosamente ela me disse que outras pessoas já haviam recomendado essa leitura, mas ela tinha medo de ler o livro. De certo modo, ela tinha medo de disciplinar sua mediunidade - mediunidade essa que era nítida - e  ter contato constante com os espíritos.</w:t>
-      </w:r>
-    </w:p>
-    <w:p>
-      <w:pPr>
-        <w:pStyle w:val="Normal"/>
-        <w:jc w:val="both"/>
-        <w:rPr>
-          <w:color w:val="000000"/>
-        </w:rPr>
-      </w:pPr>
-      <w:r>
-        <w:rPr>
-          <w:color w:val="00A0FC"/>
-          <w:sz w:val="36"/>
-          <w:szCs w:val="36"/>
-        </w:rPr>
-      </w:r>
-    </w:p>
-    <w:p>
-      <w:pPr>
-        <w:pStyle w:val="Normal"/>
-        <w:jc w:val="both"/>
-        <w:rPr>
-          <w:color w:val="000000"/>
-        </w:rPr>
-      </w:pPr>
-      <w:r>
-        <w:rPr>
-          <w:rFonts w:eastAsia="Times New Roman" w:cs="Times New Roman" w:ascii="Garamond" w:hAnsi="Garamond"/>
-          <w:color w:val="000000"/>
-          <w:kern w:val="0"/>
-          <w:sz w:val="36"/>
-          <w:szCs w:val="36"/>
-          <w:shd w:fill="auto" w:val="clear"/>
-          <w:lang w:val="en-US" w:eastAsia="zh-CN" w:bidi="hi-IN"/>
-        </w:rPr>
-        <w:t>Depressão é uma doença terrível. Em um dia a pessoa está bem; no dia seguinte ela está péssima.  Não foi diferente com essa amiga. Os sentimentos dela viviam em uma montanha russa.</w:t>
-      </w:r>
-    </w:p>
-    <w:p>
-      <w:pPr>
-        <w:pStyle w:val="Normal"/>
-        <w:jc w:val="both"/>
-        <w:rPr>
-          <w:color w:val="000000"/>
-        </w:rPr>
-      </w:pPr>
-      <w:r>
-        <w:rPr>
-          <w:color w:val="00A0FC"/>
-          <w:sz w:val="36"/>
-          <w:szCs w:val="36"/>
-        </w:rPr>
-      </w:r>
-    </w:p>
-    <w:p>
-      <w:pPr>
-        <w:pStyle w:val="Normal"/>
-        <w:jc w:val="both"/>
-        <w:rPr>
-          <w:color w:val="000000"/>
-        </w:rPr>
-      </w:pPr>
-      <w:r>
-        <w:rPr>
-          <w:rFonts w:eastAsia="Times New Roman" w:cs="Times New Roman" w:ascii="Garamond" w:hAnsi="Garamond"/>
-          <w:color w:val="000000"/>
-          <w:kern w:val="0"/>
-          <w:sz w:val="36"/>
-          <w:szCs w:val="36"/>
-          <w:shd w:fill="auto" w:val="clear"/>
-          <w:lang w:val="en-US" w:eastAsia="zh-CN" w:bidi="hi-IN"/>
-        </w:rPr>
-        <w:t>Em duas ocasiões eu abri o WhatsApp pela manhã e encontrei mensagens dela se despedindo e dizendo que estava indo embora. Na primeira ocasião ela ingeriu veneno para matar ratos e acetona. Milagrosamente ela não morreu. Causou um enorme estrago na garganta e no estômago, mas sobreviveu.</w:t>
-      </w:r>
-    </w:p>
-    <w:p>
-      <w:pPr>
-        <w:pStyle w:val="Normal"/>
-        <w:jc w:val="both"/>
-        <w:rPr>
-          <w:color w:val="000000"/>
-        </w:rPr>
-      </w:pPr>
-      <w:r>
-        <w:rPr>
-          <w:color w:val="00A0FC"/>
-          <w:sz w:val="36"/>
-          <w:szCs w:val="36"/>
-        </w:rPr>
-      </w:r>
-    </w:p>
-    <w:p>
-      <w:pPr>
-        <w:pStyle w:val="Normal"/>
-        <w:jc w:val="both"/>
-        <w:rPr>
-          <w:color w:val="000000"/>
-        </w:rPr>
-      </w:pPr>
-      <w:r>
-        <w:rPr>
-          <w:rFonts w:eastAsia="Times New Roman" w:cs="Times New Roman" w:ascii="Garamond" w:hAnsi="Garamond"/>
-          <w:color w:val="000000"/>
-          <w:kern w:val="0"/>
-          <w:sz w:val="36"/>
-          <w:szCs w:val="36"/>
-          <w:shd w:fill="auto" w:val="clear"/>
-          <w:lang w:val="en-US" w:eastAsia="zh-CN" w:bidi="hi-IN"/>
-        </w:rPr>
-        <w:t>Na segunda ela tomou uma overdose de remédios e a única coisa que conseguiu foi dormir por quase 48 horas seguidas.</w:t>
-      </w:r>
-    </w:p>
-    <w:p>
-      <w:pPr>
-        <w:pStyle w:val="Normal"/>
-        <w:jc w:val="both"/>
-        <w:rPr>
-          <w:color w:val="000000"/>
-        </w:rPr>
-      </w:pPr>
-      <w:r>
-        <w:rPr>
-          <w:rFonts w:eastAsia="Times New Roman" w:cs="Times New Roman" w:ascii="Garamond" w:hAnsi="Garamond"/>
-          <w:color w:val="000000"/>
-          <w:kern w:val="0"/>
-          <w:sz w:val="36"/>
-          <w:szCs w:val="36"/>
-          <w:shd w:fill="auto" w:val="clear"/>
-          <w:lang w:val="en-US" w:eastAsia="zh-CN" w:bidi="hi-IN"/>
-        </w:rPr>
-        <w:t>Em ambas as situações eu disse a ela "Vê como Deus não quer que você vá embora? Você sobreviveu por milagre. Entenda isso como uma nova oportunidade que Deus está dando a você. Não tente tirar sua vida novamente.</w:t>
-      </w:r>
-    </w:p>
-    <w:p>
-      <w:pPr>
-        <w:pStyle w:val="Normal"/>
-        <w:jc w:val="both"/>
-        <w:rPr>
-          <w:color w:val="000000"/>
-        </w:rPr>
-      </w:pPr>
-      <w:r>
-        <w:rPr>
-          <w:color w:val="00A0FC"/>
-          <w:sz w:val="36"/>
-          <w:szCs w:val="36"/>
-        </w:rPr>
-      </w:r>
-    </w:p>
-    <w:p>
-      <w:pPr>
-        <w:pStyle w:val="Normal"/>
-        <w:jc w:val="both"/>
-        <w:rPr>
-          <w:color w:val="000000"/>
-        </w:rPr>
-      </w:pPr>
-      <w:r>
-        <w:rPr>
-          <w:rFonts w:eastAsia="Times New Roman" w:cs="Times New Roman" w:ascii="Garamond" w:hAnsi="Garamond"/>
-          <w:color w:val="000000"/>
-          <w:kern w:val="0"/>
-          <w:sz w:val="36"/>
-          <w:szCs w:val="36"/>
-          <w:shd w:fill="auto" w:val="clear"/>
-          <w:lang w:val="en-US" w:eastAsia="zh-CN" w:bidi="hi-IN"/>
-        </w:rPr>
-        <w:t>Minha amiga seguiu com seus altos e baixos. Estava administrando os problemas com uma certa tranquilidade até o dia em que teve uma discussão terrível com a mãe dela. Foi uma briga muito, muito feia que o fez o pai dela chorar. E o sofrimento do pai desencadeou na minha amiga um sentimento de culpa gigantesco.</w:t>
-      </w:r>
-    </w:p>
-    <w:p>
-      <w:pPr>
-        <w:pStyle w:val="Normal"/>
-        <w:jc w:val="both"/>
-        <w:rPr>
-          <w:color w:val="000000"/>
-        </w:rPr>
-      </w:pPr>
-      <w:r>
-        <w:rPr>
-          <w:color w:val="00A0FC"/>
-          <w:sz w:val="36"/>
-          <w:szCs w:val="36"/>
-        </w:rPr>
-      </w:r>
-    </w:p>
-    <w:p>
-      <w:pPr>
-        <w:pStyle w:val="Normal"/>
-        <w:jc w:val="both"/>
-        <w:rPr>
-          <w:color w:val="000000"/>
-        </w:rPr>
-      </w:pPr>
-      <w:r>
-        <w:rPr>
-          <w:rFonts w:eastAsia="Times New Roman" w:cs="Times New Roman" w:ascii="Garamond" w:hAnsi="Garamond"/>
-          <w:color w:val="000000"/>
-          <w:kern w:val="0"/>
-          <w:sz w:val="36"/>
-          <w:szCs w:val="36"/>
-          <w:shd w:fill="auto" w:val="clear"/>
-          <w:lang w:val="en-US" w:eastAsia="zh-CN" w:bidi="hi-IN"/>
-        </w:rPr>
-        <w:t>Desde a briga a mãe se recusou a dar dinheiro à filha para comprar remédios e alimento para o coelho. Ela me contou isso com um enorme pesar, muito maior pelo coelho do que pelos remédios. Ela chegou a me dizer que não se importava em ficar sem os remédios, mas estava arrasada por não poder alimentar o coelho.</w:t>
-      </w:r>
-    </w:p>
-    <w:p>
-      <w:pPr>
-        <w:pStyle w:val="Normal"/>
-        <w:jc w:val="both"/>
-        <w:rPr>
-          <w:color w:val="000000"/>
-        </w:rPr>
-      </w:pPr>
-      <w:r>
-        <w:rPr>
-          <w:color w:val="00A0FC"/>
-          <w:sz w:val="36"/>
-          <w:szCs w:val="36"/>
-        </w:rPr>
-      </w:r>
-    </w:p>
-    <w:p>
-      <w:pPr>
-        <w:pStyle w:val="Normal"/>
-        <w:jc w:val="both"/>
-        <w:rPr>
-          <w:color w:val="000000"/>
-        </w:rPr>
-      </w:pPr>
-      <w:r>
-        <w:rPr>
-          <w:rFonts w:eastAsia="Times New Roman" w:cs="Times New Roman" w:ascii="Garamond" w:hAnsi="Garamond"/>
-          <w:color w:val="000000"/>
-          <w:kern w:val="0"/>
-          <w:sz w:val="36"/>
-          <w:szCs w:val="36"/>
-          <w:shd w:fill="auto" w:val="clear"/>
-          <w:lang w:val="en-US" w:eastAsia="zh-CN" w:bidi="hi-IN"/>
-        </w:rPr>
-        <w:t>Dei a ela o dinheiro para comprar as coisas para o coelho e ela se acalmou. Em determinado momento eu percebi que minha amiga tinha sumido. Não mandava  mensagens há vários dias. Embora isso sempre acontecesse nos momentos em que ela não estava bem, dessa vez o sumiço foi maior.</w:t>
-      </w:r>
-    </w:p>
-    <w:p>
-      <w:pPr>
-        <w:pStyle w:val="Normal"/>
-        <w:jc w:val="both"/>
-        <w:rPr>
-          <w:color w:val="000000"/>
-        </w:rPr>
-      </w:pPr>
-      <w:r>
-        <w:rPr>
-          <w:color w:val="00A0FC"/>
-          <w:sz w:val="36"/>
-          <w:szCs w:val="36"/>
-        </w:rPr>
-      </w:r>
-    </w:p>
-    <w:p>
-      <w:pPr>
-        <w:pStyle w:val="Normal"/>
-        <w:jc w:val="both"/>
-        <w:rPr>
-          <w:color w:val="000000"/>
-        </w:rPr>
-      </w:pPr>
-      <w:r>
-        <w:rPr>
-          <w:rFonts w:eastAsia="Times New Roman" w:cs="Times New Roman" w:ascii="Garamond" w:hAnsi="Garamond"/>
-          <w:color w:val="000000"/>
-          <w:kern w:val="0"/>
-          <w:sz w:val="36"/>
-          <w:szCs w:val="36"/>
-          <w:shd w:fill="auto" w:val="clear"/>
-          <w:lang w:val="en-US" w:eastAsia="zh-CN" w:bidi="hi-IN"/>
-        </w:rPr>
-        <w:t xml:space="preserve">Fiquei muito preocupado e quando vi que ela não acessava o WhatsApp há mais de uma semana, resolvi  tentar descobrir o que havia acontecido. </w:t>
-      </w:r>
-      <w:r>
-        <w:rPr>
-          <w:rFonts w:eastAsia="Times New Roman" w:cs="Times New Roman" w:ascii="Garamond" w:hAnsi="Garamond"/>
-          <w:color w:val="000000"/>
-          <w:kern w:val="0"/>
-          <w:sz w:val="36"/>
-          <w:szCs w:val="36"/>
-          <w:shd w:fill="auto" w:val="clear"/>
-          <w:lang w:val="en-US" w:eastAsia="zh-CN" w:bidi="hi-IN"/>
-        </w:rPr>
-        <w:t>Como eu já tinha colocado o nome dessa amiga várias vezes no livro de irradiação aqui da FEIG, fiz uma pesquisa e encontrei uma nota no obituário da cidade onde ela morava informando que o sepultamento aconteceu no dia seguinte ao último dia em que ela tinha acessado o WhatsApp.</w:t>
-      </w:r>
-    </w:p>
-    <w:p>
-      <w:pPr>
-        <w:pStyle w:val="Normal"/>
-        <w:jc w:val="both"/>
-        <w:rPr>
-          <w:color w:val="000000"/>
-        </w:rPr>
-      </w:pPr>
-      <w:r>
-        <w:rPr>
-          <w:color w:val="00A0FC"/>
-          <w:sz w:val="36"/>
-          <w:szCs w:val="36"/>
-        </w:rPr>
-      </w:r>
-    </w:p>
-    <w:p>
-      <w:pPr>
-        <w:pStyle w:val="Normal"/>
-        <w:jc w:val="both"/>
-        <w:rPr>
-          <w:color w:val="000000"/>
-        </w:rPr>
-      </w:pPr>
-      <w:r>
-        <w:rPr>
-          <w:rFonts w:eastAsia="Times New Roman" w:cs="Times New Roman" w:ascii="Garamond" w:hAnsi="Garamond"/>
-          <w:color w:val="000000"/>
-          <w:kern w:val="0"/>
-          <w:sz w:val="36"/>
-          <w:szCs w:val="36"/>
-          <w:shd w:fill="auto" w:val="clear"/>
-          <w:lang w:val="en-US" w:eastAsia="zh-CN" w:bidi="hi-IN"/>
-        </w:rPr>
-        <w:t>Fui tomado de uma tristeza profunda. Nunca consegui saber se ela realmente tirou a própria vida, mas fiquei pensando que se morássemos próximos um do outro, talvez eu tivesse conseguido ajudá-la mais.</w:t>
-      </w:r>
-    </w:p>
-    <w:p>
-      <w:pPr>
-        <w:pStyle w:val="Normal"/>
-        <w:jc w:val="both"/>
-        <w:rPr>
-          <w:color w:val="000000"/>
-        </w:rPr>
-      </w:pPr>
-      <w:r>
-        <w:rPr>
-          <w:color w:val="00A0FC"/>
-          <w:sz w:val="36"/>
-          <w:szCs w:val="36"/>
-        </w:rPr>
-      </w:r>
-    </w:p>
-    <w:p>
-      <w:pPr>
-        <w:pStyle w:val="Normal"/>
-        <w:jc w:val="both"/>
-        <w:rPr>
-          <w:color w:val="000000"/>
-        </w:rPr>
-      </w:pPr>
-      <w:r>
-        <w:rPr>
-          <w:rFonts w:eastAsia="Times New Roman" w:cs="Times New Roman" w:ascii="Garamond" w:hAnsi="Garamond"/>
-          <w:color w:val="000000"/>
-          <w:kern w:val="0"/>
-          <w:sz w:val="36"/>
-          <w:szCs w:val="36"/>
-          <w:shd w:fill="auto" w:val="clear"/>
-          <w:lang w:val="en-US" w:eastAsia="zh-CN" w:bidi="hi-IN"/>
-        </w:rPr>
-        <w:t xml:space="preserve">Bem, mas onde eu quero chegar com toda essa história? Hoje eu entendo que muitas vezes, o animal torna-se a única fonte de amor e de afeto para uma pessoa. </w:t>
-      </w:r>
-    </w:p>
-    <w:p>
-      <w:pPr>
-        <w:pStyle w:val="Normal"/>
-        <w:jc w:val="both"/>
-        <w:rPr>
-          <w:color w:val="000000"/>
-        </w:rPr>
-      </w:pPr>
-      <w:r>
-        <w:rPr>
-          <w:color w:val="00A0FC"/>
-          <w:sz w:val="36"/>
-          <w:szCs w:val="36"/>
-        </w:rPr>
-      </w:r>
-    </w:p>
-    <w:p>
-      <w:pPr>
-        <w:pStyle w:val="Normal"/>
-        <w:jc w:val="both"/>
-        <w:rPr>
-          <w:color w:val="000000"/>
-        </w:rPr>
-      </w:pPr>
-      <w:r>
-        <w:rPr>
-          <w:rFonts w:eastAsia="Times New Roman" w:cs="Times New Roman" w:ascii="Garamond" w:hAnsi="Garamond"/>
-          <w:color w:val="000000"/>
-          <w:kern w:val="0"/>
-          <w:sz w:val="36"/>
-          <w:szCs w:val="36"/>
-          <w:shd w:fill="auto" w:val="clear"/>
-          <w:lang w:val="en-US" w:eastAsia="zh-CN" w:bidi="hi-IN"/>
-        </w:rPr>
-        <w:t>Nã</w:t>
-      </w:r>
-      <w:r>
-        <w:rPr>
-          <w:rFonts w:eastAsia="Times New Roman" w:cs="Times New Roman" w:ascii="Garamond" w:hAnsi="Garamond"/>
-          <w:color w:val="000000"/>
-          <w:kern w:val="0"/>
-          <w:sz w:val="36"/>
-          <w:szCs w:val="36"/>
-          <w:shd w:fill="auto" w:val="clear"/>
-          <w:lang w:val="en-US" w:eastAsia="zh-CN" w:bidi="hi-IN"/>
-        </w:rPr>
-        <w:t xml:space="preserve">o é que a pessoa acordou em um determinado dia e decidiu: "A partir de hoje não vou mais conviver com humanos. Só vou me dedicar aos animais". Não é isso. O que acontece é que, por todos os problemas, todas as dificuldades que a pessoa tem nos seus relacionamentos, o animal torna-se o único amigo daquela pessoa. </w:t>
-      </w:r>
-    </w:p>
-    <w:p>
-      <w:pPr>
-        <w:pStyle w:val="Normal"/>
-        <w:jc w:val="both"/>
-        <w:rPr>
-          <w:color w:val="000000"/>
-        </w:rPr>
-      </w:pPr>
-      <w:r>
-        <w:rPr>
-          <w:color w:val="00A0FC"/>
-          <w:sz w:val="36"/>
-          <w:szCs w:val="36"/>
-        </w:rPr>
-      </w:r>
-    </w:p>
-    <w:p>
-      <w:pPr>
-        <w:pStyle w:val="Normal"/>
-        <w:jc w:val="both"/>
-        <w:rPr>
-          <w:color w:val="000000"/>
-        </w:rPr>
-      </w:pPr>
-      <w:r>
-        <w:rPr>
-          <w:rFonts w:eastAsia="Times New Roman" w:cs="Times New Roman" w:ascii="Garamond" w:hAnsi="Garamond"/>
-          <w:color w:val="000000"/>
-          <w:kern w:val="0"/>
-          <w:sz w:val="36"/>
-          <w:szCs w:val="36"/>
-          <w:shd w:fill="auto" w:val="clear"/>
-          <w:lang w:val="en-US" w:eastAsia="zh-CN" w:bidi="hi-IN"/>
-        </w:rPr>
-        <w:t>Por mais estranheza que isso nos cause, a pessoa concentra todos os seus melhores sentimentos no animal. E quando ela o perde, o mundo desaba.</w:t>
-      </w:r>
-    </w:p>
-    <w:p>
-      <w:pPr>
-        <w:pStyle w:val="Normal"/>
-        <w:jc w:val="both"/>
-        <w:rPr>
-          <w:color w:val="000000"/>
-        </w:rPr>
-      </w:pPr>
-      <w:r>
-        <w:rPr>
-          <w:color w:val="00A0FC"/>
-          <w:sz w:val="36"/>
-          <w:szCs w:val="36"/>
-        </w:rPr>
-      </w:r>
-    </w:p>
-    <w:p>
-      <w:pPr>
-        <w:pStyle w:val="Normal"/>
-        <w:jc w:val="both"/>
-        <w:rPr>
-          <w:color w:val="000000"/>
-        </w:rPr>
-      </w:pPr>
-      <w:r>
-        <w:rPr>
-          <w:rFonts w:eastAsia="Times New Roman" w:cs="Times New Roman" w:ascii="Garamond" w:hAnsi="Garamond"/>
-          <w:color w:val="000000"/>
-          <w:kern w:val="0"/>
-          <w:sz w:val="36"/>
-          <w:szCs w:val="36"/>
-          <w:shd w:fill="auto" w:val="clear"/>
-          <w:lang w:val="en-US" w:eastAsia="zh-CN" w:bidi="hi-IN"/>
-        </w:rPr>
-        <w:t>O fato de uma pessoa dedicar mais amor, mais atenção a um animal do que a um familiar ou a outras pessoas, em inúmeras ocasiões ela assim o faz porque o animal é o refúgio sentimental daquela pessoa.</w:t>
-      </w:r>
-    </w:p>
-    <w:p>
-      <w:pPr>
-        <w:pStyle w:val="Normal"/>
-        <w:jc w:val="both"/>
-        <w:rPr>
-          <w:color w:val="000000"/>
-        </w:rPr>
-      </w:pPr>
-      <w:r>
-        <w:rPr>
-          <w:color w:val="00A0FC"/>
-          <w:sz w:val="36"/>
-          <w:szCs w:val="36"/>
-        </w:rPr>
-      </w:r>
-    </w:p>
-    <w:p>
-      <w:pPr>
-        <w:pStyle w:val="Normal"/>
-        <w:jc w:val="both"/>
-        <w:rPr>
-          <w:color w:val="000000"/>
-        </w:rPr>
-      </w:pPr>
-      <w:r>
-        <w:rPr>
-          <w:rFonts w:eastAsia="Times New Roman" w:cs="Times New Roman" w:ascii="Garamond" w:hAnsi="Garamond"/>
-          <w:color w:val="000000"/>
-          <w:kern w:val="0"/>
-          <w:sz w:val="36"/>
-          <w:szCs w:val="36"/>
-          <w:shd w:fill="auto" w:val="clear"/>
-          <w:lang w:val="en-US" w:eastAsia="zh-CN" w:bidi="hi-IN"/>
-        </w:rPr>
-        <w:t>Então, quando virmos uma pessoa com esse comportamento, vale a pena ter um olhar diferente sobre ela. Aquele apego excessivo ao animal pode ser um sinal de que a pessoa sente-se solitária, abandonada, tem graves problemas ao relacionar-se com os outros.</w:t>
-      </w:r>
-    </w:p>
-    <w:p>
-      <w:pPr>
-        <w:pStyle w:val="Normal"/>
-        <w:jc w:val="both"/>
-        <w:rPr>
-          <w:color w:val="000000"/>
-        </w:rPr>
-      </w:pPr>
-      <w:r>
-        <w:rPr>
-          <w:color w:val="00A0FC"/>
-          <w:sz w:val="36"/>
-          <w:szCs w:val="36"/>
-        </w:rPr>
-      </w:r>
-    </w:p>
-    <w:p>
-      <w:pPr>
-        <w:pStyle w:val="Normal"/>
-        <w:jc w:val="both"/>
-        <w:rPr>
-          <w:color w:val="000000"/>
-        </w:rPr>
-      </w:pPr>
-      <w:r>
-        <w:rPr>
-          <w:rFonts w:eastAsia="Times New Roman" w:cs="Times New Roman" w:ascii="Garamond" w:hAnsi="Garamond"/>
-          <w:color w:val="000000"/>
-          <w:kern w:val="0"/>
-          <w:sz w:val="36"/>
-          <w:szCs w:val="36"/>
-          <w:shd w:fill="auto" w:val="clear"/>
-          <w:lang w:val="en-US" w:eastAsia="zh-CN" w:bidi="hi-IN"/>
-        </w:rPr>
-        <w:t>E quem sabe não possamos ser para aquela pessoa, um apoio, um ouvido e um ombro amigos que a auxilie a vencer aquelas dificuldades.</w:t>
-      </w:r>
-    </w:p>
-    <w:p>
-      <w:pPr>
-        <w:pStyle w:val="Normal"/>
-        <w:jc w:val="both"/>
-        <w:rPr>
-          <w:color w:val="00A0FC"/>
-          <w:sz w:val="36"/>
-          <w:szCs w:val="36"/>
-        </w:rPr>
-      </w:pPr>
-      <w:r>
-        <w:rPr>
-          <w:rFonts w:eastAsia="Times New Roman" w:cs="Times New Roman" w:ascii="Garamond" w:hAnsi="Garamond"/>
-          <w:color w:val="00A0FC"/>
-          <w:kern w:val="0"/>
-          <w:sz w:val="36"/>
-          <w:szCs w:val="36"/>
-          <w:shd w:fill="auto" w:val="clear"/>
-          <w:lang w:val="en-US" w:eastAsia="zh-CN" w:bidi="hi-IN"/>
-        </w:rPr>
-        <w:t xml:space="preserve">[ </w:t>
-      </w:r>
-      <w:r>
-        <w:rPr>
-          <w:rFonts w:eastAsia="Times New Roman" w:cs="Times New Roman" w:ascii="Garamond" w:hAnsi="Garamond"/>
-          <w:color w:val="00A0FC"/>
-          <w:kern w:val="0"/>
-          <w:sz w:val="36"/>
-          <w:szCs w:val="36"/>
-          <w:shd w:fill="auto" w:val="clear"/>
-          <w:lang w:val="en-US" w:eastAsia="zh-CN" w:bidi="hi-IN"/>
-        </w:rPr>
-        <w:t>Tópico sobre amor aos animais</w:t>
-      </w:r>
-      <w:r>
-        <w:rPr>
-          <w:rFonts w:eastAsia="Times New Roman" w:cs="Times New Roman" w:ascii="Garamond" w:hAnsi="Garamond"/>
-          <w:color w:val="00A0FC"/>
-          <w:kern w:val="0"/>
-          <w:sz w:val="36"/>
-          <w:szCs w:val="36"/>
-          <w:shd w:fill="auto" w:val="clear"/>
-          <w:lang w:val="en-US" w:eastAsia="zh-CN" w:bidi="hi-IN"/>
-        </w:rPr>
-        <w:t xml:space="preserve"> - Término ]</w:t>
+          <w:kern w:val="0"/>
+          <w:sz w:val="36"/>
+          <w:szCs w:val="36"/>
+          <w:shd w:fill="auto" w:val="clear"/>
+          <w:lang w:val="en-US" w:eastAsia="zh-CN" w:bidi="hi-IN"/>
+        </w:rPr>
+        <w:t>[ Tópico sobre amor aos animais - Término ]</w:t>
       </w:r>
     </w:p>
     <w:p>
@@ -6695,7 +7036,7 @@
         <w:bCs/>
         <w:rFonts w:ascii="Garamond" w:hAnsi="Garamond"/>
       </w:rPr>
-      <w:t>30</w:t>
+      <w:t>31</w:t>
     </w:r>
     <w:r>
       <w:rPr>
@@ -7942,6 +8283,417 @@
     </w:lvl>
   </w:abstractNum>
   <w:abstractNum w:abstractNumId="10">
+    <w:lvl w:ilvl="0">
+      <w:start w:val="1"/>
+      <w:numFmt w:val="bullet"/>
+      <w:lvlText w:val=""/>
+      <w:lvlJc w:val="left"/>
+      <w:pPr>
+        <w:tabs>
+          <w:tab w:val="num" w:pos="720"/>
+        </w:tabs>
+        <w:ind w:left="720" w:hanging="360"/>
+      </w:pPr>
+      <w:rPr>
+        <w:rFonts w:ascii="Symbol" w:hAnsi="Symbol" w:cs="Symbol" w:hint="default"/>
+      </w:rPr>
+    </w:lvl>
+    <w:lvl w:ilvl="1">
+      <w:start w:val="1"/>
+      <w:numFmt w:val="bullet"/>
+      <w:lvlText w:val="◦"/>
+      <w:lvlJc w:val="left"/>
+      <w:pPr>
+        <w:tabs>
+          <w:tab w:val="num" w:pos="1080"/>
+        </w:tabs>
+        <w:ind w:left="1080" w:hanging="360"/>
+      </w:pPr>
+      <w:rPr>
+        <w:rFonts w:ascii="OpenSymbol" w:hAnsi="OpenSymbol" w:cs="OpenSymbol" w:hint="default"/>
+      </w:rPr>
+    </w:lvl>
+    <w:lvl w:ilvl="2">
+      <w:start w:val="1"/>
+      <w:numFmt w:val="bullet"/>
+      <w:lvlText w:val="▪"/>
+      <w:lvlJc w:val="left"/>
+      <w:pPr>
+        <w:tabs>
+          <w:tab w:val="num" w:pos="1440"/>
+        </w:tabs>
+        <w:ind w:left="1440" w:hanging="360"/>
+      </w:pPr>
+      <w:rPr>
+        <w:rFonts w:ascii="OpenSymbol" w:hAnsi="OpenSymbol" w:cs="OpenSymbol" w:hint="default"/>
+      </w:rPr>
+    </w:lvl>
+    <w:lvl w:ilvl="3">
+      <w:start w:val="1"/>
+      <w:numFmt w:val="bullet"/>
+      <w:lvlText w:val=""/>
+      <w:lvlJc w:val="left"/>
+      <w:pPr>
+        <w:tabs>
+          <w:tab w:val="num" w:pos="1800"/>
+        </w:tabs>
+        <w:ind w:left="1800" w:hanging="360"/>
+      </w:pPr>
+      <w:rPr>
+        <w:rFonts w:ascii="Symbol" w:hAnsi="Symbol" w:cs="Symbol" w:hint="default"/>
+      </w:rPr>
+    </w:lvl>
+    <w:lvl w:ilvl="4">
+      <w:start w:val="1"/>
+      <w:numFmt w:val="bullet"/>
+      <w:lvlText w:val="◦"/>
+      <w:lvlJc w:val="left"/>
+      <w:pPr>
+        <w:tabs>
+          <w:tab w:val="num" w:pos="2160"/>
+        </w:tabs>
+        <w:ind w:left="2160" w:hanging="360"/>
+      </w:pPr>
+      <w:rPr>
+        <w:rFonts w:ascii="OpenSymbol" w:hAnsi="OpenSymbol" w:cs="OpenSymbol" w:hint="default"/>
+      </w:rPr>
+    </w:lvl>
+    <w:lvl w:ilvl="5">
+      <w:start w:val="1"/>
+      <w:numFmt w:val="bullet"/>
+      <w:lvlText w:val="▪"/>
+      <w:lvlJc w:val="left"/>
+      <w:pPr>
+        <w:tabs>
+          <w:tab w:val="num" w:pos="2520"/>
+        </w:tabs>
+        <w:ind w:left="2520" w:hanging="360"/>
+      </w:pPr>
+      <w:rPr>
+        <w:rFonts w:ascii="OpenSymbol" w:hAnsi="OpenSymbol" w:cs="OpenSymbol" w:hint="default"/>
+      </w:rPr>
+    </w:lvl>
+    <w:lvl w:ilvl="6">
+      <w:start w:val="1"/>
+      <w:numFmt w:val="bullet"/>
+      <w:lvlText w:val=""/>
+      <w:lvlJc w:val="left"/>
+      <w:pPr>
+        <w:tabs>
+          <w:tab w:val="num" w:pos="2880"/>
+        </w:tabs>
+        <w:ind w:left="2880" w:hanging="360"/>
+      </w:pPr>
+      <w:rPr>
+        <w:rFonts w:ascii="Symbol" w:hAnsi="Symbol" w:cs="Symbol" w:hint="default"/>
+      </w:rPr>
+    </w:lvl>
+    <w:lvl w:ilvl="7">
+      <w:start w:val="1"/>
+      <w:numFmt w:val="bullet"/>
+      <w:lvlText w:val="◦"/>
+      <w:lvlJc w:val="left"/>
+      <w:pPr>
+        <w:tabs>
+          <w:tab w:val="num" w:pos="3240"/>
+        </w:tabs>
+        <w:ind w:left="3240" w:hanging="360"/>
+      </w:pPr>
+      <w:rPr>
+        <w:rFonts w:ascii="OpenSymbol" w:hAnsi="OpenSymbol" w:cs="OpenSymbol" w:hint="default"/>
+      </w:rPr>
+    </w:lvl>
+    <w:lvl w:ilvl="8">
+      <w:start w:val="1"/>
+      <w:numFmt w:val="bullet"/>
+      <w:lvlText w:val="▪"/>
+      <w:lvlJc w:val="left"/>
+      <w:pPr>
+        <w:tabs>
+          <w:tab w:val="num" w:pos="3600"/>
+        </w:tabs>
+        <w:ind w:left="3600" w:hanging="360"/>
+      </w:pPr>
+      <w:rPr>
+        <w:rFonts w:ascii="OpenSymbol" w:hAnsi="OpenSymbol" w:cs="OpenSymbol" w:hint="default"/>
+      </w:rPr>
+    </w:lvl>
+  </w:abstractNum>
+  <w:abstractNum w:abstractNumId="11">
+    <w:lvl w:ilvl="0">
+      <w:start w:val="1"/>
+      <w:numFmt w:val="bullet"/>
+      <w:lvlText w:val=""/>
+      <w:lvlJc w:val="left"/>
+      <w:pPr>
+        <w:tabs>
+          <w:tab w:val="num" w:pos="720"/>
+        </w:tabs>
+        <w:ind w:left="720" w:hanging="360"/>
+      </w:pPr>
+      <w:rPr>
+        <w:rFonts w:ascii="Symbol" w:hAnsi="Symbol" w:cs="Symbol" w:hint="default"/>
+      </w:rPr>
+    </w:lvl>
+    <w:lvl w:ilvl="1">
+      <w:start w:val="1"/>
+      <w:numFmt w:val="bullet"/>
+      <w:lvlText w:val="◦"/>
+      <w:lvlJc w:val="left"/>
+      <w:pPr>
+        <w:tabs>
+          <w:tab w:val="num" w:pos="1080"/>
+        </w:tabs>
+        <w:ind w:left="1080" w:hanging="360"/>
+      </w:pPr>
+      <w:rPr>
+        <w:rFonts w:ascii="OpenSymbol" w:hAnsi="OpenSymbol" w:cs="OpenSymbol" w:hint="default"/>
+      </w:rPr>
+    </w:lvl>
+    <w:lvl w:ilvl="2">
+      <w:start w:val="1"/>
+      <w:numFmt w:val="bullet"/>
+      <w:lvlText w:val="▪"/>
+      <w:lvlJc w:val="left"/>
+      <w:pPr>
+        <w:tabs>
+          <w:tab w:val="num" w:pos="1440"/>
+        </w:tabs>
+        <w:ind w:left="1440" w:hanging="360"/>
+      </w:pPr>
+      <w:rPr>
+        <w:rFonts w:ascii="OpenSymbol" w:hAnsi="OpenSymbol" w:cs="OpenSymbol" w:hint="default"/>
+      </w:rPr>
+    </w:lvl>
+    <w:lvl w:ilvl="3">
+      <w:start w:val="1"/>
+      <w:numFmt w:val="bullet"/>
+      <w:lvlText w:val=""/>
+      <w:lvlJc w:val="left"/>
+      <w:pPr>
+        <w:tabs>
+          <w:tab w:val="num" w:pos="1800"/>
+        </w:tabs>
+        <w:ind w:left="1800" w:hanging="360"/>
+      </w:pPr>
+      <w:rPr>
+        <w:rFonts w:ascii="Symbol" w:hAnsi="Symbol" w:cs="Symbol" w:hint="default"/>
+      </w:rPr>
+    </w:lvl>
+    <w:lvl w:ilvl="4">
+      <w:start w:val="1"/>
+      <w:numFmt w:val="bullet"/>
+      <w:lvlText w:val="◦"/>
+      <w:lvlJc w:val="left"/>
+      <w:pPr>
+        <w:tabs>
+          <w:tab w:val="num" w:pos="2160"/>
+        </w:tabs>
+        <w:ind w:left="2160" w:hanging="360"/>
+      </w:pPr>
+      <w:rPr>
+        <w:rFonts w:ascii="OpenSymbol" w:hAnsi="OpenSymbol" w:cs="OpenSymbol" w:hint="default"/>
+      </w:rPr>
+    </w:lvl>
+    <w:lvl w:ilvl="5">
+      <w:start w:val="1"/>
+      <w:numFmt w:val="bullet"/>
+      <w:lvlText w:val="▪"/>
+      <w:lvlJc w:val="left"/>
+      <w:pPr>
+        <w:tabs>
+          <w:tab w:val="num" w:pos="2520"/>
+        </w:tabs>
+        <w:ind w:left="2520" w:hanging="360"/>
+      </w:pPr>
+      <w:rPr>
+        <w:rFonts w:ascii="OpenSymbol" w:hAnsi="OpenSymbol" w:cs="OpenSymbol" w:hint="default"/>
+      </w:rPr>
+    </w:lvl>
+    <w:lvl w:ilvl="6">
+      <w:start w:val="1"/>
+      <w:numFmt w:val="bullet"/>
+      <w:lvlText w:val=""/>
+      <w:lvlJc w:val="left"/>
+      <w:pPr>
+        <w:tabs>
+          <w:tab w:val="num" w:pos="2880"/>
+        </w:tabs>
+        <w:ind w:left="2880" w:hanging="360"/>
+      </w:pPr>
+      <w:rPr>
+        <w:rFonts w:ascii="Symbol" w:hAnsi="Symbol" w:cs="Symbol" w:hint="default"/>
+      </w:rPr>
+    </w:lvl>
+    <w:lvl w:ilvl="7">
+      <w:start w:val="1"/>
+      <w:numFmt w:val="bullet"/>
+      <w:lvlText w:val="◦"/>
+      <w:lvlJc w:val="left"/>
+      <w:pPr>
+        <w:tabs>
+          <w:tab w:val="num" w:pos="3240"/>
+        </w:tabs>
+        <w:ind w:left="3240" w:hanging="360"/>
+      </w:pPr>
+      <w:rPr>
+        <w:rFonts w:ascii="OpenSymbol" w:hAnsi="OpenSymbol" w:cs="OpenSymbol" w:hint="default"/>
+      </w:rPr>
+    </w:lvl>
+    <w:lvl w:ilvl="8">
+      <w:start w:val="1"/>
+      <w:numFmt w:val="bullet"/>
+      <w:lvlText w:val="▪"/>
+      <w:lvlJc w:val="left"/>
+      <w:pPr>
+        <w:tabs>
+          <w:tab w:val="num" w:pos="3600"/>
+        </w:tabs>
+        <w:ind w:left="3600" w:hanging="360"/>
+      </w:pPr>
+      <w:rPr>
+        <w:rFonts w:ascii="OpenSymbol" w:hAnsi="OpenSymbol" w:cs="OpenSymbol" w:hint="default"/>
+      </w:rPr>
+    </w:lvl>
+  </w:abstractNum>
+  <w:abstractNum w:abstractNumId="12">
+    <w:lvl w:ilvl="0">
+      <w:start w:val="1"/>
+      <w:numFmt w:val="bullet"/>
+      <w:lvlText w:val=""/>
+      <w:lvlJc w:val="left"/>
+      <w:pPr>
+        <w:tabs>
+          <w:tab w:val="num" w:pos="720"/>
+        </w:tabs>
+        <w:ind w:left="720" w:hanging="360"/>
+      </w:pPr>
+      <w:rPr>
+        <w:rFonts w:ascii="Symbol" w:hAnsi="Symbol" w:cs="Symbol" w:hint="default"/>
+      </w:rPr>
+    </w:lvl>
+    <w:lvl w:ilvl="1">
+      <w:start w:val="1"/>
+      <w:numFmt w:val="bullet"/>
+      <w:lvlText w:val="◦"/>
+      <w:lvlJc w:val="left"/>
+      <w:pPr>
+        <w:tabs>
+          <w:tab w:val="num" w:pos="1080"/>
+        </w:tabs>
+        <w:ind w:left="1080" w:hanging="360"/>
+      </w:pPr>
+      <w:rPr>
+        <w:rFonts w:ascii="OpenSymbol" w:hAnsi="OpenSymbol" w:cs="OpenSymbol" w:hint="default"/>
+      </w:rPr>
+    </w:lvl>
+    <w:lvl w:ilvl="2">
+      <w:start w:val="1"/>
+      <w:numFmt w:val="bullet"/>
+      <w:lvlText w:val="▪"/>
+      <w:lvlJc w:val="left"/>
+      <w:pPr>
+        <w:tabs>
+          <w:tab w:val="num" w:pos="1440"/>
+        </w:tabs>
+        <w:ind w:left="1440" w:hanging="360"/>
+      </w:pPr>
+      <w:rPr>
+        <w:rFonts w:ascii="OpenSymbol" w:hAnsi="OpenSymbol" w:cs="OpenSymbol" w:hint="default"/>
+      </w:rPr>
+    </w:lvl>
+    <w:lvl w:ilvl="3">
+      <w:start w:val="1"/>
+      <w:numFmt w:val="bullet"/>
+      <w:lvlText w:val=""/>
+      <w:lvlJc w:val="left"/>
+      <w:pPr>
+        <w:tabs>
+          <w:tab w:val="num" w:pos="1800"/>
+        </w:tabs>
+        <w:ind w:left="1800" w:hanging="360"/>
+      </w:pPr>
+      <w:rPr>
+        <w:rFonts w:ascii="Symbol" w:hAnsi="Symbol" w:cs="Symbol" w:hint="default"/>
+      </w:rPr>
+    </w:lvl>
+    <w:lvl w:ilvl="4">
+      <w:start w:val="1"/>
+      <w:numFmt w:val="bullet"/>
+      <w:lvlText w:val="◦"/>
+      <w:lvlJc w:val="left"/>
+      <w:pPr>
+        <w:tabs>
+          <w:tab w:val="num" w:pos="2160"/>
+        </w:tabs>
+        <w:ind w:left="2160" w:hanging="360"/>
+      </w:pPr>
+      <w:rPr>
+        <w:rFonts w:ascii="OpenSymbol" w:hAnsi="OpenSymbol" w:cs="OpenSymbol" w:hint="default"/>
+      </w:rPr>
+    </w:lvl>
+    <w:lvl w:ilvl="5">
+      <w:start w:val="1"/>
+      <w:numFmt w:val="bullet"/>
+      <w:lvlText w:val="▪"/>
+      <w:lvlJc w:val="left"/>
+      <w:pPr>
+        <w:tabs>
+          <w:tab w:val="num" w:pos="2520"/>
+        </w:tabs>
+        <w:ind w:left="2520" w:hanging="360"/>
+      </w:pPr>
+      <w:rPr>
+        <w:rFonts w:ascii="OpenSymbol" w:hAnsi="OpenSymbol" w:cs="OpenSymbol" w:hint="default"/>
+      </w:rPr>
+    </w:lvl>
+    <w:lvl w:ilvl="6">
+      <w:start w:val="1"/>
+      <w:numFmt w:val="bullet"/>
+      <w:lvlText w:val=""/>
+      <w:lvlJc w:val="left"/>
+      <w:pPr>
+        <w:tabs>
+          <w:tab w:val="num" w:pos="2880"/>
+        </w:tabs>
+        <w:ind w:left="2880" w:hanging="360"/>
+      </w:pPr>
+      <w:rPr>
+        <w:rFonts w:ascii="Symbol" w:hAnsi="Symbol" w:cs="Symbol" w:hint="default"/>
+      </w:rPr>
+    </w:lvl>
+    <w:lvl w:ilvl="7">
+      <w:start w:val="1"/>
+      <w:numFmt w:val="bullet"/>
+      <w:lvlText w:val="◦"/>
+      <w:lvlJc w:val="left"/>
+      <w:pPr>
+        <w:tabs>
+          <w:tab w:val="num" w:pos="3240"/>
+        </w:tabs>
+        <w:ind w:left="3240" w:hanging="360"/>
+      </w:pPr>
+      <w:rPr>
+        <w:rFonts w:ascii="OpenSymbol" w:hAnsi="OpenSymbol" w:cs="OpenSymbol" w:hint="default"/>
+      </w:rPr>
+    </w:lvl>
+    <w:lvl w:ilvl="8">
+      <w:start w:val="1"/>
+      <w:numFmt w:val="bullet"/>
+      <w:lvlText w:val="▪"/>
+      <w:lvlJc w:val="left"/>
+      <w:pPr>
+        <w:tabs>
+          <w:tab w:val="num" w:pos="3600"/>
+        </w:tabs>
+        <w:ind w:left="3600" w:hanging="360"/>
+      </w:pPr>
+      <w:rPr>
+        <w:rFonts w:ascii="OpenSymbol" w:hAnsi="OpenSymbol" w:cs="OpenSymbol" w:hint="default"/>
+      </w:rPr>
+    </w:lvl>
+  </w:abstractNum>
+  <w:abstractNum w:abstractNumId="13">
     <w:lvl w:ilvl="0">
       <w:start w:val="1"/>
       <w:numFmt w:val="none"/>
@@ -8089,6 +8841,15 @@
   </w:num>
   <w:num w:numId="10">
     <w:abstractNumId w:val="10"/>
+  </w:num>
+  <w:num w:numId="11">
+    <w:abstractNumId w:val="11"/>
+  </w:num>
+  <w:num w:numId="12">
+    <w:abstractNumId w:val="12"/>
+  </w:num>
+  <w:num w:numId="13">
+    <w:abstractNumId w:val="13"/>
   </w:num>
 </w:numbering>
 </file>

</xml_diff>

<commit_message>
16/11/2025 - 17:10 h
</commit_message>
<xml_diff>
--- a/O mandamento maior/O Mandamento Maior.docx
+++ b/O mandamento maior/O Mandamento Maior.docx
@@ -2077,31 +2077,7 @@
           <w:shd w:fill="auto" w:val="clear"/>
           <w:lang w:val="en-US" w:eastAsia="zh-CN" w:bidi="hi-IN"/>
         </w:rPr>
-        <w:t xml:space="preserve">[ </w:t>
-      </w:r>
-      <w:r>
-        <w:rPr>
-          <w:rFonts w:eastAsia="Times New Roman" w:cs="Times New Roman" w:ascii="Garamond" w:hAnsi="Garamond"/>
-          <w:color w:val="00A0FC"/>
-          <w:kern w:val="0"/>
-          <w:sz w:val="36"/>
-          <w:szCs w:val="36"/>
-          <w:shd w:fill="auto" w:val="clear"/>
-          <w:lang w:val="en-US" w:eastAsia="zh-CN" w:bidi="hi-IN"/>
-        </w:rPr>
-        <w:t xml:space="preserve">Anotações feitas do capítulo XI </w:t>
-      </w:r>
-      <w:r>
-        <w:rPr>
-          <w:rFonts w:eastAsia="Times New Roman" w:cs="Times New Roman" w:ascii="Garamond" w:hAnsi="Garamond"/>
-          <w:color w:val="00A0FC"/>
-          <w:kern w:val="0"/>
-          <w:sz w:val="36"/>
-          <w:szCs w:val="36"/>
-          <w:shd w:fill="auto" w:val="clear"/>
-          <w:lang w:val="en-US" w:eastAsia="zh-CN" w:bidi="hi-IN"/>
-        </w:rPr>
-        <w:t>- Início ]</w:t>
+        <w:t>[ Anotações feitas do capítulo XI - Início ]</w:t>
       </w:r>
     </w:p>
     <w:p>
@@ -2340,19 +2316,7 @@
           <w:shd w:fill="auto" w:val="clear"/>
           <w:lang w:val="en-US" w:eastAsia="zh-CN" w:bidi="hi-IN"/>
         </w:rPr>
-        <w:t>todos nós temos algumas dessas virtudes, mas para a maioria de nós elas não estão com</w:t>
-      </w:r>
-      <w:r>
-        <w:rPr>
-          <w:rFonts w:eastAsia="Times New Roman" w:cs="Times New Roman" w:ascii="Garamond" w:hAnsi="Garamond"/>
-          <w:color w:val="000000"/>
-          <w:kern w:val="0"/>
-          <w:sz w:val="36"/>
-          <w:szCs w:val="36"/>
-          <w:shd w:fill="auto" w:val="clear"/>
-          <w:lang w:val="en-US" w:eastAsia="zh-CN" w:bidi="hi-IN"/>
-        </w:rPr>
-        <w:t>pletamente desenvolvidas. Isso é natural considerando o atual estágio evolutivo em que nos encontramos;</w:t>
+        <w:t>todos nós temos algumas dessas virtudes, mas para a maioria de nós elas não estão completamente desenvolvidas. Isso é natural considerando o atual estágio evolutivo em que nos encontramos;</w:t>
       </w:r>
     </w:p>
     <w:p>
@@ -2445,19 +2409,7 @@
           <w:shd w:fill="auto" w:val="clear"/>
           <w:lang w:val="en-US" w:eastAsia="zh-CN" w:bidi="hi-IN"/>
         </w:rPr>
-        <w:t xml:space="preserve">Jesus é nosso Mestre, guia e modelo. Ele possui todas as virtudes humanas em seu grau máximo. Por isso Ele ama a Deus e a todos nós em plenitude. Também por isso Ele nos disse que o mandamento maior encerra em si toda a lei e </w:t>
-      </w:r>
-      <w:r>
-        <w:rPr>
-          <w:rFonts w:eastAsia="Times New Roman" w:cs="Times New Roman" w:ascii="Garamond" w:hAnsi="Garamond"/>
-          <w:color w:val="000000"/>
-          <w:kern w:val="0"/>
-          <w:sz w:val="36"/>
-          <w:szCs w:val="36"/>
-          <w:shd w:fill="auto" w:val="clear"/>
-          <w:lang w:val="en-US" w:eastAsia="zh-CN" w:bidi="hi-IN"/>
-        </w:rPr>
-        <w:t>todos os profetas;</w:t>
+        <w:t>Jesus é nosso Mestre, guia e modelo. Ele possui todas as virtudes humanas em seu grau máximo. Por isso Ele ama a Deus e a todos nós em plenitude. Também por isso Ele nos disse que o mandamento maior encerra em si toda a lei e todos os profetas;</w:t>
       </w:r>
     </w:p>
     <w:p>
@@ -2580,6 +2532,10 @@
     <w:p>
       <w:pPr>
         <w:pStyle w:val="Normal"/>
+        <w:numPr>
+          <w:ilvl w:val="0"/>
+          <w:numId w:val="12"/>
+        </w:numPr>
         <w:jc w:val="both"/>
         <w:rPr>
           <w:rFonts w:ascii="Garamond" w:hAnsi="Garamond" w:eastAsia="Times New Roman" w:cs="Times New Roman"/>
@@ -2601,6 +2557,715 @@
           <w:shd w:fill="auto" w:val="clear"/>
           <w:lang w:val="en-US" w:eastAsia="zh-CN" w:bidi="hi-IN"/>
         </w:rPr>
+        <w:t>enfatizar a diferença que existe entre "não fazer aos outros o que não queremos que eles nos façam" e "fazer aos outros o que queremos que eles nos façam". A primeira condição nos coloca numa situação de inatividade; a segunda nos torna agentes do bem;</w:t>
+      </w:r>
+    </w:p>
+    <w:p>
+      <w:pPr>
+        <w:pStyle w:val="Normal"/>
+        <w:numPr>
+          <w:ilvl w:val="0"/>
+          <w:numId w:val="12"/>
+        </w:numPr>
+        <w:jc w:val="both"/>
+        <w:rPr>
+          <w:rFonts w:ascii="Garamond" w:hAnsi="Garamond" w:eastAsia="Times New Roman" w:cs="Times New Roman"/>
+          <w:color w:val="000000"/>
+          <w:kern w:val="0"/>
+          <w:sz w:val="36"/>
+          <w:szCs w:val="36"/>
+          <w:shd w:fill="auto" w:val="clear"/>
+          <w:lang w:val="en-US" w:eastAsia="zh-CN" w:bidi="hi-IN"/>
+        </w:rPr>
+      </w:pPr>
+      <w:r>
+        <w:rPr>
+          <w:rFonts w:eastAsia="Times New Roman" w:cs="Times New Roman" w:ascii="Garamond" w:hAnsi="Garamond"/>
+          <w:color w:val="000000"/>
+          <w:kern w:val="0"/>
+          <w:sz w:val="36"/>
+          <w:szCs w:val="36"/>
+          <w:shd w:fill="auto" w:val="clear"/>
+          <w:lang w:val="en-US" w:eastAsia="zh-CN" w:bidi="hi-IN"/>
+        </w:rPr>
+        <w:t>vivemos tempos difíceis, turbulentos. Há muito egoísmo, muitos corações endurecidos. Tais corações somente podem sensibilizados pelo amor verdadeiro. Ainda que eles insistam em permanecer na frieza e na indiferença, a seu tempo todos serão convertidos;</w:t>
+      </w:r>
+    </w:p>
+    <w:p>
+      <w:pPr>
+        <w:pStyle w:val="Normal"/>
+        <w:numPr>
+          <w:ilvl w:val="0"/>
+          <w:numId w:val="12"/>
+        </w:numPr>
+        <w:jc w:val="both"/>
+        <w:rPr>
+          <w:rFonts w:ascii="Garamond" w:hAnsi="Garamond" w:eastAsia="Times New Roman" w:cs="Times New Roman"/>
+          <w:color w:val="000000"/>
+          <w:kern w:val="0"/>
+          <w:sz w:val="36"/>
+          <w:szCs w:val="36"/>
+          <w:shd w:fill="auto" w:val="clear"/>
+          <w:lang w:val="en-US" w:eastAsia="zh-CN" w:bidi="hi-IN"/>
+        </w:rPr>
+      </w:pPr>
+      <w:r>
+        <w:rPr>
+          <w:rFonts w:eastAsia="Times New Roman" w:cs="Times New Roman" w:ascii="Garamond" w:hAnsi="Garamond"/>
+          <w:color w:val="000000"/>
+          <w:kern w:val="0"/>
+          <w:sz w:val="36"/>
+          <w:szCs w:val="36"/>
+          <w:shd w:fill="auto" w:val="clear"/>
+          <w:lang w:val="en-US" w:eastAsia="zh-CN" w:bidi="hi-IN"/>
+        </w:rPr>
+        <w:t>portanto, se desejamos transformar o mundo para melhor, o exemplo do amor é a melhor e mais poderosa ferramenta de que dispomos;</w:t>
+      </w:r>
+    </w:p>
+    <w:p>
+      <w:pPr>
+        <w:pStyle w:val="Normal"/>
+        <w:jc w:val="both"/>
+        <w:rPr>
+          <w:rFonts w:ascii="Garamond" w:hAnsi="Garamond" w:eastAsia="Times New Roman" w:cs="Times New Roman"/>
+          <w:color w:val="000000"/>
+          <w:kern w:val="0"/>
+          <w:sz w:val="36"/>
+          <w:szCs w:val="36"/>
+          <w:shd w:fill="auto" w:val="clear"/>
+          <w:lang w:val="en-US" w:eastAsia="zh-CN" w:bidi="hi-IN"/>
+        </w:rPr>
+      </w:pPr>
+      <w:r>
+        <w:rPr/>
+      </w:r>
+    </w:p>
+    <w:p>
+      <w:pPr>
+        <w:pStyle w:val="Normal"/>
+        <w:jc w:val="both"/>
+        <w:rPr>
+          <w:u w:val="single"/>
+        </w:rPr>
+      </w:pPr>
+      <w:r>
+        <w:rPr>
+          <w:rFonts w:eastAsia="Times New Roman" w:cs="Times New Roman" w:ascii="Garamond" w:hAnsi="Garamond"/>
+          <w:color w:val="000000"/>
+          <w:kern w:val="0"/>
+          <w:sz w:val="36"/>
+          <w:szCs w:val="36"/>
+          <w:u w:val="single"/>
+          <w:shd w:fill="auto" w:val="clear"/>
+          <w:lang w:val="en-US" w:eastAsia="zh-CN" w:bidi="hi-IN"/>
+        </w:rPr>
+        <w:t>Instruções de Emmanuel</w:t>
+      </w:r>
+    </w:p>
+    <w:p>
+      <w:pPr>
+        <w:pStyle w:val="Normal"/>
+        <w:numPr>
+          <w:ilvl w:val="0"/>
+          <w:numId w:val="13"/>
+        </w:numPr>
+        <w:jc w:val="both"/>
+        <w:rPr>
+          <w:u w:val="none"/>
+        </w:rPr>
+      </w:pPr>
+      <w:r>
+        <w:rPr>
+          <w:rFonts w:eastAsia="Times New Roman" w:cs="Times New Roman" w:ascii="Garamond" w:hAnsi="Garamond"/>
+          <w:color w:val="000000"/>
+          <w:kern w:val="0"/>
+          <w:sz w:val="36"/>
+          <w:szCs w:val="36"/>
+          <w:u w:val="none"/>
+          <w:shd w:fill="auto" w:val="clear"/>
+          <w:lang w:val="en-US" w:eastAsia="zh-CN" w:bidi="hi-IN"/>
+        </w:rPr>
+        <w:t>O egoísmo é o grande inimigo do homem. É contra ele que devemos voltar todos os nossos esforços, toda a nossa coragem porque esse combate representa uma luta nossa contra nós mesmos;</w:t>
+      </w:r>
+    </w:p>
+    <w:p>
+      <w:pPr>
+        <w:pStyle w:val="Normal"/>
+        <w:numPr>
+          <w:ilvl w:val="0"/>
+          <w:numId w:val="13"/>
+        </w:numPr>
+        <w:jc w:val="both"/>
+        <w:rPr>
+          <w:u w:val="none"/>
+        </w:rPr>
+      </w:pPr>
+      <w:r>
+        <w:rPr>
+          <w:rFonts w:eastAsia="Times New Roman" w:cs="Times New Roman" w:ascii="Garamond" w:hAnsi="Garamond"/>
+          <w:color w:val="000000"/>
+          <w:kern w:val="0"/>
+          <w:sz w:val="36"/>
+          <w:szCs w:val="36"/>
+          <w:u w:val="none"/>
+          <w:shd w:fill="auto" w:val="clear"/>
+          <w:lang w:val="en-US" w:eastAsia="zh-CN" w:bidi="hi-IN"/>
+        </w:rPr>
+        <w:t>como sempre nos é dito: o egoísmo e o orgulho são as maiores chagas da humanidade;</w:t>
+      </w:r>
+    </w:p>
+    <w:p>
+      <w:pPr>
+        <w:pStyle w:val="Normal"/>
+        <w:numPr>
+          <w:ilvl w:val="0"/>
+          <w:numId w:val="13"/>
+        </w:numPr>
+        <w:jc w:val="both"/>
+        <w:rPr>
+          <w:u w:val="none"/>
+        </w:rPr>
+      </w:pPr>
+      <w:r>
+        <w:rPr>
+          <w:rFonts w:eastAsia="Times New Roman" w:cs="Times New Roman" w:ascii="Garamond" w:hAnsi="Garamond"/>
+          <w:color w:val="000000"/>
+          <w:kern w:val="0"/>
+          <w:sz w:val="36"/>
+          <w:szCs w:val="36"/>
+          <w:u w:val="none"/>
+          <w:shd w:fill="auto" w:val="clear"/>
+          <w:lang w:val="en-US" w:eastAsia="zh-CN" w:bidi="hi-IN"/>
+        </w:rPr>
+        <w:t>o Cristianismo ainda não conseguiu cumprir sua missão porque o homem, vencido pelo egoísmo, não pratica a caridade</w:t>
+      </w:r>
+    </w:p>
+    <w:p>
+      <w:pPr>
+        <w:pStyle w:val="Normal"/>
+        <w:jc w:val="both"/>
+        <w:rPr>
+          <w:rFonts w:ascii="Garamond" w:hAnsi="Garamond" w:eastAsia="Times New Roman" w:cs="Times New Roman"/>
+          <w:color w:val="000000"/>
+          <w:kern w:val="0"/>
+          <w:sz w:val="36"/>
+          <w:szCs w:val="36"/>
+          <w:shd w:fill="auto" w:val="clear"/>
+          <w:lang w:val="en-US" w:eastAsia="zh-CN" w:bidi="hi-IN"/>
+        </w:rPr>
+      </w:pPr>
+      <w:r>
+        <w:rPr>
+          <w:u w:val="none"/>
+        </w:rPr>
+      </w:r>
+    </w:p>
+    <w:p>
+      <w:pPr>
+        <w:pStyle w:val="Normal"/>
+        <w:jc w:val="both"/>
+        <w:rPr>
+          <w:u w:val="single"/>
+        </w:rPr>
+      </w:pPr>
+      <w:r>
+        <w:rPr>
+          <w:rFonts w:eastAsia="Times New Roman" w:cs="Times New Roman" w:ascii="Garamond" w:hAnsi="Garamond"/>
+          <w:color w:val="000000"/>
+          <w:kern w:val="0"/>
+          <w:sz w:val="36"/>
+          <w:szCs w:val="36"/>
+          <w:u w:val="single"/>
+          <w:shd w:fill="auto" w:val="clear"/>
+          <w:lang w:val="en-US" w:eastAsia="zh-CN" w:bidi="hi-IN"/>
+        </w:rPr>
+        <w:t>Instruções de Pascal</w:t>
+      </w:r>
+    </w:p>
+    <w:p>
+      <w:pPr>
+        <w:pStyle w:val="Normal"/>
+        <w:numPr>
+          <w:ilvl w:val="0"/>
+          <w:numId w:val="14"/>
+        </w:numPr>
+        <w:jc w:val="both"/>
+        <w:rPr>
+          <w:u w:val="none"/>
+        </w:rPr>
+      </w:pPr>
+      <w:r>
+        <w:rPr>
+          <w:rFonts w:eastAsia="Times New Roman" w:cs="Times New Roman" w:ascii="Garamond" w:hAnsi="Garamond"/>
+          <w:color w:val="000000"/>
+          <w:kern w:val="0"/>
+          <w:sz w:val="36"/>
+          <w:szCs w:val="36"/>
+          <w:u w:val="none"/>
+          <w:shd w:fill="auto" w:val="clear"/>
+          <w:lang w:val="en-US" w:eastAsia="zh-CN" w:bidi="hi-IN"/>
+        </w:rPr>
+        <w:t>Jesus jamais deixou de auxiliar aqueles que o procuraram; da mulher adúltera ao criminoso, o Mestre auxiliou a todos com amor incondicional</w:t>
+      </w:r>
+    </w:p>
+    <w:p>
+      <w:pPr>
+        <w:pStyle w:val="Normal"/>
+        <w:numPr>
+          <w:ilvl w:val="0"/>
+          <w:numId w:val="14"/>
+        </w:numPr>
+        <w:jc w:val="both"/>
+        <w:rPr>
+          <w:u w:val="none"/>
+        </w:rPr>
+      </w:pPr>
+      <w:r>
+        <w:rPr>
+          <w:rFonts w:eastAsia="Times New Roman" w:cs="Times New Roman" w:ascii="Garamond" w:hAnsi="Garamond"/>
+          <w:color w:val="000000"/>
+          <w:kern w:val="0"/>
+          <w:sz w:val="36"/>
+          <w:szCs w:val="36"/>
+          <w:u w:val="none"/>
+          <w:shd w:fill="auto" w:val="clear"/>
+          <w:lang w:val="en-US" w:eastAsia="zh-CN" w:bidi="hi-IN"/>
+        </w:rPr>
+        <w:t>no trabalho no bem não devemos nos deixar abalar por aqueles que nos menosprezam. Cabe a nós seguirmos determinados em nossos compromissos com o Cristo, certos de que Deus, em tempo oportuno, fará com que Sua justiça se cumpra;</w:t>
+      </w:r>
+    </w:p>
+    <w:p>
+      <w:pPr>
+        <w:pStyle w:val="Normal"/>
+        <w:numPr>
+          <w:ilvl w:val="0"/>
+          <w:numId w:val="14"/>
+        </w:numPr>
+        <w:jc w:val="both"/>
+        <w:rPr>
+          <w:u w:val="none"/>
+        </w:rPr>
+      </w:pPr>
+      <w:r>
+        <w:rPr>
+          <w:rFonts w:eastAsia="Times New Roman" w:cs="Times New Roman" w:ascii="Garamond" w:hAnsi="Garamond"/>
+          <w:color w:val="000000"/>
+          <w:kern w:val="0"/>
+          <w:sz w:val="36"/>
+          <w:szCs w:val="36"/>
+          <w:u w:val="none"/>
+          <w:shd w:fill="auto" w:val="clear"/>
+          <w:lang w:val="en-US" w:eastAsia="zh-CN" w:bidi="hi-IN"/>
+        </w:rPr>
+        <w:t>Pascal fala de uma situação extremamente atual: enquanto o orgulho e o egoísmo imperarem no mundo, a humanidade continuará vendo a vitória dos mais espertos, dos desonestos e dos injustos; os laços de amizade e até mesmo os laços de família continuarão sendo rompidos pelos interesses pessoais</w:t>
+      </w:r>
+    </w:p>
+    <w:p>
+      <w:pPr>
+        <w:pStyle w:val="Normal"/>
+        <w:jc w:val="both"/>
+        <w:rPr>
+          <w:rFonts w:ascii="Garamond" w:hAnsi="Garamond" w:eastAsia="Times New Roman" w:cs="Times New Roman"/>
+          <w:color w:val="000000"/>
+          <w:kern w:val="0"/>
+          <w:sz w:val="36"/>
+          <w:szCs w:val="36"/>
+          <w:shd w:fill="auto" w:val="clear"/>
+          <w:lang w:val="en-US" w:eastAsia="zh-CN" w:bidi="hi-IN"/>
+        </w:rPr>
+      </w:pPr>
+      <w:r>
+        <w:rPr>
+          <w:u w:val="none"/>
+        </w:rPr>
+      </w:r>
+    </w:p>
+    <w:p>
+      <w:pPr>
+        <w:pStyle w:val="Normal"/>
+        <w:jc w:val="both"/>
+        <w:rPr>
+          <w:u w:val="single"/>
+        </w:rPr>
+      </w:pPr>
+      <w:r>
+        <w:rPr>
+          <w:rFonts w:eastAsia="Times New Roman" w:cs="Times New Roman" w:ascii="Garamond" w:hAnsi="Garamond"/>
+          <w:color w:val="000000"/>
+          <w:kern w:val="0"/>
+          <w:sz w:val="36"/>
+          <w:szCs w:val="36"/>
+          <w:u w:val="single"/>
+          <w:shd w:fill="auto" w:val="clear"/>
+          <w:lang w:val="en-US" w:eastAsia="zh-CN" w:bidi="hi-IN"/>
+        </w:rPr>
+        <w:t>Instruções do Espírito Protetor</w:t>
+      </w:r>
+    </w:p>
+    <w:p>
+      <w:pPr>
+        <w:pStyle w:val="Normal"/>
+        <w:numPr>
+          <w:ilvl w:val="0"/>
+          <w:numId w:val="15"/>
+        </w:numPr>
+        <w:jc w:val="both"/>
+        <w:rPr>
+          <w:u w:val="none"/>
+        </w:rPr>
+      </w:pPr>
+      <w:r>
+        <w:rPr>
+          <w:rFonts w:eastAsia="Times New Roman" w:cs="Times New Roman" w:ascii="Garamond" w:hAnsi="Garamond"/>
+          <w:color w:val="000000"/>
+          <w:kern w:val="0"/>
+          <w:sz w:val="36"/>
+          <w:szCs w:val="36"/>
+          <w:u w:val="none"/>
+          <w:shd w:fill="auto" w:val="clear"/>
+          <w:lang w:val="en-US" w:eastAsia="zh-CN" w:bidi="hi-IN"/>
+        </w:rPr>
+        <w:t>a caridade duradoura só existe quando sustentada pela fé porque a prática da caridade exige sacrifício, renúncia, abnegação, virtudes que somente a fé verdadeira dá ao homem;</w:t>
+      </w:r>
+    </w:p>
+    <w:p>
+      <w:pPr>
+        <w:pStyle w:val="Normal"/>
+        <w:numPr>
+          <w:ilvl w:val="0"/>
+          <w:numId w:val="15"/>
+        </w:numPr>
+        <w:jc w:val="both"/>
+        <w:rPr>
+          <w:u w:val="none"/>
+        </w:rPr>
+      </w:pPr>
+      <w:r>
+        <w:rPr>
+          <w:rFonts w:eastAsia="Times New Roman" w:cs="Times New Roman" w:ascii="Garamond" w:hAnsi="Garamond"/>
+          <w:color w:val="000000"/>
+          <w:kern w:val="0"/>
+          <w:sz w:val="36"/>
+          <w:szCs w:val="36"/>
+          <w:u w:val="none"/>
+          <w:shd w:fill="auto" w:val="clear"/>
+          <w:lang w:val="en-US" w:eastAsia="zh-CN" w:bidi="hi-IN"/>
+        </w:rPr>
+        <w:t>o homem tem que sacrificar seus interesses mundanos para construir a felicidade;</w:t>
+      </w:r>
+    </w:p>
+    <w:p>
+      <w:pPr>
+        <w:pStyle w:val="Normal"/>
+        <w:numPr>
+          <w:ilvl w:val="0"/>
+          <w:numId w:val="15"/>
+        </w:numPr>
+        <w:jc w:val="both"/>
+        <w:rPr>
+          <w:u w:val="none"/>
+        </w:rPr>
+      </w:pPr>
+      <w:r>
+        <w:rPr>
+          <w:rFonts w:eastAsia="Times New Roman" w:cs="Times New Roman" w:ascii="Garamond" w:hAnsi="Garamond"/>
+          <w:color w:val="000000"/>
+          <w:kern w:val="0"/>
+          <w:sz w:val="36"/>
+          <w:szCs w:val="36"/>
+          <w:u w:val="none"/>
+          <w:shd w:fill="auto" w:val="clear"/>
+          <w:lang w:val="en-US" w:eastAsia="zh-CN" w:bidi="hi-IN"/>
+        </w:rPr>
+        <w:t>embora em vários países, cristãos estejam sendo mortos, relembrando os circos da Roma antiga, o sacrifício  que nos é pedido hoje é o do egoísmo, do orgulho e da vaidade</w:t>
+      </w:r>
+    </w:p>
+    <w:p>
+      <w:pPr>
+        <w:pStyle w:val="Normal"/>
+        <w:jc w:val="both"/>
+        <w:rPr>
+          <w:rFonts w:ascii="Garamond" w:hAnsi="Garamond" w:eastAsia="Times New Roman" w:cs="Times New Roman"/>
+          <w:color w:val="000000"/>
+          <w:kern w:val="0"/>
+          <w:sz w:val="36"/>
+          <w:szCs w:val="36"/>
+          <w:shd w:fill="auto" w:val="clear"/>
+          <w:lang w:val="en-US" w:eastAsia="zh-CN" w:bidi="hi-IN"/>
+        </w:rPr>
+      </w:pPr>
+      <w:r>
+        <w:rPr>
+          <w:u w:val="none"/>
+        </w:rPr>
+      </w:r>
+    </w:p>
+    <w:p>
+      <w:pPr>
+        <w:pStyle w:val="Normal"/>
+        <w:jc w:val="both"/>
+        <w:rPr>
+          <w:u w:val="single"/>
+        </w:rPr>
+      </w:pPr>
+      <w:r>
+        <w:rPr>
+          <w:rFonts w:eastAsia="Times New Roman" w:cs="Times New Roman" w:ascii="Garamond" w:hAnsi="Garamond"/>
+          <w:color w:val="000000"/>
+          <w:kern w:val="0"/>
+          <w:sz w:val="36"/>
+          <w:szCs w:val="36"/>
+          <w:u w:val="single"/>
+          <w:shd w:fill="auto" w:val="clear"/>
+          <w:lang w:val="en-US" w:eastAsia="zh-CN" w:bidi="hi-IN"/>
+        </w:rPr>
+        <w:t>Instruções de Isabel de França</w:t>
+      </w:r>
+    </w:p>
+    <w:p>
+      <w:pPr>
+        <w:pStyle w:val="Normal"/>
+        <w:jc w:val="both"/>
+        <w:rPr>
+          <w:u w:val="none"/>
+        </w:rPr>
+      </w:pPr>
+      <w:r>
+        <w:rPr>
+          <w:rFonts w:eastAsia="Times New Roman" w:cs="Times New Roman" w:ascii="Garamond" w:hAnsi="Garamond"/>
+          <w:color w:val="000000"/>
+          <w:kern w:val="0"/>
+          <w:sz w:val="36"/>
+          <w:szCs w:val="36"/>
+          <w:u w:val="none"/>
+          <w:shd w:fill="auto" w:val="clear"/>
+          <w:lang w:val="en-US" w:eastAsia="zh-CN" w:bidi="hi-IN"/>
+        </w:rPr>
+        <w:t>Esse Espírito trata de uma questão extremamente delicada: a caridade para com os criminosos. Isso é particularmente delicado para nós, brasileiros. Infelizmente, durante décadas temos visto assassinos, estupradores, sequestradores, corruptos sendo colocados em liberdade, a despeito da gravidade e do números de crimes comprovadamente cometidos por eles. A segurança pública é hoje, indiscutivelmente, um dos maiores problemas que  a sociedade brasileira tem enfrentado.</w:t>
+      </w:r>
+    </w:p>
+    <w:p>
+      <w:pPr>
+        <w:pStyle w:val="Normal"/>
+        <w:jc w:val="both"/>
+        <w:rPr>
+          <w:u w:val="none"/>
+        </w:rPr>
+      </w:pPr>
+      <w:r>
+        <w:rPr>
+          <w:rFonts w:eastAsia="Times New Roman" w:cs="Times New Roman" w:ascii="Garamond" w:hAnsi="Garamond"/>
+          <w:color w:val="000000"/>
+          <w:kern w:val="0"/>
+          <w:sz w:val="36"/>
+          <w:szCs w:val="36"/>
+          <w:u w:val="none"/>
+          <w:shd w:fill="auto" w:val="clear"/>
+          <w:lang w:val="en-US" w:eastAsia="zh-CN" w:bidi="hi-IN"/>
+        </w:rPr>
+        <w:t xml:space="preserve">Diante desse cenário é muito difícil para nós termos o  sentimento da caridade para com os criminosos. Entretanto, é exatamente isso que Jesus </w:t>
+      </w:r>
+      <w:r>
+        <w:rPr>
+          <w:rFonts w:eastAsia="Times New Roman" w:cs="Times New Roman" w:ascii="Garamond" w:hAnsi="Garamond"/>
+          <w:color w:val="000000"/>
+          <w:kern w:val="0"/>
+          <w:sz w:val="36"/>
+          <w:szCs w:val="36"/>
+          <w:u w:val="none"/>
+          <w:shd w:fill="auto" w:val="clear"/>
+          <w:lang w:val="en-US" w:eastAsia="zh-CN" w:bidi="hi-IN"/>
+        </w:rPr>
+        <w:t>espera de nós.</w:t>
+      </w:r>
+    </w:p>
+    <w:p>
+      <w:pPr>
+        <w:pStyle w:val="Normal"/>
+        <w:jc w:val="both"/>
+        <w:rPr>
+          <w:u w:val="none"/>
+        </w:rPr>
+      </w:pPr>
+      <w:r>
+        <w:rPr>
+          <w:rFonts w:eastAsia="Times New Roman" w:cs="Times New Roman" w:ascii="Garamond" w:hAnsi="Garamond"/>
+          <w:color w:val="000000"/>
+          <w:kern w:val="0"/>
+          <w:sz w:val="36"/>
+          <w:szCs w:val="36"/>
+          <w:u w:val="none"/>
+          <w:shd w:fill="auto" w:val="clear"/>
+          <w:lang w:val="en-US" w:eastAsia="zh-CN" w:bidi="hi-IN"/>
+        </w:rPr>
+        <w:t>Isabel nos diz que, se Jesus visse junto a nós um desses piores criminosos dos dias de hoje, Jesus o consideraria um doente digno de piedade e estenderia a ele uma mão amiga. Isabel diz ainda que nós não temos condições de agir como Jesus. Entretanto, podemos orar por aquele criminoso e talvez, sob o influxo de nossas orações ele seja tocado de arrependimento e inicie desde já a transformação para abandonar a vida de crimes.</w:t>
+      </w:r>
+    </w:p>
+    <w:p>
+      <w:pPr>
+        <w:pStyle w:val="Normal"/>
+        <w:jc w:val="both"/>
+        <w:rPr>
+          <w:u w:val="none"/>
+        </w:rPr>
+      </w:pPr>
+      <w:r>
+        <w:rPr>
+          <w:rFonts w:eastAsia="Times New Roman" w:cs="Times New Roman" w:ascii="Garamond" w:hAnsi="Garamond"/>
+          <w:color w:val="000000"/>
+          <w:kern w:val="0"/>
+          <w:sz w:val="36"/>
+          <w:szCs w:val="36"/>
+          <w:u w:val="none"/>
+          <w:shd w:fill="auto" w:val="clear"/>
+          <w:lang w:val="en-US" w:eastAsia="zh-CN" w:bidi="hi-IN"/>
+        </w:rPr>
+        <w:t>Mas, sejamos sinceros: até mesmo orar pelos criminosos é algo difícil para nós. Porém, precisamos tentar. É uma barreira interior que, com o tempo e a prática, conseguiremos transpor.</w:t>
+      </w:r>
+    </w:p>
+    <w:p>
+      <w:pPr>
+        <w:pStyle w:val="Normal"/>
+        <w:jc w:val="both"/>
+        <w:rPr>
+          <w:u w:val="none"/>
+        </w:rPr>
+      </w:pPr>
+      <w:r>
+        <w:rPr>
+          <w:rFonts w:eastAsia="Times New Roman" w:cs="Times New Roman" w:ascii="Garamond" w:hAnsi="Garamond"/>
+          <w:color w:val="000000"/>
+          <w:kern w:val="0"/>
+          <w:sz w:val="36"/>
+          <w:szCs w:val="36"/>
+          <w:u w:val="none"/>
+          <w:shd w:fill="auto" w:val="clear"/>
+          <w:lang w:val="en-US" w:eastAsia="zh-CN" w:bidi="hi-IN"/>
+        </w:rPr>
+        <w:t>Os mais jovens aqui muito provavelmente nunca ouviram falar de Daniela Perez. Ela era uma atriz que foi brutalmente assassinada pelo ator Guilherme de Pádua e a esposa dele. A mãe de Daniela, Glória Pereza, procurou Chico Xavier poucos dias depois do crime e o Chico disse a ela o seguinte: "Você, na posição de mãe, ainda não tem condições de conceder o perdão às pessoas que tiraram a vida de sua filha querida. Mas eu vou lhe pedir uma coisa: não permita que os algozes de sua filha sejam linchados".</w:t>
+      </w:r>
+    </w:p>
+    <w:p>
+      <w:pPr>
+        <w:pStyle w:val="Normal"/>
+        <w:jc w:val="both"/>
+        <w:rPr>
+          <w:u w:val="none"/>
+        </w:rPr>
+      </w:pPr>
+      <w:r>
+        <w:rPr>
+          <w:rFonts w:eastAsia="Times New Roman" w:cs="Times New Roman" w:ascii="Garamond" w:hAnsi="Garamond"/>
+          <w:color w:val="000000"/>
+          <w:kern w:val="0"/>
+          <w:sz w:val="36"/>
+          <w:szCs w:val="36"/>
+          <w:u w:val="none"/>
+          <w:shd w:fill="auto" w:val="clear"/>
+          <w:lang w:val="en-US" w:eastAsia="zh-CN" w:bidi="hi-IN"/>
+        </w:rPr>
+        <w:t>Havia um temor muito grande de que Guilherme e sua esposa fossem linchados devido à comoção nacional que o crime causou.</w:t>
+      </w:r>
+    </w:p>
+    <w:p>
+      <w:pPr>
+        <w:pStyle w:val="Normal"/>
+        <w:jc w:val="both"/>
+        <w:rPr>
+          <w:u w:val="none"/>
+        </w:rPr>
+      </w:pPr>
+      <w:r>
+        <w:rPr>
+          <w:rFonts w:eastAsia="Times New Roman" w:cs="Times New Roman" w:ascii="Garamond" w:hAnsi="Garamond"/>
+          <w:color w:val="000000"/>
+          <w:kern w:val="0"/>
+          <w:sz w:val="36"/>
+          <w:szCs w:val="36"/>
+          <w:u w:val="none"/>
+          <w:shd w:fill="auto" w:val="clear"/>
+          <w:lang w:val="en-US" w:eastAsia="zh-CN" w:bidi="hi-IN"/>
+        </w:rPr>
+        <w:t>Chico sabia que Glória Perez  não tinha condições de perdoar os assassinos de sua filha, mas sabia que, com a influência que Glória tinha - ela é uma escritora de novelas - seria possível evitar o linchamento</w:t>
+      </w:r>
+      <w:r>
+        <w:rPr>
+          <w:rFonts w:eastAsia="Times New Roman" w:cs="Times New Roman" w:ascii="Garamond" w:hAnsi="Garamond"/>
+          <w:color w:val="000000"/>
+          <w:kern w:val="0"/>
+          <w:sz w:val="36"/>
+          <w:szCs w:val="36"/>
+          <w:u w:val="none"/>
+          <w:shd w:fill="auto" w:val="clear"/>
+          <w:lang w:val="en-US" w:eastAsia="zh-CN" w:bidi="hi-IN"/>
+        </w:rPr>
+        <w:t>.</w:t>
+      </w:r>
+    </w:p>
+    <w:p>
+      <w:pPr>
+        <w:pStyle w:val="Normal"/>
+        <w:jc w:val="both"/>
+        <w:rPr>
+          <w:u w:val="none"/>
+        </w:rPr>
+      </w:pPr>
+      <w:r>
+        <w:rPr>
+          <w:rFonts w:eastAsia="Times New Roman" w:cs="Times New Roman" w:ascii="Garamond" w:hAnsi="Garamond"/>
+          <w:color w:val="000000"/>
+          <w:kern w:val="0"/>
+          <w:sz w:val="36"/>
+          <w:szCs w:val="36"/>
+          <w:u w:val="none"/>
+          <w:shd w:fill="auto" w:val="clear"/>
+          <w:lang w:val="en-US" w:eastAsia="zh-CN" w:bidi="hi-IN"/>
+        </w:rPr>
+        <w:t>No dia seguinte ao encontro com Chico, Glória telefonouo para Eurípedes, filho adotivo de Chico e disse: "Avise ao Chico que o perdão ainda está muito difícil, mas eu vou trabalhar para que ninguém faça o linchamento".</w:t>
+      </w:r>
+    </w:p>
+    <w:p>
+      <w:pPr>
+        <w:pStyle w:val="Normal"/>
+        <w:jc w:val="both"/>
+        <w:rPr>
+          <w:u w:val="none"/>
+        </w:rPr>
+      </w:pPr>
+      <w:r>
+        <w:rPr>
+          <w:rFonts w:eastAsia="Times New Roman" w:cs="Times New Roman" w:ascii="Garamond" w:hAnsi="Garamond"/>
+          <w:color w:val="000000"/>
+          <w:kern w:val="0"/>
+          <w:sz w:val="36"/>
+          <w:szCs w:val="36"/>
+          <w:u w:val="none"/>
+          <w:shd w:fill="auto" w:val="clear"/>
+          <w:lang w:val="en-US" w:eastAsia="zh-CN" w:bidi="hi-IN"/>
+        </w:rPr>
+        <w:t>Foi um ato de nobreza espiritual de Glória Perez. Trabalhar para preservar a vida dos assassinos da filha dela. Não resta a menor dúvida  de que essa atitude exigiu dessa mãe um esforço e uma coragem gigantescos.</w:t>
+      </w:r>
+    </w:p>
+    <w:p>
+      <w:pPr>
+        <w:pStyle w:val="Normal"/>
+        <w:jc w:val="both"/>
+        <w:rPr>
+          <w:u w:val="none"/>
+        </w:rPr>
+      </w:pPr>
+      <w:r>
+        <w:rPr>
+          <w:rFonts w:eastAsia="Times New Roman" w:cs="Times New Roman" w:ascii="Garamond" w:hAnsi="Garamond"/>
+          <w:color w:val="000000"/>
+          <w:kern w:val="0"/>
+          <w:sz w:val="36"/>
+          <w:szCs w:val="36"/>
+          <w:u w:val="none"/>
+          <w:shd w:fill="auto" w:val="clear"/>
+          <w:lang w:val="en-US" w:eastAsia="zh-CN" w:bidi="hi-IN"/>
+        </w:rPr>
+        <w:t>É exatamente isso que o Espírito Isabe de França nos pede: não é o mesmo que Jesus teria com o criminoso, mas é fazer por ele aquilo que nossa condição espiritual já nos permite fazer.</w:t>
       </w:r>
     </w:p>
     <w:p>
@@ -2623,55 +3288,7 @@
           <w:shd w:fill="auto" w:val="clear"/>
           <w:lang w:val="en-US" w:eastAsia="zh-CN" w:bidi="hi-IN"/>
         </w:rPr>
-        <w:t xml:space="preserve">[ </w:t>
-      </w:r>
-      <w:r>
-        <w:rPr>
-          <w:rFonts w:eastAsia="Times New Roman" w:cs="Times New Roman" w:ascii="Garamond" w:hAnsi="Garamond"/>
-          <w:color w:val="00A0FC"/>
-          <w:kern w:val="0"/>
-          <w:sz w:val="36"/>
-          <w:szCs w:val="36"/>
-          <w:shd w:fill="auto" w:val="clear"/>
-          <w:lang w:val="en-US" w:eastAsia="zh-CN" w:bidi="hi-IN"/>
-        </w:rPr>
-        <w:t xml:space="preserve">Anotações feitas do capítulo XI </w:t>
-      </w:r>
-      <w:r>
-        <w:rPr>
-          <w:rFonts w:eastAsia="Times New Roman" w:cs="Times New Roman" w:ascii="Garamond" w:hAnsi="Garamond"/>
-          <w:color w:val="00A0FC"/>
-          <w:kern w:val="0"/>
-          <w:sz w:val="36"/>
-          <w:szCs w:val="36"/>
-          <w:shd w:fill="auto" w:val="clear"/>
-          <w:lang w:val="en-US" w:eastAsia="zh-CN" w:bidi="hi-IN"/>
-        </w:rPr>
-        <w:t xml:space="preserve">- </w:t>
-      </w:r>
-      <w:r>
-        <w:rPr>
-          <w:rFonts w:eastAsia="Times New Roman" w:cs="Times New Roman" w:ascii="Garamond" w:hAnsi="Garamond"/>
-          <w:color w:val="00A0FC"/>
-          <w:kern w:val="0"/>
-          <w:sz w:val="36"/>
-          <w:szCs w:val="36"/>
-          <w:shd w:fill="auto" w:val="clear"/>
-          <w:lang w:val="en-US" w:eastAsia="zh-CN" w:bidi="hi-IN"/>
-        </w:rPr>
-        <w:t>Término</w:t>
-      </w:r>
-      <w:r>
-        <w:rPr>
-          <w:rFonts w:eastAsia="Times New Roman" w:cs="Times New Roman" w:ascii="Garamond" w:hAnsi="Garamond"/>
-          <w:color w:val="00A0FC"/>
-          <w:kern w:val="0"/>
-          <w:sz w:val="36"/>
-          <w:szCs w:val="36"/>
-          <w:shd w:fill="auto" w:val="clear"/>
-          <w:lang w:val="en-US" w:eastAsia="zh-CN" w:bidi="hi-IN"/>
-        </w:rPr>
-        <w:t xml:space="preserve"> ]</w:t>
+        <w:t>[ Anotações feitas do capítulo XI - Término ]</w:t>
       </w:r>
     </w:p>
     <w:p>
@@ -7036,7 +7653,7 @@
         <w:bCs/>
         <w:rFonts w:ascii="Garamond" w:hAnsi="Garamond"/>
       </w:rPr>
-      <w:t>31</w:t>
+      <w:t>36</w:t>
     </w:r>
     <w:r>
       <w:rPr>
@@ -8694,6 +9311,417 @@
     </w:lvl>
   </w:abstractNum>
   <w:abstractNum w:abstractNumId="13">
+    <w:lvl w:ilvl="0">
+      <w:start w:val="1"/>
+      <w:numFmt w:val="bullet"/>
+      <w:lvlText w:val=""/>
+      <w:lvlJc w:val="left"/>
+      <w:pPr>
+        <w:tabs>
+          <w:tab w:val="num" w:pos="720"/>
+        </w:tabs>
+        <w:ind w:left="720" w:hanging="360"/>
+      </w:pPr>
+      <w:rPr>
+        <w:rFonts w:ascii="Symbol" w:hAnsi="Symbol" w:cs="Symbol" w:hint="default"/>
+      </w:rPr>
+    </w:lvl>
+    <w:lvl w:ilvl="1">
+      <w:start w:val="1"/>
+      <w:numFmt w:val="bullet"/>
+      <w:lvlText w:val="◦"/>
+      <w:lvlJc w:val="left"/>
+      <w:pPr>
+        <w:tabs>
+          <w:tab w:val="num" w:pos="1080"/>
+        </w:tabs>
+        <w:ind w:left="1080" w:hanging="360"/>
+      </w:pPr>
+      <w:rPr>
+        <w:rFonts w:ascii="OpenSymbol" w:hAnsi="OpenSymbol" w:cs="OpenSymbol" w:hint="default"/>
+      </w:rPr>
+    </w:lvl>
+    <w:lvl w:ilvl="2">
+      <w:start w:val="1"/>
+      <w:numFmt w:val="bullet"/>
+      <w:lvlText w:val="▪"/>
+      <w:lvlJc w:val="left"/>
+      <w:pPr>
+        <w:tabs>
+          <w:tab w:val="num" w:pos="1440"/>
+        </w:tabs>
+        <w:ind w:left="1440" w:hanging="360"/>
+      </w:pPr>
+      <w:rPr>
+        <w:rFonts w:ascii="OpenSymbol" w:hAnsi="OpenSymbol" w:cs="OpenSymbol" w:hint="default"/>
+      </w:rPr>
+    </w:lvl>
+    <w:lvl w:ilvl="3">
+      <w:start w:val="1"/>
+      <w:numFmt w:val="bullet"/>
+      <w:lvlText w:val=""/>
+      <w:lvlJc w:val="left"/>
+      <w:pPr>
+        <w:tabs>
+          <w:tab w:val="num" w:pos="1800"/>
+        </w:tabs>
+        <w:ind w:left="1800" w:hanging="360"/>
+      </w:pPr>
+      <w:rPr>
+        <w:rFonts w:ascii="Symbol" w:hAnsi="Symbol" w:cs="Symbol" w:hint="default"/>
+      </w:rPr>
+    </w:lvl>
+    <w:lvl w:ilvl="4">
+      <w:start w:val="1"/>
+      <w:numFmt w:val="bullet"/>
+      <w:lvlText w:val="◦"/>
+      <w:lvlJc w:val="left"/>
+      <w:pPr>
+        <w:tabs>
+          <w:tab w:val="num" w:pos="2160"/>
+        </w:tabs>
+        <w:ind w:left="2160" w:hanging="360"/>
+      </w:pPr>
+      <w:rPr>
+        <w:rFonts w:ascii="OpenSymbol" w:hAnsi="OpenSymbol" w:cs="OpenSymbol" w:hint="default"/>
+      </w:rPr>
+    </w:lvl>
+    <w:lvl w:ilvl="5">
+      <w:start w:val="1"/>
+      <w:numFmt w:val="bullet"/>
+      <w:lvlText w:val="▪"/>
+      <w:lvlJc w:val="left"/>
+      <w:pPr>
+        <w:tabs>
+          <w:tab w:val="num" w:pos="2520"/>
+        </w:tabs>
+        <w:ind w:left="2520" w:hanging="360"/>
+      </w:pPr>
+      <w:rPr>
+        <w:rFonts w:ascii="OpenSymbol" w:hAnsi="OpenSymbol" w:cs="OpenSymbol" w:hint="default"/>
+      </w:rPr>
+    </w:lvl>
+    <w:lvl w:ilvl="6">
+      <w:start w:val="1"/>
+      <w:numFmt w:val="bullet"/>
+      <w:lvlText w:val=""/>
+      <w:lvlJc w:val="left"/>
+      <w:pPr>
+        <w:tabs>
+          <w:tab w:val="num" w:pos="2880"/>
+        </w:tabs>
+        <w:ind w:left="2880" w:hanging="360"/>
+      </w:pPr>
+      <w:rPr>
+        <w:rFonts w:ascii="Symbol" w:hAnsi="Symbol" w:cs="Symbol" w:hint="default"/>
+      </w:rPr>
+    </w:lvl>
+    <w:lvl w:ilvl="7">
+      <w:start w:val="1"/>
+      <w:numFmt w:val="bullet"/>
+      <w:lvlText w:val="◦"/>
+      <w:lvlJc w:val="left"/>
+      <w:pPr>
+        <w:tabs>
+          <w:tab w:val="num" w:pos="3240"/>
+        </w:tabs>
+        <w:ind w:left="3240" w:hanging="360"/>
+      </w:pPr>
+      <w:rPr>
+        <w:rFonts w:ascii="OpenSymbol" w:hAnsi="OpenSymbol" w:cs="OpenSymbol" w:hint="default"/>
+      </w:rPr>
+    </w:lvl>
+    <w:lvl w:ilvl="8">
+      <w:start w:val="1"/>
+      <w:numFmt w:val="bullet"/>
+      <w:lvlText w:val="▪"/>
+      <w:lvlJc w:val="left"/>
+      <w:pPr>
+        <w:tabs>
+          <w:tab w:val="num" w:pos="3600"/>
+        </w:tabs>
+        <w:ind w:left="3600" w:hanging="360"/>
+      </w:pPr>
+      <w:rPr>
+        <w:rFonts w:ascii="OpenSymbol" w:hAnsi="OpenSymbol" w:cs="OpenSymbol" w:hint="default"/>
+      </w:rPr>
+    </w:lvl>
+  </w:abstractNum>
+  <w:abstractNum w:abstractNumId="14">
+    <w:lvl w:ilvl="0">
+      <w:start w:val="1"/>
+      <w:numFmt w:val="bullet"/>
+      <w:lvlText w:val=""/>
+      <w:lvlJc w:val="left"/>
+      <w:pPr>
+        <w:tabs>
+          <w:tab w:val="num" w:pos="720"/>
+        </w:tabs>
+        <w:ind w:left="720" w:hanging="360"/>
+      </w:pPr>
+      <w:rPr>
+        <w:rFonts w:ascii="Symbol" w:hAnsi="Symbol" w:cs="Symbol" w:hint="default"/>
+      </w:rPr>
+    </w:lvl>
+    <w:lvl w:ilvl="1">
+      <w:start w:val="1"/>
+      <w:numFmt w:val="bullet"/>
+      <w:lvlText w:val="◦"/>
+      <w:lvlJc w:val="left"/>
+      <w:pPr>
+        <w:tabs>
+          <w:tab w:val="num" w:pos="1080"/>
+        </w:tabs>
+        <w:ind w:left="1080" w:hanging="360"/>
+      </w:pPr>
+      <w:rPr>
+        <w:rFonts w:ascii="OpenSymbol" w:hAnsi="OpenSymbol" w:cs="OpenSymbol" w:hint="default"/>
+      </w:rPr>
+    </w:lvl>
+    <w:lvl w:ilvl="2">
+      <w:start w:val="1"/>
+      <w:numFmt w:val="bullet"/>
+      <w:lvlText w:val="▪"/>
+      <w:lvlJc w:val="left"/>
+      <w:pPr>
+        <w:tabs>
+          <w:tab w:val="num" w:pos="1440"/>
+        </w:tabs>
+        <w:ind w:left="1440" w:hanging="360"/>
+      </w:pPr>
+      <w:rPr>
+        <w:rFonts w:ascii="OpenSymbol" w:hAnsi="OpenSymbol" w:cs="OpenSymbol" w:hint="default"/>
+      </w:rPr>
+    </w:lvl>
+    <w:lvl w:ilvl="3">
+      <w:start w:val="1"/>
+      <w:numFmt w:val="bullet"/>
+      <w:lvlText w:val=""/>
+      <w:lvlJc w:val="left"/>
+      <w:pPr>
+        <w:tabs>
+          <w:tab w:val="num" w:pos="1800"/>
+        </w:tabs>
+        <w:ind w:left="1800" w:hanging="360"/>
+      </w:pPr>
+      <w:rPr>
+        <w:rFonts w:ascii="Symbol" w:hAnsi="Symbol" w:cs="Symbol" w:hint="default"/>
+      </w:rPr>
+    </w:lvl>
+    <w:lvl w:ilvl="4">
+      <w:start w:val="1"/>
+      <w:numFmt w:val="bullet"/>
+      <w:lvlText w:val="◦"/>
+      <w:lvlJc w:val="left"/>
+      <w:pPr>
+        <w:tabs>
+          <w:tab w:val="num" w:pos="2160"/>
+        </w:tabs>
+        <w:ind w:left="2160" w:hanging="360"/>
+      </w:pPr>
+      <w:rPr>
+        <w:rFonts w:ascii="OpenSymbol" w:hAnsi="OpenSymbol" w:cs="OpenSymbol" w:hint="default"/>
+      </w:rPr>
+    </w:lvl>
+    <w:lvl w:ilvl="5">
+      <w:start w:val="1"/>
+      <w:numFmt w:val="bullet"/>
+      <w:lvlText w:val="▪"/>
+      <w:lvlJc w:val="left"/>
+      <w:pPr>
+        <w:tabs>
+          <w:tab w:val="num" w:pos="2520"/>
+        </w:tabs>
+        <w:ind w:left="2520" w:hanging="360"/>
+      </w:pPr>
+      <w:rPr>
+        <w:rFonts w:ascii="OpenSymbol" w:hAnsi="OpenSymbol" w:cs="OpenSymbol" w:hint="default"/>
+      </w:rPr>
+    </w:lvl>
+    <w:lvl w:ilvl="6">
+      <w:start w:val="1"/>
+      <w:numFmt w:val="bullet"/>
+      <w:lvlText w:val=""/>
+      <w:lvlJc w:val="left"/>
+      <w:pPr>
+        <w:tabs>
+          <w:tab w:val="num" w:pos="2880"/>
+        </w:tabs>
+        <w:ind w:left="2880" w:hanging="360"/>
+      </w:pPr>
+      <w:rPr>
+        <w:rFonts w:ascii="Symbol" w:hAnsi="Symbol" w:cs="Symbol" w:hint="default"/>
+      </w:rPr>
+    </w:lvl>
+    <w:lvl w:ilvl="7">
+      <w:start w:val="1"/>
+      <w:numFmt w:val="bullet"/>
+      <w:lvlText w:val="◦"/>
+      <w:lvlJc w:val="left"/>
+      <w:pPr>
+        <w:tabs>
+          <w:tab w:val="num" w:pos="3240"/>
+        </w:tabs>
+        <w:ind w:left="3240" w:hanging="360"/>
+      </w:pPr>
+      <w:rPr>
+        <w:rFonts w:ascii="OpenSymbol" w:hAnsi="OpenSymbol" w:cs="OpenSymbol" w:hint="default"/>
+      </w:rPr>
+    </w:lvl>
+    <w:lvl w:ilvl="8">
+      <w:start w:val="1"/>
+      <w:numFmt w:val="bullet"/>
+      <w:lvlText w:val="▪"/>
+      <w:lvlJc w:val="left"/>
+      <w:pPr>
+        <w:tabs>
+          <w:tab w:val="num" w:pos="3600"/>
+        </w:tabs>
+        <w:ind w:left="3600" w:hanging="360"/>
+      </w:pPr>
+      <w:rPr>
+        <w:rFonts w:ascii="OpenSymbol" w:hAnsi="OpenSymbol" w:cs="OpenSymbol" w:hint="default"/>
+      </w:rPr>
+    </w:lvl>
+  </w:abstractNum>
+  <w:abstractNum w:abstractNumId="15">
+    <w:lvl w:ilvl="0">
+      <w:start w:val="1"/>
+      <w:numFmt w:val="bullet"/>
+      <w:lvlText w:val=""/>
+      <w:lvlJc w:val="left"/>
+      <w:pPr>
+        <w:tabs>
+          <w:tab w:val="num" w:pos="720"/>
+        </w:tabs>
+        <w:ind w:left="720" w:hanging="360"/>
+      </w:pPr>
+      <w:rPr>
+        <w:rFonts w:ascii="Symbol" w:hAnsi="Symbol" w:cs="Symbol" w:hint="default"/>
+      </w:rPr>
+    </w:lvl>
+    <w:lvl w:ilvl="1">
+      <w:start w:val="1"/>
+      <w:numFmt w:val="bullet"/>
+      <w:lvlText w:val="◦"/>
+      <w:lvlJc w:val="left"/>
+      <w:pPr>
+        <w:tabs>
+          <w:tab w:val="num" w:pos="1080"/>
+        </w:tabs>
+        <w:ind w:left="1080" w:hanging="360"/>
+      </w:pPr>
+      <w:rPr>
+        <w:rFonts w:ascii="OpenSymbol" w:hAnsi="OpenSymbol" w:cs="OpenSymbol" w:hint="default"/>
+      </w:rPr>
+    </w:lvl>
+    <w:lvl w:ilvl="2">
+      <w:start w:val="1"/>
+      <w:numFmt w:val="bullet"/>
+      <w:lvlText w:val="▪"/>
+      <w:lvlJc w:val="left"/>
+      <w:pPr>
+        <w:tabs>
+          <w:tab w:val="num" w:pos="1440"/>
+        </w:tabs>
+        <w:ind w:left="1440" w:hanging="360"/>
+      </w:pPr>
+      <w:rPr>
+        <w:rFonts w:ascii="OpenSymbol" w:hAnsi="OpenSymbol" w:cs="OpenSymbol" w:hint="default"/>
+      </w:rPr>
+    </w:lvl>
+    <w:lvl w:ilvl="3">
+      <w:start w:val="1"/>
+      <w:numFmt w:val="bullet"/>
+      <w:lvlText w:val=""/>
+      <w:lvlJc w:val="left"/>
+      <w:pPr>
+        <w:tabs>
+          <w:tab w:val="num" w:pos="1800"/>
+        </w:tabs>
+        <w:ind w:left="1800" w:hanging="360"/>
+      </w:pPr>
+      <w:rPr>
+        <w:rFonts w:ascii="Symbol" w:hAnsi="Symbol" w:cs="Symbol" w:hint="default"/>
+      </w:rPr>
+    </w:lvl>
+    <w:lvl w:ilvl="4">
+      <w:start w:val="1"/>
+      <w:numFmt w:val="bullet"/>
+      <w:lvlText w:val="◦"/>
+      <w:lvlJc w:val="left"/>
+      <w:pPr>
+        <w:tabs>
+          <w:tab w:val="num" w:pos="2160"/>
+        </w:tabs>
+        <w:ind w:left="2160" w:hanging="360"/>
+      </w:pPr>
+      <w:rPr>
+        <w:rFonts w:ascii="OpenSymbol" w:hAnsi="OpenSymbol" w:cs="OpenSymbol" w:hint="default"/>
+      </w:rPr>
+    </w:lvl>
+    <w:lvl w:ilvl="5">
+      <w:start w:val="1"/>
+      <w:numFmt w:val="bullet"/>
+      <w:lvlText w:val="▪"/>
+      <w:lvlJc w:val="left"/>
+      <w:pPr>
+        <w:tabs>
+          <w:tab w:val="num" w:pos="2520"/>
+        </w:tabs>
+        <w:ind w:left="2520" w:hanging="360"/>
+      </w:pPr>
+      <w:rPr>
+        <w:rFonts w:ascii="OpenSymbol" w:hAnsi="OpenSymbol" w:cs="OpenSymbol" w:hint="default"/>
+      </w:rPr>
+    </w:lvl>
+    <w:lvl w:ilvl="6">
+      <w:start w:val="1"/>
+      <w:numFmt w:val="bullet"/>
+      <w:lvlText w:val=""/>
+      <w:lvlJc w:val="left"/>
+      <w:pPr>
+        <w:tabs>
+          <w:tab w:val="num" w:pos="2880"/>
+        </w:tabs>
+        <w:ind w:left="2880" w:hanging="360"/>
+      </w:pPr>
+      <w:rPr>
+        <w:rFonts w:ascii="Symbol" w:hAnsi="Symbol" w:cs="Symbol" w:hint="default"/>
+      </w:rPr>
+    </w:lvl>
+    <w:lvl w:ilvl="7">
+      <w:start w:val="1"/>
+      <w:numFmt w:val="bullet"/>
+      <w:lvlText w:val="◦"/>
+      <w:lvlJc w:val="left"/>
+      <w:pPr>
+        <w:tabs>
+          <w:tab w:val="num" w:pos="3240"/>
+        </w:tabs>
+        <w:ind w:left="3240" w:hanging="360"/>
+      </w:pPr>
+      <w:rPr>
+        <w:rFonts w:ascii="OpenSymbol" w:hAnsi="OpenSymbol" w:cs="OpenSymbol" w:hint="default"/>
+      </w:rPr>
+    </w:lvl>
+    <w:lvl w:ilvl="8">
+      <w:start w:val="1"/>
+      <w:numFmt w:val="bullet"/>
+      <w:lvlText w:val="▪"/>
+      <w:lvlJc w:val="left"/>
+      <w:pPr>
+        <w:tabs>
+          <w:tab w:val="num" w:pos="3600"/>
+        </w:tabs>
+        <w:ind w:left="3600" w:hanging="360"/>
+      </w:pPr>
+      <w:rPr>
+        <w:rFonts w:ascii="OpenSymbol" w:hAnsi="OpenSymbol" w:cs="OpenSymbol" w:hint="default"/>
+      </w:rPr>
+    </w:lvl>
+  </w:abstractNum>
+  <w:abstractNum w:abstractNumId="16">
     <w:lvl w:ilvl="0">
       <w:start w:val="1"/>
       <w:numFmt w:val="none"/>
@@ -8850,6 +9878,15 @@
   </w:num>
   <w:num w:numId="13">
     <w:abstractNumId w:val="13"/>
+  </w:num>
+  <w:num w:numId="14">
+    <w:abstractNumId w:val="14"/>
+  </w:num>
+  <w:num w:numId="15">
+    <w:abstractNumId w:val="15"/>
+  </w:num>
+  <w:num w:numId="16">
+    <w:abstractNumId w:val="16"/>
   </w:num>
 </w:numbering>
 </file>

</xml_diff>

<commit_message>
22/11/2025 - 20:34 h
</commit_message>
<xml_diff>
--- a/O mandamento maior/O Mandamento Maior.docx
+++ b/O mandamento maior/O Mandamento Maior.docx
@@ -322,403 +322,455 @@
           <w:shd w:fill="auto" w:val="clear"/>
           <w:lang w:val="en-US" w:eastAsia="zh-CN" w:bidi="hi-IN"/>
         </w:rPr>
-        <w:t xml:space="preserve">Nos capítulos 21, 22 e 23 do Evangelho de Mateus, percebe-se claramente um crescente clima de confronto entre Jesus e as lideranças religiosas da época. </w:t>
-      </w:r>
-    </w:p>
-    <w:p>
-      <w:pPr>
-        <w:pStyle w:val="Normal"/>
-        <w:jc w:val="both"/>
-        <w:rPr>
-          <w:sz w:val="36"/>
-          <w:szCs w:val="36"/>
-        </w:rPr>
-      </w:pPr>
-      <w:r>
-        <w:rPr>
-          <w:sz w:val="36"/>
-          <w:szCs w:val="36"/>
-        </w:rPr>
-      </w:r>
-    </w:p>
-    <w:p>
-      <w:pPr>
-        <w:pStyle w:val="Normal"/>
-        <w:jc w:val="both"/>
-        <w:rPr>
-          <w:sz w:val="36"/>
-          <w:szCs w:val="36"/>
-        </w:rPr>
-      </w:pPr>
-      <w:r>
-        <w:rPr>
-          <w:rFonts w:eastAsia="Times New Roman" w:cs="Times New Roman" w:ascii="Garamond" w:hAnsi="Garamond"/>
-          <w:color w:val="000000"/>
-          <w:kern w:val="0"/>
-          <w:sz w:val="36"/>
-          <w:szCs w:val="36"/>
-          <w:shd w:fill="auto" w:val="clear"/>
-          <w:lang w:val="en-US" w:eastAsia="zh-CN" w:bidi="hi-IN"/>
-        </w:rPr>
-        <w:t>O Mestre começa mostrando que a fé sem frutos é estéril — como a figueira que seca — e que o templo não é lugar de comércio, mas de oração — quando ele expulsa os vendilhões de lá. Em tudo isso, Jesus está denunciando a esterilidade da fé exterior e expõe o vazio de uma religião feita de ritos, vaidades e julgamentos.</w:t>
-      </w:r>
-    </w:p>
-    <w:p>
-      <w:pPr>
-        <w:pStyle w:val="Normal"/>
-        <w:jc w:val="both"/>
-        <w:rPr>
-          <w:sz w:val="36"/>
-          <w:szCs w:val="36"/>
-        </w:rPr>
-      </w:pPr>
-      <w:r>
-        <w:rPr>
-          <w:sz w:val="36"/>
-          <w:szCs w:val="36"/>
-        </w:rPr>
-      </w:r>
-    </w:p>
-    <w:p>
-      <w:pPr>
-        <w:pStyle w:val="Normal"/>
-        <w:jc w:val="both"/>
-        <w:rPr>
-          <w:sz w:val="36"/>
-          <w:szCs w:val="36"/>
-        </w:rPr>
-      </w:pPr>
-      <w:r>
-        <w:rPr>
-          <w:rFonts w:eastAsia="Times New Roman" w:cs="Times New Roman" w:ascii="Garamond" w:hAnsi="Garamond"/>
-          <w:color w:val="000000"/>
-          <w:kern w:val="0"/>
-          <w:sz w:val="36"/>
-          <w:szCs w:val="36"/>
-          <w:shd w:fill="auto" w:val="clear"/>
-          <w:lang w:val="en-US" w:eastAsia="zh-CN" w:bidi="hi-IN"/>
-        </w:rPr>
-        <w:t xml:space="preserve">Os fariseus e saduceus faziam perguntas e criavam armadilhas com o único propósito de fazer Jesus cair em contradição; tudo o que eles queriam era desacreditar o Mestre. </w:t>
-      </w:r>
-    </w:p>
-    <w:p>
-      <w:pPr>
-        <w:pStyle w:val="Normal"/>
-        <w:jc w:val="both"/>
-        <w:rPr>
-          <w:sz w:val="36"/>
-          <w:szCs w:val="36"/>
-        </w:rPr>
-      </w:pPr>
-      <w:r>
-        <w:rPr>
-          <w:sz w:val="36"/>
-          <w:szCs w:val="36"/>
-        </w:rPr>
-      </w:r>
-    </w:p>
-    <w:p>
-      <w:pPr>
-        <w:pStyle w:val="Normal"/>
-        <w:jc w:val="both"/>
-        <w:rPr>
-          <w:sz w:val="36"/>
-          <w:szCs w:val="36"/>
-        </w:rPr>
-      </w:pPr>
-      <w:r>
-        <w:rPr>
-          <w:rFonts w:eastAsia="Times New Roman" w:cs="Times New Roman" w:ascii="Garamond" w:hAnsi="Garamond"/>
-          <w:color w:val="000000"/>
-          <w:kern w:val="0"/>
-          <w:sz w:val="36"/>
-          <w:szCs w:val="36"/>
-          <w:shd w:fill="auto" w:val="clear"/>
-          <w:lang w:val="en-US" w:eastAsia="zh-CN" w:bidi="hi-IN"/>
-        </w:rPr>
-        <w:t>Embora tanto os fariseus quanto os saduceus tenham confrontado Jesus, havia entre eles diferenças bem marcantes.</w:t>
-      </w:r>
-    </w:p>
-    <w:p>
-      <w:pPr>
-        <w:pStyle w:val="Normal"/>
-        <w:jc w:val="both"/>
-        <w:rPr>
-          <w:sz w:val="36"/>
-          <w:szCs w:val="36"/>
-        </w:rPr>
-      </w:pPr>
-      <w:r>
-        <w:rPr>
-          <w:sz w:val="36"/>
-          <w:szCs w:val="36"/>
-        </w:rPr>
-      </w:r>
-    </w:p>
-    <w:p>
-      <w:pPr>
-        <w:pStyle w:val="Normal"/>
-        <w:jc w:val="both"/>
-        <w:rPr>
-          <w:sz w:val="36"/>
-          <w:szCs w:val="36"/>
-        </w:rPr>
-      </w:pPr>
-      <w:r>
-        <w:rPr>
-          <w:rFonts w:eastAsia="Times New Roman" w:cs="Times New Roman" w:ascii="Garamond" w:hAnsi="Garamond"/>
-          <w:color w:val="000000"/>
-          <w:kern w:val="0"/>
-          <w:sz w:val="36"/>
-          <w:szCs w:val="36"/>
-          <w:shd w:fill="auto" w:val="clear"/>
-          <w:lang w:val="en-US" w:eastAsia="zh-CN" w:bidi="hi-IN"/>
-        </w:rPr>
-        <w:t>Os saduceus formavam um grupo pequeno, ligado às elites sacerdotais e políticas de Jerusalém. Eles se apegavam somente à Torá escrita — os cinco livros de Moisés — e não acreditavam na imortalidade da alma nem na existência dos espíritos.</w:t>
-      </w:r>
-    </w:p>
-    <w:p>
-      <w:pPr>
-        <w:pStyle w:val="Normal"/>
-        <w:jc w:val="both"/>
-        <w:rPr>
-          <w:sz w:val="36"/>
-          <w:szCs w:val="36"/>
-        </w:rPr>
-      </w:pPr>
-      <w:r>
-        <w:rPr>
-          <w:sz w:val="36"/>
-          <w:szCs w:val="36"/>
-        </w:rPr>
-      </w:r>
-    </w:p>
-    <w:p>
-      <w:pPr>
-        <w:pStyle w:val="Normal"/>
-        <w:jc w:val="both"/>
-        <w:rPr>
-          <w:sz w:val="36"/>
-          <w:szCs w:val="36"/>
-        </w:rPr>
-      </w:pPr>
-      <w:r>
-        <w:rPr>
-          <w:rFonts w:eastAsia="Times New Roman" w:cs="Times New Roman" w:ascii="Garamond" w:hAnsi="Garamond"/>
-          <w:color w:val="000000"/>
-          <w:kern w:val="0"/>
-          <w:sz w:val="36"/>
-          <w:szCs w:val="36"/>
-          <w:shd w:fill="auto" w:val="clear"/>
-          <w:lang w:val="en-US" w:eastAsia="zh-CN" w:bidi="hi-IN"/>
-        </w:rPr>
-        <w:t>Para os saduceus, toda recompensa divina acontecia aqui mesmo, na vida terrena. A fé, para eles, era algo exterior — uma prática sustentada pelo poder e pelas aparências.</w:t>
-      </w:r>
-    </w:p>
-    <w:p>
-      <w:pPr>
-        <w:pStyle w:val="Normal"/>
-        <w:jc w:val="both"/>
-        <w:rPr>
-          <w:sz w:val="36"/>
-          <w:szCs w:val="36"/>
-        </w:rPr>
-      </w:pPr>
-      <w:r>
-        <w:rPr>
-          <w:sz w:val="36"/>
-          <w:szCs w:val="36"/>
-        </w:rPr>
-      </w:r>
-    </w:p>
-    <w:p>
-      <w:pPr>
-        <w:pStyle w:val="Normal"/>
-        <w:jc w:val="both"/>
-        <w:rPr>
-          <w:sz w:val="36"/>
-          <w:szCs w:val="36"/>
-        </w:rPr>
-      </w:pPr>
-      <w:r>
-        <w:rPr>
-          <w:rFonts w:eastAsia="Times New Roman" w:cs="Times New Roman" w:ascii="Garamond" w:hAnsi="Garamond"/>
-          <w:color w:val="000000"/>
-          <w:kern w:val="0"/>
-          <w:sz w:val="36"/>
-          <w:szCs w:val="36"/>
-          <w:shd w:fill="auto" w:val="clear"/>
-          <w:lang w:val="en-US" w:eastAsia="zh-CN" w:bidi="hi-IN"/>
-        </w:rPr>
-        <w:t>Os fariseus, por outro lado, eram estudiosos e muito dedicados ao cumprimento da Lei. Mas a crença deles ia além da Torá: eles aceitavam todos os livros sagrados do judaísmo — o que hoje conhecemos como Antigo Testamento — e também valorizavam o que chamavam de “Lei Oral”.</w:t>
-      </w:r>
-    </w:p>
-    <w:p>
-      <w:pPr>
-        <w:pStyle w:val="Normal"/>
-        <w:jc w:val="both"/>
-        <w:rPr>
-          <w:sz w:val="36"/>
-          <w:szCs w:val="36"/>
-        </w:rPr>
-      </w:pPr>
-      <w:r>
-        <w:rPr>
-          <w:sz w:val="36"/>
-          <w:szCs w:val="36"/>
-        </w:rPr>
-      </w:r>
-    </w:p>
-    <w:p>
-      <w:pPr>
-        <w:pStyle w:val="Normal"/>
-        <w:jc w:val="both"/>
-        <w:rPr>
-          <w:sz w:val="36"/>
-          <w:szCs w:val="36"/>
-        </w:rPr>
-      </w:pPr>
-      <w:r>
-        <w:rPr>
-          <w:rFonts w:eastAsia="Times New Roman" w:cs="Times New Roman" w:ascii="Garamond" w:hAnsi="Garamond"/>
-          <w:color w:val="000000"/>
-          <w:kern w:val="0"/>
-          <w:sz w:val="36"/>
-          <w:szCs w:val="36"/>
-          <w:shd w:fill="auto" w:val="clear"/>
-          <w:lang w:val="en-US" w:eastAsia="zh-CN" w:bidi="hi-IN"/>
-        </w:rPr>
-        <w:t>Essa Lei Oral era o conjunto de tradições e interpretações passadas de geração em geração. Ela explicava como aplicar a Lei escrita nas situações do dia a dia. Os fariseus também acreditavam na vida espiritual e na ressurreição.</w:t>
-      </w:r>
-    </w:p>
-    <w:p>
-      <w:pPr>
-        <w:pStyle w:val="Normal"/>
-        <w:jc w:val="both"/>
-        <w:rPr>
-          <w:sz w:val="36"/>
-          <w:szCs w:val="36"/>
-        </w:rPr>
-      </w:pPr>
-      <w:r>
-        <w:rPr>
-          <w:sz w:val="36"/>
-          <w:szCs w:val="36"/>
-        </w:rPr>
-      </w:r>
-    </w:p>
-    <w:p>
-      <w:pPr>
-        <w:pStyle w:val="Normal"/>
-        <w:jc w:val="both"/>
-        <w:rPr>
-          <w:sz w:val="36"/>
-          <w:szCs w:val="36"/>
-        </w:rPr>
-      </w:pPr>
-      <w:r>
-        <w:rPr>
-          <w:rFonts w:eastAsia="Times New Roman" w:cs="Times New Roman" w:ascii="Garamond" w:hAnsi="Garamond"/>
-          <w:color w:val="000000"/>
-          <w:kern w:val="0"/>
-          <w:sz w:val="36"/>
-          <w:szCs w:val="36"/>
-          <w:shd w:fill="auto" w:val="clear"/>
-          <w:lang w:val="en-US" w:eastAsia="zh-CN" w:bidi="hi-IN"/>
-        </w:rPr>
-        <w:t>O problema é que, com o tempo, muitos deles começaram a se apegar demais às regras e às aparências. Cumpriam tudo à risca, mas deixavam o coração de fora. A fé virou um exercício de vaidade, mais preocupado com a forma do que com o espírito.</w:t>
-      </w:r>
-    </w:p>
-    <w:p>
-      <w:pPr>
-        <w:pStyle w:val="Normal"/>
-        <w:jc w:val="both"/>
-        <w:rPr>
-          <w:sz w:val="36"/>
-          <w:szCs w:val="36"/>
-        </w:rPr>
-      </w:pPr>
-      <w:r>
-        <w:rPr>
-          <w:sz w:val="36"/>
-          <w:szCs w:val="36"/>
-        </w:rPr>
-      </w:r>
-    </w:p>
-    <w:p>
-      <w:pPr>
-        <w:pStyle w:val="Normal"/>
-        <w:jc w:val="both"/>
-        <w:rPr>
-          <w:sz w:val="36"/>
-          <w:szCs w:val="36"/>
-        </w:rPr>
-      </w:pPr>
-      <w:r>
-        <w:rPr>
-          <w:rFonts w:eastAsia="Times New Roman" w:cs="Times New Roman" w:ascii="Garamond" w:hAnsi="Garamond"/>
-          <w:color w:val="000000"/>
-          <w:kern w:val="0"/>
-          <w:sz w:val="36"/>
-          <w:szCs w:val="36"/>
-          <w:shd w:fill="auto" w:val="clear"/>
-          <w:lang w:val="en-US" w:eastAsia="zh-CN" w:bidi="hi-IN"/>
-        </w:rPr>
-        <w:t>Por isso, Jesus foi mais duro com eles. Porque, apesar de estarem mais próximos da verdade, acabaram se distanciando da essência dela — que é o amor e a humildade.</w:t>
-      </w:r>
-    </w:p>
-    <w:p>
-      <w:pPr>
-        <w:pStyle w:val="Normal"/>
-        <w:jc w:val="both"/>
-        <w:rPr>
-          <w:sz w:val="36"/>
-          <w:szCs w:val="36"/>
-        </w:rPr>
-      </w:pPr>
-      <w:r>
-        <w:rPr>
-          <w:sz w:val="36"/>
-          <w:szCs w:val="36"/>
-        </w:rPr>
-      </w:r>
-    </w:p>
-    <w:p>
-      <w:pPr>
-        <w:pStyle w:val="Normal"/>
-        <w:jc w:val="both"/>
-        <w:rPr>
-          <w:sz w:val="36"/>
-          <w:szCs w:val="36"/>
-        </w:rPr>
-      </w:pPr>
-      <w:r>
-        <w:rPr>
-          <w:rFonts w:eastAsia="Times New Roman" w:cs="Times New Roman" w:ascii="Garamond" w:hAnsi="Garamond"/>
-          <w:color w:val="000000"/>
-          <w:kern w:val="0"/>
-          <w:sz w:val="36"/>
-          <w:szCs w:val="36"/>
-          <w:shd w:fill="auto" w:val="clear"/>
-          <w:lang w:val="en-US" w:eastAsia="zh-CN" w:bidi="hi-IN"/>
-        </w:rPr>
-        <w:t xml:space="preserve">Apesar dessas diferenças acentuadas entre as crenças dos saduceus e dos fariseus, ambos confrontaram Jesus e nesses embates, o Mestre sempre respondeu com sabedoria, elevando o diálogo a um nível espiritual que eles não conseguiam alcançar. </w:t>
-      </w:r>
-    </w:p>
-    <w:p>
-      <w:pPr>
-        <w:pStyle w:val="Normal"/>
-        <w:jc w:val="both"/>
-        <w:rPr>
-          <w:sz w:val="36"/>
-          <w:szCs w:val="36"/>
-        </w:rPr>
-      </w:pPr>
-      <w:r>
-        <w:rPr>
-          <w:sz w:val="36"/>
-          <w:szCs w:val="36"/>
-        </w:rPr>
+        <w:t xml:space="preserve">Nos capítulos 21, 22 e 23 do Evangelho de Mateus, </w:t>
+      </w:r>
+      <w:r>
+        <w:rPr>
+          <w:rFonts w:eastAsia="Times New Roman" w:cs="Times New Roman" w:ascii="Garamond" w:hAnsi="Garamond"/>
+          <w:color w:val="000000"/>
+          <w:kern w:val="0"/>
+          <w:sz w:val="36"/>
+          <w:szCs w:val="36"/>
+          <w:shd w:fill="auto" w:val="clear"/>
+          <w:lang w:val="en-US" w:eastAsia="zh-CN" w:bidi="hi-IN"/>
+        </w:rPr>
+        <w:t>nós percebemos</w:t>
+      </w:r>
+      <w:r>
+        <w:rPr>
+          <w:rFonts w:eastAsia="Times New Roman" w:cs="Times New Roman" w:ascii="Garamond" w:hAnsi="Garamond"/>
+          <w:color w:val="000000"/>
+          <w:kern w:val="0"/>
+          <w:sz w:val="36"/>
+          <w:szCs w:val="36"/>
+          <w:shd w:fill="auto" w:val="clear"/>
+          <w:lang w:val="en-US" w:eastAsia="zh-CN" w:bidi="hi-IN"/>
+        </w:rPr>
+        <w:t xml:space="preserve"> um crescente clima de confronto entre Jesus e as lideranças religiosas da época. </w:t>
+      </w:r>
+    </w:p>
+    <w:p>
+      <w:pPr>
+        <w:pStyle w:val="Normal"/>
+        <w:jc w:val="both"/>
+        <w:rPr>
+          <w:sz w:val="36"/>
+          <w:szCs w:val="36"/>
+        </w:rPr>
+      </w:pPr>
+      <w:r>
+        <w:rPr>
+          <w:sz w:val="36"/>
+          <w:szCs w:val="36"/>
+        </w:rPr>
+      </w:r>
+    </w:p>
+    <w:p>
+      <w:pPr>
+        <w:pStyle w:val="Normal"/>
+        <w:jc w:val="both"/>
+        <w:rPr>
+          <w:sz w:val="36"/>
+          <w:szCs w:val="36"/>
+        </w:rPr>
+      </w:pPr>
+      <w:r>
+        <w:rPr>
+          <w:rFonts w:eastAsia="Times New Roman" w:cs="Times New Roman" w:ascii="Garamond" w:hAnsi="Garamond"/>
+          <w:color w:val="000000"/>
+          <w:kern w:val="0"/>
+          <w:sz w:val="36"/>
+          <w:szCs w:val="36"/>
+          <w:shd w:fill="auto" w:val="clear"/>
+          <w:lang w:val="en-US" w:eastAsia="zh-CN" w:bidi="hi-IN"/>
+        </w:rPr>
+        <w:t xml:space="preserve">Primeiro </w:t>
+      </w:r>
+      <w:r>
+        <w:rPr>
+          <w:rFonts w:eastAsia="Times New Roman" w:cs="Times New Roman" w:ascii="Garamond" w:hAnsi="Garamond"/>
+          <w:color w:val="000000"/>
+          <w:kern w:val="0"/>
+          <w:sz w:val="36"/>
+          <w:szCs w:val="36"/>
+          <w:shd w:fill="auto" w:val="clear"/>
+          <w:lang w:val="en-US" w:eastAsia="zh-CN" w:bidi="hi-IN"/>
+        </w:rPr>
+        <w:t>Jesus</w:t>
+      </w:r>
+      <w:r>
+        <w:rPr>
+          <w:rFonts w:eastAsia="Times New Roman" w:cs="Times New Roman" w:ascii="Garamond" w:hAnsi="Garamond"/>
+          <w:color w:val="000000"/>
+          <w:kern w:val="0"/>
+          <w:sz w:val="36"/>
+          <w:szCs w:val="36"/>
+          <w:shd w:fill="auto" w:val="clear"/>
+          <w:lang w:val="en-US" w:eastAsia="zh-CN" w:bidi="hi-IN"/>
+        </w:rPr>
+        <w:t xml:space="preserve"> expulsa os mercadores do templo, dizendo que </w:t>
+      </w:r>
+      <w:r>
+        <w:rPr>
+          <w:rFonts w:eastAsia="Times New Roman" w:cs="Times New Roman" w:ascii="Garamond" w:hAnsi="Garamond"/>
+          <w:color w:val="000000"/>
+          <w:kern w:val="0"/>
+          <w:sz w:val="36"/>
+          <w:szCs w:val="36"/>
+          <w:shd w:fill="auto" w:val="clear"/>
+          <w:lang w:val="en-US" w:eastAsia="zh-CN" w:bidi="hi-IN"/>
+        </w:rPr>
+        <w:t>aquele era</w:t>
+      </w:r>
+      <w:r>
+        <w:rPr>
+          <w:rFonts w:eastAsia="Times New Roman" w:cs="Times New Roman" w:ascii="Garamond" w:hAnsi="Garamond"/>
+          <w:color w:val="000000"/>
+          <w:kern w:val="0"/>
+          <w:sz w:val="36"/>
+          <w:szCs w:val="36"/>
+          <w:shd w:fill="auto" w:val="clear"/>
+          <w:lang w:val="en-US" w:eastAsia="zh-CN" w:bidi="hi-IN"/>
+        </w:rPr>
+        <w:t xml:space="preserve"> um lugar de oração e não de comércio. Depois </w:t>
+      </w:r>
+      <w:r>
+        <w:rPr>
+          <w:rFonts w:eastAsia="Times New Roman" w:cs="Times New Roman" w:ascii="Garamond" w:hAnsi="Garamond"/>
+          <w:color w:val="000000"/>
+          <w:kern w:val="0"/>
+          <w:sz w:val="36"/>
+          <w:szCs w:val="36"/>
+          <w:shd w:fill="auto" w:val="clear"/>
+          <w:lang w:val="en-US" w:eastAsia="zh-CN" w:bidi="hi-IN"/>
+        </w:rPr>
+        <w:t>E</w:t>
+      </w:r>
+      <w:r>
+        <w:rPr>
+          <w:rFonts w:eastAsia="Times New Roman" w:cs="Times New Roman" w:ascii="Garamond" w:hAnsi="Garamond"/>
+          <w:color w:val="000000"/>
+          <w:kern w:val="0"/>
+          <w:sz w:val="36"/>
+          <w:szCs w:val="36"/>
+          <w:shd w:fill="auto" w:val="clear"/>
+          <w:lang w:val="en-US" w:eastAsia="zh-CN" w:bidi="hi-IN"/>
+        </w:rPr>
+        <w:t>le seca a figueira que não dava frutos, mostrando que a fé sem obras é estéril. Com esses exemplos</w:t>
+      </w:r>
+      <w:r>
+        <w:rPr>
+          <w:rFonts w:eastAsia="Times New Roman" w:cs="Times New Roman" w:ascii="Garamond" w:hAnsi="Garamond"/>
+          <w:color w:val="000000"/>
+          <w:kern w:val="0"/>
+          <w:sz w:val="36"/>
+          <w:szCs w:val="36"/>
+          <w:shd w:fill="auto" w:val="clear"/>
+          <w:lang w:val="en-US" w:eastAsia="zh-CN" w:bidi="hi-IN"/>
+        </w:rPr>
+        <w:t xml:space="preserve">, Jesus </w:t>
+      </w:r>
+      <w:r>
+        <w:rPr>
+          <w:rFonts w:eastAsia="Times New Roman" w:cs="Times New Roman" w:ascii="Garamond" w:hAnsi="Garamond"/>
+          <w:color w:val="000000"/>
+          <w:kern w:val="0"/>
+          <w:sz w:val="36"/>
+          <w:szCs w:val="36"/>
+          <w:shd w:fill="auto" w:val="clear"/>
+          <w:lang w:val="en-US" w:eastAsia="zh-CN" w:bidi="hi-IN"/>
+        </w:rPr>
+        <w:t>expõe</w:t>
+      </w:r>
+      <w:r>
+        <w:rPr>
+          <w:rFonts w:eastAsia="Times New Roman" w:cs="Times New Roman" w:ascii="Garamond" w:hAnsi="Garamond"/>
+          <w:color w:val="000000"/>
+          <w:kern w:val="0"/>
+          <w:sz w:val="36"/>
+          <w:szCs w:val="36"/>
+          <w:shd w:fill="auto" w:val="clear"/>
+          <w:lang w:val="en-US" w:eastAsia="zh-CN" w:bidi="hi-IN"/>
+        </w:rPr>
+        <w:t xml:space="preserve"> a </w:t>
+      </w:r>
+      <w:r>
+        <w:rPr>
+          <w:rFonts w:eastAsia="Times New Roman" w:cs="Times New Roman" w:ascii="Garamond" w:hAnsi="Garamond"/>
+          <w:color w:val="000000"/>
+          <w:kern w:val="0"/>
+          <w:sz w:val="36"/>
+          <w:szCs w:val="36"/>
+          <w:shd w:fill="auto" w:val="clear"/>
+          <w:lang w:val="en-US" w:eastAsia="zh-CN" w:bidi="hi-IN"/>
+        </w:rPr>
+        <w:t>inutilidade</w:t>
+      </w:r>
+      <w:r>
+        <w:rPr>
+          <w:rFonts w:eastAsia="Times New Roman" w:cs="Times New Roman" w:ascii="Garamond" w:hAnsi="Garamond"/>
+          <w:color w:val="000000"/>
+          <w:kern w:val="0"/>
+          <w:sz w:val="36"/>
+          <w:szCs w:val="36"/>
+          <w:shd w:fill="auto" w:val="clear"/>
+          <w:lang w:val="en-US" w:eastAsia="zh-CN" w:bidi="hi-IN"/>
+        </w:rPr>
+        <w:t xml:space="preserve"> da fé exterior e o vazio</w:t>
+      </w:r>
+      <w:r>
+        <w:rPr>
+          <w:rFonts w:eastAsia="Times New Roman" w:cs="Times New Roman" w:ascii="Garamond" w:hAnsi="Garamond"/>
+          <w:color w:val="000000"/>
+          <w:kern w:val="0"/>
+          <w:sz w:val="36"/>
+          <w:szCs w:val="36"/>
+          <w:shd w:fill="auto" w:val="clear"/>
+          <w:lang w:val="en-US" w:eastAsia="zh-CN" w:bidi="hi-IN"/>
+        </w:rPr>
+        <w:t xml:space="preserve"> d</w:t>
+      </w:r>
+      <w:r>
+        <w:rPr>
+          <w:rFonts w:eastAsia="Times New Roman" w:cs="Times New Roman" w:ascii="Garamond" w:hAnsi="Garamond"/>
+          <w:color w:val="000000"/>
+          <w:kern w:val="0"/>
+          <w:sz w:val="36"/>
+          <w:szCs w:val="36"/>
+          <w:shd w:fill="auto" w:val="clear"/>
+          <w:lang w:val="en-US" w:eastAsia="zh-CN" w:bidi="hi-IN"/>
+        </w:rPr>
+        <w:t>a religião feita de ritos, vaidades e julgamentos.</w:t>
+      </w:r>
+    </w:p>
+    <w:p>
+      <w:pPr>
+        <w:pStyle w:val="Normal"/>
+        <w:jc w:val="both"/>
+        <w:rPr>
+          <w:sz w:val="36"/>
+          <w:szCs w:val="36"/>
+        </w:rPr>
+      </w:pPr>
+      <w:r>
+        <w:rPr>
+          <w:sz w:val="36"/>
+          <w:szCs w:val="36"/>
+        </w:rPr>
+      </w:r>
+    </w:p>
+    <w:p>
+      <w:pPr>
+        <w:pStyle w:val="Normal"/>
+        <w:jc w:val="both"/>
+        <w:rPr>
+          <w:sz w:val="36"/>
+          <w:szCs w:val="36"/>
+        </w:rPr>
+      </w:pPr>
+      <w:r>
+        <w:rPr>
+          <w:rFonts w:eastAsia="Times New Roman" w:cs="Times New Roman" w:ascii="Garamond" w:hAnsi="Garamond"/>
+          <w:color w:val="000000"/>
+          <w:kern w:val="0"/>
+          <w:sz w:val="36"/>
+          <w:szCs w:val="36"/>
+          <w:shd w:fill="auto" w:val="clear"/>
+          <w:lang w:val="en-US" w:eastAsia="zh-CN" w:bidi="hi-IN"/>
+        </w:rPr>
+        <w:t xml:space="preserve">Fariseus e saduceus viviam tentando colocar Jesus em situações difíceis, fazendo perguntas </w:t>
+      </w:r>
+      <w:r>
+        <w:rPr>
+          <w:rFonts w:eastAsia="Times New Roman" w:cs="Times New Roman" w:ascii="Garamond" w:hAnsi="Garamond"/>
+          <w:color w:val="000000"/>
+          <w:kern w:val="0"/>
+          <w:sz w:val="36"/>
+          <w:szCs w:val="36"/>
+          <w:shd w:fill="auto" w:val="clear"/>
+          <w:lang w:val="en-US" w:eastAsia="zh-CN" w:bidi="hi-IN"/>
+        </w:rPr>
+        <w:t>maliciosas</w:t>
+      </w:r>
+      <w:r>
+        <w:rPr>
+          <w:rFonts w:eastAsia="Times New Roman" w:cs="Times New Roman" w:ascii="Garamond" w:hAnsi="Garamond"/>
+          <w:color w:val="000000"/>
+          <w:kern w:val="0"/>
+          <w:sz w:val="36"/>
+          <w:szCs w:val="36"/>
+          <w:shd w:fill="auto" w:val="clear"/>
+          <w:lang w:val="en-US" w:eastAsia="zh-CN" w:bidi="hi-IN"/>
+        </w:rPr>
+        <w:t xml:space="preserve"> </w:t>
+      </w:r>
+      <w:r>
+        <w:rPr>
+          <w:rFonts w:eastAsia="Times New Roman" w:cs="Times New Roman" w:ascii="Garamond" w:hAnsi="Garamond"/>
+          <w:color w:val="000000"/>
+          <w:kern w:val="0"/>
+          <w:sz w:val="36"/>
+          <w:szCs w:val="36"/>
+          <w:shd w:fill="auto" w:val="clear"/>
+          <w:lang w:val="en-US" w:eastAsia="zh-CN" w:bidi="hi-IN"/>
+        </w:rPr>
+        <w:t>com a  intenção de fazer Jesus cair em</w:t>
+      </w:r>
+      <w:r>
+        <w:rPr>
+          <w:rFonts w:eastAsia="Times New Roman" w:cs="Times New Roman" w:ascii="Garamond" w:hAnsi="Garamond"/>
+          <w:color w:val="000000"/>
+          <w:kern w:val="0"/>
+          <w:sz w:val="36"/>
+          <w:szCs w:val="36"/>
+          <w:shd w:fill="auto" w:val="clear"/>
+          <w:lang w:val="en-US" w:eastAsia="zh-CN" w:bidi="hi-IN"/>
+        </w:rPr>
+        <w:t xml:space="preserve"> contradição e </w:t>
+      </w:r>
+      <w:r>
+        <w:rPr>
+          <w:rFonts w:eastAsia="Times New Roman" w:cs="Times New Roman" w:ascii="Garamond" w:hAnsi="Garamond"/>
+          <w:color w:val="000000"/>
+          <w:kern w:val="0"/>
+          <w:sz w:val="36"/>
+          <w:szCs w:val="36"/>
+          <w:shd w:fill="auto" w:val="clear"/>
+          <w:lang w:val="en-US" w:eastAsia="zh-CN" w:bidi="hi-IN"/>
+        </w:rPr>
+        <w:t>ser desmoralizado</w:t>
+      </w:r>
+      <w:r>
+        <w:rPr>
+          <w:rFonts w:eastAsia="Times New Roman" w:cs="Times New Roman" w:ascii="Garamond" w:hAnsi="Garamond"/>
+          <w:color w:val="000000"/>
+          <w:kern w:val="0"/>
+          <w:sz w:val="36"/>
+          <w:szCs w:val="36"/>
+          <w:shd w:fill="auto" w:val="clear"/>
+          <w:lang w:val="en-US" w:eastAsia="zh-CN" w:bidi="hi-IN"/>
+        </w:rPr>
+        <w:t xml:space="preserve"> diante do povo. </w:t>
+      </w:r>
+    </w:p>
+    <w:p>
+      <w:pPr>
+        <w:pStyle w:val="Normal"/>
+        <w:jc w:val="both"/>
+        <w:rPr>
+          <w:sz w:val="36"/>
+          <w:szCs w:val="36"/>
+        </w:rPr>
+      </w:pPr>
+      <w:r>
+        <w:rPr/>
+      </w:r>
+    </w:p>
+    <w:p>
+      <w:pPr>
+        <w:pStyle w:val="Normal"/>
+        <w:jc w:val="both"/>
+        <w:rPr>
+          <w:sz w:val="36"/>
+          <w:szCs w:val="36"/>
+        </w:rPr>
+      </w:pPr>
+      <w:r>
+        <w:rPr>
+          <w:rFonts w:eastAsia="Times New Roman" w:cs="Times New Roman" w:ascii="Garamond" w:hAnsi="Garamond"/>
+          <w:color w:val="000000"/>
+          <w:kern w:val="0"/>
+          <w:sz w:val="36"/>
+          <w:szCs w:val="36"/>
+          <w:shd w:fill="auto" w:val="clear"/>
+          <w:lang w:val="en-US" w:eastAsia="zh-CN" w:bidi="hi-IN"/>
+        </w:rPr>
+        <w:t>Os fariseus</w:t>
+      </w:r>
+      <w:r>
+        <w:rPr>
+          <w:rFonts w:eastAsia="Times New Roman" w:cs="Times New Roman" w:ascii="Garamond" w:hAnsi="Garamond"/>
+          <w:color w:val="000000"/>
+          <w:kern w:val="0"/>
+          <w:sz w:val="36"/>
+          <w:szCs w:val="36"/>
+          <w:shd w:fill="auto" w:val="clear"/>
+          <w:lang w:val="en-US" w:eastAsia="zh-CN" w:bidi="hi-IN"/>
+        </w:rPr>
+        <w:t xml:space="preserve"> tinham uma crença mais próxima daquilo que Jesus ensinava. Eram estudiosos e muito dedicados ao cumprimento da Lei</w:t>
+      </w:r>
+      <w:r>
+        <w:rPr>
+          <w:rFonts w:eastAsia="Times New Roman" w:cs="Times New Roman" w:ascii="Garamond" w:hAnsi="Garamond"/>
+          <w:color w:val="000000"/>
+          <w:kern w:val="0"/>
+          <w:sz w:val="36"/>
+          <w:szCs w:val="36"/>
+          <w:shd w:fill="auto" w:val="clear"/>
+          <w:lang w:val="en-US" w:eastAsia="zh-CN" w:bidi="hi-IN"/>
+        </w:rPr>
+        <w:t xml:space="preserve">, mas muitos </w:t>
+      </w:r>
+      <w:r>
+        <w:rPr>
+          <w:rFonts w:eastAsia="Times New Roman" w:cs="Times New Roman" w:ascii="Garamond" w:hAnsi="Garamond"/>
+          <w:color w:val="000000"/>
+          <w:kern w:val="0"/>
+          <w:sz w:val="36"/>
+          <w:szCs w:val="36"/>
+          <w:shd w:fill="auto" w:val="clear"/>
+          <w:lang w:val="en-US" w:eastAsia="zh-CN" w:bidi="hi-IN"/>
+        </w:rPr>
+        <w:t xml:space="preserve">deles </w:t>
+      </w:r>
+      <w:r>
+        <w:rPr>
+          <w:rFonts w:eastAsia="Times New Roman" w:cs="Times New Roman" w:ascii="Garamond" w:hAnsi="Garamond"/>
+          <w:color w:val="000000"/>
+          <w:kern w:val="0"/>
+          <w:sz w:val="36"/>
+          <w:szCs w:val="36"/>
+          <w:shd w:fill="auto" w:val="clear"/>
+          <w:lang w:val="en-US" w:eastAsia="zh-CN" w:bidi="hi-IN"/>
+        </w:rPr>
+        <w:t xml:space="preserve">acabaram se apegando demais às regras e ao exibicionismo religioso. </w:t>
+      </w:r>
+      <w:r>
+        <w:rPr>
+          <w:rFonts w:eastAsia="Times New Roman" w:cs="Times New Roman" w:ascii="Garamond" w:hAnsi="Garamond"/>
+          <w:color w:val="000000"/>
+          <w:kern w:val="0"/>
+          <w:sz w:val="36"/>
+          <w:szCs w:val="36"/>
+          <w:shd w:fill="auto" w:val="clear"/>
+          <w:lang w:val="en-US" w:eastAsia="zh-CN" w:bidi="hi-IN"/>
+        </w:rPr>
+        <w:t xml:space="preserve">Embora cumprissem a Lei, faziam isso de maneira externa e </w:t>
+      </w:r>
+      <w:r>
+        <w:rPr>
+          <w:rFonts w:eastAsia="Times New Roman" w:cs="Times New Roman" w:ascii="Garamond" w:hAnsi="Garamond"/>
+          <w:color w:val="000000"/>
+          <w:kern w:val="0"/>
+          <w:sz w:val="36"/>
+          <w:szCs w:val="36"/>
+          <w:shd w:fill="auto" w:val="clear"/>
+          <w:lang w:val="en-US" w:eastAsia="zh-CN" w:bidi="hi-IN"/>
+        </w:rPr>
+        <w:t xml:space="preserve"> deixavam o coração de lado. </w:t>
+      </w:r>
+    </w:p>
+    <w:p>
+      <w:pPr>
+        <w:pStyle w:val="Normal"/>
+        <w:jc w:val="both"/>
+        <w:rPr>
+          <w:sz w:val="36"/>
+          <w:szCs w:val="36"/>
+        </w:rPr>
+      </w:pPr>
+      <w:r>
+        <w:rPr/>
       </w:r>
     </w:p>
     <w:p>
@@ -809,16 +861,53 @@
         </w:rPr>
       </w:pPr>
       <w:r>
-        <w:rPr>
-          <w:rFonts w:eastAsia="Times New Roman" w:cs="Times New Roman" w:ascii="Garamond" w:hAnsi="Garamond"/>
-          <w:color w:val="000000"/>
-          <w:kern w:val="0"/>
-          <w:sz w:val="36"/>
-          <w:szCs w:val="36"/>
-          <w:shd w:fill="auto" w:val="clear"/>
-          <w:lang w:val="en-US" w:eastAsia="zh-CN" w:bidi="hi-IN"/>
-        </w:rPr>
-        <w:t xml:space="preserve">É como se Ele dissesse: </w:t>
+        <w:rPr/>
+      </w:r>
+    </w:p>
+    <w:p>
+      <w:pPr>
+        <w:pStyle w:val="Normal"/>
+        <w:jc w:val="both"/>
+        <w:rPr>
+          <w:sz w:val="36"/>
+          <w:szCs w:val="36"/>
+        </w:rPr>
+      </w:pPr>
+      <w:r>
+        <w:rPr>
+          <w:rFonts w:eastAsia="Times New Roman" w:cs="Times New Roman" w:ascii="Garamond" w:hAnsi="Garamond"/>
+          <w:color w:val="000000"/>
+          <w:kern w:val="0"/>
+          <w:sz w:val="36"/>
+          <w:szCs w:val="36"/>
+          <w:shd w:fill="auto" w:val="clear"/>
+          <w:lang w:val="en-US" w:eastAsia="zh-CN" w:bidi="hi-IN"/>
+        </w:rPr>
+        <w:t xml:space="preserve">É como se </w:t>
+      </w:r>
+      <w:r>
+        <w:rPr>
+          <w:rFonts w:eastAsia="Times New Roman" w:cs="Times New Roman" w:ascii="Garamond" w:hAnsi="Garamond"/>
+          <w:color w:val="000000"/>
+          <w:kern w:val="0"/>
+          <w:sz w:val="36"/>
+          <w:szCs w:val="36"/>
+          <w:shd w:fill="auto" w:val="clear"/>
+          <w:lang w:val="en-US" w:eastAsia="zh-CN" w:bidi="hi-IN"/>
+        </w:rPr>
+        <w:t>Jesus estivesse dizendo a eles</w:t>
+      </w:r>
+      <w:r>
+        <w:rPr>
+          <w:rFonts w:eastAsia="Times New Roman" w:cs="Times New Roman" w:ascii="Garamond" w:hAnsi="Garamond"/>
+          <w:color w:val="000000"/>
+          <w:kern w:val="0"/>
+          <w:sz w:val="36"/>
+          <w:szCs w:val="36"/>
+          <w:shd w:fill="auto" w:val="clear"/>
+          <w:lang w:val="en-US" w:eastAsia="zh-CN" w:bidi="hi-IN"/>
+        </w:rPr>
+        <w:t xml:space="preserve">: </w:t>
       </w:r>
     </w:p>
     <w:p>
@@ -936,7 +1025,103 @@
           <w:shd w:fill="auto" w:val="clear"/>
           <w:lang w:val="en-US" w:eastAsia="zh-CN" w:bidi="hi-IN"/>
         </w:rPr>
-        <w:t>Esse comportamento combatido por Jesus permanece conosco até os dias de hoje. Passados mais de 2000 mil anos, continuamos exigindo muitas condições para fazer o bem. Escolhemos a quem, como e onde fazer o bem. E não pode ser assim.</w:t>
+        <w:t>Esse comportamento combatido por Jesus permanece conosco até os dias de hoje. Passados mais de 2000 mil anos, continuamos exigindo muitas condições para fazer o bem. Escolhemos a quem</w:t>
+      </w:r>
+      <w:r>
+        <w:rPr>
+          <w:rFonts w:eastAsia="Times New Roman" w:cs="Times New Roman" w:ascii="Garamond" w:hAnsi="Garamond"/>
+          <w:color w:val="000000"/>
+          <w:kern w:val="0"/>
+          <w:sz w:val="36"/>
+          <w:szCs w:val="36"/>
+          <w:shd w:fill="auto" w:val="clear"/>
+          <w:lang w:val="en-US" w:eastAsia="zh-CN" w:bidi="hi-IN"/>
+        </w:rPr>
+        <w:t xml:space="preserve"> fazer</w:t>
+      </w:r>
+      <w:r>
+        <w:rPr>
+          <w:rFonts w:eastAsia="Times New Roman" w:cs="Times New Roman" w:ascii="Garamond" w:hAnsi="Garamond"/>
+          <w:color w:val="000000"/>
+          <w:kern w:val="0"/>
+          <w:sz w:val="36"/>
+          <w:szCs w:val="36"/>
+          <w:shd w:fill="auto" w:val="clear"/>
+          <w:lang w:val="en-US" w:eastAsia="zh-CN" w:bidi="hi-IN"/>
+        </w:rPr>
+        <w:t xml:space="preserve">, como </w:t>
+      </w:r>
+      <w:r>
+        <w:rPr>
+          <w:rFonts w:eastAsia="Times New Roman" w:cs="Times New Roman" w:ascii="Garamond" w:hAnsi="Garamond"/>
+          <w:color w:val="000000"/>
+          <w:kern w:val="0"/>
+          <w:sz w:val="36"/>
+          <w:szCs w:val="36"/>
+          <w:shd w:fill="auto" w:val="clear"/>
+          <w:lang w:val="en-US" w:eastAsia="zh-CN" w:bidi="hi-IN"/>
+        </w:rPr>
+        <w:t xml:space="preserve">fazer </w:t>
+      </w:r>
+      <w:r>
+        <w:rPr>
+          <w:rFonts w:eastAsia="Times New Roman" w:cs="Times New Roman" w:ascii="Garamond" w:hAnsi="Garamond"/>
+          <w:color w:val="000000"/>
+          <w:kern w:val="0"/>
+          <w:sz w:val="36"/>
+          <w:szCs w:val="36"/>
+          <w:shd w:fill="auto" w:val="clear"/>
+          <w:lang w:val="en-US" w:eastAsia="zh-CN" w:bidi="hi-IN"/>
+        </w:rPr>
+        <w:t>e onde fazer</w:t>
+      </w:r>
+      <w:r>
+        <w:rPr>
+          <w:rFonts w:eastAsia="Times New Roman" w:cs="Times New Roman" w:ascii="Garamond" w:hAnsi="Garamond"/>
+          <w:color w:val="000000"/>
+          <w:kern w:val="0"/>
+          <w:sz w:val="36"/>
+          <w:szCs w:val="36"/>
+          <w:shd w:fill="auto" w:val="clear"/>
+          <w:lang w:val="en-US" w:eastAsia="zh-CN" w:bidi="hi-IN"/>
+        </w:rPr>
+        <w:t>.</w:t>
+      </w:r>
+      <w:r>
+        <w:rPr>
+          <w:rFonts w:eastAsia="Times New Roman" w:cs="Times New Roman" w:ascii="Garamond" w:hAnsi="Garamond"/>
+          <w:color w:val="000000"/>
+          <w:kern w:val="0"/>
+          <w:sz w:val="36"/>
+          <w:szCs w:val="36"/>
+          <w:shd w:fill="auto" w:val="clear"/>
+          <w:lang w:val="en-US" w:eastAsia="zh-CN" w:bidi="hi-IN"/>
+        </w:rPr>
+        <w:t xml:space="preserve"> E </w:t>
+      </w:r>
+      <w:r>
+        <w:rPr>
+          <w:rFonts w:eastAsia="Times New Roman" w:cs="Times New Roman" w:ascii="Garamond" w:hAnsi="Garamond"/>
+          <w:color w:val="000000"/>
+          <w:kern w:val="0"/>
+          <w:sz w:val="36"/>
+          <w:szCs w:val="36"/>
+          <w:shd w:fill="auto" w:val="clear"/>
+          <w:lang w:val="en-US" w:eastAsia="zh-CN" w:bidi="hi-IN"/>
+        </w:rPr>
+        <w:t xml:space="preserve">obviamente </w:t>
+      </w:r>
+      <w:r>
+        <w:rPr>
+          <w:rFonts w:eastAsia="Times New Roman" w:cs="Times New Roman" w:ascii="Garamond" w:hAnsi="Garamond"/>
+          <w:color w:val="000000"/>
+          <w:kern w:val="0"/>
+          <w:sz w:val="36"/>
+          <w:szCs w:val="36"/>
+          <w:shd w:fill="auto" w:val="clear"/>
+          <w:lang w:val="en-US" w:eastAsia="zh-CN" w:bidi="hi-IN"/>
+        </w:rPr>
+        <w:t>não pode ser assim.</w:t>
       </w:r>
     </w:p>
     <w:p>
@@ -1013,22 +1198,6 @@
           <w:lang w:val="en-US" w:eastAsia="zh-CN" w:bidi="hi-IN"/>
         </w:rPr>
         <w:t>Qual é o lema dessa casa?</w:t>
-      </w:r>
-    </w:p>
-    <w:p>
-      <w:pPr>
-        <w:pStyle w:val="Normal"/>
-        <w:jc w:val="both"/>
-        <w:rPr>
-          <w:sz w:val="36"/>
-          <w:szCs w:val="36"/>
-        </w:rPr>
-      </w:pPr>
-      <w:r>
-        <w:rPr>
-          <w:sz w:val="36"/>
-          <w:szCs w:val="36"/>
-        </w:rPr>
       </w:r>
     </w:p>
     <w:p>
@@ -1108,7 +1277,31 @@
           <w:shd w:fill="auto" w:val="clear"/>
           <w:lang w:val="en-US" w:eastAsia="zh-CN" w:bidi="hi-IN"/>
         </w:rPr>
-        <w:t>Alguém tem dúvidas sobre o que o Irmão Glacus quis dizer com essas palavras? Seria correto eu fazer o bem somente aos espíritas, aos cristãos, aos familiares, amigos, às pessoas que pensam como eu?</w:t>
+        <w:t>Alguém tem dúvidas sobre o que o Irmão Glacus quis dizer com essas palavras? Seria correto eu fazer o bem somente aos espíritas, aos cristãos, aos familiares, amigos, às pessoas que pensam como eu</w:t>
+      </w:r>
+      <w:r>
+        <w:rPr>
+          <w:rFonts w:eastAsia="Times New Roman" w:cs="Times New Roman" w:ascii="Garamond" w:hAnsi="Garamond"/>
+          <w:color w:val="000000"/>
+          <w:kern w:val="0"/>
+          <w:sz w:val="36"/>
+          <w:szCs w:val="36"/>
+          <w:shd w:fill="auto" w:val="clear"/>
+          <w:lang w:val="en-US" w:eastAsia="zh-CN" w:bidi="hi-IN"/>
+        </w:rPr>
+        <w:t>, às pessoas que podem um dia retribuir o bem que eu fizer a elas</w:t>
+      </w:r>
+      <w:r>
+        <w:rPr>
+          <w:rFonts w:eastAsia="Times New Roman" w:cs="Times New Roman" w:ascii="Garamond" w:hAnsi="Garamond"/>
+          <w:color w:val="000000"/>
+          <w:kern w:val="0"/>
+          <w:sz w:val="36"/>
+          <w:szCs w:val="36"/>
+          <w:shd w:fill="auto" w:val="clear"/>
+          <w:lang w:val="en-US" w:eastAsia="zh-CN" w:bidi="hi-IN"/>
+        </w:rPr>
+        <w:t>?</w:t>
       </w:r>
     </w:p>
     <w:p>
@@ -1184,7 +1377,115 @@
           <w:shd w:fill="auto" w:val="clear"/>
           <w:lang w:val="en-US" w:eastAsia="zh-CN" w:bidi="hi-IN"/>
         </w:rPr>
-        <w:t xml:space="preserve">Esse mandamento é o resumo de tudo o que Jesus vinha ensinando. Quando o amor está no centro, não há espaço para a hipocrisia, para a vaidade espiritual ou para a religião de aparências. </w:t>
+        <w:t>Assim,</w:t>
+      </w:r>
+      <w:r>
+        <w:rPr>
+          <w:rFonts w:eastAsia="Times New Roman" w:cs="Times New Roman" w:ascii="Garamond" w:hAnsi="Garamond"/>
+          <w:color w:val="000000"/>
+          <w:kern w:val="0"/>
+          <w:sz w:val="36"/>
+          <w:szCs w:val="36"/>
+          <w:shd w:fill="auto" w:val="clear"/>
+          <w:lang w:val="en-US" w:eastAsia="zh-CN" w:bidi="hi-IN"/>
+        </w:rPr>
+        <w:t xml:space="preserve"> </w:t>
+      </w:r>
+      <w:r>
+        <w:rPr>
+          <w:rFonts w:eastAsia="Times New Roman" w:cs="Times New Roman" w:ascii="Garamond" w:hAnsi="Garamond"/>
+          <w:color w:val="000000"/>
+          <w:kern w:val="0"/>
+          <w:sz w:val="36"/>
+          <w:szCs w:val="36"/>
+          <w:shd w:fill="auto" w:val="clear"/>
+          <w:lang w:val="en-US" w:eastAsia="zh-CN" w:bidi="hi-IN"/>
+        </w:rPr>
+        <w:t xml:space="preserve">o </w:t>
+      </w:r>
+      <w:r>
+        <w:rPr>
+          <w:rFonts w:eastAsia="Times New Roman" w:cs="Times New Roman" w:ascii="Garamond" w:hAnsi="Garamond"/>
+          <w:color w:val="000000"/>
+          <w:kern w:val="0"/>
+          <w:sz w:val="36"/>
+          <w:szCs w:val="36"/>
+          <w:shd w:fill="auto" w:val="clear"/>
+          <w:lang w:val="en-US" w:eastAsia="zh-CN" w:bidi="hi-IN"/>
+        </w:rPr>
+        <w:t xml:space="preserve">mandamento </w:t>
+      </w:r>
+      <w:r>
+        <w:rPr>
+          <w:rFonts w:eastAsia="Times New Roman" w:cs="Times New Roman" w:ascii="Garamond" w:hAnsi="Garamond"/>
+          <w:color w:val="000000"/>
+          <w:kern w:val="0"/>
+          <w:sz w:val="36"/>
+          <w:szCs w:val="36"/>
+          <w:shd w:fill="auto" w:val="clear"/>
+          <w:lang w:val="en-US" w:eastAsia="zh-CN" w:bidi="hi-IN"/>
+        </w:rPr>
+        <w:t xml:space="preserve">maior </w:t>
+      </w:r>
+      <w:r>
+        <w:rPr>
+          <w:rFonts w:eastAsia="Times New Roman" w:cs="Times New Roman" w:ascii="Garamond" w:hAnsi="Garamond"/>
+          <w:color w:val="000000"/>
+          <w:kern w:val="0"/>
+          <w:sz w:val="36"/>
+          <w:szCs w:val="36"/>
+          <w:shd w:fill="auto" w:val="clear"/>
+          <w:lang w:val="en-US" w:eastAsia="zh-CN" w:bidi="hi-IN"/>
+        </w:rPr>
+        <w:t xml:space="preserve">é o resumo de tudo o que Jesus vinha ensinando. Quando </w:t>
+      </w:r>
+      <w:r>
+        <w:rPr>
+          <w:rFonts w:eastAsia="Times New Roman" w:cs="Times New Roman" w:ascii="Garamond" w:hAnsi="Garamond"/>
+          <w:color w:val="000000"/>
+          <w:kern w:val="0"/>
+          <w:sz w:val="36"/>
+          <w:szCs w:val="36"/>
+          <w:shd w:fill="auto" w:val="clear"/>
+          <w:lang w:val="en-US" w:eastAsia="zh-CN" w:bidi="hi-IN"/>
+        </w:rPr>
+        <w:t xml:space="preserve">colocamos </w:t>
+      </w:r>
+      <w:r>
+        <w:rPr>
+          <w:rFonts w:eastAsia="Times New Roman" w:cs="Times New Roman" w:ascii="Garamond" w:hAnsi="Garamond"/>
+          <w:color w:val="000000"/>
+          <w:kern w:val="0"/>
+          <w:sz w:val="36"/>
+          <w:szCs w:val="36"/>
+          <w:shd w:fill="auto" w:val="clear"/>
+          <w:lang w:val="en-US" w:eastAsia="zh-CN" w:bidi="hi-IN"/>
+        </w:rPr>
+        <w:t xml:space="preserve">o amor </w:t>
+      </w:r>
+      <w:r>
+        <w:rPr>
+          <w:rFonts w:eastAsia="Times New Roman" w:cs="Times New Roman" w:ascii="Garamond" w:hAnsi="Garamond"/>
+          <w:color w:val="000000"/>
+          <w:kern w:val="0"/>
+          <w:sz w:val="36"/>
+          <w:szCs w:val="36"/>
+          <w:shd w:fill="auto" w:val="clear"/>
+          <w:lang w:val="en-US" w:eastAsia="zh-CN" w:bidi="hi-IN"/>
+        </w:rPr>
+        <w:t>naquilo em que fazemos</w:t>
+      </w:r>
+      <w:r>
+        <w:rPr>
+          <w:rFonts w:eastAsia="Times New Roman" w:cs="Times New Roman" w:ascii="Garamond" w:hAnsi="Garamond"/>
+          <w:color w:val="000000"/>
+          <w:kern w:val="0"/>
+          <w:sz w:val="36"/>
+          <w:szCs w:val="36"/>
+          <w:shd w:fill="auto" w:val="clear"/>
+          <w:lang w:val="en-US" w:eastAsia="zh-CN" w:bidi="hi-IN"/>
+        </w:rPr>
+        <w:t xml:space="preserve">, não há espaço para a hipocrisia, para a vaidade ou para a religião de aparências. </w:t>
       </w:r>
     </w:p>
     <w:p>
@@ -1228,7 +1529,43 @@
           <w:shd w:fill="auto" w:val="clear"/>
           <w:lang w:val="en-US" w:eastAsia="zh-CN" w:bidi="hi-IN"/>
         </w:rPr>
-        <w:t xml:space="preserve">Retornando ao mandamento maior, no versículo 37 Jesus diz: </w:t>
+        <w:t>No</w:t>
+      </w:r>
+      <w:r>
+        <w:rPr>
+          <w:rFonts w:eastAsia="Times New Roman" w:cs="Times New Roman" w:ascii="Garamond" w:hAnsi="Garamond"/>
+          <w:color w:val="000000"/>
+          <w:kern w:val="0"/>
+          <w:sz w:val="36"/>
+          <w:szCs w:val="36"/>
+          <w:shd w:fill="auto" w:val="clear"/>
+          <w:lang w:val="en-US" w:eastAsia="zh-CN" w:bidi="hi-IN"/>
+        </w:rPr>
+        <w:t xml:space="preserve"> versículo 37</w:t>
+      </w:r>
+      <w:r>
+        <w:rPr>
+          <w:rFonts w:eastAsia="Times New Roman" w:cs="Times New Roman" w:ascii="Garamond" w:hAnsi="Garamond"/>
+          <w:color w:val="000000"/>
+          <w:kern w:val="0"/>
+          <w:sz w:val="36"/>
+          <w:szCs w:val="36"/>
+          <w:shd w:fill="auto" w:val="clear"/>
+          <w:lang w:val="en-US" w:eastAsia="zh-CN" w:bidi="hi-IN"/>
+        </w:rPr>
+        <w:t xml:space="preserve"> Jesus nos diz</w:t>
+      </w:r>
+      <w:r>
+        <w:rPr>
+          <w:rFonts w:eastAsia="Times New Roman" w:cs="Times New Roman" w:ascii="Garamond" w:hAnsi="Garamond"/>
+          <w:color w:val="000000"/>
+          <w:kern w:val="0"/>
+          <w:sz w:val="36"/>
+          <w:szCs w:val="36"/>
+          <w:shd w:fill="auto" w:val="clear"/>
+          <w:lang w:val="en-US" w:eastAsia="zh-CN" w:bidi="hi-IN"/>
+        </w:rPr>
+        <w:t xml:space="preserve">: </w:t>
       </w:r>
     </w:p>
     <w:p>
@@ -2637,7 +2974,15 @@
         </w:rPr>
       </w:pPr>
       <w:r>
-        <w:rPr/>
+        <w:rPr>
+          <w:rFonts w:eastAsia="Times New Roman" w:cs="Times New Roman" w:ascii="Garamond" w:hAnsi="Garamond"/>
+          <w:color w:val="000000"/>
+          <w:kern w:val="0"/>
+          <w:sz w:val="36"/>
+          <w:szCs w:val="36"/>
+          <w:shd w:fill="auto" w:val="clear"/>
+          <w:lang w:val="en-US" w:eastAsia="zh-CN" w:bidi="hi-IN"/>
+        </w:rPr>
       </w:r>
     </w:p>
     <w:p>
@@ -2756,7 +3101,13 @@
       </w:pPr>
       <w:r>
         <w:rPr>
-          <w:u w:val="none"/>
+          <w:rFonts w:eastAsia="Times New Roman" w:cs="Times New Roman" w:ascii="Garamond" w:hAnsi="Garamond"/>
+          <w:color w:val="000000"/>
+          <w:kern w:val="0"/>
+          <w:sz w:val="36"/>
+          <w:szCs w:val="36"/>
+          <w:shd w:fill="auto" w:val="clear"/>
+          <w:lang w:val="en-US" w:eastAsia="zh-CN" w:bidi="hi-IN"/>
         </w:rPr>
       </w:r>
     </w:p>
@@ -2876,7 +3227,13 @@
       </w:pPr>
       <w:r>
         <w:rPr>
-          <w:u w:val="none"/>
+          <w:rFonts w:eastAsia="Times New Roman" w:cs="Times New Roman" w:ascii="Garamond" w:hAnsi="Garamond"/>
+          <w:color w:val="000000"/>
+          <w:kern w:val="0"/>
+          <w:sz w:val="36"/>
+          <w:szCs w:val="36"/>
+          <w:shd w:fill="auto" w:val="clear"/>
+          <w:lang w:val="en-US" w:eastAsia="zh-CN" w:bidi="hi-IN"/>
         </w:rPr>
       </w:r>
     </w:p>
@@ -2996,75 +3353,90 @@
       </w:pPr>
       <w:r>
         <w:rPr>
+          <w:rFonts w:eastAsia="Times New Roman" w:cs="Times New Roman" w:ascii="Garamond" w:hAnsi="Garamond"/>
+          <w:color w:val="000000"/>
+          <w:kern w:val="0"/>
+          <w:sz w:val="36"/>
+          <w:szCs w:val="36"/>
+          <w:shd w:fill="auto" w:val="clear"/>
+          <w:lang w:val="en-US" w:eastAsia="zh-CN" w:bidi="hi-IN"/>
+        </w:rPr>
+      </w:r>
+    </w:p>
+    <w:p>
+      <w:pPr>
+        <w:pStyle w:val="Normal"/>
+        <w:jc w:val="both"/>
+        <w:rPr>
+          <w:u w:val="single"/>
+        </w:rPr>
+      </w:pPr>
+      <w:r>
+        <w:rPr>
+          <w:rFonts w:eastAsia="Times New Roman" w:cs="Times New Roman" w:ascii="Garamond" w:hAnsi="Garamond"/>
+          <w:color w:val="000000"/>
+          <w:kern w:val="0"/>
+          <w:sz w:val="36"/>
+          <w:szCs w:val="36"/>
+          <w:u w:val="single"/>
+          <w:shd w:fill="auto" w:val="clear"/>
+          <w:lang w:val="en-US" w:eastAsia="zh-CN" w:bidi="hi-IN"/>
+        </w:rPr>
+        <w:t>Instruções de Isabel de França</w:t>
+      </w:r>
+    </w:p>
+    <w:p>
+      <w:pPr>
+        <w:pStyle w:val="Normal"/>
+        <w:jc w:val="both"/>
+        <w:rPr>
           <w:u w:val="none"/>
         </w:rPr>
-      </w:r>
-    </w:p>
-    <w:p>
-      <w:pPr>
-        <w:pStyle w:val="Normal"/>
-        <w:jc w:val="both"/>
-        <w:rPr>
-          <w:u w:val="single"/>
-        </w:rPr>
-      </w:pPr>
-      <w:r>
-        <w:rPr>
-          <w:rFonts w:eastAsia="Times New Roman" w:cs="Times New Roman" w:ascii="Garamond" w:hAnsi="Garamond"/>
-          <w:color w:val="000000"/>
-          <w:kern w:val="0"/>
-          <w:sz w:val="36"/>
-          <w:szCs w:val="36"/>
-          <w:u w:val="single"/>
-          <w:shd w:fill="auto" w:val="clear"/>
-          <w:lang w:val="en-US" w:eastAsia="zh-CN" w:bidi="hi-IN"/>
-        </w:rPr>
-        <w:t>Instruções de Isabel de França</w:t>
-      </w:r>
-    </w:p>
-    <w:p>
-      <w:pPr>
-        <w:pStyle w:val="Normal"/>
-        <w:jc w:val="both"/>
-        <w:rPr>
+      </w:pPr>
+      <w:r>
+        <w:rPr>
+          <w:rFonts w:eastAsia="Times New Roman" w:cs="Times New Roman" w:ascii="Garamond" w:hAnsi="Garamond"/>
+          <w:color w:val="000000"/>
+          <w:kern w:val="0"/>
+          <w:sz w:val="36"/>
+          <w:szCs w:val="36"/>
           <w:u w:val="none"/>
-        </w:rPr>
-      </w:pPr>
-      <w:r>
-        <w:rPr>
-          <w:rFonts w:eastAsia="Times New Roman" w:cs="Times New Roman" w:ascii="Garamond" w:hAnsi="Garamond"/>
-          <w:color w:val="000000"/>
-          <w:kern w:val="0"/>
-          <w:sz w:val="36"/>
-          <w:szCs w:val="36"/>
+          <w:shd w:fill="auto" w:val="clear"/>
+          <w:lang w:val="en-US" w:eastAsia="zh-CN" w:bidi="hi-IN"/>
+        </w:rPr>
+        <w:t>Esse Espírito trata de uma questão extremamente delicada: a caridade para com os criminosos. Isso é particularmente delicado para nós, brasileiros. Infelizmente, durante décadas temos visto assassinos, estupradores, sequestradores, corruptos sendo colocados em liberdade, a despeito da gravidade e do números de crimes comprovadamente cometidos por eles. A segurança pública é hoje, indiscutivelmente, um dos maiores problemas que  a sociedade brasileira tem enfrentado.</w:t>
+      </w:r>
+    </w:p>
+    <w:p>
+      <w:pPr>
+        <w:pStyle w:val="Normal"/>
+        <w:jc w:val="both"/>
+        <w:rPr>
           <w:u w:val="none"/>
-          <w:shd w:fill="auto" w:val="clear"/>
-          <w:lang w:val="en-US" w:eastAsia="zh-CN" w:bidi="hi-IN"/>
-        </w:rPr>
-        <w:t>Esse Espírito trata de uma questão extremamente delicada: a caridade para com os criminosos. Isso é particularmente delicado para nós, brasileiros. Infelizmente, durante décadas temos visto assassinos, estupradores, sequestradores, corruptos sendo colocados em liberdade, a despeito da gravidade e do números de crimes comprovadamente cometidos por eles. A segurança pública é hoje, indiscutivelmente, um dos maiores problemas que  a sociedade brasileira tem enfrentado.</w:t>
-      </w:r>
-    </w:p>
-    <w:p>
-      <w:pPr>
-        <w:pStyle w:val="Normal"/>
-        <w:jc w:val="both"/>
-        <w:rPr>
+        </w:rPr>
+      </w:pPr>
+      <w:r>
+        <w:rPr>
+          <w:rFonts w:eastAsia="Times New Roman" w:cs="Times New Roman" w:ascii="Garamond" w:hAnsi="Garamond"/>
+          <w:color w:val="000000"/>
+          <w:kern w:val="0"/>
+          <w:sz w:val="36"/>
+          <w:szCs w:val="36"/>
           <w:u w:val="none"/>
-        </w:rPr>
-      </w:pPr>
-      <w:r>
-        <w:rPr>
-          <w:rFonts w:eastAsia="Times New Roman" w:cs="Times New Roman" w:ascii="Garamond" w:hAnsi="Garamond"/>
-          <w:color w:val="000000"/>
-          <w:kern w:val="0"/>
-          <w:sz w:val="36"/>
-          <w:szCs w:val="36"/>
+          <w:shd w:fill="auto" w:val="clear"/>
+          <w:lang w:val="en-US" w:eastAsia="zh-CN" w:bidi="hi-IN"/>
+        </w:rPr>
+        <w:t>Diante desse cenário é muito difícil para nós termos o  sentimento da caridade para com os criminosos. Entretanto, é exatamente isso que Jesus espera de nós.</w:t>
+      </w:r>
+    </w:p>
+    <w:p>
+      <w:pPr>
+        <w:pStyle w:val="Normal"/>
+        <w:jc w:val="both"/>
+        <w:rPr>
           <w:u w:val="none"/>
-          <w:shd w:fill="auto" w:val="clear"/>
-          <w:lang w:val="en-US" w:eastAsia="zh-CN" w:bidi="hi-IN"/>
-        </w:rPr>
-        <w:t xml:space="preserve">Diante desse cenário é muito difícil para nós termos o  sentimento da caridade para com os criminosos. Entretanto, é exatamente isso que Jesus </w:t>
-      </w:r>
+        </w:rPr>
+      </w:pPr>
       <w:r>
         <w:rPr>
           <w:rFonts w:eastAsia="Times New Roman" w:cs="Times New Roman" w:ascii="Garamond" w:hAnsi="Garamond"/>
@@ -3076,7 +3448,7 @@
           <w:shd w:fill="auto" w:val="clear"/>
           <w:lang w:val="en-US" w:eastAsia="zh-CN" w:bidi="hi-IN"/>
         </w:rPr>
-        <w:t>espera de nós.</w:t>
+        <w:t>Isabel nos diz que, se Jesus visse junto a nós um desses piores criminosos dos dias de hoje, Jesus o consideraria um doente digno de piedade e estenderia a ele uma mão amiga. Isabel diz ainda que nós não temos condições de agir como Jesus. Entretanto, podemos orar por aquele criminoso e talvez, sob o influxo de nossas orações ele seja tocado de arrependimento e inicie desde já a transformação para abandonar a vida de crimes.</w:t>
       </w:r>
     </w:p>
     <w:p>
@@ -3098,7 +3470,7 @@
           <w:shd w:fill="auto" w:val="clear"/>
           <w:lang w:val="en-US" w:eastAsia="zh-CN" w:bidi="hi-IN"/>
         </w:rPr>
-        <w:t>Isabel nos diz que, se Jesus visse junto a nós um desses piores criminosos dos dias de hoje, Jesus o consideraria um doente digno de piedade e estenderia a ele uma mão amiga. Isabel diz ainda que nós não temos condições de agir como Jesus. Entretanto, podemos orar por aquele criminoso e talvez, sob o influxo de nossas orações ele seja tocado de arrependimento e inicie desde já a transformação para abandonar a vida de crimes.</w:t>
+        <w:t>Mas, sejamos sinceros: até mesmo orar pelos criminosos é algo difícil para nós. Porém, precisamos tentar. É uma barreira interior que, com o tempo e a prática, conseguiremos transpor.</w:t>
       </w:r>
     </w:p>
     <w:p>
@@ -3120,7 +3492,7 @@
           <w:shd w:fill="auto" w:val="clear"/>
           <w:lang w:val="en-US" w:eastAsia="zh-CN" w:bidi="hi-IN"/>
         </w:rPr>
-        <w:t>Mas, sejamos sinceros: até mesmo orar pelos criminosos é algo difícil para nós. Porém, precisamos tentar. É uma barreira interior que, com o tempo e a prática, conseguiremos transpor.</w:t>
+        <w:t>Os mais jovens aqui muito provavelmente nunca ouviram falar de Daniela Perez. Ela era uma atriz que foi brutalmente assassinada pelo ator Guilherme de Pádua e a esposa dele. A mãe de Daniela, Glória Pereza, procurou Chico Xavier poucos dias depois do crime e o Chico disse a ela o seguinte: "Você, na posição de mãe, ainda não tem condições de conceder o perdão às pessoas que tiraram a vida de sua filha querida. Mas eu vou lhe pedir uma coisa: não permita que os algozes de sua filha sejam linchados".</w:t>
       </w:r>
     </w:p>
     <w:p>
@@ -3142,7 +3514,7 @@
           <w:shd w:fill="auto" w:val="clear"/>
           <w:lang w:val="en-US" w:eastAsia="zh-CN" w:bidi="hi-IN"/>
         </w:rPr>
-        <w:t>Os mais jovens aqui muito provavelmente nunca ouviram falar de Daniela Perez. Ela era uma atriz que foi brutalmente assassinada pelo ator Guilherme de Pádua e a esposa dele. A mãe de Daniela, Glória Pereza, procurou Chico Xavier poucos dias depois do crime e o Chico disse a ela o seguinte: "Você, na posição de mãe, ainda não tem condições de conceder o perdão às pessoas que tiraram a vida de sua filha querida. Mas eu vou lhe pedir uma coisa: não permita que os algozes de sua filha sejam linchados".</w:t>
+        <w:t>Havia um temor muito grande de que Guilherme e sua esposa fossem linchados devido à comoção nacional que o crime causou.</w:t>
       </w:r>
     </w:p>
     <w:p>
@@ -3164,42 +3536,7 @@
           <w:shd w:fill="auto" w:val="clear"/>
           <w:lang w:val="en-US" w:eastAsia="zh-CN" w:bidi="hi-IN"/>
         </w:rPr>
-        <w:t>Havia um temor muito grande de que Guilherme e sua esposa fossem linchados devido à comoção nacional que o crime causou.</w:t>
-      </w:r>
-    </w:p>
-    <w:p>
-      <w:pPr>
-        <w:pStyle w:val="Normal"/>
-        <w:jc w:val="both"/>
-        <w:rPr>
-          <w:u w:val="none"/>
-        </w:rPr>
-      </w:pPr>
-      <w:r>
-        <w:rPr>
-          <w:rFonts w:eastAsia="Times New Roman" w:cs="Times New Roman" w:ascii="Garamond" w:hAnsi="Garamond"/>
-          <w:color w:val="000000"/>
-          <w:kern w:val="0"/>
-          <w:sz w:val="36"/>
-          <w:szCs w:val="36"/>
-          <w:u w:val="none"/>
-          <w:shd w:fill="auto" w:val="clear"/>
-          <w:lang w:val="en-US" w:eastAsia="zh-CN" w:bidi="hi-IN"/>
-        </w:rPr>
-        <w:t>Chico sabia que Glória Perez  não tinha condições de perdoar os assassinos de sua filha, mas sabia que, com a influência que Glória tinha - ela é uma escritora de novelas - seria possível evitar o linchamento</w:t>
-      </w:r>
-      <w:r>
-        <w:rPr>
-          <w:rFonts w:eastAsia="Times New Roman" w:cs="Times New Roman" w:ascii="Garamond" w:hAnsi="Garamond"/>
-          <w:color w:val="000000"/>
-          <w:kern w:val="0"/>
-          <w:sz w:val="36"/>
-          <w:szCs w:val="36"/>
-          <w:u w:val="none"/>
-          <w:shd w:fill="auto" w:val="clear"/>
-          <w:lang w:val="en-US" w:eastAsia="zh-CN" w:bidi="hi-IN"/>
-        </w:rPr>
-        <w:t>.</w:t>
+        <w:t>Chico sabia que Glória Perez  não tinha condições de perdoar os assassinos de sua filha, mas sabia que, com a influência que Glória tinha - ela é uma escritora de novelas - seria possível evitar o linchamento.</w:t>
       </w:r>
     </w:p>
     <w:p>
@@ -7653,7 +7990,7 @@
         <w:bCs/>
         <w:rFonts w:ascii="Garamond" w:hAnsi="Garamond"/>
       </w:rPr>
-      <w:t>36</w:t>
+      <w:t>35</w:t>
     </w:r>
     <w:r>
       <w:rPr>

</xml_diff>

<commit_message>
23/11/2025 - 21:35 h
</commit_message>
<xml_diff>
--- a/O mandamento maior/O Mandamento Maior.docx
+++ b/O mandamento maior/O Mandamento Maior.docx
@@ -322,455 +322,137 @@
           <w:shd w:fill="auto" w:val="clear"/>
           <w:lang w:val="en-US" w:eastAsia="zh-CN" w:bidi="hi-IN"/>
         </w:rPr>
-        <w:t xml:space="preserve">Nos capítulos 21, 22 e 23 do Evangelho de Mateus, </w:t>
-      </w:r>
-      <w:r>
-        <w:rPr>
-          <w:rFonts w:eastAsia="Times New Roman" w:cs="Times New Roman" w:ascii="Garamond" w:hAnsi="Garamond"/>
-          <w:color w:val="000000"/>
-          <w:kern w:val="0"/>
-          <w:sz w:val="36"/>
-          <w:szCs w:val="36"/>
-          <w:shd w:fill="auto" w:val="clear"/>
-          <w:lang w:val="en-US" w:eastAsia="zh-CN" w:bidi="hi-IN"/>
-        </w:rPr>
-        <w:t>nós percebemos</w:t>
-      </w:r>
-      <w:r>
-        <w:rPr>
-          <w:rFonts w:eastAsia="Times New Roman" w:cs="Times New Roman" w:ascii="Garamond" w:hAnsi="Garamond"/>
-          <w:color w:val="000000"/>
-          <w:kern w:val="0"/>
-          <w:sz w:val="36"/>
-          <w:szCs w:val="36"/>
-          <w:shd w:fill="auto" w:val="clear"/>
-          <w:lang w:val="en-US" w:eastAsia="zh-CN" w:bidi="hi-IN"/>
-        </w:rPr>
-        <w:t xml:space="preserve"> um crescente clima de confronto entre Jesus e as lideranças religiosas da época. </w:t>
-      </w:r>
-    </w:p>
-    <w:p>
-      <w:pPr>
-        <w:pStyle w:val="Normal"/>
-        <w:jc w:val="both"/>
-        <w:rPr>
-          <w:sz w:val="36"/>
-          <w:szCs w:val="36"/>
-        </w:rPr>
-      </w:pPr>
-      <w:r>
-        <w:rPr>
-          <w:sz w:val="36"/>
-          <w:szCs w:val="36"/>
-        </w:rPr>
-      </w:r>
-    </w:p>
-    <w:p>
-      <w:pPr>
-        <w:pStyle w:val="Normal"/>
-        <w:jc w:val="both"/>
-        <w:rPr>
-          <w:sz w:val="36"/>
-          <w:szCs w:val="36"/>
-        </w:rPr>
-      </w:pPr>
-      <w:r>
-        <w:rPr>
-          <w:rFonts w:eastAsia="Times New Roman" w:cs="Times New Roman" w:ascii="Garamond" w:hAnsi="Garamond"/>
-          <w:color w:val="000000"/>
-          <w:kern w:val="0"/>
-          <w:sz w:val="36"/>
-          <w:szCs w:val="36"/>
-          <w:shd w:fill="auto" w:val="clear"/>
-          <w:lang w:val="en-US" w:eastAsia="zh-CN" w:bidi="hi-IN"/>
-        </w:rPr>
-        <w:t xml:space="preserve">Primeiro </w:t>
-      </w:r>
-      <w:r>
-        <w:rPr>
-          <w:rFonts w:eastAsia="Times New Roman" w:cs="Times New Roman" w:ascii="Garamond" w:hAnsi="Garamond"/>
-          <w:color w:val="000000"/>
-          <w:kern w:val="0"/>
-          <w:sz w:val="36"/>
-          <w:szCs w:val="36"/>
-          <w:shd w:fill="auto" w:val="clear"/>
-          <w:lang w:val="en-US" w:eastAsia="zh-CN" w:bidi="hi-IN"/>
-        </w:rPr>
-        <w:t>Jesus</w:t>
-      </w:r>
-      <w:r>
-        <w:rPr>
-          <w:rFonts w:eastAsia="Times New Roman" w:cs="Times New Roman" w:ascii="Garamond" w:hAnsi="Garamond"/>
-          <w:color w:val="000000"/>
-          <w:kern w:val="0"/>
-          <w:sz w:val="36"/>
-          <w:szCs w:val="36"/>
-          <w:shd w:fill="auto" w:val="clear"/>
-          <w:lang w:val="en-US" w:eastAsia="zh-CN" w:bidi="hi-IN"/>
-        </w:rPr>
-        <w:t xml:space="preserve"> expulsa os mercadores do templo, dizendo que </w:t>
-      </w:r>
-      <w:r>
-        <w:rPr>
-          <w:rFonts w:eastAsia="Times New Roman" w:cs="Times New Roman" w:ascii="Garamond" w:hAnsi="Garamond"/>
-          <w:color w:val="000000"/>
-          <w:kern w:val="0"/>
-          <w:sz w:val="36"/>
-          <w:szCs w:val="36"/>
-          <w:shd w:fill="auto" w:val="clear"/>
-          <w:lang w:val="en-US" w:eastAsia="zh-CN" w:bidi="hi-IN"/>
-        </w:rPr>
-        <w:t>aquele era</w:t>
-      </w:r>
-      <w:r>
-        <w:rPr>
-          <w:rFonts w:eastAsia="Times New Roman" w:cs="Times New Roman" w:ascii="Garamond" w:hAnsi="Garamond"/>
-          <w:color w:val="000000"/>
-          <w:kern w:val="0"/>
-          <w:sz w:val="36"/>
-          <w:szCs w:val="36"/>
-          <w:shd w:fill="auto" w:val="clear"/>
-          <w:lang w:val="en-US" w:eastAsia="zh-CN" w:bidi="hi-IN"/>
-        </w:rPr>
-        <w:t xml:space="preserve"> um lugar de oração e não de comércio. Depois </w:t>
-      </w:r>
-      <w:r>
-        <w:rPr>
-          <w:rFonts w:eastAsia="Times New Roman" w:cs="Times New Roman" w:ascii="Garamond" w:hAnsi="Garamond"/>
-          <w:color w:val="000000"/>
-          <w:kern w:val="0"/>
-          <w:sz w:val="36"/>
-          <w:szCs w:val="36"/>
-          <w:shd w:fill="auto" w:val="clear"/>
-          <w:lang w:val="en-US" w:eastAsia="zh-CN" w:bidi="hi-IN"/>
-        </w:rPr>
-        <w:t>E</w:t>
-      </w:r>
-      <w:r>
-        <w:rPr>
-          <w:rFonts w:eastAsia="Times New Roman" w:cs="Times New Roman" w:ascii="Garamond" w:hAnsi="Garamond"/>
-          <w:color w:val="000000"/>
-          <w:kern w:val="0"/>
-          <w:sz w:val="36"/>
-          <w:szCs w:val="36"/>
-          <w:shd w:fill="auto" w:val="clear"/>
-          <w:lang w:val="en-US" w:eastAsia="zh-CN" w:bidi="hi-IN"/>
-        </w:rPr>
-        <w:t>le seca a figueira que não dava frutos, mostrando que a fé sem obras é estéril. Com esses exemplos</w:t>
-      </w:r>
-      <w:r>
-        <w:rPr>
-          <w:rFonts w:eastAsia="Times New Roman" w:cs="Times New Roman" w:ascii="Garamond" w:hAnsi="Garamond"/>
-          <w:color w:val="000000"/>
-          <w:kern w:val="0"/>
-          <w:sz w:val="36"/>
-          <w:szCs w:val="36"/>
-          <w:shd w:fill="auto" w:val="clear"/>
-          <w:lang w:val="en-US" w:eastAsia="zh-CN" w:bidi="hi-IN"/>
-        </w:rPr>
-        <w:t xml:space="preserve">, Jesus </w:t>
-      </w:r>
-      <w:r>
-        <w:rPr>
-          <w:rFonts w:eastAsia="Times New Roman" w:cs="Times New Roman" w:ascii="Garamond" w:hAnsi="Garamond"/>
-          <w:color w:val="000000"/>
-          <w:kern w:val="0"/>
-          <w:sz w:val="36"/>
-          <w:szCs w:val="36"/>
-          <w:shd w:fill="auto" w:val="clear"/>
-          <w:lang w:val="en-US" w:eastAsia="zh-CN" w:bidi="hi-IN"/>
-        </w:rPr>
-        <w:t>expõe</w:t>
-      </w:r>
-      <w:r>
-        <w:rPr>
-          <w:rFonts w:eastAsia="Times New Roman" w:cs="Times New Roman" w:ascii="Garamond" w:hAnsi="Garamond"/>
-          <w:color w:val="000000"/>
-          <w:kern w:val="0"/>
-          <w:sz w:val="36"/>
-          <w:szCs w:val="36"/>
-          <w:shd w:fill="auto" w:val="clear"/>
-          <w:lang w:val="en-US" w:eastAsia="zh-CN" w:bidi="hi-IN"/>
-        </w:rPr>
-        <w:t xml:space="preserve"> a </w:t>
-      </w:r>
-      <w:r>
-        <w:rPr>
-          <w:rFonts w:eastAsia="Times New Roman" w:cs="Times New Roman" w:ascii="Garamond" w:hAnsi="Garamond"/>
-          <w:color w:val="000000"/>
-          <w:kern w:val="0"/>
-          <w:sz w:val="36"/>
-          <w:szCs w:val="36"/>
-          <w:shd w:fill="auto" w:val="clear"/>
-          <w:lang w:val="en-US" w:eastAsia="zh-CN" w:bidi="hi-IN"/>
-        </w:rPr>
-        <w:t>inutilidade</w:t>
-      </w:r>
-      <w:r>
-        <w:rPr>
-          <w:rFonts w:eastAsia="Times New Roman" w:cs="Times New Roman" w:ascii="Garamond" w:hAnsi="Garamond"/>
-          <w:color w:val="000000"/>
-          <w:kern w:val="0"/>
-          <w:sz w:val="36"/>
-          <w:szCs w:val="36"/>
-          <w:shd w:fill="auto" w:val="clear"/>
-          <w:lang w:val="en-US" w:eastAsia="zh-CN" w:bidi="hi-IN"/>
-        </w:rPr>
-        <w:t xml:space="preserve"> da fé exterior e o vazio</w:t>
-      </w:r>
-      <w:r>
-        <w:rPr>
-          <w:rFonts w:eastAsia="Times New Roman" w:cs="Times New Roman" w:ascii="Garamond" w:hAnsi="Garamond"/>
-          <w:color w:val="000000"/>
-          <w:kern w:val="0"/>
-          <w:sz w:val="36"/>
-          <w:szCs w:val="36"/>
-          <w:shd w:fill="auto" w:val="clear"/>
-          <w:lang w:val="en-US" w:eastAsia="zh-CN" w:bidi="hi-IN"/>
-        </w:rPr>
-        <w:t xml:space="preserve"> d</w:t>
-      </w:r>
-      <w:r>
-        <w:rPr>
-          <w:rFonts w:eastAsia="Times New Roman" w:cs="Times New Roman" w:ascii="Garamond" w:hAnsi="Garamond"/>
-          <w:color w:val="000000"/>
-          <w:kern w:val="0"/>
-          <w:sz w:val="36"/>
-          <w:szCs w:val="36"/>
-          <w:shd w:fill="auto" w:val="clear"/>
-          <w:lang w:val="en-US" w:eastAsia="zh-CN" w:bidi="hi-IN"/>
-        </w:rPr>
-        <w:t>a religião feita de ritos, vaidades e julgamentos.</w:t>
-      </w:r>
-    </w:p>
-    <w:p>
-      <w:pPr>
-        <w:pStyle w:val="Normal"/>
-        <w:jc w:val="both"/>
-        <w:rPr>
-          <w:sz w:val="36"/>
-          <w:szCs w:val="36"/>
-        </w:rPr>
-      </w:pPr>
-      <w:r>
-        <w:rPr>
-          <w:sz w:val="36"/>
-          <w:szCs w:val="36"/>
-        </w:rPr>
-      </w:r>
-    </w:p>
-    <w:p>
-      <w:pPr>
-        <w:pStyle w:val="Normal"/>
-        <w:jc w:val="both"/>
-        <w:rPr>
-          <w:sz w:val="36"/>
-          <w:szCs w:val="36"/>
-        </w:rPr>
-      </w:pPr>
-      <w:r>
-        <w:rPr>
-          <w:rFonts w:eastAsia="Times New Roman" w:cs="Times New Roman" w:ascii="Garamond" w:hAnsi="Garamond"/>
-          <w:color w:val="000000"/>
-          <w:kern w:val="0"/>
-          <w:sz w:val="36"/>
-          <w:szCs w:val="36"/>
-          <w:shd w:fill="auto" w:val="clear"/>
-          <w:lang w:val="en-US" w:eastAsia="zh-CN" w:bidi="hi-IN"/>
-        </w:rPr>
-        <w:t xml:space="preserve">Fariseus e saduceus viviam tentando colocar Jesus em situações difíceis, fazendo perguntas </w:t>
-      </w:r>
-      <w:r>
-        <w:rPr>
-          <w:rFonts w:eastAsia="Times New Roman" w:cs="Times New Roman" w:ascii="Garamond" w:hAnsi="Garamond"/>
-          <w:color w:val="000000"/>
-          <w:kern w:val="0"/>
-          <w:sz w:val="36"/>
-          <w:szCs w:val="36"/>
-          <w:shd w:fill="auto" w:val="clear"/>
-          <w:lang w:val="en-US" w:eastAsia="zh-CN" w:bidi="hi-IN"/>
-        </w:rPr>
-        <w:t>maliciosas</w:t>
-      </w:r>
-      <w:r>
-        <w:rPr>
-          <w:rFonts w:eastAsia="Times New Roman" w:cs="Times New Roman" w:ascii="Garamond" w:hAnsi="Garamond"/>
-          <w:color w:val="000000"/>
-          <w:kern w:val="0"/>
-          <w:sz w:val="36"/>
-          <w:szCs w:val="36"/>
-          <w:shd w:fill="auto" w:val="clear"/>
-          <w:lang w:val="en-US" w:eastAsia="zh-CN" w:bidi="hi-IN"/>
-        </w:rPr>
-        <w:t xml:space="preserve"> </w:t>
-      </w:r>
-      <w:r>
-        <w:rPr>
-          <w:rFonts w:eastAsia="Times New Roman" w:cs="Times New Roman" w:ascii="Garamond" w:hAnsi="Garamond"/>
-          <w:color w:val="000000"/>
-          <w:kern w:val="0"/>
-          <w:sz w:val="36"/>
-          <w:szCs w:val="36"/>
-          <w:shd w:fill="auto" w:val="clear"/>
-          <w:lang w:val="en-US" w:eastAsia="zh-CN" w:bidi="hi-IN"/>
-        </w:rPr>
-        <w:t>com a  intenção de fazer Jesus cair em</w:t>
-      </w:r>
-      <w:r>
-        <w:rPr>
-          <w:rFonts w:eastAsia="Times New Roman" w:cs="Times New Roman" w:ascii="Garamond" w:hAnsi="Garamond"/>
-          <w:color w:val="000000"/>
-          <w:kern w:val="0"/>
-          <w:sz w:val="36"/>
-          <w:szCs w:val="36"/>
-          <w:shd w:fill="auto" w:val="clear"/>
-          <w:lang w:val="en-US" w:eastAsia="zh-CN" w:bidi="hi-IN"/>
-        </w:rPr>
-        <w:t xml:space="preserve"> contradição e </w:t>
-      </w:r>
-      <w:r>
-        <w:rPr>
-          <w:rFonts w:eastAsia="Times New Roman" w:cs="Times New Roman" w:ascii="Garamond" w:hAnsi="Garamond"/>
-          <w:color w:val="000000"/>
-          <w:kern w:val="0"/>
-          <w:sz w:val="36"/>
-          <w:szCs w:val="36"/>
-          <w:shd w:fill="auto" w:val="clear"/>
-          <w:lang w:val="en-US" w:eastAsia="zh-CN" w:bidi="hi-IN"/>
-        </w:rPr>
-        <w:t>ser desmoralizado</w:t>
-      </w:r>
-      <w:r>
-        <w:rPr>
-          <w:rFonts w:eastAsia="Times New Roman" w:cs="Times New Roman" w:ascii="Garamond" w:hAnsi="Garamond"/>
-          <w:color w:val="000000"/>
-          <w:kern w:val="0"/>
-          <w:sz w:val="36"/>
-          <w:szCs w:val="36"/>
-          <w:shd w:fill="auto" w:val="clear"/>
-          <w:lang w:val="en-US" w:eastAsia="zh-CN" w:bidi="hi-IN"/>
-        </w:rPr>
-        <w:t xml:space="preserve"> diante do povo. </w:t>
-      </w:r>
-    </w:p>
-    <w:p>
-      <w:pPr>
-        <w:pStyle w:val="Normal"/>
-        <w:jc w:val="both"/>
-        <w:rPr>
-          <w:sz w:val="36"/>
-          <w:szCs w:val="36"/>
-        </w:rPr>
-      </w:pPr>
-      <w:r>
-        <w:rPr/>
-      </w:r>
-    </w:p>
-    <w:p>
-      <w:pPr>
-        <w:pStyle w:val="Normal"/>
-        <w:jc w:val="both"/>
-        <w:rPr>
-          <w:sz w:val="36"/>
-          <w:szCs w:val="36"/>
-        </w:rPr>
-      </w:pPr>
-      <w:r>
-        <w:rPr>
-          <w:rFonts w:eastAsia="Times New Roman" w:cs="Times New Roman" w:ascii="Garamond" w:hAnsi="Garamond"/>
-          <w:color w:val="000000"/>
-          <w:kern w:val="0"/>
-          <w:sz w:val="36"/>
-          <w:szCs w:val="36"/>
-          <w:shd w:fill="auto" w:val="clear"/>
-          <w:lang w:val="en-US" w:eastAsia="zh-CN" w:bidi="hi-IN"/>
-        </w:rPr>
-        <w:t>Os fariseus</w:t>
-      </w:r>
-      <w:r>
-        <w:rPr>
-          <w:rFonts w:eastAsia="Times New Roman" w:cs="Times New Roman" w:ascii="Garamond" w:hAnsi="Garamond"/>
-          <w:color w:val="000000"/>
-          <w:kern w:val="0"/>
-          <w:sz w:val="36"/>
-          <w:szCs w:val="36"/>
-          <w:shd w:fill="auto" w:val="clear"/>
-          <w:lang w:val="en-US" w:eastAsia="zh-CN" w:bidi="hi-IN"/>
-        </w:rPr>
-        <w:t xml:space="preserve"> tinham uma crença mais próxima daquilo que Jesus ensinava. Eram estudiosos e muito dedicados ao cumprimento da Lei</w:t>
-      </w:r>
-      <w:r>
-        <w:rPr>
-          <w:rFonts w:eastAsia="Times New Roman" w:cs="Times New Roman" w:ascii="Garamond" w:hAnsi="Garamond"/>
-          <w:color w:val="000000"/>
-          <w:kern w:val="0"/>
-          <w:sz w:val="36"/>
-          <w:szCs w:val="36"/>
-          <w:shd w:fill="auto" w:val="clear"/>
-          <w:lang w:val="en-US" w:eastAsia="zh-CN" w:bidi="hi-IN"/>
-        </w:rPr>
-        <w:t xml:space="preserve">, mas muitos </w:t>
-      </w:r>
-      <w:r>
-        <w:rPr>
-          <w:rFonts w:eastAsia="Times New Roman" w:cs="Times New Roman" w:ascii="Garamond" w:hAnsi="Garamond"/>
-          <w:color w:val="000000"/>
-          <w:kern w:val="0"/>
-          <w:sz w:val="36"/>
-          <w:szCs w:val="36"/>
-          <w:shd w:fill="auto" w:val="clear"/>
-          <w:lang w:val="en-US" w:eastAsia="zh-CN" w:bidi="hi-IN"/>
-        </w:rPr>
-        <w:t xml:space="preserve">deles </w:t>
-      </w:r>
-      <w:r>
-        <w:rPr>
-          <w:rFonts w:eastAsia="Times New Roman" w:cs="Times New Roman" w:ascii="Garamond" w:hAnsi="Garamond"/>
-          <w:color w:val="000000"/>
-          <w:kern w:val="0"/>
-          <w:sz w:val="36"/>
-          <w:szCs w:val="36"/>
-          <w:shd w:fill="auto" w:val="clear"/>
-          <w:lang w:val="en-US" w:eastAsia="zh-CN" w:bidi="hi-IN"/>
-        </w:rPr>
-        <w:t xml:space="preserve">acabaram se apegando demais às regras e ao exibicionismo religioso. </w:t>
-      </w:r>
-      <w:r>
-        <w:rPr>
-          <w:rFonts w:eastAsia="Times New Roman" w:cs="Times New Roman" w:ascii="Garamond" w:hAnsi="Garamond"/>
-          <w:color w:val="000000"/>
-          <w:kern w:val="0"/>
-          <w:sz w:val="36"/>
-          <w:szCs w:val="36"/>
-          <w:shd w:fill="auto" w:val="clear"/>
-          <w:lang w:val="en-US" w:eastAsia="zh-CN" w:bidi="hi-IN"/>
-        </w:rPr>
-        <w:t xml:space="preserve">Embora cumprissem a Lei, faziam isso de maneira externa e </w:t>
-      </w:r>
-      <w:r>
-        <w:rPr>
-          <w:rFonts w:eastAsia="Times New Roman" w:cs="Times New Roman" w:ascii="Garamond" w:hAnsi="Garamond"/>
-          <w:color w:val="000000"/>
-          <w:kern w:val="0"/>
-          <w:sz w:val="36"/>
-          <w:szCs w:val="36"/>
-          <w:shd w:fill="auto" w:val="clear"/>
-          <w:lang w:val="en-US" w:eastAsia="zh-CN" w:bidi="hi-IN"/>
-        </w:rPr>
-        <w:t xml:space="preserve"> deixavam o coração de lado. </w:t>
-      </w:r>
-    </w:p>
-    <w:p>
-      <w:pPr>
-        <w:pStyle w:val="Normal"/>
-        <w:jc w:val="both"/>
-        <w:rPr>
-          <w:sz w:val="36"/>
-          <w:szCs w:val="36"/>
-        </w:rPr>
-      </w:pPr>
-      <w:r>
-        <w:rPr/>
+        <w:t xml:space="preserve">Nos capítulos 21, 22 e 23 do Evangelho de Mateus, nós percebemos um crescente clima de confronto entre Jesus e as lideranças religiosas da época. </w:t>
+      </w:r>
+    </w:p>
+    <w:p>
+      <w:pPr>
+        <w:pStyle w:val="Normal"/>
+        <w:jc w:val="both"/>
+        <w:rPr>
+          <w:sz w:val="36"/>
+          <w:szCs w:val="36"/>
+        </w:rPr>
+      </w:pPr>
+      <w:r>
+        <w:rPr>
+          <w:sz w:val="36"/>
+          <w:szCs w:val="36"/>
+        </w:rPr>
+      </w:r>
+    </w:p>
+    <w:p>
+      <w:pPr>
+        <w:pStyle w:val="Normal"/>
+        <w:jc w:val="both"/>
+        <w:rPr>
+          <w:sz w:val="36"/>
+          <w:szCs w:val="36"/>
+        </w:rPr>
+      </w:pPr>
+      <w:r>
+        <w:rPr>
+          <w:rFonts w:eastAsia="Times New Roman" w:cs="Times New Roman" w:ascii="Garamond" w:hAnsi="Garamond"/>
+          <w:color w:val="000000"/>
+          <w:kern w:val="0"/>
+          <w:sz w:val="36"/>
+          <w:szCs w:val="36"/>
+          <w:shd w:fill="auto" w:val="clear"/>
+          <w:lang w:val="en-US" w:eastAsia="zh-CN" w:bidi="hi-IN"/>
+        </w:rPr>
+        <w:t>Primeiro Jesus expulsa os mercadores do templo, dizendo que aquele era um lugar de oração e não de comércio. Depois Ele seca a figueira que não dava frutos, mostrando que a fé sem obras é estéril. Com esses exemplos, Jesus expõe a inutilidade da fé exterior e o vazio da religião feita de ritos, vaidades e julgamentos.</w:t>
+      </w:r>
+    </w:p>
+    <w:p>
+      <w:pPr>
+        <w:pStyle w:val="Normal"/>
+        <w:jc w:val="both"/>
+        <w:rPr>
+          <w:sz w:val="36"/>
+          <w:szCs w:val="36"/>
+        </w:rPr>
+      </w:pPr>
+      <w:r>
+        <w:rPr>
+          <w:sz w:val="36"/>
+          <w:szCs w:val="36"/>
+        </w:rPr>
+      </w:r>
+    </w:p>
+    <w:p>
+      <w:pPr>
+        <w:pStyle w:val="Normal"/>
+        <w:jc w:val="both"/>
+        <w:rPr>
+          <w:sz w:val="36"/>
+          <w:szCs w:val="36"/>
+        </w:rPr>
+      </w:pPr>
+      <w:r>
+        <w:rPr>
+          <w:rFonts w:eastAsia="Times New Roman" w:cs="Times New Roman" w:ascii="Garamond" w:hAnsi="Garamond"/>
+          <w:color w:val="000000"/>
+          <w:kern w:val="0"/>
+          <w:sz w:val="36"/>
+          <w:szCs w:val="36"/>
+          <w:shd w:fill="auto" w:val="clear"/>
+          <w:lang w:val="en-US" w:eastAsia="zh-CN" w:bidi="hi-IN"/>
+        </w:rPr>
+        <w:t xml:space="preserve">Fariseus e saduceus viviam tentando colocar Jesus em situações difíceis, fazendo perguntas maliciosas com a  intenção de fazer Jesus cair em contradição e ser desmoralizado diante do povo. </w:t>
+      </w:r>
+    </w:p>
+    <w:p>
+      <w:pPr>
+        <w:pStyle w:val="Normal"/>
+        <w:jc w:val="both"/>
+        <w:rPr>
+          <w:sz w:val="36"/>
+          <w:szCs w:val="36"/>
+        </w:rPr>
+      </w:pPr>
+      <w:r>
+        <w:rPr>
+          <w:sz w:val="36"/>
+          <w:szCs w:val="36"/>
+        </w:rPr>
+      </w:r>
+    </w:p>
+    <w:p>
+      <w:pPr>
+        <w:pStyle w:val="Normal"/>
+        <w:jc w:val="both"/>
+        <w:rPr>
+          <w:sz w:val="36"/>
+          <w:szCs w:val="36"/>
+        </w:rPr>
+      </w:pPr>
+      <w:r>
+        <w:rPr>
+          <w:rFonts w:eastAsia="Times New Roman" w:cs="Times New Roman" w:ascii="Garamond" w:hAnsi="Garamond"/>
+          <w:color w:val="000000"/>
+          <w:kern w:val="0"/>
+          <w:sz w:val="36"/>
+          <w:szCs w:val="36"/>
+          <w:shd w:fill="auto" w:val="clear"/>
+          <w:lang w:val="en-US" w:eastAsia="zh-CN" w:bidi="hi-IN"/>
+        </w:rPr>
+        <w:t xml:space="preserve">Os fariseus tinham uma crença mais próxima daquilo que Jesus ensinava. Eram estudiosos e muito dedicados ao cumprimento da Lei, mas muitos deles acabaram se apegando demais às regras e ao exibicionismo religioso. Embora cumprissem a Lei, faziam isso de maneira externa e  deixavam o coração de lado. </w:t>
+      </w:r>
+    </w:p>
+    <w:p>
+      <w:pPr>
+        <w:pStyle w:val="Normal"/>
+        <w:jc w:val="both"/>
+        <w:rPr>
+          <w:sz w:val="36"/>
+          <w:szCs w:val="36"/>
+        </w:rPr>
+      </w:pPr>
+      <w:r>
+        <w:rPr>
+          <w:sz w:val="36"/>
+          <w:szCs w:val="36"/>
+        </w:rPr>
       </w:r>
     </w:p>
     <w:p>
@@ -861,53 +543,32 @@
         </w:rPr>
       </w:pPr>
       <w:r>
-        <w:rPr/>
-      </w:r>
-    </w:p>
-    <w:p>
-      <w:pPr>
-        <w:pStyle w:val="Normal"/>
-        <w:jc w:val="both"/>
-        <w:rPr>
-          <w:sz w:val="36"/>
-          <w:szCs w:val="36"/>
-        </w:rPr>
-      </w:pPr>
-      <w:r>
-        <w:rPr>
-          <w:rFonts w:eastAsia="Times New Roman" w:cs="Times New Roman" w:ascii="Garamond" w:hAnsi="Garamond"/>
-          <w:color w:val="000000"/>
-          <w:kern w:val="0"/>
-          <w:sz w:val="36"/>
-          <w:szCs w:val="36"/>
-          <w:shd w:fill="auto" w:val="clear"/>
-          <w:lang w:val="en-US" w:eastAsia="zh-CN" w:bidi="hi-IN"/>
-        </w:rPr>
-        <w:t xml:space="preserve">É como se </w:t>
-      </w:r>
-      <w:r>
-        <w:rPr>
-          <w:rFonts w:eastAsia="Times New Roman" w:cs="Times New Roman" w:ascii="Garamond" w:hAnsi="Garamond"/>
-          <w:color w:val="000000"/>
-          <w:kern w:val="0"/>
-          <w:sz w:val="36"/>
-          <w:szCs w:val="36"/>
-          <w:shd w:fill="auto" w:val="clear"/>
-          <w:lang w:val="en-US" w:eastAsia="zh-CN" w:bidi="hi-IN"/>
-        </w:rPr>
-        <w:t>Jesus estivesse dizendo a eles</w:t>
-      </w:r>
-      <w:r>
-        <w:rPr>
-          <w:rFonts w:eastAsia="Times New Roman" w:cs="Times New Roman" w:ascii="Garamond" w:hAnsi="Garamond"/>
-          <w:color w:val="000000"/>
-          <w:kern w:val="0"/>
-          <w:sz w:val="36"/>
-          <w:szCs w:val="36"/>
-          <w:shd w:fill="auto" w:val="clear"/>
-          <w:lang w:val="en-US" w:eastAsia="zh-CN" w:bidi="hi-IN"/>
-        </w:rPr>
-        <w:t xml:space="preserve">: </w:t>
+        <w:rPr>
+          <w:sz w:val="36"/>
+          <w:szCs w:val="36"/>
+        </w:rPr>
+      </w:r>
+    </w:p>
+    <w:p>
+      <w:pPr>
+        <w:pStyle w:val="Normal"/>
+        <w:jc w:val="both"/>
+        <w:rPr>
+          <w:sz w:val="36"/>
+          <w:szCs w:val="36"/>
+        </w:rPr>
+      </w:pPr>
+      <w:r>
+        <w:rPr>
+          <w:rFonts w:eastAsia="Times New Roman" w:cs="Times New Roman" w:ascii="Garamond" w:hAnsi="Garamond"/>
+          <w:color w:val="000000"/>
+          <w:kern w:val="0"/>
+          <w:sz w:val="36"/>
+          <w:szCs w:val="36"/>
+          <w:shd w:fill="auto" w:val="clear"/>
+          <w:lang w:val="en-US" w:eastAsia="zh-CN" w:bidi="hi-IN"/>
+        </w:rPr>
+        <w:t xml:space="preserve">É como se Jesus estivesse dizendo a eles: </w:t>
       </w:r>
     </w:p>
     <w:p>
@@ -1025,103 +686,7 @@
           <w:shd w:fill="auto" w:val="clear"/>
           <w:lang w:val="en-US" w:eastAsia="zh-CN" w:bidi="hi-IN"/>
         </w:rPr>
-        <w:t>Esse comportamento combatido por Jesus permanece conosco até os dias de hoje. Passados mais de 2000 mil anos, continuamos exigindo muitas condições para fazer o bem. Escolhemos a quem</w:t>
-      </w:r>
-      <w:r>
-        <w:rPr>
-          <w:rFonts w:eastAsia="Times New Roman" w:cs="Times New Roman" w:ascii="Garamond" w:hAnsi="Garamond"/>
-          <w:color w:val="000000"/>
-          <w:kern w:val="0"/>
-          <w:sz w:val="36"/>
-          <w:szCs w:val="36"/>
-          <w:shd w:fill="auto" w:val="clear"/>
-          <w:lang w:val="en-US" w:eastAsia="zh-CN" w:bidi="hi-IN"/>
-        </w:rPr>
-        <w:t xml:space="preserve"> fazer</w:t>
-      </w:r>
-      <w:r>
-        <w:rPr>
-          <w:rFonts w:eastAsia="Times New Roman" w:cs="Times New Roman" w:ascii="Garamond" w:hAnsi="Garamond"/>
-          <w:color w:val="000000"/>
-          <w:kern w:val="0"/>
-          <w:sz w:val="36"/>
-          <w:szCs w:val="36"/>
-          <w:shd w:fill="auto" w:val="clear"/>
-          <w:lang w:val="en-US" w:eastAsia="zh-CN" w:bidi="hi-IN"/>
-        </w:rPr>
-        <w:t xml:space="preserve">, como </w:t>
-      </w:r>
-      <w:r>
-        <w:rPr>
-          <w:rFonts w:eastAsia="Times New Roman" w:cs="Times New Roman" w:ascii="Garamond" w:hAnsi="Garamond"/>
-          <w:color w:val="000000"/>
-          <w:kern w:val="0"/>
-          <w:sz w:val="36"/>
-          <w:szCs w:val="36"/>
-          <w:shd w:fill="auto" w:val="clear"/>
-          <w:lang w:val="en-US" w:eastAsia="zh-CN" w:bidi="hi-IN"/>
-        </w:rPr>
-        <w:t xml:space="preserve">fazer </w:t>
-      </w:r>
-      <w:r>
-        <w:rPr>
-          <w:rFonts w:eastAsia="Times New Roman" w:cs="Times New Roman" w:ascii="Garamond" w:hAnsi="Garamond"/>
-          <w:color w:val="000000"/>
-          <w:kern w:val="0"/>
-          <w:sz w:val="36"/>
-          <w:szCs w:val="36"/>
-          <w:shd w:fill="auto" w:val="clear"/>
-          <w:lang w:val="en-US" w:eastAsia="zh-CN" w:bidi="hi-IN"/>
-        </w:rPr>
-        <w:t>e onde fazer</w:t>
-      </w:r>
-      <w:r>
-        <w:rPr>
-          <w:rFonts w:eastAsia="Times New Roman" w:cs="Times New Roman" w:ascii="Garamond" w:hAnsi="Garamond"/>
-          <w:color w:val="000000"/>
-          <w:kern w:val="0"/>
-          <w:sz w:val="36"/>
-          <w:szCs w:val="36"/>
-          <w:shd w:fill="auto" w:val="clear"/>
-          <w:lang w:val="en-US" w:eastAsia="zh-CN" w:bidi="hi-IN"/>
-        </w:rPr>
-        <w:t>.</w:t>
-      </w:r>
-      <w:r>
-        <w:rPr>
-          <w:rFonts w:eastAsia="Times New Roman" w:cs="Times New Roman" w:ascii="Garamond" w:hAnsi="Garamond"/>
-          <w:color w:val="000000"/>
-          <w:kern w:val="0"/>
-          <w:sz w:val="36"/>
-          <w:szCs w:val="36"/>
-          <w:shd w:fill="auto" w:val="clear"/>
-          <w:lang w:val="en-US" w:eastAsia="zh-CN" w:bidi="hi-IN"/>
-        </w:rPr>
-        <w:t xml:space="preserve"> E </w:t>
-      </w:r>
-      <w:r>
-        <w:rPr>
-          <w:rFonts w:eastAsia="Times New Roman" w:cs="Times New Roman" w:ascii="Garamond" w:hAnsi="Garamond"/>
-          <w:color w:val="000000"/>
-          <w:kern w:val="0"/>
-          <w:sz w:val="36"/>
-          <w:szCs w:val="36"/>
-          <w:shd w:fill="auto" w:val="clear"/>
-          <w:lang w:val="en-US" w:eastAsia="zh-CN" w:bidi="hi-IN"/>
-        </w:rPr>
-        <w:t xml:space="preserve">obviamente </w:t>
-      </w:r>
-      <w:r>
-        <w:rPr>
-          <w:rFonts w:eastAsia="Times New Roman" w:cs="Times New Roman" w:ascii="Garamond" w:hAnsi="Garamond"/>
-          <w:color w:val="000000"/>
-          <w:kern w:val="0"/>
-          <w:sz w:val="36"/>
-          <w:szCs w:val="36"/>
-          <w:shd w:fill="auto" w:val="clear"/>
-          <w:lang w:val="en-US" w:eastAsia="zh-CN" w:bidi="hi-IN"/>
-        </w:rPr>
-        <w:t>não pode ser assim.</w:t>
+        <w:t>Esse comportamento combatido por Jesus permanece conosco até os dias de hoje. Passados mais de 2000 mil anos, continuamos exigindo muitas condições para fazer o bem. Escolhemos a quem fazer, como fazer e onde fazer. E obviamente não pode ser assim.</w:t>
       </w:r>
     </w:p>
     <w:p>
@@ -1277,31 +842,7 @@
           <w:shd w:fill="auto" w:val="clear"/>
           <w:lang w:val="en-US" w:eastAsia="zh-CN" w:bidi="hi-IN"/>
         </w:rPr>
-        <w:t>Alguém tem dúvidas sobre o que o Irmão Glacus quis dizer com essas palavras? Seria correto eu fazer o bem somente aos espíritas, aos cristãos, aos familiares, amigos, às pessoas que pensam como eu</w:t>
-      </w:r>
-      <w:r>
-        <w:rPr>
-          <w:rFonts w:eastAsia="Times New Roman" w:cs="Times New Roman" w:ascii="Garamond" w:hAnsi="Garamond"/>
-          <w:color w:val="000000"/>
-          <w:kern w:val="0"/>
-          <w:sz w:val="36"/>
-          <w:szCs w:val="36"/>
-          <w:shd w:fill="auto" w:val="clear"/>
-          <w:lang w:val="en-US" w:eastAsia="zh-CN" w:bidi="hi-IN"/>
-        </w:rPr>
-        <w:t>, às pessoas que podem um dia retribuir o bem que eu fizer a elas</w:t>
-      </w:r>
-      <w:r>
-        <w:rPr>
-          <w:rFonts w:eastAsia="Times New Roman" w:cs="Times New Roman" w:ascii="Garamond" w:hAnsi="Garamond"/>
-          <w:color w:val="000000"/>
-          <w:kern w:val="0"/>
-          <w:sz w:val="36"/>
-          <w:szCs w:val="36"/>
-          <w:shd w:fill="auto" w:val="clear"/>
-          <w:lang w:val="en-US" w:eastAsia="zh-CN" w:bidi="hi-IN"/>
-        </w:rPr>
-        <w:t>?</w:t>
+        <w:t>Alguém tem dúvidas sobre o que o Irmão Glacus quis dizer com essas palavras? Seria correto eu fazer o bem somente aos espíritas, aos cristãos, aos familiares, amigos, às pessoas que pensam como eu, às pessoas que podem um dia retribuir o bem que eu fizer a elas?</w:t>
       </w:r>
     </w:p>
     <w:p>
@@ -1377,115 +918,7 @@
           <w:shd w:fill="auto" w:val="clear"/>
           <w:lang w:val="en-US" w:eastAsia="zh-CN" w:bidi="hi-IN"/>
         </w:rPr>
-        <w:t>Assim,</w:t>
-      </w:r>
-      <w:r>
-        <w:rPr>
-          <w:rFonts w:eastAsia="Times New Roman" w:cs="Times New Roman" w:ascii="Garamond" w:hAnsi="Garamond"/>
-          <w:color w:val="000000"/>
-          <w:kern w:val="0"/>
-          <w:sz w:val="36"/>
-          <w:szCs w:val="36"/>
-          <w:shd w:fill="auto" w:val="clear"/>
-          <w:lang w:val="en-US" w:eastAsia="zh-CN" w:bidi="hi-IN"/>
-        </w:rPr>
-        <w:t xml:space="preserve"> </w:t>
-      </w:r>
-      <w:r>
-        <w:rPr>
-          <w:rFonts w:eastAsia="Times New Roman" w:cs="Times New Roman" w:ascii="Garamond" w:hAnsi="Garamond"/>
-          <w:color w:val="000000"/>
-          <w:kern w:val="0"/>
-          <w:sz w:val="36"/>
-          <w:szCs w:val="36"/>
-          <w:shd w:fill="auto" w:val="clear"/>
-          <w:lang w:val="en-US" w:eastAsia="zh-CN" w:bidi="hi-IN"/>
-        </w:rPr>
-        <w:t xml:space="preserve">o </w:t>
-      </w:r>
-      <w:r>
-        <w:rPr>
-          <w:rFonts w:eastAsia="Times New Roman" w:cs="Times New Roman" w:ascii="Garamond" w:hAnsi="Garamond"/>
-          <w:color w:val="000000"/>
-          <w:kern w:val="0"/>
-          <w:sz w:val="36"/>
-          <w:szCs w:val="36"/>
-          <w:shd w:fill="auto" w:val="clear"/>
-          <w:lang w:val="en-US" w:eastAsia="zh-CN" w:bidi="hi-IN"/>
-        </w:rPr>
-        <w:t xml:space="preserve">mandamento </w:t>
-      </w:r>
-      <w:r>
-        <w:rPr>
-          <w:rFonts w:eastAsia="Times New Roman" w:cs="Times New Roman" w:ascii="Garamond" w:hAnsi="Garamond"/>
-          <w:color w:val="000000"/>
-          <w:kern w:val="0"/>
-          <w:sz w:val="36"/>
-          <w:szCs w:val="36"/>
-          <w:shd w:fill="auto" w:val="clear"/>
-          <w:lang w:val="en-US" w:eastAsia="zh-CN" w:bidi="hi-IN"/>
-        </w:rPr>
-        <w:t xml:space="preserve">maior </w:t>
-      </w:r>
-      <w:r>
-        <w:rPr>
-          <w:rFonts w:eastAsia="Times New Roman" w:cs="Times New Roman" w:ascii="Garamond" w:hAnsi="Garamond"/>
-          <w:color w:val="000000"/>
-          <w:kern w:val="0"/>
-          <w:sz w:val="36"/>
-          <w:szCs w:val="36"/>
-          <w:shd w:fill="auto" w:val="clear"/>
-          <w:lang w:val="en-US" w:eastAsia="zh-CN" w:bidi="hi-IN"/>
-        </w:rPr>
-        <w:t xml:space="preserve">é o resumo de tudo o que Jesus vinha ensinando. Quando </w:t>
-      </w:r>
-      <w:r>
-        <w:rPr>
-          <w:rFonts w:eastAsia="Times New Roman" w:cs="Times New Roman" w:ascii="Garamond" w:hAnsi="Garamond"/>
-          <w:color w:val="000000"/>
-          <w:kern w:val="0"/>
-          <w:sz w:val="36"/>
-          <w:szCs w:val="36"/>
-          <w:shd w:fill="auto" w:val="clear"/>
-          <w:lang w:val="en-US" w:eastAsia="zh-CN" w:bidi="hi-IN"/>
-        </w:rPr>
-        <w:t xml:space="preserve">colocamos </w:t>
-      </w:r>
-      <w:r>
-        <w:rPr>
-          <w:rFonts w:eastAsia="Times New Roman" w:cs="Times New Roman" w:ascii="Garamond" w:hAnsi="Garamond"/>
-          <w:color w:val="000000"/>
-          <w:kern w:val="0"/>
-          <w:sz w:val="36"/>
-          <w:szCs w:val="36"/>
-          <w:shd w:fill="auto" w:val="clear"/>
-          <w:lang w:val="en-US" w:eastAsia="zh-CN" w:bidi="hi-IN"/>
-        </w:rPr>
-        <w:t xml:space="preserve">o amor </w:t>
-      </w:r>
-      <w:r>
-        <w:rPr>
-          <w:rFonts w:eastAsia="Times New Roman" w:cs="Times New Roman" w:ascii="Garamond" w:hAnsi="Garamond"/>
-          <w:color w:val="000000"/>
-          <w:kern w:val="0"/>
-          <w:sz w:val="36"/>
-          <w:szCs w:val="36"/>
-          <w:shd w:fill="auto" w:val="clear"/>
-          <w:lang w:val="en-US" w:eastAsia="zh-CN" w:bidi="hi-IN"/>
-        </w:rPr>
-        <w:t>naquilo em que fazemos</w:t>
-      </w:r>
-      <w:r>
-        <w:rPr>
-          <w:rFonts w:eastAsia="Times New Roman" w:cs="Times New Roman" w:ascii="Garamond" w:hAnsi="Garamond"/>
-          <w:color w:val="000000"/>
-          <w:kern w:val="0"/>
-          <w:sz w:val="36"/>
-          <w:szCs w:val="36"/>
-          <w:shd w:fill="auto" w:val="clear"/>
-          <w:lang w:val="en-US" w:eastAsia="zh-CN" w:bidi="hi-IN"/>
-        </w:rPr>
-        <w:t xml:space="preserve">, não há espaço para a hipocrisia, para a vaidade ou para a religião de aparências. </w:t>
+        <w:t xml:space="preserve">Assim, o mandamento maior é o resumo de tudo o que Jesus vinha ensinando. Quando colocamos o amor naquilo em que fazemos, não há espaço para a hipocrisia, para a vaidade ou para a religião de aparências. </w:t>
       </w:r>
     </w:p>
     <w:p>
@@ -1500,72 +933,31 @@
       </w:pPr>
       <w:r>
         <w:rPr>
-          <w:rFonts w:eastAsia="Times New Roman" w:cs="Times New Roman" w:ascii="Garamond" w:hAnsi="Garamond"/>
           <w:color w:val="00A0FC"/>
-          <w:kern w:val="0"/>
-          <w:sz w:val="36"/>
-          <w:szCs w:val="36"/>
-          <w:shd w:fill="auto" w:val="clear"/>
-          <w:lang w:val="en-US" w:eastAsia="zh-CN" w:bidi="hi-IN"/>
-        </w:rPr>
-        <w:t>[ Início - Tópico 1 ]</w:t>
-      </w:r>
-    </w:p>
-    <w:p>
-      <w:pPr>
-        <w:pStyle w:val="Normal"/>
-        <w:jc w:val="both"/>
-        <w:rPr>
-          <w:color w:val="000000"/>
-        </w:rPr>
-      </w:pPr>
-      <w:r>
-        <w:rPr>
-          <w:rFonts w:eastAsia="Times New Roman" w:cs="Times New Roman" w:ascii="Garamond" w:hAnsi="Garamond"/>
-          <w:color w:val="000000"/>
-          <w:kern w:val="0"/>
-          <w:sz w:val="36"/>
-          <w:szCs w:val="36"/>
-          <w:shd w:fill="auto" w:val="clear"/>
-          <w:lang w:val="en-US" w:eastAsia="zh-CN" w:bidi="hi-IN"/>
-        </w:rPr>
-        <w:t>No</w:t>
-      </w:r>
-      <w:r>
-        <w:rPr>
-          <w:rFonts w:eastAsia="Times New Roman" w:cs="Times New Roman" w:ascii="Garamond" w:hAnsi="Garamond"/>
-          <w:color w:val="000000"/>
-          <w:kern w:val="0"/>
-          <w:sz w:val="36"/>
-          <w:szCs w:val="36"/>
-          <w:shd w:fill="auto" w:val="clear"/>
-          <w:lang w:val="en-US" w:eastAsia="zh-CN" w:bidi="hi-IN"/>
-        </w:rPr>
-        <w:t xml:space="preserve"> versículo 37</w:t>
-      </w:r>
-      <w:r>
-        <w:rPr>
-          <w:rFonts w:eastAsia="Times New Roman" w:cs="Times New Roman" w:ascii="Garamond" w:hAnsi="Garamond"/>
-          <w:color w:val="000000"/>
-          <w:kern w:val="0"/>
-          <w:sz w:val="36"/>
-          <w:szCs w:val="36"/>
-          <w:shd w:fill="auto" w:val="clear"/>
-          <w:lang w:val="en-US" w:eastAsia="zh-CN" w:bidi="hi-IN"/>
-        </w:rPr>
-        <w:t xml:space="preserve"> Jesus nos diz</w:t>
-      </w:r>
-      <w:r>
-        <w:rPr>
-          <w:rFonts w:eastAsia="Times New Roman" w:cs="Times New Roman" w:ascii="Garamond" w:hAnsi="Garamond"/>
-          <w:color w:val="000000"/>
-          <w:kern w:val="0"/>
-          <w:sz w:val="36"/>
-          <w:szCs w:val="36"/>
-          <w:shd w:fill="auto" w:val="clear"/>
-          <w:lang w:val="en-US" w:eastAsia="zh-CN" w:bidi="hi-IN"/>
-        </w:rPr>
-        <w:t xml:space="preserve">: </w:t>
+          <w:sz w:val="36"/>
+          <w:szCs w:val="36"/>
+        </w:rPr>
+      </w:r>
+    </w:p>
+    <w:p>
+      <w:pPr>
+        <w:pStyle w:val="Normal"/>
+        <w:jc w:val="both"/>
+        <w:rPr>
+          <w:color w:val="000000"/>
+        </w:rPr>
+      </w:pPr>
+      <w:r>
+        <w:rPr>
+          <w:rFonts w:eastAsia="Times New Roman" w:cs="Times New Roman" w:ascii="Garamond" w:hAnsi="Garamond"/>
+          <w:color w:val="000000"/>
+          <w:kern w:val="0"/>
+          <w:sz w:val="36"/>
+          <w:szCs w:val="36"/>
+          <w:shd w:fill="auto" w:val="clear"/>
+          <w:lang w:val="en-US" w:eastAsia="zh-CN" w:bidi="hi-IN"/>
+        </w:rPr>
+        <w:t xml:space="preserve">No versículo 37 Jesus nos diz: </w:t>
       </w:r>
     </w:p>
     <w:p>
@@ -1640,46 +1032,34 @@
           <w:shd w:fill="auto" w:val="clear"/>
           <w:lang w:val="en-US" w:eastAsia="zh-CN" w:bidi="hi-IN"/>
         </w:rPr>
-        <w:t>Amar a Deus de coração, alma e pensamento. Vamos refletir sobre essas 3 diferentes expressões de amor a Deus e vamos fazer isso sob a ótica da Doutrina Espírita.</w:t>
-      </w:r>
-    </w:p>
-    <w:p>
-      <w:pPr>
-        <w:pStyle w:val="Normal"/>
-        <w:jc w:val="both"/>
-        <w:rPr>
-          <w:color w:val="000000"/>
-        </w:rPr>
-      </w:pPr>
-      <w:r>
-        <w:rPr>
-          <w:color w:val="000000"/>
-        </w:rPr>
-      </w:r>
-    </w:p>
-    <w:p>
-      <w:pPr>
-        <w:pStyle w:val="Normal"/>
-        <w:jc w:val="both"/>
-        <w:rPr>
-          <w:color w:val="000000"/>
-        </w:rPr>
-      </w:pPr>
-      <w:r>
-        <w:rPr>
-          <w:color w:val="000000"/>
-        </w:rPr>
-      </w:r>
-    </w:p>
-    <w:p>
-      <w:pPr>
-        <w:pStyle w:val="Normal"/>
-        <w:jc w:val="center"/>
+        <w:t>Amar a Deus de coração, alma e pensamento. Vamos refletir sobre essas 3 diferentes expressões de amor a Deus e faremos isso sob a ótica da Doutrina Espírita.</w:t>
+      </w:r>
+    </w:p>
+    <w:p>
+      <w:pPr>
+        <w:pStyle w:val="Normal"/>
+        <w:jc w:val="both"/>
+        <w:rPr>
+          <w:color w:val="000000"/>
+        </w:rPr>
+      </w:pPr>
+      <w:r>
+        <w:rPr>
+          <w:color w:val="000000"/>
+        </w:rPr>
+      </w:r>
+    </w:p>
+    <w:p>
+      <w:pPr>
+        <w:pStyle w:val="Normal"/>
+        <w:jc w:val="both"/>
         <w:rPr/>
       </w:pPr>
       <w:r>
         <w:rPr>
           <w:rFonts w:eastAsia="Times New Roman" w:cs="Times New Roman" w:ascii="Garamond" w:hAnsi="Garamond"/>
+          <w:b/>
+          <w:bCs/>
           <w:color w:val="000000"/>
           <w:kern w:val="0"/>
           <w:sz w:val="36"/>
@@ -1722,102 +1102,108 @@
           <w:shd w:fill="auto" w:val="clear"/>
           <w:lang w:val="en-US" w:eastAsia="zh-CN" w:bidi="hi-IN"/>
         </w:rPr>
-        <w:t>O coração é interpretado como a sede dos sentimentos humanos. Ele representa afeição, amor, mas também um sentimento moral. É símbolo do afeto profundo, da sinceridade do sentimento.</w:t>
-      </w:r>
-    </w:p>
-    <w:p>
-      <w:pPr>
-        <w:pStyle w:val="Normal"/>
-        <w:jc w:val="both"/>
-        <w:rPr>
-          <w:color w:val="000000"/>
-        </w:rPr>
-      </w:pPr>
-      <w:r>
-        <w:rPr>
-          <w:color w:val="000000"/>
-        </w:rPr>
-      </w:r>
-    </w:p>
-    <w:p>
-      <w:pPr>
-        <w:pStyle w:val="Normal"/>
-        <w:jc w:val="both"/>
-        <w:rPr>
-          <w:color w:val="000000"/>
-        </w:rPr>
-      </w:pPr>
-      <w:r>
-        <w:rPr>
-          <w:rFonts w:eastAsia="Times New Roman" w:cs="Times New Roman" w:ascii="Garamond" w:hAnsi="Garamond"/>
-          <w:color w:val="000000"/>
-          <w:kern w:val="0"/>
-          <w:sz w:val="36"/>
-          <w:szCs w:val="36"/>
-          <w:shd w:fill="auto" w:val="clear"/>
-          <w:lang w:val="en-US" w:eastAsia="zh-CN" w:bidi="hi-IN"/>
-        </w:rPr>
-        <w:t xml:space="preserve">Portanto, amar de todo o coração significa amar a Deus com pureza de sentimentos, sem hipocrisia; é amar de forma concreta e não apenas através de palavras. </w:t>
-      </w:r>
-    </w:p>
-    <w:p>
-      <w:pPr>
-        <w:pStyle w:val="Normal"/>
-        <w:jc w:val="both"/>
-        <w:rPr>
-          <w:color w:val="000000"/>
-        </w:rPr>
-      </w:pPr>
-      <w:r>
-        <w:rPr>
-          <w:color w:val="000000"/>
-        </w:rPr>
-      </w:r>
-    </w:p>
-    <w:p>
-      <w:pPr>
-        <w:pStyle w:val="Normal"/>
-        <w:jc w:val="both"/>
-        <w:rPr>
-          <w:color w:val="000000"/>
-        </w:rPr>
-      </w:pPr>
-      <w:r>
-        <w:rPr>
-          <w:rFonts w:eastAsia="Times New Roman" w:cs="Times New Roman" w:ascii="Garamond" w:hAnsi="Garamond"/>
-          <w:color w:val="000000"/>
-          <w:kern w:val="0"/>
-          <w:sz w:val="36"/>
-          <w:szCs w:val="36"/>
-          <w:shd w:fill="auto" w:val="clear"/>
-          <w:lang w:val="en-US" w:eastAsia="zh-CN" w:bidi="hi-IN"/>
-        </w:rPr>
-        <w:t>O amor que devemos manifestar por Deus deve expressar nossa devoção mais sincera.</w:t>
-      </w:r>
-    </w:p>
-    <w:p>
-      <w:pPr>
-        <w:pStyle w:val="Normal"/>
-        <w:jc w:val="both"/>
-        <w:rPr>
-          <w:color w:val="000000"/>
-        </w:rPr>
-      </w:pPr>
-      <w:r>
-        <w:rPr>
-          <w:color w:val="000000"/>
-        </w:rPr>
-      </w:r>
-    </w:p>
-    <w:p>
-      <w:pPr>
-        <w:pStyle w:val="Normal"/>
-        <w:jc w:val="center"/>
-        <w:rPr/>
-      </w:pPr>
-      <w:r>
-        <w:rPr>
-          <w:rFonts w:eastAsia="Times New Roman" w:cs="Times New Roman" w:ascii="Garamond" w:hAnsi="Garamond"/>
+        <w:t>O coração é a sede dos sentimentos humanos e representa afeição, amor, mas também o sentimento moral. Pelo coração expressamos nossos sentimentos mais sinceros.</w:t>
+      </w:r>
+    </w:p>
+    <w:p>
+      <w:pPr>
+        <w:pStyle w:val="Normal"/>
+        <w:jc w:val="both"/>
+        <w:rPr>
+          <w:color w:val="000000"/>
+        </w:rPr>
+      </w:pPr>
+      <w:r>
+        <w:rPr>
+          <w:color w:val="000000"/>
+        </w:rPr>
+      </w:r>
+    </w:p>
+    <w:p>
+      <w:pPr>
+        <w:pStyle w:val="Normal"/>
+        <w:jc w:val="both"/>
+        <w:rPr>
+          <w:color w:val="000000"/>
+        </w:rPr>
+      </w:pPr>
+      <w:r>
+        <w:rPr>
+          <w:rFonts w:eastAsia="Times New Roman" w:cs="Times New Roman" w:ascii="Garamond" w:hAnsi="Garamond"/>
+          <w:color w:val="000000"/>
+          <w:kern w:val="0"/>
+          <w:sz w:val="36"/>
+          <w:szCs w:val="36"/>
+          <w:shd w:fill="auto" w:val="clear"/>
+          <w:lang w:val="en-US" w:eastAsia="zh-CN" w:bidi="hi-IN"/>
+        </w:rPr>
+        <w:t xml:space="preserve">Amar a Deus de todo o coração significa amar com pureza de sentimentos, sem hipocrisia; amar de forma concreta e não apenas através de palavras. </w:t>
+      </w:r>
+    </w:p>
+    <w:p>
+      <w:pPr>
+        <w:pStyle w:val="Normal"/>
+        <w:jc w:val="both"/>
+        <w:rPr>
+          <w:color w:val="000000"/>
+        </w:rPr>
+      </w:pPr>
+      <w:r>
+        <w:rPr>
+          <w:color w:val="000000"/>
+        </w:rPr>
+      </w:r>
+    </w:p>
+    <w:p>
+      <w:pPr>
+        <w:pStyle w:val="Normal"/>
+        <w:jc w:val="both"/>
+        <w:rPr>
+          <w:color w:val="000000"/>
+        </w:rPr>
+      </w:pPr>
+      <w:r>
+        <w:rPr>
+          <w:rFonts w:eastAsia="Times New Roman" w:cs="Times New Roman" w:ascii="Garamond" w:hAnsi="Garamond"/>
+          <w:color w:val="000000"/>
+          <w:kern w:val="0"/>
+          <w:sz w:val="36"/>
+          <w:szCs w:val="36"/>
+          <w:shd w:fill="auto" w:val="clear"/>
+          <w:lang w:val="en-US" w:eastAsia="zh-CN" w:bidi="hi-IN"/>
+        </w:rPr>
+        <w:t>O amor para com Deus deve expressar nossa devoção mais sincera.</w:t>
+      </w:r>
+    </w:p>
+    <w:p>
+      <w:pPr>
+        <w:pStyle w:val="Normal"/>
+        <w:jc w:val="both"/>
+        <w:rPr>
+          <w:color w:val="000000"/>
+        </w:rPr>
+      </w:pPr>
+      <w:r>
+        <w:rPr>
+          <w:color w:val="000000"/>
+        </w:rPr>
+      </w:r>
+    </w:p>
+    <w:p>
+      <w:pPr>
+        <w:pStyle w:val="Normal"/>
+        <w:jc w:val="both"/>
+        <w:rPr>
+          <w:b/>
+          <w:b/>
+          <w:bCs/>
+        </w:rPr>
+      </w:pPr>
+      <w:r>
+        <w:rPr>
+          <w:rFonts w:eastAsia="Times New Roman" w:cs="Times New Roman" w:ascii="Garamond" w:hAnsi="Garamond"/>
+          <w:b/>
+          <w:bCs/>
           <w:color w:val="000000"/>
           <w:kern w:val="0"/>
           <w:sz w:val="36"/>
@@ -1860,102 +1246,136 @@
           <w:shd w:fill="auto" w:val="clear"/>
           <w:lang w:val="en-US" w:eastAsia="zh-CN" w:bidi="hi-IN"/>
         </w:rPr>
-        <w:t>Em O Livro dos Espíritos, a Espiritualidade nos diz que alma nada mais é que o Espírito encarnado. A alma é a própria essência do ser, a individualidade espiritual que sobrevive à morte.</w:t>
-      </w:r>
-    </w:p>
-    <w:p>
-      <w:pPr>
-        <w:pStyle w:val="Normal"/>
-        <w:jc w:val="both"/>
-        <w:rPr>
-          <w:color w:val="000000"/>
-        </w:rPr>
-      </w:pPr>
-      <w:r>
-        <w:rPr>
-          <w:color w:val="000000"/>
-        </w:rPr>
-      </w:r>
-    </w:p>
-    <w:p>
-      <w:pPr>
-        <w:pStyle w:val="Normal"/>
-        <w:jc w:val="both"/>
-        <w:rPr>
-          <w:color w:val="000000"/>
-        </w:rPr>
-      </w:pPr>
-      <w:r>
-        <w:rPr>
-          <w:rFonts w:eastAsia="Times New Roman" w:cs="Times New Roman" w:ascii="Garamond" w:hAnsi="Garamond"/>
-          <w:color w:val="000000"/>
-          <w:kern w:val="0"/>
-          <w:sz w:val="36"/>
-          <w:szCs w:val="36"/>
-          <w:shd w:fill="auto" w:val="clear"/>
-          <w:lang w:val="en-US" w:eastAsia="zh-CN" w:bidi="hi-IN"/>
-        </w:rPr>
-        <w:t>Amar a Deus de toda a alma  é amar com tudo o que somos, na nossa integralidade espiritual, como Espíritos imortais. Isso inclui a ideia de entrega total, de fidelidade a Deus acima de todas as coisas, inclusive acima dos interesses passageiros da vida material.</w:t>
-      </w:r>
-    </w:p>
-    <w:p>
-      <w:pPr>
-        <w:pStyle w:val="Normal"/>
-        <w:jc w:val="both"/>
-        <w:rPr>
-          <w:color w:val="000000"/>
-        </w:rPr>
-      </w:pPr>
-      <w:r>
-        <w:rPr>
-          <w:color w:val="000000"/>
-        </w:rPr>
-      </w:r>
-    </w:p>
-    <w:p>
-      <w:pPr>
-        <w:pStyle w:val="Normal"/>
-        <w:jc w:val="both"/>
-        <w:rPr>
-          <w:color w:val="000000"/>
-        </w:rPr>
-      </w:pPr>
-      <w:r>
-        <w:rPr>
-          <w:rFonts w:eastAsia="Times New Roman" w:cs="Times New Roman" w:ascii="Garamond" w:hAnsi="Garamond"/>
-          <w:color w:val="000000"/>
-          <w:kern w:val="0"/>
-          <w:sz w:val="36"/>
-          <w:szCs w:val="36"/>
-          <w:shd w:fill="auto" w:val="clear"/>
-          <w:lang w:val="en-US" w:eastAsia="zh-CN" w:bidi="hi-IN"/>
-        </w:rPr>
-        <w:t>É o amor que transcende a existência terrena: amar a Deus não só enquanto estamos no corpo, mas também como Espírito eterno.</w:t>
-      </w:r>
-    </w:p>
-    <w:p>
-      <w:pPr>
-        <w:pStyle w:val="Normal"/>
-        <w:jc w:val="both"/>
-        <w:rPr>
-          <w:color w:val="000000"/>
-        </w:rPr>
-      </w:pPr>
-      <w:r>
-        <w:rPr>
-          <w:color w:val="000000"/>
-        </w:rPr>
-      </w:r>
-    </w:p>
-    <w:p>
-      <w:pPr>
-        <w:pStyle w:val="Normal"/>
-        <w:jc w:val="center"/>
-        <w:rPr/>
-      </w:pPr>
-      <w:r>
-        <w:rPr>
-          <w:rFonts w:eastAsia="Times New Roman" w:cs="Times New Roman" w:ascii="Garamond" w:hAnsi="Garamond"/>
+        <w:t>Em O Livro dos Espíritos, a Espiritualidade nos diz que alma nada mais é que o Espírito encarnado. É a individualidade espiritual que sobrevive à morte.</w:t>
+      </w:r>
+    </w:p>
+    <w:p>
+      <w:pPr>
+        <w:pStyle w:val="Normal"/>
+        <w:jc w:val="both"/>
+        <w:rPr>
+          <w:color w:val="000000"/>
+        </w:rPr>
+      </w:pPr>
+      <w:r>
+        <w:rPr>
+          <w:color w:val="000000"/>
+        </w:rPr>
+      </w:r>
+    </w:p>
+    <w:p>
+      <w:pPr>
+        <w:pStyle w:val="Normal"/>
+        <w:jc w:val="both"/>
+        <w:rPr>
+          <w:color w:val="000000"/>
+        </w:rPr>
+      </w:pPr>
+      <w:r>
+        <w:rPr>
+          <w:rFonts w:eastAsia="Times New Roman" w:cs="Times New Roman" w:ascii="Garamond" w:hAnsi="Garamond"/>
+          <w:color w:val="000000"/>
+          <w:kern w:val="0"/>
+          <w:sz w:val="36"/>
+          <w:szCs w:val="36"/>
+          <w:shd w:fill="auto" w:val="clear"/>
+          <w:lang w:val="en-US" w:eastAsia="zh-CN" w:bidi="hi-IN"/>
+        </w:rPr>
+        <w:t>Amar a Deus de toda a alma  é amar na nossa integralidade espiritual, como seres imortais que somos. É manifestar fidelidade a Deus acima de todas as coisas, principalmente acima dos interesses passageiros da vida material.</w:t>
+      </w:r>
+    </w:p>
+    <w:p>
+      <w:pPr>
+        <w:pStyle w:val="Normal"/>
+        <w:jc w:val="both"/>
+        <w:rPr>
+          <w:color w:val="000000"/>
+        </w:rPr>
+      </w:pPr>
+      <w:r>
+        <w:rPr>
+          <w:color w:val="000000"/>
+        </w:rPr>
+      </w:r>
+    </w:p>
+    <w:p>
+      <w:pPr>
+        <w:pStyle w:val="Normal"/>
+        <w:jc w:val="both"/>
+        <w:rPr>
+          <w:color w:val="000000"/>
+        </w:rPr>
+      </w:pPr>
+      <w:r>
+        <w:rPr>
+          <w:rFonts w:eastAsia="Times New Roman" w:cs="Times New Roman" w:ascii="Garamond" w:hAnsi="Garamond"/>
+          <w:color w:val="000000"/>
+          <w:kern w:val="0"/>
+          <w:sz w:val="36"/>
+          <w:szCs w:val="36"/>
+          <w:shd w:fill="auto" w:val="clear"/>
+          <w:lang w:val="en-US" w:eastAsia="zh-CN" w:bidi="hi-IN"/>
+        </w:rPr>
+        <w:t>Significa amar a Deus não apenas enquanto estamos no corpo, mas também como Espírito eterno.</w:t>
+      </w:r>
+    </w:p>
+    <w:p>
+      <w:pPr>
+        <w:pStyle w:val="Normal"/>
+        <w:jc w:val="both"/>
+        <w:rPr>
+          <w:color w:val="000000"/>
+        </w:rPr>
+      </w:pPr>
+      <w:r>
+        <w:rPr>
+          <w:color w:val="000000"/>
+        </w:rPr>
+      </w:r>
+    </w:p>
+    <w:p>
+      <w:pPr>
+        <w:pStyle w:val="Normal"/>
+        <w:jc w:val="both"/>
+        <w:rPr>
+          <w:color w:val="000000"/>
+        </w:rPr>
+      </w:pPr>
+      <w:r>
+        <w:rPr>
+          <w:color w:val="000000"/>
+        </w:rPr>
+      </w:r>
+    </w:p>
+    <w:p>
+      <w:pPr>
+        <w:pStyle w:val="Normal"/>
+        <w:jc w:val="both"/>
+        <w:rPr>
+          <w:color w:val="000000"/>
+        </w:rPr>
+      </w:pPr>
+      <w:r>
+        <w:rPr>
+          <w:color w:val="000000"/>
+        </w:rPr>
+      </w:r>
+    </w:p>
+    <w:p>
+      <w:pPr>
+        <w:pStyle w:val="Normal"/>
+        <w:jc w:val="both"/>
+        <w:rPr>
+          <w:b/>
+          <w:b/>
+          <w:bCs/>
+        </w:rPr>
+      </w:pPr>
+      <w:r>
+        <w:rPr>
+          <w:rFonts w:eastAsia="Times New Roman" w:cs="Times New Roman" w:ascii="Garamond" w:hAnsi="Garamond"/>
+          <w:b/>
+          <w:bCs/>
           <w:color w:val="000000"/>
           <w:kern w:val="0"/>
           <w:sz w:val="36"/>
@@ -2208,7 +1628,7 @@
           <w:shd w:fill="auto" w:val="clear"/>
           <w:lang w:val="en-US" w:eastAsia="zh-CN" w:bidi="hi-IN"/>
         </w:rPr>
-        <w:t>Podemos então dizer que:</w:t>
+        <w:t>Portanto:</w:t>
       </w:r>
     </w:p>
     <w:p>
@@ -2313,26 +1733,1451 @@
           <w:color w:val="000000"/>
         </w:rPr>
       </w:r>
-    </w:p>
-    <w:p>
-      <w:pPr>
-        <w:pStyle w:val="Normal"/>
-        <w:jc w:val="both"/>
-        <w:rPr>
-          <w:color w:val="000000"/>
-        </w:rPr>
-      </w:pPr>
-      <w:r>
-        <w:rPr>
-          <w:rFonts w:eastAsia="Times New Roman" w:cs="Times New Roman" w:ascii="Garamond" w:hAnsi="Garamond"/>
-          <w:color w:val="000000"/>
-          <w:kern w:val="0"/>
-          <w:sz w:val="36"/>
-          <w:szCs w:val="36"/>
-          <w:shd w:fill="auto" w:val="clear"/>
-          <w:lang w:val="en-US" w:eastAsia="zh-CN" w:bidi="hi-IN"/>
-        </w:rPr>
-        <w:t>Portanto, Jesus nos convida a amar a Deus com toda a nossa sensibilidade (coração), toda a nossa essência espiritual (alma) e toda a nossa razão (pensamento).</w:t>
+      <w:r>
+        <w:br w:type="page"/>
+      </w:r>
+    </w:p>
+    <w:p>
+      <w:pPr>
+        <w:pStyle w:val="Normal"/>
+        <w:jc w:val="both"/>
+        <w:rPr>
+          <w:color w:val="000000"/>
+        </w:rPr>
+      </w:pPr>
+      <w:r>
+        <w:rPr>
+          <w:rFonts w:eastAsia="Times New Roman" w:cs="Times New Roman" w:ascii="Garamond" w:hAnsi="Garamond"/>
+          <w:color w:val="000000"/>
+          <w:kern w:val="0"/>
+          <w:sz w:val="36"/>
+          <w:szCs w:val="36"/>
+          <w:shd w:fill="auto" w:val="clear"/>
+          <w:lang w:val="en-US" w:eastAsia="zh-CN" w:bidi="hi-IN"/>
+        </w:rPr>
+        <w:t>Indo agora para o versículo 39, Jesus diz:</w:t>
+      </w:r>
+    </w:p>
+    <w:p>
+      <w:pPr>
+        <w:pStyle w:val="Normal"/>
+        <w:jc w:val="both"/>
+        <w:rPr>
+          <w:rFonts w:ascii="Garamond" w:hAnsi="Garamond" w:eastAsia="Times New Roman" w:cs="Times New Roman"/>
+          <w:kern w:val="0"/>
+          <w:sz w:val="36"/>
+          <w:szCs w:val="36"/>
+          <w:shd w:fill="auto" w:val="clear"/>
+          <w:lang w:val="en-US" w:eastAsia="zh-CN" w:bidi="hi-IN"/>
+        </w:rPr>
+      </w:pPr>
+      <w:r>
+        <w:rPr>
+          <w:rFonts w:eastAsia="Times New Roman" w:cs="Times New Roman" w:ascii="Garamond" w:hAnsi="Garamond"/>
+          <w:kern w:val="0"/>
+          <w:sz w:val="36"/>
+          <w:szCs w:val="36"/>
+          <w:shd w:fill="auto" w:val="clear"/>
+          <w:lang w:val="en-US" w:eastAsia="zh-CN" w:bidi="hi-IN"/>
+        </w:rPr>
+      </w:r>
+    </w:p>
+    <w:p>
+      <w:pPr>
+        <w:pStyle w:val="Normal"/>
+        <w:ind w:left="720" w:hanging="0"/>
+        <w:jc w:val="both"/>
+        <w:rPr>
+          <w:i/>
+          <w:i/>
+          <w:iCs/>
+          <w:sz w:val="36"/>
+          <w:szCs w:val="36"/>
+        </w:rPr>
+      </w:pPr>
+      <w:r>
+        <w:rPr>
+          <w:rFonts w:eastAsia="Times New Roman" w:cs="Times New Roman" w:ascii="Garamond" w:hAnsi="Garamond"/>
+          <w:i/>
+          <w:iCs/>
+          <w:color w:val="000000"/>
+          <w:kern w:val="0"/>
+          <w:sz w:val="36"/>
+          <w:szCs w:val="36"/>
+          <w:shd w:fill="auto" w:val="clear"/>
+          <w:lang w:val="en-US" w:eastAsia="zh-CN" w:bidi="hi-IN"/>
+        </w:rPr>
+        <w:t>"Amarás o teu próximo como a ti mesmo".</w:t>
+      </w:r>
+    </w:p>
+    <w:p>
+      <w:pPr>
+        <w:pStyle w:val="Normal"/>
+        <w:jc w:val="both"/>
+        <w:rPr>
+          <w:rFonts w:ascii="Garamond" w:hAnsi="Garamond" w:eastAsia="Times New Roman" w:cs="Times New Roman"/>
+          <w:kern w:val="0"/>
+          <w:sz w:val="36"/>
+          <w:szCs w:val="36"/>
+          <w:shd w:fill="auto" w:val="clear"/>
+          <w:lang w:val="en-US" w:eastAsia="zh-CN" w:bidi="hi-IN"/>
+        </w:rPr>
+      </w:pPr>
+      <w:r>
+        <w:rPr>
+          <w:rFonts w:eastAsia="Times New Roman" w:cs="Times New Roman" w:ascii="Garamond" w:hAnsi="Garamond"/>
+          <w:kern w:val="0"/>
+          <w:sz w:val="36"/>
+          <w:szCs w:val="36"/>
+          <w:shd w:fill="auto" w:val="clear"/>
+          <w:lang w:val="en-US" w:eastAsia="zh-CN" w:bidi="hi-IN"/>
+        </w:rPr>
+      </w:r>
+    </w:p>
+    <w:p>
+      <w:pPr>
+        <w:pStyle w:val="Normal"/>
+        <w:jc w:val="both"/>
+        <w:rPr>
+          <w:rFonts w:ascii="Garamond" w:hAnsi="Garamond" w:eastAsia="Times New Roman" w:cs="Times New Roman"/>
+          <w:color w:val="000000"/>
+          <w:kern w:val="0"/>
+          <w:sz w:val="36"/>
+          <w:szCs w:val="36"/>
+          <w:shd w:fill="auto" w:val="clear"/>
+          <w:lang w:val="en-US" w:eastAsia="zh-CN" w:bidi="hi-IN"/>
+        </w:rPr>
+      </w:pPr>
+      <w:r>
+        <w:rPr>
+          <w:rFonts w:eastAsia="Times New Roman" w:cs="Times New Roman" w:ascii="Garamond" w:hAnsi="Garamond"/>
+          <w:color w:val="000000"/>
+          <w:kern w:val="0"/>
+          <w:sz w:val="36"/>
+          <w:szCs w:val="36"/>
+          <w:shd w:fill="auto" w:val="clear"/>
+          <w:lang w:val="en-US" w:eastAsia="zh-CN" w:bidi="hi-IN"/>
+        </w:rPr>
+        <w:t>Primeiro vamos analisar o "</w:t>
+      </w:r>
+      <w:r>
+        <w:rPr>
+          <w:rFonts w:eastAsia="Times New Roman" w:cs="Times New Roman" w:ascii="Garamond" w:hAnsi="Garamond"/>
+          <w:i/>
+          <w:iCs/>
+          <w:color w:val="000000"/>
+          <w:kern w:val="0"/>
+          <w:sz w:val="36"/>
+          <w:szCs w:val="36"/>
+          <w:shd w:fill="auto" w:val="clear"/>
+          <w:lang w:val="en-US" w:eastAsia="zh-CN" w:bidi="hi-IN"/>
+        </w:rPr>
+        <w:t>Amarás o teu próximo</w:t>
+      </w:r>
+      <w:r>
+        <w:rPr>
+          <w:rFonts w:eastAsia="Times New Roman" w:cs="Times New Roman" w:ascii="Garamond" w:hAnsi="Garamond"/>
+          <w:color w:val="000000"/>
+          <w:kern w:val="0"/>
+          <w:sz w:val="36"/>
+          <w:szCs w:val="36"/>
+          <w:shd w:fill="auto" w:val="clear"/>
+          <w:lang w:val="en-US" w:eastAsia="zh-CN" w:bidi="hi-IN"/>
+        </w:rPr>
+        <w:t>" e posteriormente veremos o "</w:t>
+      </w:r>
+      <w:r>
+        <w:rPr>
+          <w:rFonts w:eastAsia="Times New Roman" w:cs="Times New Roman" w:ascii="Garamond" w:hAnsi="Garamond"/>
+          <w:i/>
+          <w:iCs/>
+          <w:color w:val="000000"/>
+          <w:kern w:val="0"/>
+          <w:sz w:val="36"/>
+          <w:szCs w:val="36"/>
+          <w:shd w:fill="auto" w:val="clear"/>
+          <w:lang w:val="en-US" w:eastAsia="zh-CN" w:bidi="hi-IN"/>
+        </w:rPr>
+        <w:t>como a ti mesmo</w:t>
+      </w:r>
+      <w:r>
+        <w:rPr>
+          <w:rFonts w:eastAsia="Times New Roman" w:cs="Times New Roman" w:ascii="Garamond" w:hAnsi="Garamond"/>
+          <w:color w:val="000000"/>
+          <w:kern w:val="0"/>
+          <w:sz w:val="36"/>
+          <w:szCs w:val="36"/>
+          <w:shd w:fill="auto" w:val="clear"/>
+          <w:lang w:val="en-US" w:eastAsia="zh-CN" w:bidi="hi-IN"/>
+        </w:rPr>
+        <w:t>".</w:t>
+      </w:r>
+    </w:p>
+    <w:p>
+      <w:pPr>
+        <w:pStyle w:val="Normal"/>
+        <w:jc w:val="both"/>
+        <w:rPr>
+          <w:rFonts w:ascii="Garamond" w:hAnsi="Garamond" w:eastAsia="Times New Roman" w:cs="Times New Roman"/>
+          <w:color w:val="000000"/>
+          <w:kern w:val="0"/>
+          <w:sz w:val="36"/>
+          <w:szCs w:val="36"/>
+          <w:shd w:fill="auto" w:val="clear"/>
+          <w:lang w:val="en-US" w:eastAsia="zh-CN" w:bidi="hi-IN"/>
+        </w:rPr>
+      </w:pPr>
+      <w:r>
+        <w:rPr>
+          <w:rFonts w:eastAsia="Times New Roman" w:cs="Times New Roman" w:ascii="Garamond" w:hAnsi="Garamond"/>
+          <w:color w:val="000000"/>
+          <w:kern w:val="0"/>
+          <w:sz w:val="36"/>
+          <w:szCs w:val="36"/>
+          <w:shd w:fill="auto" w:val="clear"/>
+          <w:lang w:val="en-US" w:eastAsia="zh-CN" w:bidi="hi-IN"/>
+        </w:rPr>
+      </w:r>
+    </w:p>
+    <w:p>
+      <w:pPr>
+        <w:pStyle w:val="Normal"/>
+        <w:jc w:val="both"/>
+        <w:rPr>
+          <w:rFonts w:ascii="Garamond" w:hAnsi="Garamond" w:eastAsia="Times New Roman" w:cs="Times New Roman"/>
+          <w:color w:val="000000"/>
+          <w:kern w:val="0"/>
+          <w:sz w:val="36"/>
+          <w:szCs w:val="36"/>
+          <w:shd w:fill="auto" w:val="clear"/>
+          <w:lang w:val="en-US" w:eastAsia="zh-CN" w:bidi="hi-IN"/>
+        </w:rPr>
+      </w:pPr>
+      <w:r>
+        <w:rPr>
+          <w:rFonts w:eastAsia="Times New Roman" w:cs="Times New Roman" w:ascii="Garamond" w:hAnsi="Garamond"/>
+          <w:color w:val="000000"/>
+          <w:kern w:val="0"/>
+          <w:sz w:val="36"/>
+          <w:szCs w:val="36"/>
+          <w:shd w:fill="auto" w:val="clear"/>
+          <w:lang w:val="en-US" w:eastAsia="zh-CN" w:bidi="hi-IN"/>
+        </w:rPr>
+        <w:t xml:space="preserve">No Evangelho Segundo o Espiritismo nós temos o capítulo XI cujo título é justamente </w:t>
+      </w:r>
+      <w:r>
+        <w:rPr>
+          <w:rFonts w:eastAsia="Times New Roman" w:cs="Times New Roman" w:ascii="Garamond" w:hAnsi="Garamond"/>
+          <w:i/>
+          <w:iCs/>
+          <w:color w:val="000000"/>
+          <w:kern w:val="0"/>
+          <w:sz w:val="36"/>
+          <w:szCs w:val="36"/>
+          <w:shd w:fill="auto" w:val="clear"/>
+          <w:lang w:val="en-US" w:eastAsia="zh-CN" w:bidi="hi-IN"/>
+        </w:rPr>
+        <w:t>Amar o próximo como a si mesmo</w:t>
+      </w:r>
+      <w:r>
+        <w:rPr>
+          <w:rFonts w:eastAsia="Times New Roman" w:cs="Times New Roman" w:ascii="Garamond" w:hAnsi="Garamond"/>
+          <w:color w:val="000000"/>
+          <w:kern w:val="0"/>
+          <w:sz w:val="36"/>
+          <w:szCs w:val="36"/>
+          <w:shd w:fill="auto" w:val="clear"/>
+          <w:lang w:val="en-US" w:eastAsia="zh-CN" w:bidi="hi-IN"/>
+        </w:rPr>
+        <w:t xml:space="preserve">. </w:t>
+      </w:r>
+    </w:p>
+    <w:p>
+      <w:pPr>
+        <w:pStyle w:val="Normal"/>
+        <w:jc w:val="both"/>
+        <w:rPr>
+          <w:rFonts w:ascii="Garamond" w:hAnsi="Garamond" w:eastAsia="Times New Roman" w:cs="Times New Roman"/>
+          <w:color w:val="000000"/>
+          <w:kern w:val="0"/>
+          <w:sz w:val="36"/>
+          <w:szCs w:val="36"/>
+          <w:shd w:fill="auto" w:val="clear"/>
+          <w:lang w:val="en-US" w:eastAsia="zh-CN" w:bidi="hi-IN"/>
+        </w:rPr>
+      </w:pPr>
+      <w:r>
+        <w:rPr>
+          <w:rFonts w:eastAsia="Times New Roman" w:cs="Times New Roman" w:ascii="Garamond" w:hAnsi="Garamond"/>
+          <w:color w:val="000000"/>
+          <w:kern w:val="0"/>
+          <w:sz w:val="36"/>
+          <w:szCs w:val="36"/>
+          <w:shd w:fill="auto" w:val="clear"/>
+          <w:lang w:val="en-US" w:eastAsia="zh-CN" w:bidi="hi-IN"/>
+        </w:rPr>
+      </w:r>
+    </w:p>
+    <w:p>
+      <w:pPr>
+        <w:pStyle w:val="Normal"/>
+        <w:jc w:val="both"/>
+        <w:rPr>
+          <w:rFonts w:ascii="Garamond" w:hAnsi="Garamond" w:eastAsia="Times New Roman" w:cs="Times New Roman"/>
+          <w:color w:val="000000"/>
+          <w:kern w:val="0"/>
+          <w:sz w:val="36"/>
+          <w:szCs w:val="36"/>
+          <w:shd w:fill="auto" w:val="clear"/>
+          <w:lang w:val="en-US" w:eastAsia="zh-CN" w:bidi="hi-IN"/>
+        </w:rPr>
+      </w:pPr>
+      <w:r>
+        <w:rPr>
+          <w:rFonts w:eastAsia="Times New Roman" w:cs="Times New Roman" w:ascii="Garamond" w:hAnsi="Garamond"/>
+          <w:color w:val="000000"/>
+          <w:kern w:val="0"/>
+          <w:sz w:val="36"/>
+          <w:szCs w:val="36"/>
+          <w:shd w:fill="auto" w:val="clear"/>
+          <w:lang w:val="en-US" w:eastAsia="zh-CN" w:bidi="hi-IN"/>
+        </w:rPr>
+        <w:t>Nesse capítulo, Allan Kardec diz que o amor ao próximo é a expressão máxima da caridade pois resume todos os deveres do homem para com o semelhante.</w:t>
+      </w:r>
+    </w:p>
+    <w:p>
+      <w:pPr>
+        <w:pStyle w:val="Normal"/>
+        <w:jc w:val="both"/>
+        <w:rPr>
+          <w:rFonts w:ascii="Garamond" w:hAnsi="Garamond" w:eastAsia="Times New Roman" w:cs="Times New Roman"/>
+          <w:color w:val="000000"/>
+          <w:kern w:val="0"/>
+          <w:sz w:val="36"/>
+          <w:szCs w:val="36"/>
+          <w:shd w:fill="auto" w:val="clear"/>
+          <w:lang w:val="en-US" w:eastAsia="zh-CN" w:bidi="hi-IN"/>
+        </w:rPr>
+      </w:pPr>
+      <w:r>
+        <w:rPr>
+          <w:rFonts w:eastAsia="Times New Roman" w:cs="Times New Roman" w:ascii="Garamond" w:hAnsi="Garamond"/>
+          <w:color w:val="000000"/>
+          <w:kern w:val="0"/>
+          <w:sz w:val="36"/>
+          <w:szCs w:val="36"/>
+          <w:shd w:fill="auto" w:val="clear"/>
+          <w:lang w:val="en-US" w:eastAsia="zh-CN" w:bidi="hi-IN"/>
+        </w:rPr>
+      </w:r>
+    </w:p>
+    <w:p>
+      <w:pPr>
+        <w:pStyle w:val="Normal"/>
+        <w:jc w:val="both"/>
+        <w:rPr>
+          <w:rFonts w:ascii="Garamond" w:hAnsi="Garamond" w:eastAsia="Times New Roman" w:cs="Times New Roman"/>
+          <w:color w:val="000000"/>
+          <w:kern w:val="0"/>
+          <w:sz w:val="36"/>
+          <w:szCs w:val="36"/>
+          <w:shd w:fill="auto" w:val="clear"/>
+          <w:lang w:val="en-US" w:eastAsia="zh-CN" w:bidi="hi-IN"/>
+        </w:rPr>
+      </w:pPr>
+      <w:r>
+        <w:rPr>
+          <w:rFonts w:eastAsia="Times New Roman" w:cs="Times New Roman" w:ascii="Garamond" w:hAnsi="Garamond"/>
+          <w:color w:val="000000"/>
+          <w:kern w:val="0"/>
+          <w:sz w:val="36"/>
+          <w:szCs w:val="36"/>
+          <w:shd w:fill="auto" w:val="clear"/>
+          <w:lang w:val="en-US" w:eastAsia="zh-CN" w:bidi="hi-IN"/>
+        </w:rPr>
+        <w:t xml:space="preserve">Contudo, há um ponto muito importante a ser observado nas explicações de Kardec. Ele diz "fazer pelos outros o que quereríamos que os outros fizessem por nós". </w:t>
+      </w:r>
+    </w:p>
+    <w:p>
+      <w:pPr>
+        <w:pStyle w:val="Normal"/>
+        <w:jc w:val="both"/>
+        <w:rPr>
+          <w:rFonts w:ascii="Garamond" w:hAnsi="Garamond" w:eastAsia="Times New Roman" w:cs="Times New Roman"/>
+          <w:color w:val="000000"/>
+          <w:kern w:val="0"/>
+          <w:sz w:val="36"/>
+          <w:szCs w:val="36"/>
+          <w:shd w:fill="auto" w:val="clear"/>
+          <w:lang w:val="en-US" w:eastAsia="zh-CN" w:bidi="hi-IN"/>
+        </w:rPr>
+      </w:pPr>
+      <w:r>
+        <w:rPr>
+          <w:rFonts w:eastAsia="Times New Roman" w:cs="Times New Roman" w:ascii="Garamond" w:hAnsi="Garamond"/>
+          <w:color w:val="000000"/>
+          <w:kern w:val="0"/>
+          <w:sz w:val="36"/>
+          <w:szCs w:val="36"/>
+          <w:shd w:fill="auto" w:val="clear"/>
+          <w:lang w:val="en-US" w:eastAsia="zh-CN" w:bidi="hi-IN"/>
+        </w:rPr>
+      </w:r>
+    </w:p>
+    <w:p>
+      <w:pPr>
+        <w:pStyle w:val="Normal"/>
+        <w:jc w:val="both"/>
+        <w:rPr>
+          <w:rFonts w:ascii="Garamond" w:hAnsi="Garamond" w:eastAsia="Times New Roman" w:cs="Times New Roman"/>
+          <w:color w:val="000000"/>
+          <w:kern w:val="0"/>
+          <w:sz w:val="36"/>
+          <w:szCs w:val="36"/>
+          <w:shd w:fill="auto" w:val="clear"/>
+          <w:lang w:val="en-US" w:eastAsia="zh-CN" w:bidi="hi-IN"/>
+        </w:rPr>
+      </w:pPr>
+      <w:r>
+        <w:rPr>
+          <w:rFonts w:eastAsia="Times New Roman" w:cs="Times New Roman" w:ascii="Garamond" w:hAnsi="Garamond"/>
+          <w:color w:val="000000"/>
+          <w:kern w:val="0"/>
+          <w:sz w:val="36"/>
+          <w:szCs w:val="36"/>
+          <w:shd w:fill="auto" w:val="clear"/>
+          <w:lang w:val="en-US" w:eastAsia="zh-CN" w:bidi="hi-IN"/>
+        </w:rPr>
+        <w:t>Popularmente costuma-se dizer que não devemos fazer aos outros aquilo que  não queremos que os outros nos façam. Então, se não queremos que os outros nos façam o mal não devemos igualmente fazer o mal a eles.</w:t>
+      </w:r>
+    </w:p>
+    <w:p>
+      <w:pPr>
+        <w:pStyle w:val="Normal"/>
+        <w:jc w:val="both"/>
+        <w:rPr>
+          <w:rFonts w:ascii="Garamond" w:hAnsi="Garamond" w:eastAsia="Times New Roman" w:cs="Times New Roman"/>
+          <w:color w:val="000000"/>
+          <w:kern w:val="0"/>
+          <w:sz w:val="36"/>
+          <w:szCs w:val="36"/>
+          <w:shd w:fill="auto" w:val="clear"/>
+          <w:lang w:val="en-US" w:eastAsia="zh-CN" w:bidi="hi-IN"/>
+        </w:rPr>
+      </w:pPr>
+      <w:r>
+        <w:rPr>
+          <w:rFonts w:eastAsia="Times New Roman" w:cs="Times New Roman" w:ascii="Garamond" w:hAnsi="Garamond"/>
+          <w:color w:val="000000"/>
+          <w:kern w:val="0"/>
+          <w:sz w:val="36"/>
+          <w:szCs w:val="36"/>
+          <w:shd w:fill="auto" w:val="clear"/>
+          <w:lang w:val="en-US" w:eastAsia="zh-CN" w:bidi="hi-IN"/>
+        </w:rPr>
+      </w:r>
+    </w:p>
+    <w:p>
+      <w:pPr>
+        <w:pStyle w:val="Normal"/>
+        <w:jc w:val="both"/>
+        <w:rPr>
+          <w:rFonts w:ascii="Garamond" w:hAnsi="Garamond" w:eastAsia="Times New Roman" w:cs="Times New Roman"/>
+          <w:color w:val="000000"/>
+          <w:kern w:val="0"/>
+          <w:sz w:val="36"/>
+          <w:szCs w:val="36"/>
+          <w:shd w:fill="auto" w:val="clear"/>
+          <w:lang w:val="en-US" w:eastAsia="zh-CN" w:bidi="hi-IN"/>
+        </w:rPr>
+      </w:pPr>
+      <w:r>
+        <w:rPr>
+          <w:rFonts w:eastAsia="Times New Roman" w:cs="Times New Roman" w:ascii="Garamond" w:hAnsi="Garamond"/>
+          <w:color w:val="000000"/>
+          <w:kern w:val="0"/>
+          <w:sz w:val="36"/>
+          <w:szCs w:val="36"/>
+          <w:shd w:fill="auto" w:val="clear"/>
+          <w:lang w:val="en-US" w:eastAsia="zh-CN" w:bidi="hi-IN"/>
+        </w:rPr>
+        <w:t>Colocado dessa forma, nosso compromisso ficaria limitado a simplesmente não fazer o mal ao próximo. Poderíamos tranquilamente permanecer na neutralidade, na inércia e na inatividade.</w:t>
+      </w:r>
+    </w:p>
+    <w:p>
+      <w:pPr>
+        <w:pStyle w:val="Normal"/>
+        <w:jc w:val="both"/>
+        <w:rPr>
+          <w:rFonts w:ascii="Garamond" w:hAnsi="Garamond" w:eastAsia="Times New Roman" w:cs="Times New Roman"/>
+          <w:color w:val="000000"/>
+          <w:kern w:val="0"/>
+          <w:sz w:val="36"/>
+          <w:szCs w:val="36"/>
+          <w:shd w:fill="auto" w:val="clear"/>
+          <w:lang w:val="en-US" w:eastAsia="zh-CN" w:bidi="hi-IN"/>
+        </w:rPr>
+      </w:pPr>
+      <w:r>
+        <w:rPr>
+          <w:rFonts w:eastAsia="Times New Roman" w:cs="Times New Roman" w:ascii="Garamond" w:hAnsi="Garamond"/>
+          <w:color w:val="000000"/>
+          <w:kern w:val="0"/>
+          <w:sz w:val="36"/>
+          <w:szCs w:val="36"/>
+          <w:shd w:fill="auto" w:val="clear"/>
+          <w:lang w:val="en-US" w:eastAsia="zh-CN" w:bidi="hi-IN"/>
+        </w:rPr>
+      </w:r>
+    </w:p>
+    <w:p>
+      <w:pPr>
+        <w:pStyle w:val="Normal"/>
+        <w:jc w:val="both"/>
+        <w:rPr>
+          <w:rFonts w:ascii="Garamond" w:hAnsi="Garamond" w:eastAsia="Times New Roman" w:cs="Times New Roman"/>
+          <w:color w:val="000000"/>
+          <w:kern w:val="0"/>
+          <w:sz w:val="36"/>
+          <w:szCs w:val="36"/>
+          <w:shd w:fill="auto" w:val="clear"/>
+          <w:lang w:val="en-US" w:eastAsia="zh-CN" w:bidi="hi-IN"/>
+        </w:rPr>
+      </w:pPr>
+      <w:r>
+        <w:rPr>
+          <w:rFonts w:eastAsia="Times New Roman" w:cs="Times New Roman" w:ascii="Garamond" w:hAnsi="Garamond"/>
+          <w:color w:val="000000"/>
+          <w:kern w:val="0"/>
+          <w:sz w:val="36"/>
+          <w:szCs w:val="36"/>
+          <w:shd w:fill="auto" w:val="clear"/>
+          <w:lang w:val="en-US" w:eastAsia="zh-CN" w:bidi="hi-IN"/>
+        </w:rPr>
+        <w:t xml:space="preserve">Mas não é esse o nosso dever. Kardec afirma que é fundamental colocarmos em prática a caridade, a indulgência, a benevolência para com os outros. Se não agimos assim, com que direito podemos exigir que os outros tenham para conosco tais atitudes? Kardec nos convida à ação, ao dinamismo e ao trabalho. </w:t>
+      </w:r>
+    </w:p>
+    <w:p>
+      <w:pPr>
+        <w:pStyle w:val="Normal"/>
+        <w:jc w:val="both"/>
+        <w:rPr>
+          <w:rFonts w:ascii="Garamond" w:hAnsi="Garamond" w:eastAsia="Times New Roman" w:cs="Times New Roman"/>
+          <w:color w:val="000000"/>
+          <w:kern w:val="0"/>
+          <w:sz w:val="36"/>
+          <w:szCs w:val="36"/>
+          <w:shd w:fill="auto" w:val="clear"/>
+          <w:lang w:val="en-US" w:eastAsia="zh-CN" w:bidi="hi-IN"/>
+        </w:rPr>
+      </w:pPr>
+      <w:r>
+        <w:rPr>
+          <w:rFonts w:eastAsia="Times New Roman" w:cs="Times New Roman" w:ascii="Garamond" w:hAnsi="Garamond"/>
+          <w:color w:val="000000"/>
+          <w:kern w:val="0"/>
+          <w:sz w:val="36"/>
+          <w:szCs w:val="36"/>
+          <w:shd w:fill="auto" w:val="clear"/>
+          <w:lang w:val="en-US" w:eastAsia="zh-CN" w:bidi="hi-IN"/>
+        </w:rPr>
+      </w:r>
+    </w:p>
+    <w:p>
+      <w:pPr>
+        <w:pStyle w:val="Normal"/>
+        <w:jc w:val="both"/>
+        <w:rPr>
+          <w:rFonts w:ascii="Garamond" w:hAnsi="Garamond" w:eastAsia="Times New Roman" w:cs="Times New Roman"/>
+          <w:color w:val="000000"/>
+          <w:kern w:val="0"/>
+          <w:sz w:val="36"/>
+          <w:szCs w:val="36"/>
+          <w:shd w:fill="auto" w:val="clear"/>
+          <w:lang w:val="en-US" w:eastAsia="zh-CN" w:bidi="hi-IN"/>
+        </w:rPr>
+      </w:pPr>
+      <w:r>
+        <w:rPr>
+          <w:rFonts w:eastAsia="Times New Roman" w:cs="Times New Roman" w:ascii="Garamond" w:hAnsi="Garamond"/>
+          <w:color w:val="000000"/>
+          <w:kern w:val="0"/>
+          <w:sz w:val="36"/>
+          <w:szCs w:val="36"/>
+          <w:shd w:fill="auto" w:val="clear"/>
+          <w:lang w:val="en-US" w:eastAsia="zh-CN" w:bidi="hi-IN"/>
+        </w:rPr>
+        <w:t xml:space="preserve">Outra questão que Kardec aborda é a tão conhecida passagem evangélica “Dai a César o que é de César”.  Fariseus e herodianos tentam fazer Jesus cair em contradição perguntando se era lícito pagar tributo a César. Jesus pede que lhe mostrem uma moeda e pergunta de quem é a imagem nela gravada. Ao responderem “de César”, Ele conclui: “Dai, pois, a César o que é de César, e a Deus o que é de Deus”. Com isso, Jesus ensina que as obrigações materiais e sociais devem ser respeitadas, independente das questões religiosas.  </w:t>
+      </w:r>
+    </w:p>
+    <w:p>
+      <w:pPr>
+        <w:pStyle w:val="Normal"/>
+        <w:jc w:val="both"/>
+        <w:rPr>
+          <w:rFonts w:ascii="Garamond" w:hAnsi="Garamond" w:eastAsia="Times New Roman" w:cs="Times New Roman"/>
+          <w:color w:val="000000"/>
+          <w:kern w:val="0"/>
+          <w:sz w:val="36"/>
+          <w:szCs w:val="36"/>
+          <w:shd w:fill="auto" w:val="clear"/>
+          <w:lang w:val="en-US" w:eastAsia="zh-CN" w:bidi="hi-IN"/>
+        </w:rPr>
+      </w:pPr>
+      <w:r>
+        <w:rPr>
+          <w:rFonts w:eastAsia="Times New Roman" w:cs="Times New Roman" w:ascii="Garamond" w:hAnsi="Garamond"/>
+          <w:color w:val="000000"/>
+          <w:kern w:val="0"/>
+          <w:sz w:val="36"/>
+          <w:szCs w:val="36"/>
+          <w:shd w:fill="auto" w:val="clear"/>
+          <w:lang w:val="en-US" w:eastAsia="zh-CN" w:bidi="hi-IN"/>
+        </w:rPr>
+      </w:r>
+    </w:p>
+    <w:p>
+      <w:pPr>
+        <w:pStyle w:val="Normal"/>
+        <w:jc w:val="both"/>
+        <w:rPr>
+          <w:rFonts w:ascii="Garamond" w:hAnsi="Garamond" w:eastAsia="Times New Roman" w:cs="Times New Roman"/>
+          <w:color w:val="000000"/>
+          <w:kern w:val="0"/>
+          <w:sz w:val="36"/>
+          <w:szCs w:val="36"/>
+          <w:shd w:fill="auto" w:val="clear"/>
+          <w:lang w:val="en-US" w:eastAsia="zh-CN" w:bidi="hi-IN"/>
+        </w:rPr>
+      </w:pPr>
+      <w:r>
+        <w:rPr>
+          <w:rFonts w:eastAsia="Times New Roman" w:cs="Times New Roman" w:ascii="Garamond" w:hAnsi="Garamond"/>
+          <w:color w:val="000000"/>
+          <w:kern w:val="0"/>
+          <w:sz w:val="36"/>
+          <w:szCs w:val="36"/>
+          <w:shd w:fill="auto" w:val="clear"/>
+          <w:lang w:val="en-US" w:eastAsia="zh-CN" w:bidi="hi-IN"/>
+        </w:rPr>
+        <w:t xml:space="preserve">Quando Jesus pede a moeda do tributo, Ele revela a hipocrisia dos fariseus e herodianos. A moeda trazia a imagem de César, considerada impura pelos judeus, mas eles a carregavam no bolso e a usavam normalmente, mostrando que, quando era conveniente a eles, participavam do sistema romano que fingiam condenar. </w:t>
+      </w:r>
+    </w:p>
+    <w:p>
+      <w:pPr>
+        <w:pStyle w:val="Normal"/>
+        <w:jc w:val="both"/>
+        <w:rPr>
+          <w:rFonts w:ascii="Garamond" w:hAnsi="Garamond" w:eastAsia="Times New Roman" w:cs="Times New Roman"/>
+          <w:color w:val="000000"/>
+          <w:kern w:val="0"/>
+          <w:sz w:val="36"/>
+          <w:szCs w:val="36"/>
+          <w:shd w:fill="auto" w:val="clear"/>
+          <w:lang w:val="en-US" w:eastAsia="zh-CN" w:bidi="hi-IN"/>
+        </w:rPr>
+      </w:pPr>
+      <w:r>
+        <w:rPr>
+          <w:rFonts w:eastAsia="Times New Roman" w:cs="Times New Roman" w:ascii="Garamond" w:hAnsi="Garamond"/>
+          <w:color w:val="000000"/>
+          <w:kern w:val="0"/>
+          <w:sz w:val="36"/>
+          <w:szCs w:val="36"/>
+          <w:shd w:fill="auto" w:val="clear"/>
+          <w:lang w:val="en-US" w:eastAsia="zh-CN" w:bidi="hi-IN"/>
+        </w:rPr>
+      </w:r>
+    </w:p>
+    <w:p>
+      <w:pPr>
+        <w:pStyle w:val="Normal"/>
+        <w:jc w:val="both"/>
+        <w:rPr>
+          <w:rFonts w:ascii="Garamond" w:hAnsi="Garamond" w:eastAsia="Times New Roman" w:cs="Times New Roman"/>
+          <w:color w:val="000000"/>
+          <w:kern w:val="0"/>
+          <w:sz w:val="36"/>
+          <w:szCs w:val="36"/>
+          <w:shd w:fill="auto" w:val="clear"/>
+          <w:lang w:val="en-US" w:eastAsia="zh-CN" w:bidi="hi-IN"/>
+        </w:rPr>
+      </w:pPr>
+      <w:r>
+        <w:rPr>
+          <w:rFonts w:eastAsia="Times New Roman" w:cs="Times New Roman" w:ascii="Garamond" w:hAnsi="Garamond"/>
+          <w:color w:val="000000"/>
+          <w:kern w:val="0"/>
+          <w:sz w:val="36"/>
+          <w:szCs w:val="36"/>
+          <w:shd w:fill="auto" w:val="clear"/>
+          <w:lang w:val="en-US" w:eastAsia="zh-CN" w:bidi="hi-IN"/>
+        </w:rPr>
+        <w:t>Ao expor essa incoerência, Jesus desmonta a armadilha antes mesmo de responder. E, ao dizer “Dai a César o que é de César, e a Deus o que é de Deus”, Ele ensina a cumprir os deveres materiais sem esquecer que os deveres espirituais são superiores.</w:t>
+      </w:r>
+    </w:p>
+    <w:p>
+      <w:pPr>
+        <w:pStyle w:val="Normal"/>
+        <w:jc w:val="both"/>
+        <w:rPr>
+          <w:rFonts w:ascii="Garamond" w:hAnsi="Garamond" w:eastAsia="Times New Roman" w:cs="Times New Roman"/>
+          <w:color w:val="000000"/>
+          <w:kern w:val="0"/>
+          <w:sz w:val="36"/>
+          <w:szCs w:val="36"/>
+          <w:shd w:fill="auto" w:val="clear"/>
+          <w:lang w:val="en-US" w:eastAsia="zh-CN" w:bidi="hi-IN"/>
+        </w:rPr>
+      </w:pPr>
+      <w:r>
+        <w:rPr>
+          <w:rFonts w:eastAsia="Times New Roman" w:cs="Times New Roman" w:ascii="Garamond" w:hAnsi="Garamond"/>
+          <w:color w:val="000000"/>
+          <w:kern w:val="0"/>
+          <w:sz w:val="36"/>
+          <w:szCs w:val="36"/>
+          <w:shd w:fill="auto" w:val="clear"/>
+          <w:lang w:val="en-US" w:eastAsia="zh-CN" w:bidi="hi-IN"/>
+        </w:rPr>
+      </w:r>
+    </w:p>
+    <w:p>
+      <w:pPr>
+        <w:pStyle w:val="Normal"/>
+        <w:jc w:val="both"/>
+        <w:rPr>
+          <w:rFonts w:ascii="Garamond" w:hAnsi="Garamond" w:eastAsia="Times New Roman" w:cs="Times New Roman"/>
+          <w:color w:val="000000"/>
+          <w:kern w:val="0"/>
+          <w:sz w:val="36"/>
+          <w:szCs w:val="36"/>
+          <w:shd w:fill="auto" w:val="clear"/>
+          <w:lang w:val="en-US" w:eastAsia="zh-CN" w:bidi="hi-IN"/>
+        </w:rPr>
+      </w:pPr>
+      <w:r>
+        <w:rPr>
+          <w:rFonts w:eastAsia="Times New Roman" w:cs="Times New Roman" w:ascii="Garamond" w:hAnsi="Garamond"/>
+          <w:color w:val="000000"/>
+          <w:kern w:val="0"/>
+          <w:sz w:val="36"/>
+          <w:szCs w:val="36"/>
+          <w:shd w:fill="auto" w:val="clear"/>
+          <w:lang w:val="en-US" w:eastAsia="zh-CN" w:bidi="hi-IN"/>
+        </w:rPr>
+        <w:t xml:space="preserve">No contexto do nosso tema de hoje, a lição que extraímos desse ensinamento é que precisamos ser justos com nossos desafetos e até mesmo com nossos inimigos. </w:t>
+      </w:r>
+    </w:p>
+    <w:p>
+      <w:pPr>
+        <w:pStyle w:val="Normal"/>
+        <w:jc w:val="both"/>
+        <w:rPr>
+          <w:rFonts w:ascii="Garamond" w:hAnsi="Garamond" w:eastAsia="Times New Roman" w:cs="Times New Roman"/>
+          <w:color w:val="000000"/>
+          <w:kern w:val="0"/>
+          <w:sz w:val="36"/>
+          <w:szCs w:val="36"/>
+          <w:shd w:fill="auto" w:val="clear"/>
+          <w:lang w:val="en-US" w:eastAsia="zh-CN" w:bidi="hi-IN"/>
+        </w:rPr>
+      </w:pPr>
+      <w:r>
+        <w:rPr/>
+      </w:r>
+    </w:p>
+    <w:p>
+      <w:pPr>
+        <w:pStyle w:val="Normal"/>
+        <w:jc w:val="both"/>
+        <w:rPr>
+          <w:rFonts w:ascii="Garamond" w:hAnsi="Garamond" w:eastAsia="Times New Roman" w:cs="Times New Roman"/>
+          <w:color w:val="000000"/>
+          <w:kern w:val="0"/>
+          <w:sz w:val="36"/>
+          <w:szCs w:val="36"/>
+          <w:shd w:fill="auto" w:val="clear"/>
+          <w:lang w:val="en-US" w:eastAsia="zh-CN" w:bidi="hi-IN"/>
+        </w:rPr>
+      </w:pPr>
+      <w:r>
+        <w:rPr>
+          <w:rFonts w:eastAsia="Times New Roman" w:cs="Times New Roman" w:ascii="Garamond" w:hAnsi="Garamond"/>
+          <w:color w:val="000000"/>
+          <w:kern w:val="0"/>
+          <w:sz w:val="36"/>
+          <w:szCs w:val="36"/>
+          <w:shd w:fill="auto" w:val="clear"/>
+          <w:lang w:val="en-US" w:eastAsia="zh-CN" w:bidi="hi-IN"/>
+        </w:rPr>
+        <w:t>Gostando ou não da pessoa, se reconhecemos que algo é de direito dela ou que temos com ela uma obrigação, devemos proceder de maneira justa e correta, dando àquela pessoa o que por direito pertence a ela.</w:t>
+      </w:r>
+    </w:p>
+    <w:p>
+      <w:pPr>
+        <w:pStyle w:val="Normal"/>
+        <w:jc w:val="both"/>
+        <w:rPr>
+          <w:rFonts w:ascii="Garamond" w:hAnsi="Garamond" w:eastAsia="Times New Roman" w:cs="Times New Roman"/>
+          <w:color w:val="000000"/>
+          <w:kern w:val="0"/>
+          <w:sz w:val="36"/>
+          <w:szCs w:val="36"/>
+          <w:shd w:fill="auto" w:val="clear"/>
+          <w:lang w:val="en-US" w:eastAsia="zh-CN" w:bidi="hi-IN"/>
+        </w:rPr>
+      </w:pPr>
+      <w:r>
+        <w:rPr>
+          <w:rFonts w:eastAsia="Times New Roman" w:cs="Times New Roman" w:ascii="Garamond" w:hAnsi="Garamond"/>
+          <w:color w:val="000000"/>
+          <w:kern w:val="0"/>
+          <w:sz w:val="36"/>
+          <w:szCs w:val="36"/>
+          <w:shd w:fill="auto" w:val="clear"/>
+          <w:lang w:val="en-US" w:eastAsia="zh-CN" w:bidi="hi-IN"/>
+        </w:rPr>
+      </w:r>
+    </w:p>
+    <w:p>
+      <w:pPr>
+        <w:pStyle w:val="Normal"/>
+        <w:jc w:val="both"/>
+        <w:rPr>
+          <w:rFonts w:ascii="Garamond" w:hAnsi="Garamond" w:eastAsia="Times New Roman" w:cs="Times New Roman"/>
+          <w:color w:val="000000"/>
+          <w:kern w:val="0"/>
+          <w:sz w:val="36"/>
+          <w:szCs w:val="36"/>
+          <w:shd w:fill="auto" w:val="clear"/>
+          <w:lang w:val="en-US" w:eastAsia="zh-CN" w:bidi="hi-IN"/>
+        </w:rPr>
+      </w:pPr>
+      <w:r>
+        <w:rPr>
+          <w:rFonts w:eastAsia="Times New Roman" w:cs="Times New Roman" w:ascii="Garamond" w:hAnsi="Garamond"/>
+          <w:color w:val="000000"/>
+          <w:kern w:val="0"/>
+          <w:sz w:val="36"/>
+          <w:szCs w:val="36"/>
+          <w:shd w:fill="auto" w:val="clear"/>
+          <w:lang w:val="en-US" w:eastAsia="zh-CN" w:bidi="hi-IN"/>
+        </w:rPr>
+        <w:t>Detalhe muito importante: não estamos falando aqui apenas de coisas materiais; nosso dever envolve também questões morais e espirituais.</w:t>
+      </w:r>
+    </w:p>
+    <w:p>
+      <w:pPr>
+        <w:pStyle w:val="Normal"/>
+        <w:jc w:val="both"/>
+        <w:rPr>
+          <w:rFonts w:ascii="Garamond" w:hAnsi="Garamond" w:eastAsia="Times New Roman" w:cs="Times New Roman"/>
+          <w:color w:val="000000"/>
+          <w:kern w:val="0"/>
+          <w:sz w:val="36"/>
+          <w:szCs w:val="36"/>
+          <w:shd w:fill="auto" w:val="clear"/>
+          <w:lang w:val="en-US" w:eastAsia="zh-CN" w:bidi="hi-IN"/>
+        </w:rPr>
+      </w:pPr>
+      <w:r>
+        <w:rPr>
+          <w:rFonts w:eastAsia="Times New Roman" w:cs="Times New Roman" w:ascii="Garamond" w:hAnsi="Garamond"/>
+          <w:color w:val="000000"/>
+          <w:kern w:val="0"/>
+          <w:sz w:val="36"/>
+          <w:szCs w:val="36"/>
+          <w:shd w:fill="auto" w:val="clear"/>
+          <w:lang w:val="en-US" w:eastAsia="zh-CN" w:bidi="hi-IN"/>
+        </w:rPr>
+      </w:r>
+    </w:p>
+    <w:p>
+      <w:pPr>
+        <w:pStyle w:val="Normal"/>
+        <w:jc w:val="both"/>
+        <w:rPr>
+          <w:rFonts w:ascii="Garamond" w:hAnsi="Garamond" w:eastAsia="Times New Roman" w:cs="Times New Roman"/>
+          <w:color w:val="000000"/>
+          <w:kern w:val="0"/>
+          <w:sz w:val="36"/>
+          <w:szCs w:val="36"/>
+          <w:shd w:fill="auto" w:val="clear"/>
+          <w:lang w:val="en-US" w:eastAsia="zh-CN" w:bidi="hi-IN"/>
+        </w:rPr>
+      </w:pPr>
+      <w:r>
+        <w:rPr>
+          <w:rFonts w:eastAsia="Times New Roman" w:cs="Times New Roman" w:ascii="Garamond" w:hAnsi="Garamond"/>
+          <w:color w:val="000000"/>
+          <w:kern w:val="0"/>
+          <w:sz w:val="36"/>
+          <w:szCs w:val="36"/>
+          <w:shd w:fill="auto" w:val="clear"/>
+          <w:lang w:val="en-US" w:eastAsia="zh-CN" w:bidi="hi-IN"/>
+        </w:rPr>
+        <w:t>Assim como os fariseus, muitas vezes nós nos apoiamos na hipocrisia e nos isentamos de cumprir uma obrigação para com alguém, simplesmente porque não gostamos da pessoa ou a temos como inimiga.</w:t>
+      </w:r>
+    </w:p>
+    <w:p>
+      <w:pPr>
+        <w:pStyle w:val="Normal"/>
+        <w:jc w:val="both"/>
+        <w:rPr>
+          <w:rFonts w:ascii="Garamond" w:hAnsi="Garamond" w:eastAsia="Times New Roman" w:cs="Times New Roman"/>
+          <w:color w:val="000000"/>
+          <w:kern w:val="0"/>
+          <w:sz w:val="36"/>
+          <w:szCs w:val="36"/>
+          <w:shd w:fill="auto" w:val="clear"/>
+          <w:lang w:val="en-US" w:eastAsia="zh-CN" w:bidi="hi-IN"/>
+        </w:rPr>
+      </w:pPr>
+      <w:r>
+        <w:rPr>
+          <w:rFonts w:eastAsia="Times New Roman" w:cs="Times New Roman" w:ascii="Garamond" w:hAnsi="Garamond"/>
+          <w:color w:val="000000"/>
+          <w:kern w:val="0"/>
+          <w:sz w:val="36"/>
+          <w:szCs w:val="36"/>
+          <w:shd w:fill="auto" w:val="clear"/>
+          <w:lang w:val="en-US" w:eastAsia="zh-CN" w:bidi="hi-IN"/>
+        </w:rPr>
+      </w:r>
+    </w:p>
+    <w:p>
+      <w:pPr>
+        <w:pStyle w:val="Normal"/>
+        <w:jc w:val="both"/>
+        <w:rPr>
+          <w:rFonts w:ascii="Garamond" w:hAnsi="Garamond" w:eastAsia="Times New Roman" w:cs="Times New Roman"/>
+          <w:color w:val="000000"/>
+          <w:kern w:val="0"/>
+          <w:sz w:val="36"/>
+          <w:szCs w:val="36"/>
+          <w:shd w:fill="auto" w:val="clear"/>
+          <w:lang w:val="en-US" w:eastAsia="zh-CN" w:bidi="hi-IN"/>
+        </w:rPr>
+      </w:pPr>
+      <w:r>
+        <w:rPr>
+          <w:rFonts w:eastAsia="Times New Roman" w:cs="Times New Roman" w:ascii="Garamond" w:hAnsi="Garamond"/>
+          <w:color w:val="000000"/>
+          <w:kern w:val="0"/>
+          <w:sz w:val="36"/>
+          <w:szCs w:val="36"/>
+          <w:shd w:fill="auto" w:val="clear"/>
+          <w:lang w:val="en-US" w:eastAsia="zh-CN" w:bidi="hi-IN"/>
+        </w:rPr>
+        <w:t>Vou dar um exemplo bastante simples: domingo à noite, você entra com seu carro na garagem do prédio em que você mora. Estaciona e se prepara para ir para seu apartamento quando nota que outro morador estacionou seu carro, mas esqueceu de apagar os faróis.</w:t>
+      </w:r>
+    </w:p>
+    <w:p>
+      <w:pPr>
+        <w:pStyle w:val="Normal"/>
+        <w:jc w:val="both"/>
+        <w:rPr>
+          <w:rFonts w:ascii="Garamond" w:hAnsi="Garamond" w:eastAsia="Times New Roman" w:cs="Times New Roman"/>
+          <w:color w:val="000000"/>
+          <w:kern w:val="0"/>
+          <w:sz w:val="36"/>
+          <w:szCs w:val="36"/>
+          <w:shd w:fill="auto" w:val="clear"/>
+          <w:lang w:val="en-US" w:eastAsia="zh-CN" w:bidi="hi-IN"/>
+        </w:rPr>
+      </w:pPr>
+      <w:r>
+        <w:rPr>
+          <w:rFonts w:eastAsia="Times New Roman" w:cs="Times New Roman" w:ascii="Garamond" w:hAnsi="Garamond"/>
+          <w:color w:val="000000"/>
+          <w:kern w:val="0"/>
+          <w:sz w:val="36"/>
+          <w:szCs w:val="36"/>
+          <w:shd w:fill="auto" w:val="clear"/>
+          <w:lang w:val="en-US" w:eastAsia="zh-CN" w:bidi="hi-IN"/>
+        </w:rPr>
+      </w:r>
+    </w:p>
+    <w:p>
+      <w:pPr>
+        <w:pStyle w:val="Normal"/>
+        <w:jc w:val="both"/>
+        <w:rPr>
+          <w:rFonts w:ascii="Garamond" w:hAnsi="Garamond" w:eastAsia="Times New Roman" w:cs="Times New Roman"/>
+          <w:color w:val="000000"/>
+          <w:kern w:val="0"/>
+          <w:sz w:val="36"/>
+          <w:szCs w:val="36"/>
+          <w:shd w:fill="auto" w:val="clear"/>
+          <w:lang w:val="en-US" w:eastAsia="zh-CN" w:bidi="hi-IN"/>
+        </w:rPr>
+      </w:pPr>
+      <w:r>
+        <w:rPr>
+          <w:rFonts w:eastAsia="Times New Roman" w:cs="Times New Roman" w:ascii="Garamond" w:hAnsi="Garamond"/>
+          <w:color w:val="000000"/>
+          <w:kern w:val="0"/>
+          <w:sz w:val="36"/>
+          <w:szCs w:val="36"/>
+          <w:shd w:fill="auto" w:val="clear"/>
+          <w:lang w:val="en-US" w:eastAsia="zh-CN" w:bidi="hi-IN"/>
+        </w:rPr>
+        <w:t>Você reconhece o carro: é daquele vizinho do apartamento exatamente acima do seu, aquele que vive arrastando os móveis e cujo filho pequeno constantemente joga os brinquedos no chão.</w:t>
+      </w:r>
+    </w:p>
+    <w:p>
+      <w:pPr>
+        <w:pStyle w:val="Normal"/>
+        <w:jc w:val="both"/>
+        <w:rPr>
+          <w:rFonts w:ascii="Garamond" w:hAnsi="Garamond" w:eastAsia="Times New Roman" w:cs="Times New Roman"/>
+          <w:color w:val="000000"/>
+          <w:kern w:val="0"/>
+          <w:sz w:val="36"/>
+          <w:szCs w:val="36"/>
+          <w:shd w:fill="auto" w:val="clear"/>
+          <w:lang w:val="en-US" w:eastAsia="zh-CN" w:bidi="hi-IN"/>
+        </w:rPr>
+      </w:pPr>
+      <w:r>
+        <w:rPr>
+          <w:rFonts w:eastAsia="Times New Roman" w:cs="Times New Roman" w:ascii="Garamond" w:hAnsi="Garamond"/>
+          <w:color w:val="000000"/>
+          <w:kern w:val="0"/>
+          <w:sz w:val="36"/>
+          <w:szCs w:val="36"/>
+          <w:shd w:fill="auto" w:val="clear"/>
+          <w:lang w:val="en-US" w:eastAsia="zh-CN" w:bidi="hi-IN"/>
+        </w:rPr>
+      </w:r>
+    </w:p>
+    <w:p>
+      <w:pPr>
+        <w:pStyle w:val="Normal"/>
+        <w:jc w:val="both"/>
+        <w:rPr>
+          <w:rFonts w:ascii="Garamond" w:hAnsi="Garamond" w:eastAsia="Times New Roman" w:cs="Times New Roman"/>
+          <w:color w:val="000000"/>
+          <w:kern w:val="0"/>
+          <w:sz w:val="36"/>
+          <w:szCs w:val="36"/>
+          <w:shd w:fill="auto" w:val="clear"/>
+          <w:lang w:val="en-US" w:eastAsia="zh-CN" w:bidi="hi-IN"/>
+        </w:rPr>
+      </w:pPr>
+      <w:r>
+        <w:rPr>
+          <w:rFonts w:eastAsia="Times New Roman" w:cs="Times New Roman" w:ascii="Garamond" w:hAnsi="Garamond"/>
+          <w:color w:val="000000"/>
+          <w:kern w:val="0"/>
+          <w:sz w:val="36"/>
+          <w:szCs w:val="36"/>
+          <w:shd w:fill="auto" w:val="clear"/>
+          <w:lang w:val="en-US" w:eastAsia="zh-CN" w:bidi="hi-IN"/>
+        </w:rPr>
+        <w:t>Você sabe que esse vizinho leva o filho à escola antes de ir para o trabalho. Com os faróis ficando acesos durante toda a noite, na manhã seguinte com certeza a bateria do carro estará sem carga.  Vai ser uma grande dor de cabeça, mas como ele também lhe causa transtornos, você decide não avisá-lo. Ele que se vire no dia seguinte.</w:t>
+      </w:r>
+    </w:p>
+    <w:p>
+      <w:pPr>
+        <w:pStyle w:val="Normal"/>
+        <w:jc w:val="both"/>
+        <w:rPr>
+          <w:rFonts w:ascii="Garamond" w:hAnsi="Garamond" w:eastAsia="Times New Roman" w:cs="Times New Roman"/>
+          <w:color w:val="000000"/>
+          <w:kern w:val="0"/>
+          <w:sz w:val="36"/>
+          <w:szCs w:val="36"/>
+          <w:shd w:fill="auto" w:val="clear"/>
+          <w:lang w:val="en-US" w:eastAsia="zh-CN" w:bidi="hi-IN"/>
+        </w:rPr>
+      </w:pPr>
+      <w:r>
+        <w:rPr>
+          <w:rFonts w:eastAsia="Times New Roman" w:cs="Times New Roman" w:ascii="Garamond" w:hAnsi="Garamond"/>
+          <w:color w:val="000000"/>
+          <w:kern w:val="0"/>
+          <w:sz w:val="36"/>
+          <w:szCs w:val="36"/>
+          <w:shd w:fill="auto" w:val="clear"/>
+          <w:lang w:val="en-US" w:eastAsia="zh-CN" w:bidi="hi-IN"/>
+        </w:rPr>
+      </w:r>
+    </w:p>
+    <w:p>
+      <w:pPr>
+        <w:pStyle w:val="Normal"/>
+        <w:jc w:val="both"/>
+        <w:rPr>
+          <w:rFonts w:ascii="Garamond" w:hAnsi="Garamond" w:eastAsia="Times New Roman" w:cs="Times New Roman"/>
+          <w:color w:val="000000"/>
+          <w:kern w:val="0"/>
+          <w:sz w:val="36"/>
+          <w:szCs w:val="36"/>
+          <w:shd w:fill="auto" w:val="clear"/>
+          <w:lang w:val="en-US" w:eastAsia="zh-CN" w:bidi="hi-IN"/>
+        </w:rPr>
+      </w:pPr>
+      <w:r>
+        <w:rPr>
+          <w:rFonts w:eastAsia="Times New Roman" w:cs="Times New Roman" w:ascii="Garamond" w:hAnsi="Garamond"/>
+          <w:color w:val="000000"/>
+          <w:kern w:val="0"/>
+          <w:sz w:val="36"/>
+          <w:szCs w:val="36"/>
+          <w:shd w:fill="auto" w:val="clear"/>
+          <w:lang w:val="en-US" w:eastAsia="zh-CN" w:bidi="hi-IN"/>
+        </w:rPr>
+        <w:t xml:space="preserve">Postura totalmente errada, incompatível com quem deseja crescer espiritualmente. Você tinha a chance — e o dever moral — de fazer o que era certo, mas deixou de agir apenas porque não gostava da pessoa. Nesse pequeno gesto, perdeu a oportunidade de “dar a César o que é de César”: cumprir o bem, mesmo quando o outro não despertava em você a simpatia. </w:t>
+      </w:r>
+    </w:p>
+    <w:p>
+      <w:pPr>
+        <w:pStyle w:val="Normal"/>
+        <w:jc w:val="both"/>
+        <w:rPr>
+          <w:rFonts w:ascii="Garamond" w:hAnsi="Garamond" w:eastAsia="Times New Roman" w:cs="Times New Roman"/>
+          <w:color w:val="000000"/>
+          <w:kern w:val="0"/>
+          <w:sz w:val="36"/>
+          <w:szCs w:val="36"/>
+          <w:shd w:fill="auto" w:val="clear"/>
+          <w:lang w:val="en-US" w:eastAsia="zh-CN" w:bidi="hi-IN"/>
+        </w:rPr>
+      </w:pPr>
+      <w:r>
+        <w:rPr>
+          <w:rFonts w:eastAsia="Times New Roman" w:cs="Times New Roman" w:ascii="Garamond" w:hAnsi="Garamond"/>
+          <w:color w:val="000000"/>
+          <w:kern w:val="0"/>
+          <w:sz w:val="36"/>
+          <w:szCs w:val="36"/>
+          <w:shd w:fill="auto" w:val="clear"/>
+          <w:lang w:val="en-US" w:eastAsia="zh-CN" w:bidi="hi-IN"/>
+        </w:rPr>
+        <w:t>O Espírito Lázaro diz que no início de nossa jornada evolutiva somos movidos exclusivamente pelos instintos. Ao avançarmos um pouco mais, adquirimos sensações. Quando nos instruímos e depuramos, as sensações convertem-se em sentimentos.</w:t>
+      </w:r>
+    </w:p>
+    <w:p>
+      <w:pPr>
+        <w:pStyle w:val="Normal"/>
+        <w:jc w:val="both"/>
+        <w:rPr>
+          <w:rFonts w:ascii="Garamond" w:hAnsi="Garamond" w:eastAsia="Times New Roman" w:cs="Times New Roman"/>
+          <w:color w:val="000000"/>
+          <w:kern w:val="0"/>
+          <w:sz w:val="36"/>
+          <w:szCs w:val="36"/>
+          <w:shd w:fill="auto" w:val="clear"/>
+          <w:lang w:val="en-US" w:eastAsia="zh-CN" w:bidi="hi-IN"/>
+        </w:rPr>
+      </w:pPr>
+      <w:r>
+        <w:rPr/>
+      </w:r>
+    </w:p>
+    <w:p>
+      <w:pPr>
+        <w:pStyle w:val="Normal"/>
+        <w:jc w:val="both"/>
+        <w:rPr>
+          <w:rFonts w:ascii="Garamond" w:hAnsi="Garamond" w:eastAsia="Times New Roman" w:cs="Times New Roman"/>
+          <w:color w:val="000000"/>
+          <w:kern w:val="0"/>
+          <w:sz w:val="36"/>
+          <w:szCs w:val="36"/>
+          <w:shd w:fill="auto" w:val="clear"/>
+          <w:lang w:val="en-US" w:eastAsia="zh-CN" w:bidi="hi-IN"/>
+        </w:rPr>
+      </w:pPr>
+      <w:r>
+        <w:rPr>
+          <w:rFonts w:eastAsia="Times New Roman" w:cs="Times New Roman" w:ascii="Garamond" w:hAnsi="Garamond"/>
+          <w:color w:val="000000"/>
+          <w:kern w:val="0"/>
+          <w:sz w:val="36"/>
+          <w:szCs w:val="36"/>
+          <w:shd w:fill="auto" w:val="clear"/>
+          <w:lang w:val="en-US" w:eastAsia="zh-CN" w:bidi="hi-IN"/>
+        </w:rPr>
+        <w:t>O amor é o ápice dos sentimentos humanos. Não o amor como costumamos entender, mas o amor que concentra em si todas as melhores e mais belas virtudes humanas: caridade, humildade, benevolência, indulgência, paciência, abnegação, resignação entre outras.</w:t>
+      </w:r>
+    </w:p>
+    <w:p>
+      <w:pPr>
+        <w:pStyle w:val="Normal"/>
+        <w:jc w:val="both"/>
+        <w:rPr>
+          <w:rFonts w:ascii="Garamond" w:hAnsi="Garamond" w:eastAsia="Times New Roman" w:cs="Times New Roman"/>
+          <w:color w:val="000000"/>
+          <w:kern w:val="0"/>
+          <w:sz w:val="36"/>
+          <w:szCs w:val="36"/>
+          <w:shd w:fill="auto" w:val="clear"/>
+          <w:lang w:val="en-US" w:eastAsia="zh-CN" w:bidi="hi-IN"/>
+        </w:rPr>
+      </w:pPr>
+      <w:r>
+        <w:rPr/>
+      </w:r>
+    </w:p>
+    <w:p>
+      <w:pPr>
+        <w:pStyle w:val="Normal"/>
+        <w:jc w:val="both"/>
+        <w:rPr>
+          <w:rFonts w:ascii="Garamond" w:hAnsi="Garamond" w:eastAsia="Times New Roman" w:cs="Times New Roman"/>
+          <w:color w:val="000000"/>
+          <w:kern w:val="0"/>
+          <w:sz w:val="36"/>
+          <w:szCs w:val="36"/>
+          <w:shd w:fill="auto" w:val="clear"/>
+          <w:lang w:val="en-US" w:eastAsia="zh-CN" w:bidi="hi-IN"/>
+        </w:rPr>
+      </w:pPr>
+      <w:r>
+        <w:rPr>
+          <w:rFonts w:eastAsia="Times New Roman" w:cs="Times New Roman" w:ascii="Garamond" w:hAnsi="Garamond"/>
+          <w:color w:val="000000"/>
+          <w:kern w:val="0"/>
+          <w:sz w:val="36"/>
+          <w:szCs w:val="36"/>
+          <w:shd w:fill="auto" w:val="clear"/>
+          <w:lang w:val="en-US" w:eastAsia="zh-CN" w:bidi="hi-IN"/>
+        </w:rPr>
+        <w:t>T</w:t>
+      </w:r>
+      <w:r>
+        <w:rPr>
+          <w:rFonts w:eastAsia="Times New Roman" w:cs="Times New Roman" w:ascii="Garamond" w:hAnsi="Garamond"/>
+          <w:color w:val="000000"/>
+          <w:kern w:val="0"/>
+          <w:sz w:val="36"/>
+          <w:szCs w:val="36"/>
+          <w:shd w:fill="auto" w:val="clear"/>
+          <w:lang w:val="en-US" w:eastAsia="zh-CN" w:bidi="hi-IN"/>
+        </w:rPr>
+        <w:t>odos nós temos algumas dessas virtudes, mas elas não estão completamente desenvolvidas. Isso é natural considerando o atual estágio evolutivo em que nos encontramos</w:t>
+      </w:r>
+      <w:r>
+        <w:rPr>
+          <w:rFonts w:eastAsia="Times New Roman" w:cs="Times New Roman" w:ascii="Garamond" w:hAnsi="Garamond"/>
+          <w:color w:val="000000"/>
+          <w:kern w:val="0"/>
+          <w:sz w:val="36"/>
+          <w:szCs w:val="36"/>
+          <w:shd w:fill="auto" w:val="clear"/>
+          <w:lang w:val="en-US" w:eastAsia="zh-CN" w:bidi="hi-IN"/>
+        </w:rPr>
+        <w:t>.</w:t>
+      </w:r>
+    </w:p>
+    <w:p>
+      <w:pPr>
+        <w:pStyle w:val="Normal"/>
+        <w:jc w:val="both"/>
+        <w:rPr>
+          <w:rFonts w:ascii="Garamond" w:hAnsi="Garamond" w:eastAsia="Times New Roman" w:cs="Times New Roman"/>
+          <w:color w:val="000000"/>
+          <w:kern w:val="0"/>
+          <w:sz w:val="36"/>
+          <w:szCs w:val="36"/>
+          <w:shd w:fill="auto" w:val="clear"/>
+          <w:lang w:val="en-US" w:eastAsia="zh-CN" w:bidi="hi-IN"/>
+        </w:rPr>
+      </w:pPr>
+      <w:r>
+        <w:rPr/>
+      </w:r>
+    </w:p>
+    <w:p>
+      <w:pPr>
+        <w:pStyle w:val="Normal"/>
+        <w:jc w:val="both"/>
+        <w:rPr>
+          <w:rFonts w:ascii="Garamond" w:hAnsi="Garamond" w:eastAsia="Times New Roman" w:cs="Times New Roman"/>
+          <w:color w:val="000000"/>
+          <w:kern w:val="0"/>
+          <w:sz w:val="36"/>
+          <w:szCs w:val="36"/>
+          <w:shd w:fill="auto" w:val="clear"/>
+          <w:lang w:val="en-US" w:eastAsia="zh-CN" w:bidi="hi-IN"/>
+        </w:rPr>
+      </w:pPr>
+      <w:r>
+        <w:rPr>
+          <w:rFonts w:eastAsia="Times New Roman" w:cs="Times New Roman" w:ascii="Garamond" w:hAnsi="Garamond"/>
+          <w:color w:val="000000"/>
+          <w:kern w:val="0"/>
+          <w:sz w:val="36"/>
+          <w:szCs w:val="36"/>
+          <w:shd w:fill="auto" w:val="clear"/>
+          <w:lang w:val="en-US" w:eastAsia="zh-CN" w:bidi="hi-IN"/>
+        </w:rPr>
+        <w:t>Nosso trabalho consiste exatamente em exercitar, aprimorar e desenvolver constantamente cada uma dessas virtudes.</w:t>
+      </w:r>
+    </w:p>
+    <w:p>
+      <w:pPr>
+        <w:pStyle w:val="Normal"/>
+        <w:jc w:val="both"/>
+        <w:rPr>
+          <w:rFonts w:ascii="Garamond" w:hAnsi="Garamond" w:eastAsia="Times New Roman" w:cs="Times New Roman"/>
+          <w:color w:val="000000"/>
+          <w:kern w:val="0"/>
+          <w:sz w:val="36"/>
+          <w:szCs w:val="36"/>
+          <w:shd w:fill="auto" w:val="clear"/>
+          <w:lang w:val="en-US" w:eastAsia="zh-CN" w:bidi="hi-IN"/>
+        </w:rPr>
+      </w:pPr>
+      <w:r>
+        <w:rPr/>
+      </w:r>
+    </w:p>
+    <w:p>
+      <w:pPr>
+        <w:pStyle w:val="Normal"/>
+        <w:jc w:val="both"/>
+        <w:rPr>
+          <w:rFonts w:ascii="Garamond" w:hAnsi="Garamond" w:eastAsia="Times New Roman" w:cs="Times New Roman"/>
+          <w:color w:val="000000"/>
+          <w:kern w:val="0"/>
+          <w:sz w:val="36"/>
+          <w:szCs w:val="36"/>
+          <w:shd w:fill="auto" w:val="clear"/>
+          <w:lang w:val="en-US" w:eastAsia="zh-CN" w:bidi="hi-IN"/>
+        </w:rPr>
+      </w:pPr>
+      <w:r>
+        <w:rPr>
+          <w:rFonts w:eastAsia="Times New Roman" w:cs="Times New Roman" w:ascii="Garamond" w:hAnsi="Garamond"/>
+          <w:color w:val="000000"/>
+          <w:kern w:val="0"/>
+          <w:sz w:val="36"/>
+          <w:szCs w:val="36"/>
+          <w:shd w:fill="auto" w:val="clear"/>
+          <w:lang w:val="en-US" w:eastAsia="zh-CN" w:bidi="hi-IN"/>
+        </w:rPr>
+        <w:t>A</w:t>
+      </w:r>
+      <w:r>
+        <w:rPr>
+          <w:rFonts w:eastAsia="Times New Roman" w:cs="Times New Roman" w:ascii="Garamond" w:hAnsi="Garamond"/>
+          <w:color w:val="000000"/>
+          <w:kern w:val="0"/>
+          <w:sz w:val="36"/>
+          <w:szCs w:val="36"/>
+          <w:shd w:fill="auto" w:val="clear"/>
+          <w:lang w:val="en-US" w:eastAsia="zh-CN" w:bidi="hi-IN"/>
+        </w:rPr>
+        <w:t>ssim, quando procuramos ser mais humildes, mais pacientes, mais caridosos, mais resignados, nós estamos, na verdade, aprendendo a amar um pouco mais</w:t>
+      </w:r>
+      <w:r>
+        <w:rPr>
+          <w:rFonts w:eastAsia="Times New Roman" w:cs="Times New Roman" w:ascii="Garamond" w:hAnsi="Garamond"/>
+          <w:color w:val="000000"/>
+          <w:kern w:val="0"/>
+          <w:sz w:val="36"/>
+          <w:szCs w:val="36"/>
+          <w:shd w:fill="auto" w:val="clear"/>
+          <w:lang w:val="en-US" w:eastAsia="zh-CN" w:bidi="hi-IN"/>
+        </w:rPr>
+        <w:t>.</w:t>
+      </w:r>
+    </w:p>
+    <w:p>
+      <w:pPr>
+        <w:pStyle w:val="Normal"/>
+        <w:jc w:val="both"/>
+        <w:rPr>
+          <w:rFonts w:ascii="Garamond" w:hAnsi="Garamond" w:eastAsia="Times New Roman" w:cs="Times New Roman"/>
+          <w:color w:val="000000"/>
+          <w:kern w:val="0"/>
+          <w:sz w:val="36"/>
+          <w:szCs w:val="36"/>
+          <w:shd w:fill="auto" w:val="clear"/>
+          <w:lang w:val="en-US" w:eastAsia="zh-CN" w:bidi="hi-IN"/>
+        </w:rPr>
+      </w:pPr>
+      <w:r>
+        <w:rPr/>
+      </w:r>
+    </w:p>
+    <w:p>
+      <w:pPr>
+        <w:pStyle w:val="Normal"/>
+        <w:jc w:val="both"/>
+        <w:rPr>
+          <w:rFonts w:ascii="Garamond" w:hAnsi="Garamond" w:eastAsia="Times New Roman" w:cs="Times New Roman"/>
+          <w:color w:val="000000"/>
+          <w:kern w:val="0"/>
+          <w:sz w:val="36"/>
+          <w:szCs w:val="36"/>
+          <w:shd w:fill="auto" w:val="clear"/>
+          <w:lang w:val="en-US" w:eastAsia="zh-CN" w:bidi="hi-IN"/>
+        </w:rPr>
+      </w:pPr>
+      <w:r>
+        <w:rPr>
+          <w:rFonts w:eastAsia="Times New Roman" w:cs="Times New Roman" w:ascii="Garamond" w:hAnsi="Garamond"/>
+          <w:color w:val="000000"/>
+          <w:kern w:val="0"/>
+          <w:sz w:val="36"/>
+          <w:szCs w:val="36"/>
+          <w:shd w:fill="auto" w:val="clear"/>
+          <w:lang w:val="en-US" w:eastAsia="zh-CN" w:bidi="hi-IN"/>
+        </w:rPr>
+        <w:t>P</w:t>
+      </w:r>
+      <w:r>
+        <w:rPr>
+          <w:rFonts w:eastAsia="Times New Roman" w:cs="Times New Roman" w:ascii="Garamond" w:hAnsi="Garamond"/>
+          <w:color w:val="000000"/>
+          <w:kern w:val="0"/>
+          <w:sz w:val="36"/>
+          <w:szCs w:val="36"/>
+          <w:shd w:fill="auto" w:val="clear"/>
+          <w:lang w:val="en-US" w:eastAsia="zh-CN" w:bidi="hi-IN"/>
+        </w:rPr>
+        <w:t>arei aqui em 23/11/2025</w:t>
+      </w:r>
+    </w:p>
+    <w:p>
+      <w:pPr>
+        <w:pStyle w:val="Normal"/>
+        <w:jc w:val="both"/>
+        <w:rPr>
+          <w:rFonts w:ascii="Garamond" w:hAnsi="Garamond" w:eastAsia="Times New Roman" w:cs="Times New Roman"/>
+          <w:color w:val="000000"/>
+          <w:kern w:val="0"/>
+          <w:sz w:val="36"/>
+          <w:szCs w:val="36"/>
+          <w:shd w:fill="auto" w:val="clear"/>
+          <w:lang w:val="en-US" w:eastAsia="zh-CN" w:bidi="hi-IN"/>
+        </w:rPr>
+      </w:pPr>
+      <w:r>
+        <w:rPr/>
+      </w:r>
+    </w:p>
+    <w:p>
+      <w:pPr>
+        <w:pStyle w:val="Normal"/>
+        <w:jc w:val="both"/>
+        <w:rPr>
+          <w:rFonts w:ascii="Garamond" w:hAnsi="Garamond" w:eastAsia="Times New Roman" w:cs="Times New Roman"/>
+          <w:color w:val="000000"/>
+          <w:kern w:val="0"/>
+          <w:sz w:val="36"/>
+          <w:szCs w:val="36"/>
+          <w:shd w:fill="auto" w:val="clear"/>
+          <w:lang w:val="en-US" w:eastAsia="zh-CN" w:bidi="hi-IN"/>
+        </w:rPr>
+      </w:pPr>
+      <w:r>
+        <w:rPr/>
       </w:r>
     </w:p>
     <w:p>
@@ -2347,67 +3192,8 @@
       </w:pPr>
       <w:r>
         <w:rPr>
+          <w:rFonts w:eastAsia="Times New Roman" w:cs="Times New Roman" w:ascii="Garamond" w:hAnsi="Garamond"/>
           <w:color w:val="00A0FC"/>
-          <w:sz w:val="36"/>
-          <w:szCs w:val="36"/>
-        </w:rPr>
-      </w:r>
-    </w:p>
-    <w:p>
-      <w:pPr>
-        <w:pStyle w:val="Normal"/>
-        <w:jc w:val="both"/>
-        <w:rPr>
-          <w:color w:val="00A0FC"/>
-          <w:sz w:val="36"/>
-          <w:szCs w:val="36"/>
-        </w:rPr>
-      </w:pPr>
-      <w:r>
-        <w:rPr>
-          <w:rFonts w:eastAsia="Times New Roman" w:cs="Times New Roman" w:ascii="Garamond" w:hAnsi="Garamond"/>
-          <w:color w:val="00A0FC"/>
-          <w:kern w:val="0"/>
-          <w:sz w:val="36"/>
-          <w:szCs w:val="36"/>
-          <w:shd w:fill="auto" w:val="clear"/>
-          <w:lang w:val="en-US" w:eastAsia="zh-CN" w:bidi="hi-IN"/>
-        </w:rPr>
-        <w:t>[ Até esse ponto está OK ]</w:t>
-      </w:r>
-    </w:p>
-    <w:p>
-      <w:pPr>
-        <w:pStyle w:val="Normal"/>
-        <w:jc w:val="both"/>
-        <w:rPr>
-          <w:color w:val="00A0FC"/>
-          <w:sz w:val="36"/>
-          <w:szCs w:val="36"/>
-        </w:rPr>
-      </w:pPr>
-      <w:r>
-        <w:rPr>
-          <w:color w:val="00A0FC"/>
-          <w:sz w:val="36"/>
-          <w:szCs w:val="36"/>
-        </w:rPr>
-      </w:r>
-    </w:p>
-    <w:p>
-      <w:pPr>
-        <w:pStyle w:val="Normal"/>
-        <w:jc w:val="both"/>
-        <w:rPr>
-          <w:color w:val="00A0FC"/>
-          <w:sz w:val="36"/>
-          <w:szCs w:val="36"/>
-        </w:rPr>
-      </w:pPr>
-      <w:r>
-        <w:rPr>
-          <w:rFonts w:eastAsia="Times New Roman" w:cs="Times New Roman" w:ascii="Garamond" w:hAnsi="Garamond"/>
-          <w:color w:val="00A0FC"/>
           <w:kern w:val="0"/>
           <w:sz w:val="36"/>
           <w:szCs w:val="36"/>
@@ -2443,7 +3229,66 @@
           <w:shd w:fill="auto" w:val="clear"/>
           <w:lang w:val="en-US" w:eastAsia="zh-CN" w:bidi="hi-IN"/>
         </w:rPr>
-        <w:t>Dai a César o que é de César</w:t>
+      </w:r>
+    </w:p>
+    <w:p>
+      <w:pPr>
+        <w:pStyle w:val="Normal"/>
+        <w:numPr>
+          <w:ilvl w:val="0"/>
+          <w:numId w:val="0"/>
+        </w:numPr>
+        <w:ind w:left="720" w:hanging="0"/>
+        <w:jc w:val="both"/>
+        <w:rPr>
+          <w:rFonts w:ascii="Garamond" w:hAnsi="Garamond" w:eastAsia="Times New Roman" w:cs="Times New Roman"/>
+          <w:color w:val="000000"/>
+          <w:kern w:val="0"/>
+          <w:sz w:val="36"/>
+          <w:szCs w:val="36"/>
+          <w:shd w:fill="auto" w:val="clear"/>
+          <w:lang w:val="en-US" w:eastAsia="zh-CN" w:bidi="hi-IN"/>
+        </w:rPr>
+      </w:pPr>
+      <w:r>
+        <w:rPr>
+          <w:rFonts w:eastAsia="Times New Roman" w:cs="Times New Roman" w:ascii="Garamond" w:hAnsi="Garamond"/>
+          <w:color w:val="000000"/>
+          <w:kern w:val="0"/>
+          <w:sz w:val="36"/>
+          <w:szCs w:val="36"/>
+          <w:shd w:fill="auto" w:val="clear"/>
+          <w:lang w:val="en-US" w:eastAsia="zh-CN" w:bidi="hi-IN"/>
+        </w:rPr>
+      </w:r>
+    </w:p>
+    <w:p>
+      <w:pPr>
+        <w:pStyle w:val="Normal"/>
+        <w:jc w:val="both"/>
+        <w:rPr>
+          <w:rFonts w:ascii="Garamond" w:hAnsi="Garamond" w:eastAsia="Times New Roman" w:cs="Times New Roman"/>
+          <w:color w:val="000000"/>
+          <w:kern w:val="0"/>
+          <w:sz w:val="36"/>
+          <w:szCs w:val="36"/>
+          <w:u w:val="single"/>
+          <w:shd w:fill="auto" w:val="clear"/>
+          <w:lang w:val="en-US" w:eastAsia="zh-CN" w:bidi="hi-IN"/>
+        </w:rPr>
+      </w:pPr>
+      <w:r>
+        <w:rPr>
+          <w:rFonts w:eastAsia="Times New Roman" w:cs="Times New Roman" w:ascii="Garamond" w:hAnsi="Garamond"/>
+          <w:color w:val="000000"/>
+          <w:kern w:val="0"/>
+          <w:sz w:val="36"/>
+          <w:szCs w:val="36"/>
+          <w:u w:val="single"/>
+          <w:shd w:fill="auto" w:val="clear"/>
+          <w:lang w:val="en-US" w:eastAsia="zh-CN" w:bidi="hi-IN"/>
+        </w:rPr>
+        <w:t>Instruções de Fénelon</w:t>
       </w:r>
     </w:p>
     <w:p>
@@ -2474,7 +3319,7 @@
           <w:shd w:fill="auto" w:val="clear"/>
           <w:lang w:val="en-US" w:eastAsia="zh-CN" w:bidi="hi-IN"/>
         </w:rPr>
-        <w:t>o ponto principal que pode ser desenvolvido desse tópico é que precisamos ser justos com nossos desafetos. Se algo é de direito deles - e aqui não estamos falando apenas de coisas materiais - não devemos negar-lhes esse algo. Gostando ou não da pessoa, devemos reconhecer que ela merece receber aquilo que, por direito, pertence a ela;</w:t>
+        <w:t>para convertermos os instintos em sentimentos nobres precisamos desenvolver a moral e a inteligência;</w:t>
       </w:r>
     </w:p>
     <w:p>
@@ -2505,12 +3350,16 @@
           <w:shd w:fill="auto" w:val="clear"/>
           <w:lang w:val="en-US" w:eastAsia="zh-CN" w:bidi="hi-IN"/>
         </w:rPr>
-        <w:t>verificar se tem algo na palestra Nós e César, de Emmanuel, que possa ser trazido para cá</w:t>
-      </w:r>
-    </w:p>
-    <w:p>
-      <w:pPr>
-        <w:pStyle w:val="Normal"/>
+        <w:t>o verdadeiro amor transcende os laços consanguineos e sociais. Amar ao próximo significa amar a todos indistintamente. É ainda uma condição muito distante de nós, mas uma condição que alcançaremos um dia desde que nos esforcemos para amar um pouco mais a cada dia;</w:t>
+      </w:r>
+    </w:p>
+    <w:p>
+      <w:pPr>
+        <w:pStyle w:val="Normal"/>
+        <w:numPr>
+          <w:ilvl w:val="0"/>
+          <w:numId w:val="10"/>
+        </w:numPr>
         <w:jc w:val="both"/>
         <w:rPr>
           <w:rFonts w:ascii="Garamond" w:hAnsi="Garamond" w:eastAsia="Times New Roman" w:cs="Times New Roman"/>
@@ -2532,11 +3381,16 @@
           <w:shd w:fill="auto" w:val="clear"/>
           <w:lang w:val="en-US" w:eastAsia="zh-CN" w:bidi="hi-IN"/>
         </w:rPr>
-      </w:r>
-    </w:p>
-    <w:p>
-      <w:pPr>
-        <w:pStyle w:val="Normal"/>
+        <w:t>vivemos tempos difíceis, turbulentos. Há muito egoísmo, muitos corações endurecidos. Tais corações somente podem sensibilizados pelo amor verdadeiro. Ainda que eles insistam em permanecer na frieza e na indiferença, a seu tempo todos serão convertidos;</w:t>
+      </w:r>
+    </w:p>
+    <w:p>
+      <w:pPr>
+        <w:pStyle w:val="Normal"/>
+        <w:numPr>
+          <w:ilvl w:val="0"/>
+          <w:numId w:val="10"/>
+        </w:numPr>
         <w:jc w:val="both"/>
         <w:rPr>
           <w:rFonts w:ascii="Garamond" w:hAnsi="Garamond" w:eastAsia="Times New Roman" w:cs="Times New Roman"/>
@@ -2544,9 +3398,55 @@
           <w:kern w:val="0"/>
           <w:sz w:val="36"/>
           <w:szCs w:val="36"/>
+          <w:shd w:fill="auto" w:val="clear"/>
+          <w:lang w:val="en-US" w:eastAsia="zh-CN" w:bidi="hi-IN"/>
+        </w:rPr>
+      </w:pPr>
+      <w:r>
+        <w:rPr>
+          <w:rFonts w:eastAsia="Times New Roman" w:cs="Times New Roman" w:ascii="Garamond" w:hAnsi="Garamond"/>
+          <w:color w:val="000000"/>
+          <w:kern w:val="0"/>
+          <w:sz w:val="36"/>
+          <w:szCs w:val="36"/>
+          <w:shd w:fill="auto" w:val="clear"/>
+          <w:lang w:val="en-US" w:eastAsia="zh-CN" w:bidi="hi-IN"/>
+        </w:rPr>
+        <w:t>portanto, se desejamos transformar o mundo para melhor, o exemplo do amor é a melhor e mais poderosa ferramenta de que dispomos;</w:t>
+      </w:r>
+    </w:p>
+    <w:p>
+      <w:pPr>
+        <w:pStyle w:val="Normal"/>
+        <w:jc w:val="both"/>
+        <w:rPr>
+          <w:rFonts w:ascii="Garamond" w:hAnsi="Garamond" w:eastAsia="Times New Roman" w:cs="Times New Roman"/>
+          <w:color w:val="000000"/>
+          <w:kern w:val="0"/>
+          <w:sz w:val="36"/>
+          <w:szCs w:val="36"/>
+          <w:shd w:fill="auto" w:val="clear"/>
+          <w:lang w:val="en-US" w:eastAsia="zh-CN" w:bidi="hi-IN"/>
+        </w:rPr>
+      </w:pPr>
+      <w:r>
+        <w:rPr>
+          <w:rFonts w:eastAsia="Times New Roman" w:cs="Times New Roman" w:ascii="Garamond" w:hAnsi="Garamond"/>
+          <w:color w:val="000000"/>
+          <w:kern w:val="0"/>
+          <w:sz w:val="36"/>
+          <w:szCs w:val="36"/>
+          <w:shd w:fill="auto" w:val="clear"/>
+          <w:lang w:val="en-US" w:eastAsia="zh-CN" w:bidi="hi-IN"/>
+        </w:rPr>
+      </w:r>
+    </w:p>
+    <w:p>
+      <w:pPr>
+        <w:pStyle w:val="Normal"/>
+        <w:jc w:val="both"/>
+        <w:rPr>
           <w:u w:val="single"/>
-          <w:shd w:fill="auto" w:val="clear"/>
-          <w:lang w:val="en-US" w:eastAsia="zh-CN" w:bidi="hi-IN"/>
         </w:rPr>
       </w:pPr>
       <w:r>
@@ -2560,7 +3460,7 @@
           <w:shd w:fill="auto" w:val="clear"/>
           <w:lang w:val="en-US" w:eastAsia="zh-CN" w:bidi="hi-IN"/>
         </w:rPr>
-        <w:t>Instruções de Lázaro</w:t>
+        <w:t>Instruções de Emmanuel</w:t>
       </w:r>
     </w:p>
     <w:p>
@@ -2572,26 +3472,21 @@
         </w:numPr>
         <w:jc w:val="both"/>
         <w:rPr>
-          <w:rFonts w:ascii="Garamond" w:hAnsi="Garamond" w:eastAsia="Times New Roman" w:cs="Times New Roman"/>
-          <w:color w:val="000000"/>
-          <w:kern w:val="0"/>
-          <w:sz w:val="36"/>
-          <w:szCs w:val="36"/>
-          <w:shd w:fill="auto" w:val="clear"/>
-          <w:lang w:val="en-US" w:eastAsia="zh-CN" w:bidi="hi-IN"/>
-        </w:rPr>
-      </w:pPr>
-      <w:r>
-        <w:rPr>
-          <w:rFonts w:eastAsia="Times New Roman" w:cs="Times New Roman" w:ascii="Garamond" w:hAnsi="Garamond"/>
-          <w:color w:val="000000"/>
-          <w:kern w:val="0"/>
-          <w:sz w:val="36"/>
-          <w:szCs w:val="36"/>
-          <w:shd w:fill="auto" w:val="clear"/>
-          <w:lang w:val="en-US" w:eastAsia="zh-CN" w:bidi="hi-IN"/>
-        </w:rPr>
-        <w:t>no início o homem só tem instintos. Quando mais avançado, adquire sensações. Quando instruído e depurado, possui sentimentos;</w:t>
+          <w:u w:val="none"/>
+        </w:rPr>
+      </w:pPr>
+      <w:r>
+        <w:rPr>
+          <w:rFonts w:eastAsia="Times New Roman" w:cs="Times New Roman" w:ascii="Garamond" w:hAnsi="Garamond"/>
+          <w:color w:val="000000"/>
+          <w:kern w:val="0"/>
+          <w:sz w:val="36"/>
+          <w:szCs w:val="36"/>
+          <w:u w:val="none"/>
+          <w:shd w:fill="auto" w:val="clear"/>
+          <w:lang w:val="en-US" w:eastAsia="zh-CN" w:bidi="hi-IN"/>
+        </w:rPr>
+        <w:t>O egoísmo é o grande inimigo do homem. É contra ele que devemos voltar todos os nossos esforços, toda a nossa coragem porque esse combate representa uma luta nossa contra nós mesmos;</w:t>
       </w:r>
     </w:p>
     <w:p>
@@ -2603,26 +3498,21 @@
         </w:numPr>
         <w:jc w:val="both"/>
         <w:rPr>
-          <w:rFonts w:ascii="Garamond" w:hAnsi="Garamond" w:eastAsia="Times New Roman" w:cs="Times New Roman"/>
-          <w:color w:val="000000"/>
-          <w:kern w:val="0"/>
-          <w:sz w:val="36"/>
-          <w:szCs w:val="36"/>
-          <w:shd w:fill="auto" w:val="clear"/>
-          <w:lang w:val="en-US" w:eastAsia="zh-CN" w:bidi="hi-IN"/>
-        </w:rPr>
-      </w:pPr>
-      <w:r>
-        <w:rPr>
-          <w:rFonts w:eastAsia="Times New Roman" w:cs="Times New Roman" w:ascii="Garamond" w:hAnsi="Garamond"/>
-          <w:color w:val="000000"/>
-          <w:kern w:val="0"/>
-          <w:sz w:val="36"/>
-          <w:szCs w:val="36"/>
-          <w:shd w:fill="auto" w:val="clear"/>
-          <w:lang w:val="en-US" w:eastAsia="zh-CN" w:bidi="hi-IN"/>
-        </w:rPr>
-        <w:t>o amor é o ápice dos sentimentos humanos. Não o amor como costumamos entender, mas o amor que concentra em si todas as melhores e mais belas virtudes humanas: caridade, humildade, benevolência, indulgência, paciência, abnegação, resignação entre outras;</w:t>
+          <w:u w:val="none"/>
+        </w:rPr>
+      </w:pPr>
+      <w:r>
+        <w:rPr>
+          <w:rFonts w:eastAsia="Times New Roman" w:cs="Times New Roman" w:ascii="Garamond" w:hAnsi="Garamond"/>
+          <w:color w:val="000000"/>
+          <w:kern w:val="0"/>
+          <w:sz w:val="36"/>
+          <w:szCs w:val="36"/>
+          <w:u w:val="none"/>
+          <w:shd w:fill="auto" w:val="clear"/>
+          <w:lang w:val="en-US" w:eastAsia="zh-CN" w:bidi="hi-IN"/>
+        </w:rPr>
+        <w:t>como sempre nos é dito: o egoísmo e o orgulho são as maiores chagas da humanidade;</w:t>
       </w:r>
     </w:p>
     <w:p>
@@ -2634,6 +3524,28 @@
         </w:numPr>
         <w:jc w:val="both"/>
         <w:rPr>
+          <w:u w:val="none"/>
+        </w:rPr>
+      </w:pPr>
+      <w:r>
+        <w:rPr>
+          <w:rFonts w:eastAsia="Times New Roman" w:cs="Times New Roman" w:ascii="Garamond" w:hAnsi="Garamond"/>
+          <w:color w:val="000000"/>
+          <w:kern w:val="0"/>
+          <w:sz w:val="36"/>
+          <w:szCs w:val="36"/>
+          <w:u w:val="none"/>
+          <w:shd w:fill="auto" w:val="clear"/>
+          <w:lang w:val="en-US" w:eastAsia="zh-CN" w:bidi="hi-IN"/>
+        </w:rPr>
+        <w:t>o Cristianismo ainda não conseguiu cumprir sua missão porque o homem, vencido pelo egoísmo, não pratica a caridade</w:t>
+      </w:r>
+    </w:p>
+    <w:p>
+      <w:pPr>
+        <w:pStyle w:val="Normal"/>
+        <w:jc w:val="both"/>
+        <w:rPr>
           <w:rFonts w:ascii="Garamond" w:hAnsi="Garamond" w:eastAsia="Times New Roman" w:cs="Times New Roman"/>
           <w:color w:val="000000"/>
           <w:kern w:val="0"/>
@@ -2653,141 +3565,14 @@
           <w:shd w:fill="auto" w:val="clear"/>
           <w:lang w:val="en-US" w:eastAsia="zh-CN" w:bidi="hi-IN"/>
         </w:rPr>
-        <w:t>todos nós temos algumas dessas virtudes, mas para a maioria de nós elas não estão completamente desenvolvidas. Isso é natural considerando o atual estágio evolutivo em que nos encontramos;</w:t>
-      </w:r>
-    </w:p>
-    <w:p>
-      <w:pPr>
-        <w:pStyle w:val="Normal"/>
-        <w:numPr>
-          <w:ilvl w:val="0"/>
-          <w:numId w:val="11"/>
-        </w:numPr>
-        <w:jc w:val="both"/>
-        <w:rPr>
-          <w:rFonts w:ascii="Garamond" w:hAnsi="Garamond" w:eastAsia="Times New Roman" w:cs="Times New Roman"/>
-          <w:color w:val="000000"/>
-          <w:kern w:val="0"/>
-          <w:sz w:val="36"/>
-          <w:szCs w:val="36"/>
-          <w:shd w:fill="auto" w:val="clear"/>
-          <w:lang w:val="en-US" w:eastAsia="zh-CN" w:bidi="hi-IN"/>
-        </w:rPr>
-      </w:pPr>
-      <w:r>
-        <w:rPr>
-          <w:rFonts w:eastAsia="Times New Roman" w:cs="Times New Roman" w:ascii="Garamond" w:hAnsi="Garamond"/>
-          <w:color w:val="000000"/>
-          <w:kern w:val="0"/>
-          <w:sz w:val="36"/>
-          <w:szCs w:val="36"/>
-          <w:shd w:fill="auto" w:val="clear"/>
-          <w:lang w:val="en-US" w:eastAsia="zh-CN" w:bidi="hi-IN"/>
-        </w:rPr>
-        <w:t>aprender a amar - seja a Deus, ao próximo ou a nós mesmos - é exercitar, aprimorar, desenvolver a cada dia cada uma das virtudes humanas;</w:t>
-      </w:r>
-    </w:p>
-    <w:p>
-      <w:pPr>
-        <w:pStyle w:val="Normal"/>
-        <w:numPr>
-          <w:ilvl w:val="0"/>
-          <w:numId w:val="11"/>
-        </w:numPr>
-        <w:jc w:val="both"/>
-        <w:rPr>
-          <w:rFonts w:ascii="Garamond" w:hAnsi="Garamond" w:eastAsia="Times New Roman" w:cs="Times New Roman"/>
-          <w:color w:val="000000"/>
-          <w:kern w:val="0"/>
-          <w:sz w:val="36"/>
-          <w:szCs w:val="36"/>
-          <w:shd w:fill="auto" w:val="clear"/>
-          <w:lang w:val="en-US" w:eastAsia="zh-CN" w:bidi="hi-IN"/>
-        </w:rPr>
-      </w:pPr>
-      <w:r>
-        <w:rPr>
-          <w:rFonts w:eastAsia="Times New Roman" w:cs="Times New Roman" w:ascii="Garamond" w:hAnsi="Garamond"/>
-          <w:color w:val="000000"/>
-          <w:kern w:val="0"/>
-          <w:sz w:val="36"/>
-          <w:szCs w:val="36"/>
-          <w:shd w:fill="auto" w:val="clear"/>
-          <w:lang w:val="en-US" w:eastAsia="zh-CN" w:bidi="hi-IN"/>
-        </w:rPr>
-        <w:t>assim, quando procuramos ser mais humildes, mais pacientes, mais caridosos, mais resignados, nós estamos, na verdade, aprendendo a amar um pouco mais;</w:t>
-      </w:r>
-    </w:p>
-    <w:p>
-      <w:pPr>
-        <w:pStyle w:val="Normal"/>
-        <w:numPr>
-          <w:ilvl w:val="0"/>
-          <w:numId w:val="11"/>
-        </w:numPr>
-        <w:jc w:val="both"/>
-        <w:rPr>
-          <w:rFonts w:ascii="Garamond" w:hAnsi="Garamond" w:eastAsia="Times New Roman" w:cs="Times New Roman"/>
-          <w:color w:val="000000"/>
-          <w:kern w:val="0"/>
-          <w:sz w:val="36"/>
-          <w:szCs w:val="36"/>
-          <w:shd w:fill="auto" w:val="clear"/>
-          <w:lang w:val="en-US" w:eastAsia="zh-CN" w:bidi="hi-IN"/>
-        </w:rPr>
-      </w:pPr>
-      <w:r>
-        <w:rPr>
-          <w:rFonts w:eastAsia="Times New Roman" w:cs="Times New Roman" w:ascii="Garamond" w:hAnsi="Garamond"/>
-          <w:color w:val="000000"/>
-          <w:kern w:val="0"/>
-          <w:sz w:val="36"/>
-          <w:szCs w:val="36"/>
-          <w:shd w:fill="auto" w:val="clear"/>
-          <w:lang w:val="en-US" w:eastAsia="zh-CN" w:bidi="hi-IN"/>
-        </w:rPr>
-        <w:t>Jesus é nosso Mestre, guia e modelo. Ele possui todas as virtudes humanas em seu grau máximo. Por isso Ele ama a Deus e a todos nós em plenitude. Também por isso Ele nos disse que o mandamento maior encerra em si toda a lei e todos os profetas;</w:t>
-      </w:r>
-    </w:p>
-    <w:p>
-      <w:pPr>
-        <w:pStyle w:val="Normal"/>
-        <w:jc w:val="both"/>
-        <w:rPr>
-          <w:rFonts w:ascii="Garamond" w:hAnsi="Garamond" w:eastAsia="Times New Roman" w:cs="Times New Roman"/>
-          <w:color w:val="000000"/>
-          <w:kern w:val="0"/>
-          <w:sz w:val="36"/>
-          <w:szCs w:val="36"/>
-          <w:shd w:fill="auto" w:val="clear"/>
-          <w:lang w:val="en-US" w:eastAsia="zh-CN" w:bidi="hi-IN"/>
-        </w:rPr>
-      </w:pPr>
-      <w:r>
-        <w:rPr>
-          <w:rFonts w:eastAsia="Times New Roman" w:cs="Times New Roman" w:ascii="Garamond" w:hAnsi="Garamond"/>
-          <w:color w:val="000000"/>
-          <w:kern w:val="0"/>
-          <w:sz w:val="36"/>
-          <w:szCs w:val="36"/>
-          <w:shd w:fill="auto" w:val="clear"/>
-          <w:lang w:val="en-US" w:eastAsia="zh-CN" w:bidi="hi-IN"/>
-        </w:rPr>
-      </w:r>
-    </w:p>
-    <w:p>
-      <w:pPr>
-        <w:pStyle w:val="Normal"/>
-        <w:jc w:val="both"/>
-        <w:rPr>
-          <w:rFonts w:ascii="Garamond" w:hAnsi="Garamond" w:eastAsia="Times New Roman" w:cs="Times New Roman"/>
-          <w:color w:val="000000"/>
-          <w:kern w:val="0"/>
-          <w:sz w:val="36"/>
-          <w:szCs w:val="36"/>
+      </w:r>
+    </w:p>
+    <w:p>
+      <w:pPr>
+        <w:pStyle w:val="Normal"/>
+        <w:jc w:val="both"/>
+        <w:rPr>
           <w:u w:val="single"/>
-          <w:shd w:fill="auto" w:val="clear"/>
-          <w:lang w:val="en-US" w:eastAsia="zh-CN" w:bidi="hi-IN"/>
         </w:rPr>
       </w:pPr>
       <w:r>
@@ -2801,7 +3586,7 @@
           <w:shd w:fill="auto" w:val="clear"/>
           <w:lang w:val="en-US" w:eastAsia="zh-CN" w:bidi="hi-IN"/>
         </w:rPr>
-        <w:t>Instruções de Fénelon</w:t>
+        <w:t>Instruções de Pascal</w:t>
       </w:r>
     </w:p>
     <w:p>
@@ -2813,26 +3598,21 @@
         </w:numPr>
         <w:jc w:val="both"/>
         <w:rPr>
-          <w:rFonts w:ascii="Garamond" w:hAnsi="Garamond" w:eastAsia="Times New Roman" w:cs="Times New Roman"/>
-          <w:color w:val="000000"/>
-          <w:kern w:val="0"/>
-          <w:sz w:val="36"/>
-          <w:szCs w:val="36"/>
-          <w:shd w:fill="auto" w:val="clear"/>
-          <w:lang w:val="en-US" w:eastAsia="zh-CN" w:bidi="hi-IN"/>
-        </w:rPr>
-      </w:pPr>
-      <w:r>
-        <w:rPr>
-          <w:rFonts w:eastAsia="Times New Roman" w:cs="Times New Roman" w:ascii="Garamond" w:hAnsi="Garamond"/>
-          <w:color w:val="000000"/>
-          <w:kern w:val="0"/>
-          <w:sz w:val="36"/>
-          <w:szCs w:val="36"/>
-          <w:shd w:fill="auto" w:val="clear"/>
-          <w:lang w:val="en-US" w:eastAsia="zh-CN" w:bidi="hi-IN"/>
-        </w:rPr>
-        <w:t>para convertermos os instintos em sentimentos nobres precisamos desenvolver a moral e a inteligência;</w:t>
+          <w:u w:val="none"/>
+        </w:rPr>
+      </w:pPr>
+      <w:r>
+        <w:rPr>
+          <w:rFonts w:eastAsia="Times New Roman" w:cs="Times New Roman" w:ascii="Garamond" w:hAnsi="Garamond"/>
+          <w:color w:val="000000"/>
+          <w:kern w:val="0"/>
+          <w:sz w:val="36"/>
+          <w:szCs w:val="36"/>
+          <w:u w:val="none"/>
+          <w:shd w:fill="auto" w:val="clear"/>
+          <w:lang w:val="en-US" w:eastAsia="zh-CN" w:bidi="hi-IN"/>
+        </w:rPr>
+        <w:t>Jesus jamais deixou de auxiliar aqueles que o procuraram; da mulher adúltera ao criminoso, o Mestre auxiliou a todos com amor incondicional</w:t>
       </w:r>
     </w:p>
     <w:p>
@@ -2844,26 +3624,21 @@
         </w:numPr>
         <w:jc w:val="both"/>
         <w:rPr>
-          <w:rFonts w:ascii="Garamond" w:hAnsi="Garamond" w:eastAsia="Times New Roman" w:cs="Times New Roman"/>
-          <w:color w:val="000000"/>
-          <w:kern w:val="0"/>
-          <w:sz w:val="36"/>
-          <w:szCs w:val="36"/>
-          <w:shd w:fill="auto" w:val="clear"/>
-          <w:lang w:val="en-US" w:eastAsia="zh-CN" w:bidi="hi-IN"/>
-        </w:rPr>
-      </w:pPr>
-      <w:r>
-        <w:rPr>
-          <w:rFonts w:eastAsia="Times New Roman" w:cs="Times New Roman" w:ascii="Garamond" w:hAnsi="Garamond"/>
-          <w:color w:val="000000"/>
-          <w:kern w:val="0"/>
-          <w:sz w:val="36"/>
-          <w:szCs w:val="36"/>
-          <w:shd w:fill="auto" w:val="clear"/>
-          <w:lang w:val="en-US" w:eastAsia="zh-CN" w:bidi="hi-IN"/>
-        </w:rPr>
-        <w:t>o verdadeiro amor transcende os laços consanguineos e sociais. Amar ao próximo significa amar a todos indistintamente. É ainda uma condição muito distante de nós, mas uma condição que alcançaremos um dia desde que nos esforcemos para amar um pouco mais a cada dia;</w:t>
+          <w:u w:val="none"/>
+        </w:rPr>
+      </w:pPr>
+      <w:r>
+        <w:rPr>
+          <w:rFonts w:eastAsia="Times New Roman" w:cs="Times New Roman" w:ascii="Garamond" w:hAnsi="Garamond"/>
+          <w:color w:val="000000"/>
+          <w:kern w:val="0"/>
+          <w:sz w:val="36"/>
+          <w:szCs w:val="36"/>
+          <w:u w:val="none"/>
+          <w:shd w:fill="auto" w:val="clear"/>
+          <w:lang w:val="en-US" w:eastAsia="zh-CN" w:bidi="hi-IN"/>
+        </w:rPr>
+        <w:t>no trabalho no bem não devemos nos deixar abalar por aqueles que nos menosprezam. Cabe a nós seguirmos determinados em nossos compromissos com o Cristo, certos de que Deus, em tempo oportuno, fará com que Sua justiça se cumpra;</w:t>
       </w:r>
     </w:p>
     <w:p>
@@ -2875,6 +3650,28 @@
         </w:numPr>
         <w:jc w:val="both"/>
         <w:rPr>
+          <w:u w:val="none"/>
+        </w:rPr>
+      </w:pPr>
+      <w:r>
+        <w:rPr>
+          <w:rFonts w:eastAsia="Times New Roman" w:cs="Times New Roman" w:ascii="Garamond" w:hAnsi="Garamond"/>
+          <w:color w:val="000000"/>
+          <w:kern w:val="0"/>
+          <w:sz w:val="36"/>
+          <w:szCs w:val="36"/>
+          <w:u w:val="none"/>
+          <w:shd w:fill="auto" w:val="clear"/>
+          <w:lang w:val="en-US" w:eastAsia="zh-CN" w:bidi="hi-IN"/>
+        </w:rPr>
+        <w:t>Pascal fala de uma situação extremamente atual: enquanto o orgulho e o egoísmo imperarem no mundo, a humanidade continuará vendo a vitória dos mais espertos, dos desonestos e dos injustos; os laços de amizade e até mesmo os laços de família continuarão sendo rompidos pelos interesses pessoais</w:t>
+      </w:r>
+    </w:p>
+    <w:p>
+      <w:pPr>
+        <w:pStyle w:val="Normal"/>
+        <w:jc w:val="both"/>
+        <w:rPr>
           <w:rFonts w:ascii="Garamond" w:hAnsi="Garamond" w:eastAsia="Times New Roman" w:cs="Times New Roman"/>
           <w:color w:val="000000"/>
           <w:kern w:val="0"/>
@@ -2894,95 +3691,6 @@
           <w:shd w:fill="auto" w:val="clear"/>
           <w:lang w:val="en-US" w:eastAsia="zh-CN" w:bidi="hi-IN"/>
         </w:rPr>
-        <w:t>enfatizar a diferença que existe entre "não fazer aos outros o que não queremos que eles nos façam" e "fazer aos outros o que queremos que eles nos façam". A primeira condição nos coloca numa situação de inatividade; a segunda nos torna agentes do bem;</w:t>
-      </w:r>
-    </w:p>
-    <w:p>
-      <w:pPr>
-        <w:pStyle w:val="Normal"/>
-        <w:numPr>
-          <w:ilvl w:val="0"/>
-          <w:numId w:val="12"/>
-        </w:numPr>
-        <w:jc w:val="both"/>
-        <w:rPr>
-          <w:rFonts w:ascii="Garamond" w:hAnsi="Garamond" w:eastAsia="Times New Roman" w:cs="Times New Roman"/>
-          <w:color w:val="000000"/>
-          <w:kern w:val="0"/>
-          <w:sz w:val="36"/>
-          <w:szCs w:val="36"/>
-          <w:shd w:fill="auto" w:val="clear"/>
-          <w:lang w:val="en-US" w:eastAsia="zh-CN" w:bidi="hi-IN"/>
-        </w:rPr>
-      </w:pPr>
-      <w:r>
-        <w:rPr>
-          <w:rFonts w:eastAsia="Times New Roman" w:cs="Times New Roman" w:ascii="Garamond" w:hAnsi="Garamond"/>
-          <w:color w:val="000000"/>
-          <w:kern w:val="0"/>
-          <w:sz w:val="36"/>
-          <w:szCs w:val="36"/>
-          <w:shd w:fill="auto" w:val="clear"/>
-          <w:lang w:val="en-US" w:eastAsia="zh-CN" w:bidi="hi-IN"/>
-        </w:rPr>
-        <w:t>vivemos tempos difíceis, turbulentos. Há muito egoísmo, muitos corações endurecidos. Tais corações somente podem sensibilizados pelo amor verdadeiro. Ainda que eles insistam em permanecer na frieza e na indiferença, a seu tempo todos serão convertidos;</w:t>
-      </w:r>
-    </w:p>
-    <w:p>
-      <w:pPr>
-        <w:pStyle w:val="Normal"/>
-        <w:numPr>
-          <w:ilvl w:val="0"/>
-          <w:numId w:val="12"/>
-        </w:numPr>
-        <w:jc w:val="both"/>
-        <w:rPr>
-          <w:rFonts w:ascii="Garamond" w:hAnsi="Garamond" w:eastAsia="Times New Roman" w:cs="Times New Roman"/>
-          <w:color w:val="000000"/>
-          <w:kern w:val="0"/>
-          <w:sz w:val="36"/>
-          <w:szCs w:val="36"/>
-          <w:shd w:fill="auto" w:val="clear"/>
-          <w:lang w:val="en-US" w:eastAsia="zh-CN" w:bidi="hi-IN"/>
-        </w:rPr>
-      </w:pPr>
-      <w:r>
-        <w:rPr>
-          <w:rFonts w:eastAsia="Times New Roman" w:cs="Times New Roman" w:ascii="Garamond" w:hAnsi="Garamond"/>
-          <w:color w:val="000000"/>
-          <w:kern w:val="0"/>
-          <w:sz w:val="36"/>
-          <w:szCs w:val="36"/>
-          <w:shd w:fill="auto" w:val="clear"/>
-          <w:lang w:val="en-US" w:eastAsia="zh-CN" w:bidi="hi-IN"/>
-        </w:rPr>
-        <w:t>portanto, se desejamos transformar o mundo para melhor, o exemplo do amor é a melhor e mais poderosa ferramenta de que dispomos;</w:t>
-      </w:r>
-    </w:p>
-    <w:p>
-      <w:pPr>
-        <w:pStyle w:val="Normal"/>
-        <w:jc w:val="both"/>
-        <w:rPr>
-          <w:rFonts w:ascii="Garamond" w:hAnsi="Garamond" w:eastAsia="Times New Roman" w:cs="Times New Roman"/>
-          <w:color w:val="000000"/>
-          <w:kern w:val="0"/>
-          <w:sz w:val="36"/>
-          <w:szCs w:val="36"/>
-          <w:shd w:fill="auto" w:val="clear"/>
-          <w:lang w:val="en-US" w:eastAsia="zh-CN" w:bidi="hi-IN"/>
-        </w:rPr>
-      </w:pPr>
-      <w:r>
-        <w:rPr>
-          <w:rFonts w:eastAsia="Times New Roman" w:cs="Times New Roman" w:ascii="Garamond" w:hAnsi="Garamond"/>
-          <w:color w:val="000000"/>
-          <w:kern w:val="0"/>
-          <w:sz w:val="36"/>
-          <w:szCs w:val="36"/>
-          <w:shd w:fill="auto" w:val="clear"/>
-          <w:lang w:val="en-US" w:eastAsia="zh-CN" w:bidi="hi-IN"/>
-        </w:rPr>
       </w:r>
     </w:p>
     <w:p>
@@ -3004,7 +3712,7 @@
           <w:shd w:fill="auto" w:val="clear"/>
           <w:lang w:val="en-US" w:eastAsia="zh-CN" w:bidi="hi-IN"/>
         </w:rPr>
-        <w:t>Instruções de Emmanuel</w:t>
+        <w:t>Instruções do Espírito Protetor</w:t>
       </w:r>
     </w:p>
     <w:p>
@@ -3030,7 +3738,7 @@
           <w:shd w:fill="auto" w:val="clear"/>
           <w:lang w:val="en-US" w:eastAsia="zh-CN" w:bidi="hi-IN"/>
         </w:rPr>
-        <w:t>O egoísmo é o grande inimigo do homem. É contra ele que devemos voltar todos os nossos esforços, toda a nossa coragem porque esse combate representa uma luta nossa contra nós mesmos;</w:t>
+        <w:t>a caridade duradoura só existe quando sustentada pela fé porque a prática da caridade exige sacrifício, renúncia, abnegação, virtudes que somente a fé verdadeira dá ao homem;</w:t>
       </w:r>
     </w:p>
     <w:p>
@@ -3056,7 +3764,7 @@
           <w:shd w:fill="auto" w:val="clear"/>
           <w:lang w:val="en-US" w:eastAsia="zh-CN" w:bidi="hi-IN"/>
         </w:rPr>
-        <w:t>como sempre nos é dito: o egoísmo e o orgulho são as maiores chagas da humanidade;</w:t>
+        <w:t>o homem tem que sacrificar seus interesses mundanos para construir a felicidade;</w:t>
       </w:r>
     </w:p>
     <w:p>
@@ -3082,7 +3790,7 @@
           <w:shd w:fill="auto" w:val="clear"/>
           <w:lang w:val="en-US" w:eastAsia="zh-CN" w:bidi="hi-IN"/>
         </w:rPr>
-        <w:t>o Cristianismo ainda não conseguiu cumprir sua missão porque o homem, vencido pelo egoísmo, não pratica a caridade</w:t>
+        <w:t>embora em vários países, cristãos estejam sendo mortos, relembrando os circos da Roma antiga, o sacrifício  que nos é pedido hoje é o do egoísmo, do orgulho e da vaidade</w:t>
       </w:r>
     </w:p>
     <w:p>
@@ -3130,16 +3838,12 @@
           <w:shd w:fill="auto" w:val="clear"/>
           <w:lang w:val="en-US" w:eastAsia="zh-CN" w:bidi="hi-IN"/>
         </w:rPr>
-        <w:t>Instruções de Pascal</w:t>
-      </w:r>
-    </w:p>
-    <w:p>
-      <w:pPr>
-        <w:pStyle w:val="Normal"/>
-        <w:numPr>
-          <w:ilvl w:val="0"/>
-          <w:numId w:val="14"/>
-        </w:numPr>
+        <w:t>Instruções de Isabel de França</w:t>
+      </w:r>
+    </w:p>
+    <w:p>
+      <w:pPr>
+        <w:pStyle w:val="Normal"/>
         <w:jc w:val="both"/>
         <w:rPr>
           <w:u w:val="none"/>
@@ -3156,16 +3860,12 @@
           <w:shd w:fill="auto" w:val="clear"/>
           <w:lang w:val="en-US" w:eastAsia="zh-CN" w:bidi="hi-IN"/>
         </w:rPr>
-        <w:t>Jesus jamais deixou de auxiliar aqueles que o procuraram; da mulher adúltera ao criminoso, o Mestre auxiliou a todos com amor incondicional</w:t>
-      </w:r>
-    </w:p>
-    <w:p>
-      <w:pPr>
-        <w:pStyle w:val="Normal"/>
-        <w:numPr>
-          <w:ilvl w:val="0"/>
-          <w:numId w:val="14"/>
-        </w:numPr>
+        <w:t>Esse Espírito trata de uma questão extremamente delicada: a caridade para com os criminosos. Isso é particularmente delicado para nós, brasileiros. Infelizmente, durante décadas temos visto assassinos, estupradores, sequestradores, corruptos sendo colocados em liberdade, a despeito da gravidade e do números de crimes comprovadamente cometidos por eles. A segurança pública é hoje, indiscutivelmente, um dos maiores problemas que  a sociedade brasileira tem enfrentado.</w:t>
+      </w:r>
+    </w:p>
+    <w:p>
+      <w:pPr>
+        <w:pStyle w:val="Normal"/>
         <w:jc w:val="both"/>
         <w:rPr>
           <w:u w:val="none"/>
@@ -3182,16 +3882,12 @@
           <w:shd w:fill="auto" w:val="clear"/>
           <w:lang w:val="en-US" w:eastAsia="zh-CN" w:bidi="hi-IN"/>
         </w:rPr>
-        <w:t>no trabalho no bem não devemos nos deixar abalar por aqueles que nos menosprezam. Cabe a nós seguirmos determinados em nossos compromissos com o Cristo, certos de que Deus, em tempo oportuno, fará com que Sua justiça se cumpra;</w:t>
-      </w:r>
-    </w:p>
-    <w:p>
-      <w:pPr>
-        <w:pStyle w:val="Normal"/>
-        <w:numPr>
-          <w:ilvl w:val="0"/>
-          <w:numId w:val="14"/>
-        </w:numPr>
+        <w:t>Diante desse cenário é muito difícil para nós termos o  sentimento da caridade para com os criminosos. Entretanto, é exatamente isso que Jesus espera de nós.</w:t>
+      </w:r>
+    </w:p>
+    <w:p>
+      <w:pPr>
+        <w:pStyle w:val="Normal"/>
         <w:jc w:val="both"/>
         <w:rPr>
           <w:u w:val="none"/>
@@ -3208,64 +3904,12 @@
           <w:shd w:fill="auto" w:val="clear"/>
           <w:lang w:val="en-US" w:eastAsia="zh-CN" w:bidi="hi-IN"/>
         </w:rPr>
-        <w:t>Pascal fala de uma situação extremamente atual: enquanto o orgulho e o egoísmo imperarem no mundo, a humanidade continuará vendo a vitória dos mais espertos, dos desonestos e dos injustos; os laços de amizade e até mesmo os laços de família continuarão sendo rompidos pelos interesses pessoais</w:t>
-      </w:r>
-    </w:p>
-    <w:p>
-      <w:pPr>
-        <w:pStyle w:val="Normal"/>
-        <w:jc w:val="both"/>
-        <w:rPr>
-          <w:rFonts w:ascii="Garamond" w:hAnsi="Garamond" w:eastAsia="Times New Roman" w:cs="Times New Roman"/>
-          <w:color w:val="000000"/>
-          <w:kern w:val="0"/>
-          <w:sz w:val="36"/>
-          <w:szCs w:val="36"/>
-          <w:shd w:fill="auto" w:val="clear"/>
-          <w:lang w:val="en-US" w:eastAsia="zh-CN" w:bidi="hi-IN"/>
-        </w:rPr>
-      </w:pPr>
-      <w:r>
-        <w:rPr>
-          <w:rFonts w:eastAsia="Times New Roman" w:cs="Times New Roman" w:ascii="Garamond" w:hAnsi="Garamond"/>
-          <w:color w:val="000000"/>
-          <w:kern w:val="0"/>
-          <w:sz w:val="36"/>
-          <w:szCs w:val="36"/>
-          <w:shd w:fill="auto" w:val="clear"/>
-          <w:lang w:val="en-US" w:eastAsia="zh-CN" w:bidi="hi-IN"/>
-        </w:rPr>
-      </w:r>
-    </w:p>
-    <w:p>
-      <w:pPr>
-        <w:pStyle w:val="Normal"/>
-        <w:jc w:val="both"/>
-        <w:rPr>
-          <w:u w:val="single"/>
-        </w:rPr>
-      </w:pPr>
-      <w:r>
-        <w:rPr>
-          <w:rFonts w:eastAsia="Times New Roman" w:cs="Times New Roman" w:ascii="Garamond" w:hAnsi="Garamond"/>
-          <w:color w:val="000000"/>
-          <w:kern w:val="0"/>
-          <w:sz w:val="36"/>
-          <w:szCs w:val="36"/>
-          <w:u w:val="single"/>
-          <w:shd w:fill="auto" w:val="clear"/>
-          <w:lang w:val="en-US" w:eastAsia="zh-CN" w:bidi="hi-IN"/>
-        </w:rPr>
-        <w:t>Instruções do Espírito Protetor</w:t>
-      </w:r>
-    </w:p>
-    <w:p>
-      <w:pPr>
-        <w:pStyle w:val="Normal"/>
-        <w:numPr>
-          <w:ilvl w:val="0"/>
-          <w:numId w:val="15"/>
-        </w:numPr>
+        <w:t>Isabel nos diz que, se Jesus visse junto a nós um desses piores criminosos dos dias de hoje, Jesus o consideraria um doente digno de piedade e estenderia a ele uma mão amiga. Isabel diz ainda que nós não temos condições de agir como Jesus. Entretanto, podemos orar por aquele criminoso e talvez, sob o influxo de nossas orações ele seja tocado de arrependimento e inicie desde já a transformação para abandonar a vida de crimes.</w:t>
+      </w:r>
+    </w:p>
+    <w:p>
+      <w:pPr>
+        <w:pStyle w:val="Normal"/>
         <w:jc w:val="both"/>
         <w:rPr>
           <w:u w:val="none"/>
@@ -3282,16 +3926,12 @@
           <w:shd w:fill="auto" w:val="clear"/>
           <w:lang w:val="en-US" w:eastAsia="zh-CN" w:bidi="hi-IN"/>
         </w:rPr>
-        <w:t>a caridade duradoura só existe quando sustentada pela fé porque a prática da caridade exige sacrifício, renúncia, abnegação, virtudes que somente a fé verdadeira dá ao homem;</w:t>
-      </w:r>
-    </w:p>
-    <w:p>
-      <w:pPr>
-        <w:pStyle w:val="Normal"/>
-        <w:numPr>
-          <w:ilvl w:val="0"/>
-          <w:numId w:val="15"/>
-        </w:numPr>
+        <w:t>Mas, sejamos sinceros: até mesmo orar pelos criminosos é algo difícil para nós. Porém, precisamos tentar. É uma barreira interior que, com o tempo e a prática, conseguiremos transpor.</w:t>
+      </w:r>
+    </w:p>
+    <w:p>
+      <w:pPr>
+        <w:pStyle w:val="Normal"/>
         <w:jc w:val="both"/>
         <w:rPr>
           <w:u w:val="none"/>
@@ -3308,16 +3948,12 @@
           <w:shd w:fill="auto" w:val="clear"/>
           <w:lang w:val="en-US" w:eastAsia="zh-CN" w:bidi="hi-IN"/>
         </w:rPr>
-        <w:t>o homem tem que sacrificar seus interesses mundanos para construir a felicidade;</w:t>
-      </w:r>
-    </w:p>
-    <w:p>
-      <w:pPr>
-        <w:pStyle w:val="Normal"/>
-        <w:numPr>
-          <w:ilvl w:val="0"/>
-          <w:numId w:val="15"/>
-        </w:numPr>
+        <w:t>Os mais jovens aqui muito provavelmente nunca ouviram falar de Daniela Perez. Ela era uma atriz que foi brutalmente assassinada pelo ator Guilherme de Pádua e a esposa dele. A mãe de Daniela, Glória Pereza, procurou Chico Xavier poucos dias depois do crime e o Chico disse a ela o seguinte: "Você, na posição de mãe, ainda não tem condições de conceder o perdão às pessoas que tiraram a vida de sua filha querida. Mas eu vou lhe pedir uma coisa: não permita que os algozes de sua filha sejam linchados".</w:t>
+      </w:r>
+    </w:p>
+    <w:p>
+      <w:pPr>
+        <w:pStyle w:val="Normal"/>
         <w:jc w:val="both"/>
         <w:rPr>
           <w:u w:val="none"/>
@@ -3334,55 +3970,7 @@
           <w:shd w:fill="auto" w:val="clear"/>
           <w:lang w:val="en-US" w:eastAsia="zh-CN" w:bidi="hi-IN"/>
         </w:rPr>
-        <w:t>embora em vários países, cristãos estejam sendo mortos, relembrando os circos da Roma antiga, o sacrifício  que nos é pedido hoje é o do egoísmo, do orgulho e da vaidade</w:t>
-      </w:r>
-    </w:p>
-    <w:p>
-      <w:pPr>
-        <w:pStyle w:val="Normal"/>
-        <w:jc w:val="both"/>
-        <w:rPr>
-          <w:rFonts w:ascii="Garamond" w:hAnsi="Garamond" w:eastAsia="Times New Roman" w:cs="Times New Roman"/>
-          <w:color w:val="000000"/>
-          <w:kern w:val="0"/>
-          <w:sz w:val="36"/>
-          <w:szCs w:val="36"/>
-          <w:shd w:fill="auto" w:val="clear"/>
-          <w:lang w:val="en-US" w:eastAsia="zh-CN" w:bidi="hi-IN"/>
-        </w:rPr>
-      </w:pPr>
-      <w:r>
-        <w:rPr>
-          <w:rFonts w:eastAsia="Times New Roman" w:cs="Times New Roman" w:ascii="Garamond" w:hAnsi="Garamond"/>
-          <w:color w:val="000000"/>
-          <w:kern w:val="0"/>
-          <w:sz w:val="36"/>
-          <w:szCs w:val="36"/>
-          <w:shd w:fill="auto" w:val="clear"/>
-          <w:lang w:val="en-US" w:eastAsia="zh-CN" w:bidi="hi-IN"/>
-        </w:rPr>
-      </w:r>
-    </w:p>
-    <w:p>
-      <w:pPr>
-        <w:pStyle w:val="Normal"/>
-        <w:jc w:val="both"/>
-        <w:rPr>
-          <w:u w:val="single"/>
-        </w:rPr>
-      </w:pPr>
-      <w:r>
-        <w:rPr>
-          <w:rFonts w:eastAsia="Times New Roman" w:cs="Times New Roman" w:ascii="Garamond" w:hAnsi="Garamond"/>
-          <w:color w:val="000000"/>
-          <w:kern w:val="0"/>
-          <w:sz w:val="36"/>
-          <w:szCs w:val="36"/>
-          <w:u w:val="single"/>
-          <w:shd w:fill="auto" w:val="clear"/>
-          <w:lang w:val="en-US" w:eastAsia="zh-CN" w:bidi="hi-IN"/>
-        </w:rPr>
-        <w:t>Instruções de Isabel de França</w:t>
+        <w:t>Havia um temor muito grande de que Guilherme e sua esposa fossem linchados devido à comoção nacional que o crime causou.</w:t>
       </w:r>
     </w:p>
     <w:p>
@@ -3404,7 +3992,7 @@
           <w:shd w:fill="auto" w:val="clear"/>
           <w:lang w:val="en-US" w:eastAsia="zh-CN" w:bidi="hi-IN"/>
         </w:rPr>
-        <w:t>Esse Espírito trata de uma questão extremamente delicada: a caridade para com os criminosos. Isso é particularmente delicado para nós, brasileiros. Infelizmente, durante décadas temos visto assassinos, estupradores, sequestradores, corruptos sendo colocados em liberdade, a despeito da gravidade e do números de crimes comprovadamente cometidos por eles. A segurança pública é hoje, indiscutivelmente, um dos maiores problemas que  a sociedade brasileira tem enfrentado.</w:t>
+        <w:t>Chico sabia que Glória Perez  não tinha condições de perdoar os assassinos de sua filha, mas sabia que, com a influência que Glória tinha - ela é uma escritora de novelas - seria possível evitar o linchamento.</w:t>
       </w:r>
     </w:p>
     <w:p>
@@ -3426,7 +4014,7 @@
           <w:shd w:fill="auto" w:val="clear"/>
           <w:lang w:val="en-US" w:eastAsia="zh-CN" w:bidi="hi-IN"/>
         </w:rPr>
-        <w:t>Diante desse cenário é muito difícil para nós termos o  sentimento da caridade para com os criminosos. Entretanto, é exatamente isso que Jesus espera de nós.</w:t>
+        <w:t>No dia seguinte ao encontro com Chico, Glória telefonouo para Eurípedes, filho adotivo de Chico e disse: "Avise ao Chico que o perdão ainda está muito difícil, mas eu vou trabalhar para que ninguém faça o linchamento".</w:t>
       </w:r>
     </w:p>
     <w:p>
@@ -3448,7 +4036,7 @@
           <w:shd w:fill="auto" w:val="clear"/>
           <w:lang w:val="en-US" w:eastAsia="zh-CN" w:bidi="hi-IN"/>
         </w:rPr>
-        <w:t>Isabel nos diz que, se Jesus visse junto a nós um desses piores criminosos dos dias de hoje, Jesus o consideraria um doente digno de piedade e estenderia a ele uma mão amiga. Isabel diz ainda que nós não temos condições de agir como Jesus. Entretanto, podemos orar por aquele criminoso e talvez, sob o influxo de nossas orações ele seja tocado de arrependimento e inicie desde já a transformação para abandonar a vida de crimes.</w:t>
+        <w:t>Foi um ato de nobreza espiritual de Glória Perez. Trabalhar para preservar a vida dos assassinos da filha dela. Não resta a menor dúvida  de que essa atitude exigiu dessa mãe um esforço e uma coragem gigantescos.</w:t>
       </w:r>
     </w:p>
     <w:p>
@@ -3470,139 +4058,7 @@
           <w:shd w:fill="auto" w:val="clear"/>
           <w:lang w:val="en-US" w:eastAsia="zh-CN" w:bidi="hi-IN"/>
         </w:rPr>
-        <w:t>Mas, sejamos sinceros: até mesmo orar pelos criminosos é algo difícil para nós. Porém, precisamos tentar. É uma barreira interior que, com o tempo e a prática, conseguiremos transpor.</w:t>
-      </w:r>
-    </w:p>
-    <w:p>
-      <w:pPr>
-        <w:pStyle w:val="Normal"/>
-        <w:jc w:val="both"/>
-        <w:rPr>
-          <w:u w:val="none"/>
-        </w:rPr>
-      </w:pPr>
-      <w:r>
-        <w:rPr>
-          <w:rFonts w:eastAsia="Times New Roman" w:cs="Times New Roman" w:ascii="Garamond" w:hAnsi="Garamond"/>
-          <w:color w:val="000000"/>
-          <w:kern w:val="0"/>
-          <w:sz w:val="36"/>
-          <w:szCs w:val="36"/>
-          <w:u w:val="none"/>
-          <w:shd w:fill="auto" w:val="clear"/>
-          <w:lang w:val="en-US" w:eastAsia="zh-CN" w:bidi="hi-IN"/>
-        </w:rPr>
-        <w:t>Os mais jovens aqui muito provavelmente nunca ouviram falar de Daniela Perez. Ela era uma atriz que foi brutalmente assassinada pelo ator Guilherme de Pádua e a esposa dele. A mãe de Daniela, Glória Pereza, procurou Chico Xavier poucos dias depois do crime e o Chico disse a ela o seguinte: "Você, na posição de mãe, ainda não tem condições de conceder o perdão às pessoas que tiraram a vida de sua filha querida. Mas eu vou lhe pedir uma coisa: não permita que os algozes de sua filha sejam linchados".</w:t>
-      </w:r>
-    </w:p>
-    <w:p>
-      <w:pPr>
-        <w:pStyle w:val="Normal"/>
-        <w:jc w:val="both"/>
-        <w:rPr>
-          <w:u w:val="none"/>
-        </w:rPr>
-      </w:pPr>
-      <w:r>
-        <w:rPr>
-          <w:rFonts w:eastAsia="Times New Roman" w:cs="Times New Roman" w:ascii="Garamond" w:hAnsi="Garamond"/>
-          <w:color w:val="000000"/>
-          <w:kern w:val="0"/>
-          <w:sz w:val="36"/>
-          <w:szCs w:val="36"/>
-          <w:u w:val="none"/>
-          <w:shd w:fill="auto" w:val="clear"/>
-          <w:lang w:val="en-US" w:eastAsia="zh-CN" w:bidi="hi-IN"/>
-        </w:rPr>
-        <w:t>Havia um temor muito grande de que Guilherme e sua esposa fossem linchados devido à comoção nacional que o crime causou.</w:t>
-      </w:r>
-    </w:p>
-    <w:p>
-      <w:pPr>
-        <w:pStyle w:val="Normal"/>
-        <w:jc w:val="both"/>
-        <w:rPr>
-          <w:u w:val="none"/>
-        </w:rPr>
-      </w:pPr>
-      <w:r>
-        <w:rPr>
-          <w:rFonts w:eastAsia="Times New Roman" w:cs="Times New Roman" w:ascii="Garamond" w:hAnsi="Garamond"/>
-          <w:color w:val="000000"/>
-          <w:kern w:val="0"/>
-          <w:sz w:val="36"/>
-          <w:szCs w:val="36"/>
-          <w:u w:val="none"/>
-          <w:shd w:fill="auto" w:val="clear"/>
-          <w:lang w:val="en-US" w:eastAsia="zh-CN" w:bidi="hi-IN"/>
-        </w:rPr>
-        <w:t>Chico sabia que Glória Perez  não tinha condições de perdoar os assassinos de sua filha, mas sabia que, com a influência que Glória tinha - ela é uma escritora de novelas - seria possível evitar o linchamento.</w:t>
-      </w:r>
-    </w:p>
-    <w:p>
-      <w:pPr>
-        <w:pStyle w:val="Normal"/>
-        <w:jc w:val="both"/>
-        <w:rPr>
-          <w:u w:val="none"/>
-        </w:rPr>
-      </w:pPr>
-      <w:r>
-        <w:rPr>
-          <w:rFonts w:eastAsia="Times New Roman" w:cs="Times New Roman" w:ascii="Garamond" w:hAnsi="Garamond"/>
-          <w:color w:val="000000"/>
-          <w:kern w:val="0"/>
-          <w:sz w:val="36"/>
-          <w:szCs w:val="36"/>
-          <w:u w:val="none"/>
-          <w:shd w:fill="auto" w:val="clear"/>
-          <w:lang w:val="en-US" w:eastAsia="zh-CN" w:bidi="hi-IN"/>
-        </w:rPr>
-        <w:t>No dia seguinte ao encontro com Chico, Glória telefonouo para Eurípedes, filho adotivo de Chico e disse: "Avise ao Chico que o perdão ainda está muito difícil, mas eu vou trabalhar para que ninguém faça o linchamento".</w:t>
-      </w:r>
-    </w:p>
-    <w:p>
-      <w:pPr>
-        <w:pStyle w:val="Normal"/>
-        <w:jc w:val="both"/>
-        <w:rPr>
-          <w:u w:val="none"/>
-        </w:rPr>
-      </w:pPr>
-      <w:r>
-        <w:rPr>
-          <w:rFonts w:eastAsia="Times New Roman" w:cs="Times New Roman" w:ascii="Garamond" w:hAnsi="Garamond"/>
-          <w:color w:val="000000"/>
-          <w:kern w:val="0"/>
-          <w:sz w:val="36"/>
-          <w:szCs w:val="36"/>
-          <w:u w:val="none"/>
-          <w:shd w:fill="auto" w:val="clear"/>
-          <w:lang w:val="en-US" w:eastAsia="zh-CN" w:bidi="hi-IN"/>
-        </w:rPr>
-        <w:t>Foi um ato de nobreza espiritual de Glória Perez. Trabalhar para preservar a vida dos assassinos da filha dela. Não resta a menor dúvida  de que essa atitude exigiu dessa mãe um esforço e uma coragem gigantescos.</w:t>
-      </w:r>
-    </w:p>
-    <w:p>
-      <w:pPr>
-        <w:pStyle w:val="Normal"/>
-        <w:jc w:val="both"/>
-        <w:rPr>
-          <w:u w:val="none"/>
-        </w:rPr>
-      </w:pPr>
-      <w:r>
-        <w:rPr>
-          <w:rFonts w:eastAsia="Times New Roman" w:cs="Times New Roman" w:ascii="Garamond" w:hAnsi="Garamond"/>
-          <w:color w:val="000000"/>
-          <w:kern w:val="0"/>
-          <w:sz w:val="36"/>
-          <w:szCs w:val="36"/>
-          <w:u w:val="none"/>
-          <w:shd w:fill="auto" w:val="clear"/>
-          <w:lang w:val="en-US" w:eastAsia="zh-CN" w:bidi="hi-IN"/>
-        </w:rPr>
-        <w:t>É exatamente isso que o Espírito Isabe de França nos pede: não é o mesmo que Jesus teria com o criminoso, mas é fazer por ele aquilo que nossa condição espiritual já nos permite fazer.</w:t>
+        <w:t>É exatamente isso que o Espírito Isabel de França nos pede: não é o mesmo que Jesus teria com o criminoso, mas é fazer por ele aquilo que nossa condição espiritual já nos permite fazer.</w:t>
       </w:r>
     </w:p>
     <w:p>
@@ -7990,7 +8446,7 @@
         <w:bCs/>
         <w:rFonts w:ascii="Garamond" w:hAnsi="Garamond"/>
       </w:rPr>
-      <w:t>35</w:t>
+      <w:t>21</w:t>
     </w:r>
     <w:r>
       <w:rPr>
@@ -9785,280 +10241,6 @@
     </w:lvl>
   </w:abstractNum>
   <w:abstractNum w:abstractNumId="14">
-    <w:lvl w:ilvl="0">
-      <w:start w:val="1"/>
-      <w:numFmt w:val="bullet"/>
-      <w:lvlText w:val=""/>
-      <w:lvlJc w:val="left"/>
-      <w:pPr>
-        <w:tabs>
-          <w:tab w:val="num" w:pos="720"/>
-        </w:tabs>
-        <w:ind w:left="720" w:hanging="360"/>
-      </w:pPr>
-      <w:rPr>
-        <w:rFonts w:ascii="Symbol" w:hAnsi="Symbol" w:cs="Symbol" w:hint="default"/>
-      </w:rPr>
-    </w:lvl>
-    <w:lvl w:ilvl="1">
-      <w:start w:val="1"/>
-      <w:numFmt w:val="bullet"/>
-      <w:lvlText w:val="◦"/>
-      <w:lvlJc w:val="left"/>
-      <w:pPr>
-        <w:tabs>
-          <w:tab w:val="num" w:pos="1080"/>
-        </w:tabs>
-        <w:ind w:left="1080" w:hanging="360"/>
-      </w:pPr>
-      <w:rPr>
-        <w:rFonts w:ascii="OpenSymbol" w:hAnsi="OpenSymbol" w:cs="OpenSymbol" w:hint="default"/>
-      </w:rPr>
-    </w:lvl>
-    <w:lvl w:ilvl="2">
-      <w:start w:val="1"/>
-      <w:numFmt w:val="bullet"/>
-      <w:lvlText w:val="▪"/>
-      <w:lvlJc w:val="left"/>
-      <w:pPr>
-        <w:tabs>
-          <w:tab w:val="num" w:pos="1440"/>
-        </w:tabs>
-        <w:ind w:left="1440" w:hanging="360"/>
-      </w:pPr>
-      <w:rPr>
-        <w:rFonts w:ascii="OpenSymbol" w:hAnsi="OpenSymbol" w:cs="OpenSymbol" w:hint="default"/>
-      </w:rPr>
-    </w:lvl>
-    <w:lvl w:ilvl="3">
-      <w:start w:val="1"/>
-      <w:numFmt w:val="bullet"/>
-      <w:lvlText w:val=""/>
-      <w:lvlJc w:val="left"/>
-      <w:pPr>
-        <w:tabs>
-          <w:tab w:val="num" w:pos="1800"/>
-        </w:tabs>
-        <w:ind w:left="1800" w:hanging="360"/>
-      </w:pPr>
-      <w:rPr>
-        <w:rFonts w:ascii="Symbol" w:hAnsi="Symbol" w:cs="Symbol" w:hint="default"/>
-      </w:rPr>
-    </w:lvl>
-    <w:lvl w:ilvl="4">
-      <w:start w:val="1"/>
-      <w:numFmt w:val="bullet"/>
-      <w:lvlText w:val="◦"/>
-      <w:lvlJc w:val="left"/>
-      <w:pPr>
-        <w:tabs>
-          <w:tab w:val="num" w:pos="2160"/>
-        </w:tabs>
-        <w:ind w:left="2160" w:hanging="360"/>
-      </w:pPr>
-      <w:rPr>
-        <w:rFonts w:ascii="OpenSymbol" w:hAnsi="OpenSymbol" w:cs="OpenSymbol" w:hint="default"/>
-      </w:rPr>
-    </w:lvl>
-    <w:lvl w:ilvl="5">
-      <w:start w:val="1"/>
-      <w:numFmt w:val="bullet"/>
-      <w:lvlText w:val="▪"/>
-      <w:lvlJc w:val="left"/>
-      <w:pPr>
-        <w:tabs>
-          <w:tab w:val="num" w:pos="2520"/>
-        </w:tabs>
-        <w:ind w:left="2520" w:hanging="360"/>
-      </w:pPr>
-      <w:rPr>
-        <w:rFonts w:ascii="OpenSymbol" w:hAnsi="OpenSymbol" w:cs="OpenSymbol" w:hint="default"/>
-      </w:rPr>
-    </w:lvl>
-    <w:lvl w:ilvl="6">
-      <w:start w:val="1"/>
-      <w:numFmt w:val="bullet"/>
-      <w:lvlText w:val=""/>
-      <w:lvlJc w:val="left"/>
-      <w:pPr>
-        <w:tabs>
-          <w:tab w:val="num" w:pos="2880"/>
-        </w:tabs>
-        <w:ind w:left="2880" w:hanging="360"/>
-      </w:pPr>
-      <w:rPr>
-        <w:rFonts w:ascii="Symbol" w:hAnsi="Symbol" w:cs="Symbol" w:hint="default"/>
-      </w:rPr>
-    </w:lvl>
-    <w:lvl w:ilvl="7">
-      <w:start w:val="1"/>
-      <w:numFmt w:val="bullet"/>
-      <w:lvlText w:val="◦"/>
-      <w:lvlJc w:val="left"/>
-      <w:pPr>
-        <w:tabs>
-          <w:tab w:val="num" w:pos="3240"/>
-        </w:tabs>
-        <w:ind w:left="3240" w:hanging="360"/>
-      </w:pPr>
-      <w:rPr>
-        <w:rFonts w:ascii="OpenSymbol" w:hAnsi="OpenSymbol" w:cs="OpenSymbol" w:hint="default"/>
-      </w:rPr>
-    </w:lvl>
-    <w:lvl w:ilvl="8">
-      <w:start w:val="1"/>
-      <w:numFmt w:val="bullet"/>
-      <w:lvlText w:val="▪"/>
-      <w:lvlJc w:val="left"/>
-      <w:pPr>
-        <w:tabs>
-          <w:tab w:val="num" w:pos="3600"/>
-        </w:tabs>
-        <w:ind w:left="3600" w:hanging="360"/>
-      </w:pPr>
-      <w:rPr>
-        <w:rFonts w:ascii="OpenSymbol" w:hAnsi="OpenSymbol" w:cs="OpenSymbol" w:hint="default"/>
-      </w:rPr>
-    </w:lvl>
-  </w:abstractNum>
-  <w:abstractNum w:abstractNumId="15">
-    <w:lvl w:ilvl="0">
-      <w:start w:val="1"/>
-      <w:numFmt w:val="bullet"/>
-      <w:lvlText w:val=""/>
-      <w:lvlJc w:val="left"/>
-      <w:pPr>
-        <w:tabs>
-          <w:tab w:val="num" w:pos="720"/>
-        </w:tabs>
-        <w:ind w:left="720" w:hanging="360"/>
-      </w:pPr>
-      <w:rPr>
-        <w:rFonts w:ascii="Symbol" w:hAnsi="Symbol" w:cs="Symbol" w:hint="default"/>
-      </w:rPr>
-    </w:lvl>
-    <w:lvl w:ilvl="1">
-      <w:start w:val="1"/>
-      <w:numFmt w:val="bullet"/>
-      <w:lvlText w:val="◦"/>
-      <w:lvlJc w:val="left"/>
-      <w:pPr>
-        <w:tabs>
-          <w:tab w:val="num" w:pos="1080"/>
-        </w:tabs>
-        <w:ind w:left="1080" w:hanging="360"/>
-      </w:pPr>
-      <w:rPr>
-        <w:rFonts w:ascii="OpenSymbol" w:hAnsi="OpenSymbol" w:cs="OpenSymbol" w:hint="default"/>
-      </w:rPr>
-    </w:lvl>
-    <w:lvl w:ilvl="2">
-      <w:start w:val="1"/>
-      <w:numFmt w:val="bullet"/>
-      <w:lvlText w:val="▪"/>
-      <w:lvlJc w:val="left"/>
-      <w:pPr>
-        <w:tabs>
-          <w:tab w:val="num" w:pos="1440"/>
-        </w:tabs>
-        <w:ind w:left="1440" w:hanging="360"/>
-      </w:pPr>
-      <w:rPr>
-        <w:rFonts w:ascii="OpenSymbol" w:hAnsi="OpenSymbol" w:cs="OpenSymbol" w:hint="default"/>
-      </w:rPr>
-    </w:lvl>
-    <w:lvl w:ilvl="3">
-      <w:start w:val="1"/>
-      <w:numFmt w:val="bullet"/>
-      <w:lvlText w:val=""/>
-      <w:lvlJc w:val="left"/>
-      <w:pPr>
-        <w:tabs>
-          <w:tab w:val="num" w:pos="1800"/>
-        </w:tabs>
-        <w:ind w:left="1800" w:hanging="360"/>
-      </w:pPr>
-      <w:rPr>
-        <w:rFonts w:ascii="Symbol" w:hAnsi="Symbol" w:cs="Symbol" w:hint="default"/>
-      </w:rPr>
-    </w:lvl>
-    <w:lvl w:ilvl="4">
-      <w:start w:val="1"/>
-      <w:numFmt w:val="bullet"/>
-      <w:lvlText w:val="◦"/>
-      <w:lvlJc w:val="left"/>
-      <w:pPr>
-        <w:tabs>
-          <w:tab w:val="num" w:pos="2160"/>
-        </w:tabs>
-        <w:ind w:left="2160" w:hanging="360"/>
-      </w:pPr>
-      <w:rPr>
-        <w:rFonts w:ascii="OpenSymbol" w:hAnsi="OpenSymbol" w:cs="OpenSymbol" w:hint="default"/>
-      </w:rPr>
-    </w:lvl>
-    <w:lvl w:ilvl="5">
-      <w:start w:val="1"/>
-      <w:numFmt w:val="bullet"/>
-      <w:lvlText w:val="▪"/>
-      <w:lvlJc w:val="left"/>
-      <w:pPr>
-        <w:tabs>
-          <w:tab w:val="num" w:pos="2520"/>
-        </w:tabs>
-        <w:ind w:left="2520" w:hanging="360"/>
-      </w:pPr>
-      <w:rPr>
-        <w:rFonts w:ascii="OpenSymbol" w:hAnsi="OpenSymbol" w:cs="OpenSymbol" w:hint="default"/>
-      </w:rPr>
-    </w:lvl>
-    <w:lvl w:ilvl="6">
-      <w:start w:val="1"/>
-      <w:numFmt w:val="bullet"/>
-      <w:lvlText w:val=""/>
-      <w:lvlJc w:val="left"/>
-      <w:pPr>
-        <w:tabs>
-          <w:tab w:val="num" w:pos="2880"/>
-        </w:tabs>
-        <w:ind w:left="2880" w:hanging="360"/>
-      </w:pPr>
-      <w:rPr>
-        <w:rFonts w:ascii="Symbol" w:hAnsi="Symbol" w:cs="Symbol" w:hint="default"/>
-      </w:rPr>
-    </w:lvl>
-    <w:lvl w:ilvl="7">
-      <w:start w:val="1"/>
-      <w:numFmt w:val="bullet"/>
-      <w:lvlText w:val="◦"/>
-      <w:lvlJc w:val="left"/>
-      <w:pPr>
-        <w:tabs>
-          <w:tab w:val="num" w:pos="3240"/>
-        </w:tabs>
-        <w:ind w:left="3240" w:hanging="360"/>
-      </w:pPr>
-      <w:rPr>
-        <w:rFonts w:ascii="OpenSymbol" w:hAnsi="OpenSymbol" w:cs="OpenSymbol" w:hint="default"/>
-      </w:rPr>
-    </w:lvl>
-    <w:lvl w:ilvl="8">
-      <w:start w:val="1"/>
-      <w:numFmt w:val="bullet"/>
-      <w:lvlText w:val="▪"/>
-      <w:lvlJc w:val="left"/>
-      <w:pPr>
-        <w:tabs>
-          <w:tab w:val="num" w:pos="3600"/>
-        </w:tabs>
-        <w:ind w:left="3600" w:hanging="360"/>
-      </w:pPr>
-      <w:rPr>
-        <w:rFonts w:ascii="OpenSymbol" w:hAnsi="OpenSymbol" w:cs="OpenSymbol" w:hint="default"/>
-      </w:rPr>
-    </w:lvl>
-  </w:abstractNum>
-  <w:abstractNum w:abstractNumId="16">
     <w:lvl w:ilvl="0">
       <w:start w:val="1"/>
       <w:numFmt w:val="none"/>
@@ -10218,12 +10400,6 @@
   </w:num>
   <w:num w:numId="14">
     <w:abstractNumId w:val="14"/>
-  </w:num>
-  <w:num w:numId="15">
-    <w:abstractNumId w:val="15"/>
-  </w:num>
-  <w:num w:numId="16">
-    <w:abstractNumId w:val="16"/>
   </w:num>
 </w:numbering>
 </file>

</xml_diff>

<commit_message>
05/12/2025 - 21:55 h
</commit_message>
<xml_diff>
--- a/O mandamento maior/O Mandamento Maior.docx
+++ b/O mandamento maior/O Mandamento Maior.docx
@@ -5467,52 +5467,1292 @@
         <w:pStyle w:val="Normal"/>
         <w:jc w:val="both"/>
         <w:rPr>
-          <w:rFonts w:ascii="Garamond" w:hAnsi="Garamond" w:eastAsia="Times New Roman" w:cs="Times New Roman"/>
-          <w:color w:val="000000"/>
-          <w:kern w:val="0"/>
-          <w:sz w:val="36"/>
-          <w:szCs w:val="36"/>
-          <w:shd w:fill="auto" w:val="clear"/>
-          <w:lang w:val="en-US" w:eastAsia="zh-CN" w:bidi="hi-IN"/>
-        </w:rPr>
-      </w:pPr>
-      <w:r>
-        <w:rPr>
-          <w:rFonts w:eastAsia="Times New Roman" w:cs="Times New Roman" w:ascii="Garamond" w:hAnsi="Garamond"/>
-          <w:color w:val="000000"/>
-          <w:kern w:val="0"/>
-          <w:sz w:val="36"/>
-          <w:szCs w:val="36"/>
-          <w:shd w:fill="auto" w:val="clear"/>
-          <w:lang w:val="en-US" w:eastAsia="zh-CN" w:bidi="hi-IN"/>
-        </w:rPr>
-        <w:t xml:space="preserve">Parei aqui em 04/12/2025 </w:t>
-      </w:r>
-    </w:p>
-    <w:p>
-      <w:pPr>
-        <w:pStyle w:val="Normal"/>
-        <w:jc w:val="both"/>
-        <w:rPr>
-          <w:rFonts w:ascii="Garamond" w:hAnsi="Garamond" w:eastAsia="Times New Roman" w:cs="Times New Roman"/>
-          <w:color w:val="000000"/>
-          <w:kern w:val="0"/>
-          <w:sz w:val="36"/>
-          <w:szCs w:val="36"/>
-          <w:shd w:fill="auto" w:val="clear"/>
-          <w:lang w:val="en-US" w:eastAsia="zh-CN" w:bidi="hi-IN"/>
-        </w:rPr>
-      </w:pPr>
-      <w:r>
-        <w:rPr>
-          <w:rFonts w:eastAsia="Times New Roman" w:cs="Times New Roman" w:ascii="Garamond" w:hAnsi="Garamond"/>
-          <w:color w:val="000000"/>
-          <w:kern w:val="0"/>
-          <w:sz w:val="36"/>
-          <w:szCs w:val="36"/>
-          <w:shd w:fill="auto" w:val="clear"/>
-          <w:lang w:val="en-US" w:eastAsia="zh-CN" w:bidi="hi-IN"/>
-        </w:rPr>
+          <w:color w:val="1C99E0"/>
+        </w:rPr>
+      </w:pPr>
+      <w:r>
+        <w:rPr>
+          <w:rFonts w:eastAsia="Times New Roman" w:cs="Times New Roman" w:ascii="Garamond" w:hAnsi="Garamond"/>
+          <w:color w:val="1C99E0"/>
+          <w:kern w:val="0"/>
+          <w:sz w:val="36"/>
+          <w:szCs w:val="36"/>
+          <w:shd w:fill="auto" w:val="clear"/>
+          <w:lang w:val="en-US" w:eastAsia="zh-CN" w:bidi="hi-IN"/>
+        </w:rPr>
+        <w:t>[ Início da parte final da palestra ]</w:t>
+      </w:r>
+    </w:p>
+    <w:p>
+      <w:pPr>
+        <w:pStyle w:val="Normal"/>
+        <w:jc w:val="both"/>
+        <w:rPr>
+          <w:rFonts w:ascii="Garamond" w:hAnsi="Garamond" w:eastAsia="Times New Roman" w:cs="Times New Roman"/>
+          <w:color w:val="000000"/>
+          <w:kern w:val="0"/>
+          <w:sz w:val="36"/>
+          <w:szCs w:val="36"/>
+          <w:shd w:fill="auto" w:val="clear"/>
+          <w:lang w:val="en-US" w:eastAsia="zh-CN" w:bidi="hi-IN"/>
+        </w:rPr>
+      </w:pPr>
+      <w:r>
+        <w:rPr>
+          <w:rFonts w:eastAsia="Times New Roman" w:cs="Times New Roman" w:ascii="Garamond" w:hAnsi="Garamond"/>
+          <w:color w:val="000000"/>
+          <w:kern w:val="0"/>
+          <w:sz w:val="36"/>
+          <w:szCs w:val="36"/>
+          <w:shd w:fill="auto" w:val="clear"/>
+          <w:lang w:val="en-US" w:eastAsia="zh-CN" w:bidi="hi-IN"/>
+        </w:rPr>
+        <w:t>Na obra A Gênese, capítulo XVIII - São chegados os tempos - último capítulo da obra - Allan Kardec nos diz que a humanidade vive a época em que, pela vontade de Deus, ocorrerão grandes acontecimentos para a regeneração da humanidade.</w:t>
+      </w:r>
+    </w:p>
+    <w:p>
+      <w:pPr>
+        <w:pStyle w:val="Normal"/>
+        <w:jc w:val="both"/>
+        <w:rPr>
+          <w:rFonts w:ascii="Garamond" w:hAnsi="Garamond" w:eastAsia="Times New Roman" w:cs="Times New Roman"/>
+          <w:color w:val="000000"/>
+          <w:kern w:val="0"/>
+          <w:sz w:val="36"/>
+          <w:szCs w:val="36"/>
+          <w:shd w:fill="auto" w:val="clear"/>
+          <w:lang w:val="en-US" w:eastAsia="zh-CN" w:bidi="hi-IN"/>
+        </w:rPr>
+      </w:pPr>
+      <w:r>
+        <w:rPr>
+          <w:rFonts w:eastAsia="Times New Roman" w:cs="Times New Roman" w:ascii="Garamond" w:hAnsi="Garamond"/>
+          <w:color w:val="000000"/>
+          <w:kern w:val="0"/>
+          <w:sz w:val="36"/>
+          <w:szCs w:val="36"/>
+          <w:shd w:fill="auto" w:val="clear"/>
+          <w:lang w:val="en-US" w:eastAsia="zh-CN" w:bidi="hi-IN"/>
+        </w:rPr>
+      </w:r>
+    </w:p>
+    <w:p>
+      <w:pPr>
+        <w:pStyle w:val="Normal"/>
+        <w:jc w:val="both"/>
+        <w:rPr>
+          <w:rFonts w:ascii="Garamond" w:hAnsi="Garamond" w:eastAsia="Times New Roman" w:cs="Times New Roman"/>
+          <w:color w:val="000000"/>
+          <w:kern w:val="0"/>
+          <w:sz w:val="36"/>
+          <w:szCs w:val="36"/>
+          <w:shd w:fill="auto" w:val="clear"/>
+          <w:lang w:val="en-US" w:eastAsia="zh-CN" w:bidi="hi-IN"/>
+        </w:rPr>
+      </w:pPr>
+      <w:r>
+        <w:rPr>
+          <w:rFonts w:eastAsia="Times New Roman" w:cs="Times New Roman" w:ascii="Garamond" w:hAnsi="Garamond"/>
+          <w:color w:val="000000"/>
+          <w:kern w:val="0"/>
+          <w:sz w:val="36"/>
+          <w:szCs w:val="36"/>
+          <w:shd w:fill="auto" w:val="clear"/>
+          <w:lang w:val="en-US" w:eastAsia="zh-CN" w:bidi="hi-IN"/>
+        </w:rPr>
+        <w:t>Entretanto, Kardec diz que é errônea a ideia que muitas pessoas têm de que esses grandes acontecimentos se darão exclusivamente através de cataclismos e  desastres promovidos pela natureza.</w:t>
+      </w:r>
+    </w:p>
+    <w:p>
+      <w:pPr>
+        <w:pStyle w:val="Normal"/>
+        <w:jc w:val="both"/>
+        <w:rPr>
+          <w:rFonts w:ascii="Garamond" w:hAnsi="Garamond" w:eastAsia="Times New Roman" w:cs="Times New Roman"/>
+          <w:color w:val="000000"/>
+          <w:kern w:val="0"/>
+          <w:sz w:val="36"/>
+          <w:szCs w:val="36"/>
+          <w:shd w:fill="auto" w:val="clear"/>
+          <w:lang w:val="en-US" w:eastAsia="zh-CN" w:bidi="hi-IN"/>
+        </w:rPr>
+      </w:pPr>
+      <w:r>
+        <w:rPr>
+          <w:rFonts w:eastAsia="Times New Roman" w:cs="Times New Roman" w:ascii="Garamond" w:hAnsi="Garamond"/>
+          <w:color w:val="000000"/>
+          <w:kern w:val="0"/>
+          <w:sz w:val="36"/>
+          <w:szCs w:val="36"/>
+          <w:shd w:fill="auto" w:val="clear"/>
+          <w:lang w:val="en-US" w:eastAsia="zh-CN" w:bidi="hi-IN"/>
+        </w:rPr>
+      </w:r>
+    </w:p>
+    <w:p>
+      <w:pPr>
+        <w:pStyle w:val="Normal"/>
+        <w:jc w:val="both"/>
+        <w:rPr>
+          <w:rFonts w:ascii="Garamond" w:hAnsi="Garamond" w:eastAsia="Times New Roman" w:cs="Times New Roman"/>
+          <w:color w:val="000000"/>
+          <w:kern w:val="0"/>
+          <w:sz w:val="36"/>
+          <w:szCs w:val="36"/>
+          <w:shd w:fill="auto" w:val="clear"/>
+          <w:lang w:val="en-US" w:eastAsia="zh-CN" w:bidi="hi-IN"/>
+        </w:rPr>
+      </w:pPr>
+      <w:r>
+        <w:rPr>
+          <w:rFonts w:eastAsia="Times New Roman" w:cs="Times New Roman" w:ascii="Garamond" w:hAnsi="Garamond"/>
+          <w:color w:val="000000"/>
+          <w:kern w:val="0"/>
+          <w:sz w:val="36"/>
+          <w:szCs w:val="36"/>
+          <w:shd w:fill="auto" w:val="clear"/>
+          <w:lang w:val="en-US" w:eastAsia="zh-CN" w:bidi="hi-IN"/>
+        </w:rPr>
+        <w:t xml:space="preserve">Fisicamente falando, a Terra também progride, </w:t>
+      </w:r>
+      <w:r>
+        <w:rPr>
+          <w:rFonts w:eastAsia="Times New Roman" w:cs="Times New Roman" w:ascii="Garamond" w:hAnsi="Garamond"/>
+          <w:color w:val="000000"/>
+          <w:kern w:val="0"/>
+          <w:sz w:val="36"/>
+          <w:szCs w:val="36"/>
+          <w:shd w:fill="auto" w:val="clear"/>
+          <w:lang w:val="en-US" w:eastAsia="zh-CN" w:bidi="hi-IN"/>
+        </w:rPr>
+        <w:t xml:space="preserve">e por isso sofre transformação de seus elementos, </w:t>
+      </w:r>
+      <w:r>
+        <w:rPr>
+          <w:rFonts w:eastAsia="Times New Roman" w:cs="Times New Roman" w:ascii="Garamond" w:hAnsi="Garamond"/>
+          <w:color w:val="000000"/>
+          <w:kern w:val="0"/>
+          <w:sz w:val="36"/>
+          <w:szCs w:val="36"/>
+          <w:shd w:fill="auto" w:val="clear"/>
+          <w:lang w:val="en-US" w:eastAsia="zh-CN" w:bidi="hi-IN"/>
+        </w:rPr>
+        <w:t xml:space="preserve">mas é a </w:t>
+      </w:r>
+      <w:r>
+        <w:rPr>
+          <w:rFonts w:eastAsia="Times New Roman" w:cs="Times New Roman" w:ascii="Garamond" w:hAnsi="Garamond"/>
+          <w:color w:val="000000"/>
+          <w:kern w:val="0"/>
+          <w:sz w:val="36"/>
+          <w:szCs w:val="36"/>
+          <w:shd w:fill="auto" w:val="clear"/>
+          <w:lang w:val="en-US" w:eastAsia="zh-CN" w:bidi="hi-IN"/>
+        </w:rPr>
+        <w:t>transformação da humanidade</w:t>
+      </w:r>
+      <w:r>
+        <w:rPr>
+          <w:rFonts w:eastAsia="Times New Roman" w:cs="Times New Roman" w:ascii="Garamond" w:hAnsi="Garamond"/>
+          <w:color w:val="000000"/>
+          <w:kern w:val="0"/>
+          <w:sz w:val="36"/>
+          <w:szCs w:val="36"/>
+          <w:shd w:fill="auto" w:val="clear"/>
+          <w:lang w:val="en-US" w:eastAsia="zh-CN" w:bidi="hi-IN"/>
+        </w:rPr>
+        <w:t xml:space="preserve"> </w:t>
+      </w:r>
+      <w:r>
+        <w:rPr>
+          <w:rFonts w:eastAsia="Times New Roman" w:cs="Times New Roman" w:ascii="Garamond" w:hAnsi="Garamond"/>
+          <w:color w:val="000000"/>
+          <w:kern w:val="0"/>
+          <w:sz w:val="36"/>
+          <w:szCs w:val="36"/>
+          <w:shd w:fill="auto" w:val="clear"/>
+          <w:lang w:val="en-US" w:eastAsia="zh-CN" w:bidi="hi-IN"/>
+        </w:rPr>
+        <w:t xml:space="preserve">que </w:t>
+      </w:r>
+      <w:r>
+        <w:rPr>
+          <w:rFonts w:eastAsia="Times New Roman" w:cs="Times New Roman" w:ascii="Garamond" w:hAnsi="Garamond"/>
+          <w:color w:val="000000"/>
+          <w:kern w:val="0"/>
+          <w:sz w:val="36"/>
+          <w:szCs w:val="36"/>
+          <w:shd w:fill="auto" w:val="clear"/>
+          <w:lang w:val="en-US" w:eastAsia="zh-CN" w:bidi="hi-IN"/>
+        </w:rPr>
+        <w:t xml:space="preserve">realmente nos </w:t>
+      </w:r>
+      <w:r>
+        <w:rPr>
+          <w:rFonts w:eastAsia="Times New Roman" w:cs="Times New Roman" w:ascii="Garamond" w:hAnsi="Garamond"/>
+          <w:color w:val="000000"/>
+          <w:kern w:val="0"/>
+          <w:sz w:val="36"/>
+          <w:szCs w:val="36"/>
+          <w:shd w:fill="auto" w:val="clear"/>
+          <w:lang w:val="en-US" w:eastAsia="zh-CN" w:bidi="hi-IN"/>
+        </w:rPr>
+        <w:t>interessa</w:t>
+      </w:r>
+      <w:r>
+        <w:rPr>
+          <w:rFonts w:eastAsia="Times New Roman" w:cs="Times New Roman" w:ascii="Garamond" w:hAnsi="Garamond"/>
+          <w:color w:val="000000"/>
+          <w:kern w:val="0"/>
+          <w:sz w:val="36"/>
+          <w:szCs w:val="36"/>
+          <w:shd w:fill="auto" w:val="clear"/>
+          <w:lang w:val="en-US" w:eastAsia="zh-CN" w:bidi="hi-IN"/>
+        </w:rPr>
+        <w:t xml:space="preserve">. O homem </w:t>
+      </w:r>
+      <w:r>
+        <w:rPr>
+          <w:rFonts w:eastAsia="Times New Roman" w:cs="Times New Roman" w:ascii="Garamond" w:hAnsi="Garamond"/>
+          <w:color w:val="000000"/>
+          <w:kern w:val="0"/>
+          <w:sz w:val="36"/>
+          <w:szCs w:val="36"/>
+          <w:shd w:fill="auto" w:val="clear"/>
+          <w:lang w:val="en-US" w:eastAsia="zh-CN" w:bidi="hi-IN"/>
+        </w:rPr>
+        <w:t>evolui pelo desenvolvimento da inteligência e pela depuração do senso moral e dos sentimentos.</w:t>
+      </w:r>
+    </w:p>
+    <w:p>
+      <w:pPr>
+        <w:pStyle w:val="Normal"/>
+        <w:jc w:val="both"/>
+        <w:rPr>
+          <w:rFonts w:ascii="Garamond" w:hAnsi="Garamond" w:eastAsia="Times New Roman" w:cs="Times New Roman"/>
+          <w:color w:val="000000"/>
+          <w:kern w:val="0"/>
+          <w:sz w:val="36"/>
+          <w:szCs w:val="36"/>
+          <w:shd w:fill="auto" w:val="clear"/>
+          <w:lang w:val="en-US" w:eastAsia="zh-CN" w:bidi="hi-IN"/>
+        </w:rPr>
+      </w:pPr>
+      <w:r>
+        <w:rPr>
+          <w:rFonts w:eastAsia="Times New Roman" w:cs="Times New Roman" w:ascii="Garamond" w:hAnsi="Garamond"/>
+          <w:color w:val="000000"/>
+          <w:kern w:val="0"/>
+          <w:sz w:val="36"/>
+          <w:szCs w:val="36"/>
+          <w:shd w:fill="auto" w:val="clear"/>
+          <w:lang w:val="en-US" w:eastAsia="zh-CN" w:bidi="hi-IN"/>
+        </w:rPr>
+      </w:r>
+    </w:p>
+    <w:p>
+      <w:pPr>
+        <w:pStyle w:val="Normal"/>
+        <w:jc w:val="both"/>
+        <w:rPr>
+          <w:rFonts w:ascii="Garamond" w:hAnsi="Garamond" w:eastAsia="Times New Roman" w:cs="Times New Roman"/>
+          <w:color w:val="000000"/>
+          <w:kern w:val="0"/>
+          <w:sz w:val="36"/>
+          <w:szCs w:val="36"/>
+          <w:shd w:fill="auto" w:val="clear"/>
+          <w:lang w:val="en-US" w:eastAsia="zh-CN" w:bidi="hi-IN"/>
+        </w:rPr>
+      </w:pPr>
+      <w:r>
+        <w:rPr>
+          <w:rFonts w:eastAsia="Times New Roman" w:cs="Times New Roman" w:ascii="Garamond" w:hAnsi="Garamond"/>
+          <w:color w:val="000000"/>
+          <w:kern w:val="0"/>
+          <w:sz w:val="36"/>
+          <w:szCs w:val="36"/>
+          <w:shd w:fill="auto" w:val="clear"/>
+          <w:lang w:val="en-US" w:eastAsia="zh-CN" w:bidi="hi-IN"/>
+        </w:rPr>
+        <w:t xml:space="preserve">Nos dias de hoje percebemos claramente que a humanidade evoluiu muito intelectualmente, mas ainda se mostra extremamente deficiente moralmente falando. O progresso material que obtivemos como consequência do avança intelectual nos permite hoje viver com mais conforto, comunicar-mos como o mundo todo quase que instantaneamente, curarmo-nos de muitas doenças. </w:t>
+      </w:r>
+    </w:p>
+    <w:p>
+      <w:pPr>
+        <w:pStyle w:val="Normal"/>
+        <w:jc w:val="both"/>
+        <w:rPr>
+          <w:rFonts w:ascii="Garamond" w:hAnsi="Garamond" w:eastAsia="Times New Roman" w:cs="Times New Roman"/>
+          <w:color w:val="000000"/>
+          <w:kern w:val="0"/>
+          <w:sz w:val="36"/>
+          <w:szCs w:val="36"/>
+          <w:shd w:fill="auto" w:val="clear"/>
+          <w:lang w:val="en-US" w:eastAsia="zh-CN" w:bidi="hi-IN"/>
+        </w:rPr>
+      </w:pPr>
+      <w:r>
+        <w:rPr>
+          <w:rFonts w:eastAsia="Times New Roman" w:cs="Times New Roman" w:ascii="Garamond" w:hAnsi="Garamond"/>
+          <w:color w:val="000000"/>
+          <w:kern w:val="0"/>
+          <w:sz w:val="36"/>
+          <w:szCs w:val="36"/>
+          <w:shd w:fill="auto" w:val="clear"/>
+          <w:lang w:val="en-US" w:eastAsia="zh-CN" w:bidi="hi-IN"/>
+        </w:rPr>
+      </w:r>
+    </w:p>
+    <w:p>
+      <w:pPr>
+        <w:pStyle w:val="Normal"/>
+        <w:jc w:val="both"/>
+        <w:rPr>
+          <w:rFonts w:ascii="Garamond" w:hAnsi="Garamond" w:eastAsia="Times New Roman" w:cs="Times New Roman"/>
+          <w:color w:val="000000"/>
+          <w:kern w:val="0"/>
+          <w:sz w:val="36"/>
+          <w:szCs w:val="36"/>
+          <w:shd w:fill="auto" w:val="clear"/>
+          <w:lang w:val="en-US" w:eastAsia="zh-CN" w:bidi="hi-IN"/>
+        </w:rPr>
+      </w:pPr>
+      <w:r>
+        <w:rPr>
+          <w:rFonts w:eastAsia="Times New Roman" w:cs="Times New Roman" w:ascii="Garamond" w:hAnsi="Garamond"/>
+          <w:color w:val="000000"/>
+          <w:kern w:val="0"/>
+          <w:sz w:val="36"/>
+          <w:szCs w:val="36"/>
+          <w:shd w:fill="auto" w:val="clear"/>
+          <w:lang w:val="en-US" w:eastAsia="zh-CN" w:bidi="hi-IN"/>
+        </w:rPr>
+        <w:t>Em contra partida, despertou em nós um desejo de posse e de exibição quase incontrolável, fazendo crescer o orgulho, o egoísmo e a vaidade.</w:t>
+      </w:r>
+    </w:p>
+    <w:p>
+      <w:pPr>
+        <w:pStyle w:val="Normal"/>
+        <w:jc w:val="both"/>
+        <w:rPr>
+          <w:rFonts w:ascii="Garamond" w:hAnsi="Garamond" w:eastAsia="Times New Roman" w:cs="Times New Roman"/>
+          <w:color w:val="000000"/>
+          <w:kern w:val="0"/>
+          <w:sz w:val="36"/>
+          <w:szCs w:val="36"/>
+          <w:shd w:fill="auto" w:val="clear"/>
+          <w:lang w:val="en-US" w:eastAsia="zh-CN" w:bidi="hi-IN"/>
+        </w:rPr>
+      </w:pPr>
+      <w:r>
+        <w:rPr>
+          <w:rFonts w:eastAsia="Times New Roman" w:cs="Times New Roman" w:ascii="Garamond" w:hAnsi="Garamond"/>
+          <w:color w:val="000000"/>
+          <w:kern w:val="0"/>
+          <w:sz w:val="36"/>
+          <w:szCs w:val="36"/>
+          <w:shd w:fill="auto" w:val="clear"/>
+          <w:lang w:val="en-US" w:eastAsia="zh-CN" w:bidi="hi-IN"/>
+        </w:rPr>
+      </w:r>
+    </w:p>
+    <w:p>
+      <w:pPr>
+        <w:pStyle w:val="Normal"/>
+        <w:jc w:val="both"/>
+        <w:rPr>
+          <w:rFonts w:ascii="Garamond" w:hAnsi="Garamond" w:eastAsia="Times New Roman" w:cs="Times New Roman"/>
+          <w:color w:val="000000"/>
+          <w:kern w:val="0"/>
+          <w:sz w:val="36"/>
+          <w:szCs w:val="36"/>
+          <w:shd w:fill="auto" w:val="clear"/>
+          <w:lang w:val="en-US" w:eastAsia="zh-CN" w:bidi="hi-IN"/>
+        </w:rPr>
+      </w:pPr>
+      <w:r>
+        <w:rPr>
+          <w:rFonts w:eastAsia="Times New Roman" w:cs="Times New Roman" w:ascii="Garamond" w:hAnsi="Garamond"/>
+          <w:color w:val="000000"/>
+          <w:kern w:val="0"/>
+          <w:sz w:val="36"/>
+          <w:szCs w:val="36"/>
+          <w:shd w:fill="auto" w:val="clear"/>
+          <w:lang w:val="en-US" w:eastAsia="zh-CN" w:bidi="hi-IN"/>
+        </w:rPr>
+        <w:t>O homem do mundo moderno é como um pássaro em que uma das asas é enorme - a asa da inteligência - e a outra é pequena, atrofiada - a asa da moral. Um pássaro nessas condições não consegue voar; a humanidade nessas condições não consegue evoluir.</w:t>
+      </w:r>
+    </w:p>
+    <w:p>
+      <w:pPr>
+        <w:pStyle w:val="Normal"/>
+        <w:jc w:val="both"/>
+        <w:rPr>
+          <w:rFonts w:ascii="Garamond" w:hAnsi="Garamond" w:eastAsia="Times New Roman" w:cs="Times New Roman"/>
+          <w:color w:val="000000"/>
+          <w:kern w:val="0"/>
+          <w:sz w:val="36"/>
+          <w:szCs w:val="36"/>
+          <w:shd w:fill="auto" w:val="clear"/>
+          <w:lang w:val="en-US" w:eastAsia="zh-CN" w:bidi="hi-IN"/>
+        </w:rPr>
+      </w:pPr>
+      <w:r>
+        <w:rPr>
+          <w:rFonts w:eastAsia="Times New Roman" w:cs="Times New Roman" w:ascii="Garamond" w:hAnsi="Garamond"/>
+          <w:color w:val="000000"/>
+          <w:kern w:val="0"/>
+          <w:sz w:val="36"/>
+          <w:szCs w:val="36"/>
+          <w:shd w:fill="auto" w:val="clear"/>
+          <w:lang w:val="en-US" w:eastAsia="zh-CN" w:bidi="hi-IN"/>
+        </w:rPr>
+      </w:r>
+    </w:p>
+    <w:p>
+      <w:pPr>
+        <w:pStyle w:val="Normal"/>
+        <w:jc w:val="both"/>
+        <w:rPr>
+          <w:rFonts w:ascii="Garamond" w:hAnsi="Garamond" w:eastAsia="Times New Roman" w:cs="Times New Roman"/>
+          <w:color w:val="000000"/>
+          <w:kern w:val="0"/>
+          <w:sz w:val="36"/>
+          <w:szCs w:val="36"/>
+          <w:shd w:fill="auto" w:val="clear"/>
+          <w:lang w:val="en-US" w:eastAsia="zh-CN" w:bidi="hi-IN"/>
+        </w:rPr>
+      </w:pPr>
+      <w:r>
+        <w:rPr>
+          <w:rFonts w:eastAsia="Times New Roman" w:cs="Times New Roman" w:ascii="Garamond" w:hAnsi="Garamond"/>
+          <w:color w:val="000000"/>
+          <w:kern w:val="0"/>
+          <w:sz w:val="36"/>
+          <w:szCs w:val="36"/>
+          <w:shd w:fill="auto" w:val="clear"/>
+          <w:lang w:val="en-US" w:eastAsia="zh-CN" w:bidi="hi-IN"/>
+        </w:rPr>
+        <w:t>Nós, que já esboçamos algum desejo de evoluir com o planeta, olhamos para o caos que se estabeleceu ao nosso redor como consequência do orgulho e do egoísmo e dizemos: "não é possível que a humanidade esteja realmente evoluindo. Já se passaram 157 desde que A Gênese foi escrita e só vemos as coisas piorarem. Esses tempos dos quais Kardec fala não podem ter chegado".</w:t>
+      </w:r>
+    </w:p>
+    <w:p>
+      <w:pPr>
+        <w:pStyle w:val="Normal"/>
+        <w:jc w:val="both"/>
+        <w:rPr>
+          <w:rFonts w:ascii="Garamond" w:hAnsi="Garamond" w:eastAsia="Times New Roman" w:cs="Times New Roman"/>
+          <w:color w:val="000000"/>
+          <w:kern w:val="0"/>
+          <w:sz w:val="36"/>
+          <w:szCs w:val="36"/>
+          <w:shd w:fill="auto" w:val="clear"/>
+          <w:lang w:val="en-US" w:eastAsia="zh-CN" w:bidi="hi-IN"/>
+        </w:rPr>
+      </w:pPr>
+      <w:r>
+        <w:rPr>
+          <w:rFonts w:eastAsia="Times New Roman" w:cs="Times New Roman" w:ascii="Garamond" w:hAnsi="Garamond"/>
+          <w:color w:val="000000"/>
+          <w:kern w:val="0"/>
+          <w:sz w:val="36"/>
+          <w:szCs w:val="36"/>
+          <w:shd w:fill="auto" w:val="clear"/>
+          <w:lang w:val="en-US" w:eastAsia="zh-CN" w:bidi="hi-IN"/>
+        </w:rPr>
+      </w:r>
+    </w:p>
+    <w:p>
+      <w:pPr>
+        <w:pStyle w:val="Normal"/>
+        <w:jc w:val="both"/>
+        <w:rPr>
+          <w:rFonts w:ascii="Garamond" w:hAnsi="Garamond" w:eastAsia="Times New Roman" w:cs="Times New Roman"/>
+          <w:color w:val="000000"/>
+          <w:kern w:val="0"/>
+          <w:sz w:val="36"/>
+          <w:szCs w:val="36"/>
+          <w:shd w:fill="auto" w:val="clear"/>
+          <w:lang w:val="en-US" w:eastAsia="zh-CN" w:bidi="hi-IN"/>
+        </w:rPr>
+      </w:pPr>
+      <w:r>
+        <w:rPr>
+          <w:rFonts w:eastAsia="Times New Roman" w:cs="Times New Roman" w:ascii="Garamond" w:hAnsi="Garamond"/>
+          <w:color w:val="000000"/>
+          <w:kern w:val="0"/>
+          <w:sz w:val="36"/>
+          <w:szCs w:val="36"/>
+          <w:shd w:fill="auto" w:val="clear"/>
+          <w:lang w:val="en-US" w:eastAsia="zh-CN" w:bidi="hi-IN"/>
+        </w:rPr>
+        <w:t>Essa forma de pensar mostra o quão pequena é nossa visão das coisas e o quanto somos imediatistas. Apesar de nós termos o livre arbítrio, todas as coisas sempre acontecem e sempre acontecerão de acordo com a vontade e no tempo estabelecido por Deus.</w:t>
+      </w:r>
+    </w:p>
+    <w:p>
+      <w:pPr>
+        <w:pStyle w:val="Normal"/>
+        <w:jc w:val="both"/>
+        <w:rPr>
+          <w:rFonts w:ascii="Garamond" w:hAnsi="Garamond" w:eastAsia="Times New Roman" w:cs="Times New Roman"/>
+          <w:color w:val="000000"/>
+          <w:kern w:val="0"/>
+          <w:sz w:val="36"/>
+          <w:szCs w:val="36"/>
+          <w:shd w:fill="auto" w:val="clear"/>
+          <w:lang w:val="en-US" w:eastAsia="zh-CN" w:bidi="hi-IN"/>
+        </w:rPr>
+      </w:pPr>
+      <w:r>
+        <w:rPr>
+          <w:rFonts w:eastAsia="Times New Roman" w:cs="Times New Roman" w:ascii="Garamond" w:hAnsi="Garamond"/>
+          <w:color w:val="000000"/>
+          <w:kern w:val="0"/>
+          <w:sz w:val="36"/>
+          <w:szCs w:val="36"/>
+          <w:shd w:fill="auto" w:val="clear"/>
+          <w:lang w:val="en-US" w:eastAsia="zh-CN" w:bidi="hi-IN"/>
+        </w:rPr>
+      </w:r>
+    </w:p>
+    <w:p>
+      <w:pPr>
+        <w:pStyle w:val="Normal"/>
+        <w:jc w:val="both"/>
+        <w:rPr>
+          <w:rFonts w:ascii="Garamond" w:hAnsi="Garamond" w:eastAsia="Times New Roman" w:cs="Times New Roman"/>
+          <w:color w:val="000000"/>
+          <w:kern w:val="0"/>
+          <w:sz w:val="36"/>
+          <w:szCs w:val="36"/>
+          <w:shd w:fill="auto" w:val="clear"/>
+          <w:lang w:val="en-US" w:eastAsia="zh-CN" w:bidi="hi-IN"/>
+        </w:rPr>
+      </w:pPr>
+      <w:r>
+        <w:rPr>
+          <w:rFonts w:eastAsia="Times New Roman" w:cs="Times New Roman" w:ascii="Garamond" w:hAnsi="Garamond"/>
+          <w:color w:val="000000"/>
+          <w:kern w:val="0"/>
+          <w:sz w:val="36"/>
+          <w:szCs w:val="36"/>
+          <w:shd w:fill="auto" w:val="clear"/>
+          <w:lang w:val="en-US" w:eastAsia="zh-CN" w:bidi="hi-IN"/>
+        </w:rPr>
+        <w:t>Kardec nos esclarece que q</w:t>
+      </w:r>
+      <w:r>
+        <w:rPr>
+          <w:rFonts w:eastAsia="Times New Roman" w:cs="Times New Roman" w:ascii="Garamond" w:hAnsi="Garamond"/>
+          <w:color w:val="000000"/>
+          <w:kern w:val="0"/>
+          <w:sz w:val="36"/>
+          <w:szCs w:val="36"/>
+          <w:shd w:fill="auto" w:val="clear"/>
+          <w:lang w:val="en-US" w:eastAsia="zh-CN" w:bidi="hi-IN"/>
+        </w:rPr>
+        <w:t>uando</w:t>
+      </w:r>
+      <w:r>
+        <w:rPr>
+          <w:rFonts w:eastAsia="Times New Roman" w:cs="Times New Roman" w:ascii="Garamond" w:hAnsi="Garamond"/>
+          <w:color w:val="000000"/>
+          <w:kern w:val="0"/>
+          <w:sz w:val="36"/>
+          <w:szCs w:val="36"/>
+          <w:shd w:fill="auto" w:val="clear"/>
+          <w:lang w:val="en-US" w:eastAsia="zh-CN" w:bidi="hi-IN"/>
+        </w:rPr>
+        <w:t xml:space="preserve"> </w:t>
+      </w:r>
+      <w:r>
+        <w:rPr>
+          <w:rFonts w:eastAsia="Times New Roman" w:cs="Times New Roman" w:ascii="Garamond" w:hAnsi="Garamond"/>
+          <w:color w:val="000000"/>
+          <w:kern w:val="0"/>
+          <w:sz w:val="36"/>
+          <w:szCs w:val="36"/>
+          <w:shd w:fill="auto" w:val="clear"/>
+          <w:lang w:val="en-US" w:eastAsia="zh-CN" w:bidi="hi-IN"/>
+        </w:rPr>
+        <w:t>a</w:t>
+      </w:r>
+      <w:r>
+        <w:rPr>
+          <w:rFonts w:eastAsia="Times New Roman" w:cs="Times New Roman" w:ascii="Garamond" w:hAnsi="Garamond"/>
+          <w:color w:val="000000"/>
+          <w:kern w:val="0"/>
+          <w:sz w:val="36"/>
+          <w:szCs w:val="36"/>
+          <w:shd w:fill="auto" w:val="clear"/>
+          <w:lang w:val="en-US" w:eastAsia="zh-CN" w:bidi="hi-IN"/>
+        </w:rPr>
+        <w:t xml:space="preserve"> </w:t>
+      </w:r>
+      <w:r>
+        <w:rPr>
+          <w:rFonts w:eastAsia="Times New Roman" w:cs="Times New Roman" w:ascii="Garamond" w:hAnsi="Garamond"/>
+          <w:color w:val="000000"/>
+          <w:kern w:val="0"/>
+          <w:sz w:val="36"/>
+          <w:szCs w:val="36"/>
+          <w:shd w:fill="auto" w:val="clear"/>
+          <w:lang w:val="en-US" w:eastAsia="zh-CN" w:bidi="hi-IN"/>
+        </w:rPr>
+        <w:t>Humanidade está madura para subir um degrau,</w:t>
+      </w:r>
+      <w:r>
+        <w:rPr>
+          <w:rFonts w:eastAsia="Times New Roman" w:cs="Times New Roman" w:ascii="Garamond" w:hAnsi="Garamond"/>
+          <w:color w:val="000000"/>
+          <w:kern w:val="0"/>
+          <w:sz w:val="36"/>
+          <w:szCs w:val="36"/>
+          <w:shd w:fill="auto" w:val="clear"/>
+          <w:lang w:val="en-US" w:eastAsia="zh-CN" w:bidi="hi-IN"/>
+        </w:rPr>
+        <w:t xml:space="preserve"> ou seja, quando a humanidade já recebeu conhecimento suficiente para elevar-se um pouco mais, então</w:t>
+      </w:r>
+      <w:r>
+        <w:rPr>
+          <w:rFonts w:eastAsia="Times New Roman" w:cs="Times New Roman" w:ascii="Garamond" w:hAnsi="Garamond"/>
+          <w:color w:val="000000"/>
+          <w:kern w:val="0"/>
+          <w:sz w:val="36"/>
+          <w:szCs w:val="36"/>
+          <w:shd w:fill="auto" w:val="clear"/>
+          <w:lang w:val="en-US" w:eastAsia="zh-CN" w:bidi="hi-IN"/>
+        </w:rPr>
+        <w:t xml:space="preserve"> pode dizer</w:t>
+      </w:r>
+      <w:r>
+        <w:rPr>
+          <w:rFonts w:eastAsia="Times New Roman" w:cs="Times New Roman" w:ascii="Garamond" w:hAnsi="Garamond"/>
+          <w:color w:val="000000"/>
+          <w:kern w:val="0"/>
+          <w:sz w:val="36"/>
+          <w:szCs w:val="36"/>
+          <w:shd w:fill="auto" w:val="clear"/>
+          <w:lang w:val="en-US" w:eastAsia="zh-CN" w:bidi="hi-IN"/>
+        </w:rPr>
+        <w:t>-s</w:t>
+      </w:r>
+      <w:r>
+        <w:rPr>
+          <w:rFonts w:eastAsia="Times New Roman" w:cs="Times New Roman" w:ascii="Garamond" w:hAnsi="Garamond"/>
+          <w:color w:val="000000"/>
+          <w:kern w:val="0"/>
+          <w:sz w:val="36"/>
+          <w:szCs w:val="36"/>
+          <w:shd w:fill="auto" w:val="clear"/>
+          <w:lang w:val="en-US" w:eastAsia="zh-CN" w:bidi="hi-IN"/>
+        </w:rPr>
+        <w:t>e que são chegados os</w:t>
+      </w:r>
+      <w:r>
+        <w:rPr>
+          <w:rFonts w:eastAsia="Times New Roman" w:cs="Times New Roman" w:ascii="Garamond" w:hAnsi="Garamond"/>
+          <w:color w:val="000000"/>
+          <w:kern w:val="0"/>
+          <w:sz w:val="36"/>
+          <w:szCs w:val="36"/>
+          <w:shd w:fill="auto" w:val="clear"/>
+          <w:lang w:val="en-US" w:eastAsia="zh-CN" w:bidi="hi-IN"/>
+        </w:rPr>
+        <w:t xml:space="preserve"> </w:t>
+      </w:r>
+      <w:r>
+        <w:rPr>
+          <w:rFonts w:eastAsia="Times New Roman" w:cs="Times New Roman" w:ascii="Garamond" w:hAnsi="Garamond"/>
+          <w:color w:val="000000"/>
+          <w:kern w:val="0"/>
+          <w:sz w:val="36"/>
+          <w:szCs w:val="36"/>
+          <w:shd w:fill="auto" w:val="clear"/>
+          <w:lang w:val="en-US" w:eastAsia="zh-CN" w:bidi="hi-IN"/>
+        </w:rPr>
+        <w:t>tempos marcados por Deus</w:t>
+      </w:r>
+      <w:r>
+        <w:rPr>
+          <w:rFonts w:eastAsia="Times New Roman" w:cs="Times New Roman" w:ascii="Garamond" w:hAnsi="Garamond"/>
+          <w:color w:val="000000"/>
+          <w:kern w:val="0"/>
+          <w:sz w:val="36"/>
+          <w:szCs w:val="36"/>
+          <w:shd w:fill="auto" w:val="clear"/>
+          <w:lang w:val="en-US" w:eastAsia="zh-CN" w:bidi="hi-IN"/>
+        </w:rPr>
+        <w:t>.</w:t>
+      </w:r>
+    </w:p>
+    <w:p>
+      <w:pPr>
+        <w:pStyle w:val="Normal"/>
+        <w:jc w:val="both"/>
+        <w:rPr>
+          <w:rFonts w:ascii="Garamond" w:hAnsi="Garamond" w:eastAsia="Times New Roman" w:cs="Times New Roman"/>
+          <w:color w:val="000000"/>
+          <w:kern w:val="0"/>
+          <w:sz w:val="36"/>
+          <w:szCs w:val="36"/>
+          <w:shd w:fill="auto" w:val="clear"/>
+          <w:lang w:val="en-US" w:eastAsia="zh-CN" w:bidi="hi-IN"/>
+        </w:rPr>
+      </w:pPr>
+      <w:r>
+        <w:rPr>
+          <w:rFonts w:eastAsia="Times New Roman" w:cs="Times New Roman" w:ascii="Garamond" w:hAnsi="Garamond"/>
+          <w:color w:val="000000"/>
+          <w:kern w:val="0"/>
+          <w:sz w:val="36"/>
+          <w:szCs w:val="36"/>
+          <w:shd w:fill="auto" w:val="clear"/>
+          <w:lang w:val="en-US" w:eastAsia="zh-CN" w:bidi="hi-IN"/>
+        </w:rPr>
+      </w:r>
+    </w:p>
+    <w:p>
+      <w:pPr>
+        <w:pStyle w:val="Normal"/>
+        <w:jc w:val="both"/>
+        <w:rPr>
+          <w:rFonts w:ascii="Garamond" w:hAnsi="Garamond" w:eastAsia="Times New Roman" w:cs="Times New Roman"/>
+          <w:color w:val="000000"/>
+          <w:kern w:val="0"/>
+          <w:sz w:val="36"/>
+          <w:szCs w:val="36"/>
+          <w:shd w:fill="auto" w:val="clear"/>
+          <w:lang w:val="en-US" w:eastAsia="zh-CN" w:bidi="hi-IN"/>
+        </w:rPr>
+      </w:pPr>
+      <w:r>
+        <w:rPr>
+          <w:rFonts w:eastAsia="Times New Roman" w:cs="Times New Roman" w:ascii="Garamond" w:hAnsi="Garamond"/>
+          <w:color w:val="000000"/>
+          <w:kern w:val="0"/>
+          <w:sz w:val="36"/>
+          <w:szCs w:val="36"/>
+          <w:shd w:fill="auto" w:val="clear"/>
+          <w:lang w:val="en-US" w:eastAsia="zh-CN" w:bidi="hi-IN"/>
+        </w:rPr>
+        <w:t>Disse ainda Kardec que haveria uma grande transformação moral da humanidade, mas isso não acontecerá de maneira suave. Haveria lutas de ideias e perturbações até que todas as coisas se assentem. As castrátofes e os cataclismos que muitos imaginaram que aconteceriam com o planeta, na verdade acontecerão no íntimo do ser humano.</w:t>
+      </w:r>
+    </w:p>
+    <w:p>
+      <w:pPr>
+        <w:pStyle w:val="Normal"/>
+        <w:jc w:val="both"/>
+        <w:rPr>
+          <w:rFonts w:ascii="Garamond" w:hAnsi="Garamond" w:eastAsia="Times New Roman" w:cs="Times New Roman"/>
+          <w:color w:val="000000"/>
+          <w:kern w:val="0"/>
+          <w:sz w:val="36"/>
+          <w:szCs w:val="36"/>
+          <w:shd w:fill="auto" w:val="clear"/>
+          <w:lang w:val="en-US" w:eastAsia="zh-CN" w:bidi="hi-IN"/>
+        </w:rPr>
+      </w:pPr>
+      <w:r>
+        <w:rPr>
+          <w:rFonts w:eastAsia="Times New Roman" w:cs="Times New Roman" w:ascii="Garamond" w:hAnsi="Garamond"/>
+          <w:color w:val="000000"/>
+          <w:kern w:val="0"/>
+          <w:sz w:val="36"/>
+          <w:szCs w:val="36"/>
+          <w:shd w:fill="auto" w:val="clear"/>
+          <w:lang w:val="en-US" w:eastAsia="zh-CN" w:bidi="hi-IN"/>
+        </w:rPr>
+      </w:r>
+    </w:p>
+    <w:p>
+      <w:pPr>
+        <w:pStyle w:val="Normal"/>
+        <w:jc w:val="both"/>
+        <w:rPr>
+          <w:rFonts w:ascii="Garamond" w:hAnsi="Garamond" w:eastAsia="Times New Roman" w:cs="Times New Roman"/>
+          <w:color w:val="000000"/>
+          <w:kern w:val="0"/>
+          <w:sz w:val="36"/>
+          <w:szCs w:val="36"/>
+          <w:shd w:fill="auto" w:val="clear"/>
+          <w:lang w:val="en-US" w:eastAsia="zh-CN" w:bidi="hi-IN"/>
+        </w:rPr>
+      </w:pPr>
+      <w:r>
+        <w:rPr>
+          <w:rFonts w:eastAsia="Times New Roman" w:cs="Times New Roman" w:ascii="Garamond" w:hAnsi="Garamond"/>
+          <w:color w:val="000000"/>
+          <w:kern w:val="0"/>
+          <w:sz w:val="36"/>
+          <w:szCs w:val="36"/>
+          <w:shd w:fill="auto" w:val="clear"/>
+          <w:lang w:val="en-US" w:eastAsia="zh-CN" w:bidi="hi-IN"/>
+        </w:rPr>
+        <w:t>Se olharmos o mundo à nossa volta perceberemos que essa já é a nossa realidade. Já estamos vivendo os tempos previstos por Kardec.</w:t>
+      </w:r>
+    </w:p>
+    <w:p>
+      <w:pPr>
+        <w:pStyle w:val="Normal"/>
+        <w:jc w:val="both"/>
+        <w:rPr>
+          <w:rFonts w:ascii="Garamond" w:hAnsi="Garamond" w:eastAsia="Times New Roman" w:cs="Times New Roman"/>
+          <w:color w:val="000000"/>
+          <w:kern w:val="0"/>
+          <w:sz w:val="36"/>
+          <w:szCs w:val="36"/>
+          <w:shd w:fill="auto" w:val="clear"/>
+          <w:lang w:val="en-US" w:eastAsia="zh-CN" w:bidi="hi-IN"/>
+        </w:rPr>
+      </w:pPr>
+      <w:r>
+        <w:rPr>
+          <w:rFonts w:eastAsia="Times New Roman" w:cs="Times New Roman" w:ascii="Garamond" w:hAnsi="Garamond"/>
+          <w:color w:val="000000"/>
+          <w:kern w:val="0"/>
+          <w:sz w:val="36"/>
+          <w:szCs w:val="36"/>
+          <w:shd w:fill="auto" w:val="clear"/>
+          <w:lang w:val="en-US" w:eastAsia="zh-CN" w:bidi="hi-IN"/>
+        </w:rPr>
+      </w:r>
+    </w:p>
+    <w:p>
+      <w:pPr>
+        <w:pStyle w:val="Normal"/>
+        <w:jc w:val="both"/>
+        <w:rPr>
+          <w:rFonts w:ascii="Garamond" w:hAnsi="Garamond" w:eastAsia="Times New Roman" w:cs="Times New Roman"/>
+          <w:color w:val="1C99E0"/>
+          <w:kern w:val="0"/>
+          <w:sz w:val="36"/>
+          <w:szCs w:val="36"/>
+          <w:shd w:fill="auto" w:val="clear"/>
+          <w:lang w:val="en-US" w:eastAsia="zh-CN" w:bidi="hi-IN"/>
+        </w:rPr>
+      </w:pPr>
+      <w:r>
+        <w:rPr>
+          <w:rFonts w:eastAsia="Times New Roman" w:cs="Times New Roman" w:ascii="Garamond" w:hAnsi="Garamond"/>
+          <w:color w:val="1C99E0"/>
+          <w:kern w:val="0"/>
+          <w:sz w:val="36"/>
+          <w:szCs w:val="36"/>
+          <w:shd w:fill="auto" w:val="clear"/>
+          <w:lang w:val="en-US" w:eastAsia="zh-CN" w:bidi="hi-IN"/>
+        </w:rPr>
+        <w:t>[ Parei aqui em 05/12. Prosseguir desse ponto trazendo comentários sobre Brasil Coração do Mundo... ]</w:t>
+      </w:r>
+    </w:p>
+    <w:p>
+      <w:pPr>
+        <w:pStyle w:val="Normal"/>
+        <w:jc w:val="both"/>
+        <w:rPr>
+          <w:rFonts w:ascii="Garamond" w:hAnsi="Garamond" w:eastAsia="Times New Roman" w:cs="Times New Roman"/>
+          <w:i/>
+          <w:i/>
+          <w:iCs/>
+          <w:color w:val="000000"/>
+          <w:kern w:val="0"/>
+          <w:sz w:val="36"/>
+          <w:szCs w:val="36"/>
+          <w:shd w:fill="auto" w:val="clear"/>
+          <w:lang w:val="en-US" w:eastAsia="zh-CN" w:bidi="hi-IN"/>
+        </w:rPr>
+      </w:pPr>
+      <w:r>
+        <w:rPr>
+          <w:rFonts w:eastAsia="Times New Roman" w:cs="Times New Roman" w:ascii="Garamond" w:hAnsi="Garamond"/>
+          <w:i/>
+          <w:iCs/>
+          <w:color w:val="000000"/>
+          <w:kern w:val="0"/>
+          <w:sz w:val="36"/>
+          <w:szCs w:val="36"/>
+          <w:shd w:fill="auto" w:val="clear"/>
+          <w:lang w:val="en-US" w:eastAsia="zh-CN" w:bidi="hi-IN"/>
+        </w:rPr>
+      </w:r>
+    </w:p>
+    <w:p>
+      <w:pPr>
+        <w:pStyle w:val="Normal"/>
+        <w:jc w:val="both"/>
+        <w:rPr>
+          <w:rFonts w:ascii="Garamond" w:hAnsi="Garamond" w:eastAsia="Times New Roman" w:cs="Times New Roman"/>
+          <w:color w:val="000000"/>
+          <w:kern w:val="0"/>
+          <w:sz w:val="36"/>
+          <w:szCs w:val="36"/>
+          <w:shd w:fill="auto" w:val="clear"/>
+          <w:lang w:val="en-US" w:eastAsia="zh-CN" w:bidi="hi-IN"/>
+        </w:rPr>
+      </w:pPr>
+      <w:r>
+        <w:rPr>
+          <w:rFonts w:eastAsia="Times New Roman" w:cs="Times New Roman" w:ascii="Garamond" w:hAnsi="Garamond"/>
+          <w:color w:val="000000"/>
+          <w:kern w:val="0"/>
+          <w:sz w:val="36"/>
+          <w:szCs w:val="36"/>
+          <w:shd w:fill="auto" w:val="clear"/>
+          <w:lang w:val="en-US" w:eastAsia="zh-CN" w:bidi="hi-IN"/>
+        </w:rPr>
+      </w:r>
+    </w:p>
+    <w:p>
+      <w:pPr>
+        <w:pStyle w:val="Normal"/>
+        <w:jc w:val="both"/>
+        <w:rPr>
+          <w:rFonts w:ascii="Garamond" w:hAnsi="Garamond" w:eastAsia="Times New Roman" w:cs="Times New Roman"/>
+          <w:color w:val="000000"/>
+          <w:kern w:val="0"/>
+          <w:sz w:val="36"/>
+          <w:szCs w:val="36"/>
+          <w:shd w:fill="auto" w:val="clear"/>
+          <w:lang w:val="en-US" w:eastAsia="zh-CN" w:bidi="hi-IN"/>
+        </w:rPr>
+      </w:pPr>
+      <w:r>
+        <w:rPr>
+          <w:rFonts w:eastAsia="Times New Roman" w:cs="Times New Roman" w:ascii="Garamond" w:hAnsi="Garamond"/>
+          <w:color w:val="000000"/>
+          <w:kern w:val="0"/>
+          <w:sz w:val="36"/>
+          <w:szCs w:val="36"/>
+          <w:shd w:fill="auto" w:val="clear"/>
+          <w:lang w:val="en-US" w:eastAsia="zh-CN" w:bidi="hi-IN"/>
+        </w:rPr>
+      </w:r>
+    </w:p>
+    <w:p>
+      <w:pPr>
+        <w:pStyle w:val="Normal"/>
+        <w:jc w:val="both"/>
+        <w:rPr>
+          <w:rFonts w:ascii="Garamond" w:hAnsi="Garamond" w:eastAsia="Times New Roman" w:cs="Times New Roman"/>
+          <w:color w:val="000000"/>
+          <w:kern w:val="0"/>
+          <w:sz w:val="36"/>
+          <w:szCs w:val="36"/>
+          <w:shd w:fill="auto" w:val="clear"/>
+          <w:lang w:val="en-US" w:eastAsia="zh-CN" w:bidi="hi-IN"/>
+        </w:rPr>
+      </w:pPr>
+      <w:r>
+        <w:rPr>
+          <w:rFonts w:eastAsia="Times New Roman" w:cs="Times New Roman" w:ascii="Garamond" w:hAnsi="Garamond"/>
+          <w:color w:val="000000"/>
+          <w:kern w:val="0"/>
+          <w:sz w:val="36"/>
+          <w:szCs w:val="36"/>
+          <w:shd w:fill="auto" w:val="clear"/>
+          <w:lang w:val="en-US" w:eastAsia="zh-CN" w:bidi="hi-IN"/>
+        </w:rPr>
+        <w:t xml:space="preserve">Como reagimos diante do mal e dos maus? Desejamos que sejam mortos, destruídos? Ou nos unimos a eles em seus atos? </w:t>
+      </w:r>
+    </w:p>
+    <w:p>
+      <w:pPr>
+        <w:pStyle w:val="Normal"/>
+        <w:jc w:val="both"/>
+        <w:rPr>
+          <w:rFonts w:ascii="Garamond" w:hAnsi="Garamond" w:eastAsia="Times New Roman" w:cs="Times New Roman"/>
+          <w:color w:val="000000"/>
+          <w:kern w:val="0"/>
+          <w:sz w:val="36"/>
+          <w:szCs w:val="36"/>
+          <w:shd w:fill="auto" w:val="clear"/>
+          <w:lang w:val="en-US" w:eastAsia="zh-CN" w:bidi="hi-IN"/>
+        </w:rPr>
+      </w:pPr>
+      <w:r>
+        <w:rPr>
+          <w:rFonts w:eastAsia="Times New Roman" w:cs="Times New Roman" w:ascii="Garamond" w:hAnsi="Garamond"/>
+          <w:color w:val="000000"/>
+          <w:kern w:val="0"/>
+          <w:sz w:val="36"/>
+          <w:szCs w:val="36"/>
+          <w:shd w:fill="auto" w:val="clear"/>
+          <w:lang w:val="en-US" w:eastAsia="zh-CN" w:bidi="hi-IN"/>
+        </w:rPr>
+        <w:t>O contato com o mal é a prova pela qual temos que passar. A maneira como agimos e reagimos perante o mal determinará se continuaremos na Terra em regeneração ou se seremos rebaixados a mundos inferiores.</w:t>
+      </w:r>
+    </w:p>
+    <w:p>
+      <w:pPr>
+        <w:pStyle w:val="Normal"/>
+        <w:jc w:val="both"/>
+        <w:rPr>
+          <w:rFonts w:ascii="Garamond" w:hAnsi="Garamond" w:eastAsia="Times New Roman" w:cs="Times New Roman"/>
+          <w:color w:val="000000"/>
+          <w:kern w:val="0"/>
+          <w:sz w:val="36"/>
+          <w:szCs w:val="36"/>
+          <w:shd w:fill="auto" w:val="clear"/>
+          <w:lang w:val="en-US" w:eastAsia="zh-CN" w:bidi="hi-IN"/>
+        </w:rPr>
+      </w:pPr>
+      <w:r>
+        <w:rPr>
+          <w:rFonts w:eastAsia="Times New Roman" w:cs="Times New Roman" w:ascii="Garamond" w:hAnsi="Garamond"/>
+          <w:color w:val="000000"/>
+          <w:kern w:val="0"/>
+          <w:sz w:val="36"/>
+          <w:szCs w:val="36"/>
+          <w:shd w:fill="auto" w:val="clear"/>
+          <w:lang w:val="en-US" w:eastAsia="zh-CN" w:bidi="hi-IN"/>
+        </w:rPr>
+        <w:t>Falar sobre o engano que muitos espíritas cometem a respeito do Brasil ser a pátria do evangelho.</w:t>
+      </w:r>
+    </w:p>
+    <w:p>
+      <w:pPr>
+        <w:pStyle w:val="Normal"/>
+        <w:jc w:val="both"/>
+        <w:rPr>
+          <w:rFonts w:ascii="Garamond" w:hAnsi="Garamond" w:eastAsia="Times New Roman" w:cs="Times New Roman"/>
+          <w:color w:val="000000"/>
+          <w:kern w:val="0"/>
+          <w:sz w:val="36"/>
+          <w:szCs w:val="36"/>
+          <w:shd w:fill="auto" w:val="clear"/>
+          <w:lang w:val="en-US" w:eastAsia="zh-CN" w:bidi="hi-IN"/>
+        </w:rPr>
+      </w:pPr>
+      <w:r>
+        <w:rPr>
+          <w:rFonts w:eastAsia="Times New Roman" w:cs="Times New Roman" w:ascii="Garamond" w:hAnsi="Garamond"/>
+          <w:color w:val="000000"/>
+          <w:kern w:val="0"/>
+          <w:sz w:val="36"/>
+          <w:szCs w:val="36"/>
+          <w:shd w:fill="auto" w:val="clear"/>
+          <w:lang w:val="en-US" w:eastAsia="zh-CN" w:bidi="hi-IN"/>
+        </w:rPr>
+        <w:t xml:space="preserve">Mencionar que os tempos atuais exigem de nós o amor a Deus, ao próximo e a nós mesmos. </w:t>
+      </w:r>
+    </w:p>
+    <w:p>
+      <w:pPr>
+        <w:pStyle w:val="Normal"/>
+        <w:jc w:val="both"/>
+        <w:rPr>
+          <w:rFonts w:ascii="Garamond" w:hAnsi="Garamond" w:eastAsia="Times New Roman" w:cs="Times New Roman"/>
+          <w:color w:val="000000"/>
+          <w:kern w:val="0"/>
+          <w:sz w:val="36"/>
+          <w:szCs w:val="36"/>
+          <w:shd w:fill="auto" w:val="clear"/>
+          <w:lang w:val="en-US" w:eastAsia="zh-CN" w:bidi="hi-IN"/>
+        </w:rPr>
+      </w:pPr>
+      <w:r>
+        <w:rPr>
+          <w:rFonts w:eastAsia="Times New Roman" w:cs="Times New Roman" w:ascii="Garamond" w:hAnsi="Garamond"/>
+          <w:color w:val="000000"/>
+          <w:kern w:val="0"/>
+          <w:sz w:val="36"/>
+          <w:szCs w:val="36"/>
+          <w:shd w:fill="auto" w:val="clear"/>
+          <w:lang w:val="en-US" w:eastAsia="zh-CN" w:bidi="hi-IN"/>
+        </w:rPr>
+      </w:r>
+    </w:p>
+    <w:p>
+      <w:pPr>
+        <w:pStyle w:val="Normal"/>
+        <w:jc w:val="both"/>
+        <w:rPr>
+          <w:rFonts w:ascii="Garamond" w:hAnsi="Garamond" w:eastAsia="Times New Roman" w:cs="Times New Roman"/>
+          <w:color w:val="000000"/>
+          <w:kern w:val="0"/>
+          <w:sz w:val="36"/>
+          <w:szCs w:val="36"/>
+          <w:shd w:fill="auto" w:val="clear"/>
+          <w:lang w:val="en-US" w:eastAsia="zh-CN" w:bidi="hi-IN"/>
+        </w:rPr>
+      </w:pPr>
+      <w:r>
+        <w:rPr>
+          <w:rFonts w:eastAsia="Times New Roman" w:cs="Times New Roman" w:ascii="Garamond" w:hAnsi="Garamond"/>
+          <w:color w:val="000000"/>
+          <w:kern w:val="0"/>
+          <w:sz w:val="36"/>
+          <w:szCs w:val="36"/>
+          <w:shd w:fill="auto" w:val="clear"/>
+          <w:lang w:val="en-US" w:eastAsia="zh-CN" w:bidi="hi-IN"/>
+        </w:rPr>
+      </w:r>
+    </w:p>
+    <w:p>
+      <w:pPr>
+        <w:pStyle w:val="Normal"/>
+        <w:jc w:val="both"/>
+        <w:rPr>
+          <w:rFonts w:ascii="Garamond" w:hAnsi="Garamond" w:eastAsia="Times New Roman" w:cs="Times New Roman"/>
+          <w:color w:val="000000"/>
+          <w:kern w:val="0"/>
+          <w:sz w:val="36"/>
+          <w:szCs w:val="36"/>
+          <w:shd w:fill="auto" w:val="clear"/>
+          <w:lang w:val="en-US" w:eastAsia="zh-CN" w:bidi="hi-IN"/>
+        </w:rPr>
+      </w:pPr>
+      <w:r>
+        <w:rPr>
+          <w:rFonts w:eastAsia="Times New Roman" w:cs="Times New Roman" w:ascii="Garamond" w:hAnsi="Garamond"/>
+          <w:color w:val="000000"/>
+          <w:kern w:val="0"/>
+          <w:sz w:val="36"/>
+          <w:szCs w:val="36"/>
+          <w:shd w:fill="auto" w:val="clear"/>
+          <w:lang w:val="en-US" w:eastAsia="zh-CN" w:bidi="hi-IN"/>
+        </w:rPr>
+      </w:r>
+    </w:p>
+    <w:p>
+      <w:pPr>
+        <w:pStyle w:val="Normal"/>
+        <w:jc w:val="both"/>
+        <w:rPr>
+          <w:rFonts w:ascii="Garamond" w:hAnsi="Garamond" w:eastAsia="Times New Roman" w:cs="Times New Roman"/>
+          <w:color w:val="000000"/>
+          <w:kern w:val="0"/>
+          <w:sz w:val="36"/>
+          <w:szCs w:val="36"/>
+          <w:shd w:fill="auto" w:val="clear"/>
+          <w:lang w:val="en-US" w:eastAsia="zh-CN" w:bidi="hi-IN"/>
+        </w:rPr>
+      </w:pPr>
+      <w:r>
+        <w:rPr>
+          <w:rFonts w:eastAsia="Times New Roman" w:cs="Times New Roman" w:ascii="Garamond" w:hAnsi="Garamond"/>
+          <w:i/>
+          <w:iCs/>
+          <w:color w:val="000000"/>
+          <w:kern w:val="0"/>
+          <w:sz w:val="36"/>
+          <w:szCs w:val="36"/>
+          <w:shd w:fill="auto" w:val="clear"/>
+          <w:lang w:val="en-US" w:eastAsia="zh-CN" w:bidi="hi-IN"/>
+        </w:rPr>
+        <w:t>Resta</w:t>
+      </w:r>
+      <w:r>
+        <w:rPr>
+          <w:rFonts w:eastAsia="Times New Roman" w:cs="Times New Roman" w:ascii="Garamond" w:hAnsi="Garamond"/>
+          <w:i/>
+          <w:iCs/>
+          <w:color w:val="000000"/>
+          <w:kern w:val="0"/>
+          <w:sz w:val="36"/>
+          <w:szCs w:val="36"/>
+          <w:shd w:fill="auto" w:val="clear"/>
+          <w:lang w:val="en-US" w:eastAsia="zh-CN" w:bidi="hi-IN"/>
+        </w:rPr>
+        <w:t>-</w:t>
+      </w:r>
+      <w:r>
+        <w:rPr>
+          <w:rFonts w:eastAsia="Times New Roman" w:cs="Times New Roman" w:ascii="Garamond" w:hAnsi="Garamond"/>
+          <w:i/>
+          <w:iCs/>
+          <w:color w:val="000000"/>
+          <w:kern w:val="0"/>
+          <w:sz w:val="36"/>
+          <w:szCs w:val="36"/>
+          <w:shd w:fill="auto" w:val="clear"/>
+          <w:lang w:val="en-US" w:eastAsia="zh-CN" w:bidi="hi-IN"/>
+        </w:rPr>
+        <w:t>lhes ainda um imenso progresso a realizar: o de fazerem que</w:t>
+      </w:r>
+      <w:r>
+        <w:rPr>
+          <w:rFonts w:eastAsia="Times New Roman" w:cs="Times New Roman" w:ascii="Garamond" w:hAnsi="Garamond"/>
+          <w:i/>
+          <w:iCs/>
+          <w:color w:val="000000"/>
+          <w:kern w:val="0"/>
+          <w:sz w:val="36"/>
+          <w:szCs w:val="36"/>
+          <w:shd w:fill="auto" w:val="clear"/>
+          <w:lang w:val="en-US" w:eastAsia="zh-CN" w:bidi="hi-IN"/>
+        </w:rPr>
+        <w:t xml:space="preserve"> </w:t>
+      </w:r>
+      <w:r>
+        <w:rPr>
+          <w:rFonts w:eastAsia="Times New Roman" w:cs="Times New Roman" w:ascii="Garamond" w:hAnsi="Garamond"/>
+          <w:i/>
+          <w:iCs/>
+          <w:color w:val="000000"/>
+          <w:kern w:val="0"/>
+          <w:sz w:val="36"/>
+          <w:szCs w:val="36"/>
+          <w:shd w:fill="auto" w:val="clear"/>
+          <w:lang w:val="en-US" w:eastAsia="zh-CN" w:bidi="hi-IN"/>
+        </w:rPr>
+        <w:t>entre si reinem a caridade, a fraternidade, a solidariedade, que lhes assegurem o</w:t>
+      </w:r>
+      <w:r>
+        <w:rPr>
+          <w:rFonts w:eastAsia="Times New Roman" w:cs="Times New Roman" w:ascii="Garamond" w:hAnsi="Garamond"/>
+          <w:i/>
+          <w:iCs/>
+          <w:color w:val="000000"/>
+          <w:kern w:val="0"/>
+          <w:sz w:val="36"/>
+          <w:szCs w:val="36"/>
+          <w:shd w:fill="auto" w:val="clear"/>
+          <w:lang w:val="en-US" w:eastAsia="zh-CN" w:bidi="hi-IN"/>
+        </w:rPr>
+        <w:t xml:space="preserve"> </w:t>
+      </w:r>
+      <w:r>
+        <w:rPr>
+          <w:rFonts w:eastAsia="Times New Roman" w:cs="Times New Roman" w:ascii="Garamond" w:hAnsi="Garamond"/>
+          <w:i/>
+          <w:iCs/>
+          <w:color w:val="000000"/>
+          <w:kern w:val="0"/>
+          <w:sz w:val="36"/>
+          <w:szCs w:val="36"/>
+          <w:shd w:fill="auto" w:val="clear"/>
+          <w:lang w:val="en-US" w:eastAsia="zh-CN" w:bidi="hi-IN"/>
+        </w:rPr>
+        <w:t>bem</w:t>
+      </w:r>
+      <w:r>
+        <w:rPr>
+          <w:rFonts w:eastAsia="Times New Roman" w:cs="Times New Roman" w:ascii="Garamond" w:hAnsi="Garamond"/>
+          <w:i/>
+          <w:iCs/>
+          <w:color w:val="000000"/>
+          <w:kern w:val="0"/>
+          <w:sz w:val="36"/>
+          <w:szCs w:val="36"/>
+          <w:shd w:fill="auto" w:val="clear"/>
+          <w:lang w:val="en-US" w:eastAsia="zh-CN" w:bidi="hi-IN"/>
+        </w:rPr>
+        <w:t>-</w:t>
+      </w:r>
+      <w:r>
+        <w:rPr>
+          <w:rFonts w:eastAsia="Times New Roman" w:cs="Times New Roman" w:ascii="Garamond" w:hAnsi="Garamond"/>
+          <w:i/>
+          <w:iCs/>
+          <w:color w:val="000000"/>
+          <w:kern w:val="0"/>
+          <w:sz w:val="36"/>
+          <w:szCs w:val="36"/>
+          <w:shd w:fill="auto" w:val="clear"/>
+          <w:lang w:val="en-US" w:eastAsia="zh-CN" w:bidi="hi-IN"/>
+        </w:rPr>
+        <w:t>estar moral.</w:t>
       </w:r>
     </w:p>
     <w:p>
@@ -5526,10 +6766,7 @@
         </w:rPr>
       </w:pPr>
       <w:r>
-        <w:rPr>
-          <w:sz w:val="36"/>
-          <w:szCs w:val="36"/>
-        </w:rPr>
+        <w:rPr/>
       </w:r>
     </w:p>
     <w:sectPr>
@@ -5601,7 +6838,7 @@
         <w:bCs/>
         <w:rFonts w:ascii="Garamond" w:hAnsi="Garamond"/>
       </w:rPr>
-      <w:t>28</w:t>
+      <w:t>29</w:t>
     </w:r>
     <w:r>
       <w:rPr>

</xml_diff>

<commit_message>
06/12/2025 - 23:07 h
</commit_message>
<xml_diff>
--- a/O mandamento maior/O Mandamento Maior.docx
+++ b/O mandamento maior/O Mandamento Maior.docx
@@ -5613,115 +5613,7 @@
           <w:shd w:fill="auto" w:val="clear"/>
           <w:lang w:val="en-US" w:eastAsia="zh-CN" w:bidi="hi-IN"/>
         </w:rPr>
-        <w:t xml:space="preserve">Fisicamente falando, a Terra também progride, </w:t>
-      </w:r>
-      <w:r>
-        <w:rPr>
-          <w:rFonts w:eastAsia="Times New Roman" w:cs="Times New Roman" w:ascii="Garamond" w:hAnsi="Garamond"/>
-          <w:color w:val="000000"/>
-          <w:kern w:val="0"/>
-          <w:sz w:val="36"/>
-          <w:szCs w:val="36"/>
-          <w:shd w:fill="auto" w:val="clear"/>
-          <w:lang w:val="en-US" w:eastAsia="zh-CN" w:bidi="hi-IN"/>
-        </w:rPr>
-        <w:t xml:space="preserve">e por isso sofre transformação de seus elementos, </w:t>
-      </w:r>
-      <w:r>
-        <w:rPr>
-          <w:rFonts w:eastAsia="Times New Roman" w:cs="Times New Roman" w:ascii="Garamond" w:hAnsi="Garamond"/>
-          <w:color w:val="000000"/>
-          <w:kern w:val="0"/>
-          <w:sz w:val="36"/>
-          <w:szCs w:val="36"/>
-          <w:shd w:fill="auto" w:val="clear"/>
-          <w:lang w:val="en-US" w:eastAsia="zh-CN" w:bidi="hi-IN"/>
-        </w:rPr>
-        <w:t xml:space="preserve">mas é a </w:t>
-      </w:r>
-      <w:r>
-        <w:rPr>
-          <w:rFonts w:eastAsia="Times New Roman" w:cs="Times New Roman" w:ascii="Garamond" w:hAnsi="Garamond"/>
-          <w:color w:val="000000"/>
-          <w:kern w:val="0"/>
-          <w:sz w:val="36"/>
-          <w:szCs w:val="36"/>
-          <w:shd w:fill="auto" w:val="clear"/>
-          <w:lang w:val="en-US" w:eastAsia="zh-CN" w:bidi="hi-IN"/>
-        </w:rPr>
-        <w:t>transformação da humanidade</w:t>
-      </w:r>
-      <w:r>
-        <w:rPr>
-          <w:rFonts w:eastAsia="Times New Roman" w:cs="Times New Roman" w:ascii="Garamond" w:hAnsi="Garamond"/>
-          <w:color w:val="000000"/>
-          <w:kern w:val="0"/>
-          <w:sz w:val="36"/>
-          <w:szCs w:val="36"/>
-          <w:shd w:fill="auto" w:val="clear"/>
-          <w:lang w:val="en-US" w:eastAsia="zh-CN" w:bidi="hi-IN"/>
-        </w:rPr>
-        <w:t xml:space="preserve"> </w:t>
-      </w:r>
-      <w:r>
-        <w:rPr>
-          <w:rFonts w:eastAsia="Times New Roman" w:cs="Times New Roman" w:ascii="Garamond" w:hAnsi="Garamond"/>
-          <w:color w:val="000000"/>
-          <w:kern w:val="0"/>
-          <w:sz w:val="36"/>
-          <w:szCs w:val="36"/>
-          <w:shd w:fill="auto" w:val="clear"/>
-          <w:lang w:val="en-US" w:eastAsia="zh-CN" w:bidi="hi-IN"/>
-        </w:rPr>
-        <w:t xml:space="preserve">que </w:t>
-      </w:r>
-      <w:r>
-        <w:rPr>
-          <w:rFonts w:eastAsia="Times New Roman" w:cs="Times New Roman" w:ascii="Garamond" w:hAnsi="Garamond"/>
-          <w:color w:val="000000"/>
-          <w:kern w:val="0"/>
-          <w:sz w:val="36"/>
-          <w:szCs w:val="36"/>
-          <w:shd w:fill="auto" w:val="clear"/>
-          <w:lang w:val="en-US" w:eastAsia="zh-CN" w:bidi="hi-IN"/>
-        </w:rPr>
-        <w:t xml:space="preserve">realmente nos </w:t>
-      </w:r>
-      <w:r>
-        <w:rPr>
-          <w:rFonts w:eastAsia="Times New Roman" w:cs="Times New Roman" w:ascii="Garamond" w:hAnsi="Garamond"/>
-          <w:color w:val="000000"/>
-          <w:kern w:val="0"/>
-          <w:sz w:val="36"/>
-          <w:szCs w:val="36"/>
-          <w:shd w:fill="auto" w:val="clear"/>
-          <w:lang w:val="en-US" w:eastAsia="zh-CN" w:bidi="hi-IN"/>
-        </w:rPr>
-        <w:t>interessa</w:t>
-      </w:r>
-      <w:r>
-        <w:rPr>
-          <w:rFonts w:eastAsia="Times New Roman" w:cs="Times New Roman" w:ascii="Garamond" w:hAnsi="Garamond"/>
-          <w:color w:val="000000"/>
-          <w:kern w:val="0"/>
-          <w:sz w:val="36"/>
-          <w:szCs w:val="36"/>
-          <w:shd w:fill="auto" w:val="clear"/>
-          <w:lang w:val="en-US" w:eastAsia="zh-CN" w:bidi="hi-IN"/>
-        </w:rPr>
-        <w:t xml:space="preserve">. O homem </w:t>
-      </w:r>
-      <w:r>
-        <w:rPr>
-          <w:rFonts w:eastAsia="Times New Roman" w:cs="Times New Roman" w:ascii="Garamond" w:hAnsi="Garamond"/>
-          <w:color w:val="000000"/>
-          <w:kern w:val="0"/>
-          <w:sz w:val="36"/>
-          <w:szCs w:val="36"/>
-          <w:shd w:fill="auto" w:val="clear"/>
-          <w:lang w:val="en-US" w:eastAsia="zh-CN" w:bidi="hi-IN"/>
-        </w:rPr>
-        <w:t>evolui pelo desenvolvimento da inteligência e pela depuração do senso moral e dos sentimentos.</w:t>
+        <w:t>Fisicamente falando, a Terra também progride, e por isso sofre transformação de seus elementos, mas é a transformação da humanidade que realmente nos interessa. O homem evolui pelo desenvolvimento da inteligência e pela depuração do senso moral e dos sentimentos.</w:t>
       </w:r>
     </w:p>
     <w:p>
@@ -6039,151 +5931,7 @@
           <w:shd w:fill="auto" w:val="clear"/>
           <w:lang w:val="en-US" w:eastAsia="zh-CN" w:bidi="hi-IN"/>
         </w:rPr>
-        <w:t>Kardec nos esclarece que q</w:t>
-      </w:r>
-      <w:r>
-        <w:rPr>
-          <w:rFonts w:eastAsia="Times New Roman" w:cs="Times New Roman" w:ascii="Garamond" w:hAnsi="Garamond"/>
-          <w:color w:val="000000"/>
-          <w:kern w:val="0"/>
-          <w:sz w:val="36"/>
-          <w:szCs w:val="36"/>
-          <w:shd w:fill="auto" w:val="clear"/>
-          <w:lang w:val="en-US" w:eastAsia="zh-CN" w:bidi="hi-IN"/>
-        </w:rPr>
-        <w:t>uando</w:t>
-      </w:r>
-      <w:r>
-        <w:rPr>
-          <w:rFonts w:eastAsia="Times New Roman" w:cs="Times New Roman" w:ascii="Garamond" w:hAnsi="Garamond"/>
-          <w:color w:val="000000"/>
-          <w:kern w:val="0"/>
-          <w:sz w:val="36"/>
-          <w:szCs w:val="36"/>
-          <w:shd w:fill="auto" w:val="clear"/>
-          <w:lang w:val="en-US" w:eastAsia="zh-CN" w:bidi="hi-IN"/>
-        </w:rPr>
-        <w:t xml:space="preserve"> </w:t>
-      </w:r>
-      <w:r>
-        <w:rPr>
-          <w:rFonts w:eastAsia="Times New Roman" w:cs="Times New Roman" w:ascii="Garamond" w:hAnsi="Garamond"/>
-          <w:color w:val="000000"/>
-          <w:kern w:val="0"/>
-          <w:sz w:val="36"/>
-          <w:szCs w:val="36"/>
-          <w:shd w:fill="auto" w:val="clear"/>
-          <w:lang w:val="en-US" w:eastAsia="zh-CN" w:bidi="hi-IN"/>
-        </w:rPr>
-        <w:t>a</w:t>
-      </w:r>
-      <w:r>
-        <w:rPr>
-          <w:rFonts w:eastAsia="Times New Roman" w:cs="Times New Roman" w:ascii="Garamond" w:hAnsi="Garamond"/>
-          <w:color w:val="000000"/>
-          <w:kern w:val="0"/>
-          <w:sz w:val="36"/>
-          <w:szCs w:val="36"/>
-          <w:shd w:fill="auto" w:val="clear"/>
-          <w:lang w:val="en-US" w:eastAsia="zh-CN" w:bidi="hi-IN"/>
-        </w:rPr>
-        <w:t xml:space="preserve"> </w:t>
-      </w:r>
-      <w:r>
-        <w:rPr>
-          <w:rFonts w:eastAsia="Times New Roman" w:cs="Times New Roman" w:ascii="Garamond" w:hAnsi="Garamond"/>
-          <w:color w:val="000000"/>
-          <w:kern w:val="0"/>
-          <w:sz w:val="36"/>
-          <w:szCs w:val="36"/>
-          <w:shd w:fill="auto" w:val="clear"/>
-          <w:lang w:val="en-US" w:eastAsia="zh-CN" w:bidi="hi-IN"/>
-        </w:rPr>
-        <w:t>Humanidade está madura para subir um degrau,</w:t>
-      </w:r>
-      <w:r>
-        <w:rPr>
-          <w:rFonts w:eastAsia="Times New Roman" w:cs="Times New Roman" w:ascii="Garamond" w:hAnsi="Garamond"/>
-          <w:color w:val="000000"/>
-          <w:kern w:val="0"/>
-          <w:sz w:val="36"/>
-          <w:szCs w:val="36"/>
-          <w:shd w:fill="auto" w:val="clear"/>
-          <w:lang w:val="en-US" w:eastAsia="zh-CN" w:bidi="hi-IN"/>
-        </w:rPr>
-        <w:t xml:space="preserve"> ou seja, quando a humanidade já recebeu conhecimento suficiente para elevar-se um pouco mais, então</w:t>
-      </w:r>
-      <w:r>
-        <w:rPr>
-          <w:rFonts w:eastAsia="Times New Roman" w:cs="Times New Roman" w:ascii="Garamond" w:hAnsi="Garamond"/>
-          <w:color w:val="000000"/>
-          <w:kern w:val="0"/>
-          <w:sz w:val="36"/>
-          <w:szCs w:val="36"/>
-          <w:shd w:fill="auto" w:val="clear"/>
-          <w:lang w:val="en-US" w:eastAsia="zh-CN" w:bidi="hi-IN"/>
-        </w:rPr>
-        <w:t xml:space="preserve"> pode dizer</w:t>
-      </w:r>
-      <w:r>
-        <w:rPr>
-          <w:rFonts w:eastAsia="Times New Roman" w:cs="Times New Roman" w:ascii="Garamond" w:hAnsi="Garamond"/>
-          <w:color w:val="000000"/>
-          <w:kern w:val="0"/>
-          <w:sz w:val="36"/>
-          <w:szCs w:val="36"/>
-          <w:shd w:fill="auto" w:val="clear"/>
-          <w:lang w:val="en-US" w:eastAsia="zh-CN" w:bidi="hi-IN"/>
-        </w:rPr>
-        <w:t>-s</w:t>
-      </w:r>
-      <w:r>
-        <w:rPr>
-          <w:rFonts w:eastAsia="Times New Roman" w:cs="Times New Roman" w:ascii="Garamond" w:hAnsi="Garamond"/>
-          <w:color w:val="000000"/>
-          <w:kern w:val="0"/>
-          <w:sz w:val="36"/>
-          <w:szCs w:val="36"/>
-          <w:shd w:fill="auto" w:val="clear"/>
-          <w:lang w:val="en-US" w:eastAsia="zh-CN" w:bidi="hi-IN"/>
-        </w:rPr>
-        <w:t>e que são chegados os</w:t>
-      </w:r>
-      <w:r>
-        <w:rPr>
-          <w:rFonts w:eastAsia="Times New Roman" w:cs="Times New Roman" w:ascii="Garamond" w:hAnsi="Garamond"/>
-          <w:color w:val="000000"/>
-          <w:kern w:val="0"/>
-          <w:sz w:val="36"/>
-          <w:szCs w:val="36"/>
-          <w:shd w:fill="auto" w:val="clear"/>
-          <w:lang w:val="en-US" w:eastAsia="zh-CN" w:bidi="hi-IN"/>
-        </w:rPr>
-        <w:t xml:space="preserve"> </w:t>
-      </w:r>
-      <w:r>
-        <w:rPr>
-          <w:rFonts w:eastAsia="Times New Roman" w:cs="Times New Roman" w:ascii="Garamond" w:hAnsi="Garamond"/>
-          <w:color w:val="000000"/>
-          <w:kern w:val="0"/>
-          <w:sz w:val="36"/>
-          <w:szCs w:val="36"/>
-          <w:shd w:fill="auto" w:val="clear"/>
-          <w:lang w:val="en-US" w:eastAsia="zh-CN" w:bidi="hi-IN"/>
-        </w:rPr>
-        <w:t>tempos marcados por Deus</w:t>
-      </w:r>
-      <w:r>
-        <w:rPr>
-          <w:rFonts w:eastAsia="Times New Roman" w:cs="Times New Roman" w:ascii="Garamond" w:hAnsi="Garamond"/>
-          <w:color w:val="000000"/>
-          <w:kern w:val="0"/>
-          <w:sz w:val="36"/>
-          <w:szCs w:val="36"/>
-          <w:shd w:fill="auto" w:val="clear"/>
-          <w:lang w:val="en-US" w:eastAsia="zh-CN" w:bidi="hi-IN"/>
-        </w:rPr>
-        <w:t>.</w:t>
+        <w:t>Kardec nos esclarece que quando a Humanidade está madura para subir um degrau, ou seja, quando a humanidade já recebeu conhecimento suficiente para elevar-se um pouco mais, então pode dizer-se que são chegados os tempos marcados por Deus.</w:t>
       </w:r>
     </w:p>
     <w:p>
@@ -6289,41 +6037,428 @@
           <w:shd w:fill="auto" w:val="clear"/>
           <w:lang w:val="en-US" w:eastAsia="zh-CN" w:bidi="hi-IN"/>
         </w:rPr>
-        <w:t>Se olharmos o mundo à nossa volta perceberemos que essa já é a nossa realidade. Já estamos vivendo os tempos previstos por Kardec.</w:t>
-      </w:r>
-    </w:p>
-    <w:p>
-      <w:pPr>
-        <w:pStyle w:val="Normal"/>
-        <w:jc w:val="both"/>
-        <w:rPr>
-          <w:rFonts w:ascii="Garamond" w:hAnsi="Garamond" w:eastAsia="Times New Roman" w:cs="Times New Roman"/>
-          <w:color w:val="000000"/>
-          <w:kern w:val="0"/>
-          <w:sz w:val="36"/>
-          <w:szCs w:val="36"/>
-          <w:shd w:fill="auto" w:val="clear"/>
-          <w:lang w:val="en-US" w:eastAsia="zh-CN" w:bidi="hi-IN"/>
-        </w:rPr>
-      </w:pPr>
-      <w:r>
-        <w:rPr>
-          <w:rFonts w:eastAsia="Times New Roman" w:cs="Times New Roman" w:ascii="Garamond" w:hAnsi="Garamond"/>
-          <w:color w:val="000000"/>
-          <w:kern w:val="0"/>
-          <w:sz w:val="36"/>
-          <w:szCs w:val="36"/>
-          <w:shd w:fill="auto" w:val="clear"/>
-          <w:lang w:val="en-US" w:eastAsia="zh-CN" w:bidi="hi-IN"/>
-        </w:rPr>
-      </w:r>
-    </w:p>
-    <w:p>
-      <w:pPr>
-        <w:pStyle w:val="Normal"/>
-        <w:jc w:val="both"/>
-        <w:rPr>
-          <w:rFonts w:ascii="Garamond" w:hAnsi="Garamond" w:eastAsia="Times New Roman" w:cs="Times New Roman"/>
+        <w:t>Basta olharmos a turbulência do mundo moderno para compreendermos que já estamos vivendo os tempos dos quais Kardec falou. E invariavelmente pensamos também sobre a realidade do nosso país: Brasil, o coração do mundo, a pátria do evangelho.</w:t>
+      </w:r>
+    </w:p>
+    <w:p>
+      <w:pPr>
+        <w:pStyle w:val="Normal"/>
+        <w:jc w:val="both"/>
+        <w:rPr>
+          <w:rFonts w:ascii="Garamond" w:hAnsi="Garamond" w:eastAsia="Times New Roman" w:cs="Times New Roman"/>
+          <w:color w:val="000000"/>
+          <w:kern w:val="0"/>
+          <w:sz w:val="36"/>
+          <w:szCs w:val="36"/>
+          <w:shd w:fill="auto" w:val="clear"/>
+          <w:lang w:val="en-US" w:eastAsia="zh-CN" w:bidi="hi-IN"/>
+        </w:rPr>
+      </w:pPr>
+      <w:r>
+        <w:rPr/>
+      </w:r>
+    </w:p>
+    <w:p>
+      <w:pPr>
+        <w:pStyle w:val="Normal"/>
+        <w:jc w:val="both"/>
+        <w:rPr>
+          <w:rFonts w:ascii="Garamond" w:hAnsi="Garamond" w:eastAsia="Times New Roman" w:cs="Times New Roman"/>
+          <w:color w:val="000000"/>
+          <w:kern w:val="0"/>
+          <w:sz w:val="36"/>
+          <w:szCs w:val="36"/>
+          <w:shd w:fill="auto" w:val="clear"/>
+          <w:lang w:val="en-US" w:eastAsia="zh-CN" w:bidi="hi-IN"/>
+        </w:rPr>
+      </w:pPr>
+      <w:r>
+        <w:rPr/>
+      </w:r>
+    </w:p>
+    <w:p>
+      <w:pPr>
+        <w:pStyle w:val="Normal"/>
+        <w:jc w:val="both"/>
+        <w:rPr>
+          <w:rFonts w:ascii="Garamond" w:hAnsi="Garamond" w:eastAsia="Times New Roman" w:cs="Times New Roman"/>
+          <w:color w:val="000000"/>
+          <w:kern w:val="0"/>
+          <w:sz w:val="36"/>
+          <w:szCs w:val="36"/>
+          <w:shd w:fill="auto" w:val="clear"/>
+          <w:lang w:val="en-US" w:eastAsia="zh-CN" w:bidi="hi-IN"/>
+        </w:rPr>
+      </w:pPr>
+      <w:r>
+        <w:rPr>
+          <w:rFonts w:eastAsia="Times New Roman" w:cs="Times New Roman" w:ascii="Garamond" w:hAnsi="Garamond"/>
+          <w:color w:val="000000"/>
+          <w:kern w:val="0"/>
+          <w:sz w:val="36"/>
+          <w:szCs w:val="36"/>
+          <w:shd w:fill="auto" w:val="clear"/>
+          <w:lang w:val="en-US" w:eastAsia="zh-CN" w:bidi="hi-IN"/>
+        </w:rPr>
+        <w:t xml:space="preserve">Quando falamos em pátria do Evangelho, há duas observações muito importantes que precisam ser feitas. </w:t>
+      </w:r>
+    </w:p>
+    <w:p>
+      <w:pPr>
+        <w:pStyle w:val="Normal"/>
+        <w:jc w:val="both"/>
+        <w:rPr>
+          <w:rFonts w:ascii="Garamond" w:hAnsi="Garamond" w:eastAsia="Times New Roman" w:cs="Times New Roman"/>
+          <w:color w:val="000000"/>
+          <w:kern w:val="0"/>
+          <w:sz w:val="36"/>
+          <w:szCs w:val="36"/>
+          <w:shd w:fill="auto" w:val="clear"/>
+          <w:lang w:val="en-US" w:eastAsia="zh-CN" w:bidi="hi-IN"/>
+        </w:rPr>
+      </w:pPr>
+      <w:r>
+        <w:rPr/>
+      </w:r>
+    </w:p>
+    <w:p>
+      <w:pPr>
+        <w:pStyle w:val="Normal"/>
+        <w:jc w:val="both"/>
+        <w:rPr>
+          <w:rFonts w:ascii="Garamond" w:hAnsi="Garamond" w:eastAsia="Times New Roman" w:cs="Times New Roman"/>
+          <w:color w:val="000000"/>
+          <w:kern w:val="0"/>
+          <w:sz w:val="36"/>
+          <w:szCs w:val="36"/>
+          <w:shd w:fill="auto" w:val="clear"/>
+          <w:lang w:val="en-US" w:eastAsia="zh-CN" w:bidi="hi-IN"/>
+        </w:rPr>
+      </w:pPr>
+      <w:r>
+        <w:rPr>
+          <w:rFonts w:eastAsia="Times New Roman" w:cs="Times New Roman" w:ascii="Garamond" w:hAnsi="Garamond"/>
+          <w:color w:val="000000"/>
+          <w:kern w:val="0"/>
+          <w:sz w:val="36"/>
+          <w:szCs w:val="36"/>
+          <w:shd w:fill="auto" w:val="clear"/>
+          <w:lang w:val="en-US" w:eastAsia="zh-CN" w:bidi="hi-IN"/>
+        </w:rPr>
+        <w:t>A primeira é o terrível engano que muitos espíritas cometem sobre o tema. Há quem pense que, pelo fato de Jesus ter designado o Brasil como a nação para a qual a árvore do Seu Evangelho seria transplantada, nós somos privilegiados ou mais amados por Ele do que outros povos.</w:t>
+      </w:r>
+    </w:p>
+    <w:p>
+      <w:pPr>
+        <w:pStyle w:val="Normal"/>
+        <w:jc w:val="both"/>
+        <w:rPr>
+          <w:rFonts w:ascii="Garamond" w:hAnsi="Garamond" w:eastAsia="Times New Roman" w:cs="Times New Roman"/>
+          <w:color w:val="000000"/>
+          <w:kern w:val="0"/>
+          <w:sz w:val="36"/>
+          <w:szCs w:val="36"/>
+          <w:shd w:fill="auto" w:val="clear"/>
+          <w:lang w:val="en-US" w:eastAsia="zh-CN" w:bidi="hi-IN"/>
+        </w:rPr>
+      </w:pPr>
+      <w:r>
+        <w:rPr/>
+      </w:r>
+    </w:p>
+    <w:p>
+      <w:pPr>
+        <w:pStyle w:val="Normal"/>
+        <w:jc w:val="both"/>
+        <w:rPr>
+          <w:rFonts w:ascii="Garamond" w:hAnsi="Garamond" w:eastAsia="Times New Roman" w:cs="Times New Roman"/>
+          <w:color w:val="000000"/>
+          <w:kern w:val="0"/>
+          <w:sz w:val="36"/>
+          <w:szCs w:val="36"/>
+          <w:shd w:fill="auto" w:val="clear"/>
+          <w:lang w:val="en-US" w:eastAsia="zh-CN" w:bidi="hi-IN"/>
+        </w:rPr>
+      </w:pPr>
+      <w:r>
+        <w:rPr>
+          <w:rFonts w:eastAsia="Times New Roman" w:cs="Times New Roman" w:ascii="Garamond" w:hAnsi="Garamond"/>
+          <w:color w:val="000000"/>
+          <w:kern w:val="0"/>
+          <w:sz w:val="36"/>
+          <w:szCs w:val="36"/>
+          <w:shd w:fill="auto" w:val="clear"/>
+          <w:lang w:val="en-US" w:eastAsia="zh-CN" w:bidi="hi-IN"/>
+        </w:rPr>
+        <w:t xml:space="preserve">Como consequência desse pensamento equivocado, algumas pessoas acreditam que podemos simplesmente cruzar os braços diante dos gigantescos problemas morais que enfrentamos no Brasil, esperando que, algum dia, eles sejam resolvidos de maneira milagrosa por Jesus. Nada está mais distante da realidade. </w:t>
+      </w:r>
+    </w:p>
+    <w:p>
+      <w:pPr>
+        <w:pStyle w:val="Normal"/>
+        <w:jc w:val="both"/>
+        <w:rPr>
+          <w:rFonts w:ascii="Garamond" w:hAnsi="Garamond" w:eastAsia="Times New Roman" w:cs="Times New Roman"/>
+          <w:color w:val="000000"/>
+          <w:kern w:val="0"/>
+          <w:sz w:val="36"/>
+          <w:szCs w:val="36"/>
+          <w:shd w:fill="auto" w:val="clear"/>
+          <w:lang w:val="en-US" w:eastAsia="zh-CN" w:bidi="hi-IN"/>
+        </w:rPr>
+      </w:pPr>
+      <w:r>
+        <w:rPr/>
+      </w:r>
+    </w:p>
+    <w:p>
+      <w:pPr>
+        <w:pStyle w:val="Normal"/>
+        <w:jc w:val="both"/>
+        <w:rPr>
+          <w:rFonts w:ascii="Garamond" w:hAnsi="Garamond" w:eastAsia="Times New Roman" w:cs="Times New Roman"/>
+          <w:color w:val="000000"/>
+          <w:kern w:val="0"/>
+          <w:sz w:val="36"/>
+          <w:szCs w:val="36"/>
+          <w:shd w:fill="auto" w:val="clear"/>
+          <w:lang w:val="en-US" w:eastAsia="zh-CN" w:bidi="hi-IN"/>
+        </w:rPr>
+      </w:pPr>
+      <w:r>
+        <w:rPr>
+          <w:rFonts w:eastAsia="Times New Roman" w:cs="Times New Roman" w:ascii="Garamond" w:hAnsi="Garamond"/>
+          <w:color w:val="000000"/>
+          <w:kern w:val="0"/>
+          <w:sz w:val="36"/>
+          <w:szCs w:val="36"/>
+          <w:shd w:fill="auto" w:val="clear"/>
+          <w:lang w:val="en-US" w:eastAsia="zh-CN" w:bidi="hi-IN"/>
+        </w:rPr>
+        <w:t>Basta analisarmos o que está escrito no primeiro capítulo do livro Brasil, Coração do Mundo, Pátria do Evangelho, ditado por Humberto de Campos a Chico Xavier.</w:t>
+      </w:r>
+    </w:p>
+    <w:p>
+      <w:pPr>
+        <w:pStyle w:val="Normal"/>
+        <w:jc w:val="both"/>
+        <w:rPr>
+          <w:rFonts w:ascii="Garamond" w:hAnsi="Garamond" w:eastAsia="Times New Roman" w:cs="Times New Roman"/>
+          <w:color w:val="000000"/>
+          <w:kern w:val="0"/>
+          <w:sz w:val="36"/>
+          <w:szCs w:val="36"/>
+          <w:shd w:fill="auto" w:val="clear"/>
+          <w:lang w:val="en-US" w:eastAsia="zh-CN" w:bidi="hi-IN"/>
+        </w:rPr>
+      </w:pPr>
+      <w:r>
+        <w:rPr/>
+      </w:r>
+    </w:p>
+    <w:p>
+      <w:pPr>
+        <w:pStyle w:val="Normal"/>
+        <w:jc w:val="both"/>
+        <w:rPr>
+          <w:rFonts w:ascii="Garamond" w:hAnsi="Garamond" w:eastAsia="Times New Roman" w:cs="Times New Roman"/>
+          <w:color w:val="000000"/>
+          <w:kern w:val="0"/>
+          <w:sz w:val="36"/>
+          <w:szCs w:val="36"/>
+          <w:shd w:fill="auto" w:val="clear"/>
+          <w:lang w:val="en-US" w:eastAsia="zh-CN" w:bidi="hi-IN"/>
+        </w:rPr>
+      </w:pPr>
+      <w:r>
+        <w:rPr>
+          <w:rFonts w:eastAsia="Times New Roman" w:cs="Times New Roman" w:ascii="Garamond" w:hAnsi="Garamond"/>
+          <w:color w:val="000000"/>
+          <w:kern w:val="0"/>
+          <w:sz w:val="36"/>
+          <w:szCs w:val="36"/>
+          <w:shd w:fill="auto" w:val="clear"/>
+          <w:lang w:val="en-US" w:eastAsia="zh-CN" w:bidi="hi-IN"/>
+        </w:rPr>
+        <w:t xml:space="preserve">Jesus, ao ver a degradação moral à qual a humanidade se entregara, percebe que a Europa — o local onde o Cristianismo estava mais consolidado e de onde se irradiava a maior parte da influência religiosa do Ocidente — já não vivia o espírito do Evangelho que lhe fora confiado. </w:t>
+      </w:r>
+    </w:p>
+    <w:p>
+      <w:pPr>
+        <w:pStyle w:val="Normal"/>
+        <w:jc w:val="both"/>
+        <w:rPr>
+          <w:rFonts w:ascii="Garamond" w:hAnsi="Garamond" w:eastAsia="Times New Roman" w:cs="Times New Roman"/>
+          <w:color w:val="000000"/>
+          <w:kern w:val="0"/>
+          <w:sz w:val="36"/>
+          <w:szCs w:val="36"/>
+          <w:shd w:fill="auto" w:val="clear"/>
+          <w:lang w:val="en-US" w:eastAsia="zh-CN" w:bidi="hi-IN"/>
+        </w:rPr>
+      </w:pPr>
+      <w:r>
+        <w:rPr/>
+      </w:r>
+    </w:p>
+    <w:p>
+      <w:pPr>
+        <w:pStyle w:val="Normal"/>
+        <w:jc w:val="both"/>
+        <w:rPr>
+          <w:rFonts w:ascii="Garamond" w:hAnsi="Garamond" w:eastAsia="Times New Roman" w:cs="Times New Roman"/>
+          <w:color w:val="000000"/>
+          <w:kern w:val="0"/>
+          <w:sz w:val="36"/>
+          <w:szCs w:val="36"/>
+          <w:shd w:fill="auto" w:val="clear"/>
+          <w:lang w:val="en-US" w:eastAsia="zh-CN" w:bidi="hi-IN"/>
+        </w:rPr>
+      </w:pPr>
+      <w:r>
+        <w:rPr>
+          <w:rFonts w:eastAsia="Times New Roman" w:cs="Times New Roman" w:ascii="Garamond" w:hAnsi="Garamond"/>
+          <w:color w:val="000000"/>
+          <w:kern w:val="0"/>
+          <w:sz w:val="36"/>
+          <w:szCs w:val="36"/>
+          <w:shd w:fill="auto" w:val="clear"/>
+          <w:lang w:val="en-US" w:eastAsia="zh-CN" w:bidi="hi-IN"/>
+        </w:rPr>
+        <w:t>A mensagem de amor, simplicidade e fraternidade havia sido sufocada por interesses políticos, rivalidades e ambições materiais. Diante da incapacidade dos antigos povos cristãos de manter viva a pureza dos Seus ensinos, o Cristo decide transplantar a árvore do Evangelho para outra terra — ainda desconhecida, mas preparada para acolhê-lo em sua essência: o Brasil.</w:t>
+      </w:r>
+    </w:p>
+    <w:p>
+      <w:pPr>
+        <w:pStyle w:val="Normal"/>
+        <w:jc w:val="both"/>
+        <w:rPr>
+          <w:rFonts w:ascii="Garamond" w:hAnsi="Garamond" w:eastAsia="Times New Roman" w:cs="Times New Roman"/>
+          <w:color w:val="000000"/>
+          <w:kern w:val="0"/>
+          <w:sz w:val="36"/>
+          <w:szCs w:val="36"/>
+          <w:shd w:fill="auto" w:val="clear"/>
+          <w:lang w:val="en-US" w:eastAsia="zh-CN" w:bidi="hi-IN"/>
+        </w:rPr>
+      </w:pPr>
+      <w:r>
+        <w:rPr/>
+      </w:r>
+    </w:p>
+    <w:p>
+      <w:pPr>
+        <w:pStyle w:val="Normal"/>
+        <w:jc w:val="both"/>
+        <w:rPr>
+          <w:rFonts w:ascii="Garamond" w:hAnsi="Garamond" w:eastAsia="Times New Roman" w:cs="Times New Roman"/>
+          <w:color w:val="000000"/>
+          <w:kern w:val="0"/>
+          <w:sz w:val="36"/>
+          <w:szCs w:val="36"/>
+          <w:shd w:fill="auto" w:val="clear"/>
+          <w:lang w:val="en-US" w:eastAsia="zh-CN" w:bidi="hi-IN"/>
+        </w:rPr>
+      </w:pPr>
+      <w:r>
+        <w:rPr>
+          <w:rFonts w:eastAsia="Times New Roman" w:cs="Times New Roman" w:ascii="Garamond" w:hAnsi="Garamond"/>
+          <w:color w:val="000000"/>
+          <w:kern w:val="0"/>
+          <w:sz w:val="36"/>
+          <w:szCs w:val="36"/>
+          <w:shd w:fill="auto" w:val="clear"/>
+          <w:lang w:val="en-US" w:eastAsia="zh-CN" w:bidi="hi-IN"/>
+        </w:rPr>
+        <w:t xml:space="preserve">O que nós precisamos entender de verdade é que, </w:t>
+      </w:r>
+      <w:r>
+        <w:rPr>
+          <w:rFonts w:eastAsia="Times New Roman" w:cs="Times New Roman" w:ascii="Garamond" w:hAnsi="Garamond"/>
+          <w:color w:val="000000"/>
+          <w:kern w:val="0"/>
+          <w:sz w:val="36"/>
+          <w:szCs w:val="36"/>
+          <w:shd w:fill="auto" w:val="clear"/>
+          <w:lang w:val="en-US" w:eastAsia="zh-CN" w:bidi="hi-IN"/>
+        </w:rPr>
+        <w:t xml:space="preserve">se Jesus retirou a árvore do Seu Evangelho da Europa porque aqueles povos, embora profundamente marcados pelo Cristianismo, já não conseguiam sustentar a vivência autêntica dos Seus ensinamentos, Ele pode, da mesma forma, transplantar novamente essa árvore para outro ponto do planeta, caso o Brasil também se afaste da missão que lhe foi confiada. </w:t>
+      </w:r>
+    </w:p>
+    <w:p>
+      <w:pPr>
+        <w:pStyle w:val="Normal"/>
+        <w:jc w:val="both"/>
+        <w:rPr>
+          <w:rFonts w:ascii="Garamond" w:hAnsi="Garamond" w:eastAsia="Times New Roman" w:cs="Times New Roman"/>
+          <w:color w:val="000000"/>
+          <w:kern w:val="0"/>
+          <w:sz w:val="36"/>
+          <w:szCs w:val="36"/>
+          <w:shd w:fill="auto" w:val="clear"/>
+          <w:lang w:val="en-US" w:eastAsia="zh-CN" w:bidi="hi-IN"/>
+        </w:rPr>
+      </w:pPr>
+      <w:r>
+        <w:rPr>
+          <w:rFonts w:eastAsia="Times New Roman" w:cs="Times New Roman" w:ascii="Garamond" w:hAnsi="Garamond"/>
+          <w:color w:val="000000"/>
+          <w:kern w:val="0"/>
+          <w:sz w:val="36"/>
+          <w:szCs w:val="36"/>
+          <w:shd w:fill="auto" w:val="clear"/>
+          <w:lang w:val="en-US" w:eastAsia="zh-CN" w:bidi="hi-IN"/>
+        </w:rPr>
+        <w:t>A responsabilidade é nossa: nenhuma nação mantém o Evangelho por privilégio, mas unicamente pela fidelidade com que o vive.</w:t>
+      </w:r>
+    </w:p>
+    <w:p>
+      <w:pPr>
+        <w:pStyle w:val="Normal"/>
+        <w:jc w:val="both"/>
+        <w:rPr>
+          <w:rFonts w:ascii="Garamond" w:hAnsi="Garamond" w:eastAsia="Times New Roman" w:cs="Times New Roman"/>
+          <w:color w:val="000000"/>
+          <w:kern w:val="0"/>
+          <w:sz w:val="36"/>
+          <w:szCs w:val="36"/>
+          <w:shd w:fill="auto" w:val="clear"/>
+          <w:lang w:val="en-US" w:eastAsia="zh-CN" w:bidi="hi-IN"/>
+        </w:rPr>
+      </w:pPr>
+      <w:r>
+        <w:rPr/>
+      </w:r>
+    </w:p>
+    <w:p>
+      <w:pPr>
+        <w:pStyle w:val="Normal"/>
+        <w:jc w:val="both"/>
+        <w:rPr>
+          <w:rFonts w:ascii="Garamond" w:hAnsi="Garamond" w:eastAsia="Times New Roman" w:cs="Times New Roman"/>
+          <w:color w:val="000000"/>
+          <w:kern w:val="0"/>
+          <w:sz w:val="36"/>
+          <w:szCs w:val="36"/>
+          <w:shd w:fill="auto" w:val="clear"/>
+          <w:lang w:val="en-US" w:eastAsia="zh-CN" w:bidi="hi-IN"/>
+        </w:rPr>
+      </w:pPr>
+      <w:r>
+        <w:rPr>
+          <w:rFonts w:eastAsia="Times New Roman" w:cs="Times New Roman" w:ascii="Garamond" w:hAnsi="Garamond"/>
+          <w:color w:val="000000"/>
+          <w:kern w:val="0"/>
+          <w:sz w:val="36"/>
+          <w:szCs w:val="36"/>
+          <w:shd w:fill="auto" w:val="clear"/>
+          <w:lang w:val="en-US" w:eastAsia="zh-CN" w:bidi="hi-IN"/>
+        </w:rPr>
+        <w:t xml:space="preserve">A segunda observação importante que precisa ser feita a respeito do Brasil como Pátria do Evangelho é a maneira como interpretamos </w:t>
+      </w:r>
+      <w:r>
+        <w:rPr>
+          <w:rFonts w:eastAsia="Times New Roman" w:cs="Times New Roman" w:ascii="Garamond" w:hAnsi="Garamond"/>
           <w:color w:val="1C99E0"/>
           <w:kern w:val="0"/>
           <w:sz w:val="36"/>
@@ -6331,7 +6466,8 @@
           <w:shd w:fill="auto" w:val="clear"/>
           <w:lang w:val="en-US" w:eastAsia="zh-CN" w:bidi="hi-IN"/>
         </w:rPr>
-      </w:pPr>
+        <w:t>[ Parei aqui em 0</w:t>
+      </w:r>
       <w:r>
         <w:rPr>
           <w:rFonts w:eastAsia="Times New Roman" w:cs="Times New Roman" w:ascii="Garamond" w:hAnsi="Garamond"/>
@@ -6342,7 +6478,19 @@
           <w:shd w:fill="auto" w:val="clear"/>
           <w:lang w:val="en-US" w:eastAsia="zh-CN" w:bidi="hi-IN"/>
         </w:rPr>
-        <w:t>[ Parei aqui em 05/12. Prosseguir desse ponto trazendo comentários sobre Brasil Coração do Mundo... ]</w:t>
+        <w:t>6</w:t>
+      </w:r>
+      <w:r>
+        <w:rPr>
+          <w:rFonts w:eastAsia="Times New Roman" w:cs="Times New Roman" w:ascii="Garamond" w:hAnsi="Garamond"/>
+          <w:color w:val="1C99E0"/>
+          <w:kern w:val="0"/>
+          <w:sz w:val="36"/>
+          <w:szCs w:val="36"/>
+          <w:shd w:fill="auto" w:val="clear"/>
+          <w:lang w:val="en-US" w:eastAsia="zh-CN" w:bidi="hi-IN"/>
+        </w:rPr>
+        <w:t>/12 ]</w:t>
       </w:r>
     </w:p>
     <w:p>
@@ -6640,119 +6788,7 @@
           <w:shd w:fill="auto" w:val="clear"/>
           <w:lang w:val="en-US" w:eastAsia="zh-CN" w:bidi="hi-IN"/>
         </w:rPr>
-        <w:t>Resta</w:t>
-      </w:r>
-      <w:r>
-        <w:rPr>
-          <w:rFonts w:eastAsia="Times New Roman" w:cs="Times New Roman" w:ascii="Garamond" w:hAnsi="Garamond"/>
-          <w:i/>
-          <w:iCs/>
-          <w:color w:val="000000"/>
-          <w:kern w:val="0"/>
-          <w:sz w:val="36"/>
-          <w:szCs w:val="36"/>
-          <w:shd w:fill="auto" w:val="clear"/>
-          <w:lang w:val="en-US" w:eastAsia="zh-CN" w:bidi="hi-IN"/>
-        </w:rPr>
-        <w:t>-</w:t>
-      </w:r>
-      <w:r>
-        <w:rPr>
-          <w:rFonts w:eastAsia="Times New Roman" w:cs="Times New Roman" w:ascii="Garamond" w:hAnsi="Garamond"/>
-          <w:i/>
-          <w:iCs/>
-          <w:color w:val="000000"/>
-          <w:kern w:val="0"/>
-          <w:sz w:val="36"/>
-          <w:szCs w:val="36"/>
-          <w:shd w:fill="auto" w:val="clear"/>
-          <w:lang w:val="en-US" w:eastAsia="zh-CN" w:bidi="hi-IN"/>
-        </w:rPr>
-        <w:t>lhes ainda um imenso progresso a realizar: o de fazerem que</w:t>
-      </w:r>
-      <w:r>
-        <w:rPr>
-          <w:rFonts w:eastAsia="Times New Roman" w:cs="Times New Roman" w:ascii="Garamond" w:hAnsi="Garamond"/>
-          <w:i/>
-          <w:iCs/>
-          <w:color w:val="000000"/>
-          <w:kern w:val="0"/>
-          <w:sz w:val="36"/>
-          <w:szCs w:val="36"/>
-          <w:shd w:fill="auto" w:val="clear"/>
-          <w:lang w:val="en-US" w:eastAsia="zh-CN" w:bidi="hi-IN"/>
-        </w:rPr>
-        <w:t xml:space="preserve"> </w:t>
-      </w:r>
-      <w:r>
-        <w:rPr>
-          <w:rFonts w:eastAsia="Times New Roman" w:cs="Times New Roman" w:ascii="Garamond" w:hAnsi="Garamond"/>
-          <w:i/>
-          <w:iCs/>
-          <w:color w:val="000000"/>
-          <w:kern w:val="0"/>
-          <w:sz w:val="36"/>
-          <w:szCs w:val="36"/>
-          <w:shd w:fill="auto" w:val="clear"/>
-          <w:lang w:val="en-US" w:eastAsia="zh-CN" w:bidi="hi-IN"/>
-        </w:rPr>
-        <w:t>entre si reinem a caridade, a fraternidade, a solidariedade, que lhes assegurem o</w:t>
-      </w:r>
-      <w:r>
-        <w:rPr>
-          <w:rFonts w:eastAsia="Times New Roman" w:cs="Times New Roman" w:ascii="Garamond" w:hAnsi="Garamond"/>
-          <w:i/>
-          <w:iCs/>
-          <w:color w:val="000000"/>
-          <w:kern w:val="0"/>
-          <w:sz w:val="36"/>
-          <w:szCs w:val="36"/>
-          <w:shd w:fill="auto" w:val="clear"/>
-          <w:lang w:val="en-US" w:eastAsia="zh-CN" w:bidi="hi-IN"/>
-        </w:rPr>
-        <w:t xml:space="preserve"> </w:t>
-      </w:r>
-      <w:r>
-        <w:rPr>
-          <w:rFonts w:eastAsia="Times New Roman" w:cs="Times New Roman" w:ascii="Garamond" w:hAnsi="Garamond"/>
-          <w:i/>
-          <w:iCs/>
-          <w:color w:val="000000"/>
-          <w:kern w:val="0"/>
-          <w:sz w:val="36"/>
-          <w:szCs w:val="36"/>
-          <w:shd w:fill="auto" w:val="clear"/>
-          <w:lang w:val="en-US" w:eastAsia="zh-CN" w:bidi="hi-IN"/>
-        </w:rPr>
-        <w:t>bem</w:t>
-      </w:r>
-      <w:r>
-        <w:rPr>
-          <w:rFonts w:eastAsia="Times New Roman" w:cs="Times New Roman" w:ascii="Garamond" w:hAnsi="Garamond"/>
-          <w:i/>
-          <w:iCs/>
-          <w:color w:val="000000"/>
-          <w:kern w:val="0"/>
-          <w:sz w:val="36"/>
-          <w:szCs w:val="36"/>
-          <w:shd w:fill="auto" w:val="clear"/>
-          <w:lang w:val="en-US" w:eastAsia="zh-CN" w:bidi="hi-IN"/>
-        </w:rPr>
-        <w:t>-</w:t>
-      </w:r>
-      <w:r>
-        <w:rPr>
-          <w:rFonts w:eastAsia="Times New Roman" w:cs="Times New Roman" w:ascii="Garamond" w:hAnsi="Garamond"/>
-          <w:i/>
-          <w:iCs/>
-          <w:color w:val="000000"/>
-          <w:kern w:val="0"/>
-          <w:sz w:val="36"/>
-          <w:szCs w:val="36"/>
-          <w:shd w:fill="auto" w:val="clear"/>
-          <w:lang w:val="en-US" w:eastAsia="zh-CN" w:bidi="hi-IN"/>
-        </w:rPr>
-        <w:t>estar moral.</w:t>
+        <w:t>Resta-lhes ainda um imenso progresso a realizar: o de fazerem que entre si reinem a caridade, a fraternidade, a solidariedade, que lhes assegurem o bem-estar moral.</w:t>
       </w:r>
     </w:p>
     <w:p>
@@ -6838,7 +6874,7 @@
         <w:bCs/>
         <w:rFonts w:ascii="Garamond" w:hAnsi="Garamond"/>
       </w:rPr>
-      <w:t>29</w:t>
+      <w:t>35</w:t>
     </w:r>
     <w:r>
       <w:rPr>

</xml_diff>

<commit_message>
07/12/2025 - 18:11 h
</commit_message>
<xml_diff>
--- a/O mandamento maior/O Mandamento Maior.docx
+++ b/O mandamento maior/O Mandamento Maior.docx
@@ -6055,6 +6055,495 @@
         </w:rPr>
       </w:pPr>
       <w:r>
+        <w:rPr>
+          <w:rFonts w:eastAsia="Times New Roman" w:cs="Times New Roman" w:ascii="Garamond" w:hAnsi="Garamond"/>
+          <w:color w:val="000000"/>
+          <w:kern w:val="0"/>
+          <w:sz w:val="36"/>
+          <w:szCs w:val="36"/>
+          <w:shd w:fill="auto" w:val="clear"/>
+          <w:lang w:val="en-US" w:eastAsia="zh-CN" w:bidi="hi-IN"/>
+        </w:rPr>
+      </w:r>
+    </w:p>
+    <w:p>
+      <w:pPr>
+        <w:pStyle w:val="Normal"/>
+        <w:jc w:val="both"/>
+        <w:rPr>
+          <w:rFonts w:ascii="Garamond" w:hAnsi="Garamond" w:eastAsia="Times New Roman" w:cs="Times New Roman"/>
+          <w:color w:val="000000"/>
+          <w:kern w:val="0"/>
+          <w:sz w:val="36"/>
+          <w:szCs w:val="36"/>
+          <w:shd w:fill="auto" w:val="clear"/>
+          <w:lang w:val="en-US" w:eastAsia="zh-CN" w:bidi="hi-IN"/>
+        </w:rPr>
+      </w:pPr>
+      <w:r>
+        <w:rPr>
+          <w:rFonts w:eastAsia="Times New Roman" w:cs="Times New Roman" w:ascii="Garamond" w:hAnsi="Garamond"/>
+          <w:color w:val="000000"/>
+          <w:kern w:val="0"/>
+          <w:sz w:val="36"/>
+          <w:szCs w:val="36"/>
+          <w:shd w:fill="auto" w:val="clear"/>
+          <w:lang w:val="en-US" w:eastAsia="zh-CN" w:bidi="hi-IN"/>
+        </w:rPr>
+      </w:r>
+    </w:p>
+    <w:p>
+      <w:pPr>
+        <w:pStyle w:val="Normal"/>
+        <w:jc w:val="both"/>
+        <w:rPr>
+          <w:rFonts w:ascii="Garamond" w:hAnsi="Garamond" w:eastAsia="Times New Roman" w:cs="Times New Roman"/>
+          <w:color w:val="000000"/>
+          <w:kern w:val="0"/>
+          <w:sz w:val="36"/>
+          <w:szCs w:val="36"/>
+          <w:shd w:fill="auto" w:val="clear"/>
+          <w:lang w:val="en-US" w:eastAsia="zh-CN" w:bidi="hi-IN"/>
+        </w:rPr>
+      </w:pPr>
+      <w:r>
+        <w:rPr>
+          <w:rFonts w:eastAsia="Times New Roman" w:cs="Times New Roman" w:ascii="Garamond" w:hAnsi="Garamond"/>
+          <w:color w:val="000000"/>
+          <w:kern w:val="0"/>
+          <w:sz w:val="36"/>
+          <w:szCs w:val="36"/>
+          <w:shd w:fill="auto" w:val="clear"/>
+          <w:lang w:val="en-US" w:eastAsia="zh-CN" w:bidi="hi-IN"/>
+        </w:rPr>
+        <w:t xml:space="preserve">Quando falamos em pátria do Evangelho, há duas observações muito importantes que precisam ser feitas. </w:t>
+      </w:r>
+    </w:p>
+    <w:p>
+      <w:pPr>
+        <w:pStyle w:val="Normal"/>
+        <w:jc w:val="both"/>
+        <w:rPr>
+          <w:rFonts w:ascii="Garamond" w:hAnsi="Garamond" w:eastAsia="Times New Roman" w:cs="Times New Roman"/>
+          <w:color w:val="000000"/>
+          <w:kern w:val="0"/>
+          <w:sz w:val="36"/>
+          <w:szCs w:val="36"/>
+          <w:shd w:fill="auto" w:val="clear"/>
+          <w:lang w:val="en-US" w:eastAsia="zh-CN" w:bidi="hi-IN"/>
+        </w:rPr>
+      </w:pPr>
+      <w:r>
+        <w:rPr>
+          <w:rFonts w:eastAsia="Times New Roman" w:cs="Times New Roman" w:ascii="Garamond" w:hAnsi="Garamond"/>
+          <w:color w:val="000000"/>
+          <w:kern w:val="0"/>
+          <w:sz w:val="36"/>
+          <w:szCs w:val="36"/>
+          <w:shd w:fill="auto" w:val="clear"/>
+          <w:lang w:val="en-US" w:eastAsia="zh-CN" w:bidi="hi-IN"/>
+        </w:rPr>
+      </w:r>
+    </w:p>
+    <w:p>
+      <w:pPr>
+        <w:pStyle w:val="Normal"/>
+        <w:jc w:val="both"/>
+        <w:rPr>
+          <w:rFonts w:ascii="Garamond" w:hAnsi="Garamond" w:eastAsia="Times New Roman" w:cs="Times New Roman"/>
+          <w:color w:val="000000"/>
+          <w:kern w:val="0"/>
+          <w:sz w:val="36"/>
+          <w:szCs w:val="36"/>
+          <w:shd w:fill="auto" w:val="clear"/>
+          <w:lang w:val="en-US" w:eastAsia="zh-CN" w:bidi="hi-IN"/>
+        </w:rPr>
+      </w:pPr>
+      <w:r>
+        <w:rPr>
+          <w:rFonts w:eastAsia="Times New Roman" w:cs="Times New Roman" w:ascii="Garamond" w:hAnsi="Garamond"/>
+          <w:color w:val="000000"/>
+          <w:kern w:val="0"/>
+          <w:sz w:val="36"/>
+          <w:szCs w:val="36"/>
+          <w:shd w:fill="auto" w:val="clear"/>
+          <w:lang w:val="en-US" w:eastAsia="zh-CN" w:bidi="hi-IN"/>
+        </w:rPr>
+        <w:t>A primeira é o terrível engano que muitos espíritas cometem sobre o tema. Há quem pense que, pelo fato de Jesus ter designado o Brasil como a nação para a qual a árvore do Seu Evangelho seria transplantada, nós somos privilegiados ou mais amados por Ele do que outros povos.</w:t>
+      </w:r>
+    </w:p>
+    <w:p>
+      <w:pPr>
+        <w:pStyle w:val="Normal"/>
+        <w:jc w:val="both"/>
+        <w:rPr>
+          <w:rFonts w:ascii="Garamond" w:hAnsi="Garamond" w:eastAsia="Times New Roman" w:cs="Times New Roman"/>
+          <w:color w:val="000000"/>
+          <w:kern w:val="0"/>
+          <w:sz w:val="36"/>
+          <w:szCs w:val="36"/>
+          <w:shd w:fill="auto" w:val="clear"/>
+          <w:lang w:val="en-US" w:eastAsia="zh-CN" w:bidi="hi-IN"/>
+        </w:rPr>
+      </w:pPr>
+      <w:r>
+        <w:rPr>
+          <w:rFonts w:eastAsia="Times New Roman" w:cs="Times New Roman" w:ascii="Garamond" w:hAnsi="Garamond"/>
+          <w:color w:val="000000"/>
+          <w:kern w:val="0"/>
+          <w:sz w:val="36"/>
+          <w:szCs w:val="36"/>
+          <w:shd w:fill="auto" w:val="clear"/>
+          <w:lang w:val="en-US" w:eastAsia="zh-CN" w:bidi="hi-IN"/>
+        </w:rPr>
+      </w:r>
+    </w:p>
+    <w:p>
+      <w:pPr>
+        <w:pStyle w:val="Normal"/>
+        <w:jc w:val="both"/>
+        <w:rPr>
+          <w:rFonts w:ascii="Garamond" w:hAnsi="Garamond" w:eastAsia="Times New Roman" w:cs="Times New Roman"/>
+          <w:color w:val="000000"/>
+          <w:kern w:val="0"/>
+          <w:sz w:val="36"/>
+          <w:szCs w:val="36"/>
+          <w:shd w:fill="auto" w:val="clear"/>
+          <w:lang w:val="en-US" w:eastAsia="zh-CN" w:bidi="hi-IN"/>
+        </w:rPr>
+      </w:pPr>
+      <w:r>
+        <w:rPr>
+          <w:rFonts w:eastAsia="Times New Roman" w:cs="Times New Roman" w:ascii="Garamond" w:hAnsi="Garamond"/>
+          <w:color w:val="000000"/>
+          <w:kern w:val="0"/>
+          <w:sz w:val="36"/>
+          <w:szCs w:val="36"/>
+          <w:shd w:fill="auto" w:val="clear"/>
+          <w:lang w:val="en-US" w:eastAsia="zh-CN" w:bidi="hi-IN"/>
+        </w:rPr>
+        <w:t xml:space="preserve">Como consequência desse pensamento equivocado, algumas pessoas acreditam que podemos simplesmente cruzar os braços diante dos gigantescos problemas morais que enfrentamos no Brasil, esperando que, algum dia, eles sejam resolvidos de maneira milagrosa por Jesus. Nada está mais distante da realidade. </w:t>
+      </w:r>
+    </w:p>
+    <w:p>
+      <w:pPr>
+        <w:pStyle w:val="Normal"/>
+        <w:jc w:val="both"/>
+        <w:rPr>
+          <w:rFonts w:ascii="Garamond" w:hAnsi="Garamond" w:eastAsia="Times New Roman" w:cs="Times New Roman"/>
+          <w:color w:val="000000"/>
+          <w:kern w:val="0"/>
+          <w:sz w:val="36"/>
+          <w:szCs w:val="36"/>
+          <w:shd w:fill="auto" w:val="clear"/>
+          <w:lang w:val="en-US" w:eastAsia="zh-CN" w:bidi="hi-IN"/>
+        </w:rPr>
+      </w:pPr>
+      <w:r>
+        <w:rPr>
+          <w:rFonts w:eastAsia="Times New Roman" w:cs="Times New Roman" w:ascii="Garamond" w:hAnsi="Garamond"/>
+          <w:color w:val="000000"/>
+          <w:kern w:val="0"/>
+          <w:sz w:val="36"/>
+          <w:szCs w:val="36"/>
+          <w:shd w:fill="auto" w:val="clear"/>
+          <w:lang w:val="en-US" w:eastAsia="zh-CN" w:bidi="hi-IN"/>
+        </w:rPr>
+      </w:r>
+    </w:p>
+    <w:p>
+      <w:pPr>
+        <w:pStyle w:val="Normal"/>
+        <w:jc w:val="both"/>
+        <w:rPr>
+          <w:rFonts w:ascii="Garamond" w:hAnsi="Garamond" w:eastAsia="Times New Roman" w:cs="Times New Roman"/>
+          <w:color w:val="000000"/>
+          <w:kern w:val="0"/>
+          <w:sz w:val="36"/>
+          <w:szCs w:val="36"/>
+          <w:shd w:fill="auto" w:val="clear"/>
+          <w:lang w:val="en-US" w:eastAsia="zh-CN" w:bidi="hi-IN"/>
+        </w:rPr>
+      </w:pPr>
+      <w:r>
+        <w:rPr>
+          <w:rFonts w:eastAsia="Times New Roman" w:cs="Times New Roman" w:ascii="Garamond" w:hAnsi="Garamond"/>
+          <w:color w:val="000000"/>
+          <w:kern w:val="0"/>
+          <w:sz w:val="36"/>
+          <w:szCs w:val="36"/>
+          <w:shd w:fill="auto" w:val="clear"/>
+          <w:lang w:val="en-US" w:eastAsia="zh-CN" w:bidi="hi-IN"/>
+        </w:rPr>
+        <w:t>Basta analisarmos o que está escrito no primeiro capítulo do livro Brasil, Coração do Mundo, Pátria do Evangelho, ditado por Humberto de Campos a Chico Xavier.</w:t>
+      </w:r>
+    </w:p>
+    <w:p>
+      <w:pPr>
+        <w:pStyle w:val="Normal"/>
+        <w:jc w:val="both"/>
+        <w:rPr>
+          <w:rFonts w:ascii="Garamond" w:hAnsi="Garamond" w:eastAsia="Times New Roman" w:cs="Times New Roman"/>
+          <w:color w:val="000000"/>
+          <w:kern w:val="0"/>
+          <w:sz w:val="36"/>
+          <w:szCs w:val="36"/>
+          <w:shd w:fill="auto" w:val="clear"/>
+          <w:lang w:val="en-US" w:eastAsia="zh-CN" w:bidi="hi-IN"/>
+        </w:rPr>
+      </w:pPr>
+      <w:r>
+        <w:rPr>
+          <w:rFonts w:eastAsia="Times New Roman" w:cs="Times New Roman" w:ascii="Garamond" w:hAnsi="Garamond"/>
+          <w:color w:val="000000"/>
+          <w:kern w:val="0"/>
+          <w:sz w:val="36"/>
+          <w:szCs w:val="36"/>
+          <w:shd w:fill="auto" w:val="clear"/>
+          <w:lang w:val="en-US" w:eastAsia="zh-CN" w:bidi="hi-IN"/>
+        </w:rPr>
+      </w:r>
+    </w:p>
+    <w:p>
+      <w:pPr>
+        <w:pStyle w:val="Normal"/>
+        <w:jc w:val="both"/>
+        <w:rPr>
+          <w:rFonts w:ascii="Garamond" w:hAnsi="Garamond" w:eastAsia="Times New Roman" w:cs="Times New Roman"/>
+          <w:color w:val="000000"/>
+          <w:kern w:val="0"/>
+          <w:sz w:val="36"/>
+          <w:szCs w:val="36"/>
+          <w:shd w:fill="auto" w:val="clear"/>
+          <w:lang w:val="en-US" w:eastAsia="zh-CN" w:bidi="hi-IN"/>
+        </w:rPr>
+      </w:pPr>
+      <w:r>
+        <w:rPr>
+          <w:rFonts w:eastAsia="Times New Roman" w:cs="Times New Roman" w:ascii="Garamond" w:hAnsi="Garamond"/>
+          <w:color w:val="000000"/>
+          <w:kern w:val="0"/>
+          <w:sz w:val="36"/>
+          <w:szCs w:val="36"/>
+          <w:shd w:fill="auto" w:val="clear"/>
+          <w:lang w:val="en-US" w:eastAsia="zh-CN" w:bidi="hi-IN"/>
+        </w:rPr>
+        <w:t xml:space="preserve">Jesus, ao ver a degradação moral à qual a humanidade se entregara, percebe que a Europa — o local onde o Cristianismo estava mais consolidado e de onde se irradiava a maior parte da influência religiosa do Ocidente — já não vivia o espírito do Evangelho que lhe fora confiado. </w:t>
+      </w:r>
+    </w:p>
+    <w:p>
+      <w:pPr>
+        <w:pStyle w:val="Normal"/>
+        <w:jc w:val="both"/>
+        <w:rPr>
+          <w:rFonts w:ascii="Garamond" w:hAnsi="Garamond" w:eastAsia="Times New Roman" w:cs="Times New Roman"/>
+          <w:color w:val="000000"/>
+          <w:kern w:val="0"/>
+          <w:sz w:val="36"/>
+          <w:szCs w:val="36"/>
+          <w:shd w:fill="auto" w:val="clear"/>
+          <w:lang w:val="en-US" w:eastAsia="zh-CN" w:bidi="hi-IN"/>
+        </w:rPr>
+      </w:pPr>
+      <w:r>
+        <w:rPr>
+          <w:rFonts w:eastAsia="Times New Roman" w:cs="Times New Roman" w:ascii="Garamond" w:hAnsi="Garamond"/>
+          <w:color w:val="000000"/>
+          <w:kern w:val="0"/>
+          <w:sz w:val="36"/>
+          <w:szCs w:val="36"/>
+          <w:shd w:fill="auto" w:val="clear"/>
+          <w:lang w:val="en-US" w:eastAsia="zh-CN" w:bidi="hi-IN"/>
+        </w:rPr>
+      </w:r>
+    </w:p>
+    <w:p>
+      <w:pPr>
+        <w:pStyle w:val="Normal"/>
+        <w:jc w:val="both"/>
+        <w:rPr>
+          <w:rFonts w:ascii="Garamond" w:hAnsi="Garamond" w:eastAsia="Times New Roman" w:cs="Times New Roman"/>
+          <w:color w:val="000000"/>
+          <w:kern w:val="0"/>
+          <w:sz w:val="36"/>
+          <w:szCs w:val="36"/>
+          <w:shd w:fill="auto" w:val="clear"/>
+          <w:lang w:val="en-US" w:eastAsia="zh-CN" w:bidi="hi-IN"/>
+        </w:rPr>
+      </w:pPr>
+      <w:r>
+        <w:rPr>
+          <w:rFonts w:eastAsia="Times New Roman" w:cs="Times New Roman" w:ascii="Garamond" w:hAnsi="Garamond"/>
+          <w:color w:val="000000"/>
+          <w:kern w:val="0"/>
+          <w:sz w:val="36"/>
+          <w:szCs w:val="36"/>
+          <w:shd w:fill="auto" w:val="clear"/>
+          <w:lang w:val="en-US" w:eastAsia="zh-CN" w:bidi="hi-IN"/>
+        </w:rPr>
+        <w:t>A mensagem de amor, simplicidade e fraternidade havia sido sufocada por interesses políticos, rivalidades e ambições materiais. Diante da incapacidade dos antigos povos cristãos de manter viva a pureza dos Seus ensinos, o Cristo decide transplantar a árvore do Evangelho para outra terra — ainda desconhecida, mas preparada para acolhê-lo em sua essência: o Brasil.</w:t>
+      </w:r>
+    </w:p>
+    <w:p>
+      <w:pPr>
+        <w:pStyle w:val="Normal"/>
+        <w:jc w:val="both"/>
+        <w:rPr>
+          <w:rFonts w:ascii="Garamond" w:hAnsi="Garamond" w:eastAsia="Times New Roman" w:cs="Times New Roman"/>
+          <w:color w:val="000000"/>
+          <w:kern w:val="0"/>
+          <w:sz w:val="36"/>
+          <w:szCs w:val="36"/>
+          <w:shd w:fill="auto" w:val="clear"/>
+          <w:lang w:val="en-US" w:eastAsia="zh-CN" w:bidi="hi-IN"/>
+        </w:rPr>
+      </w:pPr>
+      <w:r>
+        <w:rPr>
+          <w:rFonts w:eastAsia="Times New Roman" w:cs="Times New Roman" w:ascii="Garamond" w:hAnsi="Garamond"/>
+          <w:color w:val="000000"/>
+          <w:kern w:val="0"/>
+          <w:sz w:val="36"/>
+          <w:szCs w:val="36"/>
+          <w:shd w:fill="auto" w:val="clear"/>
+          <w:lang w:val="en-US" w:eastAsia="zh-CN" w:bidi="hi-IN"/>
+        </w:rPr>
+      </w:r>
+    </w:p>
+    <w:p>
+      <w:pPr>
+        <w:pStyle w:val="Normal"/>
+        <w:jc w:val="both"/>
+        <w:rPr>
+          <w:rFonts w:ascii="Garamond" w:hAnsi="Garamond" w:eastAsia="Times New Roman" w:cs="Times New Roman"/>
+          <w:color w:val="000000"/>
+          <w:kern w:val="0"/>
+          <w:sz w:val="36"/>
+          <w:szCs w:val="36"/>
+          <w:shd w:fill="auto" w:val="clear"/>
+          <w:lang w:val="en-US" w:eastAsia="zh-CN" w:bidi="hi-IN"/>
+        </w:rPr>
+      </w:pPr>
+      <w:r>
+        <w:rPr>
+          <w:rFonts w:eastAsia="Times New Roman" w:cs="Times New Roman" w:ascii="Garamond" w:hAnsi="Garamond"/>
+          <w:color w:val="000000"/>
+          <w:kern w:val="0"/>
+          <w:sz w:val="36"/>
+          <w:szCs w:val="36"/>
+          <w:shd w:fill="auto" w:val="clear"/>
+          <w:lang w:val="en-US" w:eastAsia="zh-CN" w:bidi="hi-IN"/>
+        </w:rPr>
+        <w:t xml:space="preserve">O que nós precisamos entender de verdade é que, se Jesus retirou a árvore do Seu Evangelho da Europa porque aqueles povos, embora profundamente marcados pelo Cristianismo, já não conseguiam sustentar a vivência autêntica dos Seus ensinamentos, Ele pode, da mesma forma, transplantar novamente essa árvore para outro ponto do planeta, caso o Brasil também se afaste da missão que lhe foi confiada. </w:t>
+      </w:r>
+    </w:p>
+    <w:p>
+      <w:pPr>
+        <w:pStyle w:val="Normal"/>
+        <w:jc w:val="both"/>
+        <w:rPr>
+          <w:rFonts w:ascii="Garamond" w:hAnsi="Garamond" w:eastAsia="Times New Roman" w:cs="Times New Roman"/>
+          <w:color w:val="000000"/>
+          <w:kern w:val="0"/>
+          <w:sz w:val="36"/>
+          <w:szCs w:val="36"/>
+          <w:shd w:fill="auto" w:val="clear"/>
+          <w:lang w:val="en-US" w:eastAsia="zh-CN" w:bidi="hi-IN"/>
+        </w:rPr>
+      </w:pPr>
+      <w:r>
+        <w:rPr>
+          <w:rFonts w:eastAsia="Times New Roman" w:cs="Times New Roman" w:ascii="Garamond" w:hAnsi="Garamond"/>
+          <w:color w:val="000000"/>
+          <w:kern w:val="0"/>
+          <w:sz w:val="36"/>
+          <w:szCs w:val="36"/>
+          <w:shd w:fill="auto" w:val="clear"/>
+          <w:lang w:val="en-US" w:eastAsia="zh-CN" w:bidi="hi-IN"/>
+        </w:rPr>
+        <w:t>A responsabilidade é nossa: nenhuma nação mantém o Evangelho por privilégio, mas unicamente pela fidelidade com que o vive.</w:t>
+      </w:r>
+    </w:p>
+    <w:p>
+      <w:pPr>
+        <w:pStyle w:val="Normal"/>
+        <w:jc w:val="both"/>
+        <w:rPr>
+          <w:rFonts w:ascii="Garamond" w:hAnsi="Garamond" w:eastAsia="Times New Roman" w:cs="Times New Roman"/>
+          <w:color w:val="000000"/>
+          <w:kern w:val="0"/>
+          <w:sz w:val="36"/>
+          <w:szCs w:val="36"/>
+          <w:shd w:fill="auto" w:val="clear"/>
+          <w:lang w:val="en-US" w:eastAsia="zh-CN" w:bidi="hi-IN"/>
+        </w:rPr>
+      </w:pPr>
+      <w:r>
+        <w:rPr>
+          <w:rFonts w:eastAsia="Times New Roman" w:cs="Times New Roman" w:ascii="Garamond" w:hAnsi="Garamond"/>
+          <w:color w:val="000000"/>
+          <w:kern w:val="0"/>
+          <w:sz w:val="36"/>
+          <w:szCs w:val="36"/>
+          <w:shd w:fill="auto" w:val="clear"/>
+          <w:lang w:val="en-US" w:eastAsia="zh-CN" w:bidi="hi-IN"/>
+        </w:rPr>
+      </w:r>
+    </w:p>
+    <w:p>
+      <w:pPr>
+        <w:pStyle w:val="Normal"/>
+        <w:jc w:val="both"/>
+        <w:rPr>
+          <w:rFonts w:ascii="Garamond" w:hAnsi="Garamond" w:eastAsia="Times New Roman" w:cs="Times New Roman"/>
+          <w:color w:val="000000"/>
+          <w:kern w:val="0"/>
+          <w:sz w:val="36"/>
+          <w:szCs w:val="36"/>
+          <w:shd w:fill="auto" w:val="clear"/>
+          <w:lang w:val="en-US" w:eastAsia="zh-CN" w:bidi="hi-IN"/>
+        </w:rPr>
+      </w:pPr>
+      <w:r>
+        <w:rPr>
+          <w:rFonts w:eastAsia="Times New Roman" w:cs="Times New Roman" w:ascii="Garamond" w:hAnsi="Garamond"/>
+          <w:color w:val="000000"/>
+          <w:kern w:val="0"/>
+          <w:sz w:val="36"/>
+          <w:szCs w:val="36"/>
+          <w:shd w:fill="auto" w:val="clear"/>
+          <w:lang w:val="en-US" w:eastAsia="zh-CN" w:bidi="hi-IN"/>
+        </w:rPr>
+        <w:t xml:space="preserve">A segunda observação </w:t>
+      </w:r>
+      <w:r>
+        <w:rPr>
+          <w:rFonts w:eastAsia="Times New Roman" w:cs="Times New Roman" w:ascii="Garamond" w:hAnsi="Garamond"/>
+          <w:color w:val="000000"/>
+          <w:kern w:val="0"/>
+          <w:sz w:val="36"/>
+          <w:szCs w:val="36"/>
+          <w:shd w:fill="auto" w:val="clear"/>
+          <w:lang w:val="en-US" w:eastAsia="zh-CN" w:bidi="hi-IN"/>
+        </w:rPr>
+        <w:t>que, diga-se de passagem, é ainda mais importante que a primeira, diz respeito à maneira como interpretamos a condição de pátria do evangelho do nosso país. A maioria de nós acha que o Brasil deveria ser um celeiro de Espíritos de luz, berço das entidades mais elevadas do nosso planeta, um exemplo de moralidade para o resto do mundo.</w:t>
+      </w:r>
+    </w:p>
+    <w:p>
+      <w:pPr>
+        <w:pStyle w:val="Normal"/>
+        <w:jc w:val="both"/>
+        <w:rPr>
+          <w:rFonts w:ascii="Garamond" w:hAnsi="Garamond" w:eastAsia="Times New Roman" w:cs="Times New Roman"/>
+          <w:color w:val="000000"/>
+          <w:kern w:val="0"/>
+          <w:sz w:val="36"/>
+          <w:szCs w:val="36"/>
+          <w:shd w:fill="auto" w:val="clear"/>
+          <w:lang w:val="en-US" w:eastAsia="zh-CN" w:bidi="hi-IN"/>
+        </w:rPr>
+      </w:pPr>
+      <w:r>
         <w:rPr/>
       </w:r>
     </w:p>
@@ -6073,6 +6562,33 @@
         </w:rPr>
       </w:pPr>
       <w:r>
+        <w:rPr>
+          <w:rFonts w:eastAsia="Times New Roman" w:cs="Times New Roman" w:ascii="Garamond" w:hAnsi="Garamond"/>
+          <w:color w:val="000000"/>
+          <w:kern w:val="0"/>
+          <w:sz w:val="36"/>
+          <w:szCs w:val="36"/>
+          <w:shd w:fill="auto" w:val="clear"/>
+          <w:lang w:val="en-US" w:eastAsia="zh-CN" w:bidi="hi-IN"/>
+        </w:rPr>
+        <w:t>Só que diariamente nós somos bombardeados com notícias de desvio de verbas, pagamento de propinas, lavagem de dinheiro, sequestros, roubos a banco, assaltos a residências, assassinatos, pedofilia, estelionato e por aí vai. A lista de crimes cometidos diariamente no Brasil é bem extensa.</w:t>
+      </w:r>
+    </w:p>
+    <w:p>
+      <w:pPr>
+        <w:pStyle w:val="Normal"/>
+        <w:jc w:val="both"/>
+        <w:rPr>
+          <w:rFonts w:ascii="Garamond" w:hAnsi="Garamond" w:eastAsia="Times New Roman" w:cs="Times New Roman"/>
+          <w:color w:val="000000"/>
+          <w:kern w:val="0"/>
+          <w:sz w:val="36"/>
+          <w:szCs w:val="36"/>
+          <w:shd w:fill="auto" w:val="clear"/>
+          <w:lang w:val="en-US" w:eastAsia="zh-CN" w:bidi="hi-IN"/>
+        </w:rPr>
+      </w:pPr>
+      <w:r>
         <w:rPr/>
       </w:r>
     </w:p>
@@ -6100,7 +6616,7 @@
           <w:shd w:fill="auto" w:val="clear"/>
           <w:lang w:val="en-US" w:eastAsia="zh-CN" w:bidi="hi-IN"/>
         </w:rPr>
-        <w:t xml:space="preserve">Quando falamos em pátria do Evangelho, há duas observações muito importantes que precisam ser feitas. </w:t>
+        <w:t>Nós olhamos para tudo isso e dizemos: não é possível que o Brasil seja a pátria do evangelho. Em vez de ser o lar de Espíritos de Luz, o Brasil abriga aquilo de pior que existe na humanidade em termos de moralidade e honestidade. Jesus deve ter cometido algum engano na escolha d'Ele.</w:t>
       </w:r>
     </w:p>
     <w:p>
@@ -6145,7 +6661,7 @@
           <w:shd w:fill="auto" w:val="clear"/>
           <w:lang w:val="en-US" w:eastAsia="zh-CN" w:bidi="hi-IN"/>
         </w:rPr>
-        <w:t>A primeira é o terrível engano que muitos espíritas cometem sobre o tema. Há quem pense que, pelo fato de Jesus ter designado o Brasil como a nação para a qual a árvore do Seu Evangelho seria transplantada, nós somos privilegiados ou mais amados por Ele do que outros povos.</w:t>
+        <w:t xml:space="preserve">Na verdade o engano é nosso. O Brasil foi escolhido por Jesus para ser a pátria do Seu evangelho de luz e amor, justamente porque seria a nação a receber e acolher no seu seio os Espíritos mais endividados perante a Justiça Divina, aqueles com os maiores débitos a serem resgatados. </w:t>
       </w:r>
     </w:p>
     <w:p>
@@ -6190,7 +6706,19 @@
           <w:shd w:fill="auto" w:val="clear"/>
           <w:lang w:val="en-US" w:eastAsia="zh-CN" w:bidi="hi-IN"/>
         </w:rPr>
-        <w:t xml:space="preserve">Como consequência desse pensamento equivocado, algumas pessoas acreditam que podemos simplesmente cruzar os braços diante dos gigantescos problemas morais que enfrentamos no Brasil, esperando que, algum dia, eles sejam resolvidos de maneira milagrosa por Jesus. Nada está mais distante da realidade. </w:t>
+        <w:t>É</w:t>
+      </w:r>
+      <w:r>
+        <w:rPr>
+          <w:rFonts w:eastAsia="Times New Roman" w:cs="Times New Roman" w:ascii="Garamond" w:hAnsi="Garamond"/>
+          <w:color w:val="000000"/>
+          <w:kern w:val="0"/>
+          <w:sz w:val="36"/>
+          <w:szCs w:val="36"/>
+          <w:shd w:fill="auto" w:val="clear"/>
+          <w:lang w:val="en-US" w:eastAsia="zh-CN" w:bidi="hi-IN"/>
+        </w:rPr>
+        <w:t xml:space="preserve"> aqui no Brasil que Espíritos que já falharam inúmeras vezes, que contraíram grandes dívidas ao longo de suas existências comentendo crimes de todos os tipos, recebem a oportunidade de recomeçar. Muitos persistem no erro; outros já iniciaram seu processo de redenção.</w:t>
       </w:r>
     </w:p>
     <w:p>
@@ -6235,7 +6763,7 @@
           <w:shd w:fill="auto" w:val="clear"/>
           <w:lang w:val="en-US" w:eastAsia="zh-CN" w:bidi="hi-IN"/>
         </w:rPr>
-        <w:t>Basta analisarmos o que está escrito no primeiro capítulo do livro Brasil, Coração do Mundo, Pátria do Evangelho, ditado por Humberto de Campos a Chico Xavier.</w:t>
+        <w:t>Nós podemos argumentar que somos pessoas honestas, trabalhadoras e não cometemos crimes. Ótimo. Estamos no caminho certo, mas isso não garante que um dia nós também não tivemos enormes dívidas para com Deus e que foi o Brasil que nos ofereceu a oportunidade de nos redimirmos dos erros passados.</w:t>
       </w:r>
     </w:p>
     <w:p>
@@ -6280,7 +6808,7 @@
           <w:shd w:fill="auto" w:val="clear"/>
           <w:lang w:val="en-US" w:eastAsia="zh-CN" w:bidi="hi-IN"/>
         </w:rPr>
-        <w:t xml:space="preserve">Jesus, ao ver a degradação moral à qual a humanidade se entregara, percebe que a Europa — o local onde o Cristianismo estava mais consolidado e de onde se irradiava a maior parte da influência religiosa do Ocidente — já não vivia o espírito do Evangelho que lhe fora confiado. </w:t>
+        <w:t xml:space="preserve">Independente de termos ou não errado muito no passado, o conhecimento que possuímos hoje do Evangelho de Jesus coloca sob nossos ombros a responsabilidade de ter um olhar diferente para com o mundo. </w:t>
       </w:r>
     </w:p>
     <w:p>
@@ -6325,7 +6853,7 @@
           <w:shd w:fill="auto" w:val="clear"/>
           <w:lang w:val="en-US" w:eastAsia="zh-CN" w:bidi="hi-IN"/>
         </w:rPr>
-        <w:t>A mensagem de amor, simplicidade e fraternidade havia sido sufocada por interesses políticos, rivalidades e ambições materiais. Diante da incapacidade dos antigos povos cristãos de manter viva a pureza dos Seus ensinos, o Cristo decide transplantar a árvore do Evangelho para outra terra — ainda desconhecida, mas preparada para acolhê-lo em sua essência: o Brasil.</w:t>
+        <w:t xml:space="preserve">O contato com o mal é a prova pela qual temos que passar. Nosso futuro espiritual depende da maneira como agimos e reagimos perante o mal. O que eu desejo para os criminosos, para os corruptos? A morte, o aniquilamento total? Se for, então estaremos vibrando na mesma faixa que eles. </w:t>
       </w:r>
     </w:p>
     <w:p>
@@ -6361,72 +6889,6 @@
         </w:rPr>
       </w:pPr>
       <w:r>
-        <w:rPr>
-          <w:rFonts w:eastAsia="Times New Roman" w:cs="Times New Roman" w:ascii="Garamond" w:hAnsi="Garamond"/>
-          <w:color w:val="000000"/>
-          <w:kern w:val="0"/>
-          <w:sz w:val="36"/>
-          <w:szCs w:val="36"/>
-          <w:shd w:fill="auto" w:val="clear"/>
-          <w:lang w:val="en-US" w:eastAsia="zh-CN" w:bidi="hi-IN"/>
-        </w:rPr>
-        <w:t xml:space="preserve">O que nós precisamos entender de verdade é que, </w:t>
-      </w:r>
-      <w:r>
-        <w:rPr>
-          <w:rFonts w:eastAsia="Times New Roman" w:cs="Times New Roman" w:ascii="Garamond" w:hAnsi="Garamond"/>
-          <w:color w:val="000000"/>
-          <w:kern w:val="0"/>
-          <w:sz w:val="36"/>
-          <w:szCs w:val="36"/>
-          <w:shd w:fill="auto" w:val="clear"/>
-          <w:lang w:val="en-US" w:eastAsia="zh-CN" w:bidi="hi-IN"/>
-        </w:rPr>
-        <w:t xml:space="preserve">se Jesus retirou a árvore do Seu Evangelho da Europa porque aqueles povos, embora profundamente marcados pelo Cristianismo, já não conseguiam sustentar a vivência autêntica dos Seus ensinamentos, Ele pode, da mesma forma, transplantar novamente essa árvore para outro ponto do planeta, caso o Brasil também se afaste da missão que lhe foi confiada. </w:t>
-      </w:r>
-    </w:p>
-    <w:p>
-      <w:pPr>
-        <w:pStyle w:val="Normal"/>
-        <w:jc w:val="both"/>
-        <w:rPr>
-          <w:rFonts w:ascii="Garamond" w:hAnsi="Garamond" w:eastAsia="Times New Roman" w:cs="Times New Roman"/>
-          <w:color w:val="000000"/>
-          <w:kern w:val="0"/>
-          <w:sz w:val="36"/>
-          <w:szCs w:val="36"/>
-          <w:shd w:fill="auto" w:val="clear"/>
-          <w:lang w:val="en-US" w:eastAsia="zh-CN" w:bidi="hi-IN"/>
-        </w:rPr>
-      </w:pPr>
-      <w:r>
-        <w:rPr>
-          <w:rFonts w:eastAsia="Times New Roman" w:cs="Times New Roman" w:ascii="Garamond" w:hAnsi="Garamond"/>
-          <w:color w:val="000000"/>
-          <w:kern w:val="0"/>
-          <w:sz w:val="36"/>
-          <w:szCs w:val="36"/>
-          <w:shd w:fill="auto" w:val="clear"/>
-          <w:lang w:val="en-US" w:eastAsia="zh-CN" w:bidi="hi-IN"/>
-        </w:rPr>
-        <w:t>A responsabilidade é nossa: nenhuma nação mantém o Evangelho por privilégio, mas unicamente pela fidelidade com que o vive.</w:t>
-      </w:r>
-    </w:p>
-    <w:p>
-      <w:pPr>
-        <w:pStyle w:val="Normal"/>
-        <w:jc w:val="both"/>
-        <w:rPr>
-          <w:rFonts w:ascii="Garamond" w:hAnsi="Garamond" w:eastAsia="Times New Roman" w:cs="Times New Roman"/>
-          <w:color w:val="000000"/>
-          <w:kern w:val="0"/>
-          <w:sz w:val="36"/>
-          <w:szCs w:val="36"/>
-          <w:shd w:fill="auto" w:val="clear"/>
-          <w:lang w:val="en-US" w:eastAsia="zh-CN" w:bidi="hi-IN"/>
-        </w:rPr>
-      </w:pPr>
-      <w:r>
         <w:rPr/>
       </w:r>
     </w:p>
@@ -6454,351 +6916,39 @@
           <w:shd w:fill="auto" w:val="clear"/>
           <w:lang w:val="en-US" w:eastAsia="zh-CN" w:bidi="hi-IN"/>
         </w:rPr>
-        <w:t xml:space="preserve">A segunda observação importante que precisa ser feita a respeito do Brasil como Pátria do Evangelho é a maneira como interpretamos </w:t>
-      </w:r>
-      <w:r>
-        <w:rPr>
-          <w:rFonts w:eastAsia="Times New Roman" w:cs="Times New Roman" w:ascii="Garamond" w:hAnsi="Garamond"/>
-          <w:color w:val="1C99E0"/>
-          <w:kern w:val="0"/>
-          <w:sz w:val="36"/>
-          <w:szCs w:val="36"/>
-          <w:shd w:fill="auto" w:val="clear"/>
-          <w:lang w:val="en-US" w:eastAsia="zh-CN" w:bidi="hi-IN"/>
-        </w:rPr>
-        <w:t>[ Parei aqui em 0</w:t>
-      </w:r>
-      <w:r>
-        <w:rPr>
-          <w:rFonts w:eastAsia="Times New Roman" w:cs="Times New Roman" w:ascii="Garamond" w:hAnsi="Garamond"/>
-          <w:color w:val="1C99E0"/>
-          <w:kern w:val="0"/>
-          <w:sz w:val="36"/>
-          <w:szCs w:val="36"/>
-          <w:shd w:fill="auto" w:val="clear"/>
-          <w:lang w:val="en-US" w:eastAsia="zh-CN" w:bidi="hi-IN"/>
-        </w:rPr>
-        <w:t>6</w:t>
-      </w:r>
-      <w:r>
-        <w:rPr>
-          <w:rFonts w:eastAsia="Times New Roman" w:cs="Times New Roman" w:ascii="Garamond" w:hAnsi="Garamond"/>
-          <w:color w:val="1C99E0"/>
-          <w:kern w:val="0"/>
-          <w:sz w:val="36"/>
-          <w:szCs w:val="36"/>
-          <w:shd w:fill="auto" w:val="clear"/>
-          <w:lang w:val="en-US" w:eastAsia="zh-CN" w:bidi="hi-IN"/>
-        </w:rPr>
-        <w:t>/12 ]</w:t>
-      </w:r>
-    </w:p>
-    <w:p>
-      <w:pPr>
-        <w:pStyle w:val="Normal"/>
-        <w:jc w:val="both"/>
-        <w:rPr>
-          <w:rFonts w:ascii="Garamond" w:hAnsi="Garamond" w:eastAsia="Times New Roman" w:cs="Times New Roman"/>
-          <w:i/>
-          <w:i/>
-          <w:iCs/>
-          <w:color w:val="000000"/>
-          <w:kern w:val="0"/>
-          <w:sz w:val="36"/>
-          <w:szCs w:val="36"/>
-          <w:shd w:fill="auto" w:val="clear"/>
-          <w:lang w:val="en-US" w:eastAsia="zh-CN" w:bidi="hi-IN"/>
-        </w:rPr>
-      </w:pPr>
-      <w:r>
-        <w:rPr>
-          <w:rFonts w:eastAsia="Times New Roman" w:cs="Times New Roman" w:ascii="Garamond" w:hAnsi="Garamond"/>
-          <w:i/>
-          <w:iCs/>
-          <w:color w:val="000000"/>
-          <w:kern w:val="0"/>
-          <w:sz w:val="36"/>
-          <w:szCs w:val="36"/>
-          <w:shd w:fill="auto" w:val="clear"/>
-          <w:lang w:val="en-US" w:eastAsia="zh-CN" w:bidi="hi-IN"/>
-        </w:rPr>
-      </w:r>
-    </w:p>
-    <w:p>
-      <w:pPr>
-        <w:pStyle w:val="Normal"/>
-        <w:jc w:val="both"/>
-        <w:rPr>
-          <w:rFonts w:ascii="Garamond" w:hAnsi="Garamond" w:eastAsia="Times New Roman" w:cs="Times New Roman"/>
-          <w:color w:val="000000"/>
-          <w:kern w:val="0"/>
-          <w:sz w:val="36"/>
-          <w:szCs w:val="36"/>
-          <w:shd w:fill="auto" w:val="clear"/>
-          <w:lang w:val="en-US" w:eastAsia="zh-CN" w:bidi="hi-IN"/>
-        </w:rPr>
-      </w:pPr>
-      <w:r>
-        <w:rPr>
-          <w:rFonts w:eastAsia="Times New Roman" w:cs="Times New Roman" w:ascii="Garamond" w:hAnsi="Garamond"/>
-          <w:color w:val="000000"/>
-          <w:kern w:val="0"/>
-          <w:sz w:val="36"/>
-          <w:szCs w:val="36"/>
-          <w:shd w:fill="auto" w:val="clear"/>
-          <w:lang w:val="en-US" w:eastAsia="zh-CN" w:bidi="hi-IN"/>
-        </w:rPr>
-      </w:r>
-    </w:p>
-    <w:p>
-      <w:pPr>
-        <w:pStyle w:val="Normal"/>
-        <w:jc w:val="both"/>
-        <w:rPr>
-          <w:rFonts w:ascii="Garamond" w:hAnsi="Garamond" w:eastAsia="Times New Roman" w:cs="Times New Roman"/>
-          <w:color w:val="000000"/>
-          <w:kern w:val="0"/>
-          <w:sz w:val="36"/>
-          <w:szCs w:val="36"/>
-          <w:shd w:fill="auto" w:val="clear"/>
-          <w:lang w:val="en-US" w:eastAsia="zh-CN" w:bidi="hi-IN"/>
-        </w:rPr>
-      </w:pPr>
-      <w:r>
-        <w:rPr>
-          <w:rFonts w:eastAsia="Times New Roman" w:cs="Times New Roman" w:ascii="Garamond" w:hAnsi="Garamond"/>
-          <w:color w:val="000000"/>
-          <w:kern w:val="0"/>
-          <w:sz w:val="36"/>
-          <w:szCs w:val="36"/>
-          <w:shd w:fill="auto" w:val="clear"/>
-          <w:lang w:val="en-US" w:eastAsia="zh-CN" w:bidi="hi-IN"/>
-        </w:rPr>
-      </w:r>
-    </w:p>
-    <w:p>
-      <w:pPr>
-        <w:pStyle w:val="Normal"/>
-        <w:jc w:val="both"/>
-        <w:rPr>
-          <w:rFonts w:ascii="Garamond" w:hAnsi="Garamond" w:eastAsia="Times New Roman" w:cs="Times New Roman"/>
-          <w:color w:val="000000"/>
-          <w:kern w:val="0"/>
-          <w:sz w:val="36"/>
-          <w:szCs w:val="36"/>
-          <w:shd w:fill="auto" w:val="clear"/>
-          <w:lang w:val="en-US" w:eastAsia="zh-CN" w:bidi="hi-IN"/>
-        </w:rPr>
-      </w:pPr>
-      <w:r>
-        <w:rPr>
-          <w:rFonts w:eastAsia="Times New Roman" w:cs="Times New Roman" w:ascii="Garamond" w:hAnsi="Garamond"/>
-          <w:color w:val="000000"/>
-          <w:kern w:val="0"/>
-          <w:sz w:val="36"/>
-          <w:szCs w:val="36"/>
-          <w:shd w:fill="auto" w:val="clear"/>
-          <w:lang w:val="en-US" w:eastAsia="zh-CN" w:bidi="hi-IN"/>
-        </w:rPr>
-        <w:t xml:space="preserve">Como reagimos diante do mal e dos maus? Desejamos que sejam mortos, destruídos? Ou nos unimos a eles em seus atos? </w:t>
-      </w:r>
-    </w:p>
-    <w:p>
-      <w:pPr>
-        <w:pStyle w:val="Normal"/>
-        <w:jc w:val="both"/>
-        <w:rPr>
-          <w:rFonts w:ascii="Garamond" w:hAnsi="Garamond" w:eastAsia="Times New Roman" w:cs="Times New Roman"/>
-          <w:color w:val="000000"/>
-          <w:kern w:val="0"/>
-          <w:sz w:val="36"/>
-          <w:szCs w:val="36"/>
-          <w:shd w:fill="auto" w:val="clear"/>
-          <w:lang w:val="en-US" w:eastAsia="zh-CN" w:bidi="hi-IN"/>
-        </w:rPr>
-      </w:pPr>
-      <w:r>
-        <w:rPr>
-          <w:rFonts w:eastAsia="Times New Roman" w:cs="Times New Roman" w:ascii="Garamond" w:hAnsi="Garamond"/>
-          <w:color w:val="000000"/>
-          <w:kern w:val="0"/>
-          <w:sz w:val="36"/>
-          <w:szCs w:val="36"/>
-          <w:shd w:fill="auto" w:val="clear"/>
-          <w:lang w:val="en-US" w:eastAsia="zh-CN" w:bidi="hi-IN"/>
-        </w:rPr>
-        <w:t>O contato com o mal é a prova pela qual temos que passar. A maneira como agimos e reagimos perante o mal determinará se continuaremos na Terra em regeneração ou se seremos rebaixados a mundos inferiores.</w:t>
-      </w:r>
-    </w:p>
-    <w:p>
-      <w:pPr>
-        <w:pStyle w:val="Normal"/>
-        <w:jc w:val="both"/>
-        <w:rPr>
-          <w:rFonts w:ascii="Garamond" w:hAnsi="Garamond" w:eastAsia="Times New Roman" w:cs="Times New Roman"/>
-          <w:color w:val="000000"/>
-          <w:kern w:val="0"/>
-          <w:sz w:val="36"/>
-          <w:szCs w:val="36"/>
-          <w:shd w:fill="auto" w:val="clear"/>
-          <w:lang w:val="en-US" w:eastAsia="zh-CN" w:bidi="hi-IN"/>
-        </w:rPr>
-      </w:pPr>
-      <w:r>
-        <w:rPr>
-          <w:rFonts w:eastAsia="Times New Roman" w:cs="Times New Roman" w:ascii="Garamond" w:hAnsi="Garamond"/>
-          <w:color w:val="000000"/>
-          <w:kern w:val="0"/>
-          <w:sz w:val="36"/>
-          <w:szCs w:val="36"/>
-          <w:shd w:fill="auto" w:val="clear"/>
-          <w:lang w:val="en-US" w:eastAsia="zh-CN" w:bidi="hi-IN"/>
-        </w:rPr>
-        <w:t>Falar sobre o engano que muitos espíritas cometem a respeito do Brasil ser a pátria do evangelho.</w:t>
-      </w:r>
-    </w:p>
-    <w:p>
-      <w:pPr>
-        <w:pStyle w:val="Normal"/>
-        <w:jc w:val="both"/>
-        <w:rPr>
-          <w:rFonts w:ascii="Garamond" w:hAnsi="Garamond" w:eastAsia="Times New Roman" w:cs="Times New Roman"/>
-          <w:color w:val="000000"/>
-          <w:kern w:val="0"/>
-          <w:sz w:val="36"/>
-          <w:szCs w:val="36"/>
-          <w:shd w:fill="auto" w:val="clear"/>
-          <w:lang w:val="en-US" w:eastAsia="zh-CN" w:bidi="hi-IN"/>
-        </w:rPr>
-      </w:pPr>
-      <w:r>
-        <w:rPr>
-          <w:rFonts w:eastAsia="Times New Roman" w:cs="Times New Roman" w:ascii="Garamond" w:hAnsi="Garamond"/>
-          <w:color w:val="000000"/>
-          <w:kern w:val="0"/>
-          <w:sz w:val="36"/>
-          <w:szCs w:val="36"/>
-          <w:shd w:fill="auto" w:val="clear"/>
-          <w:lang w:val="en-US" w:eastAsia="zh-CN" w:bidi="hi-IN"/>
-        </w:rPr>
-        <w:t xml:space="preserve">Mencionar que os tempos atuais exigem de nós o amor a Deus, ao próximo e a nós mesmos. </w:t>
-      </w:r>
-    </w:p>
-    <w:p>
-      <w:pPr>
-        <w:pStyle w:val="Normal"/>
-        <w:jc w:val="both"/>
-        <w:rPr>
-          <w:rFonts w:ascii="Garamond" w:hAnsi="Garamond" w:eastAsia="Times New Roman" w:cs="Times New Roman"/>
-          <w:color w:val="000000"/>
-          <w:kern w:val="0"/>
-          <w:sz w:val="36"/>
-          <w:szCs w:val="36"/>
-          <w:shd w:fill="auto" w:val="clear"/>
-          <w:lang w:val="en-US" w:eastAsia="zh-CN" w:bidi="hi-IN"/>
-        </w:rPr>
-      </w:pPr>
-      <w:r>
-        <w:rPr>
-          <w:rFonts w:eastAsia="Times New Roman" w:cs="Times New Roman" w:ascii="Garamond" w:hAnsi="Garamond"/>
-          <w:color w:val="000000"/>
-          <w:kern w:val="0"/>
-          <w:sz w:val="36"/>
-          <w:szCs w:val="36"/>
-          <w:shd w:fill="auto" w:val="clear"/>
-          <w:lang w:val="en-US" w:eastAsia="zh-CN" w:bidi="hi-IN"/>
-        </w:rPr>
-      </w:r>
-    </w:p>
-    <w:p>
-      <w:pPr>
-        <w:pStyle w:val="Normal"/>
-        <w:jc w:val="both"/>
-        <w:rPr>
-          <w:rFonts w:ascii="Garamond" w:hAnsi="Garamond" w:eastAsia="Times New Roman" w:cs="Times New Roman"/>
-          <w:color w:val="000000"/>
-          <w:kern w:val="0"/>
-          <w:sz w:val="36"/>
-          <w:szCs w:val="36"/>
-          <w:shd w:fill="auto" w:val="clear"/>
-          <w:lang w:val="en-US" w:eastAsia="zh-CN" w:bidi="hi-IN"/>
-        </w:rPr>
-      </w:pPr>
-      <w:r>
-        <w:rPr>
-          <w:rFonts w:eastAsia="Times New Roman" w:cs="Times New Roman" w:ascii="Garamond" w:hAnsi="Garamond"/>
-          <w:color w:val="000000"/>
-          <w:kern w:val="0"/>
-          <w:sz w:val="36"/>
-          <w:szCs w:val="36"/>
-          <w:shd w:fill="auto" w:val="clear"/>
-          <w:lang w:val="en-US" w:eastAsia="zh-CN" w:bidi="hi-IN"/>
-        </w:rPr>
-      </w:r>
-    </w:p>
-    <w:p>
-      <w:pPr>
-        <w:pStyle w:val="Normal"/>
-        <w:jc w:val="both"/>
-        <w:rPr>
-          <w:rFonts w:ascii="Garamond" w:hAnsi="Garamond" w:eastAsia="Times New Roman" w:cs="Times New Roman"/>
-          <w:color w:val="000000"/>
-          <w:kern w:val="0"/>
-          <w:sz w:val="36"/>
-          <w:szCs w:val="36"/>
-          <w:shd w:fill="auto" w:val="clear"/>
-          <w:lang w:val="en-US" w:eastAsia="zh-CN" w:bidi="hi-IN"/>
-        </w:rPr>
-      </w:pPr>
-      <w:r>
-        <w:rPr>
-          <w:rFonts w:eastAsia="Times New Roman" w:cs="Times New Roman" w:ascii="Garamond" w:hAnsi="Garamond"/>
-          <w:color w:val="000000"/>
-          <w:kern w:val="0"/>
-          <w:sz w:val="36"/>
-          <w:szCs w:val="36"/>
-          <w:shd w:fill="auto" w:val="clear"/>
-          <w:lang w:val="en-US" w:eastAsia="zh-CN" w:bidi="hi-IN"/>
-        </w:rPr>
-      </w:r>
-    </w:p>
-    <w:p>
-      <w:pPr>
-        <w:pStyle w:val="Normal"/>
-        <w:jc w:val="both"/>
-        <w:rPr>
-          <w:rFonts w:ascii="Garamond" w:hAnsi="Garamond" w:eastAsia="Times New Roman" w:cs="Times New Roman"/>
-          <w:color w:val="000000"/>
-          <w:kern w:val="0"/>
-          <w:sz w:val="36"/>
-          <w:szCs w:val="36"/>
-          <w:shd w:fill="auto" w:val="clear"/>
-          <w:lang w:val="en-US" w:eastAsia="zh-CN" w:bidi="hi-IN"/>
-        </w:rPr>
-      </w:pPr>
-      <w:r>
-        <w:rPr>
-          <w:rFonts w:eastAsia="Times New Roman" w:cs="Times New Roman" w:ascii="Garamond" w:hAnsi="Garamond"/>
-          <w:i/>
-          <w:iCs/>
-          <w:color w:val="000000"/>
-          <w:kern w:val="0"/>
-          <w:sz w:val="36"/>
-          <w:szCs w:val="36"/>
-          <w:shd w:fill="auto" w:val="clear"/>
-          <w:lang w:val="en-US" w:eastAsia="zh-CN" w:bidi="hi-IN"/>
-        </w:rPr>
-        <w:t>Resta-lhes ainda um imenso progresso a realizar: o de fazerem que entre si reinem a caridade, a fraternidade, a solidariedade, que lhes assegurem o bem-estar moral.</w:t>
-      </w:r>
-    </w:p>
-    <w:p>
-      <w:pPr>
-        <w:pStyle w:val="Normal"/>
-        <w:jc w:val="both"/>
-        <w:rPr>
-          <w:color w:val="00A0FC"/>
-          <w:sz w:val="36"/>
-          <w:szCs w:val="36"/>
+        <w:t>Em breve Jesus irá separar o joio do trigo e a Terra  se tornará mundo em regeneração. Se queremos conquistar o direito de permanecer aqui, devemos nos empenhar na prática da caridade, da humildade, da paciência, do devotamento, da abnegação, da resignação e do sacrifício porque são todas diferentes manifestações do amor a Deus, ao próximo e a nós mesmos.</w:t>
+      </w:r>
+    </w:p>
+    <w:p>
+      <w:pPr>
+        <w:pStyle w:val="Normal"/>
+        <w:jc w:val="both"/>
+        <w:rPr>
+          <w:rFonts w:ascii="Garamond" w:hAnsi="Garamond" w:eastAsia="Times New Roman" w:cs="Times New Roman"/>
+          <w:color w:val="000000"/>
+          <w:kern w:val="0"/>
+          <w:sz w:val="36"/>
+          <w:szCs w:val="36"/>
+          <w:shd w:fill="auto" w:val="clear"/>
+          <w:lang w:val="en-US" w:eastAsia="zh-CN" w:bidi="hi-IN"/>
+        </w:rPr>
+      </w:pPr>
+      <w:r>
+        <w:rPr/>
+      </w:r>
+    </w:p>
+    <w:p>
+      <w:pPr>
+        <w:pStyle w:val="Normal"/>
+        <w:jc w:val="both"/>
+        <w:rPr>
+          <w:rFonts w:ascii="Garamond" w:hAnsi="Garamond" w:eastAsia="Times New Roman" w:cs="Times New Roman"/>
+          <w:color w:val="000000"/>
+          <w:kern w:val="0"/>
+          <w:sz w:val="36"/>
+          <w:szCs w:val="36"/>
+          <w:shd w:fill="auto" w:val="clear"/>
+          <w:lang w:val="en-US" w:eastAsia="zh-CN" w:bidi="hi-IN"/>
         </w:rPr>
       </w:pPr>
       <w:r>
@@ -6874,7 +7024,7 @@
         <w:bCs/>
         <w:rFonts w:ascii="Garamond" w:hAnsi="Garamond"/>
       </w:rPr>
-      <w:t>35</w:t>
+      <w:t>37</w:t>
     </w:r>
     <w:r>
       <w:rPr>

</xml_diff>

<commit_message>
15/12/2025 - 21:01 h
</commit_message>
<xml_diff>
--- a/O mandamento maior/O Mandamento Maior.docx
+++ b/O mandamento maior/O Mandamento Maior.docx
@@ -3221,54 +3221,54 @@
           <w:shd w:fill="auto" w:val="clear"/>
           <w:lang w:val="en-US" w:eastAsia="zh-CN" w:bidi="hi-IN"/>
         </w:rPr>
-        <w:t xml:space="preserve">Obviamente que essas manifestações de afeto estão absurdamente distantes do amor ensinado e exemplificado por Jesus, mas Fénelon chama nossa atenção justamente para o fato de que, tais sentimentos são a semente do sentimento do amor e que um dia, devido à nossa filiação divina, essa sementer irá germinar, florescer e frutificar. </w:t>
-      </w:r>
-    </w:p>
-    <w:p>
-      <w:pPr>
-        <w:pStyle w:val="Normal"/>
-        <w:jc w:val="both"/>
-        <w:rPr>
-          <w:rFonts w:ascii="Garamond" w:hAnsi="Garamond" w:eastAsia="Times New Roman" w:cs="Times New Roman"/>
-          <w:color w:val="000000"/>
-          <w:kern w:val="0"/>
-          <w:sz w:val="36"/>
-          <w:szCs w:val="36"/>
-          <w:shd w:fill="auto" w:val="clear"/>
-          <w:lang w:val="en-US" w:eastAsia="zh-CN" w:bidi="hi-IN"/>
-        </w:rPr>
-      </w:pPr>
-      <w:r>
-        <w:rPr>
-          <w:rFonts w:eastAsia="Times New Roman" w:cs="Times New Roman" w:ascii="Garamond" w:hAnsi="Garamond"/>
-          <w:color w:val="000000"/>
-          <w:kern w:val="0"/>
-          <w:sz w:val="36"/>
-          <w:szCs w:val="36"/>
-          <w:shd w:fill="auto" w:val="clear"/>
-          <w:lang w:val="en-US" w:eastAsia="zh-CN" w:bidi="hi-IN"/>
-        </w:rPr>
-      </w:r>
-    </w:p>
-    <w:p>
-      <w:pPr>
-        <w:pStyle w:val="Normal"/>
-        <w:jc w:val="both"/>
-        <w:rPr>
-          <w:color w:val="000000"/>
-        </w:rPr>
-      </w:pPr>
-      <w:r>
-        <w:rPr>
-          <w:rFonts w:eastAsia="Times New Roman" w:cs="Times New Roman" w:ascii="Garamond" w:hAnsi="Garamond"/>
-          <w:color w:val="000000"/>
-          <w:kern w:val="0"/>
-          <w:sz w:val="36"/>
-          <w:szCs w:val="36"/>
-          <w:shd w:fill="auto" w:val="clear"/>
-          <w:lang w:val="en-US" w:eastAsia="zh-CN" w:bidi="hi-IN"/>
-        </w:rPr>
-        <w:t>Sobre a questão do amor aos animais, eu gostaria de trazer um ponto que vai de encontro ao tema amor ao próximo.</w:t>
+        <w:t xml:space="preserve">Obviamente que essas manifestações de afeto estão absurdamente distantes do amor ensinado e exemplificado por Jesus, mas Fénelon chama nossa atenção justamente para o fato de que, tais sentimentos são a semente do amor e que um dia, devido à nossa filiação divina, essa semente irá germinar, florescer e frutificar. </w:t>
+      </w:r>
+    </w:p>
+    <w:p>
+      <w:pPr>
+        <w:pStyle w:val="Normal"/>
+        <w:jc w:val="both"/>
+        <w:rPr>
+          <w:rFonts w:ascii="Garamond" w:hAnsi="Garamond" w:eastAsia="Times New Roman" w:cs="Times New Roman"/>
+          <w:color w:val="000000"/>
+          <w:kern w:val="0"/>
+          <w:sz w:val="36"/>
+          <w:szCs w:val="36"/>
+          <w:shd w:fill="auto" w:val="clear"/>
+          <w:lang w:val="en-US" w:eastAsia="zh-CN" w:bidi="hi-IN"/>
+        </w:rPr>
+      </w:pPr>
+      <w:r>
+        <w:rPr>
+          <w:rFonts w:eastAsia="Times New Roman" w:cs="Times New Roman" w:ascii="Garamond" w:hAnsi="Garamond"/>
+          <w:color w:val="000000"/>
+          <w:kern w:val="0"/>
+          <w:sz w:val="36"/>
+          <w:szCs w:val="36"/>
+          <w:shd w:fill="auto" w:val="clear"/>
+          <w:lang w:val="en-US" w:eastAsia="zh-CN" w:bidi="hi-IN"/>
+        </w:rPr>
+      </w:r>
+    </w:p>
+    <w:p>
+      <w:pPr>
+        <w:pStyle w:val="Normal"/>
+        <w:jc w:val="both"/>
+        <w:rPr>
+          <w:color w:val="000000"/>
+        </w:rPr>
+      </w:pPr>
+      <w:r>
+        <w:rPr>
+          <w:rFonts w:eastAsia="Times New Roman" w:cs="Times New Roman" w:ascii="Garamond" w:hAnsi="Garamond"/>
+          <w:color w:val="000000"/>
+          <w:kern w:val="0"/>
+          <w:sz w:val="36"/>
+          <w:szCs w:val="36"/>
+          <w:shd w:fill="auto" w:val="clear"/>
+          <w:lang w:val="en-US" w:eastAsia="zh-CN" w:bidi="hi-IN"/>
+        </w:rPr>
+        <w:t>Sobre a questão do amor aos animais, eu gostaria de trazer um ponto que vai de encontro à questão do amor ao próximo.</w:t>
       </w:r>
     </w:p>
     <w:p>
@@ -3338,7 +3338,7 @@
           <w:shd w:fill="auto" w:val="clear"/>
           <w:lang w:val="en-US" w:eastAsia="zh-CN" w:bidi="hi-IN"/>
         </w:rPr>
-        <w:t>Coelhos são animais muito mal compreendidos. As pessoas os alimentam de maneira errada, prendem em gaiolas, os dentes deles crescem durante toda a vida e por isso eles têm a necessidade constante de roer tudo o que encontram pela frente, são suscetíveis de uma série de doenças e por aí vai. Por isso eu faço parte de alguns grupos de pessoas que também tem coelhos de estimação e nesses grupos nós trocamos informações sobre como cuidar da melhor maneira dos nossos orelhudinhos.</w:t>
+        <w:t>Coelhos são animais muito mal compreendidos. As pessoas os alimentam de maneira errada, prendem em gaiolas, os dentes deles crescem durante toda a vida e por isso eles têm a necessidade constante de roer tudo o que encontram pela frente, são suscetíveis a uma série de doenças e por aí vai. Por isso eu faço parte de alguns grupos de pessoas que também tem coelhos de estimação e nesses grupos nós trocamos informações sobre como cuidar da melhor maneira dos nossos orelhudinhos.</w:t>
       </w:r>
     </w:p>
     <w:p>
@@ -4103,455 +4103,7 @@
         </w:rPr>
       </w:pPr>
       <w:r>
-        <w:rPr>
-          <w:rFonts w:eastAsia="Times New Roman" w:cs="Times New Roman" w:ascii="Garamond" w:hAnsi="Garamond"/>
-          <w:color w:val="000000"/>
-          <w:kern w:val="0"/>
-          <w:sz w:val="36"/>
-          <w:szCs w:val="36"/>
-          <w:shd w:fill="auto" w:val="clear"/>
-          <w:lang w:val="en-US" w:eastAsia="zh-CN" w:bidi="hi-IN"/>
-        </w:rPr>
-      </w:r>
-    </w:p>
-    <w:p>
-      <w:pPr>
-        <w:pStyle w:val="Normal"/>
-        <w:jc w:val="both"/>
-        <w:rPr>
-          <w:u w:val="none"/>
-        </w:rPr>
-      </w:pPr>
-      <w:r>
-        <w:rPr>
-          <w:rFonts w:eastAsia="Times New Roman" w:cs="Times New Roman" w:ascii="Garamond" w:hAnsi="Garamond"/>
-          <w:color w:val="000000"/>
-          <w:kern w:val="0"/>
-          <w:sz w:val="36"/>
-          <w:szCs w:val="36"/>
-          <w:u w:val="none"/>
-          <w:shd w:fill="auto" w:val="clear"/>
-          <w:lang w:val="en-US" w:eastAsia="zh-CN" w:bidi="hi-IN"/>
-        </w:rPr>
-        <w:t xml:space="preserve">Ainda no capítulo XI de O Evangelho Segundo o Espiritismo, o Espírito Isabel de França trata de uma questão extremamente delicada: a caridade para com os criminosos. Isso é particularmente delicado para nós, brasileiros. </w:t>
-      </w:r>
-    </w:p>
-    <w:p>
-      <w:pPr>
-        <w:pStyle w:val="Normal"/>
-        <w:jc w:val="both"/>
-        <w:rPr>
-          <w:u w:val="none"/>
-        </w:rPr>
-      </w:pPr>
-      <w:r>
-        <w:rPr>
-          <w:u w:val="none"/>
-        </w:rPr>
-      </w:r>
-    </w:p>
-    <w:p>
-      <w:pPr>
-        <w:pStyle w:val="Normal"/>
-        <w:jc w:val="both"/>
-        <w:rPr>
-          <w:u w:val="none"/>
-        </w:rPr>
-      </w:pPr>
-      <w:r>
-        <w:rPr>
-          <w:rFonts w:eastAsia="Times New Roman" w:cs="Times New Roman" w:ascii="Garamond" w:hAnsi="Garamond"/>
-          <w:color w:val="000000"/>
-          <w:kern w:val="0"/>
-          <w:sz w:val="36"/>
-          <w:szCs w:val="36"/>
-          <w:u w:val="none"/>
-          <w:shd w:fill="auto" w:val="clear"/>
-          <w:lang w:val="en-US" w:eastAsia="zh-CN" w:bidi="hi-IN"/>
-        </w:rPr>
-        <w:t>Infelizmente, durante décadas temos visto assassinos, estupradores, sequestradores, corruptos sendo colocados em liberdade, a despeito da gravidade e do números de crimes comprovadamente cometidos por eles. A segurança pública é, sem dúvida alguma, um dos maiores problemas que  a sociedade brasileira tem enfrentado.</w:t>
-      </w:r>
-    </w:p>
-    <w:p>
-      <w:pPr>
-        <w:pStyle w:val="Normal"/>
-        <w:jc w:val="both"/>
-        <w:rPr>
-          <w:u w:val="none"/>
-        </w:rPr>
-      </w:pPr>
-      <w:r>
-        <w:rPr>
-          <w:u w:val="none"/>
-        </w:rPr>
-      </w:r>
-    </w:p>
-    <w:p>
-      <w:pPr>
-        <w:pStyle w:val="Normal"/>
-        <w:jc w:val="both"/>
-        <w:rPr>
-          <w:u w:val="none"/>
-        </w:rPr>
-      </w:pPr>
-      <w:r>
-        <w:rPr>
-          <w:rFonts w:eastAsia="Times New Roman" w:cs="Times New Roman" w:ascii="Garamond" w:hAnsi="Garamond"/>
-          <w:color w:val="000000"/>
-          <w:kern w:val="0"/>
-          <w:sz w:val="36"/>
-          <w:szCs w:val="36"/>
-          <w:u w:val="none"/>
-          <w:shd w:fill="auto" w:val="clear"/>
-          <w:lang w:val="en-US" w:eastAsia="zh-CN" w:bidi="hi-IN"/>
-        </w:rPr>
-        <w:t>Diante desse cenário é muito difícil para nós termos o  sentimento da caridade para com os criminosos. Entretanto, é exatamente isso que Jesus espera de nós.</w:t>
-      </w:r>
-    </w:p>
-    <w:p>
-      <w:pPr>
-        <w:pStyle w:val="Normal"/>
-        <w:jc w:val="both"/>
-        <w:rPr>
-          <w:u w:val="none"/>
-        </w:rPr>
-      </w:pPr>
-      <w:r>
-        <w:rPr>
-          <w:rFonts w:eastAsia="Times New Roman" w:cs="Times New Roman" w:ascii="Garamond" w:hAnsi="Garamond"/>
-          <w:color w:val="000000"/>
-          <w:kern w:val="0"/>
-          <w:sz w:val="36"/>
-          <w:szCs w:val="36"/>
-          <w:u w:val="none"/>
-          <w:shd w:fill="auto" w:val="clear"/>
-          <w:lang w:val="en-US" w:eastAsia="zh-CN" w:bidi="hi-IN"/>
-        </w:rPr>
-        <w:t xml:space="preserve">Isabel nos diz que, se Jesus visse junto a nós um desses piores criminosos dos dias de hoje, o Mestre o consideraria um doente digno de piedade e estenderia a ele uma mão amiga. </w:t>
-      </w:r>
-    </w:p>
-    <w:p>
-      <w:pPr>
-        <w:pStyle w:val="Normal"/>
-        <w:jc w:val="both"/>
-        <w:rPr>
-          <w:u w:val="none"/>
-        </w:rPr>
-      </w:pPr>
-      <w:r>
-        <w:rPr>
-          <w:u w:val="none"/>
-        </w:rPr>
-      </w:r>
-    </w:p>
-    <w:p>
-      <w:pPr>
-        <w:pStyle w:val="Normal"/>
-        <w:jc w:val="both"/>
-        <w:rPr>
-          <w:u w:val="none"/>
-        </w:rPr>
-      </w:pPr>
-      <w:r>
-        <w:rPr>
-          <w:rFonts w:eastAsia="Times New Roman" w:cs="Times New Roman" w:ascii="Garamond" w:hAnsi="Garamond"/>
-          <w:color w:val="000000"/>
-          <w:kern w:val="0"/>
-          <w:sz w:val="36"/>
-          <w:szCs w:val="36"/>
-          <w:u w:val="none"/>
-          <w:shd w:fill="auto" w:val="clear"/>
-          <w:lang w:val="en-US" w:eastAsia="zh-CN" w:bidi="hi-IN"/>
-        </w:rPr>
-        <w:t>Isabel diz ainda que nós não temos condições de agir como Jesus. Entretanto, podemos orar por aquele criminoso e talvez, sob o influxo de nossas orações ele seja tocado de arrependimento e inicie desde já a transformação para abandonar a vida de crimes.</w:t>
-      </w:r>
-    </w:p>
-    <w:p>
-      <w:pPr>
-        <w:pStyle w:val="Normal"/>
-        <w:jc w:val="both"/>
-        <w:rPr>
-          <w:u w:val="none"/>
-        </w:rPr>
-      </w:pPr>
-      <w:r>
-        <w:rPr>
-          <w:u w:val="none"/>
-        </w:rPr>
-      </w:r>
-    </w:p>
-    <w:p>
-      <w:pPr>
-        <w:pStyle w:val="Normal"/>
-        <w:jc w:val="both"/>
-        <w:rPr>
-          <w:u w:val="none"/>
-        </w:rPr>
-      </w:pPr>
-      <w:r>
-        <w:rPr>
-          <w:rFonts w:eastAsia="Times New Roman" w:cs="Times New Roman" w:ascii="Garamond" w:hAnsi="Garamond"/>
-          <w:color w:val="000000"/>
-          <w:kern w:val="0"/>
-          <w:sz w:val="36"/>
-          <w:szCs w:val="36"/>
-          <w:u w:val="none"/>
-          <w:shd w:fill="auto" w:val="clear"/>
-          <w:lang w:val="en-US" w:eastAsia="zh-CN" w:bidi="hi-IN"/>
-        </w:rPr>
-        <w:t>Mas, sejamos sinceros: até mesmo orar pelos criminosos é algo difícil para nós. Porém, precisamos tentar. É uma barreira interior que, com o tempo e a prática, conseguiremos transpor.</w:t>
-      </w:r>
-    </w:p>
-    <w:p>
-      <w:pPr>
-        <w:pStyle w:val="Normal"/>
-        <w:jc w:val="both"/>
-        <w:rPr>
-          <w:u w:val="none"/>
-        </w:rPr>
-      </w:pPr>
-      <w:r>
-        <w:rPr>
-          <w:u w:val="none"/>
-        </w:rPr>
-      </w:r>
-    </w:p>
-    <w:p>
-      <w:pPr>
-        <w:pStyle w:val="Normal"/>
-        <w:jc w:val="both"/>
-        <w:rPr>
-          <w:u w:val="none"/>
-        </w:rPr>
-      </w:pPr>
-      <w:r>
-        <w:rPr>
-          <w:rFonts w:eastAsia="Times New Roman" w:cs="Times New Roman" w:ascii="Garamond" w:hAnsi="Garamond"/>
-          <w:color w:val="000000"/>
-          <w:kern w:val="0"/>
-          <w:sz w:val="36"/>
-          <w:szCs w:val="36"/>
-          <w:u w:val="none"/>
-          <w:shd w:fill="auto" w:val="clear"/>
-          <w:lang w:val="en-US" w:eastAsia="zh-CN" w:bidi="hi-IN"/>
-        </w:rPr>
-        <w:t xml:space="preserve">Os mais jovens aqui muito provavelmente nunca ouviram falar de Daniela Perez. Ela era uma jovem atriz, muito bonita, que foi brutalmente assassinada pelo ator Guilherme de Pádua e a esposa dele. </w:t>
-      </w:r>
-    </w:p>
-    <w:p>
-      <w:pPr>
-        <w:pStyle w:val="Normal"/>
-        <w:jc w:val="both"/>
-        <w:rPr>
-          <w:u w:val="none"/>
-        </w:rPr>
-      </w:pPr>
-      <w:r>
-        <w:rPr>
-          <w:u w:val="none"/>
-        </w:rPr>
-      </w:r>
-    </w:p>
-    <w:p>
-      <w:pPr>
-        <w:pStyle w:val="Normal"/>
-        <w:jc w:val="both"/>
-        <w:rPr>
-          <w:u w:val="none"/>
-        </w:rPr>
-      </w:pPr>
-      <w:r>
-        <w:rPr>
-          <w:rFonts w:eastAsia="Times New Roman" w:cs="Times New Roman" w:ascii="Garamond" w:hAnsi="Garamond"/>
-          <w:color w:val="000000"/>
-          <w:kern w:val="0"/>
-          <w:sz w:val="36"/>
-          <w:szCs w:val="36"/>
-          <w:u w:val="none"/>
-          <w:shd w:fill="auto" w:val="clear"/>
-          <w:lang w:val="en-US" w:eastAsia="zh-CN" w:bidi="hi-IN"/>
-        </w:rPr>
-        <w:t>A mãe de Daniela, Glória Perez, procurou Chico Xavier poucos dias depois do crime e o Chico disse a ela o seguinte: "Você, na posição de mãe, ainda não tem condições de conceder o perdão às pessoas que tiraram a vida de sua filha querida. Mas eu vou lhe pedir uma coisa: não permita que os algozes de sua filha sejam linchados".</w:t>
-      </w:r>
-    </w:p>
-    <w:p>
-      <w:pPr>
-        <w:pStyle w:val="Normal"/>
-        <w:jc w:val="both"/>
-        <w:rPr>
-          <w:u w:val="none"/>
-        </w:rPr>
-      </w:pPr>
-      <w:r>
-        <w:rPr>
-          <w:u w:val="none"/>
-        </w:rPr>
-      </w:r>
-    </w:p>
-    <w:p>
-      <w:pPr>
-        <w:pStyle w:val="Normal"/>
-        <w:jc w:val="both"/>
-        <w:rPr>
-          <w:u w:val="none"/>
-        </w:rPr>
-      </w:pPr>
-      <w:r>
-        <w:rPr>
-          <w:rFonts w:eastAsia="Times New Roman" w:cs="Times New Roman" w:ascii="Garamond" w:hAnsi="Garamond"/>
-          <w:color w:val="000000"/>
-          <w:kern w:val="0"/>
-          <w:sz w:val="36"/>
-          <w:szCs w:val="36"/>
-          <w:u w:val="none"/>
-          <w:shd w:fill="auto" w:val="clear"/>
-          <w:lang w:val="en-US" w:eastAsia="zh-CN" w:bidi="hi-IN"/>
-        </w:rPr>
-        <w:t>Havia um temor muito grande de que Guilherme e sua esposa fossem linchados devido à comoção nacional que o crime causou.</w:t>
-      </w:r>
-    </w:p>
-    <w:p>
-      <w:pPr>
-        <w:pStyle w:val="Normal"/>
-        <w:jc w:val="both"/>
-        <w:rPr>
-          <w:u w:val="none"/>
-        </w:rPr>
-      </w:pPr>
-      <w:r>
-        <w:rPr>
-          <w:u w:val="none"/>
-        </w:rPr>
-      </w:r>
-    </w:p>
-    <w:p>
-      <w:pPr>
-        <w:pStyle w:val="Normal"/>
-        <w:jc w:val="both"/>
-        <w:rPr>
-          <w:u w:val="none"/>
-        </w:rPr>
-      </w:pPr>
-      <w:r>
-        <w:rPr>
-          <w:rFonts w:eastAsia="Times New Roman" w:cs="Times New Roman" w:ascii="Garamond" w:hAnsi="Garamond"/>
-          <w:color w:val="000000"/>
-          <w:kern w:val="0"/>
-          <w:sz w:val="36"/>
-          <w:szCs w:val="36"/>
-          <w:u w:val="none"/>
-          <w:shd w:fill="auto" w:val="clear"/>
-          <w:lang w:val="en-US" w:eastAsia="zh-CN" w:bidi="hi-IN"/>
-        </w:rPr>
-        <w:t>Chico sabia que Glória Perez  não tinha condições de perdoar os assassinos de sua filha, mas sabia que, com a influência que Glória tinha - ela é uma escritora de novelas - seria possível evitar o linchamento.</w:t>
-      </w:r>
-    </w:p>
-    <w:p>
-      <w:pPr>
-        <w:pStyle w:val="Normal"/>
-        <w:jc w:val="both"/>
-        <w:rPr>
-          <w:u w:val="none"/>
-        </w:rPr>
-      </w:pPr>
-      <w:r>
-        <w:rPr>
-          <w:u w:val="none"/>
-        </w:rPr>
-      </w:r>
-    </w:p>
-    <w:p>
-      <w:pPr>
-        <w:pStyle w:val="Normal"/>
-        <w:jc w:val="both"/>
-        <w:rPr>
-          <w:u w:val="none"/>
-        </w:rPr>
-      </w:pPr>
-      <w:r>
-        <w:rPr>
-          <w:rFonts w:eastAsia="Times New Roman" w:cs="Times New Roman" w:ascii="Garamond" w:hAnsi="Garamond"/>
-          <w:color w:val="000000"/>
-          <w:kern w:val="0"/>
-          <w:sz w:val="36"/>
-          <w:szCs w:val="36"/>
-          <w:u w:val="none"/>
-          <w:shd w:fill="auto" w:val="clear"/>
-          <w:lang w:val="en-US" w:eastAsia="zh-CN" w:bidi="hi-IN"/>
-        </w:rPr>
-        <w:t>No dia seguinte ao encontro com Chico, Glória telefonou para Eurípedes, filho adotivo de Chico e disse: "Avise ao Chico que o perdão ainda está muito difícil, mas eu vou trabalhar para que ninguém faça o linchamento".</w:t>
-      </w:r>
-    </w:p>
-    <w:p>
-      <w:pPr>
-        <w:pStyle w:val="Normal"/>
-        <w:jc w:val="both"/>
-        <w:rPr>
-          <w:u w:val="none"/>
-        </w:rPr>
-      </w:pPr>
-      <w:r>
-        <w:rPr>
-          <w:u w:val="none"/>
-        </w:rPr>
-      </w:r>
-    </w:p>
-    <w:p>
-      <w:pPr>
-        <w:pStyle w:val="Normal"/>
-        <w:jc w:val="both"/>
-        <w:rPr>
-          <w:u w:val="none"/>
-        </w:rPr>
-      </w:pPr>
-      <w:r>
-        <w:rPr>
-          <w:rFonts w:eastAsia="Times New Roman" w:cs="Times New Roman" w:ascii="Garamond" w:hAnsi="Garamond"/>
-          <w:color w:val="000000"/>
-          <w:kern w:val="0"/>
-          <w:sz w:val="36"/>
-          <w:szCs w:val="36"/>
-          <w:u w:val="none"/>
-          <w:shd w:fill="auto" w:val="clear"/>
-          <w:lang w:val="en-US" w:eastAsia="zh-CN" w:bidi="hi-IN"/>
-        </w:rPr>
-        <w:t>Foi um ato de nobreza espiritual de Glória Perez. Trabalhar para preservar a vida dos assassinos da filha dela. Não resta a menor dúvida  de que essa atitude exigiu dessa mãe um esforço e uma coragem gigantescos.</w:t>
-      </w:r>
-    </w:p>
-    <w:p>
-      <w:pPr>
-        <w:pStyle w:val="Normal"/>
-        <w:jc w:val="both"/>
-        <w:rPr>
-          <w:u w:val="none"/>
-        </w:rPr>
-      </w:pPr>
-      <w:r>
-        <w:rPr>
-          <w:u w:val="none"/>
-        </w:rPr>
-      </w:r>
-    </w:p>
-    <w:p>
-      <w:pPr>
-        <w:pStyle w:val="Normal"/>
-        <w:jc w:val="both"/>
-        <w:rPr>
-          <w:u w:val="none"/>
-        </w:rPr>
-      </w:pPr>
-      <w:r>
-        <w:rPr>
-          <w:rFonts w:eastAsia="Times New Roman" w:cs="Times New Roman" w:ascii="Garamond" w:hAnsi="Garamond"/>
-          <w:color w:val="000000"/>
-          <w:kern w:val="0"/>
-          <w:sz w:val="36"/>
-          <w:szCs w:val="36"/>
-          <w:u w:val="none"/>
-          <w:shd w:fill="auto" w:val="clear"/>
-          <w:lang w:val="en-US" w:eastAsia="zh-CN" w:bidi="hi-IN"/>
-        </w:rPr>
-        <w:t>É exatamente isso que o Espírito Isabel de França nos pede: não é ter para com o criminoso o mesmo sentimento que Jesus tem, mas é fazer por ele aquilo que nossa condição espiritual já nos permite fazer.</w:t>
+        <w:rPr/>
       </w:r>
     </w:p>
     <w:p>
@@ -4949,67 +4501,7 @@
           <w:shd w:fill="auto" w:val="clear"/>
           <w:lang w:val="en-US" w:eastAsia="zh-CN" w:bidi="hi-IN"/>
         </w:rPr>
-        <w:t>I</w:t>
-      </w:r>
-      <w:r>
-        <w:rPr>
-          <w:rFonts w:eastAsia="Times New Roman" w:cs="Times New Roman" w:ascii="Garamond" w:hAnsi="Garamond"/>
-          <w:color w:val="000000"/>
-          <w:kern w:val="0"/>
-          <w:sz w:val="36"/>
-          <w:szCs w:val="36"/>
-          <w:shd w:fill="auto" w:val="clear"/>
-          <w:lang w:val="en-US" w:eastAsia="zh-CN" w:bidi="hi-IN"/>
-        </w:rPr>
-        <w:t xml:space="preserve">nfelizmente </w:t>
-      </w:r>
-      <w:r>
-        <w:rPr>
-          <w:rFonts w:eastAsia="Times New Roman" w:cs="Times New Roman" w:ascii="Garamond" w:hAnsi="Garamond"/>
-          <w:color w:val="000000"/>
-          <w:kern w:val="0"/>
-          <w:sz w:val="36"/>
-          <w:szCs w:val="36"/>
-          <w:shd w:fill="auto" w:val="clear"/>
-          <w:lang w:val="en-US" w:eastAsia="zh-CN" w:bidi="hi-IN"/>
-        </w:rPr>
-        <w:t xml:space="preserve">nós </w:t>
-      </w:r>
-      <w:r>
-        <w:rPr>
-          <w:rFonts w:eastAsia="Times New Roman" w:cs="Times New Roman" w:ascii="Garamond" w:hAnsi="Garamond"/>
-          <w:color w:val="000000"/>
-          <w:kern w:val="0"/>
-          <w:sz w:val="36"/>
-          <w:szCs w:val="36"/>
-          <w:shd w:fill="auto" w:val="clear"/>
-          <w:lang w:val="en-US" w:eastAsia="zh-CN" w:bidi="hi-IN"/>
-        </w:rPr>
-        <w:t>ainda não</w:t>
-      </w:r>
-      <w:r>
-        <w:rPr>
-          <w:rFonts w:eastAsia="Times New Roman" w:cs="Times New Roman" w:ascii="Garamond" w:hAnsi="Garamond"/>
-          <w:color w:val="000000"/>
-          <w:kern w:val="0"/>
-          <w:sz w:val="36"/>
-          <w:szCs w:val="36"/>
-          <w:shd w:fill="auto" w:val="clear"/>
-          <w:lang w:val="en-US" w:eastAsia="zh-CN" w:bidi="hi-IN"/>
-        </w:rPr>
-        <w:t xml:space="preserve"> alcançamos o amor pŕoprio equilibrado demonstrado por Jesus e não é por fa</w:t>
-      </w:r>
-      <w:r>
-        <w:rPr>
-          <w:rFonts w:eastAsia="Times New Roman" w:cs="Times New Roman" w:ascii="Garamond" w:hAnsi="Garamond"/>
-          <w:color w:val="000000"/>
-          <w:kern w:val="0"/>
-          <w:sz w:val="36"/>
-          <w:szCs w:val="36"/>
-          <w:shd w:fill="auto" w:val="clear"/>
-          <w:lang w:val="en-US" w:eastAsia="zh-CN" w:bidi="hi-IN"/>
-        </w:rPr>
-        <w:t>lta de conhecimento, mas de dificuldade em aplicar o Evangelho à própria vida.</w:t>
+        <w:t>Infelizmente nós ainda não alcançamos o amor pŕoprio equilibrado demonstrado por Jesus e não é por falta de conhecimento, mas pela dificuldade em aplicar o Evangelho à própria vida.</w:t>
       </w:r>
     </w:p>
     <w:p>
@@ -5062,139 +4554,7 @@
           <w:shd w:fill="auto" w:val="clear"/>
           <w:lang w:val="en-US" w:eastAsia="zh-CN" w:bidi="hi-IN"/>
         </w:rPr>
-        <w:t>P</w:t>
-      </w:r>
-      <w:r>
-        <w:rPr>
-          <w:rFonts w:eastAsia="Times New Roman" w:cs="Times New Roman" w:ascii="Garamond" w:hAnsi="Garamond"/>
-          <w:color w:val="000000"/>
-          <w:kern w:val="0"/>
-          <w:sz w:val="36"/>
-          <w:szCs w:val="36"/>
-          <w:shd w:fill="auto" w:val="clear"/>
-          <w:lang w:val="en-US" w:eastAsia="zh-CN" w:bidi="hi-IN"/>
-        </w:rPr>
-        <w:t>or exemplo, quando alimentamos culpas intermináveis</w:t>
-      </w:r>
-      <w:r>
-        <w:rPr>
-          <w:rFonts w:eastAsia="Times New Roman" w:cs="Times New Roman" w:ascii="Garamond" w:hAnsi="Garamond"/>
-          <w:color w:val="000000"/>
-          <w:kern w:val="0"/>
-          <w:sz w:val="36"/>
-          <w:szCs w:val="36"/>
-          <w:shd w:fill="auto" w:val="clear"/>
-          <w:lang w:val="en-US" w:eastAsia="zh-CN" w:bidi="hi-IN"/>
-        </w:rPr>
-        <w:t>. R</w:t>
-      </w:r>
-      <w:r>
-        <w:rPr>
-          <w:rFonts w:eastAsia="Times New Roman" w:cs="Times New Roman" w:ascii="Garamond" w:hAnsi="Garamond"/>
-          <w:color w:val="000000"/>
-          <w:kern w:val="0"/>
-          <w:sz w:val="36"/>
-          <w:szCs w:val="36"/>
-          <w:shd w:fill="auto" w:val="clear"/>
-          <w:lang w:val="en-US" w:eastAsia="zh-CN" w:bidi="hi-IN"/>
-        </w:rPr>
-        <w:t xml:space="preserve">econhecer o erro é necessário, </w:t>
-      </w:r>
-      <w:r>
-        <w:rPr>
-          <w:rFonts w:eastAsia="Times New Roman" w:cs="Times New Roman" w:ascii="Garamond" w:hAnsi="Garamond"/>
-          <w:color w:val="000000"/>
-          <w:kern w:val="0"/>
-          <w:sz w:val="36"/>
-          <w:szCs w:val="36"/>
-          <w:shd w:fill="auto" w:val="clear"/>
-          <w:lang w:val="en-US" w:eastAsia="zh-CN" w:bidi="hi-IN"/>
-        </w:rPr>
-        <w:t xml:space="preserve"> </w:t>
-      </w:r>
-      <w:r>
-        <w:rPr>
-          <w:rFonts w:eastAsia="Times New Roman" w:cs="Times New Roman" w:ascii="Garamond" w:hAnsi="Garamond"/>
-          <w:color w:val="000000"/>
-          <w:kern w:val="0"/>
-          <w:sz w:val="36"/>
-          <w:szCs w:val="36"/>
-          <w:shd w:fill="auto" w:val="clear"/>
-          <w:lang w:val="en-US" w:eastAsia="zh-CN" w:bidi="hi-IN"/>
-        </w:rPr>
-        <w:t>mas permanecer preso à</w:t>
-      </w:r>
-      <w:r>
-        <w:rPr>
-          <w:rFonts w:eastAsia="Times New Roman" w:cs="Times New Roman" w:ascii="Garamond" w:hAnsi="Garamond"/>
-          <w:color w:val="000000"/>
-          <w:kern w:val="0"/>
-          <w:sz w:val="36"/>
-          <w:szCs w:val="36"/>
-          <w:shd w:fill="auto" w:val="clear"/>
-          <w:lang w:val="en-US" w:eastAsia="zh-CN" w:bidi="hi-IN"/>
-        </w:rPr>
-        <w:t xml:space="preserve"> ele</w:t>
-      </w:r>
-      <w:r>
-        <w:rPr>
-          <w:rFonts w:eastAsia="Times New Roman" w:cs="Times New Roman" w:ascii="Garamond" w:hAnsi="Garamond"/>
-          <w:color w:val="000000"/>
-          <w:kern w:val="0"/>
-          <w:sz w:val="36"/>
-          <w:szCs w:val="36"/>
-          <w:shd w:fill="auto" w:val="clear"/>
-          <w:lang w:val="en-US" w:eastAsia="zh-CN" w:bidi="hi-IN"/>
-        </w:rPr>
-        <w:t xml:space="preserve">, negando </w:t>
-      </w:r>
-      <w:r>
-        <w:rPr>
-          <w:rFonts w:eastAsia="Times New Roman" w:cs="Times New Roman" w:ascii="Garamond" w:hAnsi="Garamond"/>
-          <w:color w:val="000000"/>
-          <w:kern w:val="0"/>
-          <w:sz w:val="36"/>
-          <w:szCs w:val="36"/>
-          <w:shd w:fill="auto" w:val="clear"/>
-          <w:lang w:val="en-US" w:eastAsia="zh-CN" w:bidi="hi-IN"/>
-        </w:rPr>
-        <w:t>o autoperdão</w:t>
-      </w:r>
-      <w:r>
-        <w:rPr>
-          <w:rFonts w:eastAsia="Times New Roman" w:cs="Times New Roman" w:ascii="Garamond" w:hAnsi="Garamond"/>
-          <w:color w:val="000000"/>
-          <w:kern w:val="0"/>
-          <w:sz w:val="36"/>
-          <w:szCs w:val="36"/>
-          <w:shd w:fill="auto" w:val="clear"/>
-          <w:lang w:val="en-US" w:eastAsia="zh-CN" w:bidi="hi-IN"/>
-        </w:rPr>
-        <w:t xml:space="preserve"> é</w:t>
-      </w:r>
-      <w:r>
-        <w:rPr>
-          <w:rFonts w:eastAsia="Times New Roman" w:cs="Times New Roman" w:ascii="Garamond" w:hAnsi="Garamond"/>
-          <w:color w:val="000000"/>
-          <w:kern w:val="0"/>
-          <w:sz w:val="36"/>
-          <w:szCs w:val="36"/>
-          <w:shd w:fill="auto" w:val="clear"/>
-          <w:lang w:val="en-US" w:eastAsia="zh-CN" w:bidi="hi-IN"/>
-        </w:rPr>
-        <w:t xml:space="preserve"> </w:t>
-      </w:r>
-      <w:r>
-        <w:rPr>
-          <w:rFonts w:eastAsia="Times New Roman" w:cs="Times New Roman" w:ascii="Garamond" w:hAnsi="Garamond"/>
-          <w:color w:val="000000"/>
-          <w:kern w:val="0"/>
-          <w:sz w:val="36"/>
-          <w:szCs w:val="36"/>
-          <w:shd w:fill="auto" w:val="clear"/>
-          <w:lang w:val="en-US" w:eastAsia="zh-CN" w:bidi="hi-IN"/>
-        </w:rPr>
-        <w:t xml:space="preserve">impedir o próprio progresso. </w:t>
+        <w:t xml:space="preserve">Por exemplo, quando alimentamos culpas intermináveis. Reconhecer o erro é necessário,  mas permanecer preso à ele, negando o autoperdão é impedir o próprio progresso. </w:t>
       </w:r>
     </w:p>
     <w:p>
@@ -5247,7 +4607,7 @@
           <w:shd w:fill="auto" w:val="clear"/>
           <w:lang w:val="en-US" w:eastAsia="zh-CN" w:bidi="hi-IN"/>
         </w:rPr>
-        <w:t>Todos nós cometemos erros e quase todos nós já teve pelo menos uma vez na vida, o desejo de poder voltar no tempo e não cometer um determinado erro. Isso faz parte do nosso aprendizado.</w:t>
+        <w:t>Todos nós cometemos erros e quase todos nós já tivemos pelo menos uma vez na vida, aquele desejo de poder voltar no tempo e não cometer um determinado erro. Isso faz parte do nosso aprendizado.</w:t>
       </w:r>
     </w:p>
     <w:p>
@@ -5274,31 +4634,7 @@
           <w:shd w:fill="auto" w:val="clear"/>
           <w:lang w:val="en-US" w:eastAsia="zh-CN" w:bidi="hi-IN"/>
         </w:rPr>
-        <w:t xml:space="preserve">Reconhecer que erramos </w:t>
-      </w:r>
-      <w:r>
-        <w:rPr>
-          <w:rFonts w:eastAsia="Times New Roman" w:cs="Times New Roman" w:ascii="Garamond" w:hAnsi="Garamond"/>
-          <w:color w:val="000000"/>
-          <w:kern w:val="0"/>
-          <w:sz w:val="36"/>
-          <w:szCs w:val="36"/>
-          <w:shd w:fill="auto" w:val="clear"/>
-          <w:lang w:val="en-US" w:eastAsia="zh-CN" w:bidi="hi-IN"/>
-        </w:rPr>
-        <w:t>é</w:t>
-      </w:r>
-      <w:r>
-        <w:rPr>
-          <w:rFonts w:eastAsia="Times New Roman" w:cs="Times New Roman" w:ascii="Garamond" w:hAnsi="Garamond"/>
-          <w:color w:val="000000"/>
-          <w:kern w:val="0"/>
-          <w:sz w:val="36"/>
-          <w:szCs w:val="36"/>
-          <w:shd w:fill="auto" w:val="clear"/>
-          <w:lang w:val="en-US" w:eastAsia="zh-CN" w:bidi="hi-IN"/>
-        </w:rPr>
-        <w:t xml:space="preserve"> o primeiro e mais importante passo para corrigirmos aquele erro. Contudo, se não concedemos o perdão a nós mesmos, não teremos forças para repararmos aquele erro.  </w:t>
+        <w:t xml:space="preserve">Reconhecer que erramos é o primeiro e mais importante passo na solução de qualquer problema. Contudo, se não concedemos o perdão a nós mesmos, não teremos forças para repararmos aquele erro.  </w:t>
       </w:r>
     </w:p>
     <w:p>
@@ -5457,223 +4793,7 @@
           <w:shd w:fill="auto" w:val="clear"/>
           <w:lang w:val="en-US" w:eastAsia="zh-CN" w:bidi="hi-IN"/>
         </w:rPr>
-        <w:t>Outra dificuldade que nós temos: guardar</w:t>
-      </w:r>
-      <w:r>
-        <w:rPr>
-          <w:rFonts w:eastAsia="Times New Roman" w:cs="Times New Roman" w:ascii="Garamond" w:hAnsi="Garamond"/>
-          <w:color w:val="000000"/>
-          <w:kern w:val="0"/>
-          <w:sz w:val="36"/>
-          <w:szCs w:val="36"/>
-          <w:shd w:fill="auto" w:val="clear"/>
-          <w:lang w:val="en-US" w:eastAsia="zh-CN" w:bidi="hi-IN"/>
-        </w:rPr>
-        <w:t xml:space="preserve"> ressentimento</w:t>
-      </w:r>
-      <w:r>
-        <w:rPr>
-          <w:rFonts w:eastAsia="Times New Roman" w:cs="Times New Roman" w:ascii="Garamond" w:hAnsi="Garamond"/>
-          <w:color w:val="000000"/>
-          <w:kern w:val="0"/>
-          <w:sz w:val="36"/>
-          <w:szCs w:val="36"/>
-          <w:shd w:fill="auto" w:val="clear"/>
-          <w:lang w:val="en-US" w:eastAsia="zh-CN" w:bidi="hi-IN"/>
-        </w:rPr>
-        <w:t>s</w:t>
-      </w:r>
-      <w:r>
-        <w:rPr>
-          <w:rFonts w:eastAsia="Times New Roman" w:cs="Times New Roman" w:ascii="Garamond" w:hAnsi="Garamond"/>
-          <w:color w:val="000000"/>
-          <w:kern w:val="0"/>
-          <w:sz w:val="36"/>
-          <w:szCs w:val="36"/>
-          <w:shd w:fill="auto" w:val="clear"/>
-          <w:lang w:val="en-US" w:eastAsia="zh-CN" w:bidi="hi-IN"/>
-        </w:rPr>
-        <w:t>, mágoa</w:t>
-      </w:r>
-      <w:r>
-        <w:rPr>
-          <w:rFonts w:eastAsia="Times New Roman" w:cs="Times New Roman" w:ascii="Garamond" w:hAnsi="Garamond"/>
-          <w:color w:val="000000"/>
-          <w:kern w:val="0"/>
-          <w:sz w:val="36"/>
-          <w:szCs w:val="36"/>
-          <w:shd w:fill="auto" w:val="clear"/>
-          <w:lang w:val="en-US" w:eastAsia="zh-CN" w:bidi="hi-IN"/>
-        </w:rPr>
-        <w:t>s</w:t>
-      </w:r>
-      <w:r>
-        <w:rPr>
-          <w:rFonts w:eastAsia="Times New Roman" w:cs="Times New Roman" w:ascii="Garamond" w:hAnsi="Garamond"/>
-          <w:color w:val="000000"/>
-          <w:kern w:val="0"/>
-          <w:sz w:val="36"/>
-          <w:szCs w:val="36"/>
-          <w:shd w:fill="auto" w:val="clear"/>
-          <w:lang w:val="en-US" w:eastAsia="zh-CN" w:bidi="hi-IN"/>
-        </w:rPr>
-        <w:t xml:space="preserve"> ou ódio</w:t>
-      </w:r>
-      <w:r>
-        <w:rPr>
-          <w:rFonts w:eastAsia="Times New Roman" w:cs="Times New Roman" w:ascii="Garamond" w:hAnsi="Garamond"/>
-          <w:color w:val="000000"/>
-          <w:kern w:val="0"/>
-          <w:sz w:val="36"/>
-          <w:szCs w:val="36"/>
-          <w:shd w:fill="auto" w:val="clear"/>
-          <w:lang w:val="en-US" w:eastAsia="zh-CN" w:bidi="hi-IN"/>
-        </w:rPr>
-        <w:t>. Isso</w:t>
-      </w:r>
-      <w:r>
-        <w:rPr>
-          <w:rFonts w:eastAsia="Times New Roman" w:cs="Times New Roman" w:ascii="Garamond" w:hAnsi="Garamond"/>
-          <w:color w:val="000000"/>
-          <w:kern w:val="0"/>
-          <w:sz w:val="36"/>
-          <w:szCs w:val="36"/>
-          <w:shd w:fill="auto" w:val="clear"/>
-          <w:lang w:val="en-US" w:eastAsia="zh-CN" w:bidi="hi-IN"/>
-        </w:rPr>
-        <w:t xml:space="preserve"> é uma forma de autossabotagem</w:t>
-      </w:r>
-      <w:r>
-        <w:rPr>
-          <w:rFonts w:eastAsia="Times New Roman" w:cs="Times New Roman" w:ascii="Garamond" w:hAnsi="Garamond"/>
-          <w:color w:val="000000"/>
-          <w:kern w:val="0"/>
-          <w:sz w:val="36"/>
-          <w:szCs w:val="36"/>
-          <w:shd w:fill="auto" w:val="clear"/>
-          <w:lang w:val="en-US" w:eastAsia="zh-CN" w:bidi="hi-IN"/>
-        </w:rPr>
-        <w:t>. São</w:t>
-      </w:r>
-      <w:r>
-        <w:rPr>
-          <w:rFonts w:eastAsia="Times New Roman" w:cs="Times New Roman" w:ascii="Garamond" w:hAnsi="Garamond"/>
-          <w:color w:val="000000"/>
-          <w:kern w:val="0"/>
-          <w:sz w:val="36"/>
-          <w:szCs w:val="36"/>
-          <w:shd w:fill="auto" w:val="clear"/>
-          <w:lang w:val="en-US" w:eastAsia="zh-CN" w:bidi="hi-IN"/>
-        </w:rPr>
-        <w:t xml:space="preserve"> sentimentos </w:t>
-      </w:r>
-      <w:r>
-        <w:rPr>
-          <w:rFonts w:eastAsia="Times New Roman" w:cs="Times New Roman" w:ascii="Garamond" w:hAnsi="Garamond"/>
-          <w:color w:val="000000"/>
-          <w:kern w:val="0"/>
-          <w:sz w:val="36"/>
-          <w:szCs w:val="36"/>
-          <w:shd w:fill="auto" w:val="clear"/>
-          <w:lang w:val="en-US" w:eastAsia="zh-CN" w:bidi="hi-IN"/>
-        </w:rPr>
-        <w:t xml:space="preserve">que nos </w:t>
-      </w:r>
-      <w:r>
-        <w:rPr>
-          <w:rFonts w:eastAsia="Times New Roman" w:cs="Times New Roman" w:ascii="Garamond" w:hAnsi="Garamond"/>
-          <w:color w:val="000000"/>
-          <w:kern w:val="0"/>
-          <w:sz w:val="36"/>
-          <w:szCs w:val="36"/>
-          <w:shd w:fill="auto" w:val="clear"/>
-          <w:lang w:val="en-US" w:eastAsia="zh-CN" w:bidi="hi-IN"/>
-        </w:rPr>
-        <w:t>aprisionam ao passado</w:t>
-      </w:r>
-      <w:r>
-        <w:rPr>
-          <w:rFonts w:eastAsia="Times New Roman" w:cs="Times New Roman" w:ascii="Garamond" w:hAnsi="Garamond"/>
-          <w:color w:val="000000"/>
-          <w:kern w:val="0"/>
-          <w:sz w:val="36"/>
-          <w:szCs w:val="36"/>
-          <w:shd w:fill="auto" w:val="clear"/>
-          <w:lang w:val="en-US" w:eastAsia="zh-CN" w:bidi="hi-IN"/>
-        </w:rPr>
-        <w:t>, que causa</w:t>
-      </w:r>
-      <w:r>
-        <w:rPr>
-          <w:rFonts w:eastAsia="Times New Roman" w:cs="Times New Roman" w:ascii="Garamond" w:hAnsi="Garamond"/>
-          <w:color w:val="000000"/>
-          <w:kern w:val="0"/>
-          <w:sz w:val="36"/>
-          <w:szCs w:val="36"/>
-          <w:shd w:fill="auto" w:val="clear"/>
-          <w:lang w:val="en-US" w:eastAsia="zh-CN" w:bidi="hi-IN"/>
-        </w:rPr>
-        <w:t xml:space="preserve"> sofrimento </w:t>
-      </w:r>
-      <w:r>
-        <w:rPr>
-          <w:rFonts w:eastAsia="Times New Roman" w:cs="Times New Roman" w:ascii="Garamond" w:hAnsi="Garamond"/>
-          <w:color w:val="000000"/>
-          <w:kern w:val="0"/>
-          <w:sz w:val="36"/>
-          <w:szCs w:val="36"/>
-          <w:shd w:fill="auto" w:val="clear"/>
-          <w:lang w:val="en-US" w:eastAsia="zh-CN" w:bidi="hi-IN"/>
-        </w:rPr>
-        <w:t xml:space="preserve">excessivo, </w:t>
-      </w:r>
-      <w:r>
-        <w:rPr>
-          <w:rFonts w:eastAsia="Times New Roman" w:cs="Times New Roman" w:ascii="Garamond" w:hAnsi="Garamond"/>
-          <w:color w:val="000000"/>
-          <w:kern w:val="0"/>
-          <w:sz w:val="36"/>
-          <w:szCs w:val="36"/>
-          <w:shd w:fill="auto" w:val="clear"/>
-          <w:lang w:val="en-US" w:eastAsia="zh-CN" w:bidi="hi-IN"/>
-        </w:rPr>
-        <w:t>prolongado</w:t>
-      </w:r>
-      <w:r>
-        <w:rPr>
-          <w:rFonts w:eastAsia="Times New Roman" w:cs="Times New Roman" w:ascii="Garamond" w:hAnsi="Garamond"/>
-          <w:color w:val="000000"/>
-          <w:kern w:val="0"/>
-          <w:sz w:val="36"/>
-          <w:szCs w:val="36"/>
-          <w:shd w:fill="auto" w:val="clear"/>
-          <w:lang w:val="en-US" w:eastAsia="zh-CN" w:bidi="hi-IN"/>
-        </w:rPr>
-        <w:t xml:space="preserve"> e desnecessário, </w:t>
-      </w:r>
-      <w:r>
-        <w:rPr>
-          <w:rFonts w:eastAsia="Times New Roman" w:cs="Times New Roman" w:ascii="Garamond" w:hAnsi="Garamond"/>
-          <w:color w:val="000000"/>
-          <w:kern w:val="0"/>
-          <w:sz w:val="36"/>
-          <w:szCs w:val="36"/>
-          <w:shd w:fill="auto" w:val="clear"/>
-          <w:lang w:val="en-US" w:eastAsia="zh-CN" w:bidi="hi-IN"/>
-        </w:rPr>
-        <w:t xml:space="preserve">afetando </w:t>
-      </w:r>
-      <w:r>
-        <w:rPr>
-          <w:rFonts w:eastAsia="Times New Roman" w:cs="Times New Roman" w:ascii="Garamond" w:hAnsi="Garamond"/>
-          <w:color w:val="000000"/>
-          <w:kern w:val="0"/>
-          <w:sz w:val="36"/>
-          <w:szCs w:val="36"/>
-          <w:shd w:fill="auto" w:val="clear"/>
-          <w:lang w:val="en-US" w:eastAsia="zh-CN" w:bidi="hi-IN"/>
-        </w:rPr>
-        <w:t>primeiramente a nós mesmos.</w:t>
+        <w:t>Outra dificuldade que nós temos: guardar ressentimentos, mágoas ou ódio. Isso é uma forma de autossabotagem. São sentimentos que nos aprisionam ao passado, que causam sofrimento excessivo, prolongado e desnecessário, afetando primeiramente a nós mesmos.</w:t>
       </w:r>
     </w:p>
     <w:p>
@@ -5779,103 +4899,7 @@
           <w:shd w:fill="auto" w:val="clear"/>
           <w:lang w:val="en-US" w:eastAsia="zh-CN" w:bidi="hi-IN"/>
         </w:rPr>
-        <w:t xml:space="preserve">Também revelamos falta de amor </w:t>
-      </w:r>
-      <w:r>
-        <w:rPr>
-          <w:rFonts w:eastAsia="Times New Roman" w:cs="Times New Roman" w:ascii="Garamond" w:hAnsi="Garamond"/>
-          <w:color w:val="000000"/>
-          <w:kern w:val="0"/>
-          <w:sz w:val="36"/>
-          <w:szCs w:val="36"/>
-          <w:shd w:fill="auto" w:val="clear"/>
-          <w:lang w:val="en-US" w:eastAsia="zh-CN" w:bidi="hi-IN"/>
-        </w:rPr>
-        <w:t>próprio</w:t>
-      </w:r>
-      <w:r>
-        <w:rPr>
-          <w:rFonts w:eastAsia="Times New Roman" w:cs="Times New Roman" w:ascii="Garamond" w:hAnsi="Garamond"/>
-          <w:color w:val="000000"/>
-          <w:kern w:val="0"/>
-          <w:sz w:val="36"/>
-          <w:szCs w:val="36"/>
-          <w:shd w:fill="auto" w:val="clear"/>
-          <w:lang w:val="en-US" w:eastAsia="zh-CN" w:bidi="hi-IN"/>
-        </w:rPr>
-        <w:t xml:space="preserve"> quando </w:t>
-      </w:r>
-      <w:r>
-        <w:rPr>
-          <w:rFonts w:eastAsia="Times New Roman" w:cs="Times New Roman" w:ascii="Garamond" w:hAnsi="Garamond"/>
-          <w:color w:val="000000"/>
-          <w:kern w:val="0"/>
-          <w:sz w:val="36"/>
-          <w:szCs w:val="36"/>
-          <w:shd w:fill="auto" w:val="clear"/>
-          <w:lang w:val="en-US" w:eastAsia="zh-CN" w:bidi="hi-IN"/>
-        </w:rPr>
-        <w:t>insistimos em repetir</w:t>
-      </w:r>
-      <w:r>
-        <w:rPr>
-          <w:rFonts w:eastAsia="Times New Roman" w:cs="Times New Roman" w:ascii="Garamond" w:hAnsi="Garamond"/>
-          <w:color w:val="000000"/>
-          <w:kern w:val="0"/>
-          <w:sz w:val="36"/>
-          <w:szCs w:val="36"/>
-          <w:shd w:fill="auto" w:val="clear"/>
-          <w:lang w:val="en-US" w:eastAsia="zh-CN" w:bidi="hi-IN"/>
-        </w:rPr>
-        <w:t xml:space="preserve"> comportamentos que </w:t>
-      </w:r>
-      <w:r>
-        <w:rPr>
-          <w:rFonts w:eastAsia="Times New Roman" w:cs="Times New Roman" w:ascii="Garamond" w:hAnsi="Garamond"/>
-          <w:color w:val="000000"/>
-          <w:kern w:val="0"/>
-          <w:sz w:val="36"/>
-          <w:szCs w:val="36"/>
-          <w:shd w:fill="auto" w:val="clear"/>
-          <w:lang w:val="en-US" w:eastAsia="zh-CN" w:bidi="hi-IN"/>
-        </w:rPr>
-        <w:t xml:space="preserve">sabemos serem prejudiciais a nós; quando mantemos </w:t>
-      </w:r>
-      <w:r>
-        <w:rPr>
-          <w:rFonts w:eastAsia="Times New Roman" w:cs="Times New Roman" w:ascii="Garamond" w:hAnsi="Garamond"/>
-          <w:color w:val="000000"/>
-          <w:kern w:val="0"/>
-          <w:sz w:val="36"/>
-          <w:szCs w:val="36"/>
-          <w:shd w:fill="auto" w:val="clear"/>
-          <w:lang w:val="en-US" w:eastAsia="zh-CN" w:bidi="hi-IN"/>
-        </w:rPr>
-        <w:t xml:space="preserve">vícios, hábitos nocivos ou escolhas morais que </w:t>
-      </w:r>
-      <w:r>
-        <w:rPr>
-          <w:rFonts w:eastAsia="Times New Roman" w:cs="Times New Roman" w:ascii="Garamond" w:hAnsi="Garamond"/>
-          <w:color w:val="000000"/>
-          <w:kern w:val="0"/>
-          <w:sz w:val="36"/>
-          <w:szCs w:val="36"/>
-          <w:shd w:fill="auto" w:val="clear"/>
-          <w:lang w:val="en-US" w:eastAsia="zh-CN" w:bidi="hi-IN"/>
-        </w:rPr>
-        <w:t>agridem</w:t>
-      </w:r>
-      <w:r>
-        <w:rPr>
-          <w:rFonts w:eastAsia="Times New Roman" w:cs="Times New Roman" w:ascii="Garamond" w:hAnsi="Garamond"/>
-          <w:color w:val="000000"/>
-          <w:kern w:val="0"/>
-          <w:sz w:val="36"/>
-          <w:szCs w:val="36"/>
-          <w:shd w:fill="auto" w:val="clear"/>
-          <w:lang w:val="en-US" w:eastAsia="zh-CN" w:bidi="hi-IN"/>
-        </w:rPr>
-        <w:t xml:space="preserve"> o corpo e a alma. </w:t>
+        <w:t xml:space="preserve">Também revelamos falta de amor próprio quando insistimos em repetir comportamentos que sabemos serem prejudiciais a nós; quando mantemos vícios, hábitos nocivos ou escolhas morais que agridem o corpo e a alma. </w:t>
       </w:r>
     </w:p>
     <w:p>
@@ -5981,56 +5005,31 @@
           <w:shd w:fill="auto" w:val="clear"/>
           <w:lang w:val="en-US" w:eastAsia="zh-CN" w:bidi="hi-IN"/>
         </w:rPr>
-        <w:t>Há uma última questã</w:t>
-      </w:r>
-      <w:r>
-        <w:rPr>
-          <w:rFonts w:eastAsia="Times New Roman" w:cs="Times New Roman" w:ascii="Garamond" w:hAnsi="Garamond"/>
-          <w:color w:val="000000"/>
-          <w:kern w:val="0"/>
-          <w:sz w:val="36"/>
-          <w:szCs w:val="36"/>
-          <w:shd w:fill="auto" w:val="clear"/>
-          <w:lang w:val="en-US" w:eastAsia="zh-CN" w:bidi="hi-IN"/>
-        </w:rPr>
-        <w:t>o que precisamos abordar e que é tão importante quanto tudo o que foi dito até agora.</w:t>
-      </w:r>
-    </w:p>
-    <w:p>
-      <w:pPr>
-        <w:pStyle w:val="Normal"/>
-        <w:jc w:val="both"/>
-        <w:rPr>
-          <w:rFonts w:ascii="Garamond" w:hAnsi="Garamond" w:eastAsia="Times New Roman" w:cs="Times New Roman"/>
-          <w:kern w:val="0"/>
-          <w:sz w:val="36"/>
-          <w:szCs w:val="36"/>
-          <w:shd w:fill="auto" w:val="clear"/>
-          <w:lang w:val="en-US" w:eastAsia="zh-CN" w:bidi="hi-IN"/>
-        </w:rPr>
-      </w:pPr>
-      <w:r>
-        <w:rPr>
-          <w:color w:val="auto"/>
-        </w:rPr>
-      </w:r>
-    </w:p>
-    <w:p>
-      <w:pPr>
-        <w:pStyle w:val="Normal"/>
-        <w:jc w:val="both"/>
-        <w:rPr>
-          <w:rFonts w:ascii="Garamond" w:hAnsi="Garamond" w:eastAsia="Times New Roman" w:cs="Times New Roman"/>
-          <w:color w:val="1C99E0"/>
-          <w:kern w:val="0"/>
-          <w:sz w:val="36"/>
-          <w:szCs w:val="36"/>
-          <w:shd w:fill="auto" w:val="clear"/>
-          <w:lang w:val="en-US" w:eastAsia="zh-CN" w:bidi="hi-IN"/>
-        </w:rPr>
-      </w:pPr>
-      <w:r>
-        <w:rPr/>
+        <w:t>Há uma última questão que precisamos abordar e que é tão importante quanto tudo o que foi dito até agora.</w:t>
+      </w:r>
+    </w:p>
+    <w:p>
+      <w:pPr>
+        <w:pStyle w:val="Normal"/>
+        <w:jc w:val="both"/>
+        <w:rPr>
+          <w:rFonts w:ascii="Garamond" w:hAnsi="Garamond" w:eastAsia="Times New Roman" w:cs="Times New Roman"/>
+          <w:kern w:val="0"/>
+          <w:sz w:val="36"/>
+          <w:szCs w:val="36"/>
+          <w:shd w:fill="auto" w:val="clear"/>
+          <w:lang w:val="en-US" w:eastAsia="zh-CN" w:bidi="hi-IN"/>
+        </w:rPr>
+      </w:pPr>
+      <w:r>
+        <w:rPr>
+          <w:rFonts w:eastAsia="Times New Roman" w:cs="Times New Roman" w:ascii="Garamond" w:hAnsi="Garamond"/>
+          <w:kern w:val="0"/>
+          <w:sz w:val="36"/>
+          <w:szCs w:val="36"/>
+          <w:shd w:fill="auto" w:val="clear"/>
+          <w:lang w:val="en-US" w:eastAsia="zh-CN" w:bidi="hi-IN"/>
+        </w:rPr>
       </w:r>
     </w:p>
     <w:p>
@@ -6083,382 +5082,166 @@
           <w:shd w:fill="auto" w:val="clear"/>
           <w:lang w:val="en-US" w:eastAsia="zh-CN" w:bidi="hi-IN"/>
         </w:rPr>
-        <w:t xml:space="preserve"> -  Allan Kardec nos diz que </w:t>
-      </w:r>
-      <w:r>
-        <w:rPr>
-          <w:rFonts w:eastAsia="Times New Roman" w:cs="Times New Roman" w:ascii="Garamond" w:hAnsi="Garamond"/>
-          <w:color w:val="000000"/>
-          <w:kern w:val="0"/>
-          <w:sz w:val="36"/>
-          <w:szCs w:val="36"/>
-          <w:shd w:fill="auto" w:val="clear"/>
-          <w:lang w:val="en-US" w:eastAsia="zh-CN" w:bidi="hi-IN"/>
-        </w:rPr>
-        <w:t>vivemos em um</w:t>
-      </w:r>
-      <w:r>
-        <w:rPr>
-          <w:rFonts w:eastAsia="Times New Roman" w:cs="Times New Roman" w:ascii="Garamond" w:hAnsi="Garamond"/>
-          <w:color w:val="000000"/>
-          <w:kern w:val="0"/>
-          <w:sz w:val="36"/>
-          <w:szCs w:val="36"/>
-          <w:shd w:fill="auto" w:val="clear"/>
-          <w:lang w:val="en-US" w:eastAsia="zh-CN" w:bidi="hi-IN"/>
-        </w:rPr>
-        <w:t>a época em que, pela vontade de Deus, ocorrerão grandes acontecimentos para a regeneração da humanidade.</w:t>
-      </w:r>
-    </w:p>
-    <w:p>
-      <w:pPr>
-        <w:pStyle w:val="Normal"/>
-        <w:jc w:val="both"/>
-        <w:rPr>
-          <w:rFonts w:ascii="Garamond" w:hAnsi="Garamond" w:eastAsia="Times New Roman" w:cs="Times New Roman"/>
-          <w:color w:val="000000"/>
-          <w:kern w:val="0"/>
-          <w:sz w:val="36"/>
-          <w:szCs w:val="36"/>
-          <w:shd w:fill="auto" w:val="clear"/>
-          <w:lang w:val="en-US" w:eastAsia="zh-CN" w:bidi="hi-IN"/>
-        </w:rPr>
-      </w:pPr>
-      <w:r>
-        <w:rPr>
-          <w:rFonts w:eastAsia="Times New Roman" w:cs="Times New Roman" w:ascii="Garamond" w:hAnsi="Garamond"/>
-          <w:color w:val="000000"/>
-          <w:kern w:val="0"/>
-          <w:sz w:val="36"/>
-          <w:szCs w:val="36"/>
-          <w:shd w:fill="auto" w:val="clear"/>
-          <w:lang w:val="en-US" w:eastAsia="zh-CN" w:bidi="hi-IN"/>
-        </w:rPr>
-      </w:r>
-    </w:p>
-    <w:p>
-      <w:pPr>
-        <w:pStyle w:val="Normal"/>
-        <w:jc w:val="both"/>
-        <w:rPr>
-          <w:rFonts w:ascii="Garamond" w:hAnsi="Garamond" w:eastAsia="Times New Roman" w:cs="Times New Roman"/>
-          <w:color w:val="000000"/>
-          <w:kern w:val="0"/>
-          <w:sz w:val="36"/>
-          <w:szCs w:val="36"/>
-          <w:shd w:fill="auto" w:val="clear"/>
-          <w:lang w:val="en-US" w:eastAsia="zh-CN" w:bidi="hi-IN"/>
-        </w:rPr>
-      </w:pPr>
-      <w:r>
-        <w:rPr>
-          <w:rFonts w:eastAsia="Times New Roman" w:cs="Times New Roman" w:ascii="Garamond" w:hAnsi="Garamond"/>
-          <w:color w:val="000000"/>
-          <w:kern w:val="0"/>
-          <w:sz w:val="36"/>
-          <w:szCs w:val="36"/>
-          <w:shd w:fill="auto" w:val="clear"/>
-          <w:lang w:val="en-US" w:eastAsia="zh-CN" w:bidi="hi-IN"/>
-        </w:rPr>
-        <w:t xml:space="preserve">Entretanto, Kardec afirma que é </w:t>
-      </w:r>
-      <w:r>
-        <w:rPr>
-          <w:rFonts w:eastAsia="Times New Roman" w:cs="Times New Roman" w:ascii="Garamond" w:hAnsi="Garamond"/>
-          <w:color w:val="000000"/>
-          <w:kern w:val="0"/>
-          <w:sz w:val="36"/>
-          <w:szCs w:val="36"/>
-          <w:shd w:fill="auto" w:val="clear"/>
-          <w:lang w:val="en-US" w:eastAsia="zh-CN" w:bidi="hi-IN"/>
-        </w:rPr>
-        <w:t>um equívoco pensar que</w:t>
-      </w:r>
-      <w:r>
-        <w:rPr>
-          <w:rFonts w:eastAsia="Times New Roman" w:cs="Times New Roman" w:ascii="Garamond" w:hAnsi="Garamond"/>
-          <w:color w:val="000000"/>
-          <w:kern w:val="0"/>
-          <w:sz w:val="36"/>
-          <w:szCs w:val="36"/>
-          <w:shd w:fill="auto" w:val="clear"/>
-          <w:lang w:val="en-US" w:eastAsia="zh-CN" w:bidi="hi-IN"/>
-        </w:rPr>
-        <w:t xml:space="preserve"> grandes acontecimentos se darão exclusivamente por meio de cataclismos e desastres </w:t>
-      </w:r>
-      <w:r>
-        <w:rPr>
-          <w:rFonts w:eastAsia="Times New Roman" w:cs="Times New Roman" w:ascii="Garamond" w:hAnsi="Garamond"/>
-          <w:color w:val="000000"/>
-          <w:kern w:val="0"/>
-          <w:sz w:val="36"/>
-          <w:szCs w:val="36"/>
-          <w:shd w:fill="auto" w:val="clear"/>
-          <w:lang w:val="en-US" w:eastAsia="zh-CN" w:bidi="hi-IN"/>
-        </w:rPr>
-        <w:t>naturais.</w:t>
-      </w:r>
-    </w:p>
-    <w:p>
-      <w:pPr>
-        <w:pStyle w:val="Normal"/>
-        <w:jc w:val="both"/>
-        <w:rPr>
-          <w:rFonts w:ascii="Garamond" w:hAnsi="Garamond" w:eastAsia="Times New Roman" w:cs="Times New Roman"/>
-          <w:color w:val="000000"/>
-          <w:kern w:val="0"/>
-          <w:sz w:val="36"/>
-          <w:szCs w:val="36"/>
-          <w:shd w:fill="auto" w:val="clear"/>
-          <w:lang w:val="en-US" w:eastAsia="zh-CN" w:bidi="hi-IN"/>
-        </w:rPr>
-      </w:pPr>
-      <w:r>
-        <w:rPr>
-          <w:rFonts w:eastAsia="Times New Roman" w:cs="Times New Roman" w:ascii="Garamond" w:hAnsi="Garamond"/>
-          <w:color w:val="000000"/>
-          <w:kern w:val="0"/>
-          <w:sz w:val="36"/>
-          <w:szCs w:val="36"/>
-          <w:shd w:fill="auto" w:val="clear"/>
-          <w:lang w:val="en-US" w:eastAsia="zh-CN" w:bidi="hi-IN"/>
-        </w:rPr>
-      </w:r>
-    </w:p>
-    <w:p>
-      <w:pPr>
-        <w:pStyle w:val="Normal"/>
-        <w:jc w:val="both"/>
-        <w:rPr>
-          <w:rFonts w:ascii="Garamond" w:hAnsi="Garamond" w:eastAsia="Times New Roman" w:cs="Times New Roman"/>
-          <w:color w:val="000000"/>
-          <w:kern w:val="0"/>
-          <w:sz w:val="36"/>
-          <w:szCs w:val="36"/>
-          <w:shd w:fill="auto" w:val="clear"/>
-          <w:lang w:val="en-US" w:eastAsia="zh-CN" w:bidi="hi-IN"/>
-        </w:rPr>
-      </w:pPr>
-      <w:r>
-        <w:rPr>
-          <w:rFonts w:eastAsia="Times New Roman" w:cs="Times New Roman" w:ascii="Garamond" w:hAnsi="Garamond"/>
-          <w:color w:val="000000"/>
-          <w:kern w:val="0"/>
-          <w:sz w:val="36"/>
-          <w:szCs w:val="36"/>
-          <w:shd w:fill="auto" w:val="clear"/>
-          <w:lang w:val="en-US" w:eastAsia="zh-CN" w:bidi="hi-IN"/>
-        </w:rPr>
-        <w:t>O planeta Terra</w:t>
-      </w:r>
-      <w:r>
-        <w:rPr>
-          <w:rFonts w:eastAsia="Times New Roman" w:cs="Times New Roman" w:ascii="Garamond" w:hAnsi="Garamond"/>
-          <w:color w:val="000000"/>
-          <w:kern w:val="0"/>
-          <w:sz w:val="36"/>
-          <w:szCs w:val="36"/>
-          <w:shd w:fill="auto" w:val="clear"/>
-          <w:lang w:val="en-US" w:eastAsia="zh-CN" w:bidi="hi-IN"/>
-        </w:rPr>
-        <w:t xml:space="preserve"> também progride</w:t>
-      </w:r>
-      <w:r>
-        <w:rPr>
-          <w:rFonts w:eastAsia="Times New Roman" w:cs="Times New Roman" w:ascii="Garamond" w:hAnsi="Garamond"/>
-          <w:color w:val="000000"/>
-          <w:kern w:val="0"/>
-          <w:sz w:val="36"/>
-          <w:szCs w:val="36"/>
-          <w:shd w:fill="auto" w:val="clear"/>
-          <w:lang w:val="en-US" w:eastAsia="zh-CN" w:bidi="hi-IN"/>
-        </w:rPr>
-        <w:t xml:space="preserve"> f</w:t>
-      </w:r>
-      <w:r>
-        <w:rPr>
-          <w:rFonts w:eastAsia="Times New Roman" w:cs="Times New Roman" w:ascii="Garamond" w:hAnsi="Garamond"/>
-          <w:color w:val="000000"/>
-          <w:kern w:val="0"/>
-          <w:sz w:val="36"/>
-          <w:szCs w:val="36"/>
-          <w:shd w:fill="auto" w:val="clear"/>
-          <w:lang w:val="en-US" w:eastAsia="zh-CN" w:bidi="hi-IN"/>
-        </w:rPr>
-        <w:t>isicamente, e por isso s</w:t>
-      </w:r>
-      <w:r>
-        <w:rPr>
-          <w:rFonts w:eastAsia="Times New Roman" w:cs="Times New Roman" w:ascii="Garamond" w:hAnsi="Garamond"/>
-          <w:color w:val="000000"/>
-          <w:kern w:val="0"/>
-          <w:sz w:val="36"/>
-          <w:szCs w:val="36"/>
-          <w:shd w:fill="auto" w:val="clear"/>
-          <w:lang w:val="en-US" w:eastAsia="zh-CN" w:bidi="hi-IN"/>
-        </w:rPr>
-        <w:t xml:space="preserve">eus elementos passam por transformações. Entretanto, é </w:t>
-      </w:r>
-      <w:r>
-        <w:rPr>
-          <w:rFonts w:eastAsia="Times New Roman" w:cs="Times New Roman" w:ascii="Garamond" w:hAnsi="Garamond"/>
-          <w:color w:val="000000"/>
-          <w:kern w:val="0"/>
-          <w:sz w:val="36"/>
-          <w:szCs w:val="36"/>
-          <w:shd w:fill="auto" w:val="clear"/>
-          <w:lang w:val="en-US" w:eastAsia="zh-CN" w:bidi="hi-IN"/>
-        </w:rPr>
-        <w:t>a transformação da humanidade que realmente nos interessa. O homem evolui pelo desenvolvimento da inteligência e pela depuração do senso moral e dos sentimentos.</w:t>
-      </w:r>
-    </w:p>
-    <w:p>
-      <w:pPr>
-        <w:pStyle w:val="Normal"/>
-        <w:jc w:val="both"/>
-        <w:rPr>
-          <w:rFonts w:ascii="Garamond" w:hAnsi="Garamond" w:eastAsia="Times New Roman" w:cs="Times New Roman"/>
-          <w:color w:val="000000"/>
-          <w:kern w:val="0"/>
-          <w:sz w:val="36"/>
-          <w:szCs w:val="36"/>
-          <w:shd w:fill="auto" w:val="clear"/>
-          <w:lang w:val="en-US" w:eastAsia="zh-CN" w:bidi="hi-IN"/>
-        </w:rPr>
-      </w:pPr>
-      <w:r>
-        <w:rPr>
-          <w:rFonts w:eastAsia="Times New Roman" w:cs="Times New Roman" w:ascii="Garamond" w:hAnsi="Garamond"/>
-          <w:color w:val="000000"/>
-          <w:kern w:val="0"/>
-          <w:sz w:val="36"/>
-          <w:szCs w:val="36"/>
-          <w:shd w:fill="auto" w:val="clear"/>
-          <w:lang w:val="en-US" w:eastAsia="zh-CN" w:bidi="hi-IN"/>
-        </w:rPr>
-      </w:r>
-    </w:p>
-    <w:p>
-      <w:pPr>
-        <w:pStyle w:val="Normal"/>
-        <w:jc w:val="both"/>
-        <w:rPr>
-          <w:rFonts w:ascii="Garamond" w:hAnsi="Garamond" w:eastAsia="Times New Roman" w:cs="Times New Roman"/>
-          <w:color w:val="000000"/>
-          <w:kern w:val="0"/>
-          <w:sz w:val="36"/>
-          <w:szCs w:val="36"/>
-          <w:shd w:fill="auto" w:val="clear"/>
-          <w:lang w:val="en-US" w:eastAsia="zh-CN" w:bidi="hi-IN"/>
-        </w:rPr>
-      </w:pPr>
-      <w:r>
-        <w:rPr>
-          <w:rFonts w:eastAsia="Times New Roman" w:cs="Times New Roman" w:ascii="Garamond" w:hAnsi="Garamond"/>
-          <w:color w:val="000000"/>
-          <w:kern w:val="0"/>
-          <w:sz w:val="36"/>
-          <w:szCs w:val="36"/>
-          <w:shd w:fill="auto" w:val="clear"/>
-          <w:lang w:val="en-US" w:eastAsia="zh-CN" w:bidi="hi-IN"/>
-        </w:rPr>
-        <w:t xml:space="preserve">Nos dias </w:t>
-      </w:r>
-      <w:r>
-        <w:rPr>
-          <w:rFonts w:eastAsia="Times New Roman" w:cs="Times New Roman" w:ascii="Garamond" w:hAnsi="Garamond"/>
-          <w:color w:val="000000"/>
-          <w:kern w:val="0"/>
-          <w:sz w:val="36"/>
-          <w:szCs w:val="36"/>
-          <w:shd w:fill="auto" w:val="clear"/>
-          <w:lang w:val="en-US" w:eastAsia="zh-CN" w:bidi="hi-IN"/>
-        </w:rPr>
-        <w:t>atuais</w:t>
-      </w:r>
-      <w:r>
-        <w:rPr>
-          <w:rFonts w:eastAsia="Times New Roman" w:cs="Times New Roman" w:ascii="Garamond" w:hAnsi="Garamond"/>
-          <w:color w:val="000000"/>
-          <w:kern w:val="0"/>
-          <w:sz w:val="36"/>
-          <w:szCs w:val="36"/>
-          <w:shd w:fill="auto" w:val="clear"/>
-          <w:lang w:val="en-US" w:eastAsia="zh-CN" w:bidi="hi-IN"/>
-        </w:rPr>
-        <w:t xml:space="preserve"> percebemos claramente que a humanidade evoluiu muito intelectualmente, mas </w:t>
-      </w:r>
-      <w:r>
-        <w:rPr>
-          <w:rFonts w:eastAsia="Times New Roman" w:cs="Times New Roman" w:ascii="Garamond" w:hAnsi="Garamond"/>
-          <w:color w:val="000000"/>
-          <w:kern w:val="0"/>
-          <w:sz w:val="36"/>
-          <w:szCs w:val="36"/>
-          <w:shd w:fill="auto" w:val="clear"/>
-          <w:lang w:val="en-US" w:eastAsia="zh-CN" w:bidi="hi-IN"/>
-        </w:rPr>
-        <w:t>não realizamos o mesmo progresso no campo moral.</w:t>
-      </w:r>
-      <w:r>
-        <w:rPr>
-          <w:rFonts w:eastAsia="Times New Roman" w:cs="Times New Roman" w:ascii="Garamond" w:hAnsi="Garamond"/>
-          <w:color w:val="000000"/>
-          <w:kern w:val="0"/>
-          <w:sz w:val="36"/>
-          <w:szCs w:val="36"/>
-          <w:shd w:fill="auto" w:val="clear"/>
-          <w:lang w:val="en-US" w:eastAsia="zh-CN" w:bidi="hi-IN"/>
-        </w:rPr>
-        <w:t xml:space="preserve"> O  avanç</w:t>
-      </w:r>
-      <w:r>
-        <w:rPr>
-          <w:rFonts w:eastAsia="Times New Roman" w:cs="Times New Roman" w:ascii="Garamond" w:hAnsi="Garamond"/>
-          <w:color w:val="000000"/>
-          <w:kern w:val="0"/>
-          <w:sz w:val="36"/>
-          <w:szCs w:val="36"/>
-          <w:shd w:fill="auto" w:val="clear"/>
-          <w:lang w:val="en-US" w:eastAsia="zh-CN" w:bidi="hi-IN"/>
-        </w:rPr>
-        <w:t>o</w:t>
-      </w:r>
-      <w:r>
-        <w:rPr>
-          <w:rFonts w:eastAsia="Times New Roman" w:cs="Times New Roman" w:ascii="Garamond" w:hAnsi="Garamond"/>
-          <w:color w:val="000000"/>
-          <w:kern w:val="0"/>
-          <w:sz w:val="36"/>
-          <w:szCs w:val="36"/>
-          <w:shd w:fill="auto" w:val="clear"/>
-          <w:lang w:val="en-US" w:eastAsia="zh-CN" w:bidi="hi-IN"/>
-        </w:rPr>
-        <w:t xml:space="preserve"> intelectual nos </w:t>
-      </w:r>
-      <w:r>
-        <w:rPr>
-          <w:rFonts w:eastAsia="Times New Roman" w:cs="Times New Roman" w:ascii="Garamond" w:hAnsi="Garamond"/>
-          <w:color w:val="000000"/>
-          <w:kern w:val="0"/>
-          <w:sz w:val="36"/>
-          <w:szCs w:val="36"/>
-          <w:shd w:fill="auto" w:val="clear"/>
-          <w:lang w:val="en-US" w:eastAsia="zh-CN" w:bidi="hi-IN"/>
-        </w:rPr>
-        <w:t>trouxe conforto, melhorou nossa medicina, encurtou distâncias e permite que nos comuniquemos com</w:t>
-      </w:r>
-      <w:r>
-        <w:rPr>
-          <w:rFonts w:eastAsia="Times New Roman" w:cs="Times New Roman" w:ascii="Garamond" w:hAnsi="Garamond"/>
-          <w:color w:val="000000"/>
-          <w:kern w:val="0"/>
-          <w:sz w:val="36"/>
-          <w:szCs w:val="36"/>
-          <w:shd w:fill="auto" w:val="clear"/>
-          <w:lang w:val="en-US" w:eastAsia="zh-CN" w:bidi="hi-IN"/>
-        </w:rPr>
-        <w:t xml:space="preserve"> o mundo todo quase que instantaneamente. </w:t>
+        <w:t xml:space="preserve"> -  Allan Kardec nos diz que vivemos em uma época em que, pela vontade de Deus, ocorrerão grandes acontecimentos para a regeneração da humanidade.</w:t>
+      </w:r>
+    </w:p>
+    <w:p>
+      <w:pPr>
+        <w:pStyle w:val="Normal"/>
+        <w:jc w:val="both"/>
+        <w:rPr>
+          <w:rFonts w:ascii="Garamond" w:hAnsi="Garamond" w:eastAsia="Times New Roman" w:cs="Times New Roman"/>
+          <w:color w:val="000000"/>
+          <w:kern w:val="0"/>
+          <w:sz w:val="36"/>
+          <w:szCs w:val="36"/>
+          <w:shd w:fill="auto" w:val="clear"/>
+          <w:lang w:val="en-US" w:eastAsia="zh-CN" w:bidi="hi-IN"/>
+        </w:rPr>
+      </w:pPr>
+      <w:r>
+        <w:rPr>
+          <w:rFonts w:eastAsia="Times New Roman" w:cs="Times New Roman" w:ascii="Garamond" w:hAnsi="Garamond"/>
+          <w:color w:val="000000"/>
+          <w:kern w:val="0"/>
+          <w:sz w:val="36"/>
+          <w:szCs w:val="36"/>
+          <w:shd w:fill="auto" w:val="clear"/>
+          <w:lang w:val="en-US" w:eastAsia="zh-CN" w:bidi="hi-IN"/>
+        </w:rPr>
+      </w:r>
+    </w:p>
+    <w:p>
+      <w:pPr>
+        <w:pStyle w:val="Normal"/>
+        <w:jc w:val="both"/>
+        <w:rPr>
+          <w:rFonts w:ascii="Garamond" w:hAnsi="Garamond" w:eastAsia="Times New Roman" w:cs="Times New Roman"/>
+          <w:color w:val="000000"/>
+          <w:kern w:val="0"/>
+          <w:sz w:val="36"/>
+          <w:szCs w:val="36"/>
+          <w:shd w:fill="auto" w:val="clear"/>
+          <w:lang w:val="en-US" w:eastAsia="zh-CN" w:bidi="hi-IN"/>
+        </w:rPr>
+      </w:pPr>
+      <w:r>
+        <w:rPr>
+          <w:rFonts w:eastAsia="Times New Roman" w:cs="Times New Roman" w:ascii="Garamond" w:hAnsi="Garamond"/>
+          <w:color w:val="000000"/>
+          <w:kern w:val="0"/>
+          <w:sz w:val="36"/>
+          <w:szCs w:val="36"/>
+          <w:shd w:fill="auto" w:val="clear"/>
+          <w:lang w:val="en-US" w:eastAsia="zh-CN" w:bidi="hi-IN"/>
+        </w:rPr>
+        <w:t>Entretanto, Kardec afirma que é um equívoco pensar que grandes acontecimentos se darão exclusivamente por meio de cataclismos e desastres naturais.</w:t>
+      </w:r>
+    </w:p>
+    <w:p>
+      <w:pPr>
+        <w:pStyle w:val="Normal"/>
+        <w:jc w:val="both"/>
+        <w:rPr>
+          <w:rFonts w:ascii="Garamond" w:hAnsi="Garamond" w:eastAsia="Times New Roman" w:cs="Times New Roman"/>
+          <w:color w:val="000000"/>
+          <w:kern w:val="0"/>
+          <w:sz w:val="36"/>
+          <w:szCs w:val="36"/>
+          <w:shd w:fill="auto" w:val="clear"/>
+          <w:lang w:val="en-US" w:eastAsia="zh-CN" w:bidi="hi-IN"/>
+        </w:rPr>
+      </w:pPr>
+      <w:r>
+        <w:rPr>
+          <w:rFonts w:eastAsia="Times New Roman" w:cs="Times New Roman" w:ascii="Garamond" w:hAnsi="Garamond"/>
+          <w:color w:val="000000"/>
+          <w:kern w:val="0"/>
+          <w:sz w:val="36"/>
+          <w:szCs w:val="36"/>
+          <w:shd w:fill="auto" w:val="clear"/>
+          <w:lang w:val="en-US" w:eastAsia="zh-CN" w:bidi="hi-IN"/>
+        </w:rPr>
+      </w:r>
+    </w:p>
+    <w:p>
+      <w:pPr>
+        <w:pStyle w:val="Normal"/>
+        <w:jc w:val="both"/>
+        <w:rPr>
+          <w:rFonts w:ascii="Garamond" w:hAnsi="Garamond" w:eastAsia="Times New Roman" w:cs="Times New Roman"/>
+          <w:color w:val="000000"/>
+          <w:kern w:val="0"/>
+          <w:sz w:val="36"/>
+          <w:szCs w:val="36"/>
+          <w:shd w:fill="auto" w:val="clear"/>
+          <w:lang w:val="en-US" w:eastAsia="zh-CN" w:bidi="hi-IN"/>
+        </w:rPr>
+      </w:pPr>
+      <w:r>
+        <w:rPr>
+          <w:rFonts w:eastAsia="Times New Roman" w:cs="Times New Roman" w:ascii="Garamond" w:hAnsi="Garamond"/>
+          <w:color w:val="000000"/>
+          <w:kern w:val="0"/>
+          <w:sz w:val="36"/>
+          <w:szCs w:val="36"/>
+          <w:shd w:fill="auto" w:val="clear"/>
+          <w:lang w:val="en-US" w:eastAsia="zh-CN" w:bidi="hi-IN"/>
+        </w:rPr>
+        <w:t>O planeta Terra também progride fisicamente, e por isso seus elementos passam por transformações. Entretanto, é a transformação da humanidade que realmente nos interessa. O homem evolui pelo desenvolvimento da inteligência e pela depuração do senso moral e dos sentimentos.</w:t>
+      </w:r>
+    </w:p>
+    <w:p>
+      <w:pPr>
+        <w:pStyle w:val="Normal"/>
+        <w:jc w:val="both"/>
+        <w:rPr>
+          <w:rFonts w:ascii="Garamond" w:hAnsi="Garamond" w:eastAsia="Times New Roman" w:cs="Times New Roman"/>
+          <w:color w:val="000000"/>
+          <w:kern w:val="0"/>
+          <w:sz w:val="36"/>
+          <w:szCs w:val="36"/>
+          <w:shd w:fill="auto" w:val="clear"/>
+          <w:lang w:val="en-US" w:eastAsia="zh-CN" w:bidi="hi-IN"/>
+        </w:rPr>
+      </w:pPr>
+      <w:r>
+        <w:rPr>
+          <w:rFonts w:eastAsia="Times New Roman" w:cs="Times New Roman" w:ascii="Garamond" w:hAnsi="Garamond"/>
+          <w:color w:val="000000"/>
+          <w:kern w:val="0"/>
+          <w:sz w:val="36"/>
+          <w:szCs w:val="36"/>
+          <w:shd w:fill="auto" w:val="clear"/>
+          <w:lang w:val="en-US" w:eastAsia="zh-CN" w:bidi="hi-IN"/>
+        </w:rPr>
+      </w:r>
+    </w:p>
+    <w:p>
+      <w:pPr>
+        <w:pStyle w:val="Normal"/>
+        <w:jc w:val="both"/>
+        <w:rPr>
+          <w:rFonts w:ascii="Garamond" w:hAnsi="Garamond" w:eastAsia="Times New Roman" w:cs="Times New Roman"/>
+          <w:color w:val="000000"/>
+          <w:kern w:val="0"/>
+          <w:sz w:val="36"/>
+          <w:szCs w:val="36"/>
+          <w:shd w:fill="auto" w:val="clear"/>
+          <w:lang w:val="en-US" w:eastAsia="zh-CN" w:bidi="hi-IN"/>
+        </w:rPr>
+      </w:pPr>
+      <w:r>
+        <w:rPr>
+          <w:rFonts w:eastAsia="Times New Roman" w:cs="Times New Roman" w:ascii="Garamond" w:hAnsi="Garamond"/>
+          <w:color w:val="000000"/>
+          <w:kern w:val="0"/>
+          <w:sz w:val="36"/>
+          <w:szCs w:val="36"/>
+          <w:shd w:fill="auto" w:val="clear"/>
+          <w:lang w:val="en-US" w:eastAsia="zh-CN" w:bidi="hi-IN"/>
+        </w:rPr>
+        <w:t xml:space="preserve">Nos dias atuais percebemos claramente que a humanidade evoluiu muito intelectualmente, mas não realizamos o mesmo progresso no campo moral. O  avanço intelectual nos trouxe conforto, melhorou nossa medicina, encurtou distâncias e permite que nos comuniquemos com o mundo todo quase que instantaneamente. </w:t>
       </w:r>
     </w:p>
     <w:p>
@@ -6617,79 +5400,7 @@
           <w:shd w:fill="auto" w:val="clear"/>
           <w:lang w:val="en-US" w:eastAsia="zh-CN" w:bidi="hi-IN"/>
         </w:rPr>
-        <w:t xml:space="preserve">Nós, que já esboçamos algum desejo de evoluir com o planeta, olhamos para o caos que se estabeleceu ao nosso redor e dizemos: "não é possível que a humanidade esteja realmente evoluindo. Já se passaram 157 </w:t>
-      </w:r>
-      <w:r>
-        <w:rPr>
-          <w:rFonts w:eastAsia="Times New Roman" w:cs="Times New Roman" w:ascii="Garamond" w:hAnsi="Garamond"/>
-          <w:color w:val="000000"/>
-          <w:kern w:val="0"/>
-          <w:sz w:val="36"/>
-          <w:szCs w:val="36"/>
-          <w:shd w:fill="auto" w:val="clear"/>
-          <w:lang w:val="en-US" w:eastAsia="zh-CN" w:bidi="hi-IN"/>
-        </w:rPr>
-        <w:t xml:space="preserve">anos </w:t>
-      </w:r>
-      <w:r>
-        <w:rPr>
-          <w:rFonts w:eastAsia="Times New Roman" w:cs="Times New Roman" w:ascii="Garamond" w:hAnsi="Garamond"/>
-          <w:color w:val="000000"/>
-          <w:kern w:val="0"/>
-          <w:sz w:val="36"/>
-          <w:szCs w:val="36"/>
-          <w:shd w:fill="auto" w:val="clear"/>
-          <w:lang w:val="en-US" w:eastAsia="zh-CN" w:bidi="hi-IN"/>
-        </w:rPr>
-        <w:t xml:space="preserve">desde que A Gênese foi escrita e só vemos as coisas piorarem. </w:t>
-      </w:r>
-      <w:r>
-        <w:rPr>
-          <w:rFonts w:eastAsia="Times New Roman" w:cs="Times New Roman" w:ascii="Garamond" w:hAnsi="Garamond"/>
-          <w:color w:val="000000"/>
-          <w:kern w:val="0"/>
-          <w:sz w:val="36"/>
-          <w:szCs w:val="36"/>
-          <w:shd w:fill="auto" w:val="clear"/>
-          <w:lang w:val="en-US" w:eastAsia="zh-CN" w:bidi="hi-IN"/>
-        </w:rPr>
-        <w:t>E</w:t>
-      </w:r>
-      <w:r>
-        <w:rPr>
-          <w:rFonts w:eastAsia="Times New Roman" w:cs="Times New Roman" w:ascii="Garamond" w:hAnsi="Garamond"/>
-          <w:color w:val="000000"/>
-          <w:kern w:val="0"/>
-          <w:sz w:val="36"/>
-          <w:szCs w:val="36"/>
-          <w:shd w:fill="auto" w:val="clear"/>
-          <w:lang w:val="en-US" w:eastAsia="zh-CN" w:bidi="hi-IN"/>
-        </w:rPr>
-        <w:t xml:space="preserve">sses tempos dos quais Kardec fala </w:t>
-      </w:r>
-      <w:r>
-        <w:rPr>
-          <w:rFonts w:eastAsia="Times New Roman" w:cs="Times New Roman" w:ascii="Garamond" w:hAnsi="Garamond"/>
-          <w:color w:val="000000"/>
-          <w:kern w:val="0"/>
-          <w:sz w:val="36"/>
-          <w:szCs w:val="36"/>
-          <w:shd w:fill="auto" w:val="clear"/>
-          <w:lang w:val="en-US" w:eastAsia="zh-CN" w:bidi="hi-IN"/>
-        </w:rPr>
-        <w:t>não podem realmente ter</w:t>
-      </w:r>
-      <w:r>
-        <w:rPr>
-          <w:rFonts w:eastAsia="Times New Roman" w:cs="Times New Roman" w:ascii="Garamond" w:hAnsi="Garamond"/>
-          <w:color w:val="000000"/>
-          <w:kern w:val="0"/>
-          <w:sz w:val="36"/>
-          <w:szCs w:val="36"/>
-          <w:shd w:fill="auto" w:val="clear"/>
-          <w:lang w:val="en-US" w:eastAsia="zh-CN" w:bidi="hi-IN"/>
-        </w:rPr>
-        <w:t xml:space="preserve"> chegado".</w:t>
+        <w:t>Nós, que já esboçamos algum desejo de evoluir com o planeta, olhamos para o caos que se estabeleceu ao nosso redor e dizemos: "Não é possível que a humanidade esteja realmente evoluindo. Já se passaram 157 anos desde que A Gênese foi escrita e só vemos as coisas piorarem. Esses tempos dos quais Kardec fala não podem realmente ter chegado".</w:t>
       </w:r>
     </w:p>
     <w:p>
@@ -6769,233 +5480,113 @@
           <w:shd w:fill="auto" w:val="clear"/>
           <w:lang w:val="en-US" w:eastAsia="zh-CN" w:bidi="hi-IN"/>
         </w:rPr>
-        <w:t>Kardec nos esclarece que quando a Humanidade está madura para subir um degrau, ou seja, quando a humanidade já recebeu conhecimento suficiente para elevar-se um pouco mais, então pode dizer-se que são chegados os tempos marcados por Deus</w:t>
-      </w:r>
-      <w:r>
-        <w:rPr>
-          <w:rFonts w:eastAsia="Times New Roman" w:cs="Times New Roman" w:ascii="Garamond" w:hAnsi="Garamond"/>
-          <w:color w:val="000000"/>
-          <w:kern w:val="0"/>
-          <w:sz w:val="36"/>
-          <w:szCs w:val="36"/>
-          <w:shd w:fill="auto" w:val="clear"/>
-          <w:lang w:val="en-US" w:eastAsia="zh-CN" w:bidi="hi-IN"/>
-        </w:rPr>
-        <w:t xml:space="preserve"> para aquela fase da humanidade</w:t>
-      </w:r>
-      <w:r>
-        <w:rPr>
-          <w:rFonts w:eastAsia="Times New Roman" w:cs="Times New Roman" w:ascii="Garamond" w:hAnsi="Garamond"/>
-          <w:color w:val="000000"/>
-          <w:kern w:val="0"/>
-          <w:sz w:val="36"/>
-          <w:szCs w:val="36"/>
-          <w:shd w:fill="auto" w:val="clear"/>
-          <w:lang w:val="en-US" w:eastAsia="zh-CN" w:bidi="hi-IN"/>
-        </w:rPr>
-        <w:t>.</w:t>
-      </w:r>
-    </w:p>
-    <w:p>
-      <w:pPr>
-        <w:pStyle w:val="Normal"/>
-        <w:jc w:val="both"/>
-        <w:rPr>
-          <w:rFonts w:ascii="Garamond" w:hAnsi="Garamond" w:eastAsia="Times New Roman" w:cs="Times New Roman"/>
-          <w:color w:val="000000"/>
-          <w:kern w:val="0"/>
-          <w:sz w:val="36"/>
-          <w:szCs w:val="36"/>
-          <w:shd w:fill="auto" w:val="clear"/>
-          <w:lang w:val="en-US" w:eastAsia="zh-CN" w:bidi="hi-IN"/>
-        </w:rPr>
-      </w:pPr>
-      <w:r>
-        <w:rPr>
-          <w:rFonts w:eastAsia="Times New Roman" w:cs="Times New Roman" w:ascii="Garamond" w:hAnsi="Garamond"/>
-          <w:color w:val="000000"/>
-          <w:kern w:val="0"/>
-          <w:sz w:val="36"/>
-          <w:szCs w:val="36"/>
-          <w:shd w:fill="auto" w:val="clear"/>
-          <w:lang w:val="en-US" w:eastAsia="zh-CN" w:bidi="hi-IN"/>
-        </w:rPr>
-      </w:r>
-    </w:p>
-    <w:p>
-      <w:pPr>
-        <w:pStyle w:val="Normal"/>
-        <w:jc w:val="both"/>
-        <w:rPr>
-          <w:rFonts w:ascii="Garamond" w:hAnsi="Garamond" w:eastAsia="Times New Roman" w:cs="Times New Roman"/>
-          <w:color w:val="000000"/>
-          <w:kern w:val="0"/>
-          <w:sz w:val="36"/>
-          <w:szCs w:val="36"/>
-          <w:shd w:fill="auto" w:val="clear"/>
-          <w:lang w:val="en-US" w:eastAsia="zh-CN" w:bidi="hi-IN"/>
-        </w:rPr>
-      </w:pPr>
-      <w:r>
-        <w:rPr>
-          <w:rFonts w:eastAsia="Times New Roman" w:cs="Times New Roman" w:ascii="Garamond" w:hAnsi="Garamond"/>
-          <w:color w:val="000000"/>
-          <w:kern w:val="0"/>
-          <w:sz w:val="36"/>
-          <w:szCs w:val="36"/>
-          <w:shd w:fill="auto" w:val="clear"/>
-          <w:lang w:val="en-US" w:eastAsia="zh-CN" w:bidi="hi-IN"/>
-        </w:rPr>
-        <w:t>Disse ainda Kardec que haveria uma grande transformação moral da humanidade, mas isso não acontecer</w:t>
-      </w:r>
-      <w:r>
-        <w:rPr>
-          <w:rFonts w:eastAsia="Times New Roman" w:cs="Times New Roman" w:ascii="Garamond" w:hAnsi="Garamond"/>
-          <w:color w:val="000000"/>
-          <w:kern w:val="0"/>
-          <w:sz w:val="36"/>
-          <w:szCs w:val="36"/>
-          <w:shd w:fill="auto" w:val="clear"/>
-          <w:lang w:val="en-US" w:eastAsia="zh-CN" w:bidi="hi-IN"/>
-        </w:rPr>
-        <w:t xml:space="preserve">ia </w:t>
-      </w:r>
-      <w:r>
-        <w:rPr>
-          <w:rFonts w:eastAsia="Times New Roman" w:cs="Times New Roman" w:ascii="Garamond" w:hAnsi="Garamond"/>
-          <w:color w:val="000000"/>
-          <w:kern w:val="0"/>
-          <w:sz w:val="36"/>
-          <w:szCs w:val="36"/>
-          <w:shd w:fill="auto" w:val="clear"/>
-          <w:lang w:val="en-US" w:eastAsia="zh-CN" w:bidi="hi-IN"/>
-        </w:rPr>
-        <w:t>de maneira suave. Haveria lutas de ideias e perturbações até que todas as coisas se assentem. As catá</w:t>
-      </w:r>
-      <w:r>
-        <w:rPr>
-          <w:rFonts w:eastAsia="Times New Roman" w:cs="Times New Roman" w:ascii="Garamond" w:hAnsi="Garamond"/>
-          <w:color w:val="000000"/>
-          <w:kern w:val="0"/>
-          <w:sz w:val="36"/>
-          <w:szCs w:val="36"/>
-          <w:shd w:fill="auto" w:val="clear"/>
-          <w:lang w:val="en-US" w:eastAsia="zh-CN" w:bidi="hi-IN"/>
-        </w:rPr>
-        <w:t>s</w:t>
-      </w:r>
-      <w:r>
-        <w:rPr>
-          <w:rFonts w:eastAsia="Times New Roman" w:cs="Times New Roman" w:ascii="Garamond" w:hAnsi="Garamond"/>
-          <w:color w:val="000000"/>
-          <w:kern w:val="0"/>
-          <w:sz w:val="36"/>
-          <w:szCs w:val="36"/>
-          <w:shd w:fill="auto" w:val="clear"/>
-          <w:lang w:val="en-US" w:eastAsia="zh-CN" w:bidi="hi-IN"/>
-        </w:rPr>
-        <w:t>t</w:t>
-      </w:r>
-      <w:r>
-        <w:rPr>
-          <w:rFonts w:eastAsia="Times New Roman" w:cs="Times New Roman" w:ascii="Garamond" w:hAnsi="Garamond"/>
-          <w:color w:val="000000"/>
-          <w:kern w:val="0"/>
-          <w:sz w:val="36"/>
-          <w:szCs w:val="36"/>
-          <w:shd w:fill="auto" w:val="clear"/>
-          <w:lang w:val="en-US" w:eastAsia="zh-CN" w:bidi="hi-IN"/>
-        </w:rPr>
-        <w:t>r</w:t>
-      </w:r>
-      <w:r>
-        <w:rPr>
-          <w:rFonts w:eastAsia="Times New Roman" w:cs="Times New Roman" w:ascii="Garamond" w:hAnsi="Garamond"/>
-          <w:color w:val="000000"/>
-          <w:kern w:val="0"/>
-          <w:sz w:val="36"/>
-          <w:szCs w:val="36"/>
-          <w:shd w:fill="auto" w:val="clear"/>
-          <w:lang w:val="en-US" w:eastAsia="zh-CN" w:bidi="hi-IN"/>
-        </w:rPr>
-        <w:t>ofes e os cataclismos que muitos imaginaram que aconteceriam com o planeta, na verdade acontecerão no íntimo do ser humano.</w:t>
-      </w:r>
-    </w:p>
-    <w:p>
-      <w:pPr>
-        <w:pStyle w:val="Normal"/>
-        <w:jc w:val="both"/>
-        <w:rPr>
-          <w:rFonts w:ascii="Garamond" w:hAnsi="Garamond" w:eastAsia="Times New Roman" w:cs="Times New Roman"/>
-          <w:color w:val="000000"/>
-          <w:kern w:val="0"/>
-          <w:sz w:val="36"/>
-          <w:szCs w:val="36"/>
-          <w:shd w:fill="auto" w:val="clear"/>
-          <w:lang w:val="en-US" w:eastAsia="zh-CN" w:bidi="hi-IN"/>
-        </w:rPr>
-      </w:pPr>
-      <w:r>
-        <w:rPr>
-          <w:rFonts w:eastAsia="Times New Roman" w:cs="Times New Roman" w:ascii="Garamond" w:hAnsi="Garamond"/>
-          <w:color w:val="000000"/>
-          <w:kern w:val="0"/>
-          <w:sz w:val="36"/>
-          <w:szCs w:val="36"/>
-          <w:shd w:fill="auto" w:val="clear"/>
-          <w:lang w:val="en-US" w:eastAsia="zh-CN" w:bidi="hi-IN"/>
-        </w:rPr>
-      </w:r>
-    </w:p>
-    <w:p>
-      <w:pPr>
-        <w:pStyle w:val="Normal"/>
-        <w:jc w:val="both"/>
-        <w:rPr>
-          <w:rFonts w:ascii="Garamond" w:hAnsi="Garamond" w:eastAsia="Times New Roman" w:cs="Times New Roman"/>
-          <w:color w:val="000000"/>
-          <w:kern w:val="0"/>
-          <w:sz w:val="36"/>
-          <w:szCs w:val="36"/>
-          <w:shd w:fill="auto" w:val="clear"/>
-          <w:lang w:val="en-US" w:eastAsia="zh-CN" w:bidi="hi-IN"/>
-        </w:rPr>
-      </w:pPr>
-      <w:r>
-        <w:rPr>
-          <w:rFonts w:eastAsia="Times New Roman" w:cs="Times New Roman" w:ascii="Garamond" w:hAnsi="Garamond"/>
-          <w:color w:val="000000"/>
-          <w:kern w:val="0"/>
-          <w:sz w:val="36"/>
-          <w:szCs w:val="36"/>
-          <w:shd w:fill="auto" w:val="clear"/>
-          <w:lang w:val="en-US" w:eastAsia="zh-CN" w:bidi="hi-IN"/>
-        </w:rPr>
-        <w:t xml:space="preserve">Basta observarmos a turbulência do mundo moderno para compreendermos que já estamos vivendo os tempos dos quais Kardec falou. E, nesse contexto, </w:t>
-      </w:r>
-      <w:r>
-        <w:rPr>
-          <w:rFonts w:eastAsia="Times New Roman" w:cs="Times New Roman" w:ascii="Garamond" w:hAnsi="Garamond"/>
-          <w:color w:val="000000"/>
-          <w:kern w:val="0"/>
-          <w:sz w:val="36"/>
-          <w:szCs w:val="36"/>
-          <w:shd w:fill="auto" w:val="clear"/>
-          <w:lang w:val="en-US" w:eastAsia="zh-CN" w:bidi="hi-IN"/>
-        </w:rPr>
-        <w:t>temos que voltar nossos olhares para</w:t>
-      </w:r>
-      <w:r>
-        <w:rPr>
-          <w:rFonts w:eastAsia="Times New Roman" w:cs="Times New Roman" w:ascii="Garamond" w:hAnsi="Garamond"/>
-          <w:color w:val="000000"/>
-          <w:kern w:val="0"/>
-          <w:sz w:val="36"/>
-          <w:szCs w:val="36"/>
-          <w:shd w:fill="auto" w:val="clear"/>
-          <w:lang w:val="en-US" w:eastAsia="zh-CN" w:bidi="hi-IN"/>
-        </w:rPr>
-        <w:t xml:space="preserve"> a realidade do nosso país: Brasil, o coração do mundo, a pátria do Evangelho.</w:t>
+        <w:t>Kardec nos esclarece que quando a Humanidade está madura para subir um degrau, ou seja, quando a humanidade já recebeu conhecimento suficiente para elevar-se um pouco mais, então pode dizer-se que são chegados os tempos marcados por Deus para aquela época da humanidade.</w:t>
+      </w:r>
+    </w:p>
+    <w:p>
+      <w:pPr>
+        <w:pStyle w:val="Normal"/>
+        <w:jc w:val="both"/>
+        <w:rPr>
+          <w:rFonts w:ascii="Garamond" w:hAnsi="Garamond" w:eastAsia="Times New Roman" w:cs="Times New Roman"/>
+          <w:color w:val="000000"/>
+          <w:kern w:val="0"/>
+          <w:sz w:val="36"/>
+          <w:szCs w:val="36"/>
+          <w:shd w:fill="auto" w:val="clear"/>
+          <w:lang w:val="en-US" w:eastAsia="zh-CN" w:bidi="hi-IN"/>
+        </w:rPr>
+      </w:pPr>
+      <w:r>
+        <w:rPr>
+          <w:rFonts w:eastAsia="Times New Roman" w:cs="Times New Roman" w:ascii="Garamond" w:hAnsi="Garamond"/>
+          <w:color w:val="000000"/>
+          <w:kern w:val="0"/>
+          <w:sz w:val="36"/>
+          <w:szCs w:val="36"/>
+          <w:shd w:fill="auto" w:val="clear"/>
+          <w:lang w:val="en-US" w:eastAsia="zh-CN" w:bidi="hi-IN"/>
+        </w:rPr>
+      </w:r>
+    </w:p>
+    <w:p>
+      <w:pPr>
+        <w:pStyle w:val="Normal"/>
+        <w:jc w:val="both"/>
+        <w:rPr>
+          <w:rFonts w:ascii="Garamond" w:hAnsi="Garamond" w:eastAsia="Times New Roman" w:cs="Times New Roman"/>
+          <w:color w:val="000000"/>
+          <w:kern w:val="0"/>
+          <w:sz w:val="36"/>
+          <w:szCs w:val="36"/>
+          <w:shd w:fill="auto" w:val="clear"/>
+          <w:lang w:val="en-US" w:eastAsia="zh-CN" w:bidi="hi-IN"/>
+        </w:rPr>
+      </w:pPr>
+      <w:r>
+        <w:rPr>
+          <w:rFonts w:eastAsia="Times New Roman" w:cs="Times New Roman" w:ascii="Garamond" w:hAnsi="Garamond"/>
+          <w:color w:val="000000"/>
+          <w:kern w:val="0"/>
+          <w:sz w:val="36"/>
+          <w:szCs w:val="36"/>
+          <w:shd w:fill="auto" w:val="clear"/>
+          <w:lang w:val="en-US" w:eastAsia="zh-CN" w:bidi="hi-IN"/>
+        </w:rPr>
+        <w:t>Disse ainda Kardec que haveria uma grande transformação moral da humanidade, mas isso não aconteceria de maneira suave. Haveria lutas de ideias e perturbações até que todas as coisas se assentem. As catástrofes e os cataclismos que muitos imaginaram que aconteceriam com o planeta, na verdade acontecerão no íntimo do ser humano.</w:t>
+      </w:r>
+    </w:p>
+    <w:p>
+      <w:pPr>
+        <w:pStyle w:val="Normal"/>
+        <w:jc w:val="both"/>
+        <w:rPr>
+          <w:rFonts w:ascii="Garamond" w:hAnsi="Garamond" w:eastAsia="Times New Roman" w:cs="Times New Roman"/>
+          <w:color w:val="000000"/>
+          <w:kern w:val="0"/>
+          <w:sz w:val="36"/>
+          <w:szCs w:val="36"/>
+          <w:shd w:fill="auto" w:val="clear"/>
+          <w:lang w:val="en-US" w:eastAsia="zh-CN" w:bidi="hi-IN"/>
+        </w:rPr>
+      </w:pPr>
+      <w:r>
+        <w:rPr>
+          <w:rFonts w:eastAsia="Times New Roman" w:cs="Times New Roman" w:ascii="Garamond" w:hAnsi="Garamond"/>
+          <w:color w:val="000000"/>
+          <w:kern w:val="0"/>
+          <w:sz w:val="36"/>
+          <w:szCs w:val="36"/>
+          <w:shd w:fill="auto" w:val="clear"/>
+          <w:lang w:val="en-US" w:eastAsia="zh-CN" w:bidi="hi-IN"/>
+        </w:rPr>
+      </w:r>
+    </w:p>
+    <w:p>
+      <w:pPr>
+        <w:pStyle w:val="Normal"/>
+        <w:jc w:val="both"/>
+        <w:rPr>
+          <w:rFonts w:ascii="Garamond" w:hAnsi="Garamond" w:eastAsia="Times New Roman" w:cs="Times New Roman"/>
+          <w:color w:val="000000"/>
+          <w:kern w:val="0"/>
+          <w:sz w:val="36"/>
+          <w:szCs w:val="36"/>
+          <w:shd w:fill="auto" w:val="clear"/>
+          <w:lang w:val="en-US" w:eastAsia="zh-CN" w:bidi="hi-IN"/>
+        </w:rPr>
+      </w:pPr>
+      <w:r>
+        <w:rPr>
+          <w:rFonts w:eastAsia="Times New Roman" w:cs="Times New Roman" w:ascii="Garamond" w:hAnsi="Garamond"/>
+          <w:color w:val="000000"/>
+          <w:kern w:val="0"/>
+          <w:sz w:val="36"/>
+          <w:szCs w:val="36"/>
+          <w:shd w:fill="auto" w:val="clear"/>
+          <w:lang w:val="en-US" w:eastAsia="zh-CN" w:bidi="hi-IN"/>
+        </w:rPr>
+        <w:t>Basta observarmos a turbulência do mundo moderno para compreendermos que já estamos vivendo os tempos dos quais Kardec falou. E, nesse contexto, temos que voltar nossos olhares para a realidade do nosso país: Brasil, o coração do mundo, a pátria do Evangelho.</w:t>
       </w:r>
     </w:p>
     <w:p>
@@ -7127,269 +5718,113 @@
           <w:shd w:fill="auto" w:val="clear"/>
           <w:lang w:val="en-US" w:eastAsia="zh-CN" w:bidi="hi-IN"/>
         </w:rPr>
-        <w:t xml:space="preserve">A primeira é o terrível engano que muitos espíritas cometem sobre o </w:t>
-      </w:r>
-      <w:r>
-        <w:rPr>
-          <w:rFonts w:eastAsia="Times New Roman" w:cs="Times New Roman" w:ascii="Garamond" w:hAnsi="Garamond"/>
-          <w:color w:val="000000"/>
-          <w:kern w:val="0"/>
-          <w:sz w:val="36"/>
-          <w:szCs w:val="36"/>
-          <w:shd w:fill="auto" w:val="clear"/>
-          <w:lang w:val="en-US" w:eastAsia="zh-CN" w:bidi="hi-IN"/>
-        </w:rPr>
-        <w:t>assunto</w:t>
-      </w:r>
-      <w:r>
-        <w:rPr>
-          <w:rFonts w:eastAsia="Times New Roman" w:cs="Times New Roman" w:ascii="Garamond" w:hAnsi="Garamond"/>
-          <w:color w:val="000000"/>
-          <w:kern w:val="0"/>
-          <w:sz w:val="36"/>
-          <w:szCs w:val="36"/>
-          <w:shd w:fill="auto" w:val="clear"/>
-          <w:lang w:val="en-US" w:eastAsia="zh-CN" w:bidi="hi-IN"/>
-        </w:rPr>
-        <w:t xml:space="preserve">. Há quem pense que, pelo fato de Jesus ter </w:t>
-      </w:r>
-      <w:r>
-        <w:rPr>
-          <w:rFonts w:eastAsia="Times New Roman" w:cs="Times New Roman" w:ascii="Garamond" w:hAnsi="Garamond"/>
-          <w:color w:val="000000"/>
-          <w:kern w:val="0"/>
-          <w:sz w:val="36"/>
-          <w:szCs w:val="36"/>
-          <w:shd w:fill="auto" w:val="clear"/>
-          <w:lang w:val="en-US" w:eastAsia="zh-CN" w:bidi="hi-IN"/>
-        </w:rPr>
-        <w:t xml:space="preserve">transplantado a árvore do Seu Evangelho para </w:t>
-      </w:r>
-      <w:r>
-        <w:rPr>
-          <w:rFonts w:eastAsia="Times New Roman" w:cs="Times New Roman" w:ascii="Garamond" w:hAnsi="Garamond"/>
-          <w:color w:val="000000"/>
-          <w:kern w:val="0"/>
-          <w:sz w:val="36"/>
-          <w:szCs w:val="36"/>
-          <w:shd w:fill="auto" w:val="clear"/>
-          <w:lang w:val="en-US" w:eastAsia="zh-CN" w:bidi="hi-IN"/>
-        </w:rPr>
-        <w:t>o Brasil,  somos privilegiados ou mais amados p</w:t>
-      </w:r>
-      <w:r>
-        <w:rPr>
-          <w:rFonts w:eastAsia="Times New Roman" w:cs="Times New Roman" w:ascii="Garamond" w:hAnsi="Garamond"/>
-          <w:color w:val="000000"/>
-          <w:kern w:val="0"/>
-          <w:sz w:val="36"/>
-          <w:szCs w:val="36"/>
-          <w:shd w:fill="auto" w:val="clear"/>
-          <w:lang w:val="en-US" w:eastAsia="zh-CN" w:bidi="hi-IN"/>
-        </w:rPr>
-        <w:t>elo Mestre</w:t>
-      </w:r>
-      <w:r>
-        <w:rPr>
-          <w:rFonts w:eastAsia="Times New Roman" w:cs="Times New Roman" w:ascii="Garamond" w:hAnsi="Garamond"/>
-          <w:color w:val="000000"/>
-          <w:kern w:val="0"/>
-          <w:sz w:val="36"/>
-          <w:szCs w:val="36"/>
-          <w:shd w:fill="auto" w:val="clear"/>
-          <w:lang w:val="en-US" w:eastAsia="zh-CN" w:bidi="hi-IN"/>
-        </w:rPr>
-        <w:t xml:space="preserve"> do que outros povos.</w:t>
-      </w:r>
-    </w:p>
-    <w:p>
-      <w:pPr>
-        <w:pStyle w:val="Normal"/>
-        <w:jc w:val="both"/>
-        <w:rPr>
-          <w:rFonts w:ascii="Garamond" w:hAnsi="Garamond" w:eastAsia="Times New Roman" w:cs="Times New Roman"/>
-          <w:color w:val="000000"/>
-          <w:kern w:val="0"/>
-          <w:sz w:val="36"/>
-          <w:szCs w:val="36"/>
-          <w:shd w:fill="auto" w:val="clear"/>
-          <w:lang w:val="en-US" w:eastAsia="zh-CN" w:bidi="hi-IN"/>
-        </w:rPr>
-      </w:pPr>
-      <w:r>
-        <w:rPr>
-          <w:rFonts w:eastAsia="Times New Roman" w:cs="Times New Roman" w:ascii="Garamond" w:hAnsi="Garamond"/>
-          <w:color w:val="000000"/>
-          <w:kern w:val="0"/>
-          <w:sz w:val="36"/>
-          <w:szCs w:val="36"/>
-          <w:shd w:fill="auto" w:val="clear"/>
-          <w:lang w:val="en-US" w:eastAsia="zh-CN" w:bidi="hi-IN"/>
-        </w:rPr>
-      </w:r>
-    </w:p>
-    <w:p>
-      <w:pPr>
-        <w:pStyle w:val="Normal"/>
-        <w:jc w:val="both"/>
-        <w:rPr>
-          <w:rFonts w:ascii="Garamond" w:hAnsi="Garamond" w:eastAsia="Times New Roman" w:cs="Times New Roman"/>
-          <w:color w:val="000000"/>
-          <w:kern w:val="0"/>
-          <w:sz w:val="36"/>
-          <w:szCs w:val="36"/>
-          <w:shd w:fill="auto" w:val="clear"/>
-          <w:lang w:val="en-US" w:eastAsia="zh-CN" w:bidi="hi-IN"/>
-        </w:rPr>
-      </w:pPr>
-      <w:r>
-        <w:rPr>
-          <w:rFonts w:eastAsia="Times New Roman" w:cs="Times New Roman" w:ascii="Garamond" w:hAnsi="Garamond"/>
-          <w:color w:val="000000"/>
-          <w:kern w:val="0"/>
-          <w:sz w:val="36"/>
-          <w:szCs w:val="36"/>
-          <w:shd w:fill="auto" w:val="clear"/>
-          <w:lang w:val="en-US" w:eastAsia="zh-CN" w:bidi="hi-IN"/>
-        </w:rPr>
-        <w:t xml:space="preserve">Como consequência desse pensamento equivocado, </w:t>
-      </w:r>
-      <w:r>
-        <w:rPr>
-          <w:rFonts w:eastAsia="Times New Roman" w:cs="Times New Roman" w:ascii="Garamond" w:hAnsi="Garamond"/>
-          <w:color w:val="000000"/>
-          <w:kern w:val="0"/>
-          <w:sz w:val="36"/>
-          <w:szCs w:val="36"/>
-          <w:shd w:fill="auto" w:val="clear"/>
-          <w:lang w:val="en-US" w:eastAsia="zh-CN" w:bidi="hi-IN"/>
-        </w:rPr>
-        <w:t>há quem acredite</w:t>
-      </w:r>
-      <w:r>
-        <w:rPr>
-          <w:rFonts w:eastAsia="Times New Roman" w:cs="Times New Roman" w:ascii="Garamond" w:hAnsi="Garamond"/>
-          <w:color w:val="000000"/>
-          <w:kern w:val="0"/>
-          <w:sz w:val="36"/>
-          <w:szCs w:val="36"/>
-          <w:shd w:fill="auto" w:val="clear"/>
-          <w:lang w:val="en-US" w:eastAsia="zh-CN" w:bidi="hi-IN"/>
-        </w:rPr>
-        <w:t xml:space="preserve"> que podemos simplesmente cruzar os braços diante dos gigantescos problemas </w:t>
-      </w:r>
-      <w:r>
-        <w:rPr>
-          <w:rFonts w:eastAsia="Times New Roman" w:cs="Times New Roman" w:ascii="Garamond" w:hAnsi="Garamond"/>
-          <w:color w:val="000000"/>
-          <w:kern w:val="0"/>
-          <w:sz w:val="36"/>
-          <w:szCs w:val="36"/>
-          <w:shd w:fill="auto" w:val="clear"/>
-          <w:lang w:val="en-US" w:eastAsia="zh-CN" w:bidi="hi-IN"/>
-        </w:rPr>
-        <w:t>de ordem moral</w:t>
-      </w:r>
-      <w:r>
-        <w:rPr>
-          <w:rFonts w:eastAsia="Times New Roman" w:cs="Times New Roman" w:ascii="Garamond" w:hAnsi="Garamond"/>
-          <w:color w:val="000000"/>
-          <w:kern w:val="0"/>
-          <w:sz w:val="36"/>
-          <w:szCs w:val="36"/>
-          <w:shd w:fill="auto" w:val="clear"/>
-          <w:lang w:val="en-US" w:eastAsia="zh-CN" w:bidi="hi-IN"/>
-        </w:rPr>
-        <w:t xml:space="preserve"> que enfrentamos no Brasil, esperando que, algum dia, eles sejam resolvidos de maneira milagrosa por Jesus. Nada está mais distante da realidade</w:t>
-      </w:r>
-      <w:r>
-        <w:rPr>
-          <w:rFonts w:eastAsia="Times New Roman" w:cs="Times New Roman" w:ascii="Garamond" w:hAnsi="Garamond"/>
-          <w:color w:val="000000"/>
-          <w:kern w:val="0"/>
-          <w:sz w:val="36"/>
-          <w:szCs w:val="36"/>
-          <w:shd w:fill="auto" w:val="clear"/>
-          <w:lang w:val="en-US" w:eastAsia="zh-CN" w:bidi="hi-IN"/>
-        </w:rPr>
-        <w:t xml:space="preserve"> do que essa ideia.</w:t>
-      </w:r>
-    </w:p>
-    <w:p>
-      <w:pPr>
-        <w:pStyle w:val="Normal"/>
-        <w:jc w:val="both"/>
-        <w:rPr>
-          <w:rFonts w:ascii="Garamond" w:hAnsi="Garamond" w:eastAsia="Times New Roman" w:cs="Times New Roman"/>
-          <w:color w:val="000000"/>
-          <w:kern w:val="0"/>
-          <w:sz w:val="36"/>
-          <w:szCs w:val="36"/>
-          <w:shd w:fill="auto" w:val="clear"/>
-          <w:lang w:val="en-US" w:eastAsia="zh-CN" w:bidi="hi-IN"/>
-        </w:rPr>
-      </w:pPr>
-      <w:r>
-        <w:rPr>
-          <w:rFonts w:eastAsia="Times New Roman" w:cs="Times New Roman" w:ascii="Garamond" w:hAnsi="Garamond"/>
-          <w:color w:val="000000"/>
-          <w:kern w:val="0"/>
-          <w:sz w:val="36"/>
-          <w:szCs w:val="36"/>
-          <w:shd w:fill="auto" w:val="clear"/>
-          <w:lang w:val="en-US" w:eastAsia="zh-CN" w:bidi="hi-IN"/>
-        </w:rPr>
-      </w:r>
-    </w:p>
-    <w:p>
-      <w:pPr>
-        <w:pStyle w:val="Normal"/>
-        <w:jc w:val="both"/>
-        <w:rPr>
-          <w:rFonts w:ascii="Garamond" w:hAnsi="Garamond" w:eastAsia="Times New Roman" w:cs="Times New Roman"/>
-          <w:color w:val="000000"/>
-          <w:kern w:val="0"/>
-          <w:sz w:val="36"/>
-          <w:szCs w:val="36"/>
-          <w:shd w:fill="auto" w:val="clear"/>
-          <w:lang w:val="en-US" w:eastAsia="zh-CN" w:bidi="hi-IN"/>
-        </w:rPr>
-      </w:pPr>
-      <w:r>
-        <w:rPr>
-          <w:rFonts w:eastAsia="Times New Roman" w:cs="Times New Roman" w:ascii="Garamond" w:hAnsi="Garamond"/>
-          <w:color w:val="000000"/>
-          <w:kern w:val="0"/>
-          <w:sz w:val="36"/>
-          <w:szCs w:val="36"/>
-          <w:shd w:fill="auto" w:val="clear"/>
-          <w:lang w:val="en-US" w:eastAsia="zh-CN" w:bidi="hi-IN"/>
-        </w:rPr>
-        <w:t>É</w:t>
-      </w:r>
-      <w:r>
-        <w:rPr>
-          <w:rFonts w:eastAsia="Times New Roman" w:cs="Times New Roman" w:ascii="Garamond" w:hAnsi="Garamond"/>
-          <w:color w:val="000000"/>
-          <w:kern w:val="0"/>
-          <w:sz w:val="36"/>
-          <w:szCs w:val="36"/>
-          <w:shd w:fill="auto" w:val="clear"/>
-          <w:lang w:val="en-US" w:eastAsia="zh-CN" w:bidi="hi-IN"/>
-        </w:rPr>
-        <w:t xml:space="preserve"> só prestarmos atenção a</w:t>
-      </w:r>
-      <w:r>
-        <w:rPr>
-          <w:rFonts w:eastAsia="Times New Roman" w:cs="Times New Roman" w:ascii="Garamond" w:hAnsi="Garamond"/>
-          <w:color w:val="000000"/>
-          <w:kern w:val="0"/>
-          <w:sz w:val="36"/>
-          <w:szCs w:val="36"/>
-          <w:shd w:fill="auto" w:val="clear"/>
-          <w:lang w:val="en-US" w:eastAsia="zh-CN" w:bidi="hi-IN"/>
-        </w:rPr>
-        <w:t xml:space="preserve">o que está escrito no primeiro capítulo do livro </w:t>
+        <w:t>A primeira é o terrível engano que muitos espíritas cometem sobre o assunto. Há quem pense que, pelo fato de Jesus ter transplantado a árvore do Seu Evangelho para o Brasil,  somos privilegiados ou mais amados pelo Mestre do que outros povos.</w:t>
+      </w:r>
+    </w:p>
+    <w:p>
+      <w:pPr>
+        <w:pStyle w:val="Normal"/>
+        <w:jc w:val="both"/>
+        <w:rPr>
+          <w:rFonts w:ascii="Garamond" w:hAnsi="Garamond" w:eastAsia="Times New Roman" w:cs="Times New Roman"/>
+          <w:color w:val="000000"/>
+          <w:kern w:val="0"/>
+          <w:sz w:val="36"/>
+          <w:szCs w:val="36"/>
+          <w:shd w:fill="auto" w:val="clear"/>
+          <w:lang w:val="en-US" w:eastAsia="zh-CN" w:bidi="hi-IN"/>
+        </w:rPr>
+      </w:pPr>
+      <w:r>
+        <w:rPr>
+          <w:rFonts w:eastAsia="Times New Roman" w:cs="Times New Roman" w:ascii="Garamond" w:hAnsi="Garamond"/>
+          <w:color w:val="000000"/>
+          <w:kern w:val="0"/>
+          <w:sz w:val="36"/>
+          <w:szCs w:val="36"/>
+          <w:shd w:fill="auto" w:val="clear"/>
+          <w:lang w:val="en-US" w:eastAsia="zh-CN" w:bidi="hi-IN"/>
+        </w:rPr>
+      </w:r>
+    </w:p>
+    <w:p>
+      <w:pPr>
+        <w:pStyle w:val="Normal"/>
+        <w:jc w:val="both"/>
+        <w:rPr>
+          <w:rFonts w:ascii="Garamond" w:hAnsi="Garamond" w:eastAsia="Times New Roman" w:cs="Times New Roman"/>
+          <w:color w:val="000000"/>
+          <w:kern w:val="0"/>
+          <w:sz w:val="36"/>
+          <w:szCs w:val="36"/>
+          <w:shd w:fill="auto" w:val="clear"/>
+          <w:lang w:val="en-US" w:eastAsia="zh-CN" w:bidi="hi-IN"/>
+        </w:rPr>
+      </w:pPr>
+      <w:r>
+        <w:rPr>
+          <w:rFonts w:eastAsia="Times New Roman" w:cs="Times New Roman" w:ascii="Garamond" w:hAnsi="Garamond"/>
+          <w:color w:val="000000"/>
+          <w:kern w:val="0"/>
+          <w:sz w:val="36"/>
+          <w:szCs w:val="36"/>
+          <w:shd w:fill="auto" w:val="clear"/>
+          <w:lang w:val="en-US" w:eastAsia="zh-CN" w:bidi="hi-IN"/>
+        </w:rPr>
+        <w:t>Como consequência desse pensamento equivocado, há quem acredite que podemos simplesmente cruzar os braços diante dos gigantescos problemas de ordem moral que enfrentamos no Brasil, esperando que, algum dia, eles sejam resolvidos de maneira milagrosa por Jesus. Nada está mais distante da realidade do que essa ideia.</w:t>
+      </w:r>
+    </w:p>
+    <w:p>
+      <w:pPr>
+        <w:pStyle w:val="Normal"/>
+        <w:jc w:val="both"/>
+        <w:rPr>
+          <w:rFonts w:ascii="Garamond" w:hAnsi="Garamond" w:eastAsia="Times New Roman" w:cs="Times New Roman"/>
+          <w:color w:val="000000"/>
+          <w:kern w:val="0"/>
+          <w:sz w:val="36"/>
+          <w:szCs w:val="36"/>
+          <w:shd w:fill="auto" w:val="clear"/>
+          <w:lang w:val="en-US" w:eastAsia="zh-CN" w:bidi="hi-IN"/>
+        </w:rPr>
+      </w:pPr>
+      <w:r>
+        <w:rPr>
+          <w:rFonts w:eastAsia="Times New Roman" w:cs="Times New Roman" w:ascii="Garamond" w:hAnsi="Garamond"/>
+          <w:color w:val="000000"/>
+          <w:kern w:val="0"/>
+          <w:sz w:val="36"/>
+          <w:szCs w:val="36"/>
+          <w:shd w:fill="auto" w:val="clear"/>
+          <w:lang w:val="en-US" w:eastAsia="zh-CN" w:bidi="hi-IN"/>
+        </w:rPr>
+      </w:r>
+    </w:p>
+    <w:p>
+      <w:pPr>
+        <w:pStyle w:val="Normal"/>
+        <w:jc w:val="both"/>
+        <w:rPr>
+          <w:rFonts w:ascii="Garamond" w:hAnsi="Garamond" w:eastAsia="Times New Roman" w:cs="Times New Roman"/>
+          <w:color w:val="000000"/>
+          <w:kern w:val="0"/>
+          <w:sz w:val="36"/>
+          <w:szCs w:val="36"/>
+          <w:shd w:fill="auto" w:val="clear"/>
+          <w:lang w:val="en-US" w:eastAsia="zh-CN" w:bidi="hi-IN"/>
+        </w:rPr>
+      </w:pPr>
+      <w:r>
+        <w:rPr>
+          <w:rFonts w:eastAsia="Times New Roman" w:cs="Times New Roman" w:ascii="Garamond" w:hAnsi="Garamond"/>
+          <w:color w:val="000000"/>
+          <w:kern w:val="0"/>
+          <w:sz w:val="36"/>
+          <w:szCs w:val="36"/>
+          <w:shd w:fill="auto" w:val="clear"/>
+          <w:lang w:val="en-US" w:eastAsia="zh-CN" w:bidi="hi-IN"/>
+        </w:rPr>
+        <w:t xml:space="preserve">É só prestarmos atenção ao que está escrito no primeiro capítulo do livro </w:t>
       </w:r>
       <w:r>
         <w:rPr>
@@ -7574,49 +6009,33 @@
           <w:shd w:fill="auto" w:val="clear"/>
           <w:lang w:val="en-US" w:eastAsia="zh-CN" w:bidi="hi-IN"/>
         </w:rPr>
-        <w:t xml:space="preserve">O que nós precisamos entender de verdade é que, se Jesus retirou a árvore do Seu Evangelho da Europa porque aqueles povos, embora profundamente marcados pelo Cristianismo, já não conseguiam sustentar a vivência autêntica dos Seus ensinamentos, Ele pode, da mesma forma, transplantar novamente essa árvore para outro ponto do planeta, caso o Brasil </w:t>
-      </w:r>
-      <w:r>
-        <w:rPr>
-          <w:rFonts w:eastAsia="Times New Roman" w:cs="Times New Roman" w:ascii="Garamond" w:hAnsi="Garamond"/>
-          <w:color w:val="000000"/>
-          <w:kern w:val="0"/>
-          <w:sz w:val="36"/>
-          <w:szCs w:val="36"/>
-          <w:shd w:fill="auto" w:val="clear"/>
-          <w:lang w:val="en-US" w:eastAsia="zh-CN" w:bidi="hi-IN"/>
-        </w:rPr>
-        <w:t>falhe n</w:t>
-      </w:r>
-      <w:r>
-        <w:rPr>
-          <w:rFonts w:eastAsia="Times New Roman" w:cs="Times New Roman" w:ascii="Garamond" w:hAnsi="Garamond"/>
-          <w:color w:val="000000"/>
-          <w:kern w:val="0"/>
-          <w:sz w:val="36"/>
-          <w:szCs w:val="36"/>
-          <w:shd w:fill="auto" w:val="clear"/>
-          <w:lang w:val="en-US" w:eastAsia="zh-CN" w:bidi="hi-IN"/>
-        </w:rPr>
-        <w:t xml:space="preserve">a missão que lhe foi confiada. </w:t>
-      </w:r>
-    </w:p>
-    <w:p>
-      <w:pPr>
-        <w:pStyle w:val="Normal"/>
-        <w:jc w:val="both"/>
-        <w:rPr>
-          <w:rFonts w:ascii="Garamond" w:hAnsi="Garamond" w:eastAsia="Times New Roman" w:cs="Times New Roman"/>
-          <w:color w:val="000000"/>
-          <w:kern w:val="0"/>
-          <w:sz w:val="36"/>
-          <w:szCs w:val="36"/>
-          <w:shd w:fill="auto" w:val="clear"/>
-          <w:lang w:val="en-US" w:eastAsia="zh-CN" w:bidi="hi-IN"/>
-        </w:rPr>
-      </w:pPr>
-      <w:r>
-        <w:rPr/>
+        <w:t xml:space="preserve">O que nós precisamos entender de verdade é que, se Jesus retirou a árvore do Seu Evangelho da Europa porque aqueles povos, embora profundamente marcados pelo Cristianismo, já não conseguiam sustentar a vivência autêntica dos Seus ensinamentos, Ele pode, da mesma forma, transplantar novamente essa árvore para outro ponto do planeta, caso o Brasil falhe na missão que lhe foi confiada. </w:t>
+      </w:r>
+    </w:p>
+    <w:p>
+      <w:pPr>
+        <w:pStyle w:val="Normal"/>
+        <w:jc w:val="both"/>
+        <w:rPr>
+          <w:rFonts w:ascii="Garamond" w:hAnsi="Garamond" w:eastAsia="Times New Roman" w:cs="Times New Roman"/>
+          <w:color w:val="000000"/>
+          <w:kern w:val="0"/>
+          <w:sz w:val="36"/>
+          <w:szCs w:val="36"/>
+          <w:shd w:fill="auto" w:val="clear"/>
+          <w:lang w:val="en-US" w:eastAsia="zh-CN" w:bidi="hi-IN"/>
+        </w:rPr>
+      </w:pPr>
+      <w:r>
+        <w:rPr>
+          <w:rFonts w:eastAsia="Times New Roman" w:cs="Times New Roman" w:ascii="Garamond" w:hAnsi="Garamond"/>
+          <w:color w:val="000000"/>
+          <w:kern w:val="0"/>
+          <w:sz w:val="36"/>
+          <w:szCs w:val="36"/>
+          <w:shd w:fill="auto" w:val="clear"/>
+          <w:lang w:val="en-US" w:eastAsia="zh-CN" w:bidi="hi-IN"/>
+        </w:rPr>
       </w:r>
     </w:p>
     <w:p>
@@ -7696,31 +6115,7 @@
           <w:shd w:fill="auto" w:val="clear"/>
           <w:lang w:val="en-US" w:eastAsia="zh-CN" w:bidi="hi-IN"/>
         </w:rPr>
-        <w:t xml:space="preserve">A segunda observação diz respeito à maneira como interpretamos a condição de pátria do evangelho. A maioria de nós acha que o Brasil deveria ser um celeiro de Espíritos de luz, berço das entidades mais elevadas do nosso planeta, </w:t>
-      </w:r>
-      <w:r>
-        <w:rPr>
-          <w:rFonts w:eastAsia="Times New Roman" w:cs="Times New Roman" w:ascii="Garamond" w:hAnsi="Garamond"/>
-          <w:color w:val="000000"/>
-          <w:kern w:val="0"/>
-          <w:sz w:val="36"/>
-          <w:szCs w:val="36"/>
-          <w:shd w:fill="auto" w:val="clear"/>
-          <w:lang w:val="en-US" w:eastAsia="zh-CN" w:bidi="hi-IN"/>
-        </w:rPr>
-        <w:t>uma vitrine</w:t>
-      </w:r>
-      <w:r>
-        <w:rPr>
-          <w:rFonts w:eastAsia="Times New Roman" w:cs="Times New Roman" w:ascii="Garamond" w:hAnsi="Garamond"/>
-          <w:color w:val="000000"/>
-          <w:kern w:val="0"/>
-          <w:sz w:val="36"/>
-          <w:szCs w:val="36"/>
-          <w:shd w:fill="auto" w:val="clear"/>
-          <w:lang w:val="en-US" w:eastAsia="zh-CN" w:bidi="hi-IN"/>
-        </w:rPr>
-        <w:t xml:space="preserve"> de moralidade para o resto do mundo.</w:t>
+        <w:t>A segunda observação diz respeito à maneira como interpretamos a condição de pátria do evangelho. A maioria de nós acha que o Brasil deveria ser um celeiro de Espíritos de luz, berço das entidades mais elevadas do nosso planeta, uma vitrine de moralidade para o resto do mundo.</w:t>
       </w:r>
     </w:p>
     <w:p>
@@ -7879,55 +6274,7 @@
           <w:shd w:fill="auto" w:val="clear"/>
           <w:lang w:val="en-US" w:eastAsia="zh-CN" w:bidi="hi-IN"/>
         </w:rPr>
-        <w:t xml:space="preserve">Na verdade o engano é nosso. O Brasil foi escolhido por Jesus para ser a pátria do Seu evangelho de luz e amor, justamente porque seria a nação </w:t>
-      </w:r>
-      <w:r>
-        <w:rPr>
-          <w:rFonts w:eastAsia="Times New Roman" w:cs="Times New Roman" w:ascii="Garamond" w:hAnsi="Garamond"/>
-          <w:color w:val="000000"/>
-          <w:kern w:val="0"/>
-          <w:sz w:val="36"/>
-          <w:szCs w:val="36"/>
-          <w:shd w:fill="auto" w:val="clear"/>
-          <w:lang w:val="en-US" w:eastAsia="zh-CN" w:bidi="hi-IN"/>
-        </w:rPr>
-        <w:t xml:space="preserve">disposta </w:t>
-      </w:r>
-      <w:r>
-        <w:rPr>
-          <w:rFonts w:eastAsia="Times New Roman" w:cs="Times New Roman" w:ascii="Garamond" w:hAnsi="Garamond"/>
-          <w:color w:val="000000"/>
-          <w:kern w:val="0"/>
-          <w:sz w:val="36"/>
-          <w:szCs w:val="36"/>
-          <w:shd w:fill="auto" w:val="clear"/>
-          <w:lang w:val="en-US" w:eastAsia="zh-CN" w:bidi="hi-IN"/>
-        </w:rPr>
-        <w:t xml:space="preserve">a receber no seu </w:t>
-      </w:r>
-      <w:r>
-        <w:rPr>
-          <w:rFonts w:eastAsia="Times New Roman" w:cs="Times New Roman" w:ascii="Garamond" w:hAnsi="Garamond"/>
-          <w:color w:val="000000"/>
-          <w:kern w:val="0"/>
-          <w:sz w:val="36"/>
-          <w:szCs w:val="36"/>
-          <w:shd w:fill="auto" w:val="clear"/>
-          <w:lang w:val="en-US" w:eastAsia="zh-CN" w:bidi="hi-IN"/>
-        </w:rPr>
-        <w:t>solo</w:t>
-      </w:r>
-      <w:r>
-        <w:rPr>
-          <w:rFonts w:eastAsia="Times New Roman" w:cs="Times New Roman" w:ascii="Garamond" w:hAnsi="Garamond"/>
-          <w:color w:val="000000"/>
-          <w:kern w:val="0"/>
-          <w:sz w:val="36"/>
-          <w:szCs w:val="36"/>
-          <w:shd w:fill="auto" w:val="clear"/>
-          <w:lang w:val="en-US" w:eastAsia="zh-CN" w:bidi="hi-IN"/>
-        </w:rPr>
-        <w:t xml:space="preserve"> os Espíritos mais endividados perante a Justiça Divina, aqueles com os maiores débitos a serem resgatados. </w:t>
+        <w:t xml:space="preserve">Na verdade o engano é nosso. O Brasil foi escolhido por Jesus para ser a pátria do Seu evangelho de luz e amor, justamente porque seria a nação disposta a receber no seu solo os Espíritos mais endividados perante a Justiça Divina, aqueles com os maiores débitos a serem resgatados. </w:t>
       </w:r>
     </w:p>
     <w:p>
@@ -8086,264 +6433,140 @@
           <w:shd w:fill="auto" w:val="clear"/>
           <w:lang w:val="en-US" w:eastAsia="zh-CN" w:bidi="hi-IN"/>
         </w:rPr>
-        <w:t xml:space="preserve">Independente de termos ou não errado muito no passado, o conhecimento que possuímos hoje do Evangelho de Jesus coloca sob nossos ombros a responsabilidade de ter um olhar diferente para com o mundo. </w:t>
-      </w:r>
-    </w:p>
-    <w:p>
-      <w:pPr>
-        <w:pStyle w:val="Normal"/>
-        <w:jc w:val="both"/>
-        <w:rPr>
-          <w:rFonts w:ascii="Garamond" w:hAnsi="Garamond" w:eastAsia="Times New Roman" w:cs="Times New Roman"/>
-          <w:color w:val="000000"/>
-          <w:kern w:val="0"/>
-          <w:sz w:val="36"/>
-          <w:szCs w:val="36"/>
-          <w:shd w:fill="auto" w:val="clear"/>
-          <w:lang w:val="en-US" w:eastAsia="zh-CN" w:bidi="hi-IN"/>
-        </w:rPr>
-      </w:pPr>
-      <w:r>
-        <w:rPr>
-          <w:rFonts w:eastAsia="Times New Roman" w:cs="Times New Roman" w:ascii="Garamond" w:hAnsi="Garamond"/>
-          <w:color w:val="000000"/>
-          <w:kern w:val="0"/>
-          <w:sz w:val="36"/>
-          <w:szCs w:val="36"/>
-          <w:shd w:fill="auto" w:val="clear"/>
-          <w:lang w:val="en-US" w:eastAsia="zh-CN" w:bidi="hi-IN"/>
-        </w:rPr>
-      </w:r>
-    </w:p>
-    <w:p>
-      <w:pPr>
-        <w:pStyle w:val="Normal"/>
-        <w:jc w:val="both"/>
-        <w:rPr>
-          <w:rFonts w:ascii="Garamond" w:hAnsi="Garamond" w:eastAsia="Times New Roman" w:cs="Times New Roman"/>
-          <w:color w:val="000000"/>
-          <w:kern w:val="0"/>
-          <w:sz w:val="36"/>
-          <w:szCs w:val="36"/>
-          <w:shd w:fill="auto" w:val="clear"/>
-          <w:lang w:val="en-US" w:eastAsia="zh-CN" w:bidi="hi-IN"/>
-        </w:rPr>
-      </w:pPr>
-      <w:r>
-        <w:rPr>
-          <w:rFonts w:eastAsia="Times New Roman" w:cs="Times New Roman" w:ascii="Garamond" w:hAnsi="Garamond"/>
-          <w:color w:val="000000"/>
-          <w:kern w:val="0"/>
-          <w:sz w:val="36"/>
-          <w:szCs w:val="36"/>
-          <w:shd w:fill="auto" w:val="clear"/>
-          <w:lang w:val="en-US" w:eastAsia="zh-CN" w:bidi="hi-IN"/>
-        </w:rPr>
-        <w:t>O contato com o mal é a prova pela qual temos que passar. Nosso futuro espiritual depende da maneira como agimos e reagimos perante o mal. O que eu desejo para os criminosos, para os corruptos? A morte, o aniquilamento total? Se for, então estaremos vibrando na mesma faixa que eles</w:t>
-      </w:r>
-      <w:r>
-        <w:rPr>
-          <w:rFonts w:eastAsia="Times New Roman" w:cs="Times New Roman" w:ascii="Garamond" w:hAnsi="Garamond"/>
-          <w:color w:val="000000"/>
-          <w:kern w:val="0"/>
-          <w:sz w:val="36"/>
-          <w:szCs w:val="36"/>
-          <w:shd w:fill="auto" w:val="clear"/>
-          <w:lang w:val="en-US" w:eastAsia="zh-CN" w:bidi="hi-IN"/>
-        </w:rPr>
-        <w:t>.</w:t>
-      </w:r>
-    </w:p>
-    <w:p>
-      <w:pPr>
-        <w:pStyle w:val="Normal"/>
-        <w:jc w:val="both"/>
-        <w:rPr>
-          <w:rFonts w:ascii="Garamond" w:hAnsi="Garamond" w:eastAsia="Times New Roman" w:cs="Times New Roman"/>
-          <w:color w:val="000000"/>
-          <w:kern w:val="0"/>
-          <w:sz w:val="36"/>
-          <w:szCs w:val="36"/>
-          <w:shd w:fill="auto" w:val="clear"/>
-          <w:lang w:val="en-US" w:eastAsia="zh-CN" w:bidi="hi-IN"/>
-        </w:rPr>
-      </w:pPr>
-      <w:r>
-        <w:rPr/>
-      </w:r>
-    </w:p>
-    <w:p>
-      <w:pPr>
-        <w:pStyle w:val="Normal"/>
-        <w:jc w:val="both"/>
-        <w:rPr>
-          <w:rFonts w:ascii="Garamond" w:hAnsi="Garamond" w:eastAsia="Times New Roman" w:cs="Times New Roman"/>
-          <w:color w:val="000000"/>
-          <w:kern w:val="0"/>
-          <w:sz w:val="36"/>
-          <w:szCs w:val="36"/>
-          <w:shd w:fill="auto" w:val="clear"/>
-          <w:lang w:val="en-US" w:eastAsia="zh-CN" w:bidi="hi-IN"/>
-        </w:rPr>
-      </w:pPr>
-      <w:r>
-        <w:rPr>
-          <w:rFonts w:eastAsia="Times New Roman" w:cs="Times New Roman" w:ascii="Garamond" w:hAnsi="Garamond"/>
-          <w:color w:val="000000"/>
-          <w:kern w:val="0"/>
-          <w:sz w:val="36"/>
-          <w:szCs w:val="36"/>
-          <w:shd w:fill="auto" w:val="clear"/>
-          <w:lang w:val="en-US" w:eastAsia="zh-CN" w:bidi="hi-IN"/>
-        </w:rPr>
-        <w:t xml:space="preserve">Aproxima-se o tempo em que o Cristo fará a separação do joio e do trigo, conduzindo a Terra à condição de mundo </w:t>
-      </w:r>
-      <w:r>
-        <w:rPr>
-          <w:rFonts w:eastAsia="Times New Roman" w:cs="Times New Roman" w:ascii="Garamond" w:hAnsi="Garamond"/>
-          <w:color w:val="000000"/>
-          <w:kern w:val="0"/>
-          <w:sz w:val="36"/>
-          <w:szCs w:val="36"/>
-          <w:shd w:fill="auto" w:val="clear"/>
-          <w:lang w:val="en-US" w:eastAsia="zh-CN" w:bidi="hi-IN"/>
-        </w:rPr>
-        <w:t>em</w:t>
-      </w:r>
-      <w:r>
-        <w:rPr>
-          <w:rFonts w:eastAsia="Times New Roman" w:cs="Times New Roman" w:ascii="Garamond" w:hAnsi="Garamond"/>
-          <w:color w:val="000000"/>
-          <w:kern w:val="0"/>
-          <w:sz w:val="36"/>
-          <w:szCs w:val="36"/>
-          <w:shd w:fill="auto" w:val="clear"/>
-          <w:lang w:val="en-US" w:eastAsia="zh-CN" w:bidi="hi-IN"/>
-        </w:rPr>
-        <w:t xml:space="preserve"> regeneração. Permanecer aqui não será um privilégio, mas uma conquista </w:t>
-      </w:r>
-      <w:r>
-        <w:rPr>
-          <w:rFonts w:eastAsia="Times New Roman" w:cs="Times New Roman" w:ascii="Garamond" w:hAnsi="Garamond"/>
-          <w:color w:val="000000"/>
-          <w:kern w:val="0"/>
-          <w:sz w:val="36"/>
-          <w:szCs w:val="36"/>
-          <w:shd w:fill="auto" w:val="clear"/>
-          <w:lang w:val="en-US" w:eastAsia="zh-CN" w:bidi="hi-IN"/>
-        </w:rPr>
-        <w:t>individual</w:t>
-      </w:r>
-      <w:r>
-        <w:rPr>
-          <w:rFonts w:eastAsia="Times New Roman" w:cs="Times New Roman" w:ascii="Garamond" w:hAnsi="Garamond"/>
-          <w:color w:val="000000"/>
-          <w:kern w:val="0"/>
-          <w:sz w:val="36"/>
-          <w:szCs w:val="36"/>
-          <w:shd w:fill="auto" w:val="clear"/>
-          <w:lang w:val="en-US" w:eastAsia="zh-CN" w:bidi="hi-IN"/>
-        </w:rPr>
-        <w:t xml:space="preserve">, alcançada pelo esforço sincero de viver o Evangelho. </w:t>
-      </w:r>
-    </w:p>
-    <w:p>
-      <w:pPr>
-        <w:pStyle w:val="Normal"/>
-        <w:jc w:val="both"/>
-        <w:rPr>
-          <w:rFonts w:ascii="Garamond" w:hAnsi="Garamond" w:eastAsia="Times New Roman" w:cs="Times New Roman"/>
-          <w:color w:val="000000"/>
-          <w:kern w:val="0"/>
-          <w:sz w:val="36"/>
-          <w:szCs w:val="36"/>
-          <w:shd w:fill="auto" w:val="clear"/>
-          <w:lang w:val="en-US" w:eastAsia="zh-CN" w:bidi="hi-IN"/>
-        </w:rPr>
-      </w:pPr>
-      <w:r>
-        <w:rPr>
-          <w:rFonts w:eastAsia="Times New Roman" w:cs="Times New Roman" w:ascii="Garamond" w:hAnsi="Garamond"/>
-          <w:color w:val="000000"/>
-          <w:kern w:val="0"/>
-          <w:sz w:val="36"/>
-          <w:szCs w:val="36"/>
-          <w:shd w:fill="auto" w:val="clear"/>
-          <w:lang w:val="en-US" w:eastAsia="zh-CN" w:bidi="hi-IN"/>
-        </w:rPr>
-        <w:t>Caridade, humildade, paciência, abnegação</w:t>
-      </w:r>
-      <w:r>
-        <w:rPr>
-          <w:rFonts w:eastAsia="Times New Roman" w:cs="Times New Roman" w:ascii="Garamond" w:hAnsi="Garamond"/>
-          <w:color w:val="000000"/>
-          <w:kern w:val="0"/>
-          <w:sz w:val="36"/>
-          <w:szCs w:val="36"/>
-          <w:shd w:fill="auto" w:val="clear"/>
-          <w:lang w:val="en-US" w:eastAsia="zh-CN" w:bidi="hi-IN"/>
-        </w:rPr>
-        <w:t xml:space="preserve"> e</w:t>
-      </w:r>
-      <w:r>
-        <w:rPr>
-          <w:rFonts w:eastAsia="Times New Roman" w:cs="Times New Roman" w:ascii="Garamond" w:hAnsi="Garamond"/>
-          <w:color w:val="000000"/>
-          <w:kern w:val="0"/>
-          <w:sz w:val="36"/>
-          <w:szCs w:val="36"/>
-          <w:shd w:fill="auto" w:val="clear"/>
-          <w:lang w:val="en-US" w:eastAsia="zh-CN" w:bidi="hi-IN"/>
-        </w:rPr>
-        <w:t xml:space="preserve"> resignação são </w:t>
-      </w:r>
-      <w:r>
-        <w:rPr>
-          <w:rFonts w:eastAsia="Times New Roman" w:cs="Times New Roman" w:ascii="Garamond" w:hAnsi="Garamond"/>
-          <w:color w:val="000000"/>
-          <w:kern w:val="0"/>
-          <w:sz w:val="36"/>
-          <w:szCs w:val="36"/>
-          <w:shd w:fill="auto" w:val="clear"/>
-          <w:lang w:val="en-US" w:eastAsia="zh-CN" w:bidi="hi-IN"/>
-        </w:rPr>
-        <w:t xml:space="preserve">algumas das virtudes que precisamos desenvolver. Elas são </w:t>
-      </w:r>
-      <w:r>
-        <w:rPr>
-          <w:rFonts w:eastAsia="Times New Roman" w:cs="Times New Roman" w:ascii="Garamond" w:hAnsi="Garamond"/>
-          <w:color w:val="000000"/>
-          <w:kern w:val="0"/>
-          <w:sz w:val="36"/>
-          <w:szCs w:val="36"/>
-          <w:shd w:fill="auto" w:val="clear"/>
-          <w:lang w:val="en-US" w:eastAsia="zh-CN" w:bidi="hi-IN"/>
-        </w:rPr>
-        <w:t>expressões d</w:t>
-      </w:r>
-      <w:r>
-        <w:rPr>
-          <w:rFonts w:eastAsia="Times New Roman" w:cs="Times New Roman" w:ascii="Garamond" w:hAnsi="Garamond"/>
-          <w:color w:val="000000"/>
-          <w:kern w:val="0"/>
-          <w:sz w:val="36"/>
-          <w:szCs w:val="36"/>
-          <w:shd w:fill="auto" w:val="clear"/>
-          <w:lang w:val="en-US" w:eastAsia="zh-CN" w:bidi="hi-IN"/>
-        </w:rPr>
-        <w:t>o</w:t>
-      </w:r>
-      <w:r>
-        <w:rPr>
-          <w:rFonts w:eastAsia="Times New Roman" w:cs="Times New Roman" w:ascii="Garamond" w:hAnsi="Garamond"/>
-          <w:color w:val="000000"/>
-          <w:kern w:val="0"/>
-          <w:sz w:val="36"/>
-          <w:szCs w:val="36"/>
-          <w:shd w:fill="auto" w:val="clear"/>
-          <w:lang w:val="en-US" w:eastAsia="zh-CN" w:bidi="hi-IN"/>
-        </w:rPr>
-        <w:t xml:space="preserve"> amor que nos une a Deus, ao próximo e a nós mesmos.</w:t>
+        <w:t>Independente de termos ou não errado muito no passado, o conhecimento que possuímos hoje do Evangelho de Jesus coloca sob nossos ombros a responsabilidade de ter um olhar diferente para com o mundo e para com o Brasil.</w:t>
+      </w:r>
+    </w:p>
+    <w:p>
+      <w:pPr>
+        <w:pStyle w:val="Normal"/>
+        <w:jc w:val="both"/>
+        <w:rPr>
+          <w:rFonts w:ascii="Garamond" w:hAnsi="Garamond" w:eastAsia="Times New Roman" w:cs="Times New Roman"/>
+          <w:color w:val="000000"/>
+          <w:kern w:val="0"/>
+          <w:sz w:val="36"/>
+          <w:szCs w:val="36"/>
+          <w:shd w:fill="auto" w:val="clear"/>
+          <w:lang w:val="en-US" w:eastAsia="zh-CN" w:bidi="hi-IN"/>
+        </w:rPr>
+      </w:pPr>
+      <w:r>
+        <w:rPr>
+          <w:rFonts w:eastAsia="Times New Roman" w:cs="Times New Roman" w:ascii="Garamond" w:hAnsi="Garamond"/>
+          <w:color w:val="000000"/>
+          <w:kern w:val="0"/>
+          <w:sz w:val="36"/>
+          <w:szCs w:val="36"/>
+          <w:shd w:fill="auto" w:val="clear"/>
+          <w:lang w:val="en-US" w:eastAsia="zh-CN" w:bidi="hi-IN"/>
+        </w:rPr>
+      </w:r>
+    </w:p>
+    <w:p>
+      <w:pPr>
+        <w:pStyle w:val="Normal"/>
+        <w:jc w:val="both"/>
+        <w:rPr>
+          <w:rFonts w:ascii="Garamond" w:hAnsi="Garamond" w:eastAsia="Times New Roman" w:cs="Times New Roman"/>
+          <w:color w:val="000000"/>
+          <w:kern w:val="0"/>
+          <w:sz w:val="36"/>
+          <w:szCs w:val="36"/>
+          <w:shd w:fill="auto" w:val="clear"/>
+          <w:lang w:val="en-US" w:eastAsia="zh-CN" w:bidi="hi-IN"/>
+        </w:rPr>
+      </w:pPr>
+      <w:r>
+        <w:rPr>
+          <w:rFonts w:eastAsia="Times New Roman" w:cs="Times New Roman" w:ascii="Garamond" w:hAnsi="Garamond"/>
+          <w:color w:val="000000"/>
+          <w:kern w:val="0"/>
+          <w:sz w:val="36"/>
+          <w:szCs w:val="36"/>
+          <w:shd w:fill="auto" w:val="clear"/>
+          <w:lang w:val="en-US" w:eastAsia="zh-CN" w:bidi="hi-IN"/>
+        </w:rPr>
+        <w:t>O contato com o mal é a prova pela qual temos que passar. Nosso futuro espiritual depende da maneira como agimos e reagimos perante o mal. O que eu desejo para os criminosos, para os corruptos? A morte, o aniquilamento total? Se for, então estaremos vibrando na mesma faixa que eles.</w:t>
+      </w:r>
+    </w:p>
+    <w:p>
+      <w:pPr>
+        <w:pStyle w:val="Normal"/>
+        <w:jc w:val="both"/>
+        <w:rPr>
+          <w:rFonts w:ascii="Garamond" w:hAnsi="Garamond" w:eastAsia="Times New Roman" w:cs="Times New Roman"/>
+          <w:color w:val="000000"/>
+          <w:kern w:val="0"/>
+          <w:sz w:val="36"/>
+          <w:szCs w:val="36"/>
+          <w:shd w:fill="auto" w:val="clear"/>
+          <w:lang w:val="en-US" w:eastAsia="zh-CN" w:bidi="hi-IN"/>
+        </w:rPr>
+      </w:pPr>
+      <w:r>
+        <w:rPr>
+          <w:rFonts w:eastAsia="Times New Roman" w:cs="Times New Roman" w:ascii="Garamond" w:hAnsi="Garamond"/>
+          <w:color w:val="000000"/>
+          <w:kern w:val="0"/>
+          <w:sz w:val="36"/>
+          <w:szCs w:val="36"/>
+          <w:shd w:fill="auto" w:val="clear"/>
+          <w:lang w:val="en-US" w:eastAsia="zh-CN" w:bidi="hi-IN"/>
+        </w:rPr>
+      </w:r>
+    </w:p>
+    <w:p>
+      <w:pPr>
+        <w:pStyle w:val="Normal"/>
+        <w:jc w:val="both"/>
+        <w:rPr>
+          <w:rFonts w:ascii="Garamond" w:hAnsi="Garamond" w:eastAsia="Times New Roman" w:cs="Times New Roman"/>
+          <w:color w:val="000000"/>
+          <w:kern w:val="0"/>
+          <w:sz w:val="36"/>
+          <w:szCs w:val="36"/>
+          <w:shd w:fill="auto" w:val="clear"/>
+          <w:lang w:val="en-US" w:eastAsia="zh-CN" w:bidi="hi-IN"/>
+        </w:rPr>
+      </w:pPr>
+      <w:r>
+        <w:rPr>
+          <w:rFonts w:eastAsia="Times New Roman" w:cs="Times New Roman" w:ascii="Garamond" w:hAnsi="Garamond"/>
+          <w:color w:val="000000"/>
+          <w:kern w:val="0"/>
+          <w:sz w:val="36"/>
+          <w:szCs w:val="36"/>
+          <w:shd w:fill="auto" w:val="clear"/>
+          <w:lang w:val="en-US" w:eastAsia="zh-CN" w:bidi="hi-IN"/>
+        </w:rPr>
+        <w:t xml:space="preserve">Aproxima-se o tempo em que o Cristo fará a separação do joio e do trigo, conduzindo a Terra à condição de mundo em regeneração. Permanecer aqui não será um privilégio, mas uma conquista individual, alcançada pelo esforço sincero de viver o Evangelho. </w:t>
+      </w:r>
+    </w:p>
+    <w:p>
+      <w:pPr>
+        <w:pStyle w:val="Normal"/>
+        <w:jc w:val="both"/>
+        <w:rPr>
+          <w:rFonts w:ascii="Garamond" w:hAnsi="Garamond" w:eastAsia="Times New Roman" w:cs="Times New Roman"/>
+          <w:color w:val="000000"/>
+          <w:kern w:val="0"/>
+          <w:sz w:val="36"/>
+          <w:szCs w:val="36"/>
+          <w:shd w:fill="auto" w:val="clear"/>
+          <w:lang w:val="en-US" w:eastAsia="zh-CN" w:bidi="hi-IN"/>
+        </w:rPr>
+      </w:pPr>
+      <w:r>
+        <w:rPr>
+          <w:rFonts w:eastAsia="Times New Roman" w:cs="Times New Roman" w:ascii="Garamond" w:hAnsi="Garamond"/>
+          <w:color w:val="000000"/>
+          <w:kern w:val="0"/>
+          <w:sz w:val="36"/>
+          <w:szCs w:val="36"/>
+          <w:shd w:fill="auto" w:val="clear"/>
+          <w:lang w:val="en-US" w:eastAsia="zh-CN" w:bidi="hi-IN"/>
+        </w:rPr>
+        <w:t>Caridade, humildade, paciência, abnegação e resignação são algumas das virtudes que precisamos desenvolver. Elas são expressões do amor que nos une a Deus, ao próximo e a nós mesmos.</w:t>
       </w:r>
     </w:p>
     <w:p>
@@ -8485,7 +6708,7 @@
         <w:bCs/>
         <w:rFonts w:ascii="Garamond" w:hAnsi="Garamond"/>
       </w:rPr>
-      <w:t>37</w:t>
+      <w:t>34</w:t>
     </w:r>
     <w:r>
       <w:rPr>

</xml_diff>